<commit_message>
ILWM round 3: docx master (linked TOC, 297pp at 5.5x8.5 in LO, no images)
</commit_message>
<xml_diff>
--- a/In Love with Murder, Actually/In_Love_with_Murder_Actually.docx
+++ b/In Love with Murder, Actually/In_Love_with_Murder_Actually.docx
@@ -566,7 +566,7 @@
       <w:hyperlink w:anchor="ch_31" w:history="1">
         <w:r>
           <w:rPr/>
-          <w:t xml:space="preserve">Chapter 31: The Second Box</w:t>
+          <w:t xml:space="preserve">Chapter 31: Edouard</w:t>
         </w:r>
       </w:hyperlink>
     </w:p>
@@ -577,7 +577,7 @@
       <w:hyperlink w:anchor="ch_32" w:history="1">
         <w:r>
           <w:rPr/>
-          <w:t xml:space="preserve">Chapter 32: The Commandant</w:t>
+          <w:t xml:space="preserve">Chapter 32: The Second Box</w:t>
         </w:r>
       </w:hyperlink>
     </w:p>
@@ -588,7 +588,7 @@
       <w:hyperlink w:anchor="ch_33" w:history="1">
         <w:r>
           <w:rPr/>
-          <w:t xml:space="preserve">Chapter 33: Dick Whittington</w:t>
+          <w:t xml:space="preserve">Chapter 33: The Commandant</w:t>
         </w:r>
       </w:hyperlink>
     </w:p>
@@ -599,7 +599,7 @@
       <w:hyperlink w:anchor="ch_34" w:history="1">
         <w:r>
           <w:rPr/>
-          <w:t xml:space="preserve">Chapter 34: The Trial</w:t>
+          <w:t xml:space="preserve">Chapter 34: Dick Whittington</w:t>
         </w:r>
       </w:hyperlink>
     </w:p>
@@ -610,7 +610,7 @@
       <w:hyperlink w:anchor="ch_35" w:history="1">
         <w:r>
           <w:rPr/>
-          <w:t xml:space="preserve">Chapter 35: The Courthouse Steps</w:t>
+          <w:t xml:space="preserve">Chapter 35: The Trial</w:t>
         </w:r>
       </w:hyperlink>
     </w:p>
@@ -621,7 +621,18 @@
       <w:hyperlink w:anchor="ch_36" w:history="1">
         <w:r>
           <w:rPr/>
-          <w:t xml:space="preserve">Chapter 36: Margaret and Geoffrey</w:t>
+          <w:t xml:space="preserve">Chapter 36: The Courthouse Steps</w:t>
+        </w:r>
+      </w:hyperlink>
+    </w:p>
+    <w:p>
+      <w:pPr>
+        <w:ind w:firstLine="0" w:left="288"/>
+      </w:pPr>
+      <w:hyperlink w:anchor="ch_37" w:history="1">
+        <w:r>
+          <w:rPr/>
+          <w:t xml:space="preserve">Chapter 37: Margaret and Geoffrey</w:t>
         </w:r>
       </w:hyperlink>
     </w:p>
@@ -2118,7 +2129,7 @@
     </w:p>
     <w:p>
       <w:r>
-        <w:t>The snake, as far as anybody ever learned, was never found.</w:t>
+        <w:t>The snake was not found that autumn, nor that winter, by anybody.</w:t>
       </w:r>
     </w:p>
     <w:p>
@@ -3699,7 +3710,7 @@
     </w:p>
     <w:p>
       <w:r>
-        <w:t>She did not finish the thought. She had never been a woman for speeches. She paid for her coffee, left a generous tip for a waiter who would never know why, and went out into the grey Mediterranean light, and made a telephone call that would take eleven weeks to come to anything at all.</w:t>
+        <w:t>She did not finish the thought. She had never been a woman for speeches. She paid for her coffee, left a generous tip for a waiter who would never know why, and went out into the grey Mediterranean light, and made a telephone call to an old colleague in Lyon that would take some weeks to come to anything at all.</w:t>
       </w:r>
     </w:p>
     <w:p>
@@ -3743,7 +3754,7 @@
     </w:p>
     <w:p>
       <w:r>
-        <w:t>The courier was a young man on a motorbike who had never been up the lane before and did not intend to come up it again. He stood at the locked gate with a padded envelope held out in front of him like a summons, and waited for Tobias to walk down the gravel, and said, "Lind?" in the tone of a man who has been told the name will be difficult. Tobias signed a screen with his finger. The signature came out as a small, despairing wave. The courier looked at it, looked at Tobias, decided that it was close enough for the south of France, and left.</w:t>
+        <w:t>The courier was a young man on a motorbike who had never been up the lane before and did not intend to come up it again. Tobias signed a screen with his finger. The signature came out as a small, despairing wave. The courier looked at it, looked at Tobias, decided that it was close enough for the south of France, and left.</w:t>
       </w:r>
     </w:p>
     <w:p>
@@ -5464,7 +5475,7 @@
     </w:p>
     <w:p>
       <w:r>
-        <w:t>"Is a lobster." She stood with her hands in her coat pockets, looking at the starched cloths through the glass. "My father catches lobsters. In Afurada. Eighteen years. He sells them to a man on the quay for the price of a lunch. The man sells them to a man in Lisbon. The man in Lisbon sells them to a man here." She turned away from the window. "Everybody is pink because of what they eat."</w:t>
+        <w:t>"Is a lobster." She stood with her hands in her coat pockets, looking at the starched cloths through the glass. "My father catches lobsters. In Afurada. Eighteen years. He sells them to a man on the quay for the price of a lunch. The man sells them to a man in Lisbon. The man in Lisbon sells them to a man here." She turned away from the window. "Like the flamingos. Everybody is pink because of what they eat."</w:t>
       </w:r>
     </w:p>
     <w:p>
@@ -5804,7 +5815,7 @@
         <w:ind w:firstLine="0"/>
       </w:pPr>
       <w:r>
-        <w:t>They telephoned them all. It took the whole of the afternoon and most of Madame Fournier's patience with the grandson's laptop, which kept asking to update itself at moments of crisis like a waiter who will not stop asking whether everything is all right.</w:t>
+        <w:t>They telephoned them all, on the grandson's laptop, which kept asking to update itself at moments of crisis like a waiter who will not stop asking whether everything is all right.</w:t>
       </w:r>
     </w:p>
     <w:p>
@@ -5853,7 +5864,7 @@
     </w:p>
     <w:p>
       <w:r>
-        <w:t>They did the sum together, with a pencil, on the back of the contract from Hale, which seemed appropriate. Madame Fournier supplied the dates from the exercise books, whenever Hale had stayed himself or the house had stood empty. The visitors' book supplied the rest. Catarina did the arithmetic in Portuguese under her breath, which was faster than Tobias did it in English, and only once had to be stopped from including Henri's goat.</w:t>
+        <w:t>They did the sum on the back of Hale's contract, which seemed appropriate, with the dates from the exercise books and the visitors' book. Catarina did the arithmetic in Portuguese under her breath, faster than Tobias did it in English, and only once had to be stopped from including Henri's goat.</w:t>
       </w:r>
     </w:p>
     <w:p>
@@ -5935,7 +5946,7 @@
     </w:p>
     <w:p>
       <w:r>
-        <w:t>"My commandant," she said, "told me this morning, over the coffee machine, that if I opened another file with Victor Hale's name on it, I would spend Christmas directing traffic at the roundabout outside the Carrefour in Cavaillon. In a fluorescent tabard. He was very specific about the tabard." She did not smile. "He closed the Marchetti file in April. He leaned on the Aubry file in Lyon, which is not even his jurisdiction, until it closed. He plays golf on Thursday mornings at a club outside Marseille, and one of the people he plays golf with is the chairman of the Verrane Foundation. I can't prove any of that means anything. I can tell you it means I can't walk this upstairs."</w:t>
+        <w:t>"My commandant," she said, "told me this morning, over the coffee machine, that if I opened another file with Victor Hale's name on it, I would spend Christmas directing traffic at the roundabout outside the Carrefour in Cavaillon. In a fluorescent tabard. He was very specific about the tabard." She did not smile. "He closed the Marchetti file in April. He leaned on the Aubry file in Lyon, which is not even his jurisdiction, until it closed. I can't prove that means anything. I can tell you it means I can't walk this upstairs."</w:t>
       </w:r>
     </w:p>
     <w:p>
@@ -6298,7 +6309,7 @@
     </w:p>
     <w:p>
       <w:r>
-        <w:t>"Roux," he said. "Grey hair. Fifty, a little more. Beautiful suit. A tie like wine. An umbrella, and no rain. He went up at ten thirty-four. I write the time. I always write the time; it is a habit from the airport. I did not see him come down. There is a staircase at the back, for the kitchens. It goes to the yard. A man who knows hotels knows the back stairs."</w:t>
+        <w:t>He added only one thing. "He went up at ten thirty-four. I write the time. I always write the time; it is a habit from the airport. I did not see him come down. There is a staircase at the back, for the kitchens. It goes to the yard. A man who knows hotels knows the back stairs."</w:t>
       </w:r>
     </w:p>
     <w:p>
@@ -6346,7 +6357,7 @@
     </w:p>
     <w:p>
       <w:r>
-        <w:t>It was a congress week, Dona Graça explained, smuggling them up the back stairs, the very stairs, at four in the afternoon when the corridor was empty and the cardiologist was at a session on arrhythmia. Every hotel in Lyon was full of cardiologists. The room had been redecorated in May. The balcony railing had been replaced the day after the fall, by the hotel's maintenance man, Monsieur Bacri, on the instructions of the manager, before the police had finished their eight days, which Dona Graça had thought was strange at the time and thought was stranger now.</w:t>
+        <w:t>Dona Graça smuggled them up the back stairs, the very stairs, at four in the afternoon, while the cardiologist was at a congress session on arrhythmia. The room had been redecorated in May. The balcony railing had been replaced the day after the fall, by the hotel's maintenance man, Monsieur Bacri, on the instructions of the manager, before the police had finished their eight days, which Dona Graça had thought was strange at the time and thought was stranger now.</w:t>
       </w:r>
     </w:p>
     <w:p>
@@ -6486,7 +6497,7 @@
     </w:p>
     <w:p>
       <w:r>
-        <w:t>They had not planned to stay. They had planned to take the last train home. But the last train had been cancelled, because of a fault on the line near Valence, and every hotel in Lyon was full of cardiologists, and it was nine o'clock at night, and raining, for the first time in ten days, as if the city had been saving it.</w:t>
+        <w:t>They had not planned to stay. They had planned to take the last train home. But Monsieur Bacri wrote slowly, and carefully, and twice started a page again because a word had come out crooked, and neither of them had the heart to hurry a carpenter, and by the time the envelope was sealed the last train had gone, and every hotel in Lyon was full of cardiologists, and it was nine o'clock at night, and raining, for the first time in ten days, as if the city had been saving it.</w:t>
       </w:r>
     </w:p>
     <w:p>
@@ -6623,7 +6634,7 @@
         <w:t>Braço dormente.</w:t>
       </w:r>
       <w:r>
-        <w:t xml:space="preserve"> He did not mention it. She rubbed it anyway, briskly, from shoulder to wrist, without being asked, and then went into the shower cupboard singing something from a Lisbon radio station, off-key, and the cardiologists of Lyon went off to their congress, and nobody in the whole city, Tobias thought, could possibly have been as happy as he was about a cancelled train.</w:t>
+        <w:t xml:space="preserve"> He did not mention it. She rubbed it anyway, briskly, from shoulder to wrist, without being asked, and then went into the shower cupboard singing something from a Lisbon radio station, off-key, and the cardiologists of Lyon went off to their congress, and nobody in the whole city, Tobias thought, could possibly have been as happy as he was about a missed train.</w:t>
       </w:r>
     </w:p>
     <w:p>
@@ -7406,27 +7417,17 @@
     </w:p>
     <w:p>
       <w:r>
-        <w:t>Tobias opened one eye.</w:t>
-      </w:r>
-    </w:p>
-    <w:p>
-      <w:r>
-        <w:t>The Olivetti stood on the desk, very upright, its keys gleaming like a row of teeth. It was not a thing he had ever noticed having a face, but it had one now, in the arrangement of the carriage and the bell and the two round spools. It looked like a retired colonel who had been asked to wait in a draughty corridor.</w:t>
-      </w:r>
-    </w:p>
-    <w:p>
-      <w:r>
-        <w:t>"Good evening," it said. "I am a 1962 Olivetti Lettera 22 of the finest Italian manufacture, and I have been sat in the same position for six weeks. Do you know how many commas you leave out?"</w:t>
-      </w:r>
-    </w:p>
-    <w:p>
-      <w:r>
-        <w:t>"You're a typewriter," said Tobias. "I'm dreaming."</w:t>
-      </w:r>
-    </w:p>
-    <w:p>
-      <w:r>
-        <w:t xml:space="preserve">"Naturally. Nobody listens to a typewriter unless he has a temperature." The bell gave a small, offended ting. "I have typed every word you have written in this house. I have typed </w:t>
+        <w:t>Tobias opened one eye. The thermometer on the bedside table, which Catarina had left there with a note that said NOT FOR THE PELICAN, said thirty-nine point four, and the room was swimming gently, like a room in a boat.</w:t>
+      </w:r>
+    </w:p>
+    <w:p>
+      <w:r>
+        <w:t>The Olivetti, on the desk, had a face. It had not had one that afternoon. It was made of the carriage and the bell and the two round spools, and it looked like a retired colonel who had been kept waiting in a draughty corridor.</w:t>
+      </w:r>
+    </w:p>
+    <w:p>
+      <w:r>
+        <w:t xml:space="preserve">"I have typed </w:t>
       </w:r>
       <w:r>
         <w:rPr>
@@ -7435,7 +7436,7 @@
         <w:t>she put the tray outside the door</w:t>
       </w:r>
       <w:r>
-        <w:t xml:space="preserve"> forty-one times. I have typed </w:t>
+        <w:t xml:space="preserve"> forty-one times," it said. "I have typed </w:t>
       </w:r>
       <w:r>
         <w:rPr>
@@ -7449,96 +7450,347 @@
     </w:p>
     <w:p>
       <w:r>
-        <w:t>On the bedside table the chipped cup rocked on its saucer. It was the one Catarina had handed him on the first day, with the crack along the rim, and it had a small, high, eager voice that spoke very fast.</w:t>
-      </w:r>
-    </w:p>
-    <w:p>
-      <w:r>
-        <w:t xml:space="preserve">"She went into the lake," said the cup. "For paper. </w:t>
+        <w:t>On the bedside table the chipped cup rocked on its saucer, and said, in a small, high, fast voice, "She went into the lake for your paper. She held your hand on the jetty. And you said nothing for a week."</w:t>
+      </w:r>
+    </w:p>
+    <w:p>
+      <w:r>
+        <w:t>"My Portuguese is terrible," said Tobias, to a cup, at thirty-nine point four.</w:t>
+      </w:r>
+    </w:p>
+    <w:p>
+      <w:r>
+        <w:t>"She does not want your Portuguese," said the cup. "She wants to be met. Halfway. On purpose."</w:t>
+      </w:r>
+    </w:p>
+    <w:p>
+      <w:r>
+        <w:t>Then the room tipped the other way, and the colonel was a typewriter again, and the cup was a cup, and Tobias lay in the blankets, shivering and warm, and thought, in the half-light, of how many small, tireless kindnesses there had been in the house since September: the trays, the notes, the fourth stair she did not step on in the night because she had learned that it creaked. None of them had asked to be noticed. That, he thought, was rather the point of them, and rather the problem.</w:t>
+      </w:r>
+    </w:p>
+    <w:p>
+      <w:r>
+        <w:t>In the morning the fever had broken. The sun lay in pale squares on the quilt, and the study was perfectly tidy, and on the desk the Olivetti stood in its usual place with a sheet of paper in the roller. It was blank, apart from one line, in the neat, ungrammatical capitals he would have known anywhere.</w:t>
+      </w:r>
+    </w:p>
+    <w:p>
+      <w:r>
+        <w:t>THE SOUP IS HOT. (NOT IS THE SOUP.) I AM HAPPY YOU ARE BETTER.</w:t>
+      </w:r>
+    </w:p>
+    <w:p>
+      <w:r>
+        <w:t>Catarina came in with the tray. On it, steaming, was a mug of tea made properly for the first time: the pot warmed, the leaves left to stand, the milk in last. It was in the cup with the chip.</w:t>
+      </w:r>
+    </w:p>
+    <w:p>
+      <w:r>
+        <w:t>He took it, and held it in both hands, and looked at it for a long moment.</w:t>
+      </w:r>
+    </w:p>
+    <w:p>
+      <w:r>
+        <w:t>"It's a very good cup," said Catarina, a little shyly.</w:t>
+      </w:r>
+    </w:p>
+    <w:p>
+      <w:r>
+        <w:t>"Yes," said Tobias. "I think it has opinions."</w:t>
+      </w:r>
+    </w:p>
+    <w:p>
+      <w:r>
+        <w:t>She laughed, and sat on the edge of the bed, and for a while neither of them said anything at all. Outside, the clock in the hall struck eight. On the desk the Olivetti stayed discreetly silent. He did not tell her about the dream. A dream that has been explained is only a temperature, and this one had been thirty-nine point four. But he kept the sentence. Halfway, on purpose. He wrote it on the envelope under the typewriter, under the name.</w:t>
+      </w:r>
+    </w:p>
+    <w:p>
+      <w:pPr>
+        <w:pStyle w:val="Heading2"/>
+        <w:pageBreakBefore/>
+      </w:pPr>
+      <w:bookmarkStart w:id="26" w:name="ch_24"/>
+      <w:r>
+        <w:t>Chapter 24: The Road to Aix</w:t>
+      </w:r>
+      <w:bookmarkEnd w:id="26"/>
+    </w:p>
+    <w:p>
+      <w:pPr>
+        <w:ind w:firstLine="0"/>
+      </w:pPr>
+      <w:r>
+        <w:t>Inês's notebook ended with an address in Aix-en-Provence: Maître Étienne Barbier, Notaire, rue Gaston de Saporta, 17h00. Beneath it, underlined twice: the originals.</w:t>
+      </w:r>
+    </w:p>
+    <w:p>
+      <w:r>
+        <w:t>"The originals of what?" said Tobias.</w:t>
+      </w:r>
+    </w:p>
+    <w:p>
+      <w:r>
+        <w:t>"Of everything he stole," said Catarina. "If a lawyer keeps the contracts, then the lawyer is the one who can open the door." She tapped the page. "It is an hour. We go tomorrow. We are there by five."</w:t>
+      </w:r>
+    </w:p>
+    <w:p>
+      <w:r>
+        <w:t>They left at ten. They were not there by five.</w:t>
+      </w:r>
+    </w:p>
+    <w:p>
+      <w:r>
+        <w:t>The first delay was a stall at the side of the road, run by a woman in a straw hat selling the last figs of the year out of a wheelbarrow. "We stop for one minute," said Catarina, who knew about figs. They stopped for forty. The figs were purple and split and warm and tasted of a summer that had not yet finished with anyone, and the woman in the hat insisted that Tobias taste the grapes, and the quince jelly, and a small orange fruit nobody could name in any language, which turned out to be a persimmon, and by the time they drove off the back seat was a fruit bowl.</w:t>
+      </w:r>
+    </w:p>
+    <w:p>
+      <w:r>
+        <w:t>"This was a mistake," said Tobias, with juice running down his wrist. "We're going to be late."</w:t>
+      </w:r>
+    </w:p>
+    <w:p>
+      <w:r>
+        <w:t>"Paris can wait," said Catarina, with her mouth full.</w:t>
+      </w:r>
+    </w:p>
+    <w:p>
+      <w:r>
+        <w:t>"We're not going to Paris."</w:t>
+      </w:r>
+    </w:p>
+    <w:p>
+      <w:r>
+        <w:t>"Then the lawyer can wait."</w:t>
+      </w:r>
+    </w:p>
+    <w:p>
+      <w:r>
+        <w:t>The second delay was a goat farm, because there was a sign. The third was a ruined abbey on a hill, because Tobias remarked that it looked Romanesque, and Catarina said "Românico," and they both spent twenty minutes standing in an empty nave where the roof had fallen in and the sky had come to live, whispering because it seemed to demand it. The fourth was an olive mill, where an old man in a blue apron poured them a thimble of oil so green and peppery that Catarina coughed, wiped her eyes, and bought six litres.</w:t>
+      </w:r>
+    </w:p>
+    <w:p>
+      <w:r>
+        <w:t>"It is for the restaurant," she said defensively. "Fernanda will say it is too expensive. Then she will use all of it."</w:t>
+      </w:r>
+    </w:p>
+    <w:p>
+      <w:r>
+        <w:t>The fifth delay was a flat tyre.</w:t>
+      </w:r>
+    </w:p>
+    <w:p>
+      <w:r>
+        <w:t>It happened on a quiet road between two vineyards, in the warm middle of the afternoon, with the last bees of the year working the ivy on a wall like a machine nobody could turn off. Tobias stood over the spare wheel with the expression of a man reading a document in Latin.</w:t>
+      </w:r>
+    </w:p>
+    <w:p>
+      <w:r>
+        <w:t>"I have never changed a tyre," he said.</w:t>
+      </w:r>
+    </w:p>
+    <w:p>
+      <w:r>
+        <w:t>"You are English. You have a man."</w:t>
+      </w:r>
+    </w:p>
+    <w:p>
+      <w:r>
+        <w:t>"I did have a man. He was called the AA."</w:t>
+      </w:r>
+    </w:p>
+    <w:p>
+      <w:r>
+        <w:t>"Afasta-te," said Catarina, rolling up her sleeves. She was four minutes with the jack and the spanner, glistening, singing a tune from the radio under her breath, and when it was done she wiped her hands on her skirt and looked at him, hot and happy and absurdly beautiful, with oil on her cheek.</w:t>
+      </w:r>
+    </w:p>
+    <w:p>
+      <w:r>
+        <w:t>"What?" she said.</w:t>
+      </w:r>
+    </w:p>
+    <w:p>
+      <w:r>
+        <w:t>"Nothing," said Tobias. "I was thinking I should have married a mechanic."</w:t>
+      </w:r>
+    </w:p>
+    <w:p>
+      <w:r>
+        <w:t>"You are not married."</w:t>
+      </w:r>
+    </w:p>
+    <w:p>
+      <w:r>
+        <w:t>"No," said Tobias. "I was thinking it in advance."</w:t>
+      </w:r>
+    </w:p>
+    <w:p>
+      <w:r>
+        <w:t>She stood very still. A bee, somewhere, chose that moment to stop. Then Catarina turned, very pink, picked up the spanner, put it in the boot with extraordinary care, and said to the air in Portuguese, quite clearly, "Meu Deus, ele disse isso a sério."</w:t>
+      </w:r>
+    </w:p>
+    <w:p>
+      <w:r>
+        <w:t>He understood every word.</w:t>
+      </w:r>
+    </w:p>
+    <w:p>
+      <w:r>
+        <w:t>They did not reach Aix until half past six. The plane trees along the Cours Mirabeau were already throwing their long shadows, the fountains were running gold, and the notary's house in the rue Gaston de Saporta was a tall honey-coloured building with its shutters closed, a small brass plate that said MAÎTRE BARBIER, NOTAIRE, and a strip of police tape across the door, tied in a bow, as if somebody had wanted it to look nice.</w:t>
+      </w:r>
+    </w:p>
+    <w:p>
+      <w:r>
+        <w:t>A neighbour in a dressing gown, who had been waiting all day for somebody to tell, told them in rapid French. Two men in dark coats had come in the night, at about three. They were, she said, extremely loud for burglars. One had kept shouting "Gaston!", and the other had replied "Oui?", and the first had said, "Not you, the other Gaston!", and for a while it had gone on like that. They had still been carrying things down the stairs at six, when Maître Barbier, who lived on the second floor and rose at six every day of his life, came down in his slippers to see who was shouting his name. One of the Gastons had fallen on him. They had left with a safe, an umbrella stand and, for reasons the neighbour could not explain, a stuffed owl. And Maître Barbier, who was sixty-nine and had eleven weeks left before the law made every notary in France put down his pen at seventy, was in the hospital with a bruised arm and an extremely bad temper.</w:t>
+      </w:r>
+    </w:p>
+    <w:p>
+      <w:r>
+        <w:t>"Last night," said Tobias slowly.</w:t>
+      </w:r>
+    </w:p>
+    <w:p>
+      <w:r>
+        <w:t>"So we were never going to be in time," said Catarina. She looked back down the road towards the figs, the goats, the abbey, the oil and the tyre, and he could see her doing the sum. "Not at five. Not at noon. All day, we are late for nothing."</w:t>
+      </w:r>
+    </w:p>
+    <w:p>
+      <w:r>
+        <w:t>"That's the first time in history the figs have cost nothing."</w:t>
+      </w:r>
+    </w:p>
+    <w:p>
+      <w:r>
+        <w:t>"Is the first time in history," said Catarina, "anything in Provence cost nothing."</w:t>
+      </w:r>
+    </w:p>
+    <w:p>
+      <w:pPr>
+        <w:spacing w:before="160" w:after="160"/>
+        <w:ind w:firstLine="0"/>
+        <w:jc w:val="center"/>
+      </w:pPr>
+      <w:r>
+        <w:t>*  *  *</w:t>
+      </w:r>
+    </w:p>
+    <w:p>
+      <w:pPr>
+        <w:ind w:firstLine="0"/>
+      </w:pPr>
+      <w:r>
+        <w:t>Maître Étienne Barbier received them in a corridor of the hospital, on a plastic chair, with his arm in a sling and his good coat over his shoulders like a cape, because he had refused to take it off for a nurse he described as a child. He was small and bald and furious, with eyebrows that did most of his talking, and he listened to Tobias's account of who they were with the expression of a man being sold a car.</w:t>
+      </w:r>
+    </w:p>
+    <w:p>
+      <w:r>
+        <w:t>"Marchetti," he said, when Tobias reached the name. The eyebrows went up and stayed there. "You think I keep Marchetti in my safe? After Giraud? After a notary in Avignon drives off a bridge with my name in his diary?" He snorted. "Monsieur, I am sixty-nine. I did not reach sixty-nine by being stupid. They stole three wills, a lease and an owl. The owl belonged to my father. They are welcome to it. It was always looking at me."</w:t>
+      </w:r>
+    </w:p>
+    <w:p>
+      <w:r>
+        <w:t>"Then where are the originals?"</w:t>
+      </w:r>
+    </w:p>
+    <w:p>
+      <w:r>
+        <w:t xml:space="preserve">"Mademoiselle Marchetti took them to a bank in March. On my advice. A safe deposit box, here, on the Cours Mirabeau." He shifted the sling and winced. "And she did not leave the key with me, before you ask. I asked her not to. I said, give it to somebody nobody would think of. She said she knew exactly the person. </w:t>
       </w:r>
       <w:r>
         <w:rPr>
           <w:i/>
         </w:rPr>
-        <w:t>Your</w:t>
-      </w:r>
-      <w:r>
-        <w:t xml:space="preserve"> paper. She talks to the toaster. She says good morning to the stove. She held your hand on the jetty and you said nothing for a week."</w:t>
-      </w:r>
-    </w:p>
-    <w:p>
-      <w:r>
-        <w:t>"I've said a great deal."</w:t>
-      </w:r>
-    </w:p>
-    <w:p>
-      <w:r>
-        <w:t>"You have said," said the Olivetti, "a great deal of rubbish, without a comma in it."</w:t>
-      </w:r>
-    </w:p>
-    <w:p>
-      <w:r>
-        <w:t>"My Portuguese is terrible," said Tobias.</w:t>
-      </w:r>
-    </w:p>
-    <w:p>
-      <w:r>
-        <w:t>"She does not want your Portuguese," said the cup.</w:t>
-      </w:r>
-    </w:p>
-    <w:p>
-      <w:r>
-        <w:t>"What does she want?"</w:t>
-      </w:r>
-    </w:p>
-    <w:p>
-      <w:r>
-        <w:t>The cup thought about it. It was the kind of silence in which, if you were a cup, you could hear all the soup in the world.</w:t>
-      </w:r>
-    </w:p>
-    <w:p>
-      <w:r>
-        <w:t>"She wants to be met," said the cup. "Halfway. On purpose."</w:t>
-      </w:r>
-    </w:p>
-    <w:p>
-      <w:r>
-        <w:t>Out in the garden the wind lifted, and in the long grass by the gate a very large white bird turned its head toward the lit window. Tobias lay in the blankets, shivering and warm, and in the half-light he saw for the first time how many small, tireless kindnesses there had been in the house since September: the trays, the notes, the stairs that did not creak when she came down in the night because she had learned which ones did. None of them had asked to be noticed. That, he thought, was rather the point of them, and rather the problem.</w:t>
-      </w:r>
-    </w:p>
-    <w:p>
-      <w:r>
-        <w:t>In the morning the fever had broken. The sun lay in pale squares on the quilt, and the study was perfectly tidy, and on the desk the Olivetti stood in its usual place with a sheet of paper in the roller. It was blank, apart from one line, in the neat, ungrammatical capitals he would have known anywhere.</w:t>
-      </w:r>
-    </w:p>
-    <w:p>
-      <w:r>
-        <w:t>THE SOUP IS HOT. (NOT IS THE SOUP.) I AM HAPPY YOU ARE BETTER.</w:t>
-      </w:r>
-    </w:p>
-    <w:p>
-      <w:r>
-        <w:t>Catarina came in with the tray. On it, steaming, was a mug of tea made properly for the first time: the pot warmed, the leaves left to stand, the milk in last. It was in the cup with the chip.</w:t>
-      </w:r>
-    </w:p>
-    <w:p>
-      <w:r>
-        <w:t>He took it, and held it in both hands, and looked at it for a long moment.</w:t>
-      </w:r>
-    </w:p>
-    <w:p>
-      <w:r>
-        <w:t>"It's a very good cup," said Catarina, a little shyly.</w:t>
-      </w:r>
-    </w:p>
-    <w:p>
-      <w:r>
-        <w:t>"Yes," said Tobias. "I think it has opinions."</w:t>
-      </w:r>
-    </w:p>
-    <w:p>
-      <w:r>
-        <w:t>She laughed, and sat on the edge of the bed, and for a while neither of them said anything at all. Outside, the clock in the hall struck eight. On the desk the Olivetti stayed discreetly silent. He did not tell her about the dream. A dream that has been explained is only a temperature. But he kept the sentence. Halfway, on purpose. He wrote it on the envelope under the typewriter, under the name.</w:t>
+        <w:t>A woman who keeps everything and trusts nobody,</w:t>
+      </w:r>
+      <w:r>
+        <w:t xml:space="preserve"> she said. </w:t>
+      </w:r>
+      <w:r>
+        <w:rPr>
+          <w:i/>
+        </w:rPr>
+        <w:t>She has a biscuit tin.</w:t>
+      </w:r>
+      <w:r>
+        <w:t xml:space="preserve"> I did not ask any more. A notary who asks more than he needs to is a notary who ends up in a diary."</w:t>
+      </w:r>
+    </w:p>
+    <w:p>
+      <w:r>
+        <w:t>Tobias and Catarina looked at each other.</w:t>
+      </w:r>
+    </w:p>
+    <w:p>
+      <w:r>
+        <w:t>"Odile," said Catarina.</w:t>
+      </w:r>
+    </w:p>
+    <w:p>
+      <w:r>
+        <w:t>"Madame Fournier," said Tobias, at the same moment, and Maître Barbier looked from one to the other, and his eyebrows came down a little, as if he had seen this kind of thing before, at the signing of marriage contracts, and had never much liked it.</w:t>
+      </w:r>
+    </w:p>
+    <w:p>
+      <w:r>
+        <w:t>He was leaning against their car in the hospital car park when they came out, as if he had been there for some time and did not mind, beside a long black saloon with a driver who did not look up. Close to, he was about fifty, immaculate, in a charcoal suit and a tie the colour of old claret, and he carried a furled black umbrella under a sky that had not held a cloud all day.</w:t>
+      </w:r>
+    </w:p>
+    <w:p>
+      <w:r>
+        <w:t>"Mr Lind," he said, in perfect, pleasant English. "I am so glad. I had hoped we might meet again."</w:t>
+      </w:r>
+    </w:p>
+    <w:p>
+      <w:r>
+        <w:t>"You left before the cheese," said Tobias, slowly. "At the Pemberton-Hayeses'."</w:t>
+      </w:r>
+    </w:p>
+    <w:p>
+      <w:r>
+        <w:t>"I never stay for the cheese. Maître Edouard Delacroix-Roux. I act for certain persons whose names you may know." He smiled. His teeth were extraordinary. "I wished to say, as a professional courtesy, how much I admire your novel."</w:t>
+      </w:r>
+    </w:p>
+    <w:p>
+      <w:r>
+        <w:t>"You've read it?"</w:t>
+      </w:r>
+    </w:p>
+    <w:p>
+      <w:r>
+        <w:t>"I have not read it. I have read a summary, which I understand is all that is left." He turned the umbrella slowly in his fingers. "It must be a great grief to lose two years of work. One would hate for anything similar to happen to the people one loves."</w:t>
+      </w:r>
+    </w:p>
+    <w:p>
+      <w:r>
+        <w:t>"Is that a threat?" said Catarina, in her very plainest English.</w:t>
+      </w:r>
+    </w:p>
+    <w:p>
+      <w:r>
+        <w:t>"A threat? Certainly not." Maître Delacroix-Roux looked at her with a tenderness so artificial it might have been varnished. "I was merely observing that the roads of Provence are most dangerous at dusk, mademoiselle. And that some people, for want of a decent education, cannot tell a landmark from a trap." He glanced up at the hospital windows, at the third floor, where a small bald man was sitting in a corridor with his coat on, then back to her. "Do give my regards to your sister. I understand she has been missing for some time. How very distressing."</w:t>
+      </w:r>
+    </w:p>
+    <w:p>
+      <w:r>
+        <w:t>He bowed, as one bows to a wedding guest, and got back into the car. It purred away out of the car park under the plane trees, and on the tarmac behind it lay one fallen leaf, and the umbrella, which he had left behind on purpose.</w:t>
+      </w:r>
+    </w:p>
+    <w:p>
+      <w:r>
+        <w:t>Catarina picked it up. Tobias took it from her very gently and snapped it in two.</w:t>
+      </w:r>
+    </w:p>
+    <w:p>
+      <w:r>
+        <w:t>"I don't like him," said Tobias.</w:t>
+      </w:r>
+    </w:p>
+    <w:p>
+      <w:r>
+        <w:t>"No," said Catarina. "He is a man who has never once been in a boat."</w:t>
+      </w:r>
+    </w:p>
+    <w:p>
+      <w:r>
+        <w:t>Edouard. The name in the margin of Inês's notebook, beside the twelfth of March. And the tie had been across a plate of vol-au-vents in October, and he had admired it. He wrote that down before he started the car, and then, because Catarina was watching him write it, he wrote underneath: I should have known at the supper. She took the pen and added, in capitals: NOBODY KNOWS AT THE SUPPER. THAT IS WHY IT IS A SUPPER.</w:t>
       </w:r>
     </w:p>
     <w:p>
@@ -7546,261 +7798,17 @@
         <w:pStyle w:val="Heading2"/>
         <w:pageBreakBefore/>
       </w:pPr>
-      <w:bookmarkStart w:id="26" w:name="ch_24"/>
-      <w:r>
-        <w:t>Chapter 24: The Road to Aix</w:t>
-      </w:r>
-      <w:bookmarkEnd w:id="26"/>
+      <w:bookmarkStart w:id="27" w:name="ch_25"/>
+      <w:r>
+        <w:t>Chapter 25: The Key</w:t>
+      </w:r>
+      <w:bookmarkEnd w:id="27"/>
     </w:p>
     <w:p>
       <w:pPr>
         <w:ind w:firstLine="0"/>
       </w:pPr>
       <w:r>
-        <w:t>Inês's notebook ended with an address in Aix-en-Provence: Maître Étienne Barbier, Notaire, rue Gaston de Saporta, 17h00. Beneath it, underlined twice: the originals.</w:t>
-      </w:r>
-    </w:p>
-    <w:p>
-      <w:r>
-        <w:t>"The originals of what?" said Tobias.</w:t>
-      </w:r>
-    </w:p>
-    <w:p>
-      <w:r>
-        <w:t>"Of everything he stole," said Catarina. "If a lawyer keeps the contracts, then the lawyer is the one who can open the door." She tapped the page. "It is an hour. We go tomorrow. We are there by five."</w:t>
-      </w:r>
-    </w:p>
-    <w:p>
-      <w:r>
-        <w:t>They left at ten. They were not there by five.</w:t>
-      </w:r>
-    </w:p>
-    <w:p>
-      <w:r>
-        <w:t>The first delay was a stall at the side of the road, run by a woman in a straw hat selling the last figs of the year out of a wheelbarrow. "We stop for one minute," said Catarina, who knew about figs. They stopped for forty. The figs were purple and split and warm and tasted of a summer that had not yet finished with anyone, and the woman in the hat insisted that Tobias taste the grapes, and the quince jelly, and a small orange fruit nobody could name in any language, which turned out to be a persimmon, and by the time they drove off the back seat was a fruit bowl.</w:t>
-      </w:r>
-    </w:p>
-    <w:p>
-      <w:r>
-        <w:t>"This was a mistake," said Tobias, with juice running down his wrist. "We're going to be late."</w:t>
-      </w:r>
-    </w:p>
-    <w:p>
-      <w:r>
-        <w:t>"Paris can wait," said Catarina, with her mouth full.</w:t>
-      </w:r>
-    </w:p>
-    <w:p>
-      <w:r>
-        <w:t>"We're not going to Paris."</w:t>
-      </w:r>
-    </w:p>
-    <w:p>
-      <w:r>
-        <w:t>"Then the lawyer can wait."</w:t>
-      </w:r>
-    </w:p>
-    <w:p>
-      <w:r>
-        <w:t>The second delay was a goat farm, because there was a sign. The third was a ruined abbey on a hill, because Tobias remarked that it looked Romanesque, and Catarina said "Românico," and they both spent twenty minutes standing in an empty nave where the roof had fallen in and the sky had come to live, whispering because it seemed to demand it. The fourth was an olive mill, where an old man in a blue apron poured them a thimble of oil so green and peppery that Catarina coughed, wiped her eyes, and bought six litres.</w:t>
-      </w:r>
-    </w:p>
-    <w:p>
-      <w:r>
-        <w:t>"It is for the restaurant," she said defensively. "Fernanda will say it is too expensive. Then she will use all of it."</w:t>
-      </w:r>
-    </w:p>
-    <w:p>
-      <w:r>
-        <w:t>The fifth delay was a flat tyre.</w:t>
-      </w:r>
-    </w:p>
-    <w:p>
-      <w:r>
-        <w:t>It happened on a quiet road between two vineyards, in the warm middle of the afternoon, with the last bees of the year working the ivy on a wall like a machine nobody could turn off. Tobias stood over the spare wheel with the expression of a man reading a document in Latin.</w:t>
-      </w:r>
-    </w:p>
-    <w:p>
-      <w:r>
-        <w:t>"I have never changed a tyre," he said.</w:t>
-      </w:r>
-    </w:p>
-    <w:p>
-      <w:r>
-        <w:t>"You are English. You have a man."</w:t>
-      </w:r>
-    </w:p>
-    <w:p>
-      <w:r>
-        <w:t>"I did have a man. He was called the AA."</w:t>
-      </w:r>
-    </w:p>
-    <w:p>
-      <w:r>
-        <w:t>"Afasta-te," said Catarina, rolling up her sleeves. She was four minutes with the jack and the spanner, glistening, singing a tune from the radio under her breath, and when it was done she wiped her hands on her skirt and looked at him, hot and happy and absurdly beautiful, with oil on her cheek.</w:t>
-      </w:r>
-    </w:p>
-    <w:p>
-      <w:r>
-        <w:t>"What?" she said.</w:t>
-      </w:r>
-    </w:p>
-    <w:p>
-      <w:r>
-        <w:t>"Nothing," said Tobias. "I was thinking I should have married a mechanic."</w:t>
-      </w:r>
-    </w:p>
-    <w:p>
-      <w:r>
-        <w:t>"You are not married."</w:t>
-      </w:r>
-    </w:p>
-    <w:p>
-      <w:r>
-        <w:t>"No," said Tobias. "I was thinking it in advance."</w:t>
-      </w:r>
-    </w:p>
-    <w:p>
-      <w:r>
-        <w:t>She stood very still. A bee, somewhere, chose that moment to stop. Then Catarina turned, very pink, picked up the spanner, put it in the boot with extraordinary care, and said to the air in Portuguese, quite clearly, "Meu Deus, ele disse isso a sério."</w:t>
-      </w:r>
-    </w:p>
-    <w:p>
-      <w:r>
-        <w:t>He understood every word.</w:t>
-      </w:r>
-    </w:p>
-    <w:p>
-      <w:r>
-        <w:t>They did not reach Aix until half past six. The plane trees along the Cours Mirabeau were already throwing their long shadows, the fountains were running gold, and the notary's house in the rue Gaston de Saporta was a tall honey-coloured building with its shutters closed and a small brass plate that said MAÎTRE BARBIER, NOTAIRE.</w:t>
-      </w:r>
-    </w:p>
-    <w:p>
-      <w:r>
-        <w:t>The door was ajar. Inside, the office had been taken to pieces. Drawers upended, files on the floor, a safe standing open and empty. A neighbour in a dressing gown told them in rapid French that two men in dark coats had come at a quarter to five. They were, she said, extremely loud for burglars. One had kept shouting "Gaston!", and the other had replied "Oui?", and the first had said, "Not you, the other Gaston!", and for a while it had gone on like that. They had left at five, taking a safe, an umbrella stand and, for reasons the neighbour could not explain, a stuffed owl. And that Maître Barbier, who was sixty-nine and had eleven weeks left before the law made every notary in France put down his pen at seventy, was at that moment in the hospital with a bruised arm and an extremely bad temper.</w:t>
-      </w:r>
-    </w:p>
-    <w:p>
-      <w:r>
-        <w:t>"At five," said Tobias slowly.</w:t>
-      </w:r>
-    </w:p>
-    <w:p>
-      <w:r>
-        <w:t>"We would have been there at five," said Catarina. She had gone very pale. "Exactly at five. Like the notebook says."</w:t>
-      </w:r>
-    </w:p>
-    <w:p>
-      <w:r>
-        <w:t>They stood in the ransacked office in the late honey light. Somewhere outside, an accordion began to play. Neither said what both were thinking. If they had been punctual, if they had been sensible, if they had not stopped for the figs, and the goats, and the abbey, and the oil, and the tyre, and the three minutes in which a man had said something aloud that should have waited.</w:t>
-      </w:r>
-    </w:p>
-    <w:p>
-      <w:r>
-        <w:t>"Paris," said Catarina at last, in a small voice, "can wait."</w:t>
-      </w:r>
-    </w:p>
-    <w:p>
-      <w:r>
-        <w:t>"Yes," said Tobias. "Apparently, so can everything else."</w:t>
-      </w:r>
-    </w:p>
-    <w:p>
-      <w:r>
-        <w:t>On the way out they picked up the single object the thieves had overlooked: a calendar on the old man's desk, where a note in a spidery hand read: Marchetti originals. Safe deposit, Cours Mirabeau branch. Key with Mme Fournier.</w:t>
-      </w:r>
-    </w:p>
-    <w:p>
-      <w:r>
-        <w:t>"Madame Fournier," said Tobias.</w:t>
-      </w:r>
-    </w:p>
-    <w:p>
-      <w:r>
-        <w:t>"Odile," said Catarina. "Odile has the key."</w:t>
-      </w:r>
-    </w:p>
-    <w:p>
-      <w:r>
-        <w:t>They were halfway to the car when a long black saloon pulled up silently at the kerb, and a man got out. He was about fifty, immaculate, in a charcoal suit and a tie the colour of old claret, and he carried a furled black umbrella under a sky that had not held a cloud all day.</w:t>
-      </w:r>
-    </w:p>
-    <w:p>
-      <w:r>
-        <w:t>"Mr Lind," he said, in perfect, pleasant English. "I am so glad. I had hoped we might meet again."</w:t>
-      </w:r>
-    </w:p>
-    <w:p>
-      <w:r>
-        <w:t>"You left before the cheese," said Tobias, slowly. "At the Pemberton-Hayeses'."</w:t>
-      </w:r>
-    </w:p>
-    <w:p>
-      <w:r>
-        <w:t>"I never stay for the cheese. Maître Edouard Delacroix-Roux. I act for certain persons whose names you may know." He smiled. His teeth were extraordinary. "I wished to say, as a professional courtesy, how much I admire your novel."</w:t>
-      </w:r>
-    </w:p>
-    <w:p>
-      <w:r>
-        <w:t>"You've read it?"</w:t>
-      </w:r>
-    </w:p>
-    <w:p>
-      <w:r>
-        <w:t>"I have not read it. I have read a summary, which I understand is all that is left." He turned the umbrella slowly in his fingers. "It must be a great grief to lose two years of work. One would hate for anything similar to happen to the people one loves."</w:t>
-      </w:r>
-    </w:p>
-    <w:p>
-      <w:r>
-        <w:t>"Is that a threat?" said Catarina, in her very plainest English.</w:t>
-      </w:r>
-    </w:p>
-    <w:p>
-      <w:r>
-        <w:t>"A threat? Certainly not." Maître Delacroix-Roux looked at her with a tenderness so artificial it might have been varnished. "I was merely observing that the roads of Provence are most dangerous at dusk, mademoiselle. And that some people, for want of a decent education, cannot tell a landmark from a trap." He glanced up at the dark windows of the notary's house, then back to her. "Do give my regards to your sister. I understand she has been missing for some time. How very distressing."</w:t>
-      </w:r>
-    </w:p>
-    <w:p>
-      <w:r>
-        <w:t>He bowed, as one bows to a wedding guest, and got back into the car. It purred away down the Cours Mirabeau under the plane trees, and in the gutter behind it lay one fallen leaf, and the umbrella, which he had left behind on purpose.</w:t>
-      </w:r>
-    </w:p>
-    <w:p>
-      <w:r>
-        <w:t>Catarina picked it up. Tobias took it from her very gently and snapped it in two.</w:t>
-      </w:r>
-    </w:p>
-    <w:p>
-      <w:r>
-        <w:t>"I don't like him," said Tobias.</w:t>
-      </w:r>
-    </w:p>
-    <w:p>
-      <w:r>
-        <w:t>"No," said Catarina. "He is a man who has never once been in a boat."</w:t>
-      </w:r>
-    </w:p>
-    <w:p>
-      <w:r>
-        <w:t>Edouard. The name in the margin of Inês's notebook, beside the twelfth of March. And the tie had been across a plate of vol-au-vents in October, and he had admired it. He wrote that down before he started the car, and then, because Catarina was watching him write it, he wrote underneath: I should have known at the supper. She took the pen and added, in capitals: NOBODY KNOWS AT THE SUPPER. THAT IS WHY IT IS A SUPPER.</w:t>
-      </w:r>
-    </w:p>
-    <w:p>
-      <w:pPr>
-        <w:pStyle w:val="Heading2"/>
-        <w:pageBreakBefore/>
-      </w:pPr>
-      <w:bookmarkStart w:id="27" w:name="ch_25"/>
-      <w:r>
-        <w:t>Chapter 25: The Key</w:t>
-      </w:r>
-      <w:bookmarkEnd w:id="27"/>
-    </w:p>
-    <w:p>
-      <w:pPr>
-        <w:ind w:firstLine="0"/>
-      </w:pPr>
-      <w:r>
         <w:t>Madame Fournier did not look up from the secateurs.</w:t>
       </w:r>
     </w:p>
@@ -7811,7 +7819,7 @@
     </w:p>
     <w:p>
       <w:r>
-        <w:t xml:space="preserve">The bank in Aix took twenty minutes and no heroism. Mara, carrying the juge d'instruction's signature in a plastic sleeve as if it might blow away, signed. Tobias watched. Catarina held the fig bag from the day before, because the bank had no ceremony and a paper bag was honest. Inside the box, on top, lay a toy Porsche with a wheel missing and a card in Elise's quick, slanting, impatient hand: </w:t>
+        <w:t xml:space="preserve">The bank in Aix took two days, a juge's signature and, in the end, twenty minutes and no heroism. Mara, carrying the juge d'instruction's signature in a plastic sleeve as if it might blow away, signed. Tobias watched. Catarina held the fig bag from the road to Aix, which she had kept, because the bank had no ceremony and a paper bag was honest. Inside the box, on top, lay a toy Porsche with a wheel missing and a card in Elise's quick, slanting, impatient hand: </w:t>
       </w:r>
       <w:r>
         <w:rPr>
@@ -7845,7 +7853,16 @@
     </w:p>
     <w:p>
       <w:r>
-        <w:t>Anselm Brunner arrived at the lake house at eight o'clock that evening, on foot, in the rain, with an umbrella held at the precise angle of a bayonet.</w:t>
+        <w:t xml:space="preserve">Anselm Brunner arrived at the lake house two evenings later, at eight o'clock, on foot, in the rain, sent, he said, by a juge in Aix who had read the word </w:t>
+      </w:r>
+      <w:r>
+        <w:rPr>
+          <w:i/>
+        </w:rPr>
+        <w:t>codex</w:t>
+      </w:r>
+      <w:r>
+        <w:t xml:space="preserve"> in the inventory of a safe deposit box and had telephoned Rome before lunch, with an umbrella held at the precise angle of a bayonet.</w:t>
       </w:r>
     </w:p>
     <w:p>
@@ -8601,7 +8618,7 @@
     </w:p>
     <w:p>
       <w:r>
-        <w:t xml:space="preserve">He had been thinking all morning, in the gaps between not typing, about Delacroix-Roux on the pavement in Aix, with his extraordinary teeth, saying </w:t>
+        <w:t xml:space="preserve">He had been thinking all morning, in the gaps between not typing, about Delacroix-Roux in the hospital car park in Aix, with his extraordinary teeth, saying </w:t>
       </w:r>
       <w:r>
         <w:rPr>
@@ -8649,7 +8666,7 @@
     </w:p>
     <w:p>
       <w:r>
-        <w:t>"To Fernanda. For a few weeks. Until this is over. Until Mara has them." He heard himself going on, the way a car goes on rolling into a gatepost after you have taken your foot off. "It's not safe here. He knows who you are. He knows about Inês. He said so, on the pavement, in front of us. He's killed three people. I can't..." He stopped. "I'd feel better if you were somewhere he couldn't find you."</w:t>
+        <w:t>"To Fernanda. For a few weeks. Until this is over. Until Mara has them." He heard himself going on, the way a car goes on rolling into a gatepost after you have taken your foot off. "It's not safe here. He knows who you are. He knows about Inês. He said so, in a car park, in front of us. He's killed three people. I can't..." He stopped. "I'd feel better if you were somewhere he couldn't find you."</w:t>
       </w:r>
     </w:p>
     <w:p>
@@ -9016,7 +9033,7 @@
     </w:p>
     <w:p>
       <w:r>
-        <w:t>"And Porto," he went on, because if he stopped he would never start again. "I didn't say Porto because I wanted you to go. I said Porto because I'm frightened. Because a man with a claret tie stood on a pavement in Aix and talked about your sister, and I can't bear it. I can't bear the idea of you being in this house when he comes, if he comes. I'd rather you were in Porto, being fed by Fernanda, hating me, than here." He took a breath. "That's what I meant. I said it like an idiot. I'm sorry."</w:t>
+        <w:t>"And Porto," he went on, because if he stopped he would never start again. "I didn't say Porto because I wanted you to go. I said Porto because I'm frightened. Because a man with a claret tie stood in a car park in Aix and talked about your sister, and I can't bear it. I can't bear the idea of you being in this house when he comes, if he comes. I'd rather you were in Porto, being fed by Fernanda, hating me, than here." He took a breath. "That's what I meant. I said it like an idiot. I'm sorry."</w:t>
       </w:r>
     </w:p>
     <w:p>
@@ -9204,12 +9221,12 @@
     </w:p>
     <w:p>
       <w:r>
-        <w:t>The gate was locked. They climbed it, which is how a locked gate announces itself to the unlucky, and the first Gaston stepped onto a layer of marbles Hugo had laid that afternoon for reasons of his own.</w:t>
-      </w:r>
-    </w:p>
-    <w:p>
-      <w:r>
-        <w:t>What followed was a precise geometry of misfortune. Gaston One's legs went east. Gaston Two, reaching out to catch him, grasped the hall coat-stand, which toppled, and brought down two walking sticks and a brass gong that Madame Fournier had always said was a decoration. The sound rang through the valley. Both men arrived at the kitchen door in a tangle of coats.</w:t>
+        <w:t>The gate was locked. They climbed it, which is how a locked gate announces itself to the unlucky, and the first Gaston came down on the far side onto the brass gong that Madame Fournier kept on the porch as a decoration, and which Hugo had carried down the drive that afternoon and propped against the inside of the gate, he said afterwards, "for acoustic reasons." The sound went round the valley like the end of the world. Over the wall, in Madame Fournier's kitchen, three heads came up from the biscuit tin at once.</w:t>
+      </w:r>
+    </w:p>
+    <w:p>
+      <w:r>
+        <w:t>The Gastons, who had come too far to go home, went in by the kitchen door, which Tobias, in his hurry to get over the wall to the biscuit tin, had left on the latch, and stood in the dark hall breathing.</w:t>
       </w:r>
     </w:p>
     <w:p>
@@ -9219,47 +9236,139 @@
     </w:p>
     <w:p>
       <w:r>
-        <w:t>Upstairs, a torch clicked on beneath a chin.</w:t>
-      </w:r>
-    </w:p>
-    <w:p>
-      <w:r>
-        <w:t>They did not find the stairs easily. Each step had been polished with olive oil from the six litres Catarina had bought at the mill, which Hugo said afterwards had been "a very good oil, actually, peppery." Gaston Two reached the landing on his knees. Gaston One reached it on his back, feet first, like a man arriving at a party by toboggan.</w:t>
-      </w:r>
-    </w:p>
-    <w:p>
-      <w:r>
-        <w:t>"The study!" hissed Gaston One. "The originals are in the study!"</w:t>
-      </w:r>
-    </w:p>
-    <w:p>
-      <w:r>
-        <w:t>The study door was not locked. That was the trap. It opened so easily that Gaston Two, who had put his whole shoulder into it, went straight across the room, stepped on a tray of cold custard that had been left with great care in front of the window seat, and went out through the open window with a long, thin, receding cry, and landed in Madame Fournier's rosemary bed, which was soft, and very old, and had views on visitors.</w:t>
-      </w:r>
-    </w:p>
-    <w:p>
-      <w:r>
-        <w:t>From the window seat, in the dark, a small voice spoke.</w:t>
-      </w:r>
-    </w:p>
-    <w:p>
-      <w:r>
-        <w:t>"I'm nine," said Hugo. "My father's a solicitor. I know all about trespass."</w:t>
-      </w:r>
-    </w:p>
-    <w:p>
-      <w:r>
-        <w:t>By the time Tobias and Catarina had got back over the wall, which took longer than it should have, because the gong had rung through the valley like the end of the world and Madame Fournier had insisted on coming too, with her secateurs, in case of emergencies, it was over. They found a white van abandoned in the lane, two men on the lawn, one of them stuck all over with rosemary and the other wearing the bead curtain from the kitchen door like a shawl, tangled together in the garden hose and a string of Christmas lights from the cellar, and a pelican standing on one chest with the air of a bird who had not been asked and did not intend to give a statement. In the porch sat Hugo, in his pyjamas, with a mug of cocoa.</w:t>
-      </w:r>
-    </w:p>
-    <w:p>
-      <w:r>
-        <w:t>"I rang the Inspector," said Hugo, not looking up. "She's on her way. I did my father's voice. She's very cross. Also I ate your biscuits."</w:t>
-      </w:r>
-    </w:p>
-    <w:p>
-      <w:r>
-        <w:t>Mara arrived at a quarter to midnight in a dressing gown, wellington boots and a raincoat, with her service card in one hand and a torch in the other, followed by two gendarmes from Saint-Martin who had been playing cards and had brought the cards. She looked at the lawn for a long time. She looked at the pelican. She looked at Hugo.</w:t>
+        <w:t>The study light came on at the top of the stairs.</w:t>
+      </w:r>
+    </w:p>
+    <w:p>
+      <w:r>
+        <w:t>Hugo was sitting on the window seat in his pyjamas, with his library book open on his knee and his torch beside him, and he looked down the stairs at two men in balaclavas with the polite, slightly disappointed expression of a librarian receiving a late return.</w:t>
+      </w:r>
+    </w:p>
+    <w:p>
+      <w:r>
+        <w:t>"Good evening," he said. "You're trespassing. That's article 226-4 if it's a home, which it is. And there's a minor present, which is me, so a court will take a very dim view. I'm just telling you. In case nobody had."</w:t>
+      </w:r>
+    </w:p>
+    <w:p>
+      <w:r>
+        <w:t>The Gastons looked at each other.</w:t>
+      </w:r>
+    </w:p>
+    <w:p>
+      <w:r>
+        <w:t>"Also," said Hugo, "I wouldn't come up. There's a snake in the window seat."</w:t>
+      </w:r>
+    </w:p>
+    <w:p>
+      <w:r>
+        <w:t>"A snake," said Gaston Two.</w:t>
+      </w:r>
+    </w:p>
+    <w:p>
+      <w:r>
+        <w:t xml:space="preserve">"A Montpellier snake. </w:t>
+      </w:r>
+      <w:r>
+        <w:rPr>
+          <w:i/>
+        </w:rPr>
+        <w:t>Malpolon monspessulanus.</w:t>
+      </w:r>
+      <w:r>
+        <w:t xml:space="preserve"> It's the biggest snake in France. It can be two metres. It's back-fanged, so it has to chew a bit to get the venom in, but it does get it in." He tapped the cushion beside him, quite gently, with the torch. "It lives in here. It's been in this house since the spring. Everybody's seen it except the grown-ups. I've been sitting on it for an hour to keep it calm. If you come up the stairs I'll have to get off it, because I'm not stupid."</w:t>
+      </w:r>
+    </w:p>
+    <w:p>
+      <w:r>
+        <w:t>There was a long silence in the hall. Under the cushion, something in the window seat, which was in fact the hollow behind the false back and contained, as far as anybody knew, nothing but dust, made no sound whatsoever, which in the circumstances was the most frightening sound a window seat could make.</w:t>
+      </w:r>
+    </w:p>
+    <w:p>
+      <w:r>
+        <w:t>"Gaston," said Gaston One, very quietly, "the originals are in the study."</w:t>
+      </w:r>
+    </w:p>
+    <w:p>
+      <w:r>
+        <w:t>"Then you go to the study," said Gaston Two, "and I will wait in the van, and tell your mother."</w:t>
+      </w:r>
+    </w:p>
+    <w:p>
+      <w:r>
+        <w:t>Hugo turned a page of his book.</w:t>
+      </w:r>
+    </w:p>
+    <w:p>
+      <w:r>
+        <w:t>"It hisses when it's angry," he said, without looking up. "Quite loudly. Like a tyre."</w:t>
+      </w:r>
+    </w:p>
+    <w:p>
+      <w:r>
+        <w:t>It was at this moment that the pelican, who had been asleep on the porch and had been woken by the gong and had come in through the open kitchen door to see who was responsible, put its enormous head round the hall door behind the two Gastons in the dark and, finding nobody with bread, opened its beak to its fullest extent and let out the long, low, wheezing hiss of a large bird that has been disturbed for nothing.</w:t>
+      </w:r>
+    </w:p>
+    <w:p>
+      <w:r>
+        <w:t>The Gastons left by the nearest exit, which was the hall window. It was not open. That was a matter for the insurance. They went across the lawn at a speed that did them great credit, and the first one, looking back over his shoulder for the snake, ran straight off the end of the garden into the shallows of the pond, and the second, who had been holding onto the first one's coat, followed him in, and they stood up to their waists among the reeds in the black water, gasping, while a heron rose out of the dark beside them with a cry of complete disgust.</w:t>
+      </w:r>
+    </w:p>
+    <w:p>
+      <w:r>
+        <w:t>Hugo came down to the jetty with his torch, in his pyjamas and a coat, and sat on the end of it with his legs crossed and his notebook open, and took their statement.</w:t>
+      </w:r>
+    </w:p>
+    <w:p>
+      <w:r>
+        <w:t>"Names," he said.</w:t>
+      </w:r>
+    </w:p>
+    <w:p>
+      <w:r>
+        <w:t>"Gaston," said both Gastons.</w:t>
+      </w:r>
+    </w:p>
+    <w:p>
+      <w:r>
+        <w:t xml:space="preserve">"I'll put </w:t>
+      </w:r>
+      <w:r>
+        <w:rPr>
+          <w:i/>
+        </w:rPr>
+        <w:t>the one who shouts</w:t>
+      </w:r>
+      <w:r>
+        <w:t xml:space="preserve"> and </w:t>
+      </w:r>
+      <w:r>
+        <w:rPr>
+          <w:i/>
+        </w:rPr>
+        <w:t>the one who falls</w:t>
+      </w:r>
+      <w:r>
+        <w:t>," said Hugo, writing. "What were you sent for?"</w:t>
+      </w:r>
+    </w:p>
+    <w:p>
+      <w:r>
+        <w:t>They told him. They told a nine-year-old with a torch everything, standing in a pond in the cold, because the pelican was walking up and down the jetty behind him, and because, the first Gaston said later, in court, there are moments in a man's life when he needs very badly to explain himself to somebody, and the somebody is not always the one he would have chosen.</w:t>
+      </w:r>
+    </w:p>
+    <w:p>
+      <w:r>
+        <w:t>By the time Tobias and Catarina had got back over the wall, which took longer than it should have, because Madame Fournier had insisted on coming too, with her secateurs, in case of emergencies, it was more or less over. They found a white van abandoned in the lane, a broken hall window, two men up to their waists in the pond, a pelican patrolling the jetty above them with the air of a bird who had not been asked and did not intend to give a statement, and Hugo, at the end of the planks, with a notebook, reading their own words back to them to make sure he had got it right.</w:t>
+      </w:r>
+    </w:p>
+    <w:p>
+      <w:r>
+        <w:t>"I rang the Inspector," said Hugo, not looking up. "She's on her way. I did my father's voice. She's very cross. There isn't a snake, by the way. Well, there is, but it's a different one, and it's harmless, and I've never actually found it." He turned a page. "Also I ate your biscuits."</w:t>
+      </w:r>
+    </w:p>
+    <w:p>
+      <w:r>
+        <w:t>Mara arrived at a quarter to midnight in a dressing gown, wellington boots and a raincoat, with her service card in one hand and a torch in the other, followed by two gendarmes from Saint-Martin who had been playing cards and had brought the cards. She looked at the pond for a long time. She looked at the pelican. She looked at Hugo.</w:t>
       </w:r>
     </w:p>
     <w:p>
@@ -9269,12 +9378,12 @@
     </w:p>
     <w:p>
       <w:r>
-        <w:t>"Mostly," said Hugo. "The pelican did the end."</w:t>
-      </w:r>
-    </w:p>
-    <w:p>
-      <w:r>
-        <w:t>She interviewed the Gastons in the kitchen, at the table, with the Christmas lights still wound round them, because nobody could find the end of the hose. They were not difficult to interview. They were, in fact, almost pathetically eager to be interviewed, in the way of men who have spent a long evening being defeated by a child and would like very much to talk to an adult about anything at all.</w:t>
+        <w:t>"I mostly talked," said Hugo. "The pelican did the end."</w:t>
+      </w:r>
+    </w:p>
+    <w:p>
+      <w:r>
+        <w:t>She interviewed the Gastons in the kitchen, at the table, wrapped in two of Henri Fournier's army blankets, dripping onto the tiles. They were not difficult to interview. They were, in fact, almost pathetically eager to be interviewed, in the way of men who have spent a long evening being defeated by a child and would like very much to talk to an adult about anything at all.</w:t>
       </w:r>
     </w:p>
     <w:p>
@@ -9315,7 +9424,7 @@
     </w:p>
     <w:p>
       <w:r>
-        <w:t>The second Gaston looked at him with the deep, wounded wariness of a man who has fallen out of a window because of custard.</w:t>
+        <w:t>The second Gaston looked at him with the deep, wounded wariness of a man who has gone through a window because of a snake that was not there.</w:t>
       </w:r>
     </w:p>
     <w:p>
@@ -9330,12 +9439,12 @@
     </w:p>
     <w:p>
       <w:r>
-        <w:t>The Gastons were taken away at half past midnight in the back of the gendarmes' car, still wrapped, at their own request, in the Christmas lights, because the first Gaston said he did not trust himself with the hose. As the car went down the lane, its blue light turning, the lights round the Gastons were still plugged into nothing and still, somehow, faintly twinkling, and Madame Fournier, at the gate with her secateurs, watched them go with an expression of deep satisfaction.</w:t>
-      </w:r>
-    </w:p>
-    <w:p>
-      <w:r>
-        <w:t>"Henri bought those lights in 1987," she said. "They have never once worked at Christmas."</w:t>
+        <w:t>The Gastons were taken away at half past midnight in the back of the gendarmes' car, still in the army blankets, which Madame Fournier said they could keep, as they had been bought for a war and had finally seen action. As the car went down the lane with its blue light turning, she stood at the gate with her secateurs and watched it go with an expression of deep satisfaction.</w:t>
+      </w:r>
+    </w:p>
+    <w:p>
+      <w:r>
+        <w:t>"Henri bought that gong in 1987," she said. "It has never once been rung for dinner."</w:t>
       </w:r>
     </w:p>
     <w:p>
@@ -10067,9 +10176,214 @@
       </w:pPr>
       <w:bookmarkStart w:id="34" w:name="ch_31"/>
       <w:r>
-        <w:t>Chapter 31: The Second Box</w:t>
+        <w:t>Chapter 31: Edouard</w:t>
       </w:r>
       <w:bookmarkEnd w:id="34"/>
+    </w:p>
+    <w:p>
+      <w:pPr>
+        <w:ind w:firstLine="0"/>
+      </w:pPr>
+      <w:r>
+        <w:t>On the last evening before the warrant, Maître Edouard Delacroix-Roux polished the brass plate himself.</w:t>
+      </w:r>
+    </w:p>
+    <w:p>
+      <w:r>
+        <w:t>He did it at nine o'clock, when the Cours Mirabeau had emptied and the waiters across the road were stacking chairs, with a tin of Miror and a soft yellow cloth that he kept in the bottom drawer of his desk, under the files that nobody else was permitted to open. He went down the three steps of the hôtel particulier in his shirtsleeves, which nobody in Aix had ever seen, and stood on the pavement under the plane trees, and polished all seven plates beside the great door, the other avocats' first, one by one, the way he had been taught, in small circles, never along the grain, and his own last.</w:t>
+      </w:r>
+    </w:p>
+    <w:p>
+      <w:r>
+        <w:t>DELACROIX-ROUX, AVOCAT AU BARREAU.</w:t>
+      </w:r>
+    </w:p>
+    <w:p>
+      <w:r>
+        <w:t>His mother had polished those plates for thirty-one years. Not his: the others. She had been the concierge of the building from 1968 until her knees went, and she had lived with her son in the two rooms of the lodge under the archway, where the light came in from the courtyard at an angle and the lawyers' shoes went past the window all day at the height of her head. Every morning at seven, before the avocats came, she had gone out with the tin and the yellow cloth, and every morning, for thirty-one years, eleven men in good coats had come up the steps past her and said nothing at all, because one does not say good morning to the brass.</w:t>
+      </w:r>
+    </w:p>
+    <w:p>
+      <w:r>
+        <w:t xml:space="preserve">All but one. A young avocat on the second floor, new, hungry, from Marseille, who had said </w:t>
+      </w:r>
+      <w:r>
+        <w:rPr>
+          <w:i/>
+        </w:rPr>
+        <w:t>bonjour, Madame Roux</w:t>
+      </w:r>
+      <w:r>
+        <w:t xml:space="preserve"> on his first day and every day after, and who had noticed the boy doing his homework at the lodge table under the archway, and asked to see it, and read it, and paid, without being asked and without ever mentioning it again, for the lycée, and the faculty, and the good suit for the oath. His name was Armand Vial. He had left the bar long ago for money, which was more interesting, and he had never once asked Edouard for anything in return, which was how Edouard had known, from the age of fourteen, that one day he would ask for everything.</w:t>
+      </w:r>
+    </w:p>
+    <w:p>
+      <w:r>
+        <w:t xml:space="preserve">He had taken the name Delacroix at twenty-five, when he took the oath. It had been on the brass plate she polished longest, the old bâtonnier on the first floor, who had walked past her for nineteen years and had died without knowing she had a name. Edouard had simply added it to his own, as a man adds a room to a house. Nobody had asked. In France a hyphen is a kind of passport. He kept </w:t>
+      </w:r>
+      <w:r>
+        <w:rPr>
+          <w:i/>
+        </w:rPr>
+        <w:t>Roux</w:t>
+      </w:r>
+      <w:r>
+        <w:t xml:space="preserve"> on the end, out of loyalty, and because it was the name he gave to night porters in Lyon, on the rare evenings when he did not wish to be anybody.</w:t>
+      </w:r>
+    </w:p>
+    <w:p>
+      <w:r>
+        <w:t>The umbrella had been the bâtonnier's, too. He had left it in the lodge one wet afternoon in 1979, propped by the door while he complained about a parcel, and had never come back for it, and Madame Roux had kept it for him in the corner for nineteen years, furled, in case he asked. He never asked. Edouard had carried it every day since the oath, in every weather, the way another man might carry a medal. People thought it was an affectation. It was a receipt. He kept cheaper ones, from the Monoprix, for leaving behind in car parks as a message; this one never left his hand.</w:t>
+      </w:r>
+    </w:p>
+    <w:p>
+      <w:r>
+        <w:t>He put the tin away. He washed his hands at the basin in the cloakroom and dried them carefully, one, then the other, and the sleeves of his shirt, which were dry, out of habit.</w:t>
+      </w:r>
+    </w:p>
+    <w:p>
+      <w:pPr>
+        <w:spacing w:before="160" w:after="160"/>
+        <w:ind w:firstLine="0"/>
+        <w:jc w:val="center"/>
+      </w:pPr>
+      <w:r>
+        <w:t>*  *  *</w:t>
+      </w:r>
+    </w:p>
+    <w:p>
+      <w:pPr>
+        <w:ind w:firstLine="0"/>
+      </w:pPr>
+      <w:r>
+        <w:t>He was not afraid. He wanted that understood, if only by himself.</w:t>
+      </w:r>
+    </w:p>
+    <w:p>
+      <w:r>
+        <w:t xml:space="preserve">Hale had been taken that morning from the end of the jetty, and Hale would talk, because Hale was a man who had always talked: to waiters, to authors, to the speaker of his own telephone. Let him. Hale's word was a cashier's word. Hale had stood at a window and seen nothing, and had checked, beforehand, that nothing could be seen. The tape had a first name on it, and there were, Edouard knew exactly, forty-one avocats called Edouard at the bar of Aix. The bolt was a bolt. The hose was a hose. Moutet would say what Moutet had always said, because once you have said </w:t>
+      </w:r>
+      <w:r>
+        <w:rPr>
+          <w:i/>
+        </w:rPr>
+        <w:t>of course, Victor</w:t>
+      </w:r>
+      <w:r>
+        <w:t xml:space="preserve"> there is no other sentence left. And the jetty had been dark, and empty, and the only light for half a kilometre had been the study window, where Hale had stood with his hands in his pockets, doing what he was told.</w:t>
+      </w:r>
+    </w:p>
+    <w:p>
+      <w:r>
+        <w:t>There had been nobody else. He had walked back along the wall past the reeds in the moonlight, drying his hands, and there had been nobody, only the reeds and the mud and the smell of the water, and once a small sound, like a bird settling. One does not look at a bird settling. One does not look at the reeds.</w:t>
+      </w:r>
+    </w:p>
+    <w:p>
+      <w:r>
+        <w:t>He sat at his desk with the lamp on and the umbrella against the wall where it always stood, and he thought, for the first time in some months, about Elise Marchetti.</w:t>
+      </w:r>
+    </w:p>
+    <w:p>
+      <w:r>
+        <w:t>She had not been afraid either. That had surprised him. She had stood on the end of the jetty in her grey wool coat with her hands in her pockets, exactly as Hale was standing now at the window, and she had listened to him explain, very reasonably, what she would sign and what she would forget, and at the end she had laughed. Not unkindly. She had laughed the way the English laugh at a waiter's French.</w:t>
+      </w:r>
+    </w:p>
+    <w:p>
+      <w:r>
+        <w:rPr>
+          <w:i/>
+        </w:rPr>
+        <w:t>You're not his partner,</w:t>
+      </w:r>
+      <w:r>
+        <w:t xml:space="preserve"> she had said. </w:t>
+      </w:r>
+      <w:r>
+        <w:rPr>
+          <w:i/>
+        </w:rPr>
+        <w:t>I've read the accounts. You're his doorman. He's paid you to stand at the door since you were fourteen.</w:t>
+      </w:r>
+    </w:p>
+    <w:p>
+      <w:r>
+        <w:t>He had not intended to do it then. He wanted that understood, too. He had intended to give her until the end of the week. But she had turned to go back up to the house, and he had seen the back of her coat going away from him, up the jetty, towards the lit window, not looking back, as eleven men in good coats had gone up the steps past his mother every morning for thirty-one years, and his hand had gone out to her shoulder before he had decided anything at all.</w:t>
+      </w:r>
+    </w:p>
+    <w:p>
+      <w:r>
+        <w:t>He did not think about the rest. He had trained himself not to, in the way he had trained himself to polish in small circles, never along the grain.</w:t>
+      </w:r>
+    </w:p>
+    <w:p>
+      <w:pPr>
+        <w:spacing w:before="160" w:after="160"/>
+        <w:ind w:firstLine="0"/>
+        <w:jc w:val="center"/>
+      </w:pPr>
+      <w:r>
+        <w:t>*  *  *</w:t>
+      </w:r>
+    </w:p>
+    <w:p>
+      <w:pPr>
+        <w:ind w:firstLine="0"/>
+      </w:pPr>
+      <w:r>
+        <w:t>On Sundays he went to see his mother.</w:t>
+      </w:r>
+    </w:p>
+    <w:p>
+      <w:r>
+        <w:t>She was ninety-one, and lived now in a home on the road to Éguilles, in a room with a window onto a car park, where she sat in a chair by the radiator and did not know him. She thought, most Sundays, that he was a lawyer from the first floor come to complain about the post. She apologised to him for it. Every week he brought her a box of calissons from the shop on the rue Gaston de Saporta, the good one, the one with the ribbon, because she had sold them in the market when he was a child and had never once been able to afford to eat one, and every week she thanked him with a kind of frightened politeness, and offered him one, and he took it, and they ate them together in silence while the radiator ticked.</w:t>
+      </w:r>
+    </w:p>
+    <w:p>
+      <w:r>
+        <w:t>He bought the calissons for everybody. For Raymond Coste at Christmas, with the envelope. For the Gastons in Toulon, under the money. He had never asked himself why. It had seemed, simply, the correct thing to bring.</w:t>
+      </w:r>
+    </w:p>
+    <w:p>
+      <w:r>
+        <w:t>Valentina Marchetti had also been ninety-one, in a room in Lyon with a window onto nothing, and had also not known who he was when he put the pen into her hand and closed her fingers round it. He had not let himself notice that at the time, and he did not let himself notice it now.</w:t>
+      </w:r>
+    </w:p>
+    <w:p>
+      <w:r>
+        <w:t>It was nearly eleven. He turned off the lamp. He would sleep well; he always slept well. In the morning he would put on the claret tie, because to leave it off now would be to admit that a tie could matter, and walk down the three steps at nine as he always did.</w:t>
+      </w:r>
+    </w:p>
+    <w:p>
+      <w:r>
+        <w:t>On the way out, he stopped at the lodge under the archway, which was a bicycle store now, with a combination lock on the door, and stood for a moment in front of it in the dark with his hand on the cold iron of the grille.</w:t>
+      </w:r>
+    </w:p>
+    <w:p>
+      <w:r>
+        <w:rPr>
+          <w:i/>
+        </w:rPr>
+        <w:t>Bonjour, Madame Roux,</w:t>
+      </w:r>
+      <w:r>
+        <w:t xml:space="preserve"> he said, very quietly, to nobody, the way a young man from Marseille had said it once, when everybody else walked past.</w:t>
+      </w:r>
+    </w:p>
+    <w:p>
+      <w:r>
+        <w:t>Then he went out into the Cours Mirabeau, under the plane trees, with the umbrella under his arm, beneath a clear sky with every star in it, and not a drop of rain anywhere in Provence.</w:t>
+      </w:r>
+    </w:p>
+    <w:p>
+      <w:pPr>
+        <w:pStyle w:val="Heading2"/>
+        <w:pageBreakBefore/>
+      </w:pPr>
+      <w:bookmarkStart w:id="35" w:name="ch_32"/>
+      <w:r>
+        <w:t>Chapter 32: The Second Box</w:t>
+      </w:r>
+      <w:bookmarkEnd w:id="35"/>
     </w:p>
     <w:p>
       <w:pPr>
@@ -10208,7 +10522,7 @@
     </w:p>
     <w:p>
       <w:r>
-        <w:t xml:space="preserve">He saw Tobias first, and his face did nothing at all. He saw Catarina, and something moved at the corner of his mouth, a small, courteous, varnished thing, the ghost of the smile from the pavement on the rue Gaston de Saporta. </w:t>
+        <w:t xml:space="preserve">He saw Tobias first, and his face did nothing at all. He saw Catarina, and something moved at the corner of his mouth, a small, courteous, varnished thing, the ghost of the smile from the hospital car park. </w:t>
       </w:r>
       <w:r>
         <w:rPr>
@@ -10389,6 +10703,20 @@
     </w:p>
     <w:p>
       <w:r>
+        <w:t xml:space="preserve">"There was a difficulty," he said, on the doorstep, before he had even taken off his coat, because he was a man who told things in order. "Inside the box was a steel case. Inside the steel case, the lawyers said, was the property of the Fondation Vial, and the case had a lock of four numbers, and nobody alive, the lawyers said, knew the four numbers. The bank's register said the case had been brought in, in March, by a Monsieur Victor Hale, who had been sent with it by his chairman, as a cashier is sent to the bank. Monsieur Vial was at sea. A locksmith would need a drill, and a week, and a drill is not a thing one points at six hundred years of vellum." He paused. "Your Inspector asked the director for one minute. She took a card from her pocket, in a plastic sleeve, in an Englishwoman's handwriting. </w:t>
+      </w:r>
+      <w:r>
+        <w:rPr>
+          <w:i/>
+        </w:rPr>
+        <w:t>The same four numbers for everything.</w:t>
+      </w:r>
+      <w:r>
+        <w:t xml:space="preserve"> She turned the wheels. One, nine, seven, three. The year of an orange car." For the first time since they had known him, Anselm Brunner very nearly laughed. "The case opened. The lawyers stopped objecting. I have never heard lawyers stop before. It is like a clock stopping."</w:t>
+      </w:r>
+    </w:p>
+    <w:p>
+      <w:r>
         <w:t>He sat in the kitchen. He declined tea. He accepted water, in the cup with the chip, and drank it with his back very straight. Then he put the leather case on the oilcloth, between the bread and the dictionaries, and opened it, and took out, in white cotton gloves, a book.</w:t>
       </w:r>
     </w:p>
@@ -10408,7 +10736,7 @@
     </w:p>
     <w:p>
       <w:r>
-        <w:t>"A book of hours," said Brunner, very quietly. "For prayer. For a private person, a lady perhaps, to carry with her through the day. Made in Avignon, in 1347, when the popes lived there, by somebody whose name we do not know, who was very good, and very patient, and probably not paid enough." He opened the clasps, one, then the other, with a small click each, like a clock being wound. "Two hundred and thirty years we have looked for it. Since the Revolution. It has been in Lyon, and in Turin, and in a château near Tours, and in a bank in Geneva, and in the bedroom of an old lady with dementia who thought it was her missal. And for the last two years it has been in a box in the rue Paradis, belonging to a man who gave two million euros to be photographed with a cardinal and never once, I think, opened it."</w:t>
+        <w:t>"A book of hours," said Brunner, very quietly. "For prayer. For a private person, a lady perhaps, to carry with her through the day. Made in Avignon, in 1347, when the popes lived there, by somebody whose name we do not know, who was very good, and very patient, and probably not paid enough." He opened the clasps, one, then the other, with a small click each, like a clock being wound. "Two hundred and thirty years we have looked for it. Since the Revolution. It has been in Lyon, and in Turin, and in a château near Tours, and in a bank in Geneva, and in the bedroom of an old lady with dementia who thought it was her missal. And for the last two years it has been in a publisher's safe in Bloomsbury and then, since March, when an editor began to ask questions, in a box in the rue Paradis, belonging to a man who gave two million euros to be photographed with a cardinal and never once, I think, opened it."</w:t>
       </w:r>
     </w:p>
     <w:p>
@@ -10523,11 +10851,11 @@
         <w:pStyle w:val="Heading2"/>
         <w:pageBreakBefore/>
       </w:pPr>
-      <w:bookmarkStart w:id="35" w:name="ch_32"/>
-      <w:r>
-        <w:t>Chapter 32: The Commandant</w:t>
-      </w:r>
-      <w:bookmarkEnd w:id="35"/>
+      <w:bookmarkStart w:id="36" w:name="ch_33"/>
+      <w:r>
+        <w:t>Chapter 33: The Commandant</w:t>
+      </w:r>
+      <w:bookmarkEnd w:id="36"/>
     </w:p>
     <w:p>
       <w:pPr>
@@ -10931,11 +11259,11 @@
         <w:pStyle w:val="Heading2"/>
         <w:pageBreakBefore/>
       </w:pPr>
-      <w:bookmarkStart w:id="36" w:name="ch_33"/>
-      <w:r>
-        <w:t>Chapter 33: Dick Whittington</w:t>
-      </w:r>
-      <w:bookmarkEnd w:id="36"/>
+      <w:bookmarkStart w:id="37" w:name="ch_34"/>
+      <w:r>
+        <w:t>Chapter 34: Dick Whittington</w:t>
+      </w:r>
+      <w:bookmarkEnd w:id="37"/>
     </w:p>
     <w:p>
       <w:pPr>
@@ -11641,11 +11969,11 @@
         <w:pStyle w:val="Heading2"/>
         <w:pageBreakBefore/>
       </w:pPr>
-      <w:bookmarkStart w:id="37" w:name="ch_34"/>
-      <w:r>
-        <w:t>Chapter 34: The Trial</w:t>
-      </w:r>
-      <w:bookmarkEnd w:id="37"/>
+      <w:bookmarkStart w:id="38" w:name="ch_35"/>
+      <w:r>
+        <w:t>Chapter 35: The Trial</w:t>
+      </w:r>
+      <w:bookmarkEnd w:id="38"/>
     </w:p>
     <w:p>
       <w:pPr>
@@ -11657,7 +11985,7 @@
     </w:p>
     <w:p>
       <w:r>
-        <w:t>They were charged with breaking and entering, attempted theft, criminal damage to a brass gong, and, at the particular insistence of the prosecutor, who had a nine-year-old of her own, wilful ignorance of the ways of a child. Their lawyer was a tired young woman from the duty roster who had been given the file on the Friday and had read it, she told the court with some feeling, three times, in the hope that it would make more sense the third time, which it had not.</w:t>
+        <w:t>They were charged with breaking and entering, attempted theft, criminal damage to a hall window, and, at the particular insistence of the prosecutor, who had a nine-year-old of her own, wilful ignorance of the ways of a child. Their lawyer was a tired young woman from the duty roster who had been given the file on the Friday and had read it, she told the court with some feeling, three times, in the hope that it would make more sense the third time, which it had not.</w:t>
       </w:r>
     </w:p>
     <w:p>
@@ -11673,10 +12001,10 @@
         <w:rPr>
           <w:i/>
         </w:rPr>
-        <w:t>marbles</w:t>
-      </w:r>
-      <w:r>
-        <w:t xml:space="preserve"> in the police report. He explained, with diagrams he had prepared in advance on squared paper, the coefficient of friction of a good peppery olive oil on a waxed oak stair. He identified the first Gaston as "the one who shouts" and the second Gaston as "the one who falls," and both Gastons, from the dock, nodded, because it was true. When the duty lawyer asked him, gently, whether he had not been frightened, alone in a dark house at night with two grown men breaking in, Hugo considered the question with real seriousness.</w:t>
+        <w:t>Malpolon monspessulanus</w:t>
+      </w:r>
+      <w:r>
+        <w:t xml:space="preserve"> in the police report. He explained, with diagrams he had prepared in advance on squared paper, the difference between a Montpellier snake, which is back-fanged and bad-tempered, and a ladder snake, which is neither, and why a man who believes the first is under a cushion will leave a house by a window that is not open. He read out, from his notebook, the statement both defendants had given him from the pond, and both Gastons, from the dock, nodded, because it was accurate, and because he had read it back to them at the time. He identified the first Gaston as "the one who shouts" and the second Gaston as "the one who falls." When the duty lawyer asked him, gently, whether he had not been frightened, alone in a dark house at night with two grown men breaking in, Hugo considered the question with real seriousness.</w:t>
       </w:r>
     </w:p>
     <w:p>
@@ -12165,11 +12493,11 @@
         <w:pStyle w:val="Heading2"/>
         <w:pageBreakBefore/>
       </w:pPr>
-      <w:bookmarkStart w:id="38" w:name="ch_35"/>
-      <w:r>
-        <w:t>Chapter 35: The Courthouse Steps</w:t>
-      </w:r>
-      <w:bookmarkEnd w:id="38"/>
+      <w:bookmarkStart w:id="39" w:name="ch_36"/>
+      <w:r>
+        <w:t>Chapter 36: The Courthouse Steps</w:t>
+      </w:r>
+      <w:bookmarkEnd w:id="39"/>
     </w:p>
     <w:p>
       <w:pPr>
@@ -12446,11 +12774,11 @@
         <w:pStyle w:val="Heading2"/>
         <w:pageBreakBefore/>
       </w:pPr>
-      <w:bookmarkStart w:id="39" w:name="ch_36"/>
-      <w:r>
-        <w:t>Chapter 36: Margaret and Geoffrey</w:t>
-      </w:r>
-      <w:bookmarkEnd w:id="39"/>
+      <w:bookmarkStart w:id="40" w:name="ch_37"/>
+      <w:r>
+        <w:t>Chapter 37: Margaret and Geoffrey</w:t>
+      </w:r>
+      <w:bookmarkEnd w:id="40"/>
     </w:p>
     <w:p>
       <w:pPr>
@@ -12807,11 +13135,11 @@
         <w:pStyle w:val="Heading2"/>
         <w:pageBreakBefore/>
       </w:pPr>
-      <w:bookmarkStart w:id="40" w:name="epilogue"/>
+      <w:bookmarkStart w:id="41" w:name="epilogue"/>
       <w:r>
         <w:t>Epilogue: The Jetty</w:t>
       </w:r>
-      <w:bookmarkEnd w:id="40"/>
+      <w:bookmarkEnd w:id="41"/>
     </w:p>
     <w:p>
       <w:pPr>
@@ -13229,7 +13557,7 @@
     </w:p>
     <w:p>
       <w:r>
-        <w:t xml:space="preserve">She corrected one word. She put a small, firm, schoolteacher's circle round it, and wrote the right one above it, in her careful capitals. Then, under the line, she wrote her answer, first in Portuguese and then in English, and folded the page back along his folds, and gave it back to him, and looked out at the water, very pink, with her chin up, the way she had looked at the Hargreaveses at the inn in the Camargue, and at Victor Hale in the hall, and at a man with an umbrella on a pavement in Aix, and at a whole village hall in December shouting </w:t>
+        <w:t xml:space="preserve">She corrected one word. She put a small, firm, schoolteacher's circle round it, and wrote the right one above it, in her careful capitals. Then, under the line, she wrote her answer, first in Portuguese and then in English, and folded the page back along his folds, and gave it back to him, and looked out at the water, very pink, with her chin up, the way she had looked at the Hargreaveses at the inn in the Camargue, and at Victor Hale in the hall, and at a man with an umbrella in a car park in Aix, and at a whole village hall in December shouting </w:t>
       </w:r>
       <w:r>
         <w:rPr>

</xml_diff>

<commit_message>
Merge In Love with Murder, Actually round 3 (subtree only, from book-2-lectures-after-qed 239142c)
</commit_message>
<xml_diff>
--- a/In Love with Murder, Actually/In_Love_with_Murder_Actually.docx
+++ b/In Love with Murder, Actually/In_Love_with_Murder_Actually.docx
@@ -566,7 +566,7 @@
       <w:hyperlink w:anchor="ch_31" w:history="1">
         <w:r>
           <w:rPr/>
-          <w:t xml:space="preserve">Chapter 31: The Second Box</w:t>
+          <w:t xml:space="preserve">Chapter 31: Edouard</w:t>
         </w:r>
       </w:hyperlink>
     </w:p>
@@ -577,7 +577,7 @@
       <w:hyperlink w:anchor="ch_32" w:history="1">
         <w:r>
           <w:rPr/>
-          <w:t xml:space="preserve">Chapter 32: The Commandant</w:t>
+          <w:t xml:space="preserve">Chapter 32: The Second Box</w:t>
         </w:r>
       </w:hyperlink>
     </w:p>
@@ -588,7 +588,7 @@
       <w:hyperlink w:anchor="ch_33" w:history="1">
         <w:r>
           <w:rPr/>
-          <w:t xml:space="preserve">Chapter 33: Dick Whittington</w:t>
+          <w:t xml:space="preserve">Chapter 33: The Commandant</w:t>
         </w:r>
       </w:hyperlink>
     </w:p>
@@ -599,7 +599,7 @@
       <w:hyperlink w:anchor="ch_34" w:history="1">
         <w:r>
           <w:rPr/>
-          <w:t xml:space="preserve">Chapter 34: The Trial</w:t>
+          <w:t xml:space="preserve">Chapter 34: Dick Whittington</w:t>
         </w:r>
       </w:hyperlink>
     </w:p>
@@ -610,7 +610,7 @@
       <w:hyperlink w:anchor="ch_35" w:history="1">
         <w:r>
           <w:rPr/>
-          <w:t xml:space="preserve">Chapter 35: The Courthouse Steps</w:t>
+          <w:t xml:space="preserve">Chapter 35: The Trial</w:t>
         </w:r>
       </w:hyperlink>
     </w:p>
@@ -621,7 +621,18 @@
       <w:hyperlink w:anchor="ch_36" w:history="1">
         <w:r>
           <w:rPr/>
-          <w:t xml:space="preserve">Chapter 36: Margaret and Geoffrey</w:t>
+          <w:t xml:space="preserve">Chapter 36: The Courthouse Steps</w:t>
+        </w:r>
+      </w:hyperlink>
+    </w:p>
+    <w:p>
+      <w:pPr>
+        <w:ind w:firstLine="0" w:left="288"/>
+      </w:pPr>
+      <w:hyperlink w:anchor="ch_37" w:history="1">
+        <w:r>
+          <w:rPr/>
+          <w:t xml:space="preserve">Chapter 37: Margaret and Geoffrey</w:t>
         </w:r>
       </w:hyperlink>
     </w:p>
@@ -2118,7 +2129,7 @@
     </w:p>
     <w:p>
       <w:r>
-        <w:t>The snake, as far as anybody ever learned, was never found.</w:t>
+        <w:t>The snake was not found that autumn, nor that winter, by anybody.</w:t>
       </w:r>
     </w:p>
     <w:p>
@@ -3699,7 +3710,7 @@
     </w:p>
     <w:p>
       <w:r>
-        <w:t>She did not finish the thought. She had never been a woman for speeches. She paid for her coffee, left a generous tip for a waiter who would never know why, and went out into the grey Mediterranean light, and made a telephone call that would take eleven weeks to come to anything at all.</w:t>
+        <w:t>She did not finish the thought. She had never been a woman for speeches. She paid for her coffee, left a generous tip for a waiter who would never know why, and went out into the grey Mediterranean light, and made a telephone call to an old colleague in Lyon that would take some weeks to come to anything at all.</w:t>
       </w:r>
     </w:p>
     <w:p>
@@ -3743,7 +3754,7 @@
     </w:p>
     <w:p>
       <w:r>
-        <w:t>The courier was a young man on a motorbike who had never been up the lane before and did not intend to come up it again. He stood at the locked gate with a padded envelope held out in front of him like a summons, and waited for Tobias to walk down the gravel, and said, "Lind?" in the tone of a man who has been told the name will be difficult. Tobias signed a screen with his finger. The signature came out as a small, despairing wave. The courier looked at it, looked at Tobias, decided that it was close enough for the south of France, and left.</w:t>
+        <w:t>The courier was a young man on a motorbike who had never been up the lane before and did not intend to come up it again. Tobias signed a screen with his finger. The signature came out as a small, despairing wave. The courier looked at it, looked at Tobias, decided that it was close enough for the south of France, and left.</w:t>
       </w:r>
     </w:p>
     <w:p>
@@ -5464,7 +5475,7 @@
     </w:p>
     <w:p>
       <w:r>
-        <w:t>"Is a lobster." She stood with her hands in her coat pockets, looking at the starched cloths through the glass. "My father catches lobsters. In Afurada. Eighteen years. He sells them to a man on the quay for the price of a lunch. The man sells them to a man in Lisbon. The man in Lisbon sells them to a man here." She turned away from the window. "Everybody is pink because of what they eat."</w:t>
+        <w:t>"Is a lobster." She stood with her hands in her coat pockets, looking at the starched cloths through the glass. "My father catches lobsters. In Afurada. Eighteen years. He sells them to a man on the quay for the price of a lunch. The man sells them to a man in Lisbon. The man in Lisbon sells them to a man here." She turned away from the window. "Like the flamingos. Everybody is pink because of what they eat."</w:t>
       </w:r>
     </w:p>
     <w:p>
@@ -5804,7 +5815,7 @@
         <w:ind w:firstLine="0"/>
       </w:pPr>
       <w:r>
-        <w:t>They telephoned them all. It took the whole of the afternoon and most of Madame Fournier's patience with the grandson's laptop, which kept asking to update itself at moments of crisis like a waiter who will not stop asking whether everything is all right.</w:t>
+        <w:t>They telephoned them all, on the grandson's laptop, which kept asking to update itself at moments of crisis like a waiter who will not stop asking whether everything is all right.</w:t>
       </w:r>
     </w:p>
     <w:p>
@@ -5853,7 +5864,7 @@
     </w:p>
     <w:p>
       <w:r>
-        <w:t>They did the sum together, with a pencil, on the back of the contract from Hale, which seemed appropriate. Madame Fournier supplied the dates from the exercise books, whenever Hale had stayed himself or the house had stood empty. The visitors' book supplied the rest. Catarina did the arithmetic in Portuguese under her breath, which was faster than Tobias did it in English, and only once had to be stopped from including Henri's goat.</w:t>
+        <w:t>They did the sum on the back of Hale's contract, which seemed appropriate, with the dates from the exercise books and the visitors' book. Catarina did the arithmetic in Portuguese under her breath, faster than Tobias did it in English, and only once had to be stopped from including Henri's goat.</w:t>
       </w:r>
     </w:p>
     <w:p>
@@ -5935,7 +5946,7 @@
     </w:p>
     <w:p>
       <w:r>
-        <w:t>"My commandant," she said, "told me this morning, over the coffee machine, that if I opened another file with Victor Hale's name on it, I would spend Christmas directing traffic at the roundabout outside the Carrefour in Cavaillon. In a fluorescent tabard. He was very specific about the tabard." She did not smile. "He closed the Marchetti file in April. He leaned on the Aubry file in Lyon, which is not even his jurisdiction, until it closed. He plays golf on Thursday mornings at a club outside Marseille, and one of the people he plays golf with is the chairman of the Verrane Foundation. I can't prove any of that means anything. I can tell you it means I can't walk this upstairs."</w:t>
+        <w:t>"My commandant," she said, "told me this morning, over the coffee machine, that if I opened another file with Victor Hale's name on it, I would spend Christmas directing traffic at the roundabout outside the Carrefour in Cavaillon. In a fluorescent tabard. He was very specific about the tabard." She did not smile. "He closed the Marchetti file in April. He leaned on the Aubry file in Lyon, which is not even his jurisdiction, until it closed. I can't prove that means anything. I can tell you it means I can't walk this upstairs."</w:t>
       </w:r>
     </w:p>
     <w:p>
@@ -6298,7 +6309,7 @@
     </w:p>
     <w:p>
       <w:r>
-        <w:t>"Roux," he said. "Grey hair. Fifty, a little more. Beautiful suit. A tie like wine. An umbrella, and no rain. He went up at ten thirty-four. I write the time. I always write the time; it is a habit from the airport. I did not see him come down. There is a staircase at the back, for the kitchens. It goes to the yard. A man who knows hotels knows the back stairs."</w:t>
+        <w:t>He added only one thing. "He went up at ten thirty-four. I write the time. I always write the time; it is a habit from the airport. I did not see him come down. There is a staircase at the back, for the kitchens. It goes to the yard. A man who knows hotels knows the back stairs."</w:t>
       </w:r>
     </w:p>
     <w:p>
@@ -6346,7 +6357,7 @@
     </w:p>
     <w:p>
       <w:r>
-        <w:t>It was a congress week, Dona Graça explained, smuggling them up the back stairs, the very stairs, at four in the afternoon when the corridor was empty and the cardiologist was at a session on arrhythmia. Every hotel in Lyon was full of cardiologists. The room had been redecorated in May. The balcony railing had been replaced the day after the fall, by the hotel's maintenance man, Monsieur Bacri, on the instructions of the manager, before the police had finished their eight days, which Dona Graça had thought was strange at the time and thought was stranger now.</w:t>
+        <w:t>Dona Graça smuggled them up the back stairs, the very stairs, at four in the afternoon, while the cardiologist was at a congress session on arrhythmia. The room had been redecorated in May. The balcony railing had been replaced the day after the fall, by the hotel's maintenance man, Monsieur Bacri, on the instructions of the manager, before the police had finished their eight days, which Dona Graça had thought was strange at the time and thought was stranger now.</w:t>
       </w:r>
     </w:p>
     <w:p>
@@ -6486,7 +6497,7 @@
     </w:p>
     <w:p>
       <w:r>
-        <w:t>They had not planned to stay. They had planned to take the last train home. But the last train had been cancelled, because of a fault on the line near Valence, and every hotel in Lyon was full of cardiologists, and it was nine o'clock at night, and raining, for the first time in ten days, as if the city had been saving it.</w:t>
+        <w:t>They had not planned to stay. They had planned to take the last train home. But Monsieur Bacri wrote slowly, and carefully, and twice started a page again because a word had come out crooked, and neither of them had the heart to hurry a carpenter, and by the time the envelope was sealed the last train had gone, and every hotel in Lyon was full of cardiologists, and it was nine o'clock at night, and raining, for the first time in ten days, as if the city had been saving it.</w:t>
       </w:r>
     </w:p>
     <w:p>
@@ -6623,7 +6634,7 @@
         <w:t>Braço dormente.</w:t>
       </w:r>
       <w:r>
-        <w:t xml:space="preserve"> He did not mention it. She rubbed it anyway, briskly, from shoulder to wrist, without being asked, and then went into the shower cupboard singing something from a Lisbon radio station, off-key, and the cardiologists of Lyon went off to their congress, and nobody in the whole city, Tobias thought, could possibly have been as happy as he was about a cancelled train.</w:t>
+        <w:t xml:space="preserve"> He did not mention it. She rubbed it anyway, briskly, from shoulder to wrist, without being asked, and then went into the shower cupboard singing something from a Lisbon radio station, off-key, and the cardiologists of Lyon went off to their congress, and nobody in the whole city, Tobias thought, could possibly have been as happy as he was about a missed train.</w:t>
       </w:r>
     </w:p>
     <w:p>
@@ -7406,27 +7417,17 @@
     </w:p>
     <w:p>
       <w:r>
-        <w:t>Tobias opened one eye.</w:t>
-      </w:r>
-    </w:p>
-    <w:p>
-      <w:r>
-        <w:t>The Olivetti stood on the desk, very upright, its keys gleaming like a row of teeth. It was not a thing he had ever noticed having a face, but it had one now, in the arrangement of the carriage and the bell and the two round spools. It looked like a retired colonel who had been asked to wait in a draughty corridor.</w:t>
-      </w:r>
-    </w:p>
-    <w:p>
-      <w:r>
-        <w:t>"Good evening," it said. "I am a 1962 Olivetti Lettera 22 of the finest Italian manufacture, and I have been sat in the same position for six weeks. Do you know how many commas you leave out?"</w:t>
-      </w:r>
-    </w:p>
-    <w:p>
-      <w:r>
-        <w:t>"You're a typewriter," said Tobias. "I'm dreaming."</w:t>
-      </w:r>
-    </w:p>
-    <w:p>
-      <w:r>
-        <w:t xml:space="preserve">"Naturally. Nobody listens to a typewriter unless he has a temperature." The bell gave a small, offended ting. "I have typed every word you have written in this house. I have typed </w:t>
+        <w:t>Tobias opened one eye. The thermometer on the bedside table, which Catarina had left there with a note that said NOT FOR THE PELICAN, said thirty-nine point four, and the room was swimming gently, like a room in a boat.</w:t>
+      </w:r>
+    </w:p>
+    <w:p>
+      <w:r>
+        <w:t>The Olivetti, on the desk, had a face. It had not had one that afternoon. It was made of the carriage and the bell and the two round spools, and it looked like a retired colonel who had been kept waiting in a draughty corridor.</w:t>
+      </w:r>
+    </w:p>
+    <w:p>
+      <w:r>
+        <w:t xml:space="preserve">"I have typed </w:t>
       </w:r>
       <w:r>
         <w:rPr>
@@ -7435,7 +7436,7 @@
         <w:t>she put the tray outside the door</w:t>
       </w:r>
       <w:r>
-        <w:t xml:space="preserve"> forty-one times. I have typed </w:t>
+        <w:t xml:space="preserve"> forty-one times," it said. "I have typed </w:t>
       </w:r>
       <w:r>
         <w:rPr>
@@ -7449,96 +7450,347 @@
     </w:p>
     <w:p>
       <w:r>
-        <w:t>On the bedside table the chipped cup rocked on its saucer. It was the one Catarina had handed him on the first day, with the crack along the rim, and it had a small, high, eager voice that spoke very fast.</w:t>
-      </w:r>
-    </w:p>
-    <w:p>
-      <w:r>
-        <w:t xml:space="preserve">"She went into the lake," said the cup. "For paper. </w:t>
+        <w:t>On the bedside table the chipped cup rocked on its saucer, and said, in a small, high, fast voice, "She went into the lake for your paper. She held your hand on the jetty. And you said nothing for a week."</w:t>
+      </w:r>
+    </w:p>
+    <w:p>
+      <w:r>
+        <w:t>"My Portuguese is terrible," said Tobias, to a cup, at thirty-nine point four.</w:t>
+      </w:r>
+    </w:p>
+    <w:p>
+      <w:r>
+        <w:t>"She does not want your Portuguese," said the cup. "She wants to be met. Halfway. On purpose."</w:t>
+      </w:r>
+    </w:p>
+    <w:p>
+      <w:r>
+        <w:t>Then the room tipped the other way, and the colonel was a typewriter again, and the cup was a cup, and Tobias lay in the blankets, shivering and warm, and thought, in the half-light, of how many small, tireless kindnesses there had been in the house since September: the trays, the notes, the fourth stair she did not step on in the night because she had learned that it creaked. None of them had asked to be noticed. That, he thought, was rather the point of them, and rather the problem.</w:t>
+      </w:r>
+    </w:p>
+    <w:p>
+      <w:r>
+        <w:t>In the morning the fever had broken. The sun lay in pale squares on the quilt, and the study was perfectly tidy, and on the desk the Olivetti stood in its usual place with a sheet of paper in the roller. It was blank, apart from one line, in the neat, ungrammatical capitals he would have known anywhere.</w:t>
+      </w:r>
+    </w:p>
+    <w:p>
+      <w:r>
+        <w:t>THE SOUP IS HOT. (NOT IS THE SOUP.) I AM HAPPY YOU ARE BETTER.</w:t>
+      </w:r>
+    </w:p>
+    <w:p>
+      <w:r>
+        <w:t>Catarina came in with the tray. On it, steaming, was a mug of tea made properly for the first time: the pot warmed, the leaves left to stand, the milk in last. It was in the cup with the chip.</w:t>
+      </w:r>
+    </w:p>
+    <w:p>
+      <w:r>
+        <w:t>He took it, and held it in both hands, and looked at it for a long moment.</w:t>
+      </w:r>
+    </w:p>
+    <w:p>
+      <w:r>
+        <w:t>"It's a very good cup," said Catarina, a little shyly.</w:t>
+      </w:r>
+    </w:p>
+    <w:p>
+      <w:r>
+        <w:t>"Yes," said Tobias. "I think it has opinions."</w:t>
+      </w:r>
+    </w:p>
+    <w:p>
+      <w:r>
+        <w:t>She laughed, and sat on the edge of the bed, and for a while neither of them said anything at all. Outside, the clock in the hall struck eight. On the desk the Olivetti stayed discreetly silent. He did not tell her about the dream. A dream that has been explained is only a temperature, and this one had been thirty-nine point four. But he kept the sentence. Halfway, on purpose. He wrote it on the envelope under the typewriter, under the name.</w:t>
+      </w:r>
+    </w:p>
+    <w:p>
+      <w:pPr>
+        <w:pStyle w:val="Heading2"/>
+        <w:pageBreakBefore/>
+      </w:pPr>
+      <w:bookmarkStart w:id="26" w:name="ch_24"/>
+      <w:r>
+        <w:t>Chapter 24: The Road to Aix</w:t>
+      </w:r>
+      <w:bookmarkEnd w:id="26"/>
+    </w:p>
+    <w:p>
+      <w:pPr>
+        <w:ind w:firstLine="0"/>
+      </w:pPr>
+      <w:r>
+        <w:t>Inês's notebook ended with an address in Aix-en-Provence: Maître Étienne Barbier, Notaire, rue Gaston de Saporta, 17h00. Beneath it, underlined twice: the originals.</w:t>
+      </w:r>
+    </w:p>
+    <w:p>
+      <w:r>
+        <w:t>"The originals of what?" said Tobias.</w:t>
+      </w:r>
+    </w:p>
+    <w:p>
+      <w:r>
+        <w:t>"Of everything he stole," said Catarina. "If a lawyer keeps the contracts, then the lawyer is the one who can open the door." She tapped the page. "It is an hour. We go tomorrow. We are there by five."</w:t>
+      </w:r>
+    </w:p>
+    <w:p>
+      <w:r>
+        <w:t>They left at ten. They were not there by five.</w:t>
+      </w:r>
+    </w:p>
+    <w:p>
+      <w:r>
+        <w:t>The first delay was a stall at the side of the road, run by a woman in a straw hat selling the last figs of the year out of a wheelbarrow. "We stop for one minute," said Catarina, who knew about figs. They stopped for forty. The figs were purple and split and warm and tasted of a summer that had not yet finished with anyone, and the woman in the hat insisted that Tobias taste the grapes, and the quince jelly, and a small orange fruit nobody could name in any language, which turned out to be a persimmon, and by the time they drove off the back seat was a fruit bowl.</w:t>
+      </w:r>
+    </w:p>
+    <w:p>
+      <w:r>
+        <w:t>"This was a mistake," said Tobias, with juice running down his wrist. "We're going to be late."</w:t>
+      </w:r>
+    </w:p>
+    <w:p>
+      <w:r>
+        <w:t>"Paris can wait," said Catarina, with her mouth full.</w:t>
+      </w:r>
+    </w:p>
+    <w:p>
+      <w:r>
+        <w:t>"We're not going to Paris."</w:t>
+      </w:r>
+    </w:p>
+    <w:p>
+      <w:r>
+        <w:t>"Then the lawyer can wait."</w:t>
+      </w:r>
+    </w:p>
+    <w:p>
+      <w:r>
+        <w:t>The second delay was a goat farm, because there was a sign. The third was a ruined abbey on a hill, because Tobias remarked that it looked Romanesque, and Catarina said "Românico," and they both spent twenty minutes standing in an empty nave where the roof had fallen in and the sky had come to live, whispering because it seemed to demand it. The fourth was an olive mill, where an old man in a blue apron poured them a thimble of oil so green and peppery that Catarina coughed, wiped her eyes, and bought six litres.</w:t>
+      </w:r>
+    </w:p>
+    <w:p>
+      <w:r>
+        <w:t>"It is for the restaurant," she said defensively. "Fernanda will say it is too expensive. Then she will use all of it."</w:t>
+      </w:r>
+    </w:p>
+    <w:p>
+      <w:r>
+        <w:t>The fifth delay was a flat tyre.</w:t>
+      </w:r>
+    </w:p>
+    <w:p>
+      <w:r>
+        <w:t>It happened on a quiet road between two vineyards, in the warm middle of the afternoon, with the last bees of the year working the ivy on a wall like a machine nobody could turn off. Tobias stood over the spare wheel with the expression of a man reading a document in Latin.</w:t>
+      </w:r>
+    </w:p>
+    <w:p>
+      <w:r>
+        <w:t>"I have never changed a tyre," he said.</w:t>
+      </w:r>
+    </w:p>
+    <w:p>
+      <w:r>
+        <w:t>"You are English. You have a man."</w:t>
+      </w:r>
+    </w:p>
+    <w:p>
+      <w:r>
+        <w:t>"I did have a man. He was called the AA."</w:t>
+      </w:r>
+    </w:p>
+    <w:p>
+      <w:r>
+        <w:t>"Afasta-te," said Catarina, rolling up her sleeves. She was four minutes with the jack and the spanner, glistening, singing a tune from the radio under her breath, and when it was done she wiped her hands on her skirt and looked at him, hot and happy and absurdly beautiful, with oil on her cheek.</w:t>
+      </w:r>
+    </w:p>
+    <w:p>
+      <w:r>
+        <w:t>"What?" she said.</w:t>
+      </w:r>
+    </w:p>
+    <w:p>
+      <w:r>
+        <w:t>"Nothing," said Tobias. "I was thinking I should have married a mechanic."</w:t>
+      </w:r>
+    </w:p>
+    <w:p>
+      <w:r>
+        <w:t>"You are not married."</w:t>
+      </w:r>
+    </w:p>
+    <w:p>
+      <w:r>
+        <w:t>"No," said Tobias. "I was thinking it in advance."</w:t>
+      </w:r>
+    </w:p>
+    <w:p>
+      <w:r>
+        <w:t>She stood very still. A bee, somewhere, chose that moment to stop. Then Catarina turned, very pink, picked up the spanner, put it in the boot with extraordinary care, and said to the air in Portuguese, quite clearly, "Meu Deus, ele disse isso a sério."</w:t>
+      </w:r>
+    </w:p>
+    <w:p>
+      <w:r>
+        <w:t>He understood every word.</w:t>
+      </w:r>
+    </w:p>
+    <w:p>
+      <w:r>
+        <w:t>They did not reach Aix until half past six. The plane trees along the Cours Mirabeau were already throwing their long shadows, the fountains were running gold, and the notary's house in the rue Gaston de Saporta was a tall honey-coloured building with its shutters closed, a small brass plate that said MAÎTRE BARBIER, NOTAIRE, and a strip of police tape across the door, tied in a bow, as if somebody had wanted it to look nice.</w:t>
+      </w:r>
+    </w:p>
+    <w:p>
+      <w:r>
+        <w:t>A neighbour in a dressing gown, who had been waiting all day for somebody to tell, told them in rapid French. Two men in dark coats had come in the night, at about three. They were, she said, extremely loud for burglars. One had kept shouting "Gaston!", and the other had replied "Oui?", and the first had said, "Not you, the other Gaston!", and for a while it had gone on like that. They had still been carrying things down the stairs at six, when Maître Barbier, who lived on the second floor and rose at six every day of his life, came down in his slippers to see who was shouting his name. One of the Gastons had fallen on him. They had left with a safe, an umbrella stand and, for reasons the neighbour could not explain, a stuffed owl. And Maître Barbier, who was sixty-nine and had eleven weeks left before the law made every notary in France put down his pen at seventy, was in the hospital with a bruised arm and an extremely bad temper.</w:t>
+      </w:r>
+    </w:p>
+    <w:p>
+      <w:r>
+        <w:t>"Last night," said Tobias slowly.</w:t>
+      </w:r>
+    </w:p>
+    <w:p>
+      <w:r>
+        <w:t>"So we were never going to be in time," said Catarina. She looked back down the road towards the figs, the goats, the abbey, the oil and the tyre, and he could see her doing the sum. "Not at five. Not at noon. All day, we are late for nothing."</w:t>
+      </w:r>
+    </w:p>
+    <w:p>
+      <w:r>
+        <w:t>"That's the first time in history the figs have cost nothing."</w:t>
+      </w:r>
+    </w:p>
+    <w:p>
+      <w:r>
+        <w:t>"Is the first time in history," said Catarina, "anything in Provence cost nothing."</w:t>
+      </w:r>
+    </w:p>
+    <w:p>
+      <w:pPr>
+        <w:spacing w:before="160" w:after="160"/>
+        <w:ind w:firstLine="0"/>
+        <w:jc w:val="center"/>
+      </w:pPr>
+      <w:r>
+        <w:t>*  *  *</w:t>
+      </w:r>
+    </w:p>
+    <w:p>
+      <w:pPr>
+        <w:ind w:firstLine="0"/>
+      </w:pPr>
+      <w:r>
+        <w:t>Maître Étienne Barbier received them in a corridor of the hospital, on a plastic chair, with his arm in a sling and his good coat over his shoulders like a cape, because he had refused to take it off for a nurse he described as a child. He was small and bald and furious, with eyebrows that did most of his talking, and he listened to Tobias's account of who they were with the expression of a man being sold a car.</w:t>
+      </w:r>
+    </w:p>
+    <w:p>
+      <w:r>
+        <w:t>"Marchetti," he said, when Tobias reached the name. The eyebrows went up and stayed there. "You think I keep Marchetti in my safe? After Giraud? After a notary in Avignon drives off a bridge with my name in his diary?" He snorted. "Monsieur, I am sixty-nine. I did not reach sixty-nine by being stupid. They stole three wills, a lease and an owl. The owl belonged to my father. They are welcome to it. It was always looking at me."</w:t>
+      </w:r>
+    </w:p>
+    <w:p>
+      <w:r>
+        <w:t>"Then where are the originals?"</w:t>
+      </w:r>
+    </w:p>
+    <w:p>
+      <w:r>
+        <w:t xml:space="preserve">"Mademoiselle Marchetti took them to a bank in March. On my advice. A safe deposit box, here, on the Cours Mirabeau." He shifted the sling and winced. "And she did not leave the key with me, before you ask. I asked her not to. I said, give it to somebody nobody would think of. She said she knew exactly the person. </w:t>
       </w:r>
       <w:r>
         <w:rPr>
           <w:i/>
         </w:rPr>
-        <w:t>Your</w:t>
-      </w:r>
-      <w:r>
-        <w:t xml:space="preserve"> paper. She talks to the toaster. She says good morning to the stove. She held your hand on the jetty and you said nothing for a week."</w:t>
-      </w:r>
-    </w:p>
-    <w:p>
-      <w:r>
-        <w:t>"I've said a great deal."</w:t>
-      </w:r>
-    </w:p>
-    <w:p>
-      <w:r>
-        <w:t>"You have said," said the Olivetti, "a great deal of rubbish, without a comma in it."</w:t>
-      </w:r>
-    </w:p>
-    <w:p>
-      <w:r>
-        <w:t>"My Portuguese is terrible," said Tobias.</w:t>
-      </w:r>
-    </w:p>
-    <w:p>
-      <w:r>
-        <w:t>"She does not want your Portuguese," said the cup.</w:t>
-      </w:r>
-    </w:p>
-    <w:p>
-      <w:r>
-        <w:t>"What does she want?"</w:t>
-      </w:r>
-    </w:p>
-    <w:p>
-      <w:r>
-        <w:t>The cup thought about it. It was the kind of silence in which, if you were a cup, you could hear all the soup in the world.</w:t>
-      </w:r>
-    </w:p>
-    <w:p>
-      <w:r>
-        <w:t>"She wants to be met," said the cup. "Halfway. On purpose."</w:t>
-      </w:r>
-    </w:p>
-    <w:p>
-      <w:r>
-        <w:t>Out in the garden the wind lifted, and in the long grass by the gate a very large white bird turned its head toward the lit window. Tobias lay in the blankets, shivering and warm, and in the half-light he saw for the first time how many small, tireless kindnesses there had been in the house since September: the trays, the notes, the stairs that did not creak when she came down in the night because she had learned which ones did. None of them had asked to be noticed. That, he thought, was rather the point of them, and rather the problem.</w:t>
-      </w:r>
-    </w:p>
-    <w:p>
-      <w:r>
-        <w:t>In the morning the fever had broken. The sun lay in pale squares on the quilt, and the study was perfectly tidy, and on the desk the Olivetti stood in its usual place with a sheet of paper in the roller. It was blank, apart from one line, in the neat, ungrammatical capitals he would have known anywhere.</w:t>
-      </w:r>
-    </w:p>
-    <w:p>
-      <w:r>
-        <w:t>THE SOUP IS HOT. (NOT IS THE SOUP.) I AM HAPPY YOU ARE BETTER.</w:t>
-      </w:r>
-    </w:p>
-    <w:p>
-      <w:r>
-        <w:t>Catarina came in with the tray. On it, steaming, was a mug of tea made properly for the first time: the pot warmed, the leaves left to stand, the milk in last. It was in the cup with the chip.</w:t>
-      </w:r>
-    </w:p>
-    <w:p>
-      <w:r>
-        <w:t>He took it, and held it in both hands, and looked at it for a long moment.</w:t>
-      </w:r>
-    </w:p>
-    <w:p>
-      <w:r>
-        <w:t>"It's a very good cup," said Catarina, a little shyly.</w:t>
-      </w:r>
-    </w:p>
-    <w:p>
-      <w:r>
-        <w:t>"Yes," said Tobias. "I think it has opinions."</w:t>
-      </w:r>
-    </w:p>
-    <w:p>
-      <w:r>
-        <w:t>She laughed, and sat on the edge of the bed, and for a while neither of them said anything at all. Outside, the clock in the hall struck eight. On the desk the Olivetti stayed discreetly silent. He did not tell her about the dream. A dream that has been explained is only a temperature. But he kept the sentence. Halfway, on purpose. He wrote it on the envelope under the typewriter, under the name.</w:t>
+        <w:t>A woman who keeps everything and trusts nobody,</w:t>
+      </w:r>
+      <w:r>
+        <w:t xml:space="preserve"> she said. </w:t>
+      </w:r>
+      <w:r>
+        <w:rPr>
+          <w:i/>
+        </w:rPr>
+        <w:t>She has a biscuit tin.</w:t>
+      </w:r>
+      <w:r>
+        <w:t xml:space="preserve"> I did not ask any more. A notary who asks more than he needs to is a notary who ends up in a diary."</w:t>
+      </w:r>
+    </w:p>
+    <w:p>
+      <w:r>
+        <w:t>Tobias and Catarina looked at each other.</w:t>
+      </w:r>
+    </w:p>
+    <w:p>
+      <w:r>
+        <w:t>"Odile," said Catarina.</w:t>
+      </w:r>
+    </w:p>
+    <w:p>
+      <w:r>
+        <w:t>"Madame Fournier," said Tobias, at the same moment, and Maître Barbier looked from one to the other, and his eyebrows came down a little, as if he had seen this kind of thing before, at the signing of marriage contracts, and had never much liked it.</w:t>
+      </w:r>
+    </w:p>
+    <w:p>
+      <w:r>
+        <w:t>He was leaning against their car in the hospital car park when they came out, as if he had been there for some time and did not mind, beside a long black saloon with a driver who did not look up. Close to, he was about fifty, immaculate, in a charcoal suit and a tie the colour of old claret, and he carried a furled black umbrella under a sky that had not held a cloud all day.</w:t>
+      </w:r>
+    </w:p>
+    <w:p>
+      <w:r>
+        <w:t>"Mr Lind," he said, in perfect, pleasant English. "I am so glad. I had hoped we might meet again."</w:t>
+      </w:r>
+    </w:p>
+    <w:p>
+      <w:r>
+        <w:t>"You left before the cheese," said Tobias, slowly. "At the Pemberton-Hayeses'."</w:t>
+      </w:r>
+    </w:p>
+    <w:p>
+      <w:r>
+        <w:t>"I never stay for the cheese. Maître Edouard Delacroix-Roux. I act for certain persons whose names you may know." He smiled. His teeth were extraordinary. "I wished to say, as a professional courtesy, how much I admire your novel."</w:t>
+      </w:r>
+    </w:p>
+    <w:p>
+      <w:r>
+        <w:t>"You've read it?"</w:t>
+      </w:r>
+    </w:p>
+    <w:p>
+      <w:r>
+        <w:t>"I have not read it. I have read a summary, which I understand is all that is left." He turned the umbrella slowly in his fingers. "It must be a great grief to lose two years of work. One would hate for anything similar to happen to the people one loves."</w:t>
+      </w:r>
+    </w:p>
+    <w:p>
+      <w:r>
+        <w:t>"Is that a threat?" said Catarina, in her very plainest English.</w:t>
+      </w:r>
+    </w:p>
+    <w:p>
+      <w:r>
+        <w:t>"A threat? Certainly not." Maître Delacroix-Roux looked at her with a tenderness so artificial it might have been varnished. "I was merely observing that the roads of Provence are most dangerous at dusk, mademoiselle. And that some people, for want of a decent education, cannot tell a landmark from a trap." He glanced up at the hospital windows, at the third floor, where a small bald man was sitting in a corridor with his coat on, then back to her. "Do give my regards to your sister. I understand she has been missing for some time. How very distressing."</w:t>
+      </w:r>
+    </w:p>
+    <w:p>
+      <w:r>
+        <w:t>He bowed, as one bows to a wedding guest, and got back into the car. It purred away out of the car park under the plane trees, and on the tarmac behind it lay one fallen leaf, and the umbrella, which he had left behind on purpose.</w:t>
+      </w:r>
+    </w:p>
+    <w:p>
+      <w:r>
+        <w:t>Catarina picked it up. Tobias took it from her very gently and snapped it in two.</w:t>
+      </w:r>
+    </w:p>
+    <w:p>
+      <w:r>
+        <w:t>"I don't like him," said Tobias.</w:t>
+      </w:r>
+    </w:p>
+    <w:p>
+      <w:r>
+        <w:t>"No," said Catarina. "He is a man who has never once been in a boat."</w:t>
+      </w:r>
+    </w:p>
+    <w:p>
+      <w:r>
+        <w:t>Edouard. The name in the margin of Inês's notebook, beside the twelfth of March. And the tie had been across a plate of vol-au-vents in October, and he had admired it. He wrote that down before he started the car, and then, because Catarina was watching him write it, he wrote underneath: I should have known at the supper. She took the pen and added, in capitals: NOBODY KNOWS AT THE SUPPER. THAT IS WHY IT IS A SUPPER.</w:t>
       </w:r>
     </w:p>
     <w:p>
@@ -7546,261 +7798,17 @@
         <w:pStyle w:val="Heading2"/>
         <w:pageBreakBefore/>
       </w:pPr>
-      <w:bookmarkStart w:id="26" w:name="ch_24"/>
-      <w:r>
-        <w:t>Chapter 24: The Road to Aix</w:t>
-      </w:r>
-      <w:bookmarkEnd w:id="26"/>
+      <w:bookmarkStart w:id="27" w:name="ch_25"/>
+      <w:r>
+        <w:t>Chapter 25: The Key</w:t>
+      </w:r>
+      <w:bookmarkEnd w:id="27"/>
     </w:p>
     <w:p>
       <w:pPr>
         <w:ind w:firstLine="0"/>
       </w:pPr>
       <w:r>
-        <w:t>Inês's notebook ended with an address in Aix-en-Provence: Maître Étienne Barbier, Notaire, rue Gaston de Saporta, 17h00. Beneath it, underlined twice: the originals.</w:t>
-      </w:r>
-    </w:p>
-    <w:p>
-      <w:r>
-        <w:t>"The originals of what?" said Tobias.</w:t>
-      </w:r>
-    </w:p>
-    <w:p>
-      <w:r>
-        <w:t>"Of everything he stole," said Catarina. "If a lawyer keeps the contracts, then the lawyer is the one who can open the door." She tapped the page. "It is an hour. We go tomorrow. We are there by five."</w:t>
-      </w:r>
-    </w:p>
-    <w:p>
-      <w:r>
-        <w:t>They left at ten. They were not there by five.</w:t>
-      </w:r>
-    </w:p>
-    <w:p>
-      <w:r>
-        <w:t>The first delay was a stall at the side of the road, run by a woman in a straw hat selling the last figs of the year out of a wheelbarrow. "We stop for one minute," said Catarina, who knew about figs. They stopped for forty. The figs were purple and split and warm and tasted of a summer that had not yet finished with anyone, and the woman in the hat insisted that Tobias taste the grapes, and the quince jelly, and a small orange fruit nobody could name in any language, which turned out to be a persimmon, and by the time they drove off the back seat was a fruit bowl.</w:t>
-      </w:r>
-    </w:p>
-    <w:p>
-      <w:r>
-        <w:t>"This was a mistake," said Tobias, with juice running down his wrist. "We're going to be late."</w:t>
-      </w:r>
-    </w:p>
-    <w:p>
-      <w:r>
-        <w:t>"Paris can wait," said Catarina, with her mouth full.</w:t>
-      </w:r>
-    </w:p>
-    <w:p>
-      <w:r>
-        <w:t>"We're not going to Paris."</w:t>
-      </w:r>
-    </w:p>
-    <w:p>
-      <w:r>
-        <w:t>"Then the lawyer can wait."</w:t>
-      </w:r>
-    </w:p>
-    <w:p>
-      <w:r>
-        <w:t>The second delay was a goat farm, because there was a sign. The third was a ruined abbey on a hill, because Tobias remarked that it looked Romanesque, and Catarina said "Românico," and they both spent twenty minutes standing in an empty nave where the roof had fallen in and the sky had come to live, whispering because it seemed to demand it. The fourth was an olive mill, where an old man in a blue apron poured them a thimble of oil so green and peppery that Catarina coughed, wiped her eyes, and bought six litres.</w:t>
-      </w:r>
-    </w:p>
-    <w:p>
-      <w:r>
-        <w:t>"It is for the restaurant," she said defensively. "Fernanda will say it is too expensive. Then she will use all of it."</w:t>
-      </w:r>
-    </w:p>
-    <w:p>
-      <w:r>
-        <w:t>The fifth delay was a flat tyre.</w:t>
-      </w:r>
-    </w:p>
-    <w:p>
-      <w:r>
-        <w:t>It happened on a quiet road between two vineyards, in the warm middle of the afternoon, with the last bees of the year working the ivy on a wall like a machine nobody could turn off. Tobias stood over the spare wheel with the expression of a man reading a document in Latin.</w:t>
-      </w:r>
-    </w:p>
-    <w:p>
-      <w:r>
-        <w:t>"I have never changed a tyre," he said.</w:t>
-      </w:r>
-    </w:p>
-    <w:p>
-      <w:r>
-        <w:t>"You are English. You have a man."</w:t>
-      </w:r>
-    </w:p>
-    <w:p>
-      <w:r>
-        <w:t>"I did have a man. He was called the AA."</w:t>
-      </w:r>
-    </w:p>
-    <w:p>
-      <w:r>
-        <w:t>"Afasta-te," said Catarina, rolling up her sleeves. She was four minutes with the jack and the spanner, glistening, singing a tune from the radio under her breath, and when it was done she wiped her hands on her skirt and looked at him, hot and happy and absurdly beautiful, with oil on her cheek.</w:t>
-      </w:r>
-    </w:p>
-    <w:p>
-      <w:r>
-        <w:t>"What?" she said.</w:t>
-      </w:r>
-    </w:p>
-    <w:p>
-      <w:r>
-        <w:t>"Nothing," said Tobias. "I was thinking I should have married a mechanic."</w:t>
-      </w:r>
-    </w:p>
-    <w:p>
-      <w:r>
-        <w:t>"You are not married."</w:t>
-      </w:r>
-    </w:p>
-    <w:p>
-      <w:r>
-        <w:t>"No," said Tobias. "I was thinking it in advance."</w:t>
-      </w:r>
-    </w:p>
-    <w:p>
-      <w:r>
-        <w:t>She stood very still. A bee, somewhere, chose that moment to stop. Then Catarina turned, very pink, picked up the spanner, put it in the boot with extraordinary care, and said to the air in Portuguese, quite clearly, "Meu Deus, ele disse isso a sério."</w:t>
-      </w:r>
-    </w:p>
-    <w:p>
-      <w:r>
-        <w:t>He understood every word.</w:t>
-      </w:r>
-    </w:p>
-    <w:p>
-      <w:r>
-        <w:t>They did not reach Aix until half past six. The plane trees along the Cours Mirabeau were already throwing their long shadows, the fountains were running gold, and the notary's house in the rue Gaston de Saporta was a tall honey-coloured building with its shutters closed and a small brass plate that said MAÎTRE BARBIER, NOTAIRE.</w:t>
-      </w:r>
-    </w:p>
-    <w:p>
-      <w:r>
-        <w:t>The door was ajar. Inside, the office had been taken to pieces. Drawers upended, files on the floor, a safe standing open and empty. A neighbour in a dressing gown told them in rapid French that two men in dark coats had come at a quarter to five. They were, she said, extremely loud for burglars. One had kept shouting "Gaston!", and the other had replied "Oui?", and the first had said, "Not you, the other Gaston!", and for a while it had gone on like that. They had left at five, taking a safe, an umbrella stand and, for reasons the neighbour could not explain, a stuffed owl. And that Maître Barbier, who was sixty-nine and had eleven weeks left before the law made every notary in France put down his pen at seventy, was at that moment in the hospital with a bruised arm and an extremely bad temper.</w:t>
-      </w:r>
-    </w:p>
-    <w:p>
-      <w:r>
-        <w:t>"At five," said Tobias slowly.</w:t>
-      </w:r>
-    </w:p>
-    <w:p>
-      <w:r>
-        <w:t>"We would have been there at five," said Catarina. She had gone very pale. "Exactly at five. Like the notebook says."</w:t>
-      </w:r>
-    </w:p>
-    <w:p>
-      <w:r>
-        <w:t>They stood in the ransacked office in the late honey light. Somewhere outside, an accordion began to play. Neither said what both were thinking. If they had been punctual, if they had been sensible, if they had not stopped for the figs, and the goats, and the abbey, and the oil, and the tyre, and the three minutes in which a man had said something aloud that should have waited.</w:t>
-      </w:r>
-    </w:p>
-    <w:p>
-      <w:r>
-        <w:t>"Paris," said Catarina at last, in a small voice, "can wait."</w:t>
-      </w:r>
-    </w:p>
-    <w:p>
-      <w:r>
-        <w:t>"Yes," said Tobias. "Apparently, so can everything else."</w:t>
-      </w:r>
-    </w:p>
-    <w:p>
-      <w:r>
-        <w:t>On the way out they picked up the single object the thieves had overlooked: a calendar on the old man's desk, where a note in a spidery hand read: Marchetti originals. Safe deposit, Cours Mirabeau branch. Key with Mme Fournier.</w:t>
-      </w:r>
-    </w:p>
-    <w:p>
-      <w:r>
-        <w:t>"Madame Fournier," said Tobias.</w:t>
-      </w:r>
-    </w:p>
-    <w:p>
-      <w:r>
-        <w:t>"Odile," said Catarina. "Odile has the key."</w:t>
-      </w:r>
-    </w:p>
-    <w:p>
-      <w:r>
-        <w:t>They were halfway to the car when a long black saloon pulled up silently at the kerb, and a man got out. He was about fifty, immaculate, in a charcoal suit and a tie the colour of old claret, and he carried a furled black umbrella under a sky that had not held a cloud all day.</w:t>
-      </w:r>
-    </w:p>
-    <w:p>
-      <w:r>
-        <w:t>"Mr Lind," he said, in perfect, pleasant English. "I am so glad. I had hoped we might meet again."</w:t>
-      </w:r>
-    </w:p>
-    <w:p>
-      <w:r>
-        <w:t>"You left before the cheese," said Tobias, slowly. "At the Pemberton-Hayeses'."</w:t>
-      </w:r>
-    </w:p>
-    <w:p>
-      <w:r>
-        <w:t>"I never stay for the cheese. Maître Edouard Delacroix-Roux. I act for certain persons whose names you may know." He smiled. His teeth were extraordinary. "I wished to say, as a professional courtesy, how much I admire your novel."</w:t>
-      </w:r>
-    </w:p>
-    <w:p>
-      <w:r>
-        <w:t>"You've read it?"</w:t>
-      </w:r>
-    </w:p>
-    <w:p>
-      <w:r>
-        <w:t>"I have not read it. I have read a summary, which I understand is all that is left." He turned the umbrella slowly in his fingers. "It must be a great grief to lose two years of work. One would hate for anything similar to happen to the people one loves."</w:t>
-      </w:r>
-    </w:p>
-    <w:p>
-      <w:r>
-        <w:t>"Is that a threat?" said Catarina, in her very plainest English.</w:t>
-      </w:r>
-    </w:p>
-    <w:p>
-      <w:r>
-        <w:t>"A threat? Certainly not." Maître Delacroix-Roux looked at her with a tenderness so artificial it might have been varnished. "I was merely observing that the roads of Provence are most dangerous at dusk, mademoiselle. And that some people, for want of a decent education, cannot tell a landmark from a trap." He glanced up at the dark windows of the notary's house, then back to her. "Do give my regards to your sister. I understand she has been missing for some time. How very distressing."</w:t>
-      </w:r>
-    </w:p>
-    <w:p>
-      <w:r>
-        <w:t>He bowed, as one bows to a wedding guest, and got back into the car. It purred away down the Cours Mirabeau under the plane trees, and in the gutter behind it lay one fallen leaf, and the umbrella, which he had left behind on purpose.</w:t>
-      </w:r>
-    </w:p>
-    <w:p>
-      <w:r>
-        <w:t>Catarina picked it up. Tobias took it from her very gently and snapped it in two.</w:t>
-      </w:r>
-    </w:p>
-    <w:p>
-      <w:r>
-        <w:t>"I don't like him," said Tobias.</w:t>
-      </w:r>
-    </w:p>
-    <w:p>
-      <w:r>
-        <w:t>"No," said Catarina. "He is a man who has never once been in a boat."</w:t>
-      </w:r>
-    </w:p>
-    <w:p>
-      <w:r>
-        <w:t>Edouard. The name in the margin of Inês's notebook, beside the twelfth of March. And the tie had been across a plate of vol-au-vents in October, and he had admired it. He wrote that down before he started the car, and then, because Catarina was watching him write it, he wrote underneath: I should have known at the supper. She took the pen and added, in capitals: NOBODY KNOWS AT THE SUPPER. THAT IS WHY IT IS A SUPPER.</w:t>
-      </w:r>
-    </w:p>
-    <w:p>
-      <w:pPr>
-        <w:pStyle w:val="Heading2"/>
-        <w:pageBreakBefore/>
-      </w:pPr>
-      <w:bookmarkStart w:id="27" w:name="ch_25"/>
-      <w:r>
-        <w:t>Chapter 25: The Key</w:t>
-      </w:r>
-      <w:bookmarkEnd w:id="27"/>
-    </w:p>
-    <w:p>
-      <w:pPr>
-        <w:ind w:firstLine="0"/>
-      </w:pPr>
-      <w:r>
         <w:t>Madame Fournier did not look up from the secateurs.</w:t>
       </w:r>
     </w:p>
@@ -7811,7 +7819,7 @@
     </w:p>
     <w:p>
       <w:r>
-        <w:t xml:space="preserve">The bank in Aix took twenty minutes and no heroism. Mara, carrying the juge d'instruction's signature in a plastic sleeve as if it might blow away, signed. Tobias watched. Catarina held the fig bag from the day before, because the bank had no ceremony and a paper bag was honest. Inside the box, on top, lay a toy Porsche with a wheel missing and a card in Elise's quick, slanting, impatient hand: </w:t>
+        <w:t xml:space="preserve">The bank in Aix took two days, a juge's signature and, in the end, twenty minutes and no heroism. Mara, carrying the juge d'instruction's signature in a plastic sleeve as if it might blow away, signed. Tobias watched. Catarina held the fig bag from the road to Aix, which she had kept, because the bank had no ceremony and a paper bag was honest. Inside the box, on top, lay a toy Porsche with a wheel missing and a card in Elise's quick, slanting, impatient hand: </w:t>
       </w:r>
       <w:r>
         <w:rPr>
@@ -7845,7 +7853,16 @@
     </w:p>
     <w:p>
       <w:r>
-        <w:t>Anselm Brunner arrived at the lake house at eight o'clock that evening, on foot, in the rain, with an umbrella held at the precise angle of a bayonet.</w:t>
+        <w:t xml:space="preserve">Anselm Brunner arrived at the lake house two evenings later, at eight o'clock, on foot, in the rain, sent, he said, by a juge in Aix who had read the word </w:t>
+      </w:r>
+      <w:r>
+        <w:rPr>
+          <w:i/>
+        </w:rPr>
+        <w:t>codex</w:t>
+      </w:r>
+      <w:r>
+        <w:t xml:space="preserve"> in the inventory of a safe deposit box and had telephoned Rome before lunch, with an umbrella held at the precise angle of a bayonet.</w:t>
       </w:r>
     </w:p>
     <w:p>
@@ -8601,7 +8618,7 @@
     </w:p>
     <w:p>
       <w:r>
-        <w:t xml:space="preserve">He had been thinking all morning, in the gaps between not typing, about Delacroix-Roux on the pavement in Aix, with his extraordinary teeth, saying </w:t>
+        <w:t xml:space="preserve">He had been thinking all morning, in the gaps between not typing, about Delacroix-Roux in the hospital car park in Aix, with his extraordinary teeth, saying </w:t>
       </w:r>
       <w:r>
         <w:rPr>
@@ -8649,7 +8666,7 @@
     </w:p>
     <w:p>
       <w:r>
-        <w:t>"To Fernanda. For a few weeks. Until this is over. Until Mara has them." He heard himself going on, the way a car goes on rolling into a gatepost after you have taken your foot off. "It's not safe here. He knows who you are. He knows about Inês. He said so, on the pavement, in front of us. He's killed three people. I can't..." He stopped. "I'd feel better if you were somewhere he couldn't find you."</w:t>
+        <w:t>"To Fernanda. For a few weeks. Until this is over. Until Mara has them." He heard himself going on, the way a car goes on rolling into a gatepost after you have taken your foot off. "It's not safe here. He knows who you are. He knows about Inês. He said so, in a car park, in front of us. He's killed three people. I can't..." He stopped. "I'd feel better if you were somewhere he couldn't find you."</w:t>
       </w:r>
     </w:p>
     <w:p>
@@ -9016,7 +9033,7 @@
     </w:p>
     <w:p>
       <w:r>
-        <w:t>"And Porto," he went on, because if he stopped he would never start again. "I didn't say Porto because I wanted you to go. I said Porto because I'm frightened. Because a man with a claret tie stood on a pavement in Aix and talked about your sister, and I can't bear it. I can't bear the idea of you being in this house when he comes, if he comes. I'd rather you were in Porto, being fed by Fernanda, hating me, than here." He took a breath. "That's what I meant. I said it like an idiot. I'm sorry."</w:t>
+        <w:t>"And Porto," he went on, because if he stopped he would never start again. "I didn't say Porto because I wanted you to go. I said Porto because I'm frightened. Because a man with a claret tie stood in a car park in Aix and talked about your sister, and I can't bear it. I can't bear the idea of you being in this house when he comes, if he comes. I'd rather you were in Porto, being fed by Fernanda, hating me, than here." He took a breath. "That's what I meant. I said it like an idiot. I'm sorry."</w:t>
       </w:r>
     </w:p>
     <w:p>
@@ -9204,12 +9221,12 @@
     </w:p>
     <w:p>
       <w:r>
-        <w:t>The gate was locked. They climbed it, which is how a locked gate announces itself to the unlucky, and the first Gaston stepped onto a layer of marbles Hugo had laid that afternoon for reasons of his own.</w:t>
-      </w:r>
-    </w:p>
-    <w:p>
-      <w:r>
-        <w:t>What followed was a precise geometry of misfortune. Gaston One's legs went east. Gaston Two, reaching out to catch him, grasped the hall coat-stand, which toppled, and brought down two walking sticks and a brass gong that Madame Fournier had always said was a decoration. The sound rang through the valley. Both men arrived at the kitchen door in a tangle of coats.</w:t>
+        <w:t>The gate was locked. They climbed it, which is how a locked gate announces itself to the unlucky, and the first Gaston came down on the far side onto the brass gong that Madame Fournier kept on the porch as a decoration, and which Hugo had carried down the drive that afternoon and propped against the inside of the gate, he said afterwards, "for acoustic reasons." The sound went round the valley like the end of the world. Over the wall, in Madame Fournier's kitchen, three heads came up from the biscuit tin at once.</w:t>
+      </w:r>
+    </w:p>
+    <w:p>
+      <w:r>
+        <w:t>The Gastons, who had come too far to go home, went in by the kitchen door, which Tobias, in his hurry to get over the wall to the biscuit tin, had left on the latch, and stood in the dark hall breathing.</w:t>
       </w:r>
     </w:p>
     <w:p>
@@ -9219,47 +9236,139 @@
     </w:p>
     <w:p>
       <w:r>
-        <w:t>Upstairs, a torch clicked on beneath a chin.</w:t>
-      </w:r>
-    </w:p>
-    <w:p>
-      <w:r>
-        <w:t>They did not find the stairs easily. Each step had been polished with olive oil from the six litres Catarina had bought at the mill, which Hugo said afterwards had been "a very good oil, actually, peppery." Gaston Two reached the landing on his knees. Gaston One reached it on his back, feet first, like a man arriving at a party by toboggan.</w:t>
-      </w:r>
-    </w:p>
-    <w:p>
-      <w:r>
-        <w:t>"The study!" hissed Gaston One. "The originals are in the study!"</w:t>
-      </w:r>
-    </w:p>
-    <w:p>
-      <w:r>
-        <w:t>The study door was not locked. That was the trap. It opened so easily that Gaston Two, who had put his whole shoulder into it, went straight across the room, stepped on a tray of cold custard that had been left with great care in front of the window seat, and went out through the open window with a long, thin, receding cry, and landed in Madame Fournier's rosemary bed, which was soft, and very old, and had views on visitors.</w:t>
-      </w:r>
-    </w:p>
-    <w:p>
-      <w:r>
-        <w:t>From the window seat, in the dark, a small voice spoke.</w:t>
-      </w:r>
-    </w:p>
-    <w:p>
-      <w:r>
-        <w:t>"I'm nine," said Hugo. "My father's a solicitor. I know all about trespass."</w:t>
-      </w:r>
-    </w:p>
-    <w:p>
-      <w:r>
-        <w:t>By the time Tobias and Catarina had got back over the wall, which took longer than it should have, because the gong had rung through the valley like the end of the world and Madame Fournier had insisted on coming too, with her secateurs, in case of emergencies, it was over. They found a white van abandoned in the lane, two men on the lawn, one of them stuck all over with rosemary and the other wearing the bead curtain from the kitchen door like a shawl, tangled together in the garden hose and a string of Christmas lights from the cellar, and a pelican standing on one chest with the air of a bird who had not been asked and did not intend to give a statement. In the porch sat Hugo, in his pyjamas, with a mug of cocoa.</w:t>
-      </w:r>
-    </w:p>
-    <w:p>
-      <w:r>
-        <w:t>"I rang the Inspector," said Hugo, not looking up. "She's on her way. I did my father's voice. She's very cross. Also I ate your biscuits."</w:t>
-      </w:r>
-    </w:p>
-    <w:p>
-      <w:r>
-        <w:t>Mara arrived at a quarter to midnight in a dressing gown, wellington boots and a raincoat, with her service card in one hand and a torch in the other, followed by two gendarmes from Saint-Martin who had been playing cards and had brought the cards. She looked at the lawn for a long time. She looked at the pelican. She looked at Hugo.</w:t>
+        <w:t>The study light came on at the top of the stairs.</w:t>
+      </w:r>
+    </w:p>
+    <w:p>
+      <w:r>
+        <w:t>Hugo was sitting on the window seat in his pyjamas, with his library book open on his knee and his torch beside him, and he looked down the stairs at two men in balaclavas with the polite, slightly disappointed expression of a librarian receiving a late return.</w:t>
+      </w:r>
+    </w:p>
+    <w:p>
+      <w:r>
+        <w:t>"Good evening," he said. "You're trespassing. That's article 226-4 if it's a home, which it is. And there's a minor present, which is me, so a court will take a very dim view. I'm just telling you. In case nobody had."</w:t>
+      </w:r>
+    </w:p>
+    <w:p>
+      <w:r>
+        <w:t>The Gastons looked at each other.</w:t>
+      </w:r>
+    </w:p>
+    <w:p>
+      <w:r>
+        <w:t>"Also," said Hugo, "I wouldn't come up. There's a snake in the window seat."</w:t>
+      </w:r>
+    </w:p>
+    <w:p>
+      <w:r>
+        <w:t>"A snake," said Gaston Two.</w:t>
+      </w:r>
+    </w:p>
+    <w:p>
+      <w:r>
+        <w:t xml:space="preserve">"A Montpellier snake. </w:t>
+      </w:r>
+      <w:r>
+        <w:rPr>
+          <w:i/>
+        </w:rPr>
+        <w:t>Malpolon monspessulanus.</w:t>
+      </w:r>
+      <w:r>
+        <w:t xml:space="preserve"> It's the biggest snake in France. It can be two metres. It's back-fanged, so it has to chew a bit to get the venom in, but it does get it in." He tapped the cushion beside him, quite gently, with the torch. "It lives in here. It's been in this house since the spring. Everybody's seen it except the grown-ups. I've been sitting on it for an hour to keep it calm. If you come up the stairs I'll have to get off it, because I'm not stupid."</w:t>
+      </w:r>
+    </w:p>
+    <w:p>
+      <w:r>
+        <w:t>There was a long silence in the hall. Under the cushion, something in the window seat, which was in fact the hollow behind the false back and contained, as far as anybody knew, nothing but dust, made no sound whatsoever, which in the circumstances was the most frightening sound a window seat could make.</w:t>
+      </w:r>
+    </w:p>
+    <w:p>
+      <w:r>
+        <w:t>"Gaston," said Gaston One, very quietly, "the originals are in the study."</w:t>
+      </w:r>
+    </w:p>
+    <w:p>
+      <w:r>
+        <w:t>"Then you go to the study," said Gaston Two, "and I will wait in the van, and tell your mother."</w:t>
+      </w:r>
+    </w:p>
+    <w:p>
+      <w:r>
+        <w:t>Hugo turned a page of his book.</w:t>
+      </w:r>
+    </w:p>
+    <w:p>
+      <w:r>
+        <w:t>"It hisses when it's angry," he said, without looking up. "Quite loudly. Like a tyre."</w:t>
+      </w:r>
+    </w:p>
+    <w:p>
+      <w:r>
+        <w:t>It was at this moment that the pelican, who had been asleep on the porch and had been woken by the gong and had come in through the open kitchen door to see who was responsible, put its enormous head round the hall door behind the two Gastons in the dark and, finding nobody with bread, opened its beak to its fullest extent and let out the long, low, wheezing hiss of a large bird that has been disturbed for nothing.</w:t>
+      </w:r>
+    </w:p>
+    <w:p>
+      <w:r>
+        <w:t>The Gastons left by the nearest exit, which was the hall window. It was not open. That was a matter for the insurance. They went across the lawn at a speed that did them great credit, and the first one, looking back over his shoulder for the snake, ran straight off the end of the garden into the shallows of the pond, and the second, who had been holding onto the first one's coat, followed him in, and they stood up to their waists among the reeds in the black water, gasping, while a heron rose out of the dark beside them with a cry of complete disgust.</w:t>
+      </w:r>
+    </w:p>
+    <w:p>
+      <w:r>
+        <w:t>Hugo came down to the jetty with his torch, in his pyjamas and a coat, and sat on the end of it with his legs crossed and his notebook open, and took their statement.</w:t>
+      </w:r>
+    </w:p>
+    <w:p>
+      <w:r>
+        <w:t>"Names," he said.</w:t>
+      </w:r>
+    </w:p>
+    <w:p>
+      <w:r>
+        <w:t>"Gaston," said both Gastons.</w:t>
+      </w:r>
+    </w:p>
+    <w:p>
+      <w:r>
+        <w:t xml:space="preserve">"I'll put </w:t>
+      </w:r>
+      <w:r>
+        <w:rPr>
+          <w:i/>
+        </w:rPr>
+        <w:t>the one who shouts</w:t>
+      </w:r>
+      <w:r>
+        <w:t xml:space="preserve"> and </w:t>
+      </w:r>
+      <w:r>
+        <w:rPr>
+          <w:i/>
+        </w:rPr>
+        <w:t>the one who falls</w:t>
+      </w:r>
+      <w:r>
+        <w:t>," said Hugo, writing. "What were you sent for?"</w:t>
+      </w:r>
+    </w:p>
+    <w:p>
+      <w:r>
+        <w:t>They told him. They told a nine-year-old with a torch everything, standing in a pond in the cold, because the pelican was walking up and down the jetty behind him, and because, the first Gaston said later, in court, there are moments in a man's life when he needs very badly to explain himself to somebody, and the somebody is not always the one he would have chosen.</w:t>
+      </w:r>
+    </w:p>
+    <w:p>
+      <w:r>
+        <w:t>By the time Tobias and Catarina had got back over the wall, which took longer than it should have, because Madame Fournier had insisted on coming too, with her secateurs, in case of emergencies, it was more or less over. They found a white van abandoned in the lane, a broken hall window, two men up to their waists in the pond, a pelican patrolling the jetty above them with the air of a bird who had not been asked and did not intend to give a statement, and Hugo, at the end of the planks, with a notebook, reading their own words back to them to make sure he had got it right.</w:t>
+      </w:r>
+    </w:p>
+    <w:p>
+      <w:r>
+        <w:t>"I rang the Inspector," said Hugo, not looking up. "She's on her way. I did my father's voice. She's very cross. There isn't a snake, by the way. Well, there is, but it's a different one, and it's harmless, and I've never actually found it." He turned a page. "Also I ate your biscuits."</w:t>
+      </w:r>
+    </w:p>
+    <w:p>
+      <w:r>
+        <w:t>Mara arrived at a quarter to midnight in a dressing gown, wellington boots and a raincoat, with her service card in one hand and a torch in the other, followed by two gendarmes from Saint-Martin who had been playing cards and had brought the cards. She looked at the pond for a long time. She looked at the pelican. She looked at Hugo.</w:t>
       </w:r>
     </w:p>
     <w:p>
@@ -9269,12 +9378,12 @@
     </w:p>
     <w:p>
       <w:r>
-        <w:t>"Mostly," said Hugo. "The pelican did the end."</w:t>
-      </w:r>
-    </w:p>
-    <w:p>
-      <w:r>
-        <w:t>She interviewed the Gastons in the kitchen, at the table, with the Christmas lights still wound round them, because nobody could find the end of the hose. They were not difficult to interview. They were, in fact, almost pathetically eager to be interviewed, in the way of men who have spent a long evening being defeated by a child and would like very much to talk to an adult about anything at all.</w:t>
+        <w:t>"I mostly talked," said Hugo. "The pelican did the end."</w:t>
+      </w:r>
+    </w:p>
+    <w:p>
+      <w:r>
+        <w:t>She interviewed the Gastons in the kitchen, at the table, wrapped in two of Henri Fournier's army blankets, dripping onto the tiles. They were not difficult to interview. They were, in fact, almost pathetically eager to be interviewed, in the way of men who have spent a long evening being defeated by a child and would like very much to talk to an adult about anything at all.</w:t>
       </w:r>
     </w:p>
     <w:p>
@@ -9315,7 +9424,7 @@
     </w:p>
     <w:p>
       <w:r>
-        <w:t>The second Gaston looked at him with the deep, wounded wariness of a man who has fallen out of a window because of custard.</w:t>
+        <w:t>The second Gaston looked at him with the deep, wounded wariness of a man who has gone through a window because of a snake that was not there.</w:t>
       </w:r>
     </w:p>
     <w:p>
@@ -9330,12 +9439,12 @@
     </w:p>
     <w:p>
       <w:r>
-        <w:t>The Gastons were taken away at half past midnight in the back of the gendarmes' car, still wrapped, at their own request, in the Christmas lights, because the first Gaston said he did not trust himself with the hose. As the car went down the lane, its blue light turning, the lights round the Gastons were still plugged into nothing and still, somehow, faintly twinkling, and Madame Fournier, at the gate with her secateurs, watched them go with an expression of deep satisfaction.</w:t>
-      </w:r>
-    </w:p>
-    <w:p>
-      <w:r>
-        <w:t>"Henri bought those lights in 1987," she said. "They have never once worked at Christmas."</w:t>
+        <w:t>The Gastons were taken away at half past midnight in the back of the gendarmes' car, still in the army blankets, which Madame Fournier said they could keep, as they had been bought for a war and had finally seen action. As the car went down the lane with its blue light turning, she stood at the gate with her secateurs and watched it go with an expression of deep satisfaction.</w:t>
+      </w:r>
+    </w:p>
+    <w:p>
+      <w:r>
+        <w:t>"Henri bought that gong in 1987," she said. "It has never once been rung for dinner."</w:t>
       </w:r>
     </w:p>
     <w:p>
@@ -10067,9 +10176,214 @@
       </w:pPr>
       <w:bookmarkStart w:id="34" w:name="ch_31"/>
       <w:r>
-        <w:t>Chapter 31: The Second Box</w:t>
+        <w:t>Chapter 31: Edouard</w:t>
       </w:r>
       <w:bookmarkEnd w:id="34"/>
+    </w:p>
+    <w:p>
+      <w:pPr>
+        <w:ind w:firstLine="0"/>
+      </w:pPr>
+      <w:r>
+        <w:t>On the last evening before the warrant, Maître Edouard Delacroix-Roux polished the brass plate himself.</w:t>
+      </w:r>
+    </w:p>
+    <w:p>
+      <w:r>
+        <w:t>He did it at nine o'clock, when the Cours Mirabeau had emptied and the waiters across the road were stacking chairs, with a tin of Miror and a soft yellow cloth that he kept in the bottom drawer of his desk, under the files that nobody else was permitted to open. He went down the three steps of the hôtel particulier in his shirtsleeves, which nobody in Aix had ever seen, and stood on the pavement under the plane trees, and polished all seven plates beside the great door, the other avocats' first, one by one, the way he had been taught, in small circles, never along the grain, and his own last.</w:t>
+      </w:r>
+    </w:p>
+    <w:p>
+      <w:r>
+        <w:t>DELACROIX-ROUX, AVOCAT AU BARREAU.</w:t>
+      </w:r>
+    </w:p>
+    <w:p>
+      <w:r>
+        <w:t>His mother had polished those plates for thirty-one years. Not his: the others. She had been the concierge of the building from 1968 until her knees went, and she had lived with her son in the two rooms of the lodge under the archway, where the light came in from the courtyard at an angle and the lawyers' shoes went past the window all day at the height of her head. Every morning at seven, before the avocats came, she had gone out with the tin and the yellow cloth, and every morning, for thirty-one years, eleven men in good coats had come up the steps past her and said nothing at all, because one does not say good morning to the brass.</w:t>
+      </w:r>
+    </w:p>
+    <w:p>
+      <w:r>
+        <w:t xml:space="preserve">All but one. A young avocat on the second floor, new, hungry, from Marseille, who had said </w:t>
+      </w:r>
+      <w:r>
+        <w:rPr>
+          <w:i/>
+        </w:rPr>
+        <w:t>bonjour, Madame Roux</w:t>
+      </w:r>
+      <w:r>
+        <w:t xml:space="preserve"> on his first day and every day after, and who had noticed the boy doing his homework at the lodge table under the archway, and asked to see it, and read it, and paid, without being asked and without ever mentioning it again, for the lycée, and the faculty, and the good suit for the oath. His name was Armand Vial. He had left the bar long ago for money, which was more interesting, and he had never once asked Edouard for anything in return, which was how Edouard had known, from the age of fourteen, that one day he would ask for everything.</w:t>
+      </w:r>
+    </w:p>
+    <w:p>
+      <w:r>
+        <w:t xml:space="preserve">He had taken the name Delacroix at twenty-five, when he took the oath. It had been on the brass plate she polished longest, the old bâtonnier on the first floor, who had walked past her for nineteen years and had died without knowing she had a name. Edouard had simply added it to his own, as a man adds a room to a house. Nobody had asked. In France a hyphen is a kind of passport. He kept </w:t>
+      </w:r>
+      <w:r>
+        <w:rPr>
+          <w:i/>
+        </w:rPr>
+        <w:t>Roux</w:t>
+      </w:r>
+      <w:r>
+        <w:t xml:space="preserve"> on the end, out of loyalty, and because it was the name he gave to night porters in Lyon, on the rare evenings when he did not wish to be anybody.</w:t>
+      </w:r>
+    </w:p>
+    <w:p>
+      <w:r>
+        <w:t>The umbrella had been the bâtonnier's, too. He had left it in the lodge one wet afternoon in 1979, propped by the door while he complained about a parcel, and had never come back for it, and Madame Roux had kept it for him in the corner for nineteen years, furled, in case he asked. He never asked. Edouard had carried it every day since the oath, in every weather, the way another man might carry a medal. People thought it was an affectation. It was a receipt. He kept cheaper ones, from the Monoprix, for leaving behind in car parks as a message; this one never left his hand.</w:t>
+      </w:r>
+    </w:p>
+    <w:p>
+      <w:r>
+        <w:t>He put the tin away. He washed his hands at the basin in the cloakroom and dried them carefully, one, then the other, and the sleeves of his shirt, which were dry, out of habit.</w:t>
+      </w:r>
+    </w:p>
+    <w:p>
+      <w:pPr>
+        <w:spacing w:before="160" w:after="160"/>
+        <w:ind w:firstLine="0"/>
+        <w:jc w:val="center"/>
+      </w:pPr>
+      <w:r>
+        <w:t>*  *  *</w:t>
+      </w:r>
+    </w:p>
+    <w:p>
+      <w:pPr>
+        <w:ind w:firstLine="0"/>
+      </w:pPr>
+      <w:r>
+        <w:t>He was not afraid. He wanted that understood, if only by himself.</w:t>
+      </w:r>
+    </w:p>
+    <w:p>
+      <w:r>
+        <w:t xml:space="preserve">Hale had been taken that morning from the end of the jetty, and Hale would talk, because Hale was a man who had always talked: to waiters, to authors, to the speaker of his own telephone. Let him. Hale's word was a cashier's word. Hale had stood at a window and seen nothing, and had checked, beforehand, that nothing could be seen. The tape had a first name on it, and there were, Edouard knew exactly, forty-one avocats called Edouard at the bar of Aix. The bolt was a bolt. The hose was a hose. Moutet would say what Moutet had always said, because once you have said </w:t>
+      </w:r>
+      <w:r>
+        <w:rPr>
+          <w:i/>
+        </w:rPr>
+        <w:t>of course, Victor</w:t>
+      </w:r>
+      <w:r>
+        <w:t xml:space="preserve"> there is no other sentence left. And the jetty had been dark, and empty, and the only light for half a kilometre had been the study window, where Hale had stood with his hands in his pockets, doing what he was told.</w:t>
+      </w:r>
+    </w:p>
+    <w:p>
+      <w:r>
+        <w:t>There had been nobody else. He had walked back along the wall past the reeds in the moonlight, drying his hands, and there had been nobody, only the reeds and the mud and the smell of the water, and once a small sound, like a bird settling. One does not look at a bird settling. One does not look at the reeds.</w:t>
+      </w:r>
+    </w:p>
+    <w:p>
+      <w:r>
+        <w:t>He sat at his desk with the lamp on and the umbrella against the wall where it always stood, and he thought, for the first time in some months, about Elise Marchetti.</w:t>
+      </w:r>
+    </w:p>
+    <w:p>
+      <w:r>
+        <w:t>She had not been afraid either. That had surprised him. She had stood on the end of the jetty in her grey wool coat with her hands in her pockets, exactly as Hale was standing now at the window, and she had listened to him explain, very reasonably, what she would sign and what she would forget, and at the end she had laughed. Not unkindly. She had laughed the way the English laugh at a waiter's French.</w:t>
+      </w:r>
+    </w:p>
+    <w:p>
+      <w:r>
+        <w:rPr>
+          <w:i/>
+        </w:rPr>
+        <w:t>You're not his partner,</w:t>
+      </w:r>
+      <w:r>
+        <w:t xml:space="preserve"> she had said. </w:t>
+      </w:r>
+      <w:r>
+        <w:rPr>
+          <w:i/>
+        </w:rPr>
+        <w:t>I've read the accounts. You're his doorman. He's paid you to stand at the door since you were fourteen.</w:t>
+      </w:r>
+    </w:p>
+    <w:p>
+      <w:r>
+        <w:t>He had not intended to do it then. He wanted that understood, too. He had intended to give her until the end of the week. But she had turned to go back up to the house, and he had seen the back of her coat going away from him, up the jetty, towards the lit window, not looking back, as eleven men in good coats had gone up the steps past his mother every morning for thirty-one years, and his hand had gone out to her shoulder before he had decided anything at all.</w:t>
+      </w:r>
+    </w:p>
+    <w:p>
+      <w:r>
+        <w:t>He did not think about the rest. He had trained himself not to, in the way he had trained himself to polish in small circles, never along the grain.</w:t>
+      </w:r>
+    </w:p>
+    <w:p>
+      <w:pPr>
+        <w:spacing w:before="160" w:after="160"/>
+        <w:ind w:firstLine="0"/>
+        <w:jc w:val="center"/>
+      </w:pPr>
+      <w:r>
+        <w:t>*  *  *</w:t>
+      </w:r>
+    </w:p>
+    <w:p>
+      <w:pPr>
+        <w:ind w:firstLine="0"/>
+      </w:pPr>
+      <w:r>
+        <w:t>On Sundays he went to see his mother.</w:t>
+      </w:r>
+    </w:p>
+    <w:p>
+      <w:r>
+        <w:t>She was ninety-one, and lived now in a home on the road to Éguilles, in a room with a window onto a car park, where she sat in a chair by the radiator and did not know him. She thought, most Sundays, that he was a lawyer from the first floor come to complain about the post. She apologised to him for it. Every week he brought her a box of calissons from the shop on the rue Gaston de Saporta, the good one, the one with the ribbon, because she had sold them in the market when he was a child and had never once been able to afford to eat one, and every week she thanked him with a kind of frightened politeness, and offered him one, and he took it, and they ate them together in silence while the radiator ticked.</w:t>
+      </w:r>
+    </w:p>
+    <w:p>
+      <w:r>
+        <w:t>He bought the calissons for everybody. For Raymond Coste at Christmas, with the envelope. For the Gastons in Toulon, under the money. He had never asked himself why. It had seemed, simply, the correct thing to bring.</w:t>
+      </w:r>
+    </w:p>
+    <w:p>
+      <w:r>
+        <w:t>Valentina Marchetti had also been ninety-one, in a room in Lyon with a window onto nothing, and had also not known who he was when he put the pen into her hand and closed her fingers round it. He had not let himself notice that at the time, and he did not let himself notice it now.</w:t>
+      </w:r>
+    </w:p>
+    <w:p>
+      <w:r>
+        <w:t>It was nearly eleven. He turned off the lamp. He would sleep well; he always slept well. In the morning he would put on the claret tie, because to leave it off now would be to admit that a tie could matter, and walk down the three steps at nine as he always did.</w:t>
+      </w:r>
+    </w:p>
+    <w:p>
+      <w:r>
+        <w:t>On the way out, he stopped at the lodge under the archway, which was a bicycle store now, with a combination lock on the door, and stood for a moment in front of it in the dark with his hand on the cold iron of the grille.</w:t>
+      </w:r>
+    </w:p>
+    <w:p>
+      <w:r>
+        <w:rPr>
+          <w:i/>
+        </w:rPr>
+        <w:t>Bonjour, Madame Roux,</w:t>
+      </w:r>
+      <w:r>
+        <w:t xml:space="preserve"> he said, very quietly, to nobody, the way a young man from Marseille had said it once, when everybody else walked past.</w:t>
+      </w:r>
+    </w:p>
+    <w:p>
+      <w:r>
+        <w:t>Then he went out into the Cours Mirabeau, under the plane trees, with the umbrella under his arm, beneath a clear sky with every star in it, and not a drop of rain anywhere in Provence.</w:t>
+      </w:r>
+    </w:p>
+    <w:p>
+      <w:pPr>
+        <w:pStyle w:val="Heading2"/>
+        <w:pageBreakBefore/>
+      </w:pPr>
+      <w:bookmarkStart w:id="35" w:name="ch_32"/>
+      <w:r>
+        <w:t>Chapter 32: The Second Box</w:t>
+      </w:r>
+      <w:bookmarkEnd w:id="35"/>
     </w:p>
     <w:p>
       <w:pPr>
@@ -10208,7 +10522,7 @@
     </w:p>
     <w:p>
       <w:r>
-        <w:t xml:space="preserve">He saw Tobias first, and his face did nothing at all. He saw Catarina, and something moved at the corner of his mouth, a small, courteous, varnished thing, the ghost of the smile from the pavement on the rue Gaston de Saporta. </w:t>
+        <w:t xml:space="preserve">He saw Tobias first, and his face did nothing at all. He saw Catarina, and something moved at the corner of his mouth, a small, courteous, varnished thing, the ghost of the smile from the hospital car park. </w:t>
       </w:r>
       <w:r>
         <w:rPr>
@@ -10389,6 +10703,20 @@
     </w:p>
     <w:p>
       <w:r>
+        <w:t xml:space="preserve">"There was a difficulty," he said, on the doorstep, before he had even taken off his coat, because he was a man who told things in order. "Inside the box was a steel case. Inside the steel case, the lawyers said, was the property of the Fondation Vial, and the case had a lock of four numbers, and nobody alive, the lawyers said, knew the four numbers. The bank's register said the case had been brought in, in March, by a Monsieur Victor Hale, who had been sent with it by his chairman, as a cashier is sent to the bank. Monsieur Vial was at sea. A locksmith would need a drill, and a week, and a drill is not a thing one points at six hundred years of vellum." He paused. "Your Inspector asked the director for one minute. She took a card from her pocket, in a plastic sleeve, in an Englishwoman's handwriting. </w:t>
+      </w:r>
+      <w:r>
+        <w:rPr>
+          <w:i/>
+        </w:rPr>
+        <w:t>The same four numbers for everything.</w:t>
+      </w:r>
+      <w:r>
+        <w:t xml:space="preserve"> She turned the wheels. One, nine, seven, three. The year of an orange car." For the first time since they had known him, Anselm Brunner very nearly laughed. "The case opened. The lawyers stopped objecting. I have never heard lawyers stop before. It is like a clock stopping."</w:t>
+      </w:r>
+    </w:p>
+    <w:p>
+      <w:r>
         <w:t>He sat in the kitchen. He declined tea. He accepted water, in the cup with the chip, and drank it with his back very straight. Then he put the leather case on the oilcloth, between the bread and the dictionaries, and opened it, and took out, in white cotton gloves, a book.</w:t>
       </w:r>
     </w:p>
@@ -10408,7 +10736,7 @@
     </w:p>
     <w:p>
       <w:r>
-        <w:t>"A book of hours," said Brunner, very quietly. "For prayer. For a private person, a lady perhaps, to carry with her through the day. Made in Avignon, in 1347, when the popes lived there, by somebody whose name we do not know, who was very good, and very patient, and probably not paid enough." He opened the clasps, one, then the other, with a small click each, like a clock being wound. "Two hundred and thirty years we have looked for it. Since the Revolution. It has been in Lyon, and in Turin, and in a château near Tours, and in a bank in Geneva, and in the bedroom of an old lady with dementia who thought it was her missal. And for the last two years it has been in a box in the rue Paradis, belonging to a man who gave two million euros to be photographed with a cardinal and never once, I think, opened it."</w:t>
+        <w:t>"A book of hours," said Brunner, very quietly. "For prayer. For a private person, a lady perhaps, to carry with her through the day. Made in Avignon, in 1347, when the popes lived there, by somebody whose name we do not know, who was very good, and very patient, and probably not paid enough." He opened the clasps, one, then the other, with a small click each, like a clock being wound. "Two hundred and thirty years we have looked for it. Since the Revolution. It has been in Lyon, and in Turin, and in a château near Tours, and in a bank in Geneva, and in the bedroom of an old lady with dementia who thought it was her missal. And for the last two years it has been in a publisher's safe in Bloomsbury and then, since March, when an editor began to ask questions, in a box in the rue Paradis, belonging to a man who gave two million euros to be photographed with a cardinal and never once, I think, opened it."</w:t>
       </w:r>
     </w:p>
     <w:p>
@@ -10523,11 +10851,11 @@
         <w:pStyle w:val="Heading2"/>
         <w:pageBreakBefore/>
       </w:pPr>
-      <w:bookmarkStart w:id="35" w:name="ch_32"/>
-      <w:r>
-        <w:t>Chapter 32: The Commandant</w:t>
-      </w:r>
-      <w:bookmarkEnd w:id="35"/>
+      <w:bookmarkStart w:id="36" w:name="ch_33"/>
+      <w:r>
+        <w:t>Chapter 33: The Commandant</w:t>
+      </w:r>
+      <w:bookmarkEnd w:id="36"/>
     </w:p>
     <w:p>
       <w:pPr>
@@ -10931,11 +11259,11 @@
         <w:pStyle w:val="Heading2"/>
         <w:pageBreakBefore/>
       </w:pPr>
-      <w:bookmarkStart w:id="36" w:name="ch_33"/>
-      <w:r>
-        <w:t>Chapter 33: Dick Whittington</w:t>
-      </w:r>
-      <w:bookmarkEnd w:id="36"/>
+      <w:bookmarkStart w:id="37" w:name="ch_34"/>
+      <w:r>
+        <w:t>Chapter 34: Dick Whittington</w:t>
+      </w:r>
+      <w:bookmarkEnd w:id="37"/>
     </w:p>
     <w:p>
       <w:pPr>
@@ -11641,11 +11969,11 @@
         <w:pStyle w:val="Heading2"/>
         <w:pageBreakBefore/>
       </w:pPr>
-      <w:bookmarkStart w:id="37" w:name="ch_34"/>
-      <w:r>
-        <w:t>Chapter 34: The Trial</w:t>
-      </w:r>
-      <w:bookmarkEnd w:id="37"/>
+      <w:bookmarkStart w:id="38" w:name="ch_35"/>
+      <w:r>
+        <w:t>Chapter 35: The Trial</w:t>
+      </w:r>
+      <w:bookmarkEnd w:id="38"/>
     </w:p>
     <w:p>
       <w:pPr>
@@ -11657,7 +11985,7 @@
     </w:p>
     <w:p>
       <w:r>
-        <w:t>They were charged with breaking and entering, attempted theft, criminal damage to a brass gong, and, at the particular insistence of the prosecutor, who had a nine-year-old of her own, wilful ignorance of the ways of a child. Their lawyer was a tired young woman from the duty roster who had been given the file on the Friday and had read it, she told the court with some feeling, three times, in the hope that it would make more sense the third time, which it had not.</w:t>
+        <w:t>They were charged with breaking and entering, attempted theft, criminal damage to a hall window, and, at the particular insistence of the prosecutor, who had a nine-year-old of her own, wilful ignorance of the ways of a child. Their lawyer was a tired young woman from the duty roster who had been given the file on the Friday and had read it, she told the court with some feeling, three times, in the hope that it would make more sense the third time, which it had not.</w:t>
       </w:r>
     </w:p>
     <w:p>
@@ -11673,10 +12001,10 @@
         <w:rPr>
           <w:i/>
         </w:rPr>
-        <w:t>marbles</w:t>
-      </w:r>
-      <w:r>
-        <w:t xml:space="preserve"> in the police report. He explained, with diagrams he had prepared in advance on squared paper, the coefficient of friction of a good peppery olive oil on a waxed oak stair. He identified the first Gaston as "the one who shouts" and the second Gaston as "the one who falls," and both Gastons, from the dock, nodded, because it was true. When the duty lawyer asked him, gently, whether he had not been frightened, alone in a dark house at night with two grown men breaking in, Hugo considered the question with real seriousness.</w:t>
+        <w:t>Malpolon monspessulanus</w:t>
+      </w:r>
+      <w:r>
+        <w:t xml:space="preserve"> in the police report. He explained, with diagrams he had prepared in advance on squared paper, the difference between a Montpellier snake, which is back-fanged and bad-tempered, and a ladder snake, which is neither, and why a man who believes the first is under a cushion will leave a house by a window that is not open. He read out, from his notebook, the statement both defendants had given him from the pond, and both Gastons, from the dock, nodded, because it was accurate, and because he had read it back to them at the time. He identified the first Gaston as "the one who shouts" and the second Gaston as "the one who falls." When the duty lawyer asked him, gently, whether he had not been frightened, alone in a dark house at night with two grown men breaking in, Hugo considered the question with real seriousness.</w:t>
       </w:r>
     </w:p>
     <w:p>
@@ -12165,11 +12493,11 @@
         <w:pStyle w:val="Heading2"/>
         <w:pageBreakBefore/>
       </w:pPr>
-      <w:bookmarkStart w:id="38" w:name="ch_35"/>
-      <w:r>
-        <w:t>Chapter 35: The Courthouse Steps</w:t>
-      </w:r>
-      <w:bookmarkEnd w:id="38"/>
+      <w:bookmarkStart w:id="39" w:name="ch_36"/>
+      <w:r>
+        <w:t>Chapter 36: The Courthouse Steps</w:t>
+      </w:r>
+      <w:bookmarkEnd w:id="39"/>
     </w:p>
     <w:p>
       <w:pPr>
@@ -12446,11 +12774,11 @@
         <w:pStyle w:val="Heading2"/>
         <w:pageBreakBefore/>
       </w:pPr>
-      <w:bookmarkStart w:id="39" w:name="ch_36"/>
-      <w:r>
-        <w:t>Chapter 36: Margaret and Geoffrey</w:t>
-      </w:r>
-      <w:bookmarkEnd w:id="39"/>
+      <w:bookmarkStart w:id="40" w:name="ch_37"/>
+      <w:r>
+        <w:t>Chapter 37: Margaret and Geoffrey</w:t>
+      </w:r>
+      <w:bookmarkEnd w:id="40"/>
     </w:p>
     <w:p>
       <w:pPr>
@@ -12807,11 +13135,11 @@
         <w:pStyle w:val="Heading2"/>
         <w:pageBreakBefore/>
       </w:pPr>
-      <w:bookmarkStart w:id="40" w:name="epilogue"/>
+      <w:bookmarkStart w:id="41" w:name="epilogue"/>
       <w:r>
         <w:t>Epilogue: The Jetty</w:t>
       </w:r>
-      <w:bookmarkEnd w:id="40"/>
+      <w:bookmarkEnd w:id="41"/>
     </w:p>
     <w:p>
       <w:pPr>
@@ -13229,7 +13557,7 @@
     </w:p>
     <w:p>
       <w:r>
-        <w:t xml:space="preserve">She corrected one word. She put a small, firm, schoolteacher's circle round it, and wrote the right one above it, in her careful capitals. Then, under the line, she wrote her answer, first in Portuguese and then in English, and folded the page back along his folds, and gave it back to him, and looked out at the water, very pink, with her chin up, the way she had looked at the Hargreaveses at the inn in the Camargue, and at Victor Hale in the hall, and at a man with an umbrella on a pavement in Aix, and at a whole village hall in December shouting </w:t>
+        <w:t xml:space="preserve">She corrected one word. She put a small, firm, schoolteacher's circle round it, and wrote the right one above it, in her careful capitals. Then, under the line, she wrote her answer, first in Portuguese and then in English, and folded the page back along his folds, and gave it back to him, and looked out at the water, very pink, with her chin up, the way she had looked at the Hargreaveses at the inn in the Camargue, and at Victor Hale in the hall, and at a man with an umbrella in a car park in Aix, and at a whole village hall in December shouting </w:t>
       </w:r>
       <w:r>
         <w:rPr>

</xml_diff>

<commit_message>
ILWM round 4: docx master with page-numbered linked TOC (PAGEREF, 292pp LO)
</commit_message>
<xml_diff>
--- a/In Love with Murder, Actually/In_Love_with_Murder_Actually.docx
+++ b/In Love with Murder, Actually/In_Love_with_Murder_Actually.docx
@@ -189,6 +189,9 @@
     </w:p>
     <w:p>
       <w:pPr>
+        <w:tabs>
+          <w:tab w:pos="5544" w:val="right" w:leader="dot"/>
+        </w:tabs>
         <w:spacing w:before="160" w:after="80"/>
         <w:ind w:firstLine="0"/>
       </w:pPr>
@@ -200,9 +203,48 @@
           <w:t xml:space="preserve">Part One: The Lake</w:t>
         </w:r>
       </w:hyperlink>
-    </w:p>
-    <w:p>
-      <w:pPr>
+      <w:r>
+        <w:rPr>
+          <w:b/>
+        </w:rPr>
+        <w:tab/>
+      </w:r>
+      <w:r>
+        <w:rPr>
+          <w:b/>
+        </w:rPr>
+        <w:fldChar w:fldCharType="begin"/>
+      </w:r>
+      <w:r>
+        <w:rPr>
+          <w:b/>
+        </w:rPr>
+        <w:instrText xml:space="preserve"> PAGEREF part_part_one \h </w:instrText>
+      </w:r>
+      <w:r>
+        <w:rPr>
+          <w:b/>
+        </w:rPr>
+        <w:fldChar w:fldCharType="separate"/>
+      </w:r>
+      <w:r>
+        <w:rPr>
+          <w:b/>
+        </w:rPr>
+        <w:t xml:space="preserve">7</w:t>
+      </w:r>
+      <w:r>
+        <w:rPr>
+          <w:b/>
+        </w:rPr>
+        <w:fldChar w:fldCharType="end"/>
+      </w:r>
+    </w:p>
+    <w:p>
+      <w:pPr>
+        <w:tabs>
+          <w:tab w:pos="5544" w:val="right" w:leader="dot"/>
+        </w:tabs>
         <w:ind w:firstLine="0" w:left="288"/>
       </w:pPr>
       <w:hyperlink w:anchor="ch_1" w:history="1">
@@ -211,9 +253,30 @@
           <w:t xml:space="preserve">Chapter 1: Leeds</w:t>
         </w:r>
       </w:hyperlink>
-    </w:p>
-    <w:p>
-      <w:pPr>
+      <w:r>
+        <w:tab/>
+      </w:r>
+      <w:r>
+        <w:fldChar w:fldCharType="begin"/>
+      </w:r>
+      <w:r>
+        <w:instrText xml:space="preserve"> PAGEREF ch_1 \h </w:instrText>
+      </w:r>
+      <w:r>
+        <w:fldChar w:fldCharType="separate"/>
+      </w:r>
+      <w:r>
+        <w:t xml:space="preserve">8</w:t>
+      </w:r>
+      <w:r>
+        <w:fldChar w:fldCharType="end"/>
+      </w:r>
+    </w:p>
+    <w:p>
+      <w:pPr>
+        <w:tabs>
+          <w:tab w:pos="5544" w:val="right" w:leader="dot"/>
+        </w:tabs>
         <w:ind w:firstLine="0" w:left="288"/>
       </w:pPr>
       <w:hyperlink w:anchor="ch_2" w:history="1">
@@ -222,9 +285,30 @@
           <w:t xml:space="preserve">Chapter 2: The Pond</w:t>
         </w:r>
       </w:hyperlink>
-    </w:p>
-    <w:p>
-      <w:pPr>
+      <w:r>
+        <w:tab/>
+      </w:r>
+      <w:r>
+        <w:fldChar w:fldCharType="begin"/>
+      </w:r>
+      <w:r>
+        <w:instrText xml:space="preserve"> PAGEREF ch_2 \h </w:instrText>
+      </w:r>
+      <w:r>
+        <w:fldChar w:fldCharType="separate"/>
+      </w:r>
+      <w:r>
+        <w:t xml:space="preserve">10</w:t>
+      </w:r>
+      <w:r>
+        <w:fldChar w:fldCharType="end"/>
+      </w:r>
+    </w:p>
+    <w:p>
+      <w:pPr>
+        <w:tabs>
+          <w:tab w:pos="5544" w:val="right" w:leader="dot"/>
+        </w:tabs>
         <w:ind w:firstLine="0" w:left="288"/>
       </w:pPr>
       <w:hyperlink w:anchor="ch_3" w:history="1">
@@ -233,9 +317,30 @@
           <w:t xml:space="preserve">Chapter 3: The Housekeeper</w:t>
         </w:r>
       </w:hyperlink>
-    </w:p>
-    <w:p>
-      <w:pPr>
+      <w:r>
+        <w:tab/>
+      </w:r>
+      <w:r>
+        <w:fldChar w:fldCharType="begin"/>
+      </w:r>
+      <w:r>
+        <w:instrText xml:space="preserve"> PAGEREF ch_3 \h </w:instrText>
+      </w:r>
+      <w:r>
+        <w:fldChar w:fldCharType="separate"/>
+      </w:r>
+      <w:r>
+        <w:t xml:space="preserve">13</w:t>
+      </w:r>
+      <w:r>
+        <w:fldChar w:fldCharType="end"/>
+      </w:r>
+    </w:p>
+    <w:p>
+      <w:pPr>
+        <w:tabs>
+          <w:tab w:pos="5544" w:val="right" w:leader="dot"/>
+        </w:tabs>
         <w:ind w:firstLine="0" w:left="288"/>
       </w:pPr>
       <w:hyperlink w:anchor="ch_4" w:history="1">
@@ -244,9 +349,30 @@
           <w:t xml:space="preserve">Chapter 4: What the Water Left</w:t>
         </w:r>
       </w:hyperlink>
-    </w:p>
-    <w:p>
-      <w:pPr>
+      <w:r>
+        <w:tab/>
+      </w:r>
+      <w:r>
+        <w:fldChar w:fldCharType="begin"/>
+      </w:r>
+      <w:r>
+        <w:instrText xml:space="preserve"> PAGEREF ch_4 \h </w:instrText>
+      </w:r>
+      <w:r>
+        <w:fldChar w:fldCharType="separate"/>
+      </w:r>
+      <w:r>
+        <w:t xml:space="preserve">16</w:t>
+      </w:r>
+      <w:r>
+        <w:fldChar w:fldCharType="end"/>
+      </w:r>
+    </w:p>
+    <w:p>
+      <w:pPr>
+        <w:tabs>
+          <w:tab w:pos="5544" w:val="right" w:leader="dot"/>
+        </w:tabs>
         <w:ind w:firstLine="0" w:left="288"/>
       </w:pPr>
       <w:hyperlink w:anchor="ch_5" w:history="1">
@@ -255,9 +381,30 @@
           <w:t xml:space="preserve">Chapter 5: The Gatepost</w:t>
         </w:r>
       </w:hyperlink>
-    </w:p>
-    <w:p>
-      <w:pPr>
+      <w:r>
+        <w:tab/>
+      </w:r>
+      <w:r>
+        <w:fldChar w:fldCharType="begin"/>
+      </w:r>
+      <w:r>
+        <w:instrText xml:space="preserve"> PAGEREF ch_5 \h </w:instrText>
+      </w:r>
+      <w:r>
+        <w:fldChar w:fldCharType="separate"/>
+      </w:r>
+      <w:r>
+        <w:t xml:space="preserve">20</w:t>
+      </w:r>
+      <w:r>
+        <w:fldChar w:fldCharType="end"/>
+      </w:r>
+    </w:p>
+    <w:p>
+      <w:pPr>
+        <w:tabs>
+          <w:tab w:pos="5544" w:val="right" w:leader="dot"/>
+        </w:tabs>
         <w:ind w:firstLine="0" w:left="288"/>
       </w:pPr>
       <w:hyperlink w:anchor="ch_6" w:history="1">
@@ -266,9 +413,30 @@
           <w:t xml:space="preserve">Chapter 6: The Machine</w:t>
         </w:r>
       </w:hyperlink>
-    </w:p>
-    <w:p>
-      <w:pPr>
+      <w:r>
+        <w:tab/>
+      </w:r>
+      <w:r>
+        <w:fldChar w:fldCharType="begin"/>
+      </w:r>
+      <w:r>
+        <w:instrText xml:space="preserve"> PAGEREF ch_6 \h </w:instrText>
+      </w:r>
+      <w:r>
+        <w:fldChar w:fldCharType="separate"/>
+      </w:r>
+      <w:r>
+        <w:t xml:space="preserve">25</w:t>
+      </w:r>
+      <w:r>
+        <w:fldChar w:fldCharType="end"/>
+      </w:r>
+    </w:p>
+    <w:p>
+      <w:pPr>
+        <w:tabs>
+          <w:tab w:pos="5544" w:val="right" w:leader="dot"/>
+        </w:tabs>
         <w:ind w:firstLine="0" w:left="288"/>
       </w:pPr>
       <w:hyperlink w:anchor="ch_7" w:history="1">
@@ -277,9 +445,30 @@
           <w:t xml:space="preserve">Chapter 7: The Night She Died</w:t>
         </w:r>
       </w:hyperlink>
-    </w:p>
-    <w:p>
-      <w:pPr>
+      <w:r>
+        <w:tab/>
+      </w:r>
+      <w:r>
+        <w:fldChar w:fldCharType="begin"/>
+      </w:r>
+      <w:r>
+        <w:instrText xml:space="preserve"> PAGEREF ch_7 \h </w:instrText>
+      </w:r>
+      <w:r>
+        <w:fldChar w:fldCharType="separate"/>
+      </w:r>
+      <w:r>
+        <w:t xml:space="preserve">29</w:t>
+      </w:r>
+      <w:r>
+        <w:fldChar w:fldCharType="end"/>
+      </w:r>
+    </w:p>
+    <w:p>
+      <w:pPr>
+        <w:tabs>
+          <w:tab w:pos="5544" w:val="right" w:leader="dot"/>
+        </w:tabs>
         <w:ind w:firstLine="0" w:left="288"/>
       </w:pPr>
       <w:hyperlink w:anchor="ch_8" w:history="1">
@@ -288,9 +477,30 @@
           <w:t xml:space="preserve">Chapter 8: Birds</w:t>
         </w:r>
       </w:hyperlink>
-    </w:p>
-    <w:p>
-      <w:pPr>
+      <w:r>
+        <w:tab/>
+      </w:r>
+      <w:r>
+        <w:fldChar w:fldCharType="begin"/>
+      </w:r>
+      <w:r>
+        <w:instrText xml:space="preserve"> PAGEREF ch_8 \h </w:instrText>
+      </w:r>
+      <w:r>
+        <w:fldChar w:fldCharType="separate"/>
+      </w:r>
+      <w:r>
+        <w:t xml:space="preserve">37</w:t>
+      </w:r>
+      <w:r>
+        <w:fldChar w:fldCharType="end"/>
+      </w:r>
+    </w:p>
+    <w:p>
+      <w:pPr>
+        <w:tabs>
+          <w:tab w:pos="5544" w:val="right" w:leader="dot"/>
+        </w:tabs>
         <w:ind w:firstLine="0" w:left="288"/>
       </w:pPr>
       <w:hyperlink w:anchor="ch_9" w:history="1">
@@ -299,9 +509,30 @@
           <w:t xml:space="preserve">Chapter 9: The Leaflet</w:t>
         </w:r>
       </w:hyperlink>
-    </w:p>
-    <w:p>
-      <w:pPr>
+      <w:r>
+        <w:tab/>
+      </w:r>
+      <w:r>
+        <w:fldChar w:fldCharType="begin"/>
+      </w:r>
+      <w:r>
+        <w:instrText xml:space="preserve"> PAGEREF ch_9 \h </w:instrText>
+      </w:r>
+      <w:r>
+        <w:fldChar w:fldCharType="separate"/>
+      </w:r>
+      <w:r>
+        <w:t xml:space="preserve">42</w:t>
+      </w:r>
+      <w:r>
+        <w:fldChar w:fldCharType="end"/>
+      </w:r>
+    </w:p>
+    <w:p>
+      <w:pPr>
+        <w:tabs>
+          <w:tab w:pos="5544" w:val="right" w:leader="dot"/>
+        </w:tabs>
         <w:ind w:firstLine="0" w:left="288"/>
       </w:pPr>
       <w:hyperlink w:anchor="ch_10" w:history="1">
@@ -310,9 +541,30 @@
           <w:t xml:space="preserve">Chapter 10: The House Next Door</w:t>
         </w:r>
       </w:hyperlink>
-    </w:p>
-    <w:p>
-      <w:pPr>
+      <w:r>
+        <w:tab/>
+      </w:r>
+      <w:r>
+        <w:fldChar w:fldCharType="begin"/>
+      </w:r>
+      <w:r>
+        <w:instrText xml:space="preserve"> PAGEREF ch_10 \h </w:instrText>
+      </w:r>
+      <w:r>
+        <w:fldChar w:fldCharType="separate"/>
+      </w:r>
+      <w:r>
+        <w:t xml:space="preserve">46</w:t>
+      </w:r>
+      <w:r>
+        <w:fldChar w:fldCharType="end"/>
+      </w:r>
+    </w:p>
+    <w:p>
+      <w:pPr>
+        <w:tabs>
+          <w:tab w:pos="5544" w:val="right" w:leader="dot"/>
+        </w:tabs>
         <w:ind w:firstLine="0" w:left="288"/>
       </w:pPr>
       <w:hyperlink w:anchor="ch_11" w:history="1">
@@ -321,9 +573,30 @@
           <w:t xml:space="preserve">Chapter 11: Três Marias</w:t>
         </w:r>
       </w:hyperlink>
-    </w:p>
-    <w:p>
-      <w:pPr>
+      <w:r>
+        <w:tab/>
+      </w:r>
+      <w:r>
+        <w:fldChar w:fldCharType="begin"/>
+      </w:r>
+      <w:r>
+        <w:instrText xml:space="preserve"> PAGEREF ch_11 \h </w:instrText>
+      </w:r>
+      <w:r>
+        <w:fldChar w:fldCharType="separate"/>
+      </w:r>
+      <w:r>
+        <w:t xml:space="preserve">51</w:t>
+      </w:r>
+      <w:r>
+        <w:fldChar w:fldCharType="end"/>
+      </w:r>
+    </w:p>
+    <w:p>
+      <w:pPr>
+        <w:tabs>
+          <w:tab w:pos="5544" w:val="right" w:leader="dot"/>
+        </w:tabs>
         <w:ind w:firstLine="0" w:left="288"/>
       </w:pPr>
       <w:hyperlink w:anchor="ch_12" w:history="1">
@@ -332,9 +605,30 @@
           <w:t xml:space="preserve">Chapter 12: Flamingos</w:t>
         </w:r>
       </w:hyperlink>
-    </w:p>
-    <w:p>
-      <w:pPr>
+      <w:r>
+        <w:tab/>
+      </w:r>
+      <w:r>
+        <w:fldChar w:fldCharType="begin"/>
+      </w:r>
+      <w:r>
+        <w:instrText xml:space="preserve"> PAGEREF ch_12 \h </w:instrText>
+      </w:r>
+      <w:r>
+        <w:fldChar w:fldCharType="separate"/>
+      </w:r>
+      <w:r>
+        <w:t xml:space="preserve">56</w:t>
+      </w:r>
+      <w:r>
+        <w:fldChar w:fldCharType="end"/>
+      </w:r>
+    </w:p>
+    <w:p>
+      <w:pPr>
+        <w:tabs>
+          <w:tab w:pos="5544" w:val="right" w:leader="dot"/>
+        </w:tabs>
         <w:ind w:firstLine="0" w:left="288"/>
       </w:pPr>
       <w:hyperlink w:anchor="ch_13" w:history="1">
@@ -343,9 +637,30 @@
           <w:t xml:space="preserve">Chapter 13: Market Day</w:t>
         </w:r>
       </w:hyperlink>
-    </w:p>
-    <w:p>
-      <w:pPr>
+      <w:r>
+        <w:tab/>
+      </w:r>
+      <w:r>
+        <w:fldChar w:fldCharType="begin"/>
+      </w:r>
+      <w:r>
+        <w:instrText xml:space="preserve"> PAGEREF ch_13 \h </w:instrText>
+      </w:r>
+      <w:r>
+        <w:fldChar w:fldCharType="separate"/>
+      </w:r>
+      <w:r>
+        <w:t xml:space="preserve">60</w:t>
+      </w:r>
+      <w:r>
+        <w:fldChar w:fldCharType="end"/>
+      </w:r>
+    </w:p>
+    <w:p>
+      <w:pPr>
+        <w:tabs>
+          <w:tab w:pos="5544" w:val="right" w:leader="dot"/>
+        </w:tabs>
         <w:ind w:firstLine="0" w:left="288"/>
       </w:pPr>
       <w:hyperlink w:anchor="ch_14" w:history="1">
@@ -354,9 +669,30 @@
           <w:t xml:space="preserve">Chapter 14: The Mountain</w:t>
         </w:r>
       </w:hyperlink>
-    </w:p>
-    <w:p>
-      <w:pPr>
+      <w:r>
+        <w:tab/>
+      </w:r>
+      <w:r>
+        <w:fldChar w:fldCharType="begin"/>
+      </w:r>
+      <w:r>
+        <w:instrText xml:space="preserve"> PAGEREF ch_14 \h </w:instrText>
+      </w:r>
+      <w:r>
+        <w:fldChar w:fldCharType="separate"/>
+      </w:r>
+      <w:r>
+        <w:t xml:space="preserve">67</w:t>
+      </w:r>
+      <w:r>
+        <w:fldChar w:fldCharType="end"/>
+      </w:r>
+    </w:p>
+    <w:p>
+      <w:pPr>
+        <w:tabs>
+          <w:tab w:pos="5544" w:val="right" w:leader="dot"/>
+        </w:tabs>
         <w:ind w:firstLine="0" w:left="288"/>
       </w:pPr>
       <w:hyperlink w:anchor="ch_15" w:history="1">
@@ -365,9 +701,30 @@
           <w:t xml:space="preserve">Chapter 15: The Visitor</w:t>
         </w:r>
       </w:hyperlink>
-    </w:p>
-    <w:p>
-      <w:pPr>
+      <w:r>
+        <w:tab/>
+      </w:r>
+      <w:r>
+        <w:fldChar w:fldCharType="begin"/>
+      </w:r>
+      <w:r>
+        <w:instrText xml:space="preserve"> PAGEREF ch_15 \h </w:instrText>
+      </w:r>
+      <w:r>
+        <w:fldChar w:fldCharType="separate"/>
+      </w:r>
+      <w:r>
+        <w:t xml:space="preserve">71</w:t>
+      </w:r>
+      <w:r>
+        <w:fldChar w:fldCharType="end"/>
+      </w:r>
+    </w:p>
+    <w:p>
+      <w:pPr>
+        <w:tabs>
+          <w:tab w:pos="5544" w:val="right" w:leader="dot"/>
+        </w:tabs>
         <w:spacing w:before="160" w:after="80"/>
         <w:ind w:firstLine="0"/>
       </w:pPr>
@@ -379,9 +736,48 @@
           <w:t xml:space="preserve">Part Two: The Paper Trail</w:t>
         </w:r>
       </w:hyperlink>
-    </w:p>
-    <w:p>
-      <w:pPr>
+      <w:r>
+        <w:rPr>
+          <w:b/>
+        </w:rPr>
+        <w:tab/>
+      </w:r>
+      <w:r>
+        <w:rPr>
+          <w:b/>
+        </w:rPr>
+        <w:fldChar w:fldCharType="begin"/>
+      </w:r>
+      <w:r>
+        <w:rPr>
+          <w:b/>
+        </w:rPr>
+        <w:instrText xml:space="preserve"> PAGEREF part_part_two \h </w:instrText>
+      </w:r>
+      <w:r>
+        <w:rPr>
+          <w:b/>
+        </w:rPr>
+        <w:fldChar w:fldCharType="separate"/>
+      </w:r>
+      <w:r>
+        <w:rPr>
+          <w:b/>
+        </w:rPr>
+        <w:t xml:space="preserve">77</w:t>
+      </w:r>
+      <w:r>
+        <w:rPr>
+          <w:b/>
+        </w:rPr>
+        <w:fldChar w:fldCharType="end"/>
+      </w:r>
+    </w:p>
+    <w:p>
+      <w:pPr>
+        <w:tabs>
+          <w:tab w:pos="5544" w:val="right" w:leader="dot"/>
+        </w:tabs>
         <w:ind w:firstLine="0" w:left="288"/>
       </w:pPr>
       <w:hyperlink w:anchor="ch_16" w:history="1">
@@ -390,9 +786,30 @@
           <w:t xml:space="preserve">Chapter 16: The Contract</w:t>
         </w:r>
       </w:hyperlink>
-    </w:p>
-    <w:p>
-      <w:pPr>
+      <w:r>
+        <w:tab/>
+      </w:r>
+      <w:r>
+        <w:fldChar w:fldCharType="begin"/>
+      </w:r>
+      <w:r>
+        <w:instrText xml:space="preserve"> PAGEREF ch_16 \h </w:instrText>
+      </w:r>
+      <w:r>
+        <w:fldChar w:fldCharType="separate"/>
+      </w:r>
+      <w:r>
+        <w:t xml:space="preserve">78</w:t>
+      </w:r>
+      <w:r>
+        <w:fldChar w:fldCharType="end"/>
+      </w:r>
+    </w:p>
+    <w:p>
+      <w:pPr>
+        <w:tabs>
+          <w:tab w:pos="5544" w:val="right" w:leader="dot"/>
+        </w:tabs>
         <w:ind w:firstLine="0" w:left="288"/>
       </w:pPr>
       <w:hyperlink w:anchor="ch_17" w:history="1">
@@ -401,9 +818,30 @@
           <w:t xml:space="preserve">Chapter 17: Highly Commended</w:t>
         </w:r>
       </w:hyperlink>
-    </w:p>
-    <w:p>
-      <w:pPr>
+      <w:r>
+        <w:tab/>
+      </w:r>
+      <w:r>
+        <w:fldChar w:fldCharType="begin"/>
+      </w:r>
+      <w:r>
+        <w:instrText xml:space="preserve"> PAGEREF ch_17 \h </w:instrText>
+      </w:r>
+      <w:r>
+        <w:fldChar w:fldCharType="separate"/>
+      </w:r>
+      <w:r>
+        <w:t xml:space="preserve">89</w:t>
+      </w:r>
+      <w:r>
+        <w:fldChar w:fldCharType="end"/>
+      </w:r>
+    </w:p>
+    <w:p>
+      <w:pPr>
+        <w:tabs>
+          <w:tab w:pos="5544" w:val="right" w:leader="dot"/>
+        </w:tabs>
         <w:ind w:firstLine="0" w:left="288"/>
       </w:pPr>
       <w:hyperlink w:anchor="ch_18" w:history="1">
@@ -412,9 +850,30 @@
           <w:t xml:space="preserve">Chapter 18: The Voice</w:t>
         </w:r>
       </w:hyperlink>
-    </w:p>
-    <w:p>
-      <w:pPr>
+      <w:r>
+        <w:tab/>
+      </w:r>
+      <w:r>
+        <w:fldChar w:fldCharType="begin"/>
+      </w:r>
+      <w:r>
+        <w:instrText xml:space="preserve"> PAGEREF ch_18 \h </w:instrText>
+      </w:r>
+      <w:r>
+        <w:fldChar w:fldCharType="separate"/>
+      </w:r>
+      <w:r>
+        <w:t xml:space="preserve">100</w:t>
+      </w:r>
+      <w:r>
+        <w:fldChar w:fldCharType="end"/>
+      </w:r>
+    </w:p>
+    <w:p>
+      <w:pPr>
+        <w:tabs>
+          <w:tab w:pos="5544" w:val="right" w:leader="dot"/>
+        </w:tabs>
         <w:ind w:firstLine="0" w:left="288"/>
       </w:pPr>
       <w:hyperlink w:anchor="ch_19" w:history="1">
@@ -423,9 +882,30 @@
           <w:t xml:space="preserve">Chapter 19: The Rent</w:t>
         </w:r>
       </w:hyperlink>
-    </w:p>
-    <w:p>
-      <w:pPr>
+      <w:r>
+        <w:tab/>
+      </w:r>
+      <w:r>
+        <w:fldChar w:fldCharType="begin"/>
+      </w:r>
+      <w:r>
+        <w:instrText xml:space="preserve"> PAGEREF ch_19 \h </w:instrText>
+      </w:r>
+      <w:r>
+        <w:fldChar w:fldCharType="separate"/>
+      </w:r>
+      <w:r>
+        <w:t xml:space="preserve">111</w:t>
+      </w:r>
+      <w:r>
+        <w:fldChar w:fldCharType="end"/>
+      </w:r>
+    </w:p>
+    <w:p>
+      <w:pPr>
+        <w:tabs>
+          <w:tab w:pos="5544" w:val="right" w:leader="dot"/>
+        </w:tabs>
         <w:ind w:firstLine="0" w:left="288"/>
       </w:pPr>
       <w:hyperlink w:anchor="ch_20" w:history="1">
@@ -434,9 +914,30 @@
           <w:t xml:space="preserve">Chapter 20: The Balcony</w:t>
         </w:r>
       </w:hyperlink>
-    </w:p>
-    <w:p>
-      <w:pPr>
+      <w:r>
+        <w:tab/>
+      </w:r>
+      <w:r>
+        <w:fldChar w:fldCharType="begin"/>
+      </w:r>
+      <w:r>
+        <w:instrText xml:space="preserve"> PAGEREF ch_20 \h </w:instrText>
+      </w:r>
+      <w:r>
+        <w:fldChar w:fldCharType="separate"/>
+      </w:r>
+      <w:r>
+        <w:t xml:space="preserve">122</w:t>
+      </w:r>
+      <w:r>
+        <w:fldChar w:fldCharType="end"/>
+      </w:r>
+    </w:p>
+    <w:p>
+      <w:pPr>
+        <w:tabs>
+          <w:tab w:pos="5544" w:val="right" w:leader="dot"/>
+        </w:tabs>
         <w:ind w:firstLine="0" w:left="288"/>
       </w:pPr>
       <w:hyperlink w:anchor="ch_21" w:history="1">
@@ -445,9 +946,30 @@
           <w:t xml:space="preserve">Chapter 21: The Bridge</w:t>
         </w:r>
       </w:hyperlink>
-    </w:p>
-    <w:p>
-      <w:pPr>
+      <w:r>
+        <w:tab/>
+      </w:r>
+      <w:r>
+        <w:fldChar w:fldCharType="begin"/>
+      </w:r>
+      <w:r>
+        <w:instrText xml:space="preserve"> PAGEREF ch_21 \h </w:instrText>
+      </w:r>
+      <w:r>
+        <w:fldChar w:fldCharType="separate"/>
+      </w:r>
+      <w:r>
+        <w:t xml:space="preserve">133</w:t>
+      </w:r>
+      <w:r>
+        <w:fldChar w:fldCharType="end"/>
+      </w:r>
+    </w:p>
+    <w:p>
+      <w:pPr>
+        <w:tabs>
+          <w:tab w:pos="5544" w:val="right" w:leader="dot"/>
+        </w:tabs>
         <w:ind w:firstLine="0" w:left="288"/>
       </w:pPr>
       <w:hyperlink w:anchor="ch_22" w:history="1">
@@ -456,9 +978,30 @@
           <w:t xml:space="preserve">Chapter 22: The Photograph</w:t>
         </w:r>
       </w:hyperlink>
-    </w:p>
-    <w:p>
-      <w:pPr>
+      <w:r>
+        <w:tab/>
+      </w:r>
+      <w:r>
+        <w:fldChar w:fldCharType="begin"/>
+      </w:r>
+      <w:r>
+        <w:instrText xml:space="preserve"> PAGEREF ch_22 \h </w:instrText>
+      </w:r>
+      <w:r>
+        <w:fldChar w:fldCharType="separate"/>
+      </w:r>
+      <w:r>
+        <w:t xml:space="preserve">144</w:t>
+      </w:r>
+      <w:r>
+        <w:fldChar w:fldCharType="end"/>
+      </w:r>
+    </w:p>
+    <w:p>
+      <w:pPr>
+        <w:tabs>
+          <w:tab w:pos="5544" w:val="right" w:leader="dot"/>
+        </w:tabs>
         <w:ind w:firstLine="0" w:left="288"/>
       </w:pPr>
       <w:hyperlink w:anchor="ch_23" w:history="1">
@@ -467,9 +1010,30 @@
           <w:t xml:space="preserve">Chapter 23: The Cup</w:t>
         </w:r>
       </w:hyperlink>
-    </w:p>
-    <w:p>
-      <w:pPr>
+      <w:r>
+        <w:tab/>
+      </w:r>
+      <w:r>
+        <w:fldChar w:fldCharType="begin"/>
+      </w:r>
+      <w:r>
+        <w:instrText xml:space="preserve"> PAGEREF ch_23 \h </w:instrText>
+      </w:r>
+      <w:r>
+        <w:fldChar w:fldCharType="separate"/>
+      </w:r>
+      <w:r>
+        <w:t xml:space="preserve">149</w:t>
+      </w:r>
+      <w:r>
+        <w:fldChar w:fldCharType="end"/>
+      </w:r>
+    </w:p>
+    <w:p>
+      <w:pPr>
+        <w:tabs>
+          <w:tab w:pos="5544" w:val="right" w:leader="dot"/>
+        </w:tabs>
         <w:ind w:firstLine="0" w:left="288"/>
       </w:pPr>
       <w:hyperlink w:anchor="ch_24" w:history="1">
@@ -478,9 +1042,30 @@
           <w:t xml:space="preserve">Chapter 24: The Road to Aix</w:t>
         </w:r>
       </w:hyperlink>
-    </w:p>
-    <w:p>
-      <w:pPr>
+      <w:r>
+        <w:tab/>
+      </w:r>
+      <w:r>
+        <w:fldChar w:fldCharType="begin"/>
+      </w:r>
+      <w:r>
+        <w:instrText xml:space="preserve"> PAGEREF ch_24 \h </w:instrText>
+      </w:r>
+      <w:r>
+        <w:fldChar w:fldCharType="separate"/>
+      </w:r>
+      <w:r>
+        <w:t xml:space="preserve">152</w:t>
+      </w:r>
+      <w:r>
+        <w:fldChar w:fldCharType="end"/>
+      </w:r>
+    </w:p>
+    <w:p>
+      <w:pPr>
+        <w:tabs>
+          <w:tab w:pos="5544" w:val="right" w:leader="dot"/>
+        </w:tabs>
         <w:ind w:firstLine="0" w:left="288"/>
       </w:pPr>
       <w:hyperlink w:anchor="ch_25" w:history="1">
@@ -489,9 +1074,30 @@
           <w:t xml:space="preserve">Chapter 25: The Key</w:t>
         </w:r>
       </w:hyperlink>
-    </w:p>
-    <w:p>
-      <w:pPr>
+      <w:r>
+        <w:tab/>
+      </w:r>
+      <w:r>
+        <w:fldChar w:fldCharType="begin"/>
+      </w:r>
+      <w:r>
+        <w:instrText xml:space="preserve"> PAGEREF ch_25 \h </w:instrText>
+      </w:r>
+      <w:r>
+        <w:fldChar w:fldCharType="separate"/>
+      </w:r>
+      <w:r>
+        <w:t xml:space="preserve">159</w:t>
+      </w:r>
+      <w:r>
+        <w:fldChar w:fldCharType="end"/>
+      </w:r>
+    </w:p>
+    <w:p>
+      <w:pPr>
+        <w:tabs>
+          <w:tab w:pos="5544" w:val="right" w:leader="dot"/>
+        </w:tabs>
         <w:ind w:firstLine="0" w:left="288"/>
       </w:pPr>
       <w:hyperlink w:anchor="ch_26" w:history="1">
@@ -500,9 +1106,30 @@
           <w:t xml:space="preserve">Chapter 26: Drip</w:t>
         </w:r>
       </w:hyperlink>
-    </w:p>
-    <w:p>
-      <w:pPr>
+      <w:r>
+        <w:tab/>
+      </w:r>
+      <w:r>
+        <w:fldChar w:fldCharType="begin"/>
+      </w:r>
+      <w:r>
+        <w:instrText xml:space="preserve"> PAGEREF ch_26 \h </w:instrText>
+      </w:r>
+      <w:r>
+        <w:fldChar w:fldCharType="separate"/>
+      </w:r>
+      <w:r>
+        <w:t xml:space="preserve">165</w:t>
+      </w:r>
+      <w:r>
+        <w:fldChar w:fldCharType="end"/>
+      </w:r>
+    </w:p>
+    <w:p>
+      <w:pPr>
+        <w:tabs>
+          <w:tab w:pos="5544" w:val="right" w:leader="dot"/>
+        </w:tabs>
         <w:ind w:firstLine="0" w:left="288"/>
       </w:pPr>
       <w:hyperlink w:anchor="ch_27" w:history="1">
@@ -511,9 +1138,30 @@
           <w:t xml:space="preserve">Chapter 27: Not Only Paper</w:t>
         </w:r>
       </w:hyperlink>
-    </w:p>
-    <w:p>
-      <w:pPr>
+      <w:r>
+        <w:tab/>
+      </w:r>
+      <w:r>
+        <w:fldChar w:fldCharType="begin"/>
+      </w:r>
+      <w:r>
+        <w:instrText xml:space="preserve"> PAGEREF ch_27 \h </w:instrText>
+      </w:r>
+      <w:r>
+        <w:fldChar w:fldCharType="separate"/>
+      </w:r>
+      <w:r>
+        <w:t xml:space="preserve">174</w:t>
+      </w:r>
+      <w:r>
+        <w:fldChar w:fldCharType="end"/>
+      </w:r>
+    </w:p>
+    <w:p>
+      <w:pPr>
+        <w:tabs>
+          <w:tab w:pos="5544" w:val="right" w:leader="dot"/>
+        </w:tabs>
         <w:spacing w:before="160" w:after="80"/>
         <w:ind w:firstLine="0"/>
       </w:pPr>
@@ -525,9 +1173,48 @@
           <w:t xml:space="preserve">Part Three: The Water</w:t>
         </w:r>
       </w:hyperlink>
-    </w:p>
-    <w:p>
-      <w:pPr>
+      <w:r>
+        <w:rPr>
+          <w:b/>
+        </w:rPr>
+        <w:tab/>
+      </w:r>
+      <w:r>
+        <w:rPr>
+          <w:b/>
+        </w:rPr>
+        <w:fldChar w:fldCharType="begin"/>
+      </w:r>
+      <w:r>
+        <w:rPr>
+          <w:b/>
+        </w:rPr>
+        <w:instrText xml:space="preserve"> PAGEREF part_part_three \h </w:instrText>
+      </w:r>
+      <w:r>
+        <w:rPr>
+          <w:b/>
+        </w:rPr>
+        <w:fldChar w:fldCharType="separate"/>
+      </w:r>
+      <w:r>
+        <w:rPr>
+          <w:b/>
+        </w:rPr>
+        <w:t xml:space="preserve">185</w:t>
+      </w:r>
+      <w:r>
+        <w:rPr>
+          <w:b/>
+        </w:rPr>
+        <w:fldChar w:fldCharType="end"/>
+      </w:r>
+    </w:p>
+    <w:p>
+      <w:pPr>
+        <w:tabs>
+          <w:tab w:pos="5544" w:val="right" w:leader="dot"/>
+        </w:tabs>
         <w:ind w:firstLine="0" w:left="288"/>
       </w:pPr>
       <w:hyperlink w:anchor="ch_28" w:history="1">
@@ -536,9 +1223,30 @@
           <w:t xml:space="preserve">Chapter 28: The Two Gastons</w:t>
         </w:r>
       </w:hyperlink>
-    </w:p>
-    <w:p>
-      <w:pPr>
+      <w:r>
+        <w:tab/>
+      </w:r>
+      <w:r>
+        <w:fldChar w:fldCharType="begin"/>
+      </w:r>
+      <w:r>
+        <w:instrText xml:space="preserve"> PAGEREF ch_28 \h </w:instrText>
+      </w:r>
+      <w:r>
+        <w:fldChar w:fldCharType="separate"/>
+      </w:r>
+      <w:r>
+        <w:t xml:space="preserve">186</w:t>
+      </w:r>
+      <w:r>
+        <w:fldChar w:fldCharType="end"/>
+      </w:r>
+    </w:p>
+    <w:p>
+      <w:pPr>
+        <w:tabs>
+          <w:tab w:pos="5544" w:val="right" w:leader="dot"/>
+        </w:tabs>
         <w:ind w:firstLine="0" w:left="288"/>
       </w:pPr>
       <w:hyperlink w:anchor="ch_29" w:history="1">
@@ -547,9 +1255,30 @@
           <w:t xml:space="preserve">Chapter 29: The Far Shore</w:t>
         </w:r>
       </w:hyperlink>
-    </w:p>
-    <w:p>
-      <w:pPr>
+      <w:r>
+        <w:tab/>
+      </w:r>
+      <w:r>
+        <w:fldChar w:fldCharType="begin"/>
+      </w:r>
+      <w:r>
+        <w:instrText xml:space="preserve"> PAGEREF ch_29 \h </w:instrText>
+      </w:r>
+      <w:r>
+        <w:fldChar w:fldCharType="separate"/>
+      </w:r>
+      <w:r>
+        <w:t xml:space="preserve">194</w:t>
+      </w:r>
+      <w:r>
+        <w:fldChar w:fldCharType="end"/>
+      </w:r>
+    </w:p>
+    <w:p>
+      <w:pPr>
+        <w:tabs>
+          <w:tab w:pos="5544" w:val="right" w:leader="dot"/>
+        </w:tabs>
         <w:ind w:firstLine="0" w:left="288"/>
       </w:pPr>
       <w:hyperlink w:anchor="ch_30" w:history="1">
@@ -558,9 +1287,30 @@
           <w:t xml:space="preserve">Chapter 30: What Inês Saw</w:t>
         </w:r>
       </w:hyperlink>
-    </w:p>
-    <w:p>
-      <w:pPr>
+      <w:r>
+        <w:tab/>
+      </w:r>
+      <w:r>
+        <w:fldChar w:fldCharType="begin"/>
+      </w:r>
+      <w:r>
+        <w:instrText xml:space="preserve"> PAGEREF ch_30 \h </w:instrText>
+      </w:r>
+      <w:r>
+        <w:fldChar w:fldCharType="separate"/>
+      </w:r>
+      <w:r>
+        <w:t xml:space="preserve">202</w:t>
+      </w:r>
+      <w:r>
+        <w:fldChar w:fldCharType="end"/>
+      </w:r>
+    </w:p>
+    <w:p>
+      <w:pPr>
+        <w:tabs>
+          <w:tab w:pos="5544" w:val="right" w:leader="dot"/>
+        </w:tabs>
         <w:ind w:firstLine="0" w:left="288"/>
       </w:pPr>
       <w:hyperlink w:anchor="ch_31" w:history="1">
@@ -569,9 +1319,30 @@
           <w:t xml:space="preserve">Chapter 31: Edouard</w:t>
         </w:r>
       </w:hyperlink>
-    </w:p>
-    <w:p>
-      <w:pPr>
+      <w:r>
+        <w:tab/>
+      </w:r>
+      <w:r>
+        <w:fldChar w:fldCharType="begin"/>
+      </w:r>
+      <w:r>
+        <w:instrText xml:space="preserve"> PAGEREF ch_31 \h </w:instrText>
+      </w:r>
+      <w:r>
+        <w:fldChar w:fldCharType="separate"/>
+      </w:r>
+      <w:r>
+        <w:t xml:space="preserve">214</w:t>
+      </w:r>
+      <w:r>
+        <w:fldChar w:fldCharType="end"/>
+      </w:r>
+    </w:p>
+    <w:p>
+      <w:pPr>
+        <w:tabs>
+          <w:tab w:pos="5544" w:val="right" w:leader="dot"/>
+        </w:tabs>
         <w:ind w:firstLine="0" w:left="288"/>
       </w:pPr>
       <w:hyperlink w:anchor="ch_32" w:history="1">
@@ -580,9 +1351,30 @@
           <w:t xml:space="preserve">Chapter 32: The Second Box</w:t>
         </w:r>
       </w:hyperlink>
-    </w:p>
-    <w:p>
-      <w:pPr>
+      <w:r>
+        <w:tab/>
+      </w:r>
+      <w:r>
+        <w:fldChar w:fldCharType="begin"/>
+      </w:r>
+      <w:r>
+        <w:instrText xml:space="preserve"> PAGEREF ch_32 \h </w:instrText>
+      </w:r>
+      <w:r>
+        <w:fldChar w:fldCharType="separate"/>
+      </w:r>
+      <w:r>
+        <w:t xml:space="preserve">220</w:t>
+      </w:r>
+      <w:r>
+        <w:fldChar w:fldCharType="end"/>
+      </w:r>
+    </w:p>
+    <w:p>
+      <w:pPr>
+        <w:tabs>
+          <w:tab w:pos="5544" w:val="right" w:leader="dot"/>
+        </w:tabs>
         <w:ind w:firstLine="0" w:left="288"/>
       </w:pPr>
       <w:hyperlink w:anchor="ch_33" w:history="1">
@@ -591,9 +1383,30 @@
           <w:t xml:space="preserve">Chapter 33: The Commandant</w:t>
         </w:r>
       </w:hyperlink>
-    </w:p>
-    <w:p>
-      <w:pPr>
+      <w:r>
+        <w:tab/>
+      </w:r>
+      <w:r>
+        <w:fldChar w:fldCharType="begin"/>
+      </w:r>
+      <w:r>
+        <w:instrText xml:space="preserve"> PAGEREF ch_33 \h </w:instrText>
+      </w:r>
+      <w:r>
+        <w:fldChar w:fldCharType="separate"/>
+      </w:r>
+      <w:r>
+        <w:t xml:space="preserve">231</w:t>
+      </w:r>
+      <w:r>
+        <w:fldChar w:fldCharType="end"/>
+      </w:r>
+    </w:p>
+    <w:p>
+      <w:pPr>
+        <w:tabs>
+          <w:tab w:pos="5544" w:val="right" w:leader="dot"/>
+        </w:tabs>
         <w:ind w:firstLine="0" w:left="288"/>
       </w:pPr>
       <w:hyperlink w:anchor="ch_34" w:history="1">
@@ -602,9 +1415,30 @@
           <w:t xml:space="preserve">Chapter 34: Dick Whittington</w:t>
         </w:r>
       </w:hyperlink>
-    </w:p>
-    <w:p>
-      <w:pPr>
+      <w:r>
+        <w:tab/>
+      </w:r>
+      <w:r>
+        <w:fldChar w:fldCharType="begin"/>
+      </w:r>
+      <w:r>
+        <w:instrText xml:space="preserve"> PAGEREF ch_34 \h </w:instrText>
+      </w:r>
+      <w:r>
+        <w:fldChar w:fldCharType="separate"/>
+      </w:r>
+      <w:r>
+        <w:t xml:space="preserve">241</w:t>
+      </w:r>
+      <w:r>
+        <w:fldChar w:fldCharType="end"/>
+      </w:r>
+    </w:p>
+    <w:p>
+      <w:pPr>
+        <w:tabs>
+          <w:tab w:pos="5544" w:val="right" w:leader="dot"/>
+        </w:tabs>
         <w:ind w:firstLine="0" w:left="288"/>
       </w:pPr>
       <w:hyperlink w:anchor="ch_35" w:history="1">
@@ -613,9 +1447,30 @@
           <w:t xml:space="preserve">Chapter 35: The Trial</w:t>
         </w:r>
       </w:hyperlink>
-    </w:p>
-    <w:p>
-      <w:pPr>
+      <w:r>
+        <w:tab/>
+      </w:r>
+      <w:r>
+        <w:fldChar w:fldCharType="begin"/>
+      </w:r>
+      <w:r>
+        <w:instrText xml:space="preserve"> PAGEREF ch_35 \h </w:instrText>
+      </w:r>
+      <w:r>
+        <w:fldChar w:fldCharType="separate"/>
+      </w:r>
+      <w:r>
+        <w:t xml:space="preserve">253</w:t>
+      </w:r>
+      <w:r>
+        <w:fldChar w:fldCharType="end"/>
+      </w:r>
+    </w:p>
+    <w:p>
+      <w:pPr>
+        <w:tabs>
+          <w:tab w:pos="5544" w:val="right" w:leader="dot"/>
+        </w:tabs>
         <w:ind w:firstLine="0" w:left="288"/>
       </w:pPr>
       <w:hyperlink w:anchor="ch_36" w:history="1">
@@ -624,9 +1479,30 @@
           <w:t xml:space="preserve">Chapter 36: The Courthouse Steps</w:t>
         </w:r>
       </w:hyperlink>
-    </w:p>
-    <w:p>
-      <w:pPr>
+      <w:r>
+        <w:tab/>
+      </w:r>
+      <w:r>
+        <w:fldChar w:fldCharType="begin"/>
+      </w:r>
+      <w:r>
+        <w:instrText xml:space="preserve"> PAGEREF ch_36 \h </w:instrText>
+      </w:r>
+      <w:r>
+        <w:fldChar w:fldCharType="separate"/>
+      </w:r>
+      <w:r>
+        <w:t xml:space="preserve">267</w:t>
+      </w:r>
+      <w:r>
+        <w:fldChar w:fldCharType="end"/>
+      </w:r>
+    </w:p>
+    <w:p>
+      <w:pPr>
+        <w:tabs>
+          <w:tab w:pos="5544" w:val="right" w:leader="dot"/>
+        </w:tabs>
         <w:ind w:firstLine="0" w:left="288"/>
       </w:pPr>
       <w:hyperlink w:anchor="ch_37" w:history="1">
@@ -635,9 +1511,30 @@
           <w:t xml:space="preserve">Chapter 37: Margaret and Geoffrey</w:t>
         </w:r>
       </w:hyperlink>
-    </w:p>
-    <w:p>
-      <w:pPr>
+      <w:r>
+        <w:tab/>
+      </w:r>
+      <w:r>
+        <w:fldChar w:fldCharType="begin"/>
+      </w:r>
+      <w:r>
+        <w:instrText xml:space="preserve"> PAGEREF ch_37 \h </w:instrText>
+      </w:r>
+      <w:r>
+        <w:fldChar w:fldCharType="separate"/>
+      </w:r>
+      <w:r>
+        <w:t xml:space="preserve">273</w:t>
+      </w:r>
+      <w:r>
+        <w:fldChar w:fldCharType="end"/>
+      </w:r>
+    </w:p>
+    <w:p>
+      <w:pPr>
+        <w:tabs>
+          <w:tab w:pos="5544" w:val="right" w:leader="dot"/>
+        </w:tabs>
         <w:ind w:firstLine="0" w:left="288"/>
       </w:pPr>
       <w:hyperlink w:anchor="epilogue" w:history="1">
@@ -646,10 +1543,23 @@
           <w:t xml:space="preserve">Epilogue: The Jetty</w:t>
         </w:r>
       </w:hyperlink>
-    </w:p>
-    <w:p>
-      <w:r>
-        <w:br w:type="page"/>
+      <w:r>
+        <w:tab/>
+      </w:r>
+      <w:r>
+        <w:fldChar w:fldCharType="begin"/>
+      </w:r>
+      <w:r>
+        <w:instrText xml:space="preserve"> PAGEREF epilogue \h </w:instrText>
+      </w:r>
+      <w:r>
+        <w:fldChar w:fldCharType="separate"/>
+      </w:r>
+      <w:r>
+        <w:t xml:space="preserve">279</w:t>
+      </w:r>
+      <w:r>
+        <w:fldChar w:fldCharType="end"/>
       </w:r>
     </w:p>
     <w:p>
@@ -1880,7 +2790,7 @@
     </w:p>
     <w:p>
       <w:r>
-        <w:t>Later, after she had gone up, he sat for a long time in the study with the lamp on, at the window, looking down at the end of the jetty, which he could not see, which was only a darker line on dark water. At midnight he saw a torch come on, briefly, on the far shore, where the pond narrowed into the reeds and became the marsh, and go off again. He watched for a long time. It did not come back. He told himself it was an eel-fisher, or a poacher, or a man looking for his dog.</w:t>
+        <w:t>Later, after she had gone up, he sat for some time in the study with the lamp on, at the window, looking down at the end of the jetty, which he could not see, which was only a darker line on dark water. At midnight he saw a torch come on, briefly, on the far shore, where the pond narrowed into the reeds and became the marsh, and go off again. He watched for a while. It did not come back. He told himself it was an eel-fisher, or a poacher, or a man looking for his dog.</w:t>
       </w:r>
     </w:p>
     <w:p>
@@ -2791,7 +3701,7 @@
     </w:p>
     <w:p>
       <w:r>
-        <w:t>She laughed, softly, and held out her hand, palm up, on the blanket between them. He looked at it for a long moment. Then he put his own over it, and she closed her fingers, and they lay there on the cold planks under ten thousand stars, not speaking, holding hands like two people carrying something very fragile across a very long room.</w:t>
+        <w:t>She laughed, softly, and held out her hand, palm up, on the blanket between them. He looked at it for a moment. Then he put his own over it, and she closed her fingers, and they lay there on the cold planks under ten thousand stars, not speaking, holding hands like two people carrying something very fragile across a very long room.</w:t>
       </w:r>
     </w:p>
     <w:p>
@@ -2925,7 +3835,7 @@
     </w:p>
     <w:p>
       <w:r>
-        <w:t>Catarina got out and stood with her hand over her mouth. She did not say anything for a long time.</w:t>
+        <w:t>Catarina got out and stood with her hand over her mouth. She did not say anything for a while.</w:t>
       </w:r>
     </w:p>
     <w:p>
@@ -3205,7 +4115,7 @@
         <w:ind w:firstLine="0"/>
       </w:pPr>
       <w:r>
-        <w:t>Catarina did not say anything all the way back up the market. She walked very straight, with the parcel of eels held against her chest beside the yellow and green dish, and her face perfectly blank and polite, and Tobias walked beside her and did not say anything either, and Madame Fournier walked behind them both with her string bags and her thyme tree and looked, for once, at neither of them.</w:t>
+        <w:t>Catarina said nothing all the way back up the market. She walked very straight, with the parcel of eels held against her chest beside the yellow and green dish, and her face perfectly blank and polite, and Tobias walked beside her and did not say anything either, and Madame Fournier walked behind them both with her string bags and her thyme tree and looked, for once, at neither of them.</w:t>
       </w:r>
     </w:p>
     <w:p>
@@ -3282,7 +4192,7 @@
         <w:ind w:firstLine="0"/>
       </w:pPr>
       <w:r>
-        <w:t>They drove home with the windows open and the market in string bags on the back seat, and Madame Fournier drove the Renault 4 like a tractor through a field that had insulted her, and did not say anything until they were back in the valley, at the top of the lane, with the lake below them, flat and grey under a sky that was making up its mind.</w:t>
+        <w:t>They drove home with the windows open and the market in string bags on the back seat, and Madame Fournier drove the Renault 4 like a tractor through a field that had insulted her, and said nothing until they were back in the valley, at the top of the lane, with the lake below them, flat and grey under a sky that was making up its mind.</w:t>
       </w:r>
     </w:p>
     <w:p>
@@ -3307,7 +4217,7 @@
     </w:p>
     <w:p>
       <w:r>
-        <w:t>The third eel, the small one, in its single sheet of newspaper, she put in the cold larder, on a shelf by itself. In the morning, it was still there. She looked at it for a long time, and then she put it back.</w:t>
+        <w:t>The third eel, the small one, in its single sheet of newspaper, she put in the cold larder, on a shelf by itself. In the morning, it was still there. She looked at it for some time, and then she put it back.</w:t>
       </w:r>
     </w:p>
     <w:p>
@@ -3754,12 +4664,12 @@
     </w:p>
     <w:p>
       <w:r>
-        <w:t>The courier was a young man on a motorbike who had never been up the lane before and did not intend to come up it again. Tobias signed a screen with his finger. The signature came out as a small, despairing wave. The courier looked at it, looked at Tobias, decided that it was close enough for the south of France, and left.</w:t>
-      </w:r>
-    </w:p>
-    <w:p>
-      <w:r>
-        <w:t>The envelope was thick and cream and smelled faintly of a very good office. Inside was a letter, two copies of a contract bound with a black clip, and a fountain pen. The pen was the worst part. A contract tells you what a man wants. A fountain pen tells you he has already imagined you signing it.</w:t>
+        <w:t>The courier was a young man on a motorbike who had never been up the lane before and did not intend to come up it again. Tobias signed a screen with his finger, and the signature came out as a small, despairing wave.</w:t>
+      </w:r>
+    </w:p>
+    <w:p>
+      <w:r>
+        <w:t>Inside the thick cream envelope was a letter, two copies of a contract bound with a black clip, and a fountain pen. The pen was the worst part. A contract tells you what a man wants. A fountain pen tells you he has already imagined you signing it.</w:t>
       </w:r>
     </w:p>
     <w:p>
@@ -3884,6 +4794,31 @@
     </w:p>
     <w:p>
       <w:r>
+        <w:t xml:space="preserve">He read the list again, slowly, and stopped where she had stopped, one word further on. </w:t>
+      </w:r>
+      <w:r>
+        <w:rPr>
+          <w:i/>
+        </w:rPr>
+        <w:t>Recordings.</w:t>
+      </w:r>
+    </w:p>
+    <w:p>
+      <w:r>
+        <w:t xml:space="preserve">"Recordings," he said. "I've never recorded anything in my life. I type. Hale knows I type; he's been sending me jokes about the Olivetti for ten years. A publisher who wants my typescript asks for my typescript. A publisher who asks for </w:t>
+      </w:r>
+      <w:r>
+        <w:rPr>
+          <w:i/>
+        </w:rPr>
+        <w:t>recordings</w:t>
+      </w:r>
+      <w:r>
+        <w:t>, whether or not in my possession, thinks there's a tape. And he thinks it's somewhere I might find it." He looked up at the ceiling, towards the study. "He's not buying a book. He's buying whatever Elise left in this house."</w:t>
+      </w:r>
+    </w:p>
+    <w:p>
+      <w:r>
         <w:t>She looked at him. She looked at the clause. She looked, with great deliberation, at the window seat in the study above them, which they could not see from the stair, and which they both saw.</w:t>
       </w:r>
     </w:p>
@@ -4004,7 +4939,7 @@
     </w:p>
     <w:p>
       <w:r>
-        <w:t>The three of them looked at it for some time. Out in the garden the pelican, who had come over the wall in the hope of bread, made a noise like a door that needs oil.</w:t>
+        <w:t>The three of them looked at it for some time.</w:t>
       </w:r>
     </w:p>
     <w:p>
@@ -4047,17 +4982,7 @@
     </w:p>
     <w:p>
       <w:r>
-        <w:t>"Don't sign it," she said, when he had finished.</w:t>
-      </w:r>
-    </w:p>
-    <w:p>
-      <w:r>
-        <w:t>"I wasn't going to."</w:t>
-      </w:r>
-    </w:p>
-    <w:p>
-      <w:r>
-        <w:t xml:space="preserve">"Don't refuse it either." There was a pause on the line, and a sound that might have been a pen being tapped against teeth. "A man who sends you a contract like that is telling you what he's afraid of. If you say no, he'll find another way to be afraid. If you say </w:t>
+        <w:t xml:space="preserve">"I'm not going to sign it," he said, when he had finished. "And I'm not going to refuse it. If I say no, he'll find another way to get into the house. If I say </w:t>
       </w:r>
       <w:r>
         <w:rPr>
@@ -4066,17 +4991,17 @@
         <w:t>maybe</w:t>
       </w:r>
       <w:r>
-        <w:t>, he'll wait. Waiting men make mistakes. They ring people. They get in their cars."</w:t>
-      </w:r>
-    </w:p>
-    <w:p>
-      <w:r>
-        <w:t>"You want me to string along a man who may have killed three people."</w:t>
-      </w:r>
-    </w:p>
-    <w:p>
-      <w:r>
-        <w:t>"I want you to write him a letter," said Mara. "You're a writer. Write him a long, grateful, slightly vain letter in which you say you are honoured and that you have one or two small queries about the royalty on audio, and that you'll need a few weeks to put the typescript in order, because the water damage was so very bad. Make it boring. Make it the most boring letter a publisher has ever received. Nothing makes a crook feel safer than an author asking about audio."</w:t>
+        <w:t>, he'll wait. So I'm going to write him a long, grateful, slightly vain letter, with one or two small queries about the royalty on audio, and say I need a few weeks to put the typescript in order, because the water damage was so very bad. The most boring letter a publisher has ever received. And while he waits, I'm going to find whatever he thinks is in this house before he does."</w:t>
+      </w:r>
+    </w:p>
+    <w:p>
+      <w:r>
+        <w:t>There was a pause on the line, and a sound that might have been a pen being tapped against teeth.</w:t>
+      </w:r>
+    </w:p>
+    <w:p>
+      <w:r>
+        <w:t>"That," said Mara, "is exactly what I was going to tell you to do, and I resent it. Nothing makes a crook feel safer than an author asking about audio. Waiting men make mistakes. They ring people. They get in their cars."</w:t>
       </w:r>
     </w:p>
     <w:p>
@@ -4128,7 +5053,7 @@
         <w:t>I can't tell you what this means</w:t>
       </w:r>
       <w:r>
-        <w:t xml:space="preserve"> three times and crossed it out twice. He asked about the audio royalty. He asked, in a postscript, whether Hale Books would consider a different cover from the last one, which had made his detective look like a man selling double glazing. He thought this was a convincing touch. He had wanted to ask it for years.</w:t>
+        <w:t xml:space="preserve"> three times and crossed it out twice. He asked about the audio royalty. He asked, in a postscript, whether Hale Books would consider a different cover from the last one, which had made his detective look like a man selling double glazing. He had wanted to ask it for years.</w:t>
       </w:r>
     </w:p>
     <w:p>
@@ -4276,11 +5201,6 @@
     </w:p>
     <w:p>
       <w:r>
-        <w:t>It was a stupid thing to have said aloud. He knew that before he had finished saying it. He heard it go into the kitchen and settle there, like smoke from a pan.</w:t>
-      </w:r>
-    </w:p>
-    <w:p>
-      <w:r>
         <w:t>Catarina did not say anything. She stood beside him for another moment, very still. Then she went back to the stove, and moved the soup to the front again, and stirred it for a long time, much longer than it needed. When she spoke, it was to the pot.</w:t>
       </w:r>
     </w:p>
@@ -4331,7 +5251,7 @@
     </w:p>
     <w:p>
       <w:r>
-        <w:t>On the hall table, the boring letter to Victor Hale waited for the post. In the biscuit tin next door, under a photograph of Lucien on one leg, a contract that wanted everything waited for nothing at all. And in the study the Olivetti, which had typed forty thousand pounds' worth of nothing that week, stood in the last of the light with a clean sheet in the roller, as if it had something to say and was too well brought up to start.</w:t>
+        <w:t>On the hall table, the boring letter to Victor Hale waited for the post. Next door, under a photograph of Lucien on one leg, a contract that wanted everything waited for nothing at all.</w:t>
       </w:r>
     </w:p>
     <w:p>
@@ -4991,7 +5911,7 @@
     </w:p>
     <w:p>
       <w:r>
-        <w:t>Neither of them changed their minds. They sat opposite each other in a carriage that smelled of warm plastic and oranges, with the folder on the table between them and a paper bag of calissons left over from the Sunday, and watched Provence go past the window in long dry strokes: pines, limestone, a vineyard, a village on a hill like a pile of bread, a man on a tractor who raised one hand to the train as if it were an old friend who never stopped.</w:t>
+        <w:t>Neither of them changed their minds. They sat opposite each other in a carriage that smelled of warm plastic and oranges, with the folder on the table between them and a paper bag of calissons left over from the Sunday, and watched Provence go past in long dry strokes: pines, limestone, a village on a hill like a pile of bread.</w:t>
       </w:r>
     </w:p>
     <w:p>
@@ -5041,7 +5961,7 @@
     </w:p>
     <w:p>
       <w:r>
-        <w:t xml:space="preserve">"Is why the machine was stupid and I was not." She smiled at the window. "Every day for seven years I read handwriting worse than your typewriter. A boy called Rui made his letter </w:t>
+        <w:t xml:space="preserve">"Is why the machine was stupid and I was not." She smiled at the window. "A boy called Rui made his letter </w:t>
       </w:r>
       <w:r>
         <w:rPr>
@@ -5070,32 +5990,7 @@
     </w:p>
     <w:p>
       <w:r>
-        <w:t>He found that he had nothing to say to that, which was becoming a pattern on trains, and also that he was ashamed, which was not new but was at least honest. He reached across the table and took the last calisson, and broke it carefully in two, and gave her the bigger half.</w:t>
-      </w:r>
-    </w:p>
-    <w:p>
-      <w:r>
-        <w:t>"What were you before?" he said.</w:t>
-      </w:r>
-    </w:p>
-    <w:p>
-      <w:r>
-        <w:t>She took the half. She held it for a moment.</w:t>
-      </w:r>
-    </w:p>
-    <w:p>
-      <w:r>
-        <w:t>"Later," she said. "When we are not going to meet a criminal. It is a long story, and it has no murders in it, and you will be bored."</w:t>
-      </w:r>
-    </w:p>
-    <w:p>
-      <w:r>
-        <w:t>"I won't be bored."</w:t>
-      </w:r>
-    </w:p>
-    <w:p>
-      <w:r>
-        <w:t>"No," she agreed, and ate the calisson. "You will not."</w:t>
+        <w:t>He found that he had nothing to say to that, and that he was ashamed. He reached across the table and took the last calisson, and broke it carefully in two, and gave her the bigger half.</w:t>
       </w:r>
     </w:p>
     <w:p>
@@ -5113,7 +6008,7 @@
         <w:ind w:firstLine="0"/>
       </w:pPr>
       <w:r>
-        <w:t>Marseille arrived all at once, the way it does, at the top of the great white staircase of the Gare Saint-Charles, with the whole city tipped out below them to the sea: roofs, cranes, a thousand washing lines, the gold Virgin on her hill above the old port, and beyond everything a flat bright light that was not quite blue and not quite silver and that Tobias, who was from Leeds, could only describe as expensive.</w:t>
+        <w:t>Marseille arrived all at once, the way it does, at the top of the great white staircase of the Gare Saint-Charles, with the whole city tipped out below them to the sea: roofs, cranes, the gold Virgin on her hill above the old port, and a flat bright light that was not quite blue and not quite silver and that Tobias, who was from Leeds, could only describe as expensive.</w:t>
       </w:r>
     </w:p>
     <w:p>
@@ -5123,7 +6018,7 @@
     </w:p>
     <w:p>
       <w:r>
-        <w:t xml:space="preserve">The address on the contract was a street off the Canebière, near the market at Noailles, and they walked there down through streets that smelled in turn of cumin, fish, coffee, mint, diesel and something frying that Catarina insisted on stopping for and that turned out to be panisse, chickpea fritters, sold hot in a paper cone by a man who called her </w:t>
+        <w:t xml:space="preserve">The address on the contract was a street off the Canebière, near the market at Noailles, and they walked there through streets that smelled in turn of cumin, fish, coffee and diesel, stopping once for panisse, chickpea fritters in a paper cone, sold by a man who called her </w:t>
       </w:r>
       <w:r>
         <w:rPr>
@@ -5214,7 +6109,7 @@
         <w:ind w:firstLine="0"/>
       </w:pPr>
       <w:r>
-        <w:t xml:space="preserve">The office of the Verrane Foundation Award for Unpublished Fiction was a single room on the third floor, at the back, with a window onto a light well full of pigeons. It contained a desk, two chairs, a filing cabinet, a kettle, an ashtray in the shape of the Vieux-Port, eleven grey postal sacks, and a telephone switchboard of a type Tobias had last seen in a film about the Second World War, wired to a cassette deck on which a tape was going round and round. From the tape, very softly, came the murmur of a hundred velvet voices saying </w:t>
+        <w:t xml:space="preserve">The office of the Verrane Foundation Award for Unpublished Fiction was a single room on the third floor, at the back, with a window onto a light well full of pigeons. It contained a desk, two chairs, a kettle, an ashtray in the shape of the Vieux-Port, eleven grey postal sacks, and an old switchboard wired to a cassette deck on which a tape was going round and round. From the tape, very softly, came the murmur of a hundred velvet voices saying </w:t>
       </w:r>
       <w:r>
         <w:rPr>
@@ -5228,7 +6123,7 @@
     </w:p>
     <w:p>
       <w:r>
-        <w:t>There were no other people. There had never been any other people. The hundred voices were all the same voice, recorded on a cassette and played behind the telephone like the sea in a shell, and the voice belonged to the man with the white hair, who stood in the middle of the room with his back to the pigeons and his hands spread in front of him, as if he were about to be shot, or applauded.</w:t>
+        <w:t>There were no other people. There had never been any other people. The hundred voices were all the same voice, recorded on a cassette and played behind the telephone like the sea in a shell, and the voice belonged to the man with the white hair, who stood with his back to the pigeons and his hands spread in front of him, as if he were about to be shot, or applauded.</w:t>
       </w:r>
     </w:p>
     <w:p>
@@ -5258,12 +6153,7 @@
     </w:p>
     <w:p>
       <w:r>
-        <w:t>"The gull," he said, when he could. "The gull who is the keeper. And the lighthouse, his mother. Mon Dieu. I read it. I read it to my wife. She cried. She cried laughing, monsieur. Thirty years I am married, I never see her cry like this, not even at the funeral of her brother, who was a very funny man." He wiped his eyes. "Everybody who comes in, I read the first page. It is my only pleasure. Most are sad. Some are good. Yours, monsieur, is the worst thing I have ever read in my life, and I have been in a television series about a fisherman for eleven years."</w:t>
-      </w:r>
-    </w:p>
-    <w:p>
-      <w:r>
-        <w:t>"Thank you," said Tobias, who did not know what else to say.</w:t>
+        <w:t>"The gull," he said, when he could. "The gull who is the keeper. And the lighthouse, his mother. Mon Dieu. I read it. I read it to my wife. She cried. She cried laughing, monsieur." He wiped his eyes. "I read the first page of every one. Yours, monsieur, is the worst thing I have ever read in my life, and I have been in a television series about a fisherman for eleven years."</w:t>
       </w:r>
     </w:p>
     <w:p>
@@ -5277,7 +6167,7 @@
         <w:t>Highly Commended.</w:t>
       </w:r>
       <w:r>
-        <w:t xml:space="preserve"> The same letter. Every one. I print it in the morning, five hundred at a time." He gestured at the postal sacks, which, Tobias now saw, were not empty. They were full. They were full of envelopes, brown and white and manila, thousands of them, with stamps from everywhere, opened and stuffed back in. "Everyone is Highly Commended. Every one. Nine years."</w:t>
+        <w:t xml:space="preserve"> The same letter. Every one. I print it in the morning, five hundred at a time." He gestured at the postal sacks, which, Tobias now saw, were full of envelopes, thousands of them, with stamps from everywhere, opened and stuffed back in. "Everyone is Highly Commended. Every one. Nine years."</w:t>
       </w:r>
     </w:p>
     <w:p>
@@ -5313,12 +6203,12 @@
     </w:p>
     <w:p>
       <w:r>
-        <w:t>Raymond Coste looked at him for a long moment. Then he looked at the sacks.</w:t>
-      </w:r>
-    </w:p>
-    <w:p>
-      <w:r>
-        <w:t xml:space="preserve">"Monsieur," he said, "I am an actor. For forty years I tell lies on a stage and people pay me. This is the same. Only, there is no stage." He shrugged, and the shrug, unlike Catarina's, contained nothing at all. "I tell myself that. Every day I tell myself that. Then I read the letters. A woman in Australia writes, thank you, my husband is dead, I wrote this for him, now I know it is good. A man in Scotland, eighty-one, his first story. I put them in the sack. I write </w:t>
+        <w:t>Raymond Coste looked at him for a moment. Then he looked at the sacks.</w:t>
+      </w:r>
+    </w:p>
+    <w:p>
+      <w:r>
+        <w:t xml:space="preserve">"Monsieur," he said, "I am an actor. For forty years I tell lies on a stage and people pay me. This is the same. Only, there is no stage. I tell myself that. Then I read the letters. A woman in Australia writes, thank you, my husband is dead, I wrote this for him, now I know it is good. A man in Scotland, eighty-one, his first story. I put them in the sack. I write </w:t>
       </w:r>
       <w:r>
         <w:rPr>
@@ -5327,7 +6217,7 @@
         <w:t>Highly Commended</w:t>
       </w:r>
       <w:r>
-        <w:t>." He picked up a letter from the top of the nearest sack and held it out to Tobias without looking at it. "And in February a woman comes up those stairs. A woman with short hair and red glasses, very thin, very angry, very English. Not a writer. An editor. She stands where you are standing. She reads a letter from a sack, like you are going to do now. She does not shout. She cries, monsieur. Only a little. Then she asks me my name. She writes it in a little book. She says, Monsieur Coste, you are not the one I want, but you will have to tell the truth about the ones I want, when it is time. And I say yes. I say yes to her."</w:t>
+        <w:t>." He picked up a letter from the top of the nearest sack and held it out to Tobias without looking at it. "And in February a woman comes up those stairs. A woman with short hair and red glasses, very thin, very angry, very English. Not a writer. An editor. She reads a letter from a sack. She does not shout. She cries, monsieur. Only a little. Then she asks me my name. She writes it in a little book. She says, Monsieur Coste, you are not the one I want, but you will have to tell the truth about the ones I want, when it is time. And I say yes. I say yes to her."</w:t>
       </w:r>
     </w:p>
     <w:p>
@@ -5343,11 +6233,6 @@
     <w:p>
       <w:r>
         <w:t>"Someone did," said Catarina.</w:t>
-      </w:r>
-    </w:p>
-    <w:p>
-      <w:r>
-        <w:t>Raymond turned to look at her, and something in her face made him sit up a little straighter, the way the boy with the chalk had perhaps once sat up when she said good morning.</w:t>
       </w:r>
     </w:p>
     <w:p>
@@ -5376,17 +6261,12 @@
     </w:p>
     <w:p>
       <w:r>
-        <w:t>There was a silence in the little room. A pigeon landed on the windowsill outside and looked in at them with one orange eye, and decided it wanted nothing to do with any of it, and left.</w:t>
-      </w:r>
-    </w:p>
-    <w:p>
-      <w:r>
         <w:t>"Monsieur Coste," said Tobias slowly. "If somebody asked you, properly, a magistrate, in a courtroom, with a policewoman who does not like her commandant, would you say what you've just said to us?"</w:t>
       </w:r>
     </w:p>
     <w:p>
       <w:r>
-        <w:t>Raymond Coste looked at the sacks for a long time. He looked at the tape going round. He looked at the ashtray in the shape of the old port, and at his own large hands.</w:t>
+        <w:t>Raymond Coste looked at the sacks, and the tape going round, and his own large hands.</w:t>
       </w:r>
     </w:p>
     <w:p>
@@ -5455,7 +6335,7 @@
         <w:ind w:firstLine="0"/>
       </w:pPr>
       <w:r>
-        <w:t>They had time before the train. They walked down to the old port because Catarina wanted to see the sea, and because neither of them wanted to sit in a station with a carrier bag that seemed to have become heavier on the stairs. The fish market was over for the day. Gulls were cleaning up after it with the thoroughness of an accountant. Along the quay the restaurants were setting out their tables for the evening, and outside one of them, which had starched cloths and brass lamps and a blue lobster painted on its sign, Catarina stopped to read the menu.</w:t>
+        <w:t>They had time before the train. They walked down to the old port because Catarina wanted to see the sea, and because neither of them wanted to sit in a station with a carrier bag that seemed to have become heavier on the stairs. Along the quay the restaurants were setting out their tables for the evening, and outside one of them, which had starched cloths and brass lamps and a blue lobster painted on its sign, Catarina stopped to read the menu.</w:t>
       </w:r>
     </w:p>
     <w:p>
@@ -5480,7 +6360,7 @@
     </w:p>
     <w:p>
       <w:r>
-        <w:t>They went back up the great staircase to the station as the light turned gold over the roofs. The train was full of students and a family with a dog in a bag. Tobias and Catarina found two seats side by side, not opposite, which had not happened before, and sat in them with the carrier bag on Tobias's knees and the folder that said NOT ONLY PAPER on Catarina's, and somewhere after Gardanne, in the soft, rocking, orange dark, Catarina fell asleep against his shoulder.</w:t>
+        <w:t>They went back up the great staircase to the station as the light turned gold over the roofs. They found two seats side by side, not opposite, which had not happened before, and sat in them with the carrier bag on Tobias's knees and the folder that said NOT ONLY PAPER on Catarina's, and somewhere after Gardanne, in the soft, rocking, orange dark, Catarina fell asleep against his shoulder.</w:t>
       </w:r>
     </w:p>
     <w:p>
@@ -5563,12 +6443,12 @@
     </w:p>
     <w:p>
       <w:r>
-        <w:t>There were fifty-one of them. They lived in the bottom drawer of the dresser, under the drawer that contained the administrative history of the valley, in a neat brick held together with a rubber band that had lost its elasticity some time during the presidency of Jacques Chirac. She took them out on the Friday morning and laid them on the kitchen table, one after another, as if she were dealing a very slow hand of cards.</w:t>
-      </w:r>
-    </w:p>
-    <w:p>
-      <w:r>
-        <w:t>"Henri," she said, "wrote everything down. He said a man who does not write down his money is a man who is waiting to be surprised by it." She opened the most recent book and turned it round so that Tobias could see. "I did not like Henri's money. I liked Henri. But I have kept the books."</w:t>
+        <w:t>There were fifty-one of them. They lived in the bottom drawer of the dresser, under the drawer that contained the administrative history of the valley, in a neat brick held together with a rubber band that had lost its elasticity some time during the presidency of Jacques Chirac. She laid them on the kitchen table on the Friday morning like a very slow hand of cards.</w:t>
+      </w:r>
+    </w:p>
+    <w:p>
+      <w:r>
+        <w:t>"Henri wrote everything down," she said. She opened the most recent book and turned it round so that Tobias could see. "I did not like Henri's money. I liked Henri. But I have kept the books."</w:t>
       </w:r>
     </w:p>
     <w:p>
@@ -5592,7 +6472,7 @@
     </w:p>
     <w:p>
       <w:r>
-        <w:t xml:space="preserve">She turned back. And back. Through the books. 2024, 2022, 2020. The pages went past like a flicker book of a life: the price of a new boiler, the vet for a dog called Pompon, a funeral, </w:t>
+        <w:t xml:space="preserve">She turned back. And back. Through the books. 2024, 2022, 2020. The pages went past like a flicker book of a life: a new boiler, the vet for a dog called Pompon, </w:t>
       </w:r>
       <w:r>
         <w:rPr>
@@ -5601,7 +6481,7 @@
         <w:t>Henri, fleurs</w:t>
       </w:r>
       <w:r>
-        <w:t>, in the same small hand, though it could not have been Henri writing it. In the book for 2017 she stopped.</w:t>
+        <w:t>. In the book for 2017 she stopped.</w:t>
       </w:r>
     </w:p>
     <w:p>
@@ -5691,7 +6571,7 @@
     </w:p>
     <w:p>
       <w:r>
-        <w:t xml:space="preserve">The visitors' book lived on the hall table of the lake house, under the telephone that listened. It was bound in green cloth and had been bought by Hale, because it had a small gold label on the front that said </w:t>
+        <w:t xml:space="preserve">The visitors' book lived on the hall table of the lake house, under the telephone that listened. It was bound in green cloth, with a small gold label that said </w:t>
       </w:r>
       <w:r>
         <w:rPr>
@@ -5700,7 +6580,7 @@
         <w:t>The Lake House</w:t>
       </w:r>
       <w:r>
-        <w:t xml:space="preserve"> in a font that wanted very much to be from an older and grander century. Tobias had signed it on his first night, in the euphoria of a man who has just left his wife and believes that a lake will help. He had not looked at it since. Nobody looks at visitors' books. That is their purpose.</w:t>
+        <w:t xml:space="preserve"> in a font that wanted very much to be from a grander century. Tobias had signed it on his first night and not looked at it since. Nobody looks at visitors' books. That is their purpose.</w:t>
       </w:r>
     </w:p>
     <w:p>
@@ -5760,12 +6640,12 @@
     </w:p>
     <w:p>
       <w:r>
-        <w:t>He sat and looked at it for a long time. Nobody said anything. Madame Fournier poured him a cup of coffee he did not drink. Catarina put her hand flat on the table next to the book, not touching it, not touching him, the way she had laid her hand on the window seat on the day she had said her sister's name.</w:t>
-      </w:r>
-    </w:p>
-    <w:p>
-      <w:r>
-        <w:t>"She stayed here," said Tobias at last. "I knew she'd rented it. It was in the paper. I never asked from whom." He did not know what he had imagined. An agency, perhaps; a stranger; a cottage found online by a tired woman who wanted a fortnight by the water. He had not imagined her paying Victor Hale, of all people, three thousand euros a month to sleep under a roof he did not own, so that she could watch him, and signing his green book with a joke about a heron.</w:t>
+        <w:t>He sat and looked at it for some time. Catarina put her hand flat on the table next to the book, not touching it, not touching him, the way she had laid her hand on the window seat on the day she had said her sister's name.</w:t>
+      </w:r>
+    </w:p>
+    <w:p>
+      <w:r>
+        <w:t>"She stayed here," said Tobias at last. "I knew she'd rented it. It was in the paper. I never asked from whom." He had never imagined her paying Victor Hale, of all people, three thousand euros a month to sleep under a roof he did not own, so that she could watch him, and signing his green book with a joke about a heron.</w:t>
       </w:r>
     </w:p>
     <w:p>
@@ -5834,7 +6714,7 @@
     </w:p>
     <w:p>
       <w:r>
-        <w:t>The Belgian schoolmaster had paid three thousand two hundred, because October was "peak season for writers", the listing had said. He had found this charming at the time. He found it less charming now. He said so in a long, beautiful, furious paragraph of French that made Madame Fournier nod slowly throughout, as at a sermon with which she was in complete agreement.</w:t>
+        <w:t>The Belgian schoolmaster had paid three thousand two hundred, because October was "peak season for writers", the listing had said. He said what he thought of that in a long, beautiful, furious paragraph of French that made Madame Fournier nod slowly throughout, as at a sermon with which she was in complete agreement.</w:t>
       </w:r>
     </w:p>
     <w:p>
@@ -5849,7 +6729,7 @@
     </w:p>
     <w:p>
       <w:r>
-        <w:t>Catarina read that one twice and then went out into the garden and stood by the wall for a while with her back to the house. Tobias did not follow her. He was learning which silences were doors and which were walls, and this one, he thought, was a door that she would open herself when she was ready, and it would be rude to knock.</w:t>
+        <w:t>Catarina read that one twice and then went out into the garden and stood by the wall for a while with her back to the house. Tobias did not follow her. He was learning which silences were doors and which were walls.</w:t>
       </w:r>
     </w:p>
     <w:p>
@@ -5869,16 +6749,7 @@
     </w:p>
     <w:p>
       <w:r>
-        <w:t xml:space="preserve">It came to a little over two hundred thousand euros. For a house that was not Victor Hale's, on a lake that was not his, let to people who believed it was his because he had bought a green visitors' book with a gold label and written </w:t>
-      </w:r>
-      <w:r>
-        <w:rPr>
-          <w:i/>
-        </w:rPr>
-        <w:t>The Lake House</w:t>
-      </w:r>
-      <w:r>
-        <w:t xml:space="preserve"> on it in a font from a better century.</w:t>
+        <w:t>It came to a little over two hundred thousand euros. For a house that was not Victor Hale's, let to people who believed it was because he had bought a green book with a gold label.</w:t>
       </w:r>
     </w:p>
     <w:p>
@@ -5916,7 +6787,7 @@
     </w:p>
     <w:p>
       <w:r>
-        <w:t>She sat at the table and read the exercise books, the lease, the visitors' book and the pencilled sum, in that order, without saying anything. Then she read them again in a different order, which Tobias understood to be a professional habit, the way Catarina read his pages twice, the second time looking for what was not there.</w:t>
+        <w:t>She sat at the table and read the exercise books, the lease, the visitors' book and the pencilled sum, in that order, without saying anything. Then she read them again in a different order, looking for what was not there.</w:t>
       </w:r>
     </w:p>
     <w:p>
@@ -6033,7 +6904,7 @@
     </w:p>
     <w:p>
       <w:r>
-        <w:t>Neither of them spoke for a while. It was very cold for the first time that autumn, and the stars were out, the same crowd of them that had been out on the night of the power cut, and somewhere over the pond the three stars in a line hung low above the reeds, waiting for their ship.</w:t>
+        <w:t>Neither of them spoke for a while. It was very cold for the first time that autumn, and over the pond the three stars in a line hung low above the reeds, waiting for their ship.</w:t>
       </w:r>
     </w:p>
     <w:p>
@@ -6043,7 +6914,7 @@
     </w:p>
     <w:p>
       <w:r>
-        <w:t>Catarina stopped beside him. She did not say anything for a moment.</w:t>
+        <w:t>Catarina stopped beside him. She said nothing for a moment.</w:t>
       </w:r>
     </w:p>
     <w:p>
@@ -6073,12 +6944,7 @@
     </w:p>
     <w:p>
       <w:r>
-        <w:t>Then she opened the gate, and went up the gravel to the house, and did not look back, and Tobias stood at the gate for a long time afterwards, under the three stars, with his hand on his cheek like a man who has been told a secret and does not want to drop it.</w:t>
-      </w:r>
-    </w:p>
-    <w:p>
-      <w:r>
-        <w:t>On the pond, the pelican shifted its weight from one leg to the other, and turned its great head away toward the reeds, with what Tobias would later swear was tact.</w:t>
+        <w:t>Then she opened the gate, and went up the gravel to the house, and did not look back, and Tobias stood at the gate for a good while afterwards, under the three stars, with his hand on his cheek like a man who has been told a secret and does not want to drop it.</w:t>
       </w:r>
     </w:p>
     <w:p>
@@ -6097,7 +6963,7 @@
         <w:ind w:firstLine="0"/>
       </w:pPr>
       <w:r>
-        <w:t>Pascal Aubry had fallen from the fourth floor of a hotel on the quai of the Saône, in Lyon, on the night of the eleventh of April, at some time between half past ten and midnight. Nobody had seen it. A man walking a dog along the river had found him at a quarter past twelve on the cobbles below, beside a bench, with his reading glasses still in his breast pocket and not broken. The police had spent eight days on it. The report said that Monsieur Aubry, an auditor, fifty-four, unmarried, had been drinking in the hotel bar, had gone up to his room, had stepped out onto his balcony to smoke, and had leaned on a railing that was old and had given way.</w:t>
+        <w:t>Pascal Aubry had fallen from the fourth floor of a hotel on the quai of the Saône, in Lyon, on the night of the eleventh of April, at some time between half past ten and midnight. A man walking a dog had found him at a quarter past twelve on the cobbles below, with his reading glasses unbroken in his breast pocket. The police had spent eight days on it. The report said that Monsieur Aubry, an auditor, fifty-four, unmarried, had been drinking in the hotel bar, had gone up to his room, had stepped out onto his balcony to smoke, and had leaned on a railing that was old and had given way.</w:t>
       </w:r>
     </w:p>
     <w:p>
@@ -6163,12 +7029,12 @@
         <w:ind w:firstLine="0"/>
       </w:pPr>
       <w:r>
-        <w:t>The chambermaid was called Dona Graça and she was from Vila Nova de Gaia, three streets from the school where Catarina had taught, and had known Catarina's mother, and had been at Catarina's First Communion, and had brought a cake to it that was still discussed. This had been established by two telephone calls to Fernanda in Porto, a telephone call from Fernanda to a woman who ran a café in Lyon's seventh arrondissement, and a telephone call from the café back to Catarina, all in the space of a single afternoon, which Tobias, who had spent four weeks failing to reach a person at his bank in Leeds, regarded as something close to witchcraft.</w:t>
-      </w:r>
-    </w:p>
-    <w:p>
-      <w:r>
-        <w:t>"Is not witchcraft," said Catarina. "Is Portugal. Everybody has a cousin. Everybody in France who cleans a room or builds a wall or cooks a soup has a cousin in Gaia. If you want to know what happens in a hotel, monsieur, you do not ask the manager. You ask the woman who changes the sheets. She knows everything. She knows who sleeps in which bed. She knows who sleeps in two."</w:t>
+        <w:t>The chambermaid was called Dona Graça and she was from Vila Nova de Gaia, three streets from the school where Catarina had taught, and had known Catarina's mother, and had been at Catarina's First Communion, and had brought a cake to it that was still discussed. This had been established by three telephone calls between Porto and a café in Lyon in a single afternoon, which Tobias, who had spent four weeks failing to reach a person at his bank in Leeds, regarded as witchcraft.</w:t>
+      </w:r>
+    </w:p>
+    <w:p>
+      <w:r>
+        <w:t>"Is not witchcraft," said Catarina. "Is Portugal. Everybody has a cousin. If you want to know what happens in a hotel, you do not ask the manager. You ask the woman who changes the sheets. She knows who sleeps in which bed. She knows who sleeps in two."</w:t>
       </w:r>
     </w:p>
     <w:p>
@@ -6182,27 +7048,7 @@
         <w:t>O Cantinho</w:t>
       </w:r>
       <w:r>
-        <w:t xml:space="preserve"> and had a picture of Our Lady of Fátima beside a picture of the Lyon football team over the coffee machine, as if they were jointly responsible for miracles. She was small and round and sixty, with forearms like a baker's and a gold cross at her throat, and she kissed Catarina on both cheeks, held her at arm's length, said in Portuguese that she was too thin and that her mother would have said the same, and then looked at Tobias with an expression of frank and comprehensive assessment.</w:t>
-      </w:r>
-    </w:p>
-    <w:p>
-      <w:r>
-        <w:t>"This is the Englishman," she said, in Portuguese.</w:t>
-      </w:r>
-    </w:p>
-    <w:p>
-      <w:r>
-        <w:t>"This is the Englishman," Catarina agreed.</w:t>
-      </w:r>
-    </w:p>
-    <w:p>
-      <w:r>
-        <w:t>"He is too thin also."</w:t>
-      </w:r>
-    </w:p>
-    <w:p>
-      <w:r>
-        <w:t>"Everybody is too thin," said Catarina, "for this family."</w:t>
+        <w:t xml:space="preserve"> and had a picture of Our Lady of Fátima beside the Lyon football team over the coffee machine, as if they were jointly responsible for miracles. She was small and round and sixty, with a gold cross at her throat, and she kissed Catarina on both cheeks, said she was too thin, looked Tobias up and down, and said he was too thin also.</w:t>
       </w:r>
     </w:p>
     <w:p>
@@ -6222,7 +7068,7 @@
     </w:p>
     <w:p>
       <w:r>
-        <w:t>"One glass. Of water with gas." Dona Graça held up one finger, very firmly. "I know Kader in the bar. One glass, at ten. He paid with coins. He counted them twice." She sipped her coffee. "Then he goes up. And at half past ten, a visitor comes for him."</w:t>
+        <w:t>"One glass. Of water with gas." Dona Graça held up one finger, very firmly. "I know Kader in the bar. One glass, at ten. He paid with coins. He counted them twice." "Then he goes up. And at half past ten, a visitor comes for him."</w:t>
       </w:r>
     </w:p>
     <w:p>
@@ -6237,7 +7083,7 @@
     </w:p>
     <w:p>
       <w:r>
-        <w:t>"The police did not ask Monsieur Lemaire. Monsieur Lemaire is the night porter. He is seventy-one. He sits at the desk from ten until six and does the crossword. The police asked the manager, and the manager was in Villeurbanne with his girlfriend, and so the manager said, nobody came." Dona Graça shrugged with her whole round body. "Monsieur Lemaire told me, the next morning, when I came on. He was upset. He said, Graça, a man came last night for 412. A very chic man. Grey hair. A very good suit. He asks for Monsieur Aubry, and Monsieur Lemaire rings up, and Monsieur Aubry says, send him up. And the man goes up. And Monsieur Lemaire does not see him come down."</w:t>
+        <w:t>"The police did not ask Monsieur Lemaire. Monsieur Lemaire is the night porter. He is seventy-one. He sits at the desk from ten until six and does the crossword. The police asked the manager, who was in Villeurbanne with his girlfriend, and so the manager said, nobody came." Dona Graça shrugged with her whole round body. "Monsieur Lemaire told me, the next morning, when I came on. He was upset. He said, Graça, a man came last night for 412. A very chic man. Grey hair. A very good suit. He asks for Monsieur Aubry, and Monsieur Lemaire rings up, and Monsieur Aubry says, send him up. And the man goes up. And Monsieur Lemaire does not see him come down."</w:t>
       </w:r>
     </w:p>
     <w:p>
@@ -6252,12 +7098,12 @@
     </w:p>
     <w:p>
       <w:r>
-        <w:t>Catarina had gone quite still. Under the table, Tobias felt her hand find his knee, and grip it, hard.</w:t>
-      </w:r>
-    </w:p>
-    <w:p>
-      <w:r>
-        <w:t>"A tie," she said. "Did he say anything about the tie?"</w:t>
+        <w:t>Catarina's hand found Tobias's knee under the table and gripped it, hard. But it was Tobias who asked, because he had been sitting opposite the man at a supper with vol-au-vents and had watched him go out into a dry night with an umbrella.</w:t>
+      </w:r>
+    </w:p>
+    <w:p>
+      <w:r>
+        <w:t>"A tie," he said. "Did he say anything about the tie?"</w:t>
       </w:r>
     </w:p>
     <w:p>
@@ -6272,7 +7118,7 @@
     </w:p>
     <w:p>
       <w:r>
-        <w:t xml:space="preserve">The chambermaid thought. She was a woman who thought with her whole face, the way she shrugged with her whole body. "He said the man was very elegant," she said slowly. "He said, </w:t>
+        <w:t xml:space="preserve">The chambermaid thought. "He said the man was very elegant," she said slowly. "He said, </w:t>
       </w:r>
       <w:r>
         <w:rPr>
@@ -6304,37 +7150,17 @@
         <w:ind w:firstLine="0"/>
       </w:pPr>
       <w:r>
-        <w:t>Monsieur Lemaire had retired in June, to a flat in Vaise with a balcony of his own, which he said he did not use. He received them in a cardigan, with the crossword folded on the arm of his chair and a cat on his knee, and he told them exactly what he had told Dona Graça, in the same words, in the same order, which Tobias had learned from Mara was the sign of a man telling the truth. Liars improve their stories. Honest men repeat them, like a train timetable.</w:t>
-      </w:r>
-    </w:p>
-    <w:p>
-      <w:r>
-        <w:t>He added only one thing. "He went up at ten thirty-four. I write the time. I always write the time; it is a habit from the airport. I did not see him come down. There is a staircase at the back, for the kitchens. It goes to the yard. A man who knows hotels knows the back stairs."</w:t>
-      </w:r>
-    </w:p>
-    <w:p>
-      <w:r>
-        <w:t>"Did you tell the police?"</w:t>
-      </w:r>
-    </w:p>
-    <w:p>
-      <w:r>
-        <w:t>The old man looked at the cat for a while.</w:t>
-      </w:r>
-    </w:p>
-    <w:p>
-      <w:r>
-        <w:t>"I told an officer on the second day. A young man. He wrote it down. Then on the fourth day an officer came back, an older one, from the south, who was not from Lyon at all, which I thought was strange, and he said, Monsieur Lemaire, you are seventy-one, you were doing the crossword, are you sure about the time? Are you sure about the umbrella? Perhaps it was a walking stick. Perhaps it was another night." He stroked the cat. "I said I was sure. He said, thank you, Monsieur Lemaire. And then it was an accident."</w:t>
-      </w:r>
-    </w:p>
-    <w:p>
-      <w:r>
-        <w:t>"An officer from the south," said Tobias slowly.</w:t>
-      </w:r>
-    </w:p>
-    <w:p>
-      <w:r>
-        <w:t>"A commandant. He did not give me his card. He had a very good pen." Monsieur Lemaire looked up at them, his old eyes bright and wet and very angry. "I worked at Lyon airport for thirty-one years, monsieur. I know the difference between an umbrella and a walking stick. I know the difference between a night when it rains and a night when it does not. I know the difference," he added, more quietly, "between a man who wants the truth and a man who wants a signature."</w:t>
+        <w:t>Monsieur Lemaire had retired in June, to a flat in Vaise, and received them in a cardigan with a cat on his knee. He told them exactly what he had told Dona Graça, in the same words, in the same order. Liars improve their stories. Honest men repeat them, like a train timetable. He added two things. The first was the time: ten thirty-four, written down, a habit from thirty-one years at Lyon airport; and he had not seen the man come down, because a man who knows hotels knows the back stairs. The second was an officer who had come on the fourth day, an older one, from the south, not from Lyon at all, with a very good pen, who had asked him whether at seventy-one, with the crossword, he was sure about the time, and whether the umbrella might have been a walking stick, and whether it might have been another night.</w:t>
+      </w:r>
+    </w:p>
+    <w:p>
+      <w:r>
+        <w:t>"I said I was sure," said Monsieur Lemaire, stroking the cat, his old eyes bright and very angry. "He said, thank you. And then it was an accident. I know the difference, monsieur, between a man who wants the truth and a man who wants a signature."</w:t>
+      </w:r>
+    </w:p>
+    <w:p>
+      <w:r>
+        <w:t>"An officer from the south," said Tobias slowly, and thought of a commandant who had closed a file in April with a very good pen.</w:t>
       </w:r>
     </w:p>
     <w:p>
@@ -6352,17 +7178,12 @@
         <w:ind w:firstLine="0"/>
       </w:pPr>
       <w:r>
-        <w:t>The hotel had given the auditor's room to a cardiologist.</w:t>
-      </w:r>
-    </w:p>
-    <w:p>
-      <w:r>
-        <w:t>Dona Graça smuggled them up the back stairs, the very stairs, at four in the afternoon, while the cardiologist was at a congress session on arrhythmia. The room had been redecorated in May. The balcony railing had been replaced the day after the fall, by the hotel's maintenance man, Monsieur Bacri, on the instructions of the manager, before the police had finished their eight days, which Dona Graça had thought was strange at the time and thought was stranger now.</w:t>
-      </w:r>
-    </w:p>
-    <w:p>
-      <w:r>
-        <w:t>The new railing was black and solid and smelled faintly of paint. Tobias stood at it and looked down four floors to the cobbles and the bench and the slow green river, and felt his knees make a decision without him. He stepped back into the room. Catarina stood where he had stood, with her hands on the rail, quite still, and looked down for a long time, and crossed herself.</w:t>
+        <w:t>The hotel had given the auditor's room to a cardiologist, and Dona Graça smuggled them up the back stairs, the very stairs, while he was at a congress session on arrhythmia. The balcony railing had been replaced the day after the fall, before the police had finished their eight days.</w:t>
+      </w:r>
+    </w:p>
+    <w:p>
+      <w:r>
+        <w:t>The new railing was black and solid and smelled faintly of paint. Tobias looked down four floors to the cobbles and the slow green river, and his knees made a decision without him. Catarina stood where he had stood, with her hands on the rail, quite still, and looked down for a long time, and crossed herself.</w:t>
       </w:r>
     </w:p>
     <w:p>
@@ -6377,32 +7198,37 @@
     </w:p>
     <w:p>
       <w:r>
-        <w:t>"No," said a voice from the door. "But I can prove something else."</w:t>
-      </w:r>
-    </w:p>
-    <w:p>
-      <w:r>
-        <w:t>Monsieur Bacri was a lean, grey, quiet Algerian with a carpenter's pencil behind his ear and a canvas bag of tools over his shoulder, and he had been, Dona Graça said, maintenance man at that hotel for twenty-two years, which made him the second-longest-serving thing in the building after the lift. He came in and closed the door behind him and stood with his back against it.</w:t>
-      </w:r>
-    </w:p>
-    <w:p>
-      <w:r>
-        <w:t>"The old railing," he said, in French, slowly, so that Tobias could follow. "I took it down the next morning. The manager said, throw it in the skip. I threw it in the skip. Most of it." He put his bag down on the cardiologist's bed, very carefully, beside the cardiologist's pyjamas, and took out a jam jar with a screw-top lid. In the bottom of the jar, wrapped in a clean handkerchief, was a bolt. It was perhaps eight centimetres long, old and black and rusted, with a nut still on one end. The other end was not there.</w:t>
-      </w:r>
-    </w:p>
-    <w:p>
-      <w:r>
-        <w:t>Monsieur Bacri held the jar up to the light from the window.</w:t>
-      </w:r>
-    </w:p>
-    <w:p>
-      <w:r>
-        <w:t>"Look at the break," he said.</w:t>
-      </w:r>
-    </w:p>
-    <w:p>
-      <w:r>
-        <w:t>They looked. At first Tobias saw only metal. Then he saw what Monsieur Bacri wanted him to see. The break was not one break. Three-quarters of the way through the bolt, the metal was bright and smooth and straight, like the face of a cut loaf, with fine parallel lines across it. Only the last quarter, at the edge, was rough and grey and torn, where the metal had finally given way.</w:t>
+        <w:t>"No." Tobias was looking at the new railing, at the clean black paint, at the bolts, which were new and bright. "But somebody was in a hurry to replace this before the police had finished. You don't hurry to throw away a railing that simply broke. You hurry to throw away one that was helped." He turned to Dona Graça. "Who took the old one down?"</w:t>
+      </w:r>
+    </w:p>
+    <w:p>
+      <w:r>
+        <w:t>"Monsieur Bacri. Maintenance. Twenty-two years."</w:t>
+      </w:r>
+    </w:p>
+    <w:p>
+      <w:r>
+        <w:t>"Then I'd like to meet Monsieur Bacri," said Tobias, "because a man who has looked after one building for twenty-two years doesn't put anything in a skip without looking at it first."</w:t>
+      </w:r>
+    </w:p>
+    <w:p>
+      <w:r>
+        <w:t>They found him in the basement, in a workshop that smelled of oil and sawdust, a lean, grey, quiet Algerian with a carpenter's pencil behind his ear. He listened to Tobias's bad French without interrupting. Then he wiped his hands, went to a shelf behind a row of paint tins, and stood for a moment with his back to them, as if deciding something.</w:t>
+      </w:r>
+    </w:p>
+    <w:p>
+      <w:r>
+        <w:t>"The old railing," he said, in French, slowly, so that Tobias could follow. "The manager said, throw it in the skip. I threw it in the skip. Most of it." He took down a jam jar with a screw-top lid. In the bottom of the jar, wrapped in a clean handkerchief, was a bolt. It was old and black and rusted, with a nut on one end. The other end was not there.</w:t>
+      </w:r>
+    </w:p>
+    <w:p>
+      <w:r>
+        <w:t>"Look at the break," he said, holding it to the light.</w:t>
+      </w:r>
+    </w:p>
+    <w:p>
+      <w:r>
+        <w:t>The break was not one break. Three-quarters of the way through the bolt, the metal was bright and smooth and straight, like the face of a cut loaf, with fine parallel lines across it. Only the last quarter, at the edge, was rough and grey and torn, where the metal had finally given way.</w:t>
       </w:r>
     </w:p>
     <w:p>
@@ -6413,11 +7239,6 @@
     <w:p>
       <w:r>
         <w:t>"Why did you keep it?" said Catarina.</w:t>
-      </w:r>
-    </w:p>
-    <w:p>
-      <w:r>
-        <w:t>He looked at her for a long time.</w:t>
       </w:r>
     </w:p>
     <w:p>
@@ -6440,7 +7261,7 @@
         <w:ind w:firstLine="0"/>
       </w:pPr>
       <w:r>
-        <w:t>They did not take the jar. Mara, reached by telephone from the corridor, in a voice that suggested she was once again in a place where commandants could not follow, was very clear about that.</w:t>
+        <w:t>They did not take the jar. Mara, reached by telephone from the yard, was very clear about that.</w:t>
       </w:r>
     </w:p>
     <w:p>
@@ -6455,12 +7276,12 @@
     </w:p>
     <w:p>
       <w:r>
-        <w:t>"It's a magistrate's," said Mara, and there was something in her voice that Tobias had not heard there before, something that in a less disciplined woman might have been glee. "Madame Fournier went to the procureur on Monday in her good coat. She sat in the waiting room for five hours and forty minutes, and at the end of it a deputy procureur came out to tell her to go home, and she told him about Henri's exercise books, and the deputy procureur was a man of thirty-one whose own grandmother keeps her accounts in exercise books, and he went pale. There's a juge d'instruction looking at the rent as of yesterday. Her name is Sarrazin. She swims in the sea in November. She asked me if I had anything else." A pause. "Now I do."</w:t>
-      </w:r>
-    </w:p>
-    <w:p>
-      <w:r>
-        <w:t xml:space="preserve">Monsieur Bacri wrote his statement on the hotel's notepaper, at the cardiologist's desk, in a careful, sloping, schoolroom hand, two pages, and signed it, and photographed the envelope beside a copy of </w:t>
+        <w:t>"It's a magistrate's," said Mara, with something in her voice that in a less disciplined woman might have been glee. "Madame Fournier went to the procureur on Monday in her good coat. She sat in the waiting room for five hours and forty minutes, until a deputy procureur of thirty-one, whose own grandmother keeps her accounts in exercise books, came out to send her home and went pale instead. There's a juge d'instruction looking at the rent as of yesterday. Her name is Sarrazin. She swims in the sea in November. She asked me if I had anything else." A pause. "Now I do."</w:t>
+      </w:r>
+    </w:p>
+    <w:p>
+      <w:r>
+        <w:t xml:space="preserve">Monsieur Bacri wrote his statement on the hotel's notepaper, at his workbench, in a careful, sloping, schoolroom hand, two pages, and signed it, and photographed the envelope beside a copy of </w:t>
       </w:r>
       <w:r>
         <w:rPr>
@@ -6469,7 +7290,7 @@
         <w:t>Le Progrès</w:t>
       </w:r>
       <w:r>
-        <w:t xml:space="preserve"> on the cardiologist's pillow. He did not ask for anything. When Tobias tried to thank him, he only shook his head and picked up his canvas bag.</w:t>
+        <w:t>.</w:t>
       </w:r>
     </w:p>
     <w:p>
@@ -6511,12 +7332,7 @@
         <w:t>O Cantinho</w:t>
       </w:r>
       <w:r>
-        <w:t>, and it was one room, on the top floor, under the eaves, with a window onto the wet roofs and two narrow single beds with a gap between them about the width of a bedside table, which in fact contained a bedside table, and a lamp, and a small laminated card asking guests in four languages not to smoke.</w:t>
-      </w:r>
-    </w:p>
-    <w:p>
-      <w:r>
-        <w:t>They stood in the doorway and looked at it.</w:t>
+        <w:t>, and it was one room, under the eaves, with two narrow single beds, a bedside table between them, and a small laminated card asking guests in four languages not to smoke.</w:t>
       </w:r>
     </w:p>
     <w:p>
@@ -6526,17 +7342,7 @@
     </w:p>
     <w:p>
       <w:r>
-        <w:t>"There is no chair."</w:t>
-      </w:r>
-    </w:p>
-    <w:p>
-      <w:r>
-        <w:t>"I can sleep in the bath."</w:t>
-      </w:r>
-    </w:p>
-    <w:p>
-      <w:r>
-        <w:t>Catarina looked into the bathroom. "There is no bath. There is a shower, and the shower is a cupboard." She put down her bag on the bed nearer the window, with great firmness, as one plants a flag. "Do not be English. Is two beds. Is one table between. In Portugal we put three children in one bed until they are eleven. Nobody dies."</w:t>
+        <w:t>"There is no chair. There is no bath. The shower is a cupboard." Catarina put down her bag on the bed nearer the window, with great firmness, as one plants a flag. "Do not be English. Is two beds. Is one table between. In Portugal we put three children in one bed until they are eleven. Nobody dies."</w:t>
       </w:r>
     </w:p>
     <w:p>
@@ -6546,22 +7352,22 @@
     </w:p>
     <w:p>
       <w:r>
-        <w:t>For a long time neither of them said anything. Then, in the dark, Catarina said:</w:t>
-      </w:r>
-    </w:p>
-    <w:p>
-      <w:r>
-        <w:t>"You asked me. On the train to Marseille. What I was before."</w:t>
-      </w:r>
-    </w:p>
-    <w:p>
-      <w:r>
-        <w:t>"You said later."</w:t>
-      </w:r>
-    </w:p>
-    <w:p>
-      <w:r>
-        <w:t>"Is later." She was quiet for a moment. He heard her turn onto her side, toward him. "Before I am a teacher, I am a girl who waits. In Afurada, where my father fishes. There is a boy, Duarte. His father has a boat next to my father's boat. We are seventeen. We are going to be married. Everybody says so. The priest says so. My grandmother says so. Then there is no money in fish, so Duarte goes to Switzerland, to work in a hotel kitchen in Lausanne, for two years, to save for a boat of his own. And I wait." She paused. "Two years, I wait. Then three. He writes every month. Then every two months. Then at Christmas. Then one day his mother comes to our house with a photograph. Duarte, in a suit, with a Swiss girl, in front of a church with a very sharp roof."</w:t>
+        <w:t>In the dark, after a long time, Catarina said:</w:t>
+      </w:r>
+    </w:p>
+    <w:p>
+      <w:r>
+        <w:t>"On the train to Marseille," she said, "you did not ask me what I was before the teacher."</w:t>
+      </w:r>
+    </w:p>
+    <w:p>
+      <w:r>
+        <w:t>"I was being English."</w:t>
+      </w:r>
+    </w:p>
+    <w:p>
+      <w:r>
+        <w:t>"Is later now. I tell you anyway." She was quiet for a moment. He heard her turn onto her side, toward him. "Before I am a teacher, I am a girl who waits. In Afurada, where my father fishes. There is a boy, Duarte. His father has a boat next to my father's boat. We are seventeen. We are going to be married. Everybody says so. Then there is no money in fish, so Duarte goes to a hotel kitchen in Lausanne, for two years, to save for a boat. And I wait. Two years. Then three. He writes every month. Then at Christmas. Then one day his mother comes to our house with a photograph. Duarte, in a suit, with a Swiss girl, in front of a church with a very sharp roof."</w:t>
       </w:r>
     </w:p>
     <w:p>
@@ -6571,46 +7377,36 @@
     </w:p>
     <w:p>
       <w:r>
-        <w:t>"No. Is not sad. Is only a long time ago." He heard her smile in the dark, a little crooked. "My grandmother has a poem. You heard it, on the jetty. Three stars waiting. A boat that does not come. And I, on the stone, practising being no one." The rain filled the pause. "I practised very hard. For five years I am very good at being no one. Then one day I think, the boat is not coming, and I am twenty-three, and I do not want to be very good at this. So I go to the university in Porto, and I learn to be a teacher, and I teach children to read so that nobody can ever tell them that a letter is coming when it is not." Another pause. "That is what I was before. A woman who decided not to wait on a stone."</w:t>
-      </w:r>
-    </w:p>
-    <w:p>
-      <w:r>
-        <w:t>Tobias lay in the dark and listened to the rain and thought that it was the most complete thing anybody had ever told him about themselves, and that he had nothing to give back that was half as good.</w:t>
-      </w:r>
-    </w:p>
-    <w:p>
-      <w:r>
-        <w:t>He gave it anyway. He told her about Camilla: not the jacket on the banister, which she knew, but the years before it, the long slow quiet years in which two people who had once liked each other very much had become very polite, and then very careful, and then strangers who knew where the teaspoons were. He told her about Elise, who had read every word he had written for fifteen years and told him exactly what was wrong with it, and who had been the only person in his life who had never once been polite to him about his work, and how he had not understood until she was dead that this had been a form of love.</w:t>
-      </w:r>
-    </w:p>
-    <w:p>
-      <w:r>
-        <w:t>"She sounds like a very rude woman," said Catarina softly, when he had finished.</w:t>
-      </w:r>
-    </w:p>
-    <w:p>
-      <w:r>
-        <w:t>"She was the rudest woman I ever met."</w:t>
-      </w:r>
-    </w:p>
-    <w:p>
-      <w:r>
-        <w:t>"I would have liked her."</w:t>
-      </w:r>
-    </w:p>
-    <w:p>
-      <w:r>
-        <w:t xml:space="preserve">"She would have adored you. She would have told you your English was a disaster and then rewritten your sentences for you in the margin." He stared at the ceiling. "She'd have liked </w:t>
+        <w:t>"No. Is not sad. Is only a long time ago." He heard her smile in the dark, a little crooked. "My grandmother has a poem. You heard it, on the jetty. Three stars waiting. A boat that does not come. And I, on the stone, practising being no one." The rain filled the pause. "I practised very hard. For five years I am very good at being no one. Then one day I think, I am twenty-three, and I do not want to be good at this. So I go to the university in Porto, and I learn to teach children to read, so that nobody can ever tell them a letter is coming when it is not." "That is what I was before. A woman who decided not to wait on a stone."</w:t>
+      </w:r>
+    </w:p>
+    <w:p>
+      <w:r>
+        <w:t>Tobias thought it was the most complete thing anybody had ever told him about themselves, and that he had nothing half as good to give back.</w:t>
+      </w:r>
+    </w:p>
+    <w:p>
+      <w:r>
+        <w:t>He gave it anyway. He told her about Camilla: not the jacket on the banister, which she knew, but the years before it, the long quiet years in which two people who had once liked each other had become very polite, and then strangers who knew where the teaspoons were. He told her about Elise, who had never once been polite to him about his work, and how he had not understood until she was dead that this had been a form of love.</w:t>
+      </w:r>
+    </w:p>
+    <w:p>
+      <w:r>
+        <w:t>"She sounds like a very rude woman," said Catarina softly.</w:t>
+      </w:r>
+    </w:p>
+    <w:p>
+      <w:r>
+        <w:t xml:space="preserve">"The rudest I ever met. She'd have adored you. She'd have stolen </w:t>
       </w:r>
       <w:r>
         <w:rPr>
           <w:i/>
         </w:rPr>
-        <w:t>welcome is a good word, is like a house</w:t>
-      </w:r>
-      <w:r>
-        <w:t>. She'd have stolen it. She stole all my best lines and gave them to other authors."</w:t>
+        <w:t>welcome is like a house</w:t>
+      </w:r>
+      <w:r>
+        <w:t xml:space="preserve"> and put it in somebody else's book."</w:t>
       </w:r>
     </w:p>
     <w:p>
@@ -6620,7 +7416,7 @@
     </w:p>
     <w:p>
       <w:r>
-        <w:t>He took it. They lay like that, in two narrow beds in a cheap hotel in Lyon, with their arms stretched across a bedside table and a laminated card that asked them in four languages not to smoke, holding hands in the dark like two people carrying something fragile across a very long room, until the rain stopped, and they slept.</w:t>
+        <w:t>He took it. They lay like that, with their arms stretched across the bedside table, holding hands in the dark, until the rain stopped, and they slept.</w:t>
       </w:r>
     </w:p>
     <w:p>
@@ -6634,7 +7430,7 @@
         <w:t>Braço dormente.</w:t>
       </w:r>
       <w:r>
-        <w:t xml:space="preserve"> He did not mention it. She rubbed it anyway, briskly, from shoulder to wrist, without being asked, and then went into the shower cupboard singing something from a Lisbon radio station, off-key, and the cardiologists of Lyon went off to their congress, and nobody in the whole city, Tobias thought, could possibly have been as happy as he was about a missed train.</w:t>
+        <w:t xml:space="preserve"> He did not mention it. She rubbed it anyway, without being asked, and went into the shower cupboard singing, off-key, and nobody in the whole city, Tobias thought, could possibly have been as happy as he was about a missed train.</w:t>
       </w:r>
     </w:p>
     <w:p>
@@ -6653,7 +7449,7 @@
         <w:ind w:firstLine="0"/>
       </w:pPr>
       <w:r>
-        <w:t>Mara drove them to Avignon on the Saturday, in her own car, which was small and grey and full of the debris of a life lived between shifts: parking tickets, a child's swimming goggles that she did not explain, three empty water bottles, and a paperback in English with a broken spine and a lighthouse on the cover that Tobias, sitting in the back, looked at with a sudden unease he did not examine.</w:t>
+        <w:t>Mara drove them to Avignon on the Saturday, in her own car, which was small and grey and full of parking tickets, a child's swimming goggles that she did not explain, and a paperback with a lighthouse on the cover that Tobias looked at with a sudden unease.</w:t>
       </w:r>
     </w:p>
     <w:p>
@@ -6696,17 +7492,17 @@
         <w:ind w:firstLine="0"/>
       </w:pPr>
       <w:r>
-        <w:t>Madame Sylvie Giraud lived on the rue des Teinturiers in Avignon, a narrow street along a little canal where old waterwheels, green with moss, turned slowly under the plane trees, as they had turned for the dyers four hundred years ago, for no reason now except that nobody had told them to stop. Her flat was on the second floor, up a stone staircase worn into a dip by centuries of feet, and it was full of books and of light and of the particular stillness of a place where somebody used to sit in a particular chair.</w:t>
-      </w:r>
-    </w:p>
-    <w:p>
-      <w:r>
-        <w:t>She was perhaps sixty, small and neat, with short grey hair and a man's cardigan, much too big for her, which she wore with the sleeves rolled up. She received them in the room with the chair, and did not sit in it, and sat instead on the edge of a sofa with her hands between her knees, and listened to Mara explain who they were, and why they had come, in a French so quiet and careful that Tobias understood almost all of it.</w:t>
-      </w:r>
-    </w:p>
-    <w:p>
-      <w:r>
-        <w:t>When Mara had finished, Madame Giraud did not say anything for a long time.</w:t>
+        <w:t>Madame Sylvie Giraud lived on the rue des Teinturiers in Avignon, a narrow street along a little canal where old waterwheels, green with moss, turned slowly under the plane trees for no reason now except that nobody had told them to stop. Her flat was full of books and of light and of the particular stillness of a place where somebody used to sit in a particular chair.</w:t>
+      </w:r>
+    </w:p>
+    <w:p>
+      <w:r>
+        <w:t>She was perhaps sixty, small and neat, with short grey hair and a man's cardigan, much too big for her, which she wore with the sleeves rolled up. She received them in the room with the chair, and did not sit in it, and listened to Mara explain, in a French so careful that Tobias understood almost all of it.</w:t>
+      </w:r>
+    </w:p>
+    <w:p>
+      <w:r>
+        <w:t>When Mara had finished, Madame Giraud did not say anything for a while.</w:t>
       </w:r>
     </w:p>
     <w:p>
@@ -6731,7 +7527,7 @@
     </w:p>
     <w:p>
       <w:r>
-        <w:t>Mara opened it. Tobias, leaning over, saw the same kind of handwriting as Madame Fournier's exercise books: small, upright, French, with the sevens crossed. Appointments. Phone numbers. A dentist. A lunch. And then, from the middle of May onwards, the same initials, over and over, on almost every page.</w:t>
+        <w:t>Mara opened it. Tobias, leaning over, saw the same kind of handwriting as Madame Fournier's exercise books: small, upright, French, with the sevens crossed. Appointments. Phone numbers. A dentist. A lunch. And then, from the middle of February, the same initials, over and over, on almost every page.</w:t>
       </w:r>
     </w:p>
     <w:p>
@@ -6759,8 +7555,19 @@
         </w:rPr>
         <w:t>E.M. — Lyon, la succession.</w:t>
       </w:r>
-      <w:r>
-        <w:t xml:space="preserve"> </w:t>
+    </w:p>
+    <w:p>
+      <w:r>
+        <w:t xml:space="preserve">On the fifteenth of March, a single line, boxed in ink: </w:t>
+      </w:r>
+      <w:r>
+        <w:rPr>
+          <w:i/>
+        </w:rPr>
+        <w:t>E.M. — noyée.</w:t>
+      </w:r>
+      <w:r>
+        <w:t xml:space="preserve"> Drowned. After that there were no more initials, only a notary going on alone with a dead woman's question: </w:t>
       </w:r>
       <w:r>
         <w:rPr>
@@ -6768,10 +7575,8 @@
         </w:rPr>
         <w:t>Barbier, Aix — les originaux?</w:t>
       </w:r>
-    </w:p>
-    <w:p>
-      <w:r>
-        <w:t>And on the fourth of June, three days before he died, a longer entry, written more quickly than the others, as if the hand had been in a hurry to get the words down before they changed:</w:t>
+      <w:r>
+        <w:t xml:space="preserve"> And on the fourth of June, three days before he died, a longer entry, written more quickly than the others, as if the hand had been in a hurry to get the words down before they changed:</w:t>
       </w:r>
     </w:p>
     <w:p>
@@ -6809,7 +7614,7 @@
     </w:p>
     <w:p>
       <w:r>
-        <w:t>Madame Giraud had begun to cry, silently, without moving, her hands still between her knees.</w:t>
+        <w:t>Madame Giraud had begun to cry, silently, without moving.</w:t>
       </w:r>
     </w:p>
     <w:p>
@@ -6847,17 +7652,22 @@
     </w:p>
     <w:p>
       <w:r>
-        <w:t>Tobias looked at it and thought of Elise, in the water, in March. He did not want to look at it any more. He looked at Fangio instead, who was sitting with great dignity on three legs, watching them.</w:t>
-      </w:r>
-    </w:p>
-    <w:p>
-      <w:r>
-        <w:t>Mara lay down on the gravel.</w:t>
-      </w:r>
-    </w:p>
-    <w:p>
-      <w:r>
-        <w:t>She did it without any fuss, in her slate-grey jumper and her good trousers, on her day off, and slid under the front of the car on her back, with a torch, the way she had presumably done a hundred times before on a hundred wrecked cars, and was silent under there for some time. Monsieur Pons, who had seen policemen before but never one who lay down without being asked, took the cigar out of his mouth and watched her with respect.</w:t>
+        <w:t>Tobias looked at it and thought of Elise, in the water, in March. Then he made himself look again, at the long hill on the map in his head, and the bend, and the bridge.</w:t>
+      </w:r>
+    </w:p>
+    <w:p>
+      <w:r>
+        <w:t>"He drove that road in the dark for twenty years," he said. "Same road, same bend, one glass at lunch. A man who knows a bend that well doesn't miss it. Not unless he puts his foot down and nothing happens." He looked at Mara. "If anybody touched this car, they touched the brakes. And nobody's looked, because nobody's been paid to."</w:t>
+      </w:r>
+    </w:p>
+    <w:p>
+      <w:r>
+        <w:t>Mara looked at him for a moment, the way she had looked at him on the porch on the first day, when he was holding a pen. Then she lay down on the gravel.</w:t>
+      </w:r>
+    </w:p>
+    <w:p>
+      <w:r>
+        <w:t>She did it without any fuss, in her slate-grey jumper and her good trousers, on her day off, and slid under the front of the car on her back, with a torch, the way she had presumably done a hundred times before on a hundred wrecked cars, and was silent under there for some time.</w:t>
       </w:r>
     </w:p>
     <w:p>
@@ -6897,11 +7707,6 @@
     </w:p>
     <w:p>
       <w:r>
-        <w:t>"Rust?" said Tobias. "Wear?"</w:t>
-      </w:r>
-    </w:p>
-    <w:p>
-      <w:r>
         <w:t>"Rubber doesn't wear in a straight line," said Monsieur Pons, in French, almost exactly as Monsieur Bacri had said it in Lyon about the bolt, and Tobias felt the hair rise on his arms. "This is a knife. A good one. Somebody who knows cars." He put the cigar back in his mouth and chewed it. "Forty years I take apart cars, madame. I have seen everything. A man who cuts a brake hose like that has done it before."</w:t>
       </w:r>
     </w:p>
@@ -6927,7 +7732,7 @@
     </w:p>
     <w:p>
       <w:r>
-        <w:t>"He came," said Monsieur Pons, signing with a flourish. "In June. The week after. He looked at the car. He did not lie down. He asked me, is there anything here, Pons? I said, I have not looked. He said, then do not look. Crush it when the insurance pays." He handed the bag back. "I did not like him. Fangio did not like him. Fangio likes everybody. Fangio likes the man who comes to read the electricity."</w:t>
+        <w:t>"He came," said Monsieur Pons, signing with a flourish. "In June. The week after. He looked at the car. He did not lie down. He asked me, is there anything here, Pons? I said, I have not looked. He said, then do not look. Crush it when the insurance pays." He handed the bag back. "I did not like him. Fangio did not like him. Fangio likes everybody."</w:t>
       </w:r>
     </w:p>
     <w:p>
@@ -6960,7 +7765,7 @@
     </w:p>
     <w:p>
       <w:r>
-        <w:t>"Commandant Moutet." She said the name as if she were laying it on a table. "Twenty-six years in the service. Two commendations. A wife who does pottery. A son at the École Polytechnique. And on Thursday mornings he plays golf at a club outside Marseille with the chairman of the Verrane Foundation." Her hands were very steady on the wheel. "I've worked for him for six years. I thought he was lazy. I thought he closed files because it was easier than opening them. I thought he was the kind of man who takes the shortest road home." A pause. "I didn't think he was the road."</w:t>
+        <w:t>"Commandant Moutet." She said the name as if she were laying it on a table. "Twenty-six years in the service. Two commendations. A wife who does pottery. A son at the École Polytechnique. And on Thursday mornings he plays golf at a club outside Marseille with the chairman of the Verrane Foundation." Her hands were very steady on the wheel. "Six years I've worked for him. I thought he was lazy. I thought he took the shortest road home." A pause. "I didn't think he was the road."</w:t>
       </w:r>
     </w:p>
     <w:p>
@@ -7003,7 +7808,7 @@
     </w:p>
     <w:p>
       <w:r>
-        <w:t>Tobias knew this only because Mara told him, that evening, at Madame Fournier's kitchen table, over a glass of Madame Fournier's marc, which was colourless and smelled of pears and could, Madame Fournier said, take the varnish off a coffin, and frequently had. Mara drank it as if it were water. Nobody remarked on this.</w:t>
+        <w:t>Mara told them that evening, at Madame Fournier's kitchen table, over a glass of Henri's marc, which smelled of pears and could, Madame Fournier said, take the varnish off a coffin.</w:t>
       </w:r>
     </w:p>
     <w:p>
@@ -7018,7 +7823,7 @@
     </w:p>
     <w:p>
       <w:r>
-        <w:t>"He said, you have made a very serious mistake for your career. And he looked at me for a long time." Mara drank the marc. "And then he said, it would be a pity, Mara, if your career were the only thing you lost. And he smiled."</w:t>
+        <w:t>"He said, you have made a very serious mistake for your career. And he looked at me for some time." Mara drank the marc. "And then he said, it would be a pity, Mara, if your career were the only thing you lost. And he smiled."</w:t>
       </w:r>
     </w:p>
     <w:p>
@@ -7051,7 +7856,7 @@
         <w:ind w:firstLine="0"/>
       </w:pPr>
       <w:r>
-        <w:t xml:space="preserve">Catarina did not say anything during any of this. She sat at the end of Madame Fournier's table with her hands round a cup of tea that went cold, and listened, and watched Mara's face, and Tobias's face, and once, when Mara said </w:t>
+        <w:t xml:space="preserve">Catarina said nothing during any of this. Once, when Mara said </w:t>
       </w:r>
       <w:r>
         <w:rPr>
@@ -7099,7 +7904,7 @@
     </w:p>
     <w:p>
       <w:r>
-        <w:t>He looked at her in the starlight. He thought of the envelope under the Olivetti, with the name on it that she had let slip in the study and never said again, and that he had never asked about, because a man does not spend a thing he was not given.</w:t>
+        <w:t>He looked at her in the starlight. He thought of the envelope under the Olivetti, with the name on it that he had never asked about.</w:t>
       </w:r>
     </w:p>
     <w:p>
@@ -7247,17 +8052,41 @@
     </w:p>
     <w:p>
       <w:r>
-        <w:t>"No." She frowned and drew something on the envelope. A small wooden cabinet with a false back. "Inês keep things here. Under the window seat."</w:t>
-      </w:r>
-    </w:p>
-    <w:p>
-      <w:r>
-        <w:t>He thought of the board he had seen, the dust disturbed in a clean rectangle, the cushion put back as if the cushion were the point. He did not say that either. He lifted the seat.</w:t>
-      </w:r>
-    </w:p>
-    <w:p>
-      <w:r>
-        <w:t>They found it at midnight. The board Catarina had lifted in October had shown her only dust. The false back was behind it, a second skin of wood that you could find only if you knew that your sister had once been very good at woodwork and very bad at trusting landlords. Inside, wrapped in oilskin, lay a notebook in Inês's handwriting and a small tape recorder. Inês had written, on the inside of the wood, DO NOT MOVE THIS. TRUST ME. They did not move it. They took what she had hidden, and they put the board back.</w:t>
+        <w:t>"No." She frowned at the gap.</w:t>
+      </w:r>
+    </w:p>
+    <w:p>
+      <w:r>
+        <w:t xml:space="preserve">Tobias was not looking at the gap. He was thinking of clause fourteen, and a publisher who wanted </w:t>
+      </w:r>
+      <w:r>
+        <w:rPr>
+          <w:i/>
+        </w:rPr>
+        <w:t>recordings</w:t>
+      </w:r>
+      <w:r>
+        <w:t xml:space="preserve"> from a man who typed; of a rectangle of disturbed dust under the window seat; of a sister who had worked in this house for two years and had left in one night without her things.</w:t>
+      </w:r>
+    </w:p>
+    <w:p>
+      <w:r>
+        <w:t>"Was Inês good with her hands?" he said.</w:t>
+      </w:r>
+    </w:p>
+    <w:p>
+      <w:r>
+        <w:t>Catarina looked up. "She makes furniture. For fun. Since she is twelve. Why?"</w:t>
+      </w:r>
+    </w:p>
+    <w:p>
+      <w:r>
+        <w:t>"Because you lifted the board in October and found dust," he said, "and Hale still thinks there's a tape. So it's still here. And a woman who makes furniture doesn't hide something under a board. She builds it a wall." He got up, and lifted the seat, and knocked on the back of the box beneath it, and then on the side, and the back gave a different sound.</w:t>
+      </w:r>
+    </w:p>
+    <w:p>
+      <w:r>
+        <w:t>They had it open at midnight. The false back was a second skin of wood, very well made, by a woman who was very good at woodwork and very bad at trusting landlords. Inside, wrapped in oilskin, lay a notebook in Inês's handwriting and a small tape recorder. Inês had written, on the inside of the wood, DO NOT MOVE THIS. TRUST ME. They did not move it. They took what she had hidden, and they put the board back.</w:t>
       </w:r>
     </w:p>
     <w:p>
@@ -7707,7 +8536,7 @@
         <w:rPr>
           <w:i/>
         </w:rPr>
-        <w:t>She has a biscuit tin.</w:t>
+        <w:t>I have bribed her with honey.</w:t>
       </w:r>
       <w:r>
         <w:t xml:space="preserve"> I did not ask any more. A notary who asks more than he needs to is a notary who ends up in a diary."</w:t>
@@ -7715,17 +8544,17 @@
     </w:p>
     <w:p>
       <w:r>
-        <w:t>Tobias and Catarina looked at each other.</w:t>
-      </w:r>
-    </w:p>
-    <w:p>
-      <w:r>
-        <w:t>"Odile," said Catarina.</w:t>
-      </w:r>
-    </w:p>
-    <w:p>
-      <w:r>
-        <w:t>"Madame Fournier," said Tobias, at the same moment, and Maître Barbier looked from one to the other, and his eyebrows came down a little, as if he had seen this kind of thing before, at the signing of marriage contracts, and had never much liked it.</w:t>
+        <w:t>Catarina began to say that half the women in Provence kept everything and trusted nobody. Tobias was not listening. He was in the market at Apt, on a Saturday, watching a woman with two string bags walk past a honey stall with forty kinds of jar without stopping and without looking at it, the way a person walks past a house where somebody they knew used to live.</w:t>
+      </w:r>
+    </w:p>
+    <w:p>
+      <w:r>
+        <w:t>"Honey," he said. "Odile doesn't buy honey. She walks past it. Elise brought her a jar, and Elise didn't come back, and now she can't look at the stuff." He stood up. "It's in the biscuit tin. It's been next door to us since March."</w:t>
+      </w:r>
+    </w:p>
+    <w:p>
+      <w:r>
+        <w:t>Maître Barbier looked at him with his eyebrows, which came down a little, as if a client had for once said something worth the fee.</w:t>
       </w:r>
     </w:p>
     <w:p>
@@ -7809,17 +8638,26 @@
         <w:ind w:firstLine="0"/>
       </w:pPr>
       <w:r>
-        <w:t>Madame Fournier did not look up from the secateurs.</w:t>
-      </w:r>
-    </w:p>
-    <w:p>
-      <w:r>
-        <w:t>"The key has been in the biscuit tin since March," she said. "Under your tape, now, and the letter about the rent, and a photograph of Lucien standing on one leg, which I am not going to explain. Your friend Elise gave it to me. She came over the wall on a Thursday with a jar of honey I did not need and asked me to keep one thing in this valley that Monsieur Hale did not know about. She said she was a very careful guest." Madame Fournier snipped a rose that did not need it. "She did not come back. I put the honey in the cellar. I have not been able to open it."</w:t>
-      </w:r>
-    </w:p>
-    <w:p>
-      <w:r>
-        <w:t xml:space="preserve">The bank in Aix took two days, a juge's signature and, in the end, twenty minutes and no heroism. Mara, carrying the juge d'instruction's signature in a plastic sleeve as if it might blow away, signed. Tobias watched. Catarina held the fig bag from the road to Aix, which she had kept, because the bank had no ceremony and a paper bag was honest. Inside the box, on top, lay a toy Porsche with a wheel missing and a card in Elise's quick, slanting, impatient hand: </w:t>
+        <w:t xml:space="preserve">Madame Fournier did not look up from the secateurs when Tobias said the word </w:t>
+      </w:r>
+      <w:r>
+        <w:rPr>
+          <w:i/>
+        </w:rPr>
+        <w:t>honey</w:t>
+      </w:r>
+      <w:r>
+        <w:t>.</w:t>
+      </w:r>
+    </w:p>
+    <w:p>
+      <w:r>
+        <w:t>"The key has been in the biscuit tin since March," she said. "You took your time. It is under your tape, now, and the letter about the rent, and a photograph of Lucien standing on one leg, which I am not going to explain. Your friend Elise gave it to me. She came over the wall on a Thursday with a jar of honey I did not need and asked me to keep one thing in this valley that Monsieur Hale did not know about. She said she was a very careful guest." Madame Fournier snipped a rose that did not need it. "She did not come back. I put the honey in the cellar. I have not been able to open it."</w:t>
+      </w:r>
+    </w:p>
+    <w:p>
+      <w:r>
+        <w:t xml:space="preserve">The bank in Aix took two days and then twenty minutes, with no heroism at all. The box was in Elise's name, and Elise was dead, so the key on its own opened nothing: a bank will open a dead customer's box only for her heirs or on a juge's order, with an officer present and an inventory signed by everyone in the room. Mara, carrying the juge d'instruction's order in a plastic sleeve as if it might blow away, signed. Tobias watched. Catarina held the fig bag from the road to Aix, which she had kept, because the bank had no ceremony and a paper bag was honest. Inside the box, on top, lay a toy Porsche with a wheel missing and a card in Elise's quick, slanting, impatient hand: </w:t>
       </w:r>
       <w:r>
         <w:rPr>
@@ -8271,7 +9109,7 @@
     </w:p>
     <w:p>
       <w:r>
-        <w:t>Madame Fournier came down the garden ten minutes later, in her gardening gloves, because she had seen them from her kitchen window and wished to know what two people in dressing gowns were doing in Henri's terrace at seven in the morning. She stopped at the edge of the grove. She stood there for a long time. Then she took off one glove, finger by finger, and reached up and touched a branch, the way you would touch the sleeve of somebody you had not seen for a long time and were not sure you were allowed to speak to.</w:t>
+        <w:t>Madame Fournier came down the garden ten minutes later, in her gardening gloves, because she had seen them from her kitchen window and wished to know what two people in dressing gowns were doing in Henri's terrace at seven in the morning. She stopped at the edge of the grove. She stood there for some time. Then she took off one glove, finger by finger, and reached up and touched a branch, the way you would touch the sleeve of somebody you had not seen for a while and were not sure you were allowed to speak to.</w:t>
       </w:r>
     </w:p>
     <w:p>
@@ -8515,7 +9353,7 @@
     </w:p>
     <w:p>
       <w:r>
-        <w:t>Tobias had not heard her voice since the landing. He had heard her solicitor's voice, which was cold butter, and he had heard, in his head, at three in the morning, a great many versions of her voice saying a great many things she had never said. The real one was smaller than any of them. It was a tired voice. It sounded as if it had been crying, or had a cold, or both, which with Camilla was usually the case, because she regarded colds as a form of emotional honesty.</w:t>
+        <w:t>Tobias had not heard her voice since the landing. It was smaller than he remembered, and tired, and had a cold, which with Camilla was usual, because she regarded colds as a form of emotional honesty.</w:t>
       </w:r>
     </w:p>
     <w:p>
@@ -8535,7 +9373,7 @@
     </w:p>
     <w:p>
       <w:r>
-        <w:t>He stood in the hall with the receiver in his hand and looked at the coat-stand, and the green visitors' book with the gold label, and the stairs, at the top of which, through the open study door, he could see the end of the Olivetti's carriage, shining.</w:t>
+        <w:t>He stood in the hall with the receiver in his hand and looked at the green visitors' book.</w:t>
       </w:r>
     </w:p>
     <w:p>
@@ -8550,7 +9388,7 @@
     </w:p>
     <w:p>
       <w:r>
-        <w:t>He did not answer at once. He thought about the house in Leeds, the brick and the plane tree and the man who mended lawnmowers on Sundays. He thought about nine years of a woman with a tartan trolley nodding at him in the street. He thought, with great clarity, that he had liked that life, the way a man likes a coat that has stopped keeping him warm but still has his shape.</w:t>
+        <w:t>He did not answer at once. He thought about the house in Leeds, and the woman with the tartan trolley, and that he had liked that life the way a man likes a coat that has stopped keeping him warm but still has his shape.</w:t>
       </w:r>
     </w:p>
     <w:p>
@@ -8566,16 +9404,6 @@
     <w:p>
       <w:r>
         <w:t>"Yes," he said. "I'll think about it."</w:t>
-      </w:r>
-    </w:p>
-    <w:p>
-      <w:r>
-        <w:t>"Promise."</w:t>
-      </w:r>
-    </w:p>
-    <w:p>
-      <w:r>
-        <w:t>"I promise I'll think about it."</w:t>
       </w:r>
     </w:p>
     <w:p>
@@ -8608,7 +9436,7 @@
         <w:ind w:firstLine="0"/>
       </w:pPr>
       <w:r>
-        <w:t>He should have explained then. He knew that afterwards. He knew it within about a minute, in fact, which is the usual interval in which a man understands that he has missed the only moment that mattered. But she had already turned back into the kitchen, and put the basket on the table, and begun folding sheets with a precision that did not invite company, and he stood in the doorway for a moment, and then, being English, went upstairs and sat at the Olivetti and typed nothing for an hour.</w:t>
+        <w:t>He should have explained then. He knew it within about a minute, which is the usual interval in which a man understands that he has missed the only moment that mattered. But she had already turned back into the kitchen and begun folding sheets with a precision that did not invite company, and he, being English, went upstairs and typed nothing for an hour.</w:t>
       </w:r>
     </w:p>
     <w:p>
@@ -8618,7 +9446,7 @@
     </w:p>
     <w:p>
       <w:r>
-        <w:t xml:space="preserve">He had been thinking all morning, in the gaps between not typing, about Delacroix-Roux in the hospital car park in Aix, with his extraordinary teeth, saying </w:t>
+        <w:t xml:space="preserve">He had been thinking all morning about Delacroix-Roux in the hospital car park, saying </w:t>
       </w:r>
       <w:r>
         <w:rPr>
@@ -8627,17 +9455,12 @@
         <w:t>do give my regards to your sister</w:t>
       </w:r>
       <w:r>
-        <w:t>.</w:t>
-      </w:r>
-    </w:p>
-    <w:p>
-      <w:r>
-        <w:t>And he had been thinking, mostly, about Catarina, who had walked into a lake in September in her apron and cardigan, and who would, he was quite certain, walk into anything else that was necessary, at any hour, without a torch.</w:t>
-      </w:r>
-    </w:p>
-    <w:p>
-      <w:r>
-        <w:t xml:space="preserve">So when she put the tray down outside his door at noon, and did not knock, as she had not knocked since the first week, he opened the door before she could go, and said the stupidest thing he had said since </w:t>
+        <w:t>, and about Catarina, who had walked into a lake in her cardigan and would, he was quite certain, walk into anything else that was necessary, at any hour, without a torch.</w:t>
+      </w:r>
+    </w:p>
+    <w:p>
+      <w:r>
+        <w:t xml:space="preserve">So when she put the tray down outside his door at noon, he opened the door before she could go, and said the stupidest thing he had said since </w:t>
       </w:r>
       <w:r>
         <w:rPr>
@@ -8676,7 +9499,7 @@
     </w:p>
     <w:p>
       <w:r>
-        <w:t>He had seen her angry before. He had seen her angry with the Hargreaveses at the inn in the Camargue, a cold, elegant, heron's anger, and he had seen her angry with the stove, which was a hot, muttering, domestic anger with a great deal of Portuguese in it. He had not seen this. This was very quiet. This had no language at all.</w:t>
+        <w:t>He had seen her angry before: a cold heron's anger with the Hargreaveses, a hot, muttering anger with the stove. This was very quiet. This had no language at all.</w:t>
       </w:r>
     </w:p>
     <w:p>
@@ -8711,7 +9534,7 @@
     </w:p>
     <w:p>
       <w:r>
-        <w:t>It came out louder than he meant. It went down the stairs and into the kitchen and out of the open window over the pond, where a heron lifted out of the reeds, offended, and flapped away.</w:t>
+        <w:t>It came out louder than he meant, and went out of the open window over the pond, where a heron lifted out of the reeds, offended.</w:t>
       </w:r>
     </w:p>
     <w:p>
@@ -8744,22 +9567,17 @@
         <w:ind w:firstLine="0"/>
       </w:pPr>
       <w:r>
-        <w:t>He did not eat the soup. He sat on the edge of the bed with the tray on his knees and looked at it until it was cold, and then he took it down to the kitchen, and she was not there. The back door was open. Through it he could see her at the end of the garden, by the wall, with her back to the house, talking over it to Madame Fournier, very fast, in a mixture of French and Portuguese and her hands, and Madame Fournier, on the other side of the wall, with her secateurs, nodding slowly and not looking at the house at all, which was how he knew they were talking about him.</w:t>
-      </w:r>
-    </w:p>
-    <w:p>
-      <w:r>
-        <w:t>He went back upstairs.</w:t>
-      </w:r>
-    </w:p>
-    <w:p>
-      <w:r>
-        <w:t>It was not until the evening that he understood there was something else. That the call, and the stupid sentence on the landing, had not been the whole of it. That they had only been the match.</w:t>
-      </w:r>
-    </w:p>
-    <w:p>
-      <w:r>
-        <w:t>She came up at seven, without the tray. She knocked. She had not knocked since the first week. She stood in the doorway of the study with her hands folded in front of her apron, like a housekeeper in a film about a big house, and he hated it, and he understood that she meant him to.</w:t>
+        <w:t>He did not eat the soup. When he took it down, she was at the end of the garden, talking over the wall to Madame Fournier, very fast, in three languages and her hands, and Madame Fournier was nodding slowly and not looking at the house at all, which was how he knew they were talking about him.</w:t>
+      </w:r>
+    </w:p>
+    <w:p>
+      <w:r>
+        <w:t>That evening he understood that the call, and the stupid sentence on the landing, had only been the match.</w:t>
+      </w:r>
+    </w:p>
+    <w:p>
+      <w:r>
+        <w:t>She came up at seven, without the tray, and knocked, which she had not done since the first week, and stood in the doorway with her hands folded in front of her apron, like a housekeeper in a film about a big house. He hated it, and he understood that she meant him to.</w:t>
       </w:r>
     </w:p>
     <w:p>
@@ -8784,7 +9602,7 @@
     </w:p>
     <w:p>
       <w:r>
-        <w:t>"Before," she said. "Before the wind. Before the lake. I come in September. You come eleven days later. You put the book in the study, in the satchel, every night, on the chair. And every night, when you are asleep, I come up the stairs, the fourth one I do not step on, and I take out the pages, and I sit on the floor by the window with the dictionary and the lamp very low, and I read." She did not look away. "Every night. Eleven nights. Slowly. Ten pages, fifteen. I read about the woman on the jetty. I read about the publisher, with the silver car. I read that the woman did not slip." Her voice did not change. "I knew, before you knew I could read, what was in your book. I knew that it said Hale. I knew it was dangerous. That is why, when the wind takes the pages, I go into the lake."</w:t>
+        <w:t>"Before," she said. "Before the wind. I come in September. You come eleven days later. You put the book in the satchel, on the chair, every night. And every night, when you are asleep, I come up the stairs, the fourth one I do not step on, and I sit on the floor by the window with the dictionary and the lamp very low, and I read. Eleven nights. I read about the woman on the jetty. I read about the publisher with the silver car. I read that the woman did not slip." She did not look away. "I knew it said Hale. I knew it was dangerous. That is why, when the wind takes the pages, I go into the lake."</w:t>
       </w:r>
     </w:p>
     <w:p>
@@ -8799,12 +9617,12 @@
     </w:p>
     <w:p>
       <w:r>
-        <w:t>He sat very still at the desk with the Olivetti beside him. He thought of the first morning, the pages on the towels, drying, one by one, with grim patience. He had thought it was kindness. He had thought, later, on the train to Marseille, that it had been a professional opinion. He had not thought, at any point, that she had known exactly which pages she was saving, and why.</w:t>
-      </w:r>
-    </w:p>
-    <w:p>
-      <w:r>
-        <w:t>"I came to find my sister," said Catarina. "You know this. You knew it on the jetty, with the newspaper. You did not ask. Thank you for that. But I did not come to find you. I did not come for the birds, or the stars, or the flamingos. I came for Inês, and you were the man with the book that knew where to look. So I read your book. And I saved your book. And I helped you with the dictionary and the scanner and the prize and Marseille and Lyon. Because your book was the road to my sister." She took a breath. "I am telling you so that you know. So that you do not think, later, in the court, that I was only a housekeeper who was kind. I was not only kind. I was using you. At the beginning. It is true."</w:t>
+        <w:t>He sat very still. He had thought the drying of the pages was kindness, and later a professional opinion. He had not thought that she had known exactly which pages she was saving, and why.</w:t>
+      </w:r>
+    </w:p>
+    <w:p>
+      <w:r>
+        <w:t>"I came to find my sister," said Catarina. "You know this. You did not ask. Thank you for that. But I did not come for the birds, or the stars, or the flamingos. I came for Inês, and you were the man with the book that knew where to look. So I read your book, and I saved your book, and I helped you with the prize and Marseille and Lyon, because your book was the road to my sister." She took a breath. "I am telling you so that you do not think, later, in the court, that I was only a housekeeper who was kind. I was using you. At the beginning. It is true."</w:t>
       </w:r>
     </w:p>
     <w:p>
@@ -8839,7 +9657,7 @@
     </w:p>
     <w:p>
       <w:r>
-        <w:t xml:space="preserve">She waited. He understood, much later, that she was waiting for him to ask the obvious question, the one any fool could see sitting there in the room between them, the one with </w:t>
+        <w:t xml:space="preserve">She waited. He understood, much later, that she was waiting for the obvious question, the one with </w:t>
       </w:r>
       <w:r>
         <w:rPr>
@@ -8848,7 +9666,7 @@
         <w:t>at the beginning</w:t>
       </w:r>
       <w:r>
-        <w:t xml:space="preserve"> written all over it, like a price on a lobster. </w:t>
+        <w:t xml:space="preserve"> written all over it like a price on a lobster. </w:t>
       </w:r>
       <w:r>
         <w:rPr>
@@ -8859,7 +9677,7 @@
     </w:p>
     <w:p>
       <w:r>
-        <w:t>He did not ask it. He sat at the desk with his hurt pride in his lap like a cat that has been put there by somebody else, and he looked at the Olivetti, and said nothing, in the great English tradition of saying nothing, which she had told him on the jetty was not a sport but a disease.</w:t>
+        <w:t>He did not ask it. He sat with his hurt pride in his lap like a cat somebody else had put there, and said nothing, in the great English tradition, which she had told him on the jetty was not a sport but a disease.</w:t>
       </w:r>
     </w:p>
     <w:p>
@@ -8892,7 +9710,7 @@
     </w:p>
     <w:p>
       <w:r>
-        <w:t>It was, Tobias thought, the worst thing that had ever happened in that house, and that included a murder. She put the tray outside his door at noon, and did not knock, and there was no note under the plate. He said good morning, and she said good morning, in English, correctly, with the stress in the right place. When he came into the kitchen, she found something to do in the scullery. When she came into the study to dust, he found something to do in the garden. The radio from Lisbon stayed off. Nobody sang. The pelican stood at the end of the jetty with its back to the house, like an uncle at a wedding who has heard about the argument and has decided not to take sides by facing the sea.</w:t>
+        <w:t>It was, Tobias thought, the worst thing that had ever happened in that house, and that included a murder. There was no note under the plate. They said good morning, correctly, with the stress in the right place. The radio from Lisbon stayed off. The pelican stood at the end of the jetty with its back to the house, like an uncle at a wedding who has decided not to take sides by facing the sea.</w:t>
       </w:r>
     </w:p>
     <w:p>
@@ -8902,7 +9720,7 @@
     </w:p>
     <w:p>
       <w:r>
-        <w:t>She did not come to the kitchen door, where Catarina was. She came round to the front of the house, and up the steps, and rang the bell, which nobody had ever rung, and which turned out to play the first four notes of a tune Tobias could not place and did not want to. When he opened the door, she walked past him into the hall without being asked, took off her gardening gloves finger by finger, as Priscilla Pemberton-Hayes had taken off her gloves on the night of the pantomime, and sat down on the bottom stair.</w:t>
+        <w:t>She came round to the front and rang the bell, which nobody had ever rung, walked past him into the hall, took off her gardening gloves finger by finger, and sat down on the bottom stair.</w:t>
       </w:r>
     </w:p>
     <w:p>
@@ -8917,7 +9735,7 @@
     </w:p>
     <w:p>
       <w:r>
-        <w:t>"It was about a carburettor," said Madame Fournier. "He said I had flooded it. I said he had never once in his life admitted to a carburettor being his fault. He said a carburettor is a matter of fact and not of fault. I said everything with Henri was a matter of fact and nothing was ever his fault, including his mother. And for eleven days we were very polite." She folded the gloves together on her knee. "It was the worst eleven days of my marriage. Worse than his mother. Worse than the funeral. At the funeral, at least, I could talk to him."</w:t>
+        <w:t>"It was about a carburettor," said Madame Fournier. "He said I had flooded it. I said nothing in his life had ever been his fault, including his mother. And for eleven days we were very polite." She folded the gloves on her knee. "It was the worst eleven days of my marriage. At the funeral, at least, I could talk to him."</w:t>
       </w:r>
     </w:p>
     <w:p>
@@ -8937,17 +9755,149 @@
     </w:p>
     <w:p>
       <w:r>
-        <w:t>"She told me also. Over the wall. On Wednesday. She was crying, and she was very angry, and she said everything three times, in three languages, which is how I know it was the truth. A woman does not lie in three languages. It is too much work." Madame Fournier turned the gloves over. "And you said, so I was useful."</w:t>
-      </w:r>
-    </w:p>
-    <w:p>
-      <w:r>
-        <w:t>"How do you..."</w:t>
-      </w:r>
-    </w:p>
-    <w:p>
-      <w:r>
-        <w:t xml:space="preserve">"Because it is what Henri would have said," said Madame Fournier, with great contempt. "It is what every man says, in every language, when a woman tells him the truth and the truth has no flattery in it. </w:t>
+        <w:t>"She told me also. Over the wall. She said everything three times, in three languages, which is how I know it was the truth. A woman does not lie in three languages. It is too much work. And you said, so I was useful."</w:t>
+      </w:r>
+    </w:p>
+    <w:p>
+      <w:r>
+        <w:t>"It is what Henri would have said," said Madame Fournier, with great contempt. "It is what every man says when a woman tells him the truth and the truth has no flattery in it." She stood up, a hand on the banister. "Monsieur Lind. A woman reads eleven nights of a book in a language she does not speak, by a lamp, with a dictionary, and then she walks into a lake in her cardigan to save it. You think she was being useful? Nobody walks into a lake to be useful. Henri would not walk into a lake to save his own mother, and she owned a vineyard."</w:t>
+      </w:r>
+    </w:p>
+    <w:p>
+      <w:r>
+        <w:t>She went to the door, and stopped there with her hand on the latch, as everybody in that valley seemed to stop at doors, to say the last thing when it could no longer be answered.</w:t>
+      </w:r>
+    </w:p>
+    <w:p>
+      <w:r>
+        <w:t xml:space="preserve">"And the other thing," she said. "The thing she said. </w:t>
+      </w:r>
+      <w:r>
+        <w:rPr>
+          <w:i/>
+        </w:rPr>
+        <w:t>At the beginning.</w:t>
+      </w:r>
+      <w:r>
+        <w:t xml:space="preserve"> You heard that?"</w:t>
+      </w:r>
+    </w:p>
+    <w:p>
+      <w:r>
+        <w:t>"I heard it."</w:t>
+      </w:r>
+    </w:p>
+    <w:p>
+      <w:r>
+        <w:t>"Then why did you not ask her about the end?"</w:t>
+      </w:r>
+    </w:p>
+    <w:p>
+      <w:r>
+        <w:t>She went out. Tobias stood in the hall alone and finally, two days late, at the speed of the English, understood what Catarina had been waiting for on the landing.</w:t>
+      </w:r>
+    </w:p>
+    <w:p>
+      <w:pPr>
+        <w:spacing w:before="160" w:after="160"/>
+        <w:ind w:firstLine="0"/>
+        <w:jc w:val="center"/>
+      </w:pPr>
+      <w:r>
+        <w:t>*  *  *</w:t>
+      </w:r>
+    </w:p>
+    <w:p>
+      <w:pPr>
+        <w:ind w:firstLine="0"/>
+      </w:pPr>
+      <w:r>
+        <w:t>He went to the kitchen. She was not there. She was in the scullery, with her sleeves rolled up, scrubbing a pan that did not need it, and she did not turn round when he came to the door.</w:t>
+      </w:r>
+    </w:p>
+    <w:p>
+      <w:r>
+        <w:t>"Catarina," he said.</w:t>
+      </w:r>
+    </w:p>
+    <w:p>
+      <w:r>
+        <w:t>"Senhor Lind."</w:t>
+      </w:r>
+    </w:p>
+    <w:p>
+      <w:r>
+        <w:t>"I rang Camilla back. This afternoon, before Madame Fournier came. I want you to know that it was before." He stood in the doorway with his hands at his sides. "I said no. I said I was sorry about Gerald, and about a great many things, most of which were my fault and some of which were the duvet's. I should have said it on Wednesday, and I didn't, because she was crying and I'm a coward. She can sell the house. She can keep the duvet."</w:t>
+      </w:r>
+    </w:p>
+    <w:p>
+      <w:r>
+        <w:t>The scrubbing stopped.</w:t>
+      </w:r>
+    </w:p>
+    <w:p>
+      <w:r>
+        <w:t>"And Porto," he went on, because if he stopped he would never start again. "I said Porto because I'm frightened. Because a man with a claret tie stood in a car park and talked about your sister. I'd rather you were in Porto, being fed by Fernanda, hating me, than here when he comes. I said it like an idiot. I'm sorry."</w:t>
+      </w:r>
+    </w:p>
+    <w:p>
+      <w:r>
+        <w:t>She did not turn round. But she put the pan down in the water, very slowly, and put both hands on the edge of the sink, the way she had held it on the day Victor Hale came, with her knuckles white.</w:t>
+      </w:r>
+    </w:p>
+    <w:p>
+      <w:r>
+        <w:t>"And the book," she said, to the window. "That I read. That I used you."</w:t>
+      </w:r>
+    </w:p>
+    <w:p>
+      <w:r>
+        <w:t>"At the beginning," said Tobias.</w:t>
+      </w:r>
+    </w:p>
+    <w:p>
+      <w:r>
+        <w:t>"Yes."</w:t>
+      </w:r>
+    </w:p>
+    <w:p>
+      <w:r>
+        <w:t>"And at the end?"</w:t>
+      </w:r>
+    </w:p>
+    <w:p>
+      <w:r>
+        <w:t>There was a very long silence in the scullery. Outside, the light was going over the pond. The pelican, at the end of the jetty, had turned round, and was facing the house.</w:t>
+      </w:r>
+    </w:p>
+    <w:p>
+      <w:r>
+        <w:t>"I do not know the end," said Catarina at last, very quietly. "Nobody knows the end. That is why they read the book." She turned off the tap. "But I know the middle. In the middle, I stopped reading your pages at night, because I did not need them any more. I knew where my sister was not. I stayed anyway." She turned round. Her eyes were very bright and her chin was up, the way it had been at the inn in the Camargue, and there was a smear of soap on her cheek. "In the middle, I am not using you. In the middle, I am only..." She stopped. She searched for it, and he watched her search, through two languages, for a word, and not find it, and decide, with visible courage, to say the nearest one she had. "I am only here."</w:t>
+      </w:r>
+    </w:p>
+    <w:p>
+      <w:r>
+        <w:t>He did not say anything clever. He did not have anything clever. He crossed the scullery, three steps, and took her soapy hands in his, and held them, and she let him.</w:t>
+      </w:r>
+    </w:p>
+    <w:p>
+      <w:r>
+        <w:t>"Then I'll stay too," he said. "Here. In the middle. Until we find out how it ends."</w:t>
+      </w:r>
+    </w:p>
+    <w:p>
+      <w:r>
+        <w:t>"You are very bad at Portuguese," said Catarina, unsteadily.</w:t>
+      </w:r>
+    </w:p>
+    <w:p>
+      <w:r>
+        <w:t>"I know."</w:t>
+      </w:r>
+    </w:p>
+    <w:p>
+      <w:r>
+        <w:t xml:space="preserve">"And English. You are also bad at English. </w:t>
       </w:r>
       <w:r>
         <w:rPr>
@@ -8956,152 +9906,6 @@
         <w:t>So I was useful.</w:t>
       </w:r>
       <w:r>
-        <w:t>" She stood up, a little stiffly, with a hand on the banister. "Monsieur Lind. She walked into a lake for your book because she had read it. Think about that. A woman reads eleven nights of a book in a language she does not speak, by a lamp, on the floor, with a dictionary, and then she walks into a lake in September in her cardigan to save it. You think she was being useful?" She pulled the gloves back on. "Nobody walks into a lake to be useful. Henri would not walk into a lake to save his own mother, and she owned a vineyard."</w:t>
-      </w:r>
-    </w:p>
-    <w:p>
-      <w:r>
-        <w:t>She went to the door, and stopped there with her hand on the latch, as everybody in that valley seemed to stop at doors, to say the last thing when it could no longer be answered.</w:t>
-      </w:r>
-    </w:p>
-    <w:p>
-      <w:r>
-        <w:t xml:space="preserve">"And the other thing," she said. "The thing she said. </w:t>
-      </w:r>
-      <w:r>
-        <w:rPr>
-          <w:i/>
-        </w:rPr>
-        <w:t>At the beginning.</w:t>
-      </w:r>
-      <w:r>
-        <w:t xml:space="preserve"> You heard that?"</w:t>
-      </w:r>
-    </w:p>
-    <w:p>
-      <w:r>
-        <w:t>"I heard it."</w:t>
-      </w:r>
-    </w:p>
-    <w:p>
-      <w:r>
-        <w:t>"Then why did you not ask her about the end?"</w:t>
-      </w:r>
-    </w:p>
-    <w:p>
-      <w:r>
-        <w:t>She went out. The bell, for some reason, played its four notes again as the door closed, and Tobias stood in the hall alone, beside the coat-stand and the green visitors' book and the telephone that listened, and finally, two days late, at the speed of the English, understood what she had been waiting for on the landing.</w:t>
-      </w:r>
-    </w:p>
-    <w:p>
-      <w:pPr>
-        <w:spacing w:before="160" w:after="160"/>
-        <w:ind w:firstLine="0"/>
-        <w:jc w:val="center"/>
-      </w:pPr>
-      <w:r>
-        <w:t>*  *  *</w:t>
-      </w:r>
-    </w:p>
-    <w:p>
-      <w:pPr>
-        <w:ind w:firstLine="0"/>
-      </w:pPr>
-      <w:r>
-        <w:t>He went to the kitchen. She was not there. She was in the scullery, with her sleeves rolled up, scrubbing a pan that did not need it, and she did not turn round when he came to the door.</w:t>
-      </w:r>
-    </w:p>
-    <w:p>
-      <w:r>
-        <w:t>"Catarina," he said.</w:t>
-      </w:r>
-    </w:p>
-    <w:p>
-      <w:r>
-        <w:t>"Senhor Lind."</w:t>
-      </w:r>
-    </w:p>
-    <w:p>
-      <w:r>
-        <w:t>"I rang Camilla back. This afternoon. Before Madame Fournier came. I want you to know that it was before." He stood in the doorway with his hands at his sides, because he did not know what else to do with them. "I said no. I said I was sorry about Gerald, and I was sorry about the house, and I was sorry about a great many things, most of which were my fault and some of which were the duvet's. And I said no. I should have said it on Wednesday, and I didn't, because she was crying and I'm a coward. But I've said it now. She can sell the house. She can keep the duvet."</w:t>
-      </w:r>
-    </w:p>
-    <w:p>
-      <w:r>
-        <w:t>The scrubbing stopped.</w:t>
-      </w:r>
-    </w:p>
-    <w:p>
-      <w:r>
-        <w:t>"And Porto," he went on, because if he stopped he would never start again. "I didn't say Porto because I wanted you to go. I said Porto because I'm frightened. Because a man with a claret tie stood in a car park in Aix and talked about your sister, and I can't bear it. I can't bear the idea of you being in this house when he comes, if he comes. I'd rather you were in Porto, being fed by Fernanda, hating me, than here." He took a breath. "That's what I meant. I said it like an idiot. I'm sorry."</w:t>
-      </w:r>
-    </w:p>
-    <w:p>
-      <w:r>
-        <w:t>She did not turn round. But she put the pan down in the water, very slowly, and put both hands on the edge of the sink, the way she had held it on the day Victor Hale came, with her knuckles white.</w:t>
-      </w:r>
-    </w:p>
-    <w:p>
-      <w:r>
-        <w:t>"And the book," she said, to the window. "That I read. That I used you."</w:t>
-      </w:r>
-    </w:p>
-    <w:p>
-      <w:r>
-        <w:t>"At the beginning," said Tobias.</w:t>
-      </w:r>
-    </w:p>
-    <w:p>
-      <w:r>
-        <w:t>"Yes."</w:t>
-      </w:r>
-    </w:p>
-    <w:p>
-      <w:r>
-        <w:t>"And at the end?"</w:t>
-      </w:r>
-    </w:p>
-    <w:p>
-      <w:r>
-        <w:t>There was a very long silence in the scullery. Outside, the light was going over the pond. The pelican, at the end of the jetty, had turned round, and was facing the house.</w:t>
-      </w:r>
-    </w:p>
-    <w:p>
-      <w:r>
-        <w:t>"I do not know the end," said Catarina at last, very quietly. "Nobody knows the end. That is why they read the book." She turned off the tap. "But I know the middle. In the middle, I stopped reading your pages at night, because I did not need them any more. I knew where my sister was not. I stayed anyway." She turned round. Her eyes were very bright and her chin was up, the way it had been at the inn in the Camargue, and there was a smear of soap on her cheek. "In the middle, I am not using you. In the middle, I am only..." She stopped. She searched for it, and he watched her search, through two languages, for a word, and not find it, and decide, with visible courage, to say the nearest one she had. "I am only here."</w:t>
-      </w:r>
-    </w:p>
-    <w:p>
-      <w:r>
-        <w:t>He did not say anything clever. He did not have anything clever. He crossed the scullery, three steps, and took her soapy hands in his, and held them, and she let him.</w:t>
-      </w:r>
-    </w:p>
-    <w:p>
-      <w:r>
-        <w:t>"Then I'll stay too," he said. "Here. In the middle. Until we find out how it ends."</w:t>
-      </w:r>
-    </w:p>
-    <w:p>
-      <w:r>
-        <w:t>"You are very bad at Portuguese," said Catarina, unsteadily.</w:t>
-      </w:r>
-    </w:p>
-    <w:p>
-      <w:r>
-        <w:t>"I know."</w:t>
-      </w:r>
-    </w:p>
-    <w:p>
-      <w:r>
-        <w:t xml:space="preserve">"And English. You are also bad at English. </w:t>
-      </w:r>
-      <w:r>
-        <w:rPr>
-          <w:i/>
-        </w:rPr>
-        <w:t>So I was useful.</w:t>
-      </w:r>
-      <w:r>
         <w:t>" She shook her head. "Terrible. A terrible sentence. I would give it to a child of six and say, no, Rui, again."</w:t>
       </w:r>
     </w:p>
@@ -9112,7 +9916,7 @@
     </w:p>
     <w:p>
       <w:r>
-        <w:t>She held his eyes for a long moment, with their wet hands between them. Then she laughed, a small cracked laugh, and took one hand back to wipe her eyes with the back of her wrist, and left a stripe of soap across her eyebrow, and did not care.</w:t>
+        <w:t>She held his eyes for a moment, with their wet hands between them. Then she laughed, a small cracked laugh, and took one hand back to wipe her eyes with the back of her wrist, and left a stripe of soap across her eyebrow, and did not care.</w:t>
       </w:r>
     </w:p>
     <w:p>
@@ -9132,7 +9936,7 @@
     </w:p>
     <w:p>
       <w:r>
-        <w:t>That night the radio from Lisbon came back on. She sang along to it, off-key, in the kitchen, and he sat at the top of the stairs and listened, the way he had listened in the first week, before he knew she could read, and the house, which had been holding its breath for two days, let it out, all at once, through every window, over the pond, where the pelican stood on one leg in the dark and, for the first time in a week, put its head under its wing and slept.</w:t>
+        <w:t>That night the radio from Lisbon came back on, and she sang along to it, off-key, and the house, which had been holding its breath for two days, let it out through every window, over the pond, where the pelican put its head under its wing and slept.</w:t>
       </w:r>
     </w:p>
     <w:p>
@@ -9368,7 +10172,7 @@
     </w:p>
     <w:p>
       <w:r>
-        <w:t>Mara arrived at a quarter to midnight in a dressing gown, wellington boots and a raincoat, with her service card in one hand and a torch in the other, followed by two gendarmes from Saint-Martin who had been playing cards and had brought the cards. She looked at the pond for a long time. She looked at the pelican. She looked at Hugo.</w:t>
+        <w:t>Mara arrived at a quarter to midnight in a dressing gown, wellington boots and a raincoat, with her service card in one hand and a torch in the other, followed by two gendarmes from Saint-Martin who had been playing cards and had brought the cards. She looked at the pond for a while. She looked at the pelican. She looked at Hugo.</w:t>
       </w:r>
     </w:p>
     <w:p>
@@ -9526,26 +10330,62 @@
     </w:p>
     <w:p>
       <w:r>
-        <w:t>"Then we will not be on this side of the water," said Tobias.</w:t>
-      </w:r>
-    </w:p>
-    <w:p>
-      <w:r>
-        <w:t>Inês Vidal had been living since March in the old eel-fisher's hut half a kilometre down the outflow, where the pond narrowed into a reed channel and then gave itself up to the marsh, on land that belonged to a cousin of nobody who visited.</w:t>
-      </w:r>
-    </w:p>
-    <w:p>
-      <w:r>
-        <w:t xml:space="preserve">They rowed down the channel at dawn, with the tape in Tobias's coat and the notebook buttoned inside Catarina's cardigan, because Mara had said on the telephone, at midnight, </w:t>
+        <w:t xml:space="preserve">Tobias did not answer. He was standing at the study window in the dark, where he had stood on the night they walked the jetty, looking at the far shore, where the pond narrowed into the reeds. He was thinking of a torch that had come on there at midnight and gone off again. Of an old man at the market who had wrapped a third eel, a small one, in a single sheet of newspaper, </w:t>
       </w:r>
       <w:r>
         <w:rPr>
           <w:i/>
         </w:rPr>
-        <w:t>I know where she is, I'll meet you there, bring everything, and for God's sake don't leave it in the house</w:t>
-      </w:r>
-      <w:r>
-        <w:t>.</w:t>
+        <w:t>for the heron</w:t>
+      </w:r>
+      <w:r>
+        <w:t xml:space="preserve">, and said that the heron was careful and liked bread. Herons do not eat bread. Catarina had said it herself, at the top of the market, frightened. And Madame Fournier had said, in the car: </w:t>
+      </w:r>
+      <w:r>
+        <w:rPr>
+          <w:i/>
+        </w:rPr>
+        <w:t>the heron is being fed, and nobody is going to find the heron unless Baptistin decides it.</w:t>
+      </w:r>
+    </w:p>
+    <w:p>
+      <w:r>
+        <w:t>"Catarina," he said. "You walked the marsh three times. In the afternoons."</w:t>
+      </w:r>
+    </w:p>
+    <w:p>
+      <w:r>
+        <w:t>"Three times. Only reeds."</w:t>
+      </w:r>
+    </w:p>
+    <w:p>
+      <w:r>
+        <w:t>"In the afternoons," he said. "When anybody could see you go. From the road, from the lane, from a car parked at the top of it. She'd have seen you too. And she'd have stayed in, because she's careful, because you're being watched, and if she came out they'd have two of you." He turned round. "Baptistin's hut is on the channel. The torch I saw was on the channel. She isn't hiding from you. She's hiding from whoever's watching you. So we don't walk down the bank in daylight like people looking for somebody. We go by water, at dawn, before anybody's at the top of the lane, and we take everything with us, the tape and the notebook, because Hale has just told us he's coming back, and I'm not leaving them in a house he's walked into twice."</w:t>
+      </w:r>
+    </w:p>
+    <w:p>
+      <w:r>
+        <w:t>She had come up behind him, and she looked at him for some time across the dark study.</w:t>
+      </w:r>
+    </w:p>
+    <w:p>
+      <w:r>
+        <w:t>"You thought of this," she said, "alone?"</w:t>
+      </w:r>
+    </w:p>
+    <w:p>
+      <w:r>
+        <w:t>"I had a great deal of help from an eel," said Tobias, and picked up the telephone again, and told Mara where they would be, and when.</w:t>
+      </w:r>
+    </w:p>
+    <w:p>
+      <w:r>
+        <w:t>Inês Vidal had been living since March in the old eel-fisher's hut half a kilometre down the outflow, where the pond narrowed into a reed channel and then gave itself up to the marsh.</w:t>
+      </w:r>
+    </w:p>
+    <w:p>
+      <w:r>
+        <w:t>They rowed down the channel at dawn, with the tape in Tobias's coat and the notebook buttoned inside Catarina's cardigan.</w:t>
       </w:r>
     </w:p>
     <w:p>
@@ -9609,7 +10449,16 @@
     </w:p>
     <w:p>
       <w:r>
-        <w:t>"I rang her three days ago," Inês said, in careful English. "I did not trust the police until I met this one."</w:t>
+        <w:t xml:space="preserve">"She came ten minutes ago, along the bank, and sat on my step, and said, </w:t>
+      </w:r>
+      <w:r>
+        <w:rPr>
+          <w:i/>
+        </w:rPr>
+        <w:t>Mr Lind thinks you are here, and he is usually wrong, so I have come to prove it,</w:t>
+      </w:r>
+      <w:r>
+        <w:t>" said Inês, in careful English. "I did not trust the police until I met this one."</w:t>
       </w:r>
     </w:p>
     <w:p>
@@ -9707,7 +10556,7 @@
     </w:p>
     <w:p>
       <w:r>
-        <w:t>"It was three dead people," said Mara. "Aubry. Giraud. Marchetti. You didn't do this for a house, Mr Hale. Who was on the jetty?"</w:t>
+        <w:t>"Who was on the jetty?" said Mara.</w:t>
       </w:r>
     </w:p>
     <w:p>
@@ -9717,21 +10566,36 @@
     </w:p>
     <w:p>
       <w:r>
-        <w:t xml:space="preserve">"The tape has already said a first name," said Mara. "You said it. On the twelfth of March. </w:t>
+        <w:t>It was Tobias who answered, from the punt, with the oars across his knees, and he surprised himself, because he had not known until he opened his mouth that he was going to say anything at all.</w:t>
+      </w:r>
+    </w:p>
+    <w:p>
+      <w:r>
+        <w:t xml:space="preserve">"On the twelfth of March," he said, "you were in that study, with Elise's papers on the desk, and a man rang you and told you she wasn't to bring the pages. And when he'd hung up you said, </w:t>
       </w:r>
       <w:r>
         <w:rPr>
           <w:i/>
         </w:rPr>
-        <w:t>Edouard, she's a friend.</w:t>
-      </w:r>
-      <w:r>
-        <w:t xml:space="preserve"> You can give me the rest, or the juge can find it. The juge does not want a deal."</w:t>
-      </w:r>
-    </w:p>
-    <w:p>
-      <w:r>
-        <w:t>He gave her the rest on the second telling. Maître Edouard Delacroix-Roux, avocat, Aix. The man who had said he would be on the jetty. And then, because a cashier who has begun does not know where to stop, Armand Vial. The Fondation Vial. Marseille. The two million for the cardinal's photograph. The second box. Vial did not attend jetties, Hale said. Vial sent a lawyer, and the lawyer sent calissons.</w:t>
+        <w:t>Edouard, she's a friend. I've known her twenty years. Edouard?</w:t>
+      </w:r>
+      <w:r>
+        <w:t>" Hale's face did something terrible and small. "It's on a tape, Victor. Inês made it. Nobody answered you that night. You stood in an empty room and asked for her, and nobody answered." Tobias held his eyes. "I'm answering. That's all this is. Somebody's finally asking you back."</w:t>
+      </w:r>
+    </w:p>
+    <w:p>
+      <w:r>
+        <w:t>Hale stood quite still on the oak planks. Then he took his hands out of his pockets, as if they had become very heavy, and said the name again, the whole of it this time, to the water: Maître Edouard Delacroix-Roux, avocat, Aix. The man who had said he would be on the jetty. And then, because a cashier who has begun does not know where to stop, Armand Vial. The Fondation Vial. Marseille. The two million for the cardinal's photograph. The second box. Vial did not attend jetties, Hale said. Vial sent a lawyer, and the lawyer sent calissons.</w:t>
+      </w:r>
+    </w:p>
+    <w:p>
+      <w:r>
+        <w:t>Mara wrote it all down, and then looked across at the punt, at the man who had stayed on a jetty in September and given advice.</w:t>
+      </w:r>
+    </w:p>
+    <w:p>
+      <w:r>
+        <w:t>"I'll want that in a statement, Mr Lind," she said. "Typed. On paper. Kept somewhere dry."</w:t>
       </w:r>
     </w:p>
     <w:p>
@@ -10094,7 +10958,7 @@
     </w:p>
     <w:p>
       <w:r>
-        <w:t>"I did not know his name. I knew he knew Monsieur Hale. I knew that if I went to the police, I would be going to his police." Inês sat back. "So I stayed in the hut. For seven months. Baptistin brought me bread and eels and newspapers and did not ask anything. I worked nights at the bakery in Saint-Martin, washing the trays, for cash. Gigi found me in June. She was a stray. She does not like strangers. She makes exceptions for tins." The dog thumped her tail once under the table, hearing her name. "I watched the house. I saw the new tenant come, an Englishman with a typewriter. I saw my sister come, in September, with her bag, and get out of a taxi, and stand at the gate, and look at the jetty for a long time. I nearly ran up the lane. I nearly did, every day." Her voice cracked for the first time, very slightly, and steadied. "But I thought, if I go to her, they will know where I am, and they will know she knows. So I watched. I watched her go into the lake after his pages. I watched her peg them on a line. I watched her sit on the jetty with him at night with the binoculars, looking at birds." She glanced at Tobias, and then away. "I watched her hold his hand. Under the stars. On the night the lights went out."</w:t>
+        <w:t>"I did not know his name. I knew he knew Monsieur Hale. I knew that if I went to the police, I would be going to his police." Inês sat back. "So I stayed in the hut. For seven months. Baptistin brought me bread and eels and newspapers and did not ask anything. I worked nights at the bakery in Saint-Martin, washing the trays, for cash. Gigi found me in June. She was a stray. She does not like strangers. She makes exceptions for tins." The dog thumped her tail once under the table, hearing her name. "I watched the house. I saw the new tenant come, an Englishman with a typewriter. I saw my sister come, in September, with her bag, and get out of a taxi, and stand at the gate, and look at the jetty for some time. I nearly ran up the lane. I nearly did, every day." Her voice cracked for the first time, very slightly, and steadied. "But I thought, if I go to her, they will know where I am, and they will know she knows. So I watched. I watched her go into the lake after his pages. I watched her peg them on a line. I watched her sit on the jetty with him at night with the binoculars, looking at birds." She glanced at Tobias, and then away. "I watched her hold his hand. Under the stars. On the night the lights went out."</w:t>
       </w:r>
     </w:p>
     <w:p>
@@ -10104,7 +10968,16 @@
     </w:p>
     <w:p>
       <w:r>
-        <w:t>"I watched for a long time," said Inês. "And then one day the Inspector came to the lane, in her own car, on a Sunday, and stood by the gate, alone, and looked at the jetty for twenty minutes the way my sister looked at it. Not like a policewoman. Like somebody who was sorry." She looked at Mara. "That was in October. I found your number from the bakery's telephone book. It took me another three weeks to ring it. I am a careful woman. Careful is how I am still alive."</w:t>
+        <w:t xml:space="preserve">"I watched for a while," said Inês. "And then one day the Inspector came to the lane, in her own car, on a Sunday, and stood by the gate, alone, and looked at the jetty for twenty minutes the way my sister looked at it. Not like a policewoman. Like somebody who was sorry." She looked at Mara. "That was in October. I found your number in the bakery's telephone book, and I wrote it on the wall of the hut, with a nail, and I did not ring it. I looked at it every night. I am a careful woman. Careful is how I am still alive." She looked down the table at Tobias. "And then this morning, at dawn, you sat on my step and said, </w:t>
+      </w:r>
+      <w:r>
+        <w:rPr>
+          <w:i/>
+        </w:rPr>
+        <w:t>Mr Lind thinks you are here</w:t>
+      </w:r>
+      <w:r>
+        <w:t>. I did not know whether to be angry with him or to kiss him. I have decided to be angry. It is more Portuguese."</w:t>
       </w:r>
     </w:p>
     <w:p>
@@ -10149,7 +11022,7 @@
     </w:p>
     <w:p>
       <w:r>
-        <w:t xml:space="preserve">Then he went back up to the house and sat at the Olivetti and began, for the third time, the chapter about the night of the fourteenth of March. He did not invent anything. He did not need to. He wrote it the way Inês had said it, in order, with the umbrella and the hand on the shoulder and the handkerchief and the smile, and when he got to the part where she let go of Elise on the ladder and ran, he stopped, and sat for a long time, and then wrote only: </w:t>
+        <w:t xml:space="preserve">Then he went back up to the house and sat at the Olivetti and began, for the third time, the chapter about the night of the fourteenth of March. He did not invent anything. He did not need to. He wrote it the way Inês had said it, in order, with the umbrella and the hand on the shoulder and the handkerchief and the smile, and when he got to the part where she let go of Elise on the ladder and ran, he stopped, and sat for a good while, and then wrote only: </w:t>
       </w:r>
       <w:r>
         <w:rPr>
@@ -10553,7 +11426,7 @@
     </w:p>
     <w:p>
       <w:r>
-        <w:t>Inês did not smile. She did not say anything. She simply looked, for as long as he was there to be looked at, the way a heron looks at the water.</w:t>
+        <w:t>Inês did not smile. She said nothing. She simply looked, for as long as he was there to be looked at, the way a heron looks at the water.</w:t>
       </w:r>
     </w:p>
     <w:p>
@@ -11101,7 +11974,7 @@
         <w:t>Liaison.</w:t>
       </w:r>
       <w:r>
-        <w:t>" She paused. "He put everything else in a cardboard box. The photographs, the trophy, the cigars, the commendation. And then he stood looking at the pen for a long time. And then he picked it up, and held it out to me."</w:t>
+        <w:t>" She paused. "He put everything else in a cardboard box. The photographs, the trophy, the cigars, the commendation. And then he stood looking at the pen for some time. And then he picked it up, and held it out to me."</w:t>
       </w:r>
     </w:p>
     <w:p>
@@ -11216,7 +12089,7 @@
     </w:p>
     <w:p>
       <w:r>
-        <w:t>Tobias thought of the swimming goggles on the floor of the small grey car, among the parking tickets and the empty water bottles, on the way to Avignon. He had not asked about them. He was glad, now, that he had not.</w:t>
+        <w:t>Tobias thought of the swimming goggles on the floor of the small grey car, among the parking tickets, on the way to Avignon. He had not asked about them. He was glad, now, that he had not.</w:t>
       </w:r>
     </w:p>
     <w:p>
@@ -11658,7 +12531,7 @@
     </w:p>
     <w:p>
       <w:r>
-        <w:t>They did not say anything for a long time. Catarina's arm was through his. She had put it there at the door of the village hall without asking, and he had not mentioned it, and it had stayed.</w:t>
+        <w:t>They did not say anything for some time. Catarina's arm was through his. She had put it there at the door of the village hall without asking, and he had not mentioned it, and it had stayed.</w:t>
       </w:r>
     </w:p>
     <w:p>
@@ -11857,7 +12730,7 @@
     </w:p>
     <w:p>
       <w:r>
-        <w:t>It was not like the cheek, in November. It was not like anything. It went on for some time. Somewhere in the middle of it his nerve went back into its cupboard and shut the door and left him to it, and he discovered that he did not need it, and that a man who has been very bad at a great many things for forty-six years can be, without any practice at all, reasonably good at one.</w:t>
+        <w:t>It was not like the cheek, at this same gate, in the autumn. It was not like anything. It went on for a good while. Somewhere in the middle of it his nerve went back into its cupboard and shut the door and left him to it, and he discovered that he did not need it, and that a man who has been very bad at a great many things for forty-six years can be, without any practice at all, reasonably good at one.</w:t>
       </w:r>
     </w:p>
     <w:p>
@@ -11951,7 +12824,7 @@
     </w:p>
     <w:p>
       <w:r>
-        <w:t>Tobias stood at the gate for a long time with the corrected letter in his hand, under the three women waiting for their ship, until he could not feel his feet. Then he went in, and found the bacalhau, which she had already bought, he discovered, a week ago, and hidden at the back of the cold larder wrapped in a tea towel, and put it in a bowl of cold water, and set an alarm on the Olivetti's bell, by an arrangement of string and a clothes peg that would have impressed Hugo, for three o'clock in the morning.</w:t>
+        <w:t>Tobias stood at the gate for a while with the corrected letter in his hand, under the three women waiting for their ship, until he could not feel his feet. Then he went in, and found the bacalhau, which she had already bought, he discovered, a week ago, and hidden at the back of the cold larder wrapped in a tea towel, and put it in a bowl of cold water, and set an alarm on the Olivetti's bell, by an arrangement of string and a clothes peg that would have impressed Hugo, for three o'clock in the morning.</w:t>
       </w:r>
     </w:p>
     <w:p>
@@ -12033,7 +12906,7 @@
     </w:p>
     <w:p>
       <w:r>
-        <w:t>The judge, a large, grey, patient man who had sat in that room for twenty-two years and believed himself beyond surprise, looked at Hugo for a long moment over his glasses.</w:t>
+        <w:t>The judge, a large, grey, patient man who had sat in that room for twenty-two years and believed himself beyond surprise, looked at Hugo for a moment over his glasses.</w:t>
       </w:r>
     </w:p>
     <w:p>
@@ -12323,6 +13196,20 @@
       </w:r>
     </w:p>
     <w:p>
+      <w:r>
+        <w:t xml:space="preserve">He had done that once before, Tobias realised, on the first morning, when the court, as French courts do before they hear a single fact, had heard who the accused was. The investigator who had prepared the report on his personality, a tired woman with a ring binder, had read it out in a flat voice. Born Edouard Roux, in 1973, in the concierge's lodge of a building on the Cours Mirabeau. Mother concierge there for thirty-one years; now ninety-one, in a home on the road to Éguilles, visited every Sunday without fail, with calissons. Schooling paid for by a tenant of the building, a young avocat named Armand Vial. The name Delacroix taken at the oath, from a bâtonnier on the first floor. </w:t>
+      </w:r>
+      <w:r>
+        <w:rPr>
+          <w:i/>
+        </w:rPr>
+        <w:t>He never knew my mother's name,</w:t>
+      </w:r>
+      <w:r>
+        <w:t xml:space="preserve"> the accused had told her, of the bâtonnier, and it was the only sentence in the report she had put in quotation marks. When she read it out, Delacroix-Roux had looked down at his hands, exactly as he did now, and Tobias had thought, against his will, of a woman polishing brass for men who walked past her, and of a housekeeper nobody wonders about, and of how the same small wound can make one person very careful and another person a murderer, and how you cannot tell which from the outside.</w:t>
+      </w:r>
+    </w:p>
+    <w:p>
       <w:pPr>
         <w:spacing w:before="160" w:after="160"/>
         <w:ind w:firstLine="0"/>
@@ -12629,7 +13516,7 @@
     </w:p>
     <w:p>
       <w:r>
-        <w:t>She was quiet for a long time. Then she looked up at him with her serious dark eyes, and he saw that she was trying not to laugh.</w:t>
+        <w:t>She was quiet for a while. Then she looked up at him with her serious dark eyes, and he saw that she was trying not to laugh.</w:t>
       </w:r>
     </w:p>
     <w:p>
@@ -12752,7 +13639,7 @@
     </w:p>
     <w:p>
       <w:r>
-        <w:t xml:space="preserve">Catarina, beside him, very pink in the light of the dashboard, did not say anything. She put her hand on his knee, quite firmly, as she had put it there in a café in Lyon when a chambermaid said </w:t>
+        <w:t xml:space="preserve">Catarina, beside him, very pink in the light of the dashboard, said nothing. She put her hand on his knee, quite firmly, as she had put it there in a café in Lyon when a chambermaid said </w:t>
       </w:r>
       <w:r>
         <w:rPr>
@@ -13361,7 +14248,7 @@
     </w:p>
     <w:p>
       <w:r>
-        <w:t>When it came off, she dipped one finger in, and tasted it, and sat for a long time looking at the water.</w:t>
+        <w:t>When it came off, she dipped one finger in, and tasted it, and sat for some time looking at the water.</w:t>
       </w:r>
     </w:p>
     <w:p>
@@ -13408,7 +14295,7 @@
         <w:t>Zamenis scalaris.</w:t>
       </w:r>
       <w:r>
-        <w:t xml:space="preserve"> Completely harmless. Lives in old walls and eats mice. They're very common in Provence." He looked up at Tobias and Catarina, who were standing in the doorway in a tight formation, Catarina with the broom, Tobias with the Olivetti's dust cover held out in front of him like a shield, exactly as they had stood in October. "It's been here the whole time. Behind the false back. Nobody looked behind the false back, because you'd already found what was behind the false back. So it was the safest place in the house." He switched off the torch. "That's what a snake would think. If snakes thought. Which they don't, mostly."</w:t>
+        <w:t xml:space="preserve"> Completely harmless. Lives in old walls and eats mice. They're very common in Provence." He looked up at Tobias and Catarina, who were standing in the doorway in a tight formation, Catarina with the broom, Tobias with the Olivetti's dust cover held out in front of him like a shield, exactly as they had stood in October. "It's been here the whole time. Behind the false back. Nobody looked behind the false back, because you'd already found what was behind the false back. So it was the safest place in the house." He switched off the torch. "That's what a snake would think. If snakes thought. Which they don't, mostly." He considered the snake. "And it's exactly where I told the Gastons it was. So technically I wasn't lying. I was early."</w:t>
       </w:r>
     </w:p>
     <w:p>

</xml_diff>

<commit_message>
Merge In Love with Murder, Actually round 4 (subtree only, from book-2-lectures-after-qed e6f8577)
</commit_message>
<xml_diff>
--- a/In Love with Murder, Actually/In_Love_with_Murder_Actually.docx
+++ b/In Love with Murder, Actually/In_Love_with_Murder_Actually.docx
@@ -189,6 +189,9 @@
     </w:p>
     <w:p>
       <w:pPr>
+        <w:tabs>
+          <w:tab w:pos="5544" w:val="right" w:leader="dot"/>
+        </w:tabs>
         <w:spacing w:before="160" w:after="80"/>
         <w:ind w:firstLine="0"/>
       </w:pPr>
@@ -200,9 +203,48 @@
           <w:t xml:space="preserve">Part One: The Lake</w:t>
         </w:r>
       </w:hyperlink>
-    </w:p>
-    <w:p>
-      <w:pPr>
+      <w:r>
+        <w:rPr>
+          <w:b/>
+        </w:rPr>
+        <w:tab/>
+      </w:r>
+      <w:r>
+        <w:rPr>
+          <w:b/>
+        </w:rPr>
+        <w:fldChar w:fldCharType="begin"/>
+      </w:r>
+      <w:r>
+        <w:rPr>
+          <w:b/>
+        </w:rPr>
+        <w:instrText xml:space="preserve"> PAGEREF part_part_one \h </w:instrText>
+      </w:r>
+      <w:r>
+        <w:rPr>
+          <w:b/>
+        </w:rPr>
+        <w:fldChar w:fldCharType="separate"/>
+      </w:r>
+      <w:r>
+        <w:rPr>
+          <w:b/>
+        </w:rPr>
+        <w:t xml:space="preserve">7</w:t>
+      </w:r>
+      <w:r>
+        <w:rPr>
+          <w:b/>
+        </w:rPr>
+        <w:fldChar w:fldCharType="end"/>
+      </w:r>
+    </w:p>
+    <w:p>
+      <w:pPr>
+        <w:tabs>
+          <w:tab w:pos="5544" w:val="right" w:leader="dot"/>
+        </w:tabs>
         <w:ind w:firstLine="0" w:left="288"/>
       </w:pPr>
       <w:hyperlink w:anchor="ch_1" w:history="1">
@@ -211,9 +253,30 @@
           <w:t xml:space="preserve">Chapter 1: Leeds</w:t>
         </w:r>
       </w:hyperlink>
-    </w:p>
-    <w:p>
-      <w:pPr>
+      <w:r>
+        <w:tab/>
+      </w:r>
+      <w:r>
+        <w:fldChar w:fldCharType="begin"/>
+      </w:r>
+      <w:r>
+        <w:instrText xml:space="preserve"> PAGEREF ch_1 \h </w:instrText>
+      </w:r>
+      <w:r>
+        <w:fldChar w:fldCharType="separate"/>
+      </w:r>
+      <w:r>
+        <w:t xml:space="preserve">8</w:t>
+      </w:r>
+      <w:r>
+        <w:fldChar w:fldCharType="end"/>
+      </w:r>
+    </w:p>
+    <w:p>
+      <w:pPr>
+        <w:tabs>
+          <w:tab w:pos="5544" w:val="right" w:leader="dot"/>
+        </w:tabs>
         <w:ind w:firstLine="0" w:left="288"/>
       </w:pPr>
       <w:hyperlink w:anchor="ch_2" w:history="1">
@@ -222,9 +285,30 @@
           <w:t xml:space="preserve">Chapter 2: The Pond</w:t>
         </w:r>
       </w:hyperlink>
-    </w:p>
-    <w:p>
-      <w:pPr>
+      <w:r>
+        <w:tab/>
+      </w:r>
+      <w:r>
+        <w:fldChar w:fldCharType="begin"/>
+      </w:r>
+      <w:r>
+        <w:instrText xml:space="preserve"> PAGEREF ch_2 \h </w:instrText>
+      </w:r>
+      <w:r>
+        <w:fldChar w:fldCharType="separate"/>
+      </w:r>
+      <w:r>
+        <w:t xml:space="preserve">10</w:t>
+      </w:r>
+      <w:r>
+        <w:fldChar w:fldCharType="end"/>
+      </w:r>
+    </w:p>
+    <w:p>
+      <w:pPr>
+        <w:tabs>
+          <w:tab w:pos="5544" w:val="right" w:leader="dot"/>
+        </w:tabs>
         <w:ind w:firstLine="0" w:left="288"/>
       </w:pPr>
       <w:hyperlink w:anchor="ch_3" w:history="1">
@@ -233,9 +317,30 @@
           <w:t xml:space="preserve">Chapter 3: The Housekeeper</w:t>
         </w:r>
       </w:hyperlink>
-    </w:p>
-    <w:p>
-      <w:pPr>
+      <w:r>
+        <w:tab/>
+      </w:r>
+      <w:r>
+        <w:fldChar w:fldCharType="begin"/>
+      </w:r>
+      <w:r>
+        <w:instrText xml:space="preserve"> PAGEREF ch_3 \h </w:instrText>
+      </w:r>
+      <w:r>
+        <w:fldChar w:fldCharType="separate"/>
+      </w:r>
+      <w:r>
+        <w:t xml:space="preserve">13</w:t>
+      </w:r>
+      <w:r>
+        <w:fldChar w:fldCharType="end"/>
+      </w:r>
+    </w:p>
+    <w:p>
+      <w:pPr>
+        <w:tabs>
+          <w:tab w:pos="5544" w:val="right" w:leader="dot"/>
+        </w:tabs>
         <w:ind w:firstLine="0" w:left="288"/>
       </w:pPr>
       <w:hyperlink w:anchor="ch_4" w:history="1">
@@ -244,9 +349,30 @@
           <w:t xml:space="preserve">Chapter 4: What the Water Left</w:t>
         </w:r>
       </w:hyperlink>
-    </w:p>
-    <w:p>
-      <w:pPr>
+      <w:r>
+        <w:tab/>
+      </w:r>
+      <w:r>
+        <w:fldChar w:fldCharType="begin"/>
+      </w:r>
+      <w:r>
+        <w:instrText xml:space="preserve"> PAGEREF ch_4 \h </w:instrText>
+      </w:r>
+      <w:r>
+        <w:fldChar w:fldCharType="separate"/>
+      </w:r>
+      <w:r>
+        <w:t xml:space="preserve">16</w:t>
+      </w:r>
+      <w:r>
+        <w:fldChar w:fldCharType="end"/>
+      </w:r>
+    </w:p>
+    <w:p>
+      <w:pPr>
+        <w:tabs>
+          <w:tab w:pos="5544" w:val="right" w:leader="dot"/>
+        </w:tabs>
         <w:ind w:firstLine="0" w:left="288"/>
       </w:pPr>
       <w:hyperlink w:anchor="ch_5" w:history="1">
@@ -255,9 +381,30 @@
           <w:t xml:space="preserve">Chapter 5: The Gatepost</w:t>
         </w:r>
       </w:hyperlink>
-    </w:p>
-    <w:p>
-      <w:pPr>
+      <w:r>
+        <w:tab/>
+      </w:r>
+      <w:r>
+        <w:fldChar w:fldCharType="begin"/>
+      </w:r>
+      <w:r>
+        <w:instrText xml:space="preserve"> PAGEREF ch_5 \h </w:instrText>
+      </w:r>
+      <w:r>
+        <w:fldChar w:fldCharType="separate"/>
+      </w:r>
+      <w:r>
+        <w:t xml:space="preserve">20</w:t>
+      </w:r>
+      <w:r>
+        <w:fldChar w:fldCharType="end"/>
+      </w:r>
+    </w:p>
+    <w:p>
+      <w:pPr>
+        <w:tabs>
+          <w:tab w:pos="5544" w:val="right" w:leader="dot"/>
+        </w:tabs>
         <w:ind w:firstLine="0" w:left="288"/>
       </w:pPr>
       <w:hyperlink w:anchor="ch_6" w:history="1">
@@ -266,9 +413,30 @@
           <w:t xml:space="preserve">Chapter 6: The Machine</w:t>
         </w:r>
       </w:hyperlink>
-    </w:p>
-    <w:p>
-      <w:pPr>
+      <w:r>
+        <w:tab/>
+      </w:r>
+      <w:r>
+        <w:fldChar w:fldCharType="begin"/>
+      </w:r>
+      <w:r>
+        <w:instrText xml:space="preserve"> PAGEREF ch_6 \h </w:instrText>
+      </w:r>
+      <w:r>
+        <w:fldChar w:fldCharType="separate"/>
+      </w:r>
+      <w:r>
+        <w:t xml:space="preserve">25</w:t>
+      </w:r>
+      <w:r>
+        <w:fldChar w:fldCharType="end"/>
+      </w:r>
+    </w:p>
+    <w:p>
+      <w:pPr>
+        <w:tabs>
+          <w:tab w:pos="5544" w:val="right" w:leader="dot"/>
+        </w:tabs>
         <w:ind w:firstLine="0" w:left="288"/>
       </w:pPr>
       <w:hyperlink w:anchor="ch_7" w:history="1">
@@ -277,9 +445,30 @@
           <w:t xml:space="preserve">Chapter 7: The Night She Died</w:t>
         </w:r>
       </w:hyperlink>
-    </w:p>
-    <w:p>
-      <w:pPr>
+      <w:r>
+        <w:tab/>
+      </w:r>
+      <w:r>
+        <w:fldChar w:fldCharType="begin"/>
+      </w:r>
+      <w:r>
+        <w:instrText xml:space="preserve"> PAGEREF ch_7 \h </w:instrText>
+      </w:r>
+      <w:r>
+        <w:fldChar w:fldCharType="separate"/>
+      </w:r>
+      <w:r>
+        <w:t xml:space="preserve">29</w:t>
+      </w:r>
+      <w:r>
+        <w:fldChar w:fldCharType="end"/>
+      </w:r>
+    </w:p>
+    <w:p>
+      <w:pPr>
+        <w:tabs>
+          <w:tab w:pos="5544" w:val="right" w:leader="dot"/>
+        </w:tabs>
         <w:ind w:firstLine="0" w:left="288"/>
       </w:pPr>
       <w:hyperlink w:anchor="ch_8" w:history="1">
@@ -288,9 +477,30 @@
           <w:t xml:space="preserve">Chapter 8: Birds</w:t>
         </w:r>
       </w:hyperlink>
-    </w:p>
-    <w:p>
-      <w:pPr>
+      <w:r>
+        <w:tab/>
+      </w:r>
+      <w:r>
+        <w:fldChar w:fldCharType="begin"/>
+      </w:r>
+      <w:r>
+        <w:instrText xml:space="preserve"> PAGEREF ch_8 \h </w:instrText>
+      </w:r>
+      <w:r>
+        <w:fldChar w:fldCharType="separate"/>
+      </w:r>
+      <w:r>
+        <w:t xml:space="preserve">37</w:t>
+      </w:r>
+      <w:r>
+        <w:fldChar w:fldCharType="end"/>
+      </w:r>
+    </w:p>
+    <w:p>
+      <w:pPr>
+        <w:tabs>
+          <w:tab w:pos="5544" w:val="right" w:leader="dot"/>
+        </w:tabs>
         <w:ind w:firstLine="0" w:left="288"/>
       </w:pPr>
       <w:hyperlink w:anchor="ch_9" w:history="1">
@@ -299,9 +509,30 @@
           <w:t xml:space="preserve">Chapter 9: The Leaflet</w:t>
         </w:r>
       </w:hyperlink>
-    </w:p>
-    <w:p>
-      <w:pPr>
+      <w:r>
+        <w:tab/>
+      </w:r>
+      <w:r>
+        <w:fldChar w:fldCharType="begin"/>
+      </w:r>
+      <w:r>
+        <w:instrText xml:space="preserve"> PAGEREF ch_9 \h </w:instrText>
+      </w:r>
+      <w:r>
+        <w:fldChar w:fldCharType="separate"/>
+      </w:r>
+      <w:r>
+        <w:t xml:space="preserve">42</w:t>
+      </w:r>
+      <w:r>
+        <w:fldChar w:fldCharType="end"/>
+      </w:r>
+    </w:p>
+    <w:p>
+      <w:pPr>
+        <w:tabs>
+          <w:tab w:pos="5544" w:val="right" w:leader="dot"/>
+        </w:tabs>
         <w:ind w:firstLine="0" w:left="288"/>
       </w:pPr>
       <w:hyperlink w:anchor="ch_10" w:history="1">
@@ -310,9 +541,30 @@
           <w:t xml:space="preserve">Chapter 10: The House Next Door</w:t>
         </w:r>
       </w:hyperlink>
-    </w:p>
-    <w:p>
-      <w:pPr>
+      <w:r>
+        <w:tab/>
+      </w:r>
+      <w:r>
+        <w:fldChar w:fldCharType="begin"/>
+      </w:r>
+      <w:r>
+        <w:instrText xml:space="preserve"> PAGEREF ch_10 \h </w:instrText>
+      </w:r>
+      <w:r>
+        <w:fldChar w:fldCharType="separate"/>
+      </w:r>
+      <w:r>
+        <w:t xml:space="preserve">46</w:t>
+      </w:r>
+      <w:r>
+        <w:fldChar w:fldCharType="end"/>
+      </w:r>
+    </w:p>
+    <w:p>
+      <w:pPr>
+        <w:tabs>
+          <w:tab w:pos="5544" w:val="right" w:leader="dot"/>
+        </w:tabs>
         <w:ind w:firstLine="0" w:left="288"/>
       </w:pPr>
       <w:hyperlink w:anchor="ch_11" w:history="1">
@@ -321,9 +573,30 @@
           <w:t xml:space="preserve">Chapter 11: Três Marias</w:t>
         </w:r>
       </w:hyperlink>
-    </w:p>
-    <w:p>
-      <w:pPr>
+      <w:r>
+        <w:tab/>
+      </w:r>
+      <w:r>
+        <w:fldChar w:fldCharType="begin"/>
+      </w:r>
+      <w:r>
+        <w:instrText xml:space="preserve"> PAGEREF ch_11 \h </w:instrText>
+      </w:r>
+      <w:r>
+        <w:fldChar w:fldCharType="separate"/>
+      </w:r>
+      <w:r>
+        <w:t xml:space="preserve">51</w:t>
+      </w:r>
+      <w:r>
+        <w:fldChar w:fldCharType="end"/>
+      </w:r>
+    </w:p>
+    <w:p>
+      <w:pPr>
+        <w:tabs>
+          <w:tab w:pos="5544" w:val="right" w:leader="dot"/>
+        </w:tabs>
         <w:ind w:firstLine="0" w:left="288"/>
       </w:pPr>
       <w:hyperlink w:anchor="ch_12" w:history="1">
@@ -332,9 +605,30 @@
           <w:t xml:space="preserve">Chapter 12: Flamingos</w:t>
         </w:r>
       </w:hyperlink>
-    </w:p>
-    <w:p>
-      <w:pPr>
+      <w:r>
+        <w:tab/>
+      </w:r>
+      <w:r>
+        <w:fldChar w:fldCharType="begin"/>
+      </w:r>
+      <w:r>
+        <w:instrText xml:space="preserve"> PAGEREF ch_12 \h </w:instrText>
+      </w:r>
+      <w:r>
+        <w:fldChar w:fldCharType="separate"/>
+      </w:r>
+      <w:r>
+        <w:t xml:space="preserve">56</w:t>
+      </w:r>
+      <w:r>
+        <w:fldChar w:fldCharType="end"/>
+      </w:r>
+    </w:p>
+    <w:p>
+      <w:pPr>
+        <w:tabs>
+          <w:tab w:pos="5544" w:val="right" w:leader="dot"/>
+        </w:tabs>
         <w:ind w:firstLine="0" w:left="288"/>
       </w:pPr>
       <w:hyperlink w:anchor="ch_13" w:history="1">
@@ -343,9 +637,30 @@
           <w:t xml:space="preserve">Chapter 13: Market Day</w:t>
         </w:r>
       </w:hyperlink>
-    </w:p>
-    <w:p>
-      <w:pPr>
+      <w:r>
+        <w:tab/>
+      </w:r>
+      <w:r>
+        <w:fldChar w:fldCharType="begin"/>
+      </w:r>
+      <w:r>
+        <w:instrText xml:space="preserve"> PAGEREF ch_13 \h </w:instrText>
+      </w:r>
+      <w:r>
+        <w:fldChar w:fldCharType="separate"/>
+      </w:r>
+      <w:r>
+        <w:t xml:space="preserve">60</w:t>
+      </w:r>
+      <w:r>
+        <w:fldChar w:fldCharType="end"/>
+      </w:r>
+    </w:p>
+    <w:p>
+      <w:pPr>
+        <w:tabs>
+          <w:tab w:pos="5544" w:val="right" w:leader="dot"/>
+        </w:tabs>
         <w:ind w:firstLine="0" w:left="288"/>
       </w:pPr>
       <w:hyperlink w:anchor="ch_14" w:history="1">
@@ -354,9 +669,30 @@
           <w:t xml:space="preserve">Chapter 14: The Mountain</w:t>
         </w:r>
       </w:hyperlink>
-    </w:p>
-    <w:p>
-      <w:pPr>
+      <w:r>
+        <w:tab/>
+      </w:r>
+      <w:r>
+        <w:fldChar w:fldCharType="begin"/>
+      </w:r>
+      <w:r>
+        <w:instrText xml:space="preserve"> PAGEREF ch_14 \h </w:instrText>
+      </w:r>
+      <w:r>
+        <w:fldChar w:fldCharType="separate"/>
+      </w:r>
+      <w:r>
+        <w:t xml:space="preserve">67</w:t>
+      </w:r>
+      <w:r>
+        <w:fldChar w:fldCharType="end"/>
+      </w:r>
+    </w:p>
+    <w:p>
+      <w:pPr>
+        <w:tabs>
+          <w:tab w:pos="5544" w:val="right" w:leader="dot"/>
+        </w:tabs>
         <w:ind w:firstLine="0" w:left="288"/>
       </w:pPr>
       <w:hyperlink w:anchor="ch_15" w:history="1">
@@ -365,9 +701,30 @@
           <w:t xml:space="preserve">Chapter 15: The Visitor</w:t>
         </w:r>
       </w:hyperlink>
-    </w:p>
-    <w:p>
-      <w:pPr>
+      <w:r>
+        <w:tab/>
+      </w:r>
+      <w:r>
+        <w:fldChar w:fldCharType="begin"/>
+      </w:r>
+      <w:r>
+        <w:instrText xml:space="preserve"> PAGEREF ch_15 \h </w:instrText>
+      </w:r>
+      <w:r>
+        <w:fldChar w:fldCharType="separate"/>
+      </w:r>
+      <w:r>
+        <w:t xml:space="preserve">71</w:t>
+      </w:r>
+      <w:r>
+        <w:fldChar w:fldCharType="end"/>
+      </w:r>
+    </w:p>
+    <w:p>
+      <w:pPr>
+        <w:tabs>
+          <w:tab w:pos="5544" w:val="right" w:leader="dot"/>
+        </w:tabs>
         <w:spacing w:before="160" w:after="80"/>
         <w:ind w:firstLine="0"/>
       </w:pPr>
@@ -379,9 +736,48 @@
           <w:t xml:space="preserve">Part Two: The Paper Trail</w:t>
         </w:r>
       </w:hyperlink>
-    </w:p>
-    <w:p>
-      <w:pPr>
+      <w:r>
+        <w:rPr>
+          <w:b/>
+        </w:rPr>
+        <w:tab/>
+      </w:r>
+      <w:r>
+        <w:rPr>
+          <w:b/>
+        </w:rPr>
+        <w:fldChar w:fldCharType="begin"/>
+      </w:r>
+      <w:r>
+        <w:rPr>
+          <w:b/>
+        </w:rPr>
+        <w:instrText xml:space="preserve"> PAGEREF part_part_two \h </w:instrText>
+      </w:r>
+      <w:r>
+        <w:rPr>
+          <w:b/>
+        </w:rPr>
+        <w:fldChar w:fldCharType="separate"/>
+      </w:r>
+      <w:r>
+        <w:rPr>
+          <w:b/>
+        </w:rPr>
+        <w:t xml:space="preserve">77</w:t>
+      </w:r>
+      <w:r>
+        <w:rPr>
+          <w:b/>
+        </w:rPr>
+        <w:fldChar w:fldCharType="end"/>
+      </w:r>
+    </w:p>
+    <w:p>
+      <w:pPr>
+        <w:tabs>
+          <w:tab w:pos="5544" w:val="right" w:leader="dot"/>
+        </w:tabs>
         <w:ind w:firstLine="0" w:left="288"/>
       </w:pPr>
       <w:hyperlink w:anchor="ch_16" w:history="1">
@@ -390,9 +786,30 @@
           <w:t xml:space="preserve">Chapter 16: The Contract</w:t>
         </w:r>
       </w:hyperlink>
-    </w:p>
-    <w:p>
-      <w:pPr>
+      <w:r>
+        <w:tab/>
+      </w:r>
+      <w:r>
+        <w:fldChar w:fldCharType="begin"/>
+      </w:r>
+      <w:r>
+        <w:instrText xml:space="preserve"> PAGEREF ch_16 \h </w:instrText>
+      </w:r>
+      <w:r>
+        <w:fldChar w:fldCharType="separate"/>
+      </w:r>
+      <w:r>
+        <w:t xml:space="preserve">78</w:t>
+      </w:r>
+      <w:r>
+        <w:fldChar w:fldCharType="end"/>
+      </w:r>
+    </w:p>
+    <w:p>
+      <w:pPr>
+        <w:tabs>
+          <w:tab w:pos="5544" w:val="right" w:leader="dot"/>
+        </w:tabs>
         <w:ind w:firstLine="0" w:left="288"/>
       </w:pPr>
       <w:hyperlink w:anchor="ch_17" w:history="1">
@@ -401,9 +818,30 @@
           <w:t xml:space="preserve">Chapter 17: Highly Commended</w:t>
         </w:r>
       </w:hyperlink>
-    </w:p>
-    <w:p>
-      <w:pPr>
+      <w:r>
+        <w:tab/>
+      </w:r>
+      <w:r>
+        <w:fldChar w:fldCharType="begin"/>
+      </w:r>
+      <w:r>
+        <w:instrText xml:space="preserve"> PAGEREF ch_17 \h </w:instrText>
+      </w:r>
+      <w:r>
+        <w:fldChar w:fldCharType="separate"/>
+      </w:r>
+      <w:r>
+        <w:t xml:space="preserve">89</w:t>
+      </w:r>
+      <w:r>
+        <w:fldChar w:fldCharType="end"/>
+      </w:r>
+    </w:p>
+    <w:p>
+      <w:pPr>
+        <w:tabs>
+          <w:tab w:pos="5544" w:val="right" w:leader="dot"/>
+        </w:tabs>
         <w:ind w:firstLine="0" w:left="288"/>
       </w:pPr>
       <w:hyperlink w:anchor="ch_18" w:history="1">
@@ -412,9 +850,30 @@
           <w:t xml:space="preserve">Chapter 18: The Voice</w:t>
         </w:r>
       </w:hyperlink>
-    </w:p>
-    <w:p>
-      <w:pPr>
+      <w:r>
+        <w:tab/>
+      </w:r>
+      <w:r>
+        <w:fldChar w:fldCharType="begin"/>
+      </w:r>
+      <w:r>
+        <w:instrText xml:space="preserve"> PAGEREF ch_18 \h </w:instrText>
+      </w:r>
+      <w:r>
+        <w:fldChar w:fldCharType="separate"/>
+      </w:r>
+      <w:r>
+        <w:t xml:space="preserve">100</w:t>
+      </w:r>
+      <w:r>
+        <w:fldChar w:fldCharType="end"/>
+      </w:r>
+    </w:p>
+    <w:p>
+      <w:pPr>
+        <w:tabs>
+          <w:tab w:pos="5544" w:val="right" w:leader="dot"/>
+        </w:tabs>
         <w:ind w:firstLine="0" w:left="288"/>
       </w:pPr>
       <w:hyperlink w:anchor="ch_19" w:history="1">
@@ -423,9 +882,30 @@
           <w:t xml:space="preserve">Chapter 19: The Rent</w:t>
         </w:r>
       </w:hyperlink>
-    </w:p>
-    <w:p>
-      <w:pPr>
+      <w:r>
+        <w:tab/>
+      </w:r>
+      <w:r>
+        <w:fldChar w:fldCharType="begin"/>
+      </w:r>
+      <w:r>
+        <w:instrText xml:space="preserve"> PAGEREF ch_19 \h </w:instrText>
+      </w:r>
+      <w:r>
+        <w:fldChar w:fldCharType="separate"/>
+      </w:r>
+      <w:r>
+        <w:t xml:space="preserve">111</w:t>
+      </w:r>
+      <w:r>
+        <w:fldChar w:fldCharType="end"/>
+      </w:r>
+    </w:p>
+    <w:p>
+      <w:pPr>
+        <w:tabs>
+          <w:tab w:pos="5544" w:val="right" w:leader="dot"/>
+        </w:tabs>
         <w:ind w:firstLine="0" w:left="288"/>
       </w:pPr>
       <w:hyperlink w:anchor="ch_20" w:history="1">
@@ -434,9 +914,30 @@
           <w:t xml:space="preserve">Chapter 20: The Balcony</w:t>
         </w:r>
       </w:hyperlink>
-    </w:p>
-    <w:p>
-      <w:pPr>
+      <w:r>
+        <w:tab/>
+      </w:r>
+      <w:r>
+        <w:fldChar w:fldCharType="begin"/>
+      </w:r>
+      <w:r>
+        <w:instrText xml:space="preserve"> PAGEREF ch_20 \h </w:instrText>
+      </w:r>
+      <w:r>
+        <w:fldChar w:fldCharType="separate"/>
+      </w:r>
+      <w:r>
+        <w:t xml:space="preserve">122</w:t>
+      </w:r>
+      <w:r>
+        <w:fldChar w:fldCharType="end"/>
+      </w:r>
+    </w:p>
+    <w:p>
+      <w:pPr>
+        <w:tabs>
+          <w:tab w:pos="5544" w:val="right" w:leader="dot"/>
+        </w:tabs>
         <w:ind w:firstLine="0" w:left="288"/>
       </w:pPr>
       <w:hyperlink w:anchor="ch_21" w:history="1">
@@ -445,9 +946,30 @@
           <w:t xml:space="preserve">Chapter 21: The Bridge</w:t>
         </w:r>
       </w:hyperlink>
-    </w:p>
-    <w:p>
-      <w:pPr>
+      <w:r>
+        <w:tab/>
+      </w:r>
+      <w:r>
+        <w:fldChar w:fldCharType="begin"/>
+      </w:r>
+      <w:r>
+        <w:instrText xml:space="preserve"> PAGEREF ch_21 \h </w:instrText>
+      </w:r>
+      <w:r>
+        <w:fldChar w:fldCharType="separate"/>
+      </w:r>
+      <w:r>
+        <w:t xml:space="preserve">133</w:t>
+      </w:r>
+      <w:r>
+        <w:fldChar w:fldCharType="end"/>
+      </w:r>
+    </w:p>
+    <w:p>
+      <w:pPr>
+        <w:tabs>
+          <w:tab w:pos="5544" w:val="right" w:leader="dot"/>
+        </w:tabs>
         <w:ind w:firstLine="0" w:left="288"/>
       </w:pPr>
       <w:hyperlink w:anchor="ch_22" w:history="1">
@@ -456,9 +978,30 @@
           <w:t xml:space="preserve">Chapter 22: The Photograph</w:t>
         </w:r>
       </w:hyperlink>
-    </w:p>
-    <w:p>
-      <w:pPr>
+      <w:r>
+        <w:tab/>
+      </w:r>
+      <w:r>
+        <w:fldChar w:fldCharType="begin"/>
+      </w:r>
+      <w:r>
+        <w:instrText xml:space="preserve"> PAGEREF ch_22 \h </w:instrText>
+      </w:r>
+      <w:r>
+        <w:fldChar w:fldCharType="separate"/>
+      </w:r>
+      <w:r>
+        <w:t xml:space="preserve">144</w:t>
+      </w:r>
+      <w:r>
+        <w:fldChar w:fldCharType="end"/>
+      </w:r>
+    </w:p>
+    <w:p>
+      <w:pPr>
+        <w:tabs>
+          <w:tab w:pos="5544" w:val="right" w:leader="dot"/>
+        </w:tabs>
         <w:ind w:firstLine="0" w:left="288"/>
       </w:pPr>
       <w:hyperlink w:anchor="ch_23" w:history="1">
@@ -467,9 +1010,30 @@
           <w:t xml:space="preserve">Chapter 23: The Cup</w:t>
         </w:r>
       </w:hyperlink>
-    </w:p>
-    <w:p>
-      <w:pPr>
+      <w:r>
+        <w:tab/>
+      </w:r>
+      <w:r>
+        <w:fldChar w:fldCharType="begin"/>
+      </w:r>
+      <w:r>
+        <w:instrText xml:space="preserve"> PAGEREF ch_23 \h </w:instrText>
+      </w:r>
+      <w:r>
+        <w:fldChar w:fldCharType="separate"/>
+      </w:r>
+      <w:r>
+        <w:t xml:space="preserve">149</w:t>
+      </w:r>
+      <w:r>
+        <w:fldChar w:fldCharType="end"/>
+      </w:r>
+    </w:p>
+    <w:p>
+      <w:pPr>
+        <w:tabs>
+          <w:tab w:pos="5544" w:val="right" w:leader="dot"/>
+        </w:tabs>
         <w:ind w:firstLine="0" w:left="288"/>
       </w:pPr>
       <w:hyperlink w:anchor="ch_24" w:history="1">
@@ -478,9 +1042,30 @@
           <w:t xml:space="preserve">Chapter 24: The Road to Aix</w:t>
         </w:r>
       </w:hyperlink>
-    </w:p>
-    <w:p>
-      <w:pPr>
+      <w:r>
+        <w:tab/>
+      </w:r>
+      <w:r>
+        <w:fldChar w:fldCharType="begin"/>
+      </w:r>
+      <w:r>
+        <w:instrText xml:space="preserve"> PAGEREF ch_24 \h </w:instrText>
+      </w:r>
+      <w:r>
+        <w:fldChar w:fldCharType="separate"/>
+      </w:r>
+      <w:r>
+        <w:t xml:space="preserve">152</w:t>
+      </w:r>
+      <w:r>
+        <w:fldChar w:fldCharType="end"/>
+      </w:r>
+    </w:p>
+    <w:p>
+      <w:pPr>
+        <w:tabs>
+          <w:tab w:pos="5544" w:val="right" w:leader="dot"/>
+        </w:tabs>
         <w:ind w:firstLine="0" w:left="288"/>
       </w:pPr>
       <w:hyperlink w:anchor="ch_25" w:history="1">
@@ -489,9 +1074,30 @@
           <w:t xml:space="preserve">Chapter 25: The Key</w:t>
         </w:r>
       </w:hyperlink>
-    </w:p>
-    <w:p>
-      <w:pPr>
+      <w:r>
+        <w:tab/>
+      </w:r>
+      <w:r>
+        <w:fldChar w:fldCharType="begin"/>
+      </w:r>
+      <w:r>
+        <w:instrText xml:space="preserve"> PAGEREF ch_25 \h </w:instrText>
+      </w:r>
+      <w:r>
+        <w:fldChar w:fldCharType="separate"/>
+      </w:r>
+      <w:r>
+        <w:t xml:space="preserve">159</w:t>
+      </w:r>
+      <w:r>
+        <w:fldChar w:fldCharType="end"/>
+      </w:r>
+    </w:p>
+    <w:p>
+      <w:pPr>
+        <w:tabs>
+          <w:tab w:pos="5544" w:val="right" w:leader="dot"/>
+        </w:tabs>
         <w:ind w:firstLine="0" w:left="288"/>
       </w:pPr>
       <w:hyperlink w:anchor="ch_26" w:history="1">
@@ -500,9 +1106,30 @@
           <w:t xml:space="preserve">Chapter 26: Drip</w:t>
         </w:r>
       </w:hyperlink>
-    </w:p>
-    <w:p>
-      <w:pPr>
+      <w:r>
+        <w:tab/>
+      </w:r>
+      <w:r>
+        <w:fldChar w:fldCharType="begin"/>
+      </w:r>
+      <w:r>
+        <w:instrText xml:space="preserve"> PAGEREF ch_26 \h </w:instrText>
+      </w:r>
+      <w:r>
+        <w:fldChar w:fldCharType="separate"/>
+      </w:r>
+      <w:r>
+        <w:t xml:space="preserve">165</w:t>
+      </w:r>
+      <w:r>
+        <w:fldChar w:fldCharType="end"/>
+      </w:r>
+    </w:p>
+    <w:p>
+      <w:pPr>
+        <w:tabs>
+          <w:tab w:pos="5544" w:val="right" w:leader="dot"/>
+        </w:tabs>
         <w:ind w:firstLine="0" w:left="288"/>
       </w:pPr>
       <w:hyperlink w:anchor="ch_27" w:history="1">
@@ -511,9 +1138,30 @@
           <w:t xml:space="preserve">Chapter 27: Not Only Paper</w:t>
         </w:r>
       </w:hyperlink>
-    </w:p>
-    <w:p>
-      <w:pPr>
+      <w:r>
+        <w:tab/>
+      </w:r>
+      <w:r>
+        <w:fldChar w:fldCharType="begin"/>
+      </w:r>
+      <w:r>
+        <w:instrText xml:space="preserve"> PAGEREF ch_27 \h </w:instrText>
+      </w:r>
+      <w:r>
+        <w:fldChar w:fldCharType="separate"/>
+      </w:r>
+      <w:r>
+        <w:t xml:space="preserve">174</w:t>
+      </w:r>
+      <w:r>
+        <w:fldChar w:fldCharType="end"/>
+      </w:r>
+    </w:p>
+    <w:p>
+      <w:pPr>
+        <w:tabs>
+          <w:tab w:pos="5544" w:val="right" w:leader="dot"/>
+        </w:tabs>
         <w:spacing w:before="160" w:after="80"/>
         <w:ind w:firstLine="0"/>
       </w:pPr>
@@ -525,9 +1173,48 @@
           <w:t xml:space="preserve">Part Three: The Water</w:t>
         </w:r>
       </w:hyperlink>
-    </w:p>
-    <w:p>
-      <w:pPr>
+      <w:r>
+        <w:rPr>
+          <w:b/>
+        </w:rPr>
+        <w:tab/>
+      </w:r>
+      <w:r>
+        <w:rPr>
+          <w:b/>
+        </w:rPr>
+        <w:fldChar w:fldCharType="begin"/>
+      </w:r>
+      <w:r>
+        <w:rPr>
+          <w:b/>
+        </w:rPr>
+        <w:instrText xml:space="preserve"> PAGEREF part_part_three \h </w:instrText>
+      </w:r>
+      <w:r>
+        <w:rPr>
+          <w:b/>
+        </w:rPr>
+        <w:fldChar w:fldCharType="separate"/>
+      </w:r>
+      <w:r>
+        <w:rPr>
+          <w:b/>
+        </w:rPr>
+        <w:t xml:space="preserve">185</w:t>
+      </w:r>
+      <w:r>
+        <w:rPr>
+          <w:b/>
+        </w:rPr>
+        <w:fldChar w:fldCharType="end"/>
+      </w:r>
+    </w:p>
+    <w:p>
+      <w:pPr>
+        <w:tabs>
+          <w:tab w:pos="5544" w:val="right" w:leader="dot"/>
+        </w:tabs>
         <w:ind w:firstLine="0" w:left="288"/>
       </w:pPr>
       <w:hyperlink w:anchor="ch_28" w:history="1">
@@ -536,9 +1223,30 @@
           <w:t xml:space="preserve">Chapter 28: The Two Gastons</w:t>
         </w:r>
       </w:hyperlink>
-    </w:p>
-    <w:p>
-      <w:pPr>
+      <w:r>
+        <w:tab/>
+      </w:r>
+      <w:r>
+        <w:fldChar w:fldCharType="begin"/>
+      </w:r>
+      <w:r>
+        <w:instrText xml:space="preserve"> PAGEREF ch_28 \h </w:instrText>
+      </w:r>
+      <w:r>
+        <w:fldChar w:fldCharType="separate"/>
+      </w:r>
+      <w:r>
+        <w:t xml:space="preserve">186</w:t>
+      </w:r>
+      <w:r>
+        <w:fldChar w:fldCharType="end"/>
+      </w:r>
+    </w:p>
+    <w:p>
+      <w:pPr>
+        <w:tabs>
+          <w:tab w:pos="5544" w:val="right" w:leader="dot"/>
+        </w:tabs>
         <w:ind w:firstLine="0" w:left="288"/>
       </w:pPr>
       <w:hyperlink w:anchor="ch_29" w:history="1">
@@ -547,9 +1255,30 @@
           <w:t xml:space="preserve">Chapter 29: The Far Shore</w:t>
         </w:r>
       </w:hyperlink>
-    </w:p>
-    <w:p>
-      <w:pPr>
+      <w:r>
+        <w:tab/>
+      </w:r>
+      <w:r>
+        <w:fldChar w:fldCharType="begin"/>
+      </w:r>
+      <w:r>
+        <w:instrText xml:space="preserve"> PAGEREF ch_29 \h </w:instrText>
+      </w:r>
+      <w:r>
+        <w:fldChar w:fldCharType="separate"/>
+      </w:r>
+      <w:r>
+        <w:t xml:space="preserve">194</w:t>
+      </w:r>
+      <w:r>
+        <w:fldChar w:fldCharType="end"/>
+      </w:r>
+    </w:p>
+    <w:p>
+      <w:pPr>
+        <w:tabs>
+          <w:tab w:pos="5544" w:val="right" w:leader="dot"/>
+        </w:tabs>
         <w:ind w:firstLine="0" w:left="288"/>
       </w:pPr>
       <w:hyperlink w:anchor="ch_30" w:history="1">
@@ -558,9 +1287,30 @@
           <w:t xml:space="preserve">Chapter 30: What Inês Saw</w:t>
         </w:r>
       </w:hyperlink>
-    </w:p>
-    <w:p>
-      <w:pPr>
+      <w:r>
+        <w:tab/>
+      </w:r>
+      <w:r>
+        <w:fldChar w:fldCharType="begin"/>
+      </w:r>
+      <w:r>
+        <w:instrText xml:space="preserve"> PAGEREF ch_30 \h </w:instrText>
+      </w:r>
+      <w:r>
+        <w:fldChar w:fldCharType="separate"/>
+      </w:r>
+      <w:r>
+        <w:t xml:space="preserve">202</w:t>
+      </w:r>
+      <w:r>
+        <w:fldChar w:fldCharType="end"/>
+      </w:r>
+    </w:p>
+    <w:p>
+      <w:pPr>
+        <w:tabs>
+          <w:tab w:pos="5544" w:val="right" w:leader="dot"/>
+        </w:tabs>
         <w:ind w:firstLine="0" w:left="288"/>
       </w:pPr>
       <w:hyperlink w:anchor="ch_31" w:history="1">
@@ -569,9 +1319,30 @@
           <w:t xml:space="preserve">Chapter 31: Edouard</w:t>
         </w:r>
       </w:hyperlink>
-    </w:p>
-    <w:p>
-      <w:pPr>
+      <w:r>
+        <w:tab/>
+      </w:r>
+      <w:r>
+        <w:fldChar w:fldCharType="begin"/>
+      </w:r>
+      <w:r>
+        <w:instrText xml:space="preserve"> PAGEREF ch_31 \h </w:instrText>
+      </w:r>
+      <w:r>
+        <w:fldChar w:fldCharType="separate"/>
+      </w:r>
+      <w:r>
+        <w:t xml:space="preserve">214</w:t>
+      </w:r>
+      <w:r>
+        <w:fldChar w:fldCharType="end"/>
+      </w:r>
+    </w:p>
+    <w:p>
+      <w:pPr>
+        <w:tabs>
+          <w:tab w:pos="5544" w:val="right" w:leader="dot"/>
+        </w:tabs>
         <w:ind w:firstLine="0" w:left="288"/>
       </w:pPr>
       <w:hyperlink w:anchor="ch_32" w:history="1">
@@ -580,9 +1351,30 @@
           <w:t xml:space="preserve">Chapter 32: The Second Box</w:t>
         </w:r>
       </w:hyperlink>
-    </w:p>
-    <w:p>
-      <w:pPr>
+      <w:r>
+        <w:tab/>
+      </w:r>
+      <w:r>
+        <w:fldChar w:fldCharType="begin"/>
+      </w:r>
+      <w:r>
+        <w:instrText xml:space="preserve"> PAGEREF ch_32 \h </w:instrText>
+      </w:r>
+      <w:r>
+        <w:fldChar w:fldCharType="separate"/>
+      </w:r>
+      <w:r>
+        <w:t xml:space="preserve">220</w:t>
+      </w:r>
+      <w:r>
+        <w:fldChar w:fldCharType="end"/>
+      </w:r>
+    </w:p>
+    <w:p>
+      <w:pPr>
+        <w:tabs>
+          <w:tab w:pos="5544" w:val="right" w:leader="dot"/>
+        </w:tabs>
         <w:ind w:firstLine="0" w:left="288"/>
       </w:pPr>
       <w:hyperlink w:anchor="ch_33" w:history="1">
@@ -591,9 +1383,30 @@
           <w:t xml:space="preserve">Chapter 33: The Commandant</w:t>
         </w:r>
       </w:hyperlink>
-    </w:p>
-    <w:p>
-      <w:pPr>
+      <w:r>
+        <w:tab/>
+      </w:r>
+      <w:r>
+        <w:fldChar w:fldCharType="begin"/>
+      </w:r>
+      <w:r>
+        <w:instrText xml:space="preserve"> PAGEREF ch_33 \h </w:instrText>
+      </w:r>
+      <w:r>
+        <w:fldChar w:fldCharType="separate"/>
+      </w:r>
+      <w:r>
+        <w:t xml:space="preserve">231</w:t>
+      </w:r>
+      <w:r>
+        <w:fldChar w:fldCharType="end"/>
+      </w:r>
+    </w:p>
+    <w:p>
+      <w:pPr>
+        <w:tabs>
+          <w:tab w:pos="5544" w:val="right" w:leader="dot"/>
+        </w:tabs>
         <w:ind w:firstLine="0" w:left="288"/>
       </w:pPr>
       <w:hyperlink w:anchor="ch_34" w:history="1">
@@ -602,9 +1415,30 @@
           <w:t xml:space="preserve">Chapter 34: Dick Whittington</w:t>
         </w:r>
       </w:hyperlink>
-    </w:p>
-    <w:p>
-      <w:pPr>
+      <w:r>
+        <w:tab/>
+      </w:r>
+      <w:r>
+        <w:fldChar w:fldCharType="begin"/>
+      </w:r>
+      <w:r>
+        <w:instrText xml:space="preserve"> PAGEREF ch_34 \h </w:instrText>
+      </w:r>
+      <w:r>
+        <w:fldChar w:fldCharType="separate"/>
+      </w:r>
+      <w:r>
+        <w:t xml:space="preserve">241</w:t>
+      </w:r>
+      <w:r>
+        <w:fldChar w:fldCharType="end"/>
+      </w:r>
+    </w:p>
+    <w:p>
+      <w:pPr>
+        <w:tabs>
+          <w:tab w:pos="5544" w:val="right" w:leader="dot"/>
+        </w:tabs>
         <w:ind w:firstLine="0" w:left="288"/>
       </w:pPr>
       <w:hyperlink w:anchor="ch_35" w:history="1">
@@ -613,9 +1447,30 @@
           <w:t xml:space="preserve">Chapter 35: The Trial</w:t>
         </w:r>
       </w:hyperlink>
-    </w:p>
-    <w:p>
-      <w:pPr>
+      <w:r>
+        <w:tab/>
+      </w:r>
+      <w:r>
+        <w:fldChar w:fldCharType="begin"/>
+      </w:r>
+      <w:r>
+        <w:instrText xml:space="preserve"> PAGEREF ch_35 \h </w:instrText>
+      </w:r>
+      <w:r>
+        <w:fldChar w:fldCharType="separate"/>
+      </w:r>
+      <w:r>
+        <w:t xml:space="preserve">253</w:t>
+      </w:r>
+      <w:r>
+        <w:fldChar w:fldCharType="end"/>
+      </w:r>
+    </w:p>
+    <w:p>
+      <w:pPr>
+        <w:tabs>
+          <w:tab w:pos="5544" w:val="right" w:leader="dot"/>
+        </w:tabs>
         <w:ind w:firstLine="0" w:left="288"/>
       </w:pPr>
       <w:hyperlink w:anchor="ch_36" w:history="1">
@@ -624,9 +1479,30 @@
           <w:t xml:space="preserve">Chapter 36: The Courthouse Steps</w:t>
         </w:r>
       </w:hyperlink>
-    </w:p>
-    <w:p>
-      <w:pPr>
+      <w:r>
+        <w:tab/>
+      </w:r>
+      <w:r>
+        <w:fldChar w:fldCharType="begin"/>
+      </w:r>
+      <w:r>
+        <w:instrText xml:space="preserve"> PAGEREF ch_36 \h </w:instrText>
+      </w:r>
+      <w:r>
+        <w:fldChar w:fldCharType="separate"/>
+      </w:r>
+      <w:r>
+        <w:t xml:space="preserve">267</w:t>
+      </w:r>
+      <w:r>
+        <w:fldChar w:fldCharType="end"/>
+      </w:r>
+    </w:p>
+    <w:p>
+      <w:pPr>
+        <w:tabs>
+          <w:tab w:pos="5544" w:val="right" w:leader="dot"/>
+        </w:tabs>
         <w:ind w:firstLine="0" w:left="288"/>
       </w:pPr>
       <w:hyperlink w:anchor="ch_37" w:history="1">
@@ -635,9 +1511,30 @@
           <w:t xml:space="preserve">Chapter 37: Margaret and Geoffrey</w:t>
         </w:r>
       </w:hyperlink>
-    </w:p>
-    <w:p>
-      <w:pPr>
+      <w:r>
+        <w:tab/>
+      </w:r>
+      <w:r>
+        <w:fldChar w:fldCharType="begin"/>
+      </w:r>
+      <w:r>
+        <w:instrText xml:space="preserve"> PAGEREF ch_37 \h </w:instrText>
+      </w:r>
+      <w:r>
+        <w:fldChar w:fldCharType="separate"/>
+      </w:r>
+      <w:r>
+        <w:t xml:space="preserve">273</w:t>
+      </w:r>
+      <w:r>
+        <w:fldChar w:fldCharType="end"/>
+      </w:r>
+    </w:p>
+    <w:p>
+      <w:pPr>
+        <w:tabs>
+          <w:tab w:pos="5544" w:val="right" w:leader="dot"/>
+        </w:tabs>
         <w:ind w:firstLine="0" w:left="288"/>
       </w:pPr>
       <w:hyperlink w:anchor="epilogue" w:history="1">
@@ -646,10 +1543,23 @@
           <w:t xml:space="preserve">Epilogue: The Jetty</w:t>
         </w:r>
       </w:hyperlink>
-    </w:p>
-    <w:p>
-      <w:r>
-        <w:br w:type="page"/>
+      <w:r>
+        <w:tab/>
+      </w:r>
+      <w:r>
+        <w:fldChar w:fldCharType="begin"/>
+      </w:r>
+      <w:r>
+        <w:instrText xml:space="preserve"> PAGEREF epilogue \h </w:instrText>
+      </w:r>
+      <w:r>
+        <w:fldChar w:fldCharType="separate"/>
+      </w:r>
+      <w:r>
+        <w:t xml:space="preserve">279</w:t>
+      </w:r>
+      <w:r>
+        <w:fldChar w:fldCharType="end"/>
       </w:r>
     </w:p>
     <w:p>
@@ -1880,7 +2790,7 @@
     </w:p>
     <w:p>
       <w:r>
-        <w:t>Later, after she had gone up, he sat for a long time in the study with the lamp on, at the window, looking down at the end of the jetty, which he could not see, which was only a darker line on dark water. At midnight he saw a torch come on, briefly, on the far shore, where the pond narrowed into the reeds and became the marsh, and go off again. He watched for a long time. It did not come back. He told himself it was an eel-fisher, or a poacher, or a man looking for his dog.</w:t>
+        <w:t>Later, after she had gone up, he sat for some time in the study with the lamp on, at the window, looking down at the end of the jetty, which he could not see, which was only a darker line on dark water. At midnight he saw a torch come on, briefly, on the far shore, where the pond narrowed into the reeds and became the marsh, and go off again. He watched for a while. It did not come back. He told himself it was an eel-fisher, or a poacher, or a man looking for his dog.</w:t>
       </w:r>
     </w:p>
     <w:p>
@@ -2791,7 +3701,7 @@
     </w:p>
     <w:p>
       <w:r>
-        <w:t>She laughed, softly, and held out her hand, palm up, on the blanket between them. He looked at it for a long moment. Then he put his own over it, and she closed her fingers, and they lay there on the cold planks under ten thousand stars, not speaking, holding hands like two people carrying something very fragile across a very long room.</w:t>
+        <w:t>She laughed, softly, and held out her hand, palm up, on the blanket between them. He looked at it for a moment. Then he put his own over it, and she closed her fingers, and they lay there on the cold planks under ten thousand stars, not speaking, holding hands like two people carrying something very fragile across a very long room.</w:t>
       </w:r>
     </w:p>
     <w:p>
@@ -2925,7 +3835,7 @@
     </w:p>
     <w:p>
       <w:r>
-        <w:t>Catarina got out and stood with her hand over her mouth. She did not say anything for a long time.</w:t>
+        <w:t>Catarina got out and stood with her hand over her mouth. She did not say anything for a while.</w:t>
       </w:r>
     </w:p>
     <w:p>
@@ -3205,7 +4115,7 @@
         <w:ind w:firstLine="0"/>
       </w:pPr>
       <w:r>
-        <w:t>Catarina did not say anything all the way back up the market. She walked very straight, with the parcel of eels held against her chest beside the yellow and green dish, and her face perfectly blank and polite, and Tobias walked beside her and did not say anything either, and Madame Fournier walked behind them both with her string bags and her thyme tree and looked, for once, at neither of them.</w:t>
+        <w:t>Catarina said nothing all the way back up the market. She walked very straight, with the parcel of eels held against her chest beside the yellow and green dish, and her face perfectly blank and polite, and Tobias walked beside her and did not say anything either, and Madame Fournier walked behind them both with her string bags and her thyme tree and looked, for once, at neither of them.</w:t>
       </w:r>
     </w:p>
     <w:p>
@@ -3282,7 +4192,7 @@
         <w:ind w:firstLine="0"/>
       </w:pPr>
       <w:r>
-        <w:t>They drove home with the windows open and the market in string bags on the back seat, and Madame Fournier drove the Renault 4 like a tractor through a field that had insulted her, and did not say anything until they were back in the valley, at the top of the lane, with the lake below them, flat and grey under a sky that was making up its mind.</w:t>
+        <w:t>They drove home with the windows open and the market in string bags on the back seat, and Madame Fournier drove the Renault 4 like a tractor through a field that had insulted her, and said nothing until they were back in the valley, at the top of the lane, with the lake below them, flat and grey under a sky that was making up its mind.</w:t>
       </w:r>
     </w:p>
     <w:p>
@@ -3307,7 +4217,7 @@
     </w:p>
     <w:p>
       <w:r>
-        <w:t>The third eel, the small one, in its single sheet of newspaper, she put in the cold larder, on a shelf by itself. In the morning, it was still there. She looked at it for a long time, and then she put it back.</w:t>
+        <w:t>The third eel, the small one, in its single sheet of newspaper, she put in the cold larder, on a shelf by itself. In the morning, it was still there. She looked at it for some time, and then she put it back.</w:t>
       </w:r>
     </w:p>
     <w:p>
@@ -3754,12 +4664,12 @@
     </w:p>
     <w:p>
       <w:r>
-        <w:t>The courier was a young man on a motorbike who had never been up the lane before and did not intend to come up it again. Tobias signed a screen with his finger. The signature came out as a small, despairing wave. The courier looked at it, looked at Tobias, decided that it was close enough for the south of France, and left.</w:t>
-      </w:r>
-    </w:p>
-    <w:p>
-      <w:r>
-        <w:t>The envelope was thick and cream and smelled faintly of a very good office. Inside was a letter, two copies of a contract bound with a black clip, and a fountain pen. The pen was the worst part. A contract tells you what a man wants. A fountain pen tells you he has already imagined you signing it.</w:t>
+        <w:t>The courier was a young man on a motorbike who had never been up the lane before and did not intend to come up it again. Tobias signed a screen with his finger, and the signature came out as a small, despairing wave.</w:t>
+      </w:r>
+    </w:p>
+    <w:p>
+      <w:r>
+        <w:t>Inside the thick cream envelope was a letter, two copies of a contract bound with a black clip, and a fountain pen. The pen was the worst part. A contract tells you what a man wants. A fountain pen tells you he has already imagined you signing it.</w:t>
       </w:r>
     </w:p>
     <w:p>
@@ -3884,6 +4794,31 @@
     </w:p>
     <w:p>
       <w:r>
+        <w:t xml:space="preserve">He read the list again, slowly, and stopped where she had stopped, one word further on. </w:t>
+      </w:r>
+      <w:r>
+        <w:rPr>
+          <w:i/>
+        </w:rPr>
+        <w:t>Recordings.</w:t>
+      </w:r>
+    </w:p>
+    <w:p>
+      <w:r>
+        <w:t xml:space="preserve">"Recordings," he said. "I've never recorded anything in my life. I type. Hale knows I type; he's been sending me jokes about the Olivetti for ten years. A publisher who wants my typescript asks for my typescript. A publisher who asks for </w:t>
+      </w:r>
+      <w:r>
+        <w:rPr>
+          <w:i/>
+        </w:rPr>
+        <w:t>recordings</w:t>
+      </w:r>
+      <w:r>
+        <w:t>, whether or not in my possession, thinks there's a tape. And he thinks it's somewhere I might find it." He looked up at the ceiling, towards the study. "He's not buying a book. He's buying whatever Elise left in this house."</w:t>
+      </w:r>
+    </w:p>
+    <w:p>
+      <w:r>
         <w:t>She looked at him. She looked at the clause. She looked, with great deliberation, at the window seat in the study above them, which they could not see from the stair, and which they both saw.</w:t>
       </w:r>
     </w:p>
@@ -4004,7 +4939,7 @@
     </w:p>
     <w:p>
       <w:r>
-        <w:t>The three of them looked at it for some time. Out in the garden the pelican, who had come over the wall in the hope of bread, made a noise like a door that needs oil.</w:t>
+        <w:t>The three of them looked at it for some time.</w:t>
       </w:r>
     </w:p>
     <w:p>
@@ -4047,17 +4982,7 @@
     </w:p>
     <w:p>
       <w:r>
-        <w:t>"Don't sign it," she said, when he had finished.</w:t>
-      </w:r>
-    </w:p>
-    <w:p>
-      <w:r>
-        <w:t>"I wasn't going to."</w:t>
-      </w:r>
-    </w:p>
-    <w:p>
-      <w:r>
-        <w:t xml:space="preserve">"Don't refuse it either." There was a pause on the line, and a sound that might have been a pen being tapped against teeth. "A man who sends you a contract like that is telling you what he's afraid of. If you say no, he'll find another way to be afraid. If you say </w:t>
+        <w:t xml:space="preserve">"I'm not going to sign it," he said, when he had finished. "And I'm not going to refuse it. If I say no, he'll find another way to get into the house. If I say </w:t>
       </w:r>
       <w:r>
         <w:rPr>
@@ -4066,17 +4991,17 @@
         <w:t>maybe</w:t>
       </w:r>
       <w:r>
-        <w:t>, he'll wait. Waiting men make mistakes. They ring people. They get in their cars."</w:t>
-      </w:r>
-    </w:p>
-    <w:p>
-      <w:r>
-        <w:t>"You want me to string along a man who may have killed three people."</w:t>
-      </w:r>
-    </w:p>
-    <w:p>
-      <w:r>
-        <w:t>"I want you to write him a letter," said Mara. "You're a writer. Write him a long, grateful, slightly vain letter in which you say you are honoured and that you have one or two small queries about the royalty on audio, and that you'll need a few weeks to put the typescript in order, because the water damage was so very bad. Make it boring. Make it the most boring letter a publisher has ever received. Nothing makes a crook feel safer than an author asking about audio."</w:t>
+        <w:t>, he'll wait. So I'm going to write him a long, grateful, slightly vain letter, with one or two small queries about the royalty on audio, and say I need a few weeks to put the typescript in order, because the water damage was so very bad. The most boring letter a publisher has ever received. And while he waits, I'm going to find whatever he thinks is in this house before he does."</w:t>
+      </w:r>
+    </w:p>
+    <w:p>
+      <w:r>
+        <w:t>There was a pause on the line, and a sound that might have been a pen being tapped against teeth.</w:t>
+      </w:r>
+    </w:p>
+    <w:p>
+      <w:r>
+        <w:t>"That," said Mara, "is exactly what I was going to tell you to do, and I resent it. Nothing makes a crook feel safer than an author asking about audio. Waiting men make mistakes. They ring people. They get in their cars."</w:t>
       </w:r>
     </w:p>
     <w:p>
@@ -4128,7 +5053,7 @@
         <w:t>I can't tell you what this means</w:t>
       </w:r>
       <w:r>
-        <w:t xml:space="preserve"> three times and crossed it out twice. He asked about the audio royalty. He asked, in a postscript, whether Hale Books would consider a different cover from the last one, which had made his detective look like a man selling double glazing. He thought this was a convincing touch. He had wanted to ask it for years.</w:t>
+        <w:t xml:space="preserve"> three times and crossed it out twice. He asked about the audio royalty. He asked, in a postscript, whether Hale Books would consider a different cover from the last one, which had made his detective look like a man selling double glazing. He had wanted to ask it for years.</w:t>
       </w:r>
     </w:p>
     <w:p>
@@ -4276,11 +5201,6 @@
     </w:p>
     <w:p>
       <w:r>
-        <w:t>It was a stupid thing to have said aloud. He knew that before he had finished saying it. He heard it go into the kitchen and settle there, like smoke from a pan.</w:t>
-      </w:r>
-    </w:p>
-    <w:p>
-      <w:r>
         <w:t>Catarina did not say anything. She stood beside him for another moment, very still. Then she went back to the stove, and moved the soup to the front again, and stirred it for a long time, much longer than it needed. When she spoke, it was to the pot.</w:t>
       </w:r>
     </w:p>
@@ -4331,7 +5251,7 @@
     </w:p>
     <w:p>
       <w:r>
-        <w:t>On the hall table, the boring letter to Victor Hale waited for the post. In the biscuit tin next door, under a photograph of Lucien on one leg, a contract that wanted everything waited for nothing at all. And in the study the Olivetti, which had typed forty thousand pounds' worth of nothing that week, stood in the last of the light with a clean sheet in the roller, as if it had something to say and was too well brought up to start.</w:t>
+        <w:t>On the hall table, the boring letter to Victor Hale waited for the post. Next door, under a photograph of Lucien on one leg, a contract that wanted everything waited for nothing at all.</w:t>
       </w:r>
     </w:p>
     <w:p>
@@ -4991,7 +5911,7 @@
     </w:p>
     <w:p>
       <w:r>
-        <w:t>Neither of them changed their minds. They sat opposite each other in a carriage that smelled of warm plastic and oranges, with the folder on the table between them and a paper bag of calissons left over from the Sunday, and watched Provence go past the window in long dry strokes: pines, limestone, a vineyard, a village on a hill like a pile of bread, a man on a tractor who raised one hand to the train as if it were an old friend who never stopped.</w:t>
+        <w:t>Neither of them changed their minds. They sat opposite each other in a carriage that smelled of warm plastic and oranges, with the folder on the table between them and a paper bag of calissons left over from the Sunday, and watched Provence go past in long dry strokes: pines, limestone, a village on a hill like a pile of bread.</w:t>
       </w:r>
     </w:p>
     <w:p>
@@ -5041,7 +5961,7 @@
     </w:p>
     <w:p>
       <w:r>
-        <w:t xml:space="preserve">"Is why the machine was stupid and I was not." She smiled at the window. "Every day for seven years I read handwriting worse than your typewriter. A boy called Rui made his letter </w:t>
+        <w:t xml:space="preserve">"Is why the machine was stupid and I was not." She smiled at the window. "A boy called Rui made his letter </w:t>
       </w:r>
       <w:r>
         <w:rPr>
@@ -5070,32 +5990,7 @@
     </w:p>
     <w:p>
       <w:r>
-        <w:t>He found that he had nothing to say to that, which was becoming a pattern on trains, and also that he was ashamed, which was not new but was at least honest. He reached across the table and took the last calisson, and broke it carefully in two, and gave her the bigger half.</w:t>
-      </w:r>
-    </w:p>
-    <w:p>
-      <w:r>
-        <w:t>"What were you before?" he said.</w:t>
-      </w:r>
-    </w:p>
-    <w:p>
-      <w:r>
-        <w:t>She took the half. She held it for a moment.</w:t>
-      </w:r>
-    </w:p>
-    <w:p>
-      <w:r>
-        <w:t>"Later," she said. "When we are not going to meet a criminal. It is a long story, and it has no murders in it, and you will be bored."</w:t>
-      </w:r>
-    </w:p>
-    <w:p>
-      <w:r>
-        <w:t>"I won't be bored."</w:t>
-      </w:r>
-    </w:p>
-    <w:p>
-      <w:r>
-        <w:t>"No," she agreed, and ate the calisson. "You will not."</w:t>
+        <w:t>He found that he had nothing to say to that, and that he was ashamed. He reached across the table and took the last calisson, and broke it carefully in two, and gave her the bigger half.</w:t>
       </w:r>
     </w:p>
     <w:p>
@@ -5113,7 +6008,7 @@
         <w:ind w:firstLine="0"/>
       </w:pPr>
       <w:r>
-        <w:t>Marseille arrived all at once, the way it does, at the top of the great white staircase of the Gare Saint-Charles, with the whole city tipped out below them to the sea: roofs, cranes, a thousand washing lines, the gold Virgin on her hill above the old port, and beyond everything a flat bright light that was not quite blue and not quite silver and that Tobias, who was from Leeds, could only describe as expensive.</w:t>
+        <w:t>Marseille arrived all at once, the way it does, at the top of the great white staircase of the Gare Saint-Charles, with the whole city tipped out below them to the sea: roofs, cranes, the gold Virgin on her hill above the old port, and a flat bright light that was not quite blue and not quite silver and that Tobias, who was from Leeds, could only describe as expensive.</w:t>
       </w:r>
     </w:p>
     <w:p>
@@ -5123,7 +6018,7 @@
     </w:p>
     <w:p>
       <w:r>
-        <w:t xml:space="preserve">The address on the contract was a street off the Canebière, near the market at Noailles, and they walked there down through streets that smelled in turn of cumin, fish, coffee, mint, diesel and something frying that Catarina insisted on stopping for and that turned out to be panisse, chickpea fritters, sold hot in a paper cone by a man who called her </w:t>
+        <w:t xml:space="preserve">The address on the contract was a street off the Canebière, near the market at Noailles, and they walked there through streets that smelled in turn of cumin, fish, coffee and diesel, stopping once for panisse, chickpea fritters in a paper cone, sold by a man who called her </w:t>
       </w:r>
       <w:r>
         <w:rPr>
@@ -5214,7 +6109,7 @@
         <w:ind w:firstLine="0"/>
       </w:pPr>
       <w:r>
-        <w:t xml:space="preserve">The office of the Verrane Foundation Award for Unpublished Fiction was a single room on the third floor, at the back, with a window onto a light well full of pigeons. It contained a desk, two chairs, a filing cabinet, a kettle, an ashtray in the shape of the Vieux-Port, eleven grey postal sacks, and a telephone switchboard of a type Tobias had last seen in a film about the Second World War, wired to a cassette deck on which a tape was going round and round. From the tape, very softly, came the murmur of a hundred velvet voices saying </w:t>
+        <w:t xml:space="preserve">The office of the Verrane Foundation Award for Unpublished Fiction was a single room on the third floor, at the back, with a window onto a light well full of pigeons. It contained a desk, two chairs, a kettle, an ashtray in the shape of the Vieux-Port, eleven grey postal sacks, and an old switchboard wired to a cassette deck on which a tape was going round and round. From the tape, very softly, came the murmur of a hundred velvet voices saying </w:t>
       </w:r>
       <w:r>
         <w:rPr>
@@ -5228,7 +6123,7 @@
     </w:p>
     <w:p>
       <w:r>
-        <w:t>There were no other people. There had never been any other people. The hundred voices were all the same voice, recorded on a cassette and played behind the telephone like the sea in a shell, and the voice belonged to the man with the white hair, who stood in the middle of the room with his back to the pigeons and his hands spread in front of him, as if he were about to be shot, or applauded.</w:t>
+        <w:t>There were no other people. There had never been any other people. The hundred voices were all the same voice, recorded on a cassette and played behind the telephone like the sea in a shell, and the voice belonged to the man with the white hair, who stood with his back to the pigeons and his hands spread in front of him, as if he were about to be shot, or applauded.</w:t>
       </w:r>
     </w:p>
     <w:p>
@@ -5258,12 +6153,7 @@
     </w:p>
     <w:p>
       <w:r>
-        <w:t>"The gull," he said, when he could. "The gull who is the keeper. And the lighthouse, his mother. Mon Dieu. I read it. I read it to my wife. She cried. She cried laughing, monsieur. Thirty years I am married, I never see her cry like this, not even at the funeral of her brother, who was a very funny man." He wiped his eyes. "Everybody who comes in, I read the first page. It is my only pleasure. Most are sad. Some are good. Yours, monsieur, is the worst thing I have ever read in my life, and I have been in a television series about a fisherman for eleven years."</w:t>
-      </w:r>
-    </w:p>
-    <w:p>
-      <w:r>
-        <w:t>"Thank you," said Tobias, who did not know what else to say.</w:t>
+        <w:t>"The gull," he said, when he could. "The gull who is the keeper. And the lighthouse, his mother. Mon Dieu. I read it. I read it to my wife. She cried. She cried laughing, monsieur." He wiped his eyes. "I read the first page of every one. Yours, monsieur, is the worst thing I have ever read in my life, and I have been in a television series about a fisherman for eleven years."</w:t>
       </w:r>
     </w:p>
     <w:p>
@@ -5277,7 +6167,7 @@
         <w:t>Highly Commended.</w:t>
       </w:r>
       <w:r>
-        <w:t xml:space="preserve"> The same letter. Every one. I print it in the morning, five hundred at a time." He gestured at the postal sacks, which, Tobias now saw, were not empty. They were full. They were full of envelopes, brown and white and manila, thousands of them, with stamps from everywhere, opened and stuffed back in. "Everyone is Highly Commended. Every one. Nine years."</w:t>
+        <w:t xml:space="preserve"> The same letter. Every one. I print it in the morning, five hundred at a time." He gestured at the postal sacks, which, Tobias now saw, were full of envelopes, thousands of them, with stamps from everywhere, opened and stuffed back in. "Everyone is Highly Commended. Every one. Nine years."</w:t>
       </w:r>
     </w:p>
     <w:p>
@@ -5313,12 +6203,12 @@
     </w:p>
     <w:p>
       <w:r>
-        <w:t>Raymond Coste looked at him for a long moment. Then he looked at the sacks.</w:t>
-      </w:r>
-    </w:p>
-    <w:p>
-      <w:r>
-        <w:t xml:space="preserve">"Monsieur," he said, "I am an actor. For forty years I tell lies on a stage and people pay me. This is the same. Only, there is no stage." He shrugged, and the shrug, unlike Catarina's, contained nothing at all. "I tell myself that. Every day I tell myself that. Then I read the letters. A woman in Australia writes, thank you, my husband is dead, I wrote this for him, now I know it is good. A man in Scotland, eighty-one, his first story. I put them in the sack. I write </w:t>
+        <w:t>Raymond Coste looked at him for a moment. Then he looked at the sacks.</w:t>
+      </w:r>
+    </w:p>
+    <w:p>
+      <w:r>
+        <w:t xml:space="preserve">"Monsieur," he said, "I am an actor. For forty years I tell lies on a stage and people pay me. This is the same. Only, there is no stage. I tell myself that. Then I read the letters. A woman in Australia writes, thank you, my husband is dead, I wrote this for him, now I know it is good. A man in Scotland, eighty-one, his first story. I put them in the sack. I write </w:t>
       </w:r>
       <w:r>
         <w:rPr>
@@ -5327,7 +6217,7 @@
         <w:t>Highly Commended</w:t>
       </w:r>
       <w:r>
-        <w:t>." He picked up a letter from the top of the nearest sack and held it out to Tobias without looking at it. "And in February a woman comes up those stairs. A woman with short hair and red glasses, very thin, very angry, very English. Not a writer. An editor. She stands where you are standing. She reads a letter from a sack, like you are going to do now. She does not shout. She cries, monsieur. Only a little. Then she asks me my name. She writes it in a little book. She says, Monsieur Coste, you are not the one I want, but you will have to tell the truth about the ones I want, when it is time. And I say yes. I say yes to her."</w:t>
+        <w:t>." He picked up a letter from the top of the nearest sack and held it out to Tobias without looking at it. "And in February a woman comes up those stairs. A woman with short hair and red glasses, very thin, very angry, very English. Not a writer. An editor. She reads a letter from a sack. She does not shout. She cries, monsieur. Only a little. Then she asks me my name. She writes it in a little book. She says, Monsieur Coste, you are not the one I want, but you will have to tell the truth about the ones I want, when it is time. And I say yes. I say yes to her."</w:t>
       </w:r>
     </w:p>
     <w:p>
@@ -5343,11 +6233,6 @@
     <w:p>
       <w:r>
         <w:t>"Someone did," said Catarina.</w:t>
-      </w:r>
-    </w:p>
-    <w:p>
-      <w:r>
-        <w:t>Raymond turned to look at her, and something in her face made him sit up a little straighter, the way the boy with the chalk had perhaps once sat up when she said good morning.</w:t>
       </w:r>
     </w:p>
     <w:p>
@@ -5376,17 +6261,12 @@
     </w:p>
     <w:p>
       <w:r>
-        <w:t>There was a silence in the little room. A pigeon landed on the windowsill outside and looked in at them with one orange eye, and decided it wanted nothing to do with any of it, and left.</w:t>
-      </w:r>
-    </w:p>
-    <w:p>
-      <w:r>
         <w:t>"Monsieur Coste," said Tobias slowly. "If somebody asked you, properly, a magistrate, in a courtroom, with a policewoman who does not like her commandant, would you say what you've just said to us?"</w:t>
       </w:r>
     </w:p>
     <w:p>
       <w:r>
-        <w:t>Raymond Coste looked at the sacks for a long time. He looked at the tape going round. He looked at the ashtray in the shape of the old port, and at his own large hands.</w:t>
+        <w:t>Raymond Coste looked at the sacks, and the tape going round, and his own large hands.</w:t>
       </w:r>
     </w:p>
     <w:p>
@@ -5455,7 +6335,7 @@
         <w:ind w:firstLine="0"/>
       </w:pPr>
       <w:r>
-        <w:t>They had time before the train. They walked down to the old port because Catarina wanted to see the sea, and because neither of them wanted to sit in a station with a carrier bag that seemed to have become heavier on the stairs. The fish market was over for the day. Gulls were cleaning up after it with the thoroughness of an accountant. Along the quay the restaurants were setting out their tables for the evening, and outside one of them, which had starched cloths and brass lamps and a blue lobster painted on its sign, Catarina stopped to read the menu.</w:t>
+        <w:t>They had time before the train. They walked down to the old port because Catarina wanted to see the sea, and because neither of them wanted to sit in a station with a carrier bag that seemed to have become heavier on the stairs. Along the quay the restaurants were setting out their tables for the evening, and outside one of them, which had starched cloths and brass lamps and a blue lobster painted on its sign, Catarina stopped to read the menu.</w:t>
       </w:r>
     </w:p>
     <w:p>
@@ -5480,7 +6360,7 @@
     </w:p>
     <w:p>
       <w:r>
-        <w:t>They went back up the great staircase to the station as the light turned gold over the roofs. The train was full of students and a family with a dog in a bag. Tobias and Catarina found two seats side by side, not opposite, which had not happened before, and sat in them with the carrier bag on Tobias's knees and the folder that said NOT ONLY PAPER on Catarina's, and somewhere after Gardanne, in the soft, rocking, orange dark, Catarina fell asleep against his shoulder.</w:t>
+        <w:t>They went back up the great staircase to the station as the light turned gold over the roofs. They found two seats side by side, not opposite, which had not happened before, and sat in them with the carrier bag on Tobias's knees and the folder that said NOT ONLY PAPER on Catarina's, and somewhere after Gardanne, in the soft, rocking, orange dark, Catarina fell asleep against his shoulder.</w:t>
       </w:r>
     </w:p>
     <w:p>
@@ -5563,12 +6443,12 @@
     </w:p>
     <w:p>
       <w:r>
-        <w:t>There were fifty-one of them. They lived in the bottom drawer of the dresser, under the drawer that contained the administrative history of the valley, in a neat brick held together with a rubber band that had lost its elasticity some time during the presidency of Jacques Chirac. She took them out on the Friday morning and laid them on the kitchen table, one after another, as if she were dealing a very slow hand of cards.</w:t>
-      </w:r>
-    </w:p>
-    <w:p>
-      <w:r>
-        <w:t>"Henri," she said, "wrote everything down. He said a man who does not write down his money is a man who is waiting to be surprised by it." She opened the most recent book and turned it round so that Tobias could see. "I did not like Henri's money. I liked Henri. But I have kept the books."</w:t>
+        <w:t>There were fifty-one of them. They lived in the bottom drawer of the dresser, under the drawer that contained the administrative history of the valley, in a neat brick held together with a rubber band that had lost its elasticity some time during the presidency of Jacques Chirac. She laid them on the kitchen table on the Friday morning like a very slow hand of cards.</w:t>
+      </w:r>
+    </w:p>
+    <w:p>
+      <w:r>
+        <w:t>"Henri wrote everything down," she said. She opened the most recent book and turned it round so that Tobias could see. "I did not like Henri's money. I liked Henri. But I have kept the books."</w:t>
       </w:r>
     </w:p>
     <w:p>
@@ -5592,7 +6472,7 @@
     </w:p>
     <w:p>
       <w:r>
-        <w:t xml:space="preserve">She turned back. And back. Through the books. 2024, 2022, 2020. The pages went past like a flicker book of a life: the price of a new boiler, the vet for a dog called Pompon, a funeral, </w:t>
+        <w:t xml:space="preserve">She turned back. And back. Through the books. 2024, 2022, 2020. The pages went past like a flicker book of a life: a new boiler, the vet for a dog called Pompon, </w:t>
       </w:r>
       <w:r>
         <w:rPr>
@@ -5601,7 +6481,7 @@
         <w:t>Henri, fleurs</w:t>
       </w:r>
       <w:r>
-        <w:t>, in the same small hand, though it could not have been Henri writing it. In the book for 2017 she stopped.</w:t>
+        <w:t>. In the book for 2017 she stopped.</w:t>
       </w:r>
     </w:p>
     <w:p>
@@ -5691,7 +6571,7 @@
     </w:p>
     <w:p>
       <w:r>
-        <w:t xml:space="preserve">The visitors' book lived on the hall table of the lake house, under the telephone that listened. It was bound in green cloth and had been bought by Hale, because it had a small gold label on the front that said </w:t>
+        <w:t xml:space="preserve">The visitors' book lived on the hall table of the lake house, under the telephone that listened. It was bound in green cloth, with a small gold label that said </w:t>
       </w:r>
       <w:r>
         <w:rPr>
@@ -5700,7 +6580,7 @@
         <w:t>The Lake House</w:t>
       </w:r>
       <w:r>
-        <w:t xml:space="preserve"> in a font that wanted very much to be from an older and grander century. Tobias had signed it on his first night, in the euphoria of a man who has just left his wife and believes that a lake will help. He had not looked at it since. Nobody looks at visitors' books. That is their purpose.</w:t>
+        <w:t xml:space="preserve"> in a font that wanted very much to be from a grander century. Tobias had signed it on his first night and not looked at it since. Nobody looks at visitors' books. That is their purpose.</w:t>
       </w:r>
     </w:p>
     <w:p>
@@ -5760,12 +6640,12 @@
     </w:p>
     <w:p>
       <w:r>
-        <w:t>He sat and looked at it for a long time. Nobody said anything. Madame Fournier poured him a cup of coffee he did not drink. Catarina put her hand flat on the table next to the book, not touching it, not touching him, the way she had laid her hand on the window seat on the day she had said her sister's name.</w:t>
-      </w:r>
-    </w:p>
-    <w:p>
-      <w:r>
-        <w:t>"She stayed here," said Tobias at last. "I knew she'd rented it. It was in the paper. I never asked from whom." He did not know what he had imagined. An agency, perhaps; a stranger; a cottage found online by a tired woman who wanted a fortnight by the water. He had not imagined her paying Victor Hale, of all people, three thousand euros a month to sleep under a roof he did not own, so that she could watch him, and signing his green book with a joke about a heron.</w:t>
+        <w:t>He sat and looked at it for some time. Catarina put her hand flat on the table next to the book, not touching it, not touching him, the way she had laid her hand on the window seat on the day she had said her sister's name.</w:t>
+      </w:r>
+    </w:p>
+    <w:p>
+      <w:r>
+        <w:t>"She stayed here," said Tobias at last. "I knew she'd rented it. It was in the paper. I never asked from whom." He had never imagined her paying Victor Hale, of all people, three thousand euros a month to sleep under a roof he did not own, so that she could watch him, and signing his green book with a joke about a heron.</w:t>
       </w:r>
     </w:p>
     <w:p>
@@ -5834,7 +6714,7 @@
     </w:p>
     <w:p>
       <w:r>
-        <w:t>The Belgian schoolmaster had paid three thousand two hundred, because October was "peak season for writers", the listing had said. He had found this charming at the time. He found it less charming now. He said so in a long, beautiful, furious paragraph of French that made Madame Fournier nod slowly throughout, as at a sermon with which she was in complete agreement.</w:t>
+        <w:t>The Belgian schoolmaster had paid three thousand two hundred, because October was "peak season for writers", the listing had said. He said what he thought of that in a long, beautiful, furious paragraph of French that made Madame Fournier nod slowly throughout, as at a sermon with which she was in complete agreement.</w:t>
       </w:r>
     </w:p>
     <w:p>
@@ -5849,7 +6729,7 @@
     </w:p>
     <w:p>
       <w:r>
-        <w:t>Catarina read that one twice and then went out into the garden and stood by the wall for a while with her back to the house. Tobias did not follow her. He was learning which silences were doors and which were walls, and this one, he thought, was a door that she would open herself when she was ready, and it would be rude to knock.</w:t>
+        <w:t>Catarina read that one twice and then went out into the garden and stood by the wall for a while with her back to the house. Tobias did not follow her. He was learning which silences were doors and which were walls.</w:t>
       </w:r>
     </w:p>
     <w:p>
@@ -5869,16 +6749,7 @@
     </w:p>
     <w:p>
       <w:r>
-        <w:t xml:space="preserve">It came to a little over two hundred thousand euros. For a house that was not Victor Hale's, on a lake that was not his, let to people who believed it was his because he had bought a green visitors' book with a gold label and written </w:t>
-      </w:r>
-      <w:r>
-        <w:rPr>
-          <w:i/>
-        </w:rPr>
-        <w:t>The Lake House</w:t>
-      </w:r>
-      <w:r>
-        <w:t xml:space="preserve"> on it in a font from a better century.</w:t>
+        <w:t>It came to a little over two hundred thousand euros. For a house that was not Victor Hale's, let to people who believed it was because he had bought a green book with a gold label.</w:t>
       </w:r>
     </w:p>
     <w:p>
@@ -5916,7 +6787,7 @@
     </w:p>
     <w:p>
       <w:r>
-        <w:t>She sat at the table and read the exercise books, the lease, the visitors' book and the pencilled sum, in that order, without saying anything. Then she read them again in a different order, which Tobias understood to be a professional habit, the way Catarina read his pages twice, the second time looking for what was not there.</w:t>
+        <w:t>She sat at the table and read the exercise books, the lease, the visitors' book and the pencilled sum, in that order, without saying anything. Then she read them again in a different order, looking for what was not there.</w:t>
       </w:r>
     </w:p>
     <w:p>
@@ -6033,7 +6904,7 @@
     </w:p>
     <w:p>
       <w:r>
-        <w:t>Neither of them spoke for a while. It was very cold for the first time that autumn, and the stars were out, the same crowd of them that had been out on the night of the power cut, and somewhere over the pond the three stars in a line hung low above the reeds, waiting for their ship.</w:t>
+        <w:t>Neither of them spoke for a while. It was very cold for the first time that autumn, and over the pond the three stars in a line hung low above the reeds, waiting for their ship.</w:t>
       </w:r>
     </w:p>
     <w:p>
@@ -6043,7 +6914,7 @@
     </w:p>
     <w:p>
       <w:r>
-        <w:t>Catarina stopped beside him. She did not say anything for a moment.</w:t>
+        <w:t>Catarina stopped beside him. She said nothing for a moment.</w:t>
       </w:r>
     </w:p>
     <w:p>
@@ -6073,12 +6944,7 @@
     </w:p>
     <w:p>
       <w:r>
-        <w:t>Then she opened the gate, and went up the gravel to the house, and did not look back, and Tobias stood at the gate for a long time afterwards, under the three stars, with his hand on his cheek like a man who has been told a secret and does not want to drop it.</w:t>
-      </w:r>
-    </w:p>
-    <w:p>
-      <w:r>
-        <w:t>On the pond, the pelican shifted its weight from one leg to the other, and turned its great head away toward the reeds, with what Tobias would later swear was tact.</w:t>
+        <w:t>Then she opened the gate, and went up the gravel to the house, and did not look back, and Tobias stood at the gate for a good while afterwards, under the three stars, with his hand on his cheek like a man who has been told a secret and does not want to drop it.</w:t>
       </w:r>
     </w:p>
     <w:p>
@@ -6097,7 +6963,7 @@
         <w:ind w:firstLine="0"/>
       </w:pPr>
       <w:r>
-        <w:t>Pascal Aubry had fallen from the fourth floor of a hotel on the quai of the Saône, in Lyon, on the night of the eleventh of April, at some time between half past ten and midnight. Nobody had seen it. A man walking a dog along the river had found him at a quarter past twelve on the cobbles below, beside a bench, with his reading glasses still in his breast pocket and not broken. The police had spent eight days on it. The report said that Monsieur Aubry, an auditor, fifty-four, unmarried, had been drinking in the hotel bar, had gone up to his room, had stepped out onto his balcony to smoke, and had leaned on a railing that was old and had given way.</w:t>
+        <w:t>Pascal Aubry had fallen from the fourth floor of a hotel on the quai of the Saône, in Lyon, on the night of the eleventh of April, at some time between half past ten and midnight. A man walking a dog had found him at a quarter past twelve on the cobbles below, with his reading glasses unbroken in his breast pocket. The police had spent eight days on it. The report said that Monsieur Aubry, an auditor, fifty-four, unmarried, had been drinking in the hotel bar, had gone up to his room, had stepped out onto his balcony to smoke, and had leaned on a railing that was old and had given way.</w:t>
       </w:r>
     </w:p>
     <w:p>
@@ -6163,12 +7029,12 @@
         <w:ind w:firstLine="0"/>
       </w:pPr>
       <w:r>
-        <w:t>The chambermaid was called Dona Graça and she was from Vila Nova de Gaia, three streets from the school where Catarina had taught, and had known Catarina's mother, and had been at Catarina's First Communion, and had brought a cake to it that was still discussed. This had been established by two telephone calls to Fernanda in Porto, a telephone call from Fernanda to a woman who ran a café in Lyon's seventh arrondissement, and a telephone call from the café back to Catarina, all in the space of a single afternoon, which Tobias, who had spent four weeks failing to reach a person at his bank in Leeds, regarded as something close to witchcraft.</w:t>
-      </w:r>
-    </w:p>
-    <w:p>
-      <w:r>
-        <w:t>"Is not witchcraft," said Catarina. "Is Portugal. Everybody has a cousin. Everybody in France who cleans a room or builds a wall or cooks a soup has a cousin in Gaia. If you want to know what happens in a hotel, monsieur, you do not ask the manager. You ask the woman who changes the sheets. She knows everything. She knows who sleeps in which bed. She knows who sleeps in two."</w:t>
+        <w:t>The chambermaid was called Dona Graça and she was from Vila Nova de Gaia, three streets from the school where Catarina had taught, and had known Catarina's mother, and had been at Catarina's First Communion, and had brought a cake to it that was still discussed. This had been established by three telephone calls between Porto and a café in Lyon in a single afternoon, which Tobias, who had spent four weeks failing to reach a person at his bank in Leeds, regarded as witchcraft.</w:t>
+      </w:r>
+    </w:p>
+    <w:p>
+      <w:r>
+        <w:t>"Is not witchcraft," said Catarina. "Is Portugal. Everybody has a cousin. If you want to know what happens in a hotel, you do not ask the manager. You ask the woman who changes the sheets. She knows who sleeps in which bed. She knows who sleeps in two."</w:t>
       </w:r>
     </w:p>
     <w:p>
@@ -6182,27 +7048,7 @@
         <w:t>O Cantinho</w:t>
       </w:r>
       <w:r>
-        <w:t xml:space="preserve"> and had a picture of Our Lady of Fátima beside a picture of the Lyon football team over the coffee machine, as if they were jointly responsible for miracles. She was small and round and sixty, with forearms like a baker's and a gold cross at her throat, and she kissed Catarina on both cheeks, held her at arm's length, said in Portuguese that she was too thin and that her mother would have said the same, and then looked at Tobias with an expression of frank and comprehensive assessment.</w:t>
-      </w:r>
-    </w:p>
-    <w:p>
-      <w:r>
-        <w:t>"This is the Englishman," she said, in Portuguese.</w:t>
-      </w:r>
-    </w:p>
-    <w:p>
-      <w:r>
-        <w:t>"This is the Englishman," Catarina agreed.</w:t>
-      </w:r>
-    </w:p>
-    <w:p>
-      <w:r>
-        <w:t>"He is too thin also."</w:t>
-      </w:r>
-    </w:p>
-    <w:p>
-      <w:r>
-        <w:t>"Everybody is too thin," said Catarina, "for this family."</w:t>
+        <w:t xml:space="preserve"> and had a picture of Our Lady of Fátima beside the Lyon football team over the coffee machine, as if they were jointly responsible for miracles. She was small and round and sixty, with a gold cross at her throat, and she kissed Catarina on both cheeks, said she was too thin, looked Tobias up and down, and said he was too thin also.</w:t>
       </w:r>
     </w:p>
     <w:p>
@@ -6222,7 +7068,7 @@
     </w:p>
     <w:p>
       <w:r>
-        <w:t>"One glass. Of water with gas." Dona Graça held up one finger, very firmly. "I know Kader in the bar. One glass, at ten. He paid with coins. He counted them twice." She sipped her coffee. "Then he goes up. And at half past ten, a visitor comes for him."</w:t>
+        <w:t>"One glass. Of water with gas." Dona Graça held up one finger, very firmly. "I know Kader in the bar. One glass, at ten. He paid with coins. He counted them twice." "Then he goes up. And at half past ten, a visitor comes for him."</w:t>
       </w:r>
     </w:p>
     <w:p>
@@ -6237,7 +7083,7 @@
     </w:p>
     <w:p>
       <w:r>
-        <w:t>"The police did not ask Monsieur Lemaire. Monsieur Lemaire is the night porter. He is seventy-one. He sits at the desk from ten until six and does the crossword. The police asked the manager, and the manager was in Villeurbanne with his girlfriend, and so the manager said, nobody came." Dona Graça shrugged with her whole round body. "Monsieur Lemaire told me, the next morning, when I came on. He was upset. He said, Graça, a man came last night for 412. A very chic man. Grey hair. A very good suit. He asks for Monsieur Aubry, and Monsieur Lemaire rings up, and Monsieur Aubry says, send him up. And the man goes up. And Monsieur Lemaire does not see him come down."</w:t>
+        <w:t>"The police did not ask Monsieur Lemaire. Monsieur Lemaire is the night porter. He is seventy-one. He sits at the desk from ten until six and does the crossword. The police asked the manager, who was in Villeurbanne with his girlfriend, and so the manager said, nobody came." Dona Graça shrugged with her whole round body. "Monsieur Lemaire told me, the next morning, when I came on. He was upset. He said, Graça, a man came last night for 412. A very chic man. Grey hair. A very good suit. He asks for Monsieur Aubry, and Monsieur Lemaire rings up, and Monsieur Aubry says, send him up. And the man goes up. And Monsieur Lemaire does not see him come down."</w:t>
       </w:r>
     </w:p>
     <w:p>
@@ -6252,12 +7098,12 @@
     </w:p>
     <w:p>
       <w:r>
-        <w:t>Catarina had gone quite still. Under the table, Tobias felt her hand find his knee, and grip it, hard.</w:t>
-      </w:r>
-    </w:p>
-    <w:p>
-      <w:r>
-        <w:t>"A tie," she said. "Did he say anything about the tie?"</w:t>
+        <w:t>Catarina's hand found Tobias's knee under the table and gripped it, hard. But it was Tobias who asked, because he had been sitting opposite the man at a supper with vol-au-vents and had watched him go out into a dry night with an umbrella.</w:t>
+      </w:r>
+    </w:p>
+    <w:p>
+      <w:r>
+        <w:t>"A tie," he said. "Did he say anything about the tie?"</w:t>
       </w:r>
     </w:p>
     <w:p>
@@ -6272,7 +7118,7 @@
     </w:p>
     <w:p>
       <w:r>
-        <w:t xml:space="preserve">The chambermaid thought. She was a woman who thought with her whole face, the way she shrugged with her whole body. "He said the man was very elegant," she said slowly. "He said, </w:t>
+        <w:t xml:space="preserve">The chambermaid thought. "He said the man was very elegant," she said slowly. "He said, </w:t>
       </w:r>
       <w:r>
         <w:rPr>
@@ -6304,37 +7150,17 @@
         <w:ind w:firstLine="0"/>
       </w:pPr>
       <w:r>
-        <w:t>Monsieur Lemaire had retired in June, to a flat in Vaise with a balcony of his own, which he said he did not use. He received them in a cardigan, with the crossword folded on the arm of his chair and a cat on his knee, and he told them exactly what he had told Dona Graça, in the same words, in the same order, which Tobias had learned from Mara was the sign of a man telling the truth. Liars improve their stories. Honest men repeat them, like a train timetable.</w:t>
-      </w:r>
-    </w:p>
-    <w:p>
-      <w:r>
-        <w:t>He added only one thing. "He went up at ten thirty-four. I write the time. I always write the time; it is a habit from the airport. I did not see him come down. There is a staircase at the back, for the kitchens. It goes to the yard. A man who knows hotels knows the back stairs."</w:t>
-      </w:r>
-    </w:p>
-    <w:p>
-      <w:r>
-        <w:t>"Did you tell the police?"</w:t>
-      </w:r>
-    </w:p>
-    <w:p>
-      <w:r>
-        <w:t>The old man looked at the cat for a while.</w:t>
-      </w:r>
-    </w:p>
-    <w:p>
-      <w:r>
-        <w:t>"I told an officer on the second day. A young man. He wrote it down. Then on the fourth day an officer came back, an older one, from the south, who was not from Lyon at all, which I thought was strange, and he said, Monsieur Lemaire, you are seventy-one, you were doing the crossword, are you sure about the time? Are you sure about the umbrella? Perhaps it was a walking stick. Perhaps it was another night." He stroked the cat. "I said I was sure. He said, thank you, Monsieur Lemaire. And then it was an accident."</w:t>
-      </w:r>
-    </w:p>
-    <w:p>
-      <w:r>
-        <w:t>"An officer from the south," said Tobias slowly.</w:t>
-      </w:r>
-    </w:p>
-    <w:p>
-      <w:r>
-        <w:t>"A commandant. He did not give me his card. He had a very good pen." Monsieur Lemaire looked up at them, his old eyes bright and wet and very angry. "I worked at Lyon airport for thirty-one years, monsieur. I know the difference between an umbrella and a walking stick. I know the difference between a night when it rains and a night when it does not. I know the difference," he added, more quietly, "between a man who wants the truth and a man who wants a signature."</w:t>
+        <w:t>Monsieur Lemaire had retired in June, to a flat in Vaise, and received them in a cardigan with a cat on his knee. He told them exactly what he had told Dona Graça, in the same words, in the same order. Liars improve their stories. Honest men repeat them, like a train timetable. He added two things. The first was the time: ten thirty-four, written down, a habit from thirty-one years at Lyon airport; and he had not seen the man come down, because a man who knows hotels knows the back stairs. The second was an officer who had come on the fourth day, an older one, from the south, not from Lyon at all, with a very good pen, who had asked him whether at seventy-one, with the crossword, he was sure about the time, and whether the umbrella might have been a walking stick, and whether it might have been another night.</w:t>
+      </w:r>
+    </w:p>
+    <w:p>
+      <w:r>
+        <w:t>"I said I was sure," said Monsieur Lemaire, stroking the cat, his old eyes bright and very angry. "He said, thank you. And then it was an accident. I know the difference, monsieur, between a man who wants the truth and a man who wants a signature."</w:t>
+      </w:r>
+    </w:p>
+    <w:p>
+      <w:r>
+        <w:t>"An officer from the south," said Tobias slowly, and thought of a commandant who had closed a file in April with a very good pen.</w:t>
       </w:r>
     </w:p>
     <w:p>
@@ -6352,17 +7178,12 @@
         <w:ind w:firstLine="0"/>
       </w:pPr>
       <w:r>
-        <w:t>The hotel had given the auditor's room to a cardiologist.</w:t>
-      </w:r>
-    </w:p>
-    <w:p>
-      <w:r>
-        <w:t>Dona Graça smuggled them up the back stairs, the very stairs, at four in the afternoon, while the cardiologist was at a congress session on arrhythmia. The room had been redecorated in May. The balcony railing had been replaced the day after the fall, by the hotel's maintenance man, Monsieur Bacri, on the instructions of the manager, before the police had finished their eight days, which Dona Graça had thought was strange at the time and thought was stranger now.</w:t>
-      </w:r>
-    </w:p>
-    <w:p>
-      <w:r>
-        <w:t>The new railing was black and solid and smelled faintly of paint. Tobias stood at it and looked down four floors to the cobbles and the bench and the slow green river, and felt his knees make a decision without him. He stepped back into the room. Catarina stood where he had stood, with her hands on the rail, quite still, and looked down for a long time, and crossed herself.</w:t>
+        <w:t>The hotel had given the auditor's room to a cardiologist, and Dona Graça smuggled them up the back stairs, the very stairs, while he was at a congress session on arrhythmia. The balcony railing had been replaced the day after the fall, before the police had finished their eight days.</w:t>
+      </w:r>
+    </w:p>
+    <w:p>
+      <w:r>
+        <w:t>The new railing was black and solid and smelled faintly of paint. Tobias looked down four floors to the cobbles and the slow green river, and his knees made a decision without him. Catarina stood where he had stood, with her hands on the rail, quite still, and looked down for a long time, and crossed herself.</w:t>
       </w:r>
     </w:p>
     <w:p>
@@ -6377,32 +7198,37 @@
     </w:p>
     <w:p>
       <w:r>
-        <w:t>"No," said a voice from the door. "But I can prove something else."</w:t>
-      </w:r>
-    </w:p>
-    <w:p>
-      <w:r>
-        <w:t>Monsieur Bacri was a lean, grey, quiet Algerian with a carpenter's pencil behind his ear and a canvas bag of tools over his shoulder, and he had been, Dona Graça said, maintenance man at that hotel for twenty-two years, which made him the second-longest-serving thing in the building after the lift. He came in and closed the door behind him and stood with his back against it.</w:t>
-      </w:r>
-    </w:p>
-    <w:p>
-      <w:r>
-        <w:t>"The old railing," he said, in French, slowly, so that Tobias could follow. "I took it down the next morning. The manager said, throw it in the skip. I threw it in the skip. Most of it." He put his bag down on the cardiologist's bed, very carefully, beside the cardiologist's pyjamas, and took out a jam jar with a screw-top lid. In the bottom of the jar, wrapped in a clean handkerchief, was a bolt. It was perhaps eight centimetres long, old and black and rusted, with a nut still on one end. The other end was not there.</w:t>
-      </w:r>
-    </w:p>
-    <w:p>
-      <w:r>
-        <w:t>Monsieur Bacri held the jar up to the light from the window.</w:t>
-      </w:r>
-    </w:p>
-    <w:p>
-      <w:r>
-        <w:t>"Look at the break," he said.</w:t>
-      </w:r>
-    </w:p>
-    <w:p>
-      <w:r>
-        <w:t>They looked. At first Tobias saw only metal. Then he saw what Monsieur Bacri wanted him to see. The break was not one break. Three-quarters of the way through the bolt, the metal was bright and smooth and straight, like the face of a cut loaf, with fine parallel lines across it. Only the last quarter, at the edge, was rough and grey and torn, where the metal had finally given way.</w:t>
+        <w:t>"No." Tobias was looking at the new railing, at the clean black paint, at the bolts, which were new and bright. "But somebody was in a hurry to replace this before the police had finished. You don't hurry to throw away a railing that simply broke. You hurry to throw away one that was helped." He turned to Dona Graça. "Who took the old one down?"</w:t>
+      </w:r>
+    </w:p>
+    <w:p>
+      <w:r>
+        <w:t>"Monsieur Bacri. Maintenance. Twenty-two years."</w:t>
+      </w:r>
+    </w:p>
+    <w:p>
+      <w:r>
+        <w:t>"Then I'd like to meet Monsieur Bacri," said Tobias, "because a man who has looked after one building for twenty-two years doesn't put anything in a skip without looking at it first."</w:t>
+      </w:r>
+    </w:p>
+    <w:p>
+      <w:r>
+        <w:t>They found him in the basement, in a workshop that smelled of oil and sawdust, a lean, grey, quiet Algerian with a carpenter's pencil behind his ear. He listened to Tobias's bad French without interrupting. Then he wiped his hands, went to a shelf behind a row of paint tins, and stood for a moment with his back to them, as if deciding something.</w:t>
+      </w:r>
+    </w:p>
+    <w:p>
+      <w:r>
+        <w:t>"The old railing," he said, in French, slowly, so that Tobias could follow. "The manager said, throw it in the skip. I threw it in the skip. Most of it." He took down a jam jar with a screw-top lid. In the bottom of the jar, wrapped in a clean handkerchief, was a bolt. It was old and black and rusted, with a nut on one end. The other end was not there.</w:t>
+      </w:r>
+    </w:p>
+    <w:p>
+      <w:r>
+        <w:t>"Look at the break," he said, holding it to the light.</w:t>
+      </w:r>
+    </w:p>
+    <w:p>
+      <w:r>
+        <w:t>The break was not one break. Three-quarters of the way through the bolt, the metal was bright and smooth and straight, like the face of a cut loaf, with fine parallel lines across it. Only the last quarter, at the edge, was rough and grey and torn, where the metal had finally given way.</w:t>
       </w:r>
     </w:p>
     <w:p>
@@ -6413,11 +7239,6 @@
     <w:p>
       <w:r>
         <w:t>"Why did you keep it?" said Catarina.</w:t>
-      </w:r>
-    </w:p>
-    <w:p>
-      <w:r>
-        <w:t>He looked at her for a long time.</w:t>
       </w:r>
     </w:p>
     <w:p>
@@ -6440,7 +7261,7 @@
         <w:ind w:firstLine="0"/>
       </w:pPr>
       <w:r>
-        <w:t>They did not take the jar. Mara, reached by telephone from the corridor, in a voice that suggested she was once again in a place where commandants could not follow, was very clear about that.</w:t>
+        <w:t>They did not take the jar. Mara, reached by telephone from the yard, was very clear about that.</w:t>
       </w:r>
     </w:p>
     <w:p>
@@ -6455,12 +7276,12 @@
     </w:p>
     <w:p>
       <w:r>
-        <w:t>"It's a magistrate's," said Mara, and there was something in her voice that Tobias had not heard there before, something that in a less disciplined woman might have been glee. "Madame Fournier went to the procureur on Monday in her good coat. She sat in the waiting room for five hours and forty minutes, and at the end of it a deputy procureur came out to tell her to go home, and she told him about Henri's exercise books, and the deputy procureur was a man of thirty-one whose own grandmother keeps her accounts in exercise books, and he went pale. There's a juge d'instruction looking at the rent as of yesterday. Her name is Sarrazin. She swims in the sea in November. She asked me if I had anything else." A pause. "Now I do."</w:t>
-      </w:r>
-    </w:p>
-    <w:p>
-      <w:r>
-        <w:t xml:space="preserve">Monsieur Bacri wrote his statement on the hotel's notepaper, at the cardiologist's desk, in a careful, sloping, schoolroom hand, two pages, and signed it, and photographed the envelope beside a copy of </w:t>
+        <w:t>"It's a magistrate's," said Mara, with something in her voice that in a less disciplined woman might have been glee. "Madame Fournier went to the procureur on Monday in her good coat. She sat in the waiting room for five hours and forty minutes, until a deputy procureur of thirty-one, whose own grandmother keeps her accounts in exercise books, came out to send her home and went pale instead. There's a juge d'instruction looking at the rent as of yesterday. Her name is Sarrazin. She swims in the sea in November. She asked me if I had anything else." A pause. "Now I do."</w:t>
+      </w:r>
+    </w:p>
+    <w:p>
+      <w:r>
+        <w:t xml:space="preserve">Monsieur Bacri wrote his statement on the hotel's notepaper, at his workbench, in a careful, sloping, schoolroom hand, two pages, and signed it, and photographed the envelope beside a copy of </w:t>
       </w:r>
       <w:r>
         <w:rPr>
@@ -6469,7 +7290,7 @@
         <w:t>Le Progrès</w:t>
       </w:r>
       <w:r>
-        <w:t xml:space="preserve"> on the cardiologist's pillow. He did not ask for anything. When Tobias tried to thank him, he only shook his head and picked up his canvas bag.</w:t>
+        <w:t>.</w:t>
       </w:r>
     </w:p>
     <w:p>
@@ -6511,12 +7332,7 @@
         <w:t>O Cantinho</w:t>
       </w:r>
       <w:r>
-        <w:t>, and it was one room, on the top floor, under the eaves, with a window onto the wet roofs and two narrow single beds with a gap between them about the width of a bedside table, which in fact contained a bedside table, and a lamp, and a small laminated card asking guests in four languages not to smoke.</w:t>
-      </w:r>
-    </w:p>
-    <w:p>
-      <w:r>
-        <w:t>They stood in the doorway and looked at it.</w:t>
+        <w:t>, and it was one room, under the eaves, with two narrow single beds, a bedside table between them, and a small laminated card asking guests in four languages not to smoke.</w:t>
       </w:r>
     </w:p>
     <w:p>
@@ -6526,17 +7342,7 @@
     </w:p>
     <w:p>
       <w:r>
-        <w:t>"There is no chair."</w:t>
-      </w:r>
-    </w:p>
-    <w:p>
-      <w:r>
-        <w:t>"I can sleep in the bath."</w:t>
-      </w:r>
-    </w:p>
-    <w:p>
-      <w:r>
-        <w:t>Catarina looked into the bathroom. "There is no bath. There is a shower, and the shower is a cupboard." She put down her bag on the bed nearer the window, with great firmness, as one plants a flag. "Do not be English. Is two beds. Is one table between. In Portugal we put three children in one bed until they are eleven. Nobody dies."</w:t>
+        <w:t>"There is no chair. There is no bath. The shower is a cupboard." Catarina put down her bag on the bed nearer the window, with great firmness, as one plants a flag. "Do not be English. Is two beds. Is one table between. In Portugal we put three children in one bed until they are eleven. Nobody dies."</w:t>
       </w:r>
     </w:p>
     <w:p>
@@ -6546,22 +7352,22 @@
     </w:p>
     <w:p>
       <w:r>
-        <w:t>For a long time neither of them said anything. Then, in the dark, Catarina said:</w:t>
-      </w:r>
-    </w:p>
-    <w:p>
-      <w:r>
-        <w:t>"You asked me. On the train to Marseille. What I was before."</w:t>
-      </w:r>
-    </w:p>
-    <w:p>
-      <w:r>
-        <w:t>"You said later."</w:t>
-      </w:r>
-    </w:p>
-    <w:p>
-      <w:r>
-        <w:t>"Is later." She was quiet for a moment. He heard her turn onto her side, toward him. "Before I am a teacher, I am a girl who waits. In Afurada, where my father fishes. There is a boy, Duarte. His father has a boat next to my father's boat. We are seventeen. We are going to be married. Everybody says so. The priest says so. My grandmother says so. Then there is no money in fish, so Duarte goes to Switzerland, to work in a hotel kitchen in Lausanne, for two years, to save for a boat of his own. And I wait." She paused. "Two years, I wait. Then three. He writes every month. Then every two months. Then at Christmas. Then one day his mother comes to our house with a photograph. Duarte, in a suit, with a Swiss girl, in front of a church with a very sharp roof."</w:t>
+        <w:t>In the dark, after a long time, Catarina said:</w:t>
+      </w:r>
+    </w:p>
+    <w:p>
+      <w:r>
+        <w:t>"On the train to Marseille," she said, "you did not ask me what I was before the teacher."</w:t>
+      </w:r>
+    </w:p>
+    <w:p>
+      <w:r>
+        <w:t>"I was being English."</w:t>
+      </w:r>
+    </w:p>
+    <w:p>
+      <w:r>
+        <w:t>"Is later now. I tell you anyway." She was quiet for a moment. He heard her turn onto her side, toward him. "Before I am a teacher, I am a girl who waits. In Afurada, where my father fishes. There is a boy, Duarte. His father has a boat next to my father's boat. We are seventeen. We are going to be married. Everybody says so. Then there is no money in fish, so Duarte goes to a hotel kitchen in Lausanne, for two years, to save for a boat. And I wait. Two years. Then three. He writes every month. Then at Christmas. Then one day his mother comes to our house with a photograph. Duarte, in a suit, with a Swiss girl, in front of a church with a very sharp roof."</w:t>
       </w:r>
     </w:p>
     <w:p>
@@ -6571,46 +7377,36 @@
     </w:p>
     <w:p>
       <w:r>
-        <w:t>"No. Is not sad. Is only a long time ago." He heard her smile in the dark, a little crooked. "My grandmother has a poem. You heard it, on the jetty. Three stars waiting. A boat that does not come. And I, on the stone, practising being no one." The rain filled the pause. "I practised very hard. For five years I am very good at being no one. Then one day I think, the boat is not coming, and I am twenty-three, and I do not want to be very good at this. So I go to the university in Porto, and I learn to be a teacher, and I teach children to read so that nobody can ever tell them that a letter is coming when it is not." Another pause. "That is what I was before. A woman who decided not to wait on a stone."</w:t>
-      </w:r>
-    </w:p>
-    <w:p>
-      <w:r>
-        <w:t>Tobias lay in the dark and listened to the rain and thought that it was the most complete thing anybody had ever told him about themselves, and that he had nothing to give back that was half as good.</w:t>
-      </w:r>
-    </w:p>
-    <w:p>
-      <w:r>
-        <w:t>He gave it anyway. He told her about Camilla: not the jacket on the banister, which she knew, but the years before it, the long slow quiet years in which two people who had once liked each other very much had become very polite, and then very careful, and then strangers who knew where the teaspoons were. He told her about Elise, who had read every word he had written for fifteen years and told him exactly what was wrong with it, and who had been the only person in his life who had never once been polite to him about his work, and how he had not understood until she was dead that this had been a form of love.</w:t>
-      </w:r>
-    </w:p>
-    <w:p>
-      <w:r>
-        <w:t>"She sounds like a very rude woman," said Catarina softly, when he had finished.</w:t>
-      </w:r>
-    </w:p>
-    <w:p>
-      <w:r>
-        <w:t>"She was the rudest woman I ever met."</w:t>
-      </w:r>
-    </w:p>
-    <w:p>
-      <w:r>
-        <w:t>"I would have liked her."</w:t>
-      </w:r>
-    </w:p>
-    <w:p>
-      <w:r>
-        <w:t xml:space="preserve">"She would have adored you. She would have told you your English was a disaster and then rewritten your sentences for you in the margin." He stared at the ceiling. "She'd have liked </w:t>
+        <w:t>"No. Is not sad. Is only a long time ago." He heard her smile in the dark, a little crooked. "My grandmother has a poem. You heard it, on the jetty. Three stars waiting. A boat that does not come. And I, on the stone, practising being no one." The rain filled the pause. "I practised very hard. For five years I am very good at being no one. Then one day I think, I am twenty-three, and I do not want to be good at this. So I go to the university in Porto, and I learn to teach children to read, so that nobody can ever tell them a letter is coming when it is not." "That is what I was before. A woman who decided not to wait on a stone."</w:t>
+      </w:r>
+    </w:p>
+    <w:p>
+      <w:r>
+        <w:t>Tobias thought it was the most complete thing anybody had ever told him about themselves, and that he had nothing half as good to give back.</w:t>
+      </w:r>
+    </w:p>
+    <w:p>
+      <w:r>
+        <w:t>He gave it anyway. He told her about Camilla: not the jacket on the banister, which she knew, but the years before it, the long quiet years in which two people who had once liked each other had become very polite, and then strangers who knew where the teaspoons were. He told her about Elise, who had never once been polite to him about his work, and how he had not understood until she was dead that this had been a form of love.</w:t>
+      </w:r>
+    </w:p>
+    <w:p>
+      <w:r>
+        <w:t>"She sounds like a very rude woman," said Catarina softly.</w:t>
+      </w:r>
+    </w:p>
+    <w:p>
+      <w:r>
+        <w:t xml:space="preserve">"The rudest I ever met. She'd have adored you. She'd have stolen </w:t>
       </w:r>
       <w:r>
         <w:rPr>
           <w:i/>
         </w:rPr>
-        <w:t>welcome is a good word, is like a house</w:t>
-      </w:r>
-      <w:r>
-        <w:t>. She'd have stolen it. She stole all my best lines and gave them to other authors."</w:t>
+        <w:t>welcome is like a house</w:t>
+      </w:r>
+      <w:r>
+        <w:t xml:space="preserve"> and put it in somebody else's book."</w:t>
       </w:r>
     </w:p>
     <w:p>
@@ -6620,7 +7416,7 @@
     </w:p>
     <w:p>
       <w:r>
-        <w:t>He took it. They lay like that, in two narrow beds in a cheap hotel in Lyon, with their arms stretched across a bedside table and a laminated card that asked them in four languages not to smoke, holding hands in the dark like two people carrying something fragile across a very long room, until the rain stopped, and they slept.</w:t>
+        <w:t>He took it. They lay like that, with their arms stretched across the bedside table, holding hands in the dark, until the rain stopped, and they slept.</w:t>
       </w:r>
     </w:p>
     <w:p>
@@ -6634,7 +7430,7 @@
         <w:t>Braço dormente.</w:t>
       </w:r>
       <w:r>
-        <w:t xml:space="preserve"> He did not mention it. She rubbed it anyway, briskly, from shoulder to wrist, without being asked, and then went into the shower cupboard singing something from a Lisbon radio station, off-key, and the cardiologists of Lyon went off to their congress, and nobody in the whole city, Tobias thought, could possibly have been as happy as he was about a missed train.</w:t>
+        <w:t xml:space="preserve"> He did not mention it. She rubbed it anyway, without being asked, and went into the shower cupboard singing, off-key, and nobody in the whole city, Tobias thought, could possibly have been as happy as he was about a missed train.</w:t>
       </w:r>
     </w:p>
     <w:p>
@@ -6653,7 +7449,7 @@
         <w:ind w:firstLine="0"/>
       </w:pPr>
       <w:r>
-        <w:t>Mara drove them to Avignon on the Saturday, in her own car, which was small and grey and full of the debris of a life lived between shifts: parking tickets, a child's swimming goggles that she did not explain, three empty water bottles, and a paperback in English with a broken spine and a lighthouse on the cover that Tobias, sitting in the back, looked at with a sudden unease he did not examine.</w:t>
+        <w:t>Mara drove them to Avignon on the Saturday, in her own car, which was small and grey and full of parking tickets, a child's swimming goggles that she did not explain, and a paperback with a lighthouse on the cover that Tobias looked at with a sudden unease.</w:t>
       </w:r>
     </w:p>
     <w:p>
@@ -6696,17 +7492,17 @@
         <w:ind w:firstLine="0"/>
       </w:pPr>
       <w:r>
-        <w:t>Madame Sylvie Giraud lived on the rue des Teinturiers in Avignon, a narrow street along a little canal where old waterwheels, green with moss, turned slowly under the plane trees, as they had turned for the dyers four hundred years ago, for no reason now except that nobody had told them to stop. Her flat was on the second floor, up a stone staircase worn into a dip by centuries of feet, and it was full of books and of light and of the particular stillness of a place where somebody used to sit in a particular chair.</w:t>
-      </w:r>
-    </w:p>
-    <w:p>
-      <w:r>
-        <w:t>She was perhaps sixty, small and neat, with short grey hair and a man's cardigan, much too big for her, which she wore with the sleeves rolled up. She received them in the room with the chair, and did not sit in it, and sat instead on the edge of a sofa with her hands between her knees, and listened to Mara explain who they were, and why they had come, in a French so quiet and careful that Tobias understood almost all of it.</w:t>
-      </w:r>
-    </w:p>
-    <w:p>
-      <w:r>
-        <w:t>When Mara had finished, Madame Giraud did not say anything for a long time.</w:t>
+        <w:t>Madame Sylvie Giraud lived on the rue des Teinturiers in Avignon, a narrow street along a little canal where old waterwheels, green with moss, turned slowly under the plane trees for no reason now except that nobody had told them to stop. Her flat was full of books and of light and of the particular stillness of a place where somebody used to sit in a particular chair.</w:t>
+      </w:r>
+    </w:p>
+    <w:p>
+      <w:r>
+        <w:t>She was perhaps sixty, small and neat, with short grey hair and a man's cardigan, much too big for her, which she wore with the sleeves rolled up. She received them in the room with the chair, and did not sit in it, and listened to Mara explain, in a French so careful that Tobias understood almost all of it.</w:t>
+      </w:r>
+    </w:p>
+    <w:p>
+      <w:r>
+        <w:t>When Mara had finished, Madame Giraud did not say anything for a while.</w:t>
       </w:r>
     </w:p>
     <w:p>
@@ -6731,7 +7527,7 @@
     </w:p>
     <w:p>
       <w:r>
-        <w:t>Mara opened it. Tobias, leaning over, saw the same kind of handwriting as Madame Fournier's exercise books: small, upright, French, with the sevens crossed. Appointments. Phone numbers. A dentist. A lunch. And then, from the middle of May onwards, the same initials, over and over, on almost every page.</w:t>
+        <w:t>Mara opened it. Tobias, leaning over, saw the same kind of handwriting as Madame Fournier's exercise books: small, upright, French, with the sevens crossed. Appointments. Phone numbers. A dentist. A lunch. And then, from the middle of February, the same initials, over and over, on almost every page.</w:t>
       </w:r>
     </w:p>
     <w:p>
@@ -6759,8 +7555,19 @@
         </w:rPr>
         <w:t>E.M. — Lyon, la succession.</w:t>
       </w:r>
-      <w:r>
-        <w:t xml:space="preserve"> </w:t>
+    </w:p>
+    <w:p>
+      <w:r>
+        <w:t xml:space="preserve">On the fifteenth of March, a single line, boxed in ink: </w:t>
+      </w:r>
+      <w:r>
+        <w:rPr>
+          <w:i/>
+        </w:rPr>
+        <w:t>E.M. — noyée.</w:t>
+      </w:r>
+      <w:r>
+        <w:t xml:space="preserve"> Drowned. After that there were no more initials, only a notary going on alone with a dead woman's question: </w:t>
       </w:r>
       <w:r>
         <w:rPr>
@@ -6768,10 +7575,8 @@
         </w:rPr>
         <w:t>Barbier, Aix — les originaux?</w:t>
       </w:r>
-    </w:p>
-    <w:p>
-      <w:r>
-        <w:t>And on the fourth of June, three days before he died, a longer entry, written more quickly than the others, as if the hand had been in a hurry to get the words down before they changed:</w:t>
+      <w:r>
+        <w:t xml:space="preserve"> And on the fourth of June, three days before he died, a longer entry, written more quickly than the others, as if the hand had been in a hurry to get the words down before they changed:</w:t>
       </w:r>
     </w:p>
     <w:p>
@@ -6809,7 +7614,7 @@
     </w:p>
     <w:p>
       <w:r>
-        <w:t>Madame Giraud had begun to cry, silently, without moving, her hands still between her knees.</w:t>
+        <w:t>Madame Giraud had begun to cry, silently, without moving.</w:t>
       </w:r>
     </w:p>
     <w:p>
@@ -6847,17 +7652,22 @@
     </w:p>
     <w:p>
       <w:r>
-        <w:t>Tobias looked at it and thought of Elise, in the water, in March. He did not want to look at it any more. He looked at Fangio instead, who was sitting with great dignity on three legs, watching them.</w:t>
-      </w:r>
-    </w:p>
-    <w:p>
-      <w:r>
-        <w:t>Mara lay down on the gravel.</w:t>
-      </w:r>
-    </w:p>
-    <w:p>
-      <w:r>
-        <w:t>She did it without any fuss, in her slate-grey jumper and her good trousers, on her day off, and slid under the front of the car on her back, with a torch, the way she had presumably done a hundred times before on a hundred wrecked cars, and was silent under there for some time. Monsieur Pons, who had seen policemen before but never one who lay down without being asked, took the cigar out of his mouth and watched her with respect.</w:t>
+        <w:t>Tobias looked at it and thought of Elise, in the water, in March. Then he made himself look again, at the long hill on the map in his head, and the bend, and the bridge.</w:t>
+      </w:r>
+    </w:p>
+    <w:p>
+      <w:r>
+        <w:t>"He drove that road in the dark for twenty years," he said. "Same road, same bend, one glass at lunch. A man who knows a bend that well doesn't miss it. Not unless he puts his foot down and nothing happens." He looked at Mara. "If anybody touched this car, they touched the brakes. And nobody's looked, because nobody's been paid to."</w:t>
+      </w:r>
+    </w:p>
+    <w:p>
+      <w:r>
+        <w:t>Mara looked at him for a moment, the way she had looked at him on the porch on the first day, when he was holding a pen. Then she lay down on the gravel.</w:t>
+      </w:r>
+    </w:p>
+    <w:p>
+      <w:r>
+        <w:t>She did it without any fuss, in her slate-grey jumper and her good trousers, on her day off, and slid under the front of the car on her back, with a torch, the way she had presumably done a hundred times before on a hundred wrecked cars, and was silent under there for some time.</w:t>
       </w:r>
     </w:p>
     <w:p>
@@ -6897,11 +7707,6 @@
     </w:p>
     <w:p>
       <w:r>
-        <w:t>"Rust?" said Tobias. "Wear?"</w:t>
-      </w:r>
-    </w:p>
-    <w:p>
-      <w:r>
         <w:t>"Rubber doesn't wear in a straight line," said Monsieur Pons, in French, almost exactly as Monsieur Bacri had said it in Lyon about the bolt, and Tobias felt the hair rise on his arms. "This is a knife. A good one. Somebody who knows cars." He put the cigar back in his mouth and chewed it. "Forty years I take apart cars, madame. I have seen everything. A man who cuts a brake hose like that has done it before."</w:t>
       </w:r>
     </w:p>
@@ -6927,7 +7732,7 @@
     </w:p>
     <w:p>
       <w:r>
-        <w:t>"He came," said Monsieur Pons, signing with a flourish. "In June. The week after. He looked at the car. He did not lie down. He asked me, is there anything here, Pons? I said, I have not looked. He said, then do not look. Crush it when the insurance pays." He handed the bag back. "I did not like him. Fangio did not like him. Fangio likes everybody. Fangio likes the man who comes to read the electricity."</w:t>
+        <w:t>"He came," said Monsieur Pons, signing with a flourish. "In June. The week after. He looked at the car. He did not lie down. He asked me, is there anything here, Pons? I said, I have not looked. He said, then do not look. Crush it when the insurance pays." He handed the bag back. "I did not like him. Fangio did not like him. Fangio likes everybody."</w:t>
       </w:r>
     </w:p>
     <w:p>
@@ -6960,7 +7765,7 @@
     </w:p>
     <w:p>
       <w:r>
-        <w:t>"Commandant Moutet." She said the name as if she were laying it on a table. "Twenty-six years in the service. Two commendations. A wife who does pottery. A son at the École Polytechnique. And on Thursday mornings he plays golf at a club outside Marseille with the chairman of the Verrane Foundation." Her hands were very steady on the wheel. "I've worked for him for six years. I thought he was lazy. I thought he closed files because it was easier than opening them. I thought he was the kind of man who takes the shortest road home." A pause. "I didn't think he was the road."</w:t>
+        <w:t>"Commandant Moutet." She said the name as if she were laying it on a table. "Twenty-six years in the service. Two commendations. A wife who does pottery. A son at the École Polytechnique. And on Thursday mornings he plays golf at a club outside Marseille with the chairman of the Verrane Foundation." Her hands were very steady on the wheel. "Six years I've worked for him. I thought he was lazy. I thought he took the shortest road home." A pause. "I didn't think he was the road."</w:t>
       </w:r>
     </w:p>
     <w:p>
@@ -7003,7 +7808,7 @@
     </w:p>
     <w:p>
       <w:r>
-        <w:t>Tobias knew this only because Mara told him, that evening, at Madame Fournier's kitchen table, over a glass of Madame Fournier's marc, which was colourless and smelled of pears and could, Madame Fournier said, take the varnish off a coffin, and frequently had. Mara drank it as if it were water. Nobody remarked on this.</w:t>
+        <w:t>Mara told them that evening, at Madame Fournier's kitchen table, over a glass of Henri's marc, which smelled of pears and could, Madame Fournier said, take the varnish off a coffin.</w:t>
       </w:r>
     </w:p>
     <w:p>
@@ -7018,7 +7823,7 @@
     </w:p>
     <w:p>
       <w:r>
-        <w:t>"He said, you have made a very serious mistake for your career. And he looked at me for a long time." Mara drank the marc. "And then he said, it would be a pity, Mara, if your career were the only thing you lost. And he smiled."</w:t>
+        <w:t>"He said, you have made a very serious mistake for your career. And he looked at me for some time." Mara drank the marc. "And then he said, it would be a pity, Mara, if your career were the only thing you lost. And he smiled."</w:t>
       </w:r>
     </w:p>
     <w:p>
@@ -7051,7 +7856,7 @@
         <w:ind w:firstLine="0"/>
       </w:pPr>
       <w:r>
-        <w:t xml:space="preserve">Catarina did not say anything during any of this. She sat at the end of Madame Fournier's table with her hands round a cup of tea that went cold, and listened, and watched Mara's face, and Tobias's face, and once, when Mara said </w:t>
+        <w:t xml:space="preserve">Catarina said nothing during any of this. Once, when Mara said </w:t>
       </w:r>
       <w:r>
         <w:rPr>
@@ -7099,7 +7904,7 @@
     </w:p>
     <w:p>
       <w:r>
-        <w:t>He looked at her in the starlight. He thought of the envelope under the Olivetti, with the name on it that she had let slip in the study and never said again, and that he had never asked about, because a man does not spend a thing he was not given.</w:t>
+        <w:t>He looked at her in the starlight. He thought of the envelope under the Olivetti, with the name on it that he had never asked about.</w:t>
       </w:r>
     </w:p>
     <w:p>
@@ -7247,17 +8052,41 @@
     </w:p>
     <w:p>
       <w:r>
-        <w:t>"No." She frowned and drew something on the envelope. A small wooden cabinet with a false back. "Inês keep things here. Under the window seat."</w:t>
-      </w:r>
-    </w:p>
-    <w:p>
-      <w:r>
-        <w:t>He thought of the board he had seen, the dust disturbed in a clean rectangle, the cushion put back as if the cushion were the point. He did not say that either. He lifted the seat.</w:t>
-      </w:r>
-    </w:p>
-    <w:p>
-      <w:r>
-        <w:t>They found it at midnight. The board Catarina had lifted in October had shown her only dust. The false back was behind it, a second skin of wood that you could find only if you knew that your sister had once been very good at woodwork and very bad at trusting landlords. Inside, wrapped in oilskin, lay a notebook in Inês's handwriting and a small tape recorder. Inês had written, on the inside of the wood, DO NOT MOVE THIS. TRUST ME. They did not move it. They took what she had hidden, and they put the board back.</w:t>
+        <w:t>"No." She frowned at the gap.</w:t>
+      </w:r>
+    </w:p>
+    <w:p>
+      <w:r>
+        <w:t xml:space="preserve">Tobias was not looking at the gap. He was thinking of clause fourteen, and a publisher who wanted </w:t>
+      </w:r>
+      <w:r>
+        <w:rPr>
+          <w:i/>
+        </w:rPr>
+        <w:t>recordings</w:t>
+      </w:r>
+      <w:r>
+        <w:t xml:space="preserve"> from a man who typed; of a rectangle of disturbed dust under the window seat; of a sister who had worked in this house for two years and had left in one night without her things.</w:t>
+      </w:r>
+    </w:p>
+    <w:p>
+      <w:r>
+        <w:t>"Was Inês good with her hands?" he said.</w:t>
+      </w:r>
+    </w:p>
+    <w:p>
+      <w:r>
+        <w:t>Catarina looked up. "She makes furniture. For fun. Since she is twelve. Why?"</w:t>
+      </w:r>
+    </w:p>
+    <w:p>
+      <w:r>
+        <w:t>"Because you lifted the board in October and found dust," he said, "and Hale still thinks there's a tape. So it's still here. And a woman who makes furniture doesn't hide something under a board. She builds it a wall." He got up, and lifted the seat, and knocked on the back of the box beneath it, and then on the side, and the back gave a different sound.</w:t>
+      </w:r>
+    </w:p>
+    <w:p>
+      <w:r>
+        <w:t>They had it open at midnight. The false back was a second skin of wood, very well made, by a woman who was very good at woodwork and very bad at trusting landlords. Inside, wrapped in oilskin, lay a notebook in Inês's handwriting and a small tape recorder. Inês had written, on the inside of the wood, DO NOT MOVE THIS. TRUST ME. They did not move it. They took what she had hidden, and they put the board back.</w:t>
       </w:r>
     </w:p>
     <w:p>
@@ -7707,7 +8536,7 @@
         <w:rPr>
           <w:i/>
         </w:rPr>
-        <w:t>She has a biscuit tin.</w:t>
+        <w:t>I have bribed her with honey.</w:t>
       </w:r>
       <w:r>
         <w:t xml:space="preserve"> I did not ask any more. A notary who asks more than he needs to is a notary who ends up in a diary."</w:t>
@@ -7715,17 +8544,17 @@
     </w:p>
     <w:p>
       <w:r>
-        <w:t>Tobias and Catarina looked at each other.</w:t>
-      </w:r>
-    </w:p>
-    <w:p>
-      <w:r>
-        <w:t>"Odile," said Catarina.</w:t>
-      </w:r>
-    </w:p>
-    <w:p>
-      <w:r>
-        <w:t>"Madame Fournier," said Tobias, at the same moment, and Maître Barbier looked from one to the other, and his eyebrows came down a little, as if he had seen this kind of thing before, at the signing of marriage contracts, and had never much liked it.</w:t>
+        <w:t>Catarina began to say that half the women in Provence kept everything and trusted nobody. Tobias was not listening. He was in the market at Apt, on a Saturday, watching a woman with two string bags walk past a honey stall with forty kinds of jar without stopping and without looking at it, the way a person walks past a house where somebody they knew used to live.</w:t>
+      </w:r>
+    </w:p>
+    <w:p>
+      <w:r>
+        <w:t>"Honey," he said. "Odile doesn't buy honey. She walks past it. Elise brought her a jar, and Elise didn't come back, and now she can't look at the stuff." He stood up. "It's in the biscuit tin. It's been next door to us since March."</w:t>
+      </w:r>
+    </w:p>
+    <w:p>
+      <w:r>
+        <w:t>Maître Barbier looked at him with his eyebrows, which came down a little, as if a client had for once said something worth the fee.</w:t>
       </w:r>
     </w:p>
     <w:p>
@@ -7809,17 +8638,26 @@
         <w:ind w:firstLine="0"/>
       </w:pPr>
       <w:r>
-        <w:t>Madame Fournier did not look up from the secateurs.</w:t>
-      </w:r>
-    </w:p>
-    <w:p>
-      <w:r>
-        <w:t>"The key has been in the biscuit tin since March," she said. "Under your tape, now, and the letter about the rent, and a photograph of Lucien standing on one leg, which I am not going to explain. Your friend Elise gave it to me. She came over the wall on a Thursday with a jar of honey I did not need and asked me to keep one thing in this valley that Monsieur Hale did not know about. She said she was a very careful guest." Madame Fournier snipped a rose that did not need it. "She did not come back. I put the honey in the cellar. I have not been able to open it."</w:t>
-      </w:r>
-    </w:p>
-    <w:p>
-      <w:r>
-        <w:t xml:space="preserve">The bank in Aix took two days, a juge's signature and, in the end, twenty minutes and no heroism. Mara, carrying the juge d'instruction's signature in a plastic sleeve as if it might blow away, signed. Tobias watched. Catarina held the fig bag from the road to Aix, which she had kept, because the bank had no ceremony and a paper bag was honest. Inside the box, on top, lay a toy Porsche with a wheel missing and a card in Elise's quick, slanting, impatient hand: </w:t>
+        <w:t xml:space="preserve">Madame Fournier did not look up from the secateurs when Tobias said the word </w:t>
+      </w:r>
+      <w:r>
+        <w:rPr>
+          <w:i/>
+        </w:rPr>
+        <w:t>honey</w:t>
+      </w:r>
+      <w:r>
+        <w:t>.</w:t>
+      </w:r>
+    </w:p>
+    <w:p>
+      <w:r>
+        <w:t>"The key has been in the biscuit tin since March," she said. "You took your time. It is under your tape, now, and the letter about the rent, and a photograph of Lucien standing on one leg, which I am not going to explain. Your friend Elise gave it to me. She came over the wall on a Thursday with a jar of honey I did not need and asked me to keep one thing in this valley that Monsieur Hale did not know about. She said she was a very careful guest." Madame Fournier snipped a rose that did not need it. "She did not come back. I put the honey in the cellar. I have not been able to open it."</w:t>
+      </w:r>
+    </w:p>
+    <w:p>
+      <w:r>
+        <w:t xml:space="preserve">The bank in Aix took two days and then twenty minutes, with no heroism at all. The box was in Elise's name, and Elise was dead, so the key on its own opened nothing: a bank will open a dead customer's box only for her heirs or on a juge's order, with an officer present and an inventory signed by everyone in the room. Mara, carrying the juge d'instruction's order in a plastic sleeve as if it might blow away, signed. Tobias watched. Catarina held the fig bag from the road to Aix, which she had kept, because the bank had no ceremony and a paper bag was honest. Inside the box, on top, lay a toy Porsche with a wheel missing and a card in Elise's quick, slanting, impatient hand: </w:t>
       </w:r>
       <w:r>
         <w:rPr>
@@ -8271,7 +9109,7 @@
     </w:p>
     <w:p>
       <w:r>
-        <w:t>Madame Fournier came down the garden ten minutes later, in her gardening gloves, because she had seen them from her kitchen window and wished to know what two people in dressing gowns were doing in Henri's terrace at seven in the morning. She stopped at the edge of the grove. She stood there for a long time. Then she took off one glove, finger by finger, and reached up and touched a branch, the way you would touch the sleeve of somebody you had not seen for a long time and were not sure you were allowed to speak to.</w:t>
+        <w:t>Madame Fournier came down the garden ten minutes later, in her gardening gloves, because she had seen them from her kitchen window and wished to know what two people in dressing gowns were doing in Henri's terrace at seven in the morning. She stopped at the edge of the grove. She stood there for some time. Then she took off one glove, finger by finger, and reached up and touched a branch, the way you would touch the sleeve of somebody you had not seen for a while and were not sure you were allowed to speak to.</w:t>
       </w:r>
     </w:p>
     <w:p>
@@ -8515,7 +9353,7 @@
     </w:p>
     <w:p>
       <w:r>
-        <w:t>Tobias had not heard her voice since the landing. He had heard her solicitor's voice, which was cold butter, and he had heard, in his head, at three in the morning, a great many versions of her voice saying a great many things she had never said. The real one was smaller than any of them. It was a tired voice. It sounded as if it had been crying, or had a cold, or both, which with Camilla was usually the case, because she regarded colds as a form of emotional honesty.</w:t>
+        <w:t>Tobias had not heard her voice since the landing. It was smaller than he remembered, and tired, and had a cold, which with Camilla was usual, because she regarded colds as a form of emotional honesty.</w:t>
       </w:r>
     </w:p>
     <w:p>
@@ -8535,7 +9373,7 @@
     </w:p>
     <w:p>
       <w:r>
-        <w:t>He stood in the hall with the receiver in his hand and looked at the coat-stand, and the green visitors' book with the gold label, and the stairs, at the top of which, through the open study door, he could see the end of the Olivetti's carriage, shining.</w:t>
+        <w:t>He stood in the hall with the receiver in his hand and looked at the green visitors' book.</w:t>
       </w:r>
     </w:p>
     <w:p>
@@ -8550,7 +9388,7 @@
     </w:p>
     <w:p>
       <w:r>
-        <w:t>He did not answer at once. He thought about the house in Leeds, the brick and the plane tree and the man who mended lawnmowers on Sundays. He thought about nine years of a woman with a tartan trolley nodding at him in the street. He thought, with great clarity, that he had liked that life, the way a man likes a coat that has stopped keeping him warm but still has his shape.</w:t>
+        <w:t>He did not answer at once. He thought about the house in Leeds, and the woman with the tartan trolley, and that he had liked that life the way a man likes a coat that has stopped keeping him warm but still has his shape.</w:t>
       </w:r>
     </w:p>
     <w:p>
@@ -8566,16 +9404,6 @@
     <w:p>
       <w:r>
         <w:t>"Yes," he said. "I'll think about it."</w:t>
-      </w:r>
-    </w:p>
-    <w:p>
-      <w:r>
-        <w:t>"Promise."</w:t>
-      </w:r>
-    </w:p>
-    <w:p>
-      <w:r>
-        <w:t>"I promise I'll think about it."</w:t>
       </w:r>
     </w:p>
     <w:p>
@@ -8608,7 +9436,7 @@
         <w:ind w:firstLine="0"/>
       </w:pPr>
       <w:r>
-        <w:t>He should have explained then. He knew that afterwards. He knew it within about a minute, in fact, which is the usual interval in which a man understands that he has missed the only moment that mattered. But she had already turned back into the kitchen, and put the basket on the table, and begun folding sheets with a precision that did not invite company, and he stood in the doorway for a moment, and then, being English, went upstairs and sat at the Olivetti and typed nothing for an hour.</w:t>
+        <w:t>He should have explained then. He knew it within about a minute, which is the usual interval in which a man understands that he has missed the only moment that mattered. But she had already turned back into the kitchen and begun folding sheets with a precision that did not invite company, and he, being English, went upstairs and typed nothing for an hour.</w:t>
       </w:r>
     </w:p>
     <w:p>
@@ -8618,7 +9446,7 @@
     </w:p>
     <w:p>
       <w:r>
-        <w:t xml:space="preserve">He had been thinking all morning, in the gaps between not typing, about Delacroix-Roux in the hospital car park in Aix, with his extraordinary teeth, saying </w:t>
+        <w:t xml:space="preserve">He had been thinking all morning about Delacroix-Roux in the hospital car park, saying </w:t>
       </w:r>
       <w:r>
         <w:rPr>
@@ -8627,17 +9455,12 @@
         <w:t>do give my regards to your sister</w:t>
       </w:r>
       <w:r>
-        <w:t>.</w:t>
-      </w:r>
-    </w:p>
-    <w:p>
-      <w:r>
-        <w:t>And he had been thinking, mostly, about Catarina, who had walked into a lake in September in her apron and cardigan, and who would, he was quite certain, walk into anything else that was necessary, at any hour, without a torch.</w:t>
-      </w:r>
-    </w:p>
-    <w:p>
-      <w:r>
-        <w:t xml:space="preserve">So when she put the tray down outside his door at noon, and did not knock, as she had not knocked since the first week, he opened the door before she could go, and said the stupidest thing he had said since </w:t>
+        <w:t>, and about Catarina, who had walked into a lake in her cardigan and would, he was quite certain, walk into anything else that was necessary, at any hour, without a torch.</w:t>
+      </w:r>
+    </w:p>
+    <w:p>
+      <w:r>
+        <w:t xml:space="preserve">So when she put the tray down outside his door at noon, he opened the door before she could go, and said the stupidest thing he had said since </w:t>
       </w:r>
       <w:r>
         <w:rPr>
@@ -8676,7 +9499,7 @@
     </w:p>
     <w:p>
       <w:r>
-        <w:t>He had seen her angry before. He had seen her angry with the Hargreaveses at the inn in the Camargue, a cold, elegant, heron's anger, and he had seen her angry with the stove, which was a hot, muttering, domestic anger with a great deal of Portuguese in it. He had not seen this. This was very quiet. This had no language at all.</w:t>
+        <w:t>He had seen her angry before: a cold heron's anger with the Hargreaveses, a hot, muttering anger with the stove. This was very quiet. This had no language at all.</w:t>
       </w:r>
     </w:p>
     <w:p>
@@ -8711,7 +9534,7 @@
     </w:p>
     <w:p>
       <w:r>
-        <w:t>It came out louder than he meant. It went down the stairs and into the kitchen and out of the open window over the pond, where a heron lifted out of the reeds, offended, and flapped away.</w:t>
+        <w:t>It came out louder than he meant, and went out of the open window over the pond, where a heron lifted out of the reeds, offended.</w:t>
       </w:r>
     </w:p>
     <w:p>
@@ -8744,22 +9567,17 @@
         <w:ind w:firstLine="0"/>
       </w:pPr>
       <w:r>
-        <w:t>He did not eat the soup. He sat on the edge of the bed with the tray on his knees and looked at it until it was cold, and then he took it down to the kitchen, and she was not there. The back door was open. Through it he could see her at the end of the garden, by the wall, with her back to the house, talking over it to Madame Fournier, very fast, in a mixture of French and Portuguese and her hands, and Madame Fournier, on the other side of the wall, with her secateurs, nodding slowly and not looking at the house at all, which was how he knew they were talking about him.</w:t>
-      </w:r>
-    </w:p>
-    <w:p>
-      <w:r>
-        <w:t>He went back upstairs.</w:t>
-      </w:r>
-    </w:p>
-    <w:p>
-      <w:r>
-        <w:t>It was not until the evening that he understood there was something else. That the call, and the stupid sentence on the landing, had not been the whole of it. That they had only been the match.</w:t>
-      </w:r>
-    </w:p>
-    <w:p>
-      <w:r>
-        <w:t>She came up at seven, without the tray. She knocked. She had not knocked since the first week. She stood in the doorway of the study with her hands folded in front of her apron, like a housekeeper in a film about a big house, and he hated it, and he understood that she meant him to.</w:t>
+        <w:t>He did not eat the soup. When he took it down, she was at the end of the garden, talking over the wall to Madame Fournier, very fast, in three languages and her hands, and Madame Fournier was nodding slowly and not looking at the house at all, which was how he knew they were talking about him.</w:t>
+      </w:r>
+    </w:p>
+    <w:p>
+      <w:r>
+        <w:t>That evening he understood that the call, and the stupid sentence on the landing, had only been the match.</w:t>
+      </w:r>
+    </w:p>
+    <w:p>
+      <w:r>
+        <w:t>She came up at seven, without the tray, and knocked, which she had not done since the first week, and stood in the doorway with her hands folded in front of her apron, like a housekeeper in a film about a big house. He hated it, and he understood that she meant him to.</w:t>
       </w:r>
     </w:p>
     <w:p>
@@ -8784,7 +9602,7 @@
     </w:p>
     <w:p>
       <w:r>
-        <w:t>"Before," she said. "Before the wind. Before the lake. I come in September. You come eleven days later. You put the book in the study, in the satchel, every night, on the chair. And every night, when you are asleep, I come up the stairs, the fourth one I do not step on, and I take out the pages, and I sit on the floor by the window with the dictionary and the lamp very low, and I read." She did not look away. "Every night. Eleven nights. Slowly. Ten pages, fifteen. I read about the woman on the jetty. I read about the publisher, with the silver car. I read that the woman did not slip." Her voice did not change. "I knew, before you knew I could read, what was in your book. I knew that it said Hale. I knew it was dangerous. That is why, when the wind takes the pages, I go into the lake."</w:t>
+        <w:t>"Before," she said. "Before the wind. I come in September. You come eleven days later. You put the book in the satchel, on the chair, every night. And every night, when you are asleep, I come up the stairs, the fourth one I do not step on, and I sit on the floor by the window with the dictionary and the lamp very low, and I read. Eleven nights. I read about the woman on the jetty. I read about the publisher with the silver car. I read that the woman did not slip." She did not look away. "I knew it said Hale. I knew it was dangerous. That is why, when the wind takes the pages, I go into the lake."</w:t>
       </w:r>
     </w:p>
     <w:p>
@@ -8799,12 +9617,12 @@
     </w:p>
     <w:p>
       <w:r>
-        <w:t>He sat very still at the desk with the Olivetti beside him. He thought of the first morning, the pages on the towels, drying, one by one, with grim patience. He had thought it was kindness. He had thought, later, on the train to Marseille, that it had been a professional opinion. He had not thought, at any point, that she had known exactly which pages she was saving, and why.</w:t>
-      </w:r>
-    </w:p>
-    <w:p>
-      <w:r>
-        <w:t>"I came to find my sister," said Catarina. "You know this. You knew it on the jetty, with the newspaper. You did not ask. Thank you for that. But I did not come to find you. I did not come for the birds, or the stars, or the flamingos. I came for Inês, and you were the man with the book that knew where to look. So I read your book. And I saved your book. And I helped you with the dictionary and the scanner and the prize and Marseille and Lyon. Because your book was the road to my sister." She took a breath. "I am telling you so that you know. So that you do not think, later, in the court, that I was only a housekeeper who was kind. I was not only kind. I was using you. At the beginning. It is true."</w:t>
+        <w:t>He sat very still. He had thought the drying of the pages was kindness, and later a professional opinion. He had not thought that she had known exactly which pages she was saving, and why.</w:t>
+      </w:r>
+    </w:p>
+    <w:p>
+      <w:r>
+        <w:t>"I came to find my sister," said Catarina. "You know this. You did not ask. Thank you for that. But I did not come for the birds, or the stars, or the flamingos. I came for Inês, and you were the man with the book that knew where to look. So I read your book, and I saved your book, and I helped you with the prize and Marseille and Lyon, because your book was the road to my sister." She took a breath. "I am telling you so that you do not think, later, in the court, that I was only a housekeeper who was kind. I was using you. At the beginning. It is true."</w:t>
       </w:r>
     </w:p>
     <w:p>
@@ -8839,7 +9657,7 @@
     </w:p>
     <w:p>
       <w:r>
-        <w:t xml:space="preserve">She waited. He understood, much later, that she was waiting for him to ask the obvious question, the one any fool could see sitting there in the room between them, the one with </w:t>
+        <w:t xml:space="preserve">She waited. He understood, much later, that she was waiting for the obvious question, the one with </w:t>
       </w:r>
       <w:r>
         <w:rPr>
@@ -8848,7 +9666,7 @@
         <w:t>at the beginning</w:t>
       </w:r>
       <w:r>
-        <w:t xml:space="preserve"> written all over it, like a price on a lobster. </w:t>
+        <w:t xml:space="preserve"> written all over it like a price on a lobster. </w:t>
       </w:r>
       <w:r>
         <w:rPr>
@@ -8859,7 +9677,7 @@
     </w:p>
     <w:p>
       <w:r>
-        <w:t>He did not ask it. He sat at the desk with his hurt pride in his lap like a cat that has been put there by somebody else, and he looked at the Olivetti, and said nothing, in the great English tradition of saying nothing, which she had told him on the jetty was not a sport but a disease.</w:t>
+        <w:t>He did not ask it. He sat with his hurt pride in his lap like a cat somebody else had put there, and said nothing, in the great English tradition, which she had told him on the jetty was not a sport but a disease.</w:t>
       </w:r>
     </w:p>
     <w:p>
@@ -8892,7 +9710,7 @@
     </w:p>
     <w:p>
       <w:r>
-        <w:t>It was, Tobias thought, the worst thing that had ever happened in that house, and that included a murder. She put the tray outside his door at noon, and did not knock, and there was no note under the plate. He said good morning, and she said good morning, in English, correctly, with the stress in the right place. When he came into the kitchen, she found something to do in the scullery. When she came into the study to dust, he found something to do in the garden. The radio from Lisbon stayed off. Nobody sang. The pelican stood at the end of the jetty with its back to the house, like an uncle at a wedding who has heard about the argument and has decided not to take sides by facing the sea.</w:t>
+        <w:t>It was, Tobias thought, the worst thing that had ever happened in that house, and that included a murder. There was no note under the plate. They said good morning, correctly, with the stress in the right place. The radio from Lisbon stayed off. The pelican stood at the end of the jetty with its back to the house, like an uncle at a wedding who has decided not to take sides by facing the sea.</w:t>
       </w:r>
     </w:p>
     <w:p>
@@ -8902,7 +9720,7 @@
     </w:p>
     <w:p>
       <w:r>
-        <w:t>She did not come to the kitchen door, where Catarina was. She came round to the front of the house, and up the steps, and rang the bell, which nobody had ever rung, and which turned out to play the first four notes of a tune Tobias could not place and did not want to. When he opened the door, she walked past him into the hall without being asked, took off her gardening gloves finger by finger, as Priscilla Pemberton-Hayes had taken off her gloves on the night of the pantomime, and sat down on the bottom stair.</w:t>
+        <w:t>She came round to the front and rang the bell, which nobody had ever rung, walked past him into the hall, took off her gardening gloves finger by finger, and sat down on the bottom stair.</w:t>
       </w:r>
     </w:p>
     <w:p>
@@ -8917,7 +9735,7 @@
     </w:p>
     <w:p>
       <w:r>
-        <w:t>"It was about a carburettor," said Madame Fournier. "He said I had flooded it. I said he had never once in his life admitted to a carburettor being his fault. He said a carburettor is a matter of fact and not of fault. I said everything with Henri was a matter of fact and nothing was ever his fault, including his mother. And for eleven days we were very polite." She folded the gloves together on her knee. "It was the worst eleven days of my marriage. Worse than his mother. Worse than the funeral. At the funeral, at least, I could talk to him."</w:t>
+        <w:t>"It was about a carburettor," said Madame Fournier. "He said I had flooded it. I said nothing in his life had ever been his fault, including his mother. And for eleven days we were very polite." She folded the gloves on her knee. "It was the worst eleven days of my marriage. At the funeral, at least, I could talk to him."</w:t>
       </w:r>
     </w:p>
     <w:p>
@@ -8937,17 +9755,149 @@
     </w:p>
     <w:p>
       <w:r>
-        <w:t>"She told me also. Over the wall. On Wednesday. She was crying, and she was very angry, and she said everything three times, in three languages, which is how I know it was the truth. A woman does not lie in three languages. It is too much work." Madame Fournier turned the gloves over. "And you said, so I was useful."</w:t>
-      </w:r>
-    </w:p>
-    <w:p>
-      <w:r>
-        <w:t>"How do you..."</w:t>
-      </w:r>
-    </w:p>
-    <w:p>
-      <w:r>
-        <w:t xml:space="preserve">"Because it is what Henri would have said," said Madame Fournier, with great contempt. "It is what every man says, in every language, when a woman tells him the truth and the truth has no flattery in it. </w:t>
+        <w:t>"She told me also. Over the wall. She said everything three times, in three languages, which is how I know it was the truth. A woman does not lie in three languages. It is too much work. And you said, so I was useful."</w:t>
+      </w:r>
+    </w:p>
+    <w:p>
+      <w:r>
+        <w:t>"It is what Henri would have said," said Madame Fournier, with great contempt. "It is what every man says when a woman tells him the truth and the truth has no flattery in it." She stood up, a hand on the banister. "Monsieur Lind. A woman reads eleven nights of a book in a language she does not speak, by a lamp, with a dictionary, and then she walks into a lake in her cardigan to save it. You think she was being useful? Nobody walks into a lake to be useful. Henri would not walk into a lake to save his own mother, and she owned a vineyard."</w:t>
+      </w:r>
+    </w:p>
+    <w:p>
+      <w:r>
+        <w:t>She went to the door, and stopped there with her hand on the latch, as everybody in that valley seemed to stop at doors, to say the last thing when it could no longer be answered.</w:t>
+      </w:r>
+    </w:p>
+    <w:p>
+      <w:r>
+        <w:t xml:space="preserve">"And the other thing," she said. "The thing she said. </w:t>
+      </w:r>
+      <w:r>
+        <w:rPr>
+          <w:i/>
+        </w:rPr>
+        <w:t>At the beginning.</w:t>
+      </w:r>
+      <w:r>
+        <w:t xml:space="preserve"> You heard that?"</w:t>
+      </w:r>
+    </w:p>
+    <w:p>
+      <w:r>
+        <w:t>"I heard it."</w:t>
+      </w:r>
+    </w:p>
+    <w:p>
+      <w:r>
+        <w:t>"Then why did you not ask her about the end?"</w:t>
+      </w:r>
+    </w:p>
+    <w:p>
+      <w:r>
+        <w:t>She went out. Tobias stood in the hall alone and finally, two days late, at the speed of the English, understood what Catarina had been waiting for on the landing.</w:t>
+      </w:r>
+    </w:p>
+    <w:p>
+      <w:pPr>
+        <w:spacing w:before="160" w:after="160"/>
+        <w:ind w:firstLine="0"/>
+        <w:jc w:val="center"/>
+      </w:pPr>
+      <w:r>
+        <w:t>*  *  *</w:t>
+      </w:r>
+    </w:p>
+    <w:p>
+      <w:pPr>
+        <w:ind w:firstLine="0"/>
+      </w:pPr>
+      <w:r>
+        <w:t>He went to the kitchen. She was not there. She was in the scullery, with her sleeves rolled up, scrubbing a pan that did not need it, and she did not turn round when he came to the door.</w:t>
+      </w:r>
+    </w:p>
+    <w:p>
+      <w:r>
+        <w:t>"Catarina," he said.</w:t>
+      </w:r>
+    </w:p>
+    <w:p>
+      <w:r>
+        <w:t>"Senhor Lind."</w:t>
+      </w:r>
+    </w:p>
+    <w:p>
+      <w:r>
+        <w:t>"I rang Camilla back. This afternoon, before Madame Fournier came. I want you to know that it was before." He stood in the doorway with his hands at his sides. "I said no. I said I was sorry about Gerald, and about a great many things, most of which were my fault and some of which were the duvet's. I should have said it on Wednesday, and I didn't, because she was crying and I'm a coward. She can sell the house. She can keep the duvet."</w:t>
+      </w:r>
+    </w:p>
+    <w:p>
+      <w:r>
+        <w:t>The scrubbing stopped.</w:t>
+      </w:r>
+    </w:p>
+    <w:p>
+      <w:r>
+        <w:t>"And Porto," he went on, because if he stopped he would never start again. "I said Porto because I'm frightened. Because a man with a claret tie stood in a car park and talked about your sister. I'd rather you were in Porto, being fed by Fernanda, hating me, than here when he comes. I said it like an idiot. I'm sorry."</w:t>
+      </w:r>
+    </w:p>
+    <w:p>
+      <w:r>
+        <w:t>She did not turn round. But she put the pan down in the water, very slowly, and put both hands on the edge of the sink, the way she had held it on the day Victor Hale came, with her knuckles white.</w:t>
+      </w:r>
+    </w:p>
+    <w:p>
+      <w:r>
+        <w:t>"And the book," she said, to the window. "That I read. That I used you."</w:t>
+      </w:r>
+    </w:p>
+    <w:p>
+      <w:r>
+        <w:t>"At the beginning," said Tobias.</w:t>
+      </w:r>
+    </w:p>
+    <w:p>
+      <w:r>
+        <w:t>"Yes."</w:t>
+      </w:r>
+    </w:p>
+    <w:p>
+      <w:r>
+        <w:t>"And at the end?"</w:t>
+      </w:r>
+    </w:p>
+    <w:p>
+      <w:r>
+        <w:t>There was a very long silence in the scullery. Outside, the light was going over the pond. The pelican, at the end of the jetty, had turned round, and was facing the house.</w:t>
+      </w:r>
+    </w:p>
+    <w:p>
+      <w:r>
+        <w:t>"I do not know the end," said Catarina at last, very quietly. "Nobody knows the end. That is why they read the book." She turned off the tap. "But I know the middle. In the middle, I stopped reading your pages at night, because I did not need them any more. I knew where my sister was not. I stayed anyway." She turned round. Her eyes were very bright and her chin was up, the way it had been at the inn in the Camargue, and there was a smear of soap on her cheek. "In the middle, I am not using you. In the middle, I am only..." She stopped. She searched for it, and he watched her search, through two languages, for a word, and not find it, and decide, with visible courage, to say the nearest one she had. "I am only here."</w:t>
+      </w:r>
+    </w:p>
+    <w:p>
+      <w:r>
+        <w:t>He did not say anything clever. He did not have anything clever. He crossed the scullery, three steps, and took her soapy hands in his, and held them, and she let him.</w:t>
+      </w:r>
+    </w:p>
+    <w:p>
+      <w:r>
+        <w:t>"Then I'll stay too," he said. "Here. In the middle. Until we find out how it ends."</w:t>
+      </w:r>
+    </w:p>
+    <w:p>
+      <w:r>
+        <w:t>"You are very bad at Portuguese," said Catarina, unsteadily.</w:t>
+      </w:r>
+    </w:p>
+    <w:p>
+      <w:r>
+        <w:t>"I know."</w:t>
+      </w:r>
+    </w:p>
+    <w:p>
+      <w:r>
+        <w:t xml:space="preserve">"And English. You are also bad at English. </w:t>
       </w:r>
       <w:r>
         <w:rPr>
@@ -8956,152 +9906,6 @@
         <w:t>So I was useful.</w:t>
       </w:r>
       <w:r>
-        <w:t>" She stood up, a little stiffly, with a hand on the banister. "Monsieur Lind. She walked into a lake for your book because she had read it. Think about that. A woman reads eleven nights of a book in a language she does not speak, by a lamp, on the floor, with a dictionary, and then she walks into a lake in September in her cardigan to save it. You think she was being useful?" She pulled the gloves back on. "Nobody walks into a lake to be useful. Henri would not walk into a lake to save his own mother, and she owned a vineyard."</w:t>
-      </w:r>
-    </w:p>
-    <w:p>
-      <w:r>
-        <w:t>She went to the door, and stopped there with her hand on the latch, as everybody in that valley seemed to stop at doors, to say the last thing when it could no longer be answered.</w:t>
-      </w:r>
-    </w:p>
-    <w:p>
-      <w:r>
-        <w:t xml:space="preserve">"And the other thing," she said. "The thing she said. </w:t>
-      </w:r>
-      <w:r>
-        <w:rPr>
-          <w:i/>
-        </w:rPr>
-        <w:t>At the beginning.</w:t>
-      </w:r>
-      <w:r>
-        <w:t xml:space="preserve"> You heard that?"</w:t>
-      </w:r>
-    </w:p>
-    <w:p>
-      <w:r>
-        <w:t>"I heard it."</w:t>
-      </w:r>
-    </w:p>
-    <w:p>
-      <w:r>
-        <w:t>"Then why did you not ask her about the end?"</w:t>
-      </w:r>
-    </w:p>
-    <w:p>
-      <w:r>
-        <w:t>She went out. The bell, for some reason, played its four notes again as the door closed, and Tobias stood in the hall alone, beside the coat-stand and the green visitors' book and the telephone that listened, and finally, two days late, at the speed of the English, understood what she had been waiting for on the landing.</w:t>
-      </w:r>
-    </w:p>
-    <w:p>
-      <w:pPr>
-        <w:spacing w:before="160" w:after="160"/>
-        <w:ind w:firstLine="0"/>
-        <w:jc w:val="center"/>
-      </w:pPr>
-      <w:r>
-        <w:t>*  *  *</w:t>
-      </w:r>
-    </w:p>
-    <w:p>
-      <w:pPr>
-        <w:ind w:firstLine="0"/>
-      </w:pPr>
-      <w:r>
-        <w:t>He went to the kitchen. She was not there. She was in the scullery, with her sleeves rolled up, scrubbing a pan that did not need it, and she did not turn round when he came to the door.</w:t>
-      </w:r>
-    </w:p>
-    <w:p>
-      <w:r>
-        <w:t>"Catarina," he said.</w:t>
-      </w:r>
-    </w:p>
-    <w:p>
-      <w:r>
-        <w:t>"Senhor Lind."</w:t>
-      </w:r>
-    </w:p>
-    <w:p>
-      <w:r>
-        <w:t>"I rang Camilla back. This afternoon. Before Madame Fournier came. I want you to know that it was before." He stood in the doorway with his hands at his sides, because he did not know what else to do with them. "I said no. I said I was sorry about Gerald, and I was sorry about the house, and I was sorry about a great many things, most of which were my fault and some of which were the duvet's. And I said no. I should have said it on Wednesday, and I didn't, because she was crying and I'm a coward. But I've said it now. She can sell the house. She can keep the duvet."</w:t>
-      </w:r>
-    </w:p>
-    <w:p>
-      <w:r>
-        <w:t>The scrubbing stopped.</w:t>
-      </w:r>
-    </w:p>
-    <w:p>
-      <w:r>
-        <w:t>"And Porto," he went on, because if he stopped he would never start again. "I didn't say Porto because I wanted you to go. I said Porto because I'm frightened. Because a man with a claret tie stood in a car park in Aix and talked about your sister, and I can't bear it. I can't bear the idea of you being in this house when he comes, if he comes. I'd rather you were in Porto, being fed by Fernanda, hating me, than here." He took a breath. "That's what I meant. I said it like an idiot. I'm sorry."</w:t>
-      </w:r>
-    </w:p>
-    <w:p>
-      <w:r>
-        <w:t>She did not turn round. But she put the pan down in the water, very slowly, and put both hands on the edge of the sink, the way she had held it on the day Victor Hale came, with her knuckles white.</w:t>
-      </w:r>
-    </w:p>
-    <w:p>
-      <w:r>
-        <w:t>"And the book," she said, to the window. "That I read. That I used you."</w:t>
-      </w:r>
-    </w:p>
-    <w:p>
-      <w:r>
-        <w:t>"At the beginning," said Tobias.</w:t>
-      </w:r>
-    </w:p>
-    <w:p>
-      <w:r>
-        <w:t>"Yes."</w:t>
-      </w:r>
-    </w:p>
-    <w:p>
-      <w:r>
-        <w:t>"And at the end?"</w:t>
-      </w:r>
-    </w:p>
-    <w:p>
-      <w:r>
-        <w:t>There was a very long silence in the scullery. Outside, the light was going over the pond. The pelican, at the end of the jetty, had turned round, and was facing the house.</w:t>
-      </w:r>
-    </w:p>
-    <w:p>
-      <w:r>
-        <w:t>"I do not know the end," said Catarina at last, very quietly. "Nobody knows the end. That is why they read the book." She turned off the tap. "But I know the middle. In the middle, I stopped reading your pages at night, because I did not need them any more. I knew where my sister was not. I stayed anyway." She turned round. Her eyes were very bright and her chin was up, the way it had been at the inn in the Camargue, and there was a smear of soap on her cheek. "In the middle, I am not using you. In the middle, I am only..." She stopped. She searched for it, and he watched her search, through two languages, for a word, and not find it, and decide, with visible courage, to say the nearest one she had. "I am only here."</w:t>
-      </w:r>
-    </w:p>
-    <w:p>
-      <w:r>
-        <w:t>He did not say anything clever. He did not have anything clever. He crossed the scullery, three steps, and took her soapy hands in his, and held them, and she let him.</w:t>
-      </w:r>
-    </w:p>
-    <w:p>
-      <w:r>
-        <w:t>"Then I'll stay too," he said. "Here. In the middle. Until we find out how it ends."</w:t>
-      </w:r>
-    </w:p>
-    <w:p>
-      <w:r>
-        <w:t>"You are very bad at Portuguese," said Catarina, unsteadily.</w:t>
-      </w:r>
-    </w:p>
-    <w:p>
-      <w:r>
-        <w:t>"I know."</w:t>
-      </w:r>
-    </w:p>
-    <w:p>
-      <w:r>
-        <w:t xml:space="preserve">"And English. You are also bad at English. </w:t>
-      </w:r>
-      <w:r>
-        <w:rPr>
-          <w:i/>
-        </w:rPr>
-        <w:t>So I was useful.</w:t>
-      </w:r>
-      <w:r>
         <w:t>" She shook her head. "Terrible. A terrible sentence. I would give it to a child of six and say, no, Rui, again."</w:t>
       </w:r>
     </w:p>
@@ -9112,7 +9916,7 @@
     </w:p>
     <w:p>
       <w:r>
-        <w:t>She held his eyes for a long moment, with their wet hands between them. Then she laughed, a small cracked laugh, and took one hand back to wipe her eyes with the back of her wrist, and left a stripe of soap across her eyebrow, and did not care.</w:t>
+        <w:t>She held his eyes for a moment, with their wet hands between them. Then she laughed, a small cracked laugh, and took one hand back to wipe her eyes with the back of her wrist, and left a stripe of soap across her eyebrow, and did not care.</w:t>
       </w:r>
     </w:p>
     <w:p>
@@ -9132,7 +9936,7 @@
     </w:p>
     <w:p>
       <w:r>
-        <w:t>That night the radio from Lisbon came back on. She sang along to it, off-key, in the kitchen, and he sat at the top of the stairs and listened, the way he had listened in the first week, before he knew she could read, and the house, which had been holding its breath for two days, let it out, all at once, through every window, over the pond, where the pelican stood on one leg in the dark and, for the first time in a week, put its head under its wing and slept.</w:t>
+        <w:t>That night the radio from Lisbon came back on, and she sang along to it, off-key, and the house, which had been holding its breath for two days, let it out through every window, over the pond, where the pelican put its head under its wing and slept.</w:t>
       </w:r>
     </w:p>
     <w:p>
@@ -9368,7 +10172,7 @@
     </w:p>
     <w:p>
       <w:r>
-        <w:t>Mara arrived at a quarter to midnight in a dressing gown, wellington boots and a raincoat, with her service card in one hand and a torch in the other, followed by two gendarmes from Saint-Martin who had been playing cards and had brought the cards. She looked at the pond for a long time. She looked at the pelican. She looked at Hugo.</w:t>
+        <w:t>Mara arrived at a quarter to midnight in a dressing gown, wellington boots and a raincoat, with her service card in one hand and a torch in the other, followed by two gendarmes from Saint-Martin who had been playing cards and had brought the cards. She looked at the pond for a while. She looked at the pelican. She looked at Hugo.</w:t>
       </w:r>
     </w:p>
     <w:p>
@@ -9526,26 +10330,62 @@
     </w:p>
     <w:p>
       <w:r>
-        <w:t>"Then we will not be on this side of the water," said Tobias.</w:t>
-      </w:r>
-    </w:p>
-    <w:p>
-      <w:r>
-        <w:t>Inês Vidal had been living since March in the old eel-fisher's hut half a kilometre down the outflow, where the pond narrowed into a reed channel and then gave itself up to the marsh, on land that belonged to a cousin of nobody who visited.</w:t>
-      </w:r>
-    </w:p>
-    <w:p>
-      <w:r>
-        <w:t xml:space="preserve">They rowed down the channel at dawn, with the tape in Tobias's coat and the notebook buttoned inside Catarina's cardigan, because Mara had said on the telephone, at midnight, </w:t>
+        <w:t xml:space="preserve">Tobias did not answer. He was standing at the study window in the dark, where he had stood on the night they walked the jetty, looking at the far shore, where the pond narrowed into the reeds. He was thinking of a torch that had come on there at midnight and gone off again. Of an old man at the market who had wrapped a third eel, a small one, in a single sheet of newspaper, </w:t>
       </w:r>
       <w:r>
         <w:rPr>
           <w:i/>
         </w:rPr>
-        <w:t>I know where she is, I'll meet you there, bring everything, and for God's sake don't leave it in the house</w:t>
-      </w:r>
-      <w:r>
-        <w:t>.</w:t>
+        <w:t>for the heron</w:t>
+      </w:r>
+      <w:r>
+        <w:t xml:space="preserve">, and said that the heron was careful and liked bread. Herons do not eat bread. Catarina had said it herself, at the top of the market, frightened. And Madame Fournier had said, in the car: </w:t>
+      </w:r>
+      <w:r>
+        <w:rPr>
+          <w:i/>
+        </w:rPr>
+        <w:t>the heron is being fed, and nobody is going to find the heron unless Baptistin decides it.</w:t>
+      </w:r>
+    </w:p>
+    <w:p>
+      <w:r>
+        <w:t>"Catarina," he said. "You walked the marsh three times. In the afternoons."</w:t>
+      </w:r>
+    </w:p>
+    <w:p>
+      <w:r>
+        <w:t>"Three times. Only reeds."</w:t>
+      </w:r>
+    </w:p>
+    <w:p>
+      <w:r>
+        <w:t>"In the afternoons," he said. "When anybody could see you go. From the road, from the lane, from a car parked at the top of it. She'd have seen you too. And she'd have stayed in, because she's careful, because you're being watched, and if she came out they'd have two of you." He turned round. "Baptistin's hut is on the channel. The torch I saw was on the channel. She isn't hiding from you. She's hiding from whoever's watching you. So we don't walk down the bank in daylight like people looking for somebody. We go by water, at dawn, before anybody's at the top of the lane, and we take everything with us, the tape and the notebook, because Hale has just told us he's coming back, and I'm not leaving them in a house he's walked into twice."</w:t>
+      </w:r>
+    </w:p>
+    <w:p>
+      <w:r>
+        <w:t>She had come up behind him, and she looked at him for some time across the dark study.</w:t>
+      </w:r>
+    </w:p>
+    <w:p>
+      <w:r>
+        <w:t>"You thought of this," she said, "alone?"</w:t>
+      </w:r>
+    </w:p>
+    <w:p>
+      <w:r>
+        <w:t>"I had a great deal of help from an eel," said Tobias, and picked up the telephone again, and told Mara where they would be, and when.</w:t>
+      </w:r>
+    </w:p>
+    <w:p>
+      <w:r>
+        <w:t>Inês Vidal had been living since March in the old eel-fisher's hut half a kilometre down the outflow, where the pond narrowed into a reed channel and then gave itself up to the marsh.</w:t>
+      </w:r>
+    </w:p>
+    <w:p>
+      <w:r>
+        <w:t>They rowed down the channel at dawn, with the tape in Tobias's coat and the notebook buttoned inside Catarina's cardigan.</w:t>
       </w:r>
     </w:p>
     <w:p>
@@ -9609,7 +10449,16 @@
     </w:p>
     <w:p>
       <w:r>
-        <w:t>"I rang her three days ago," Inês said, in careful English. "I did not trust the police until I met this one."</w:t>
+        <w:t xml:space="preserve">"She came ten minutes ago, along the bank, and sat on my step, and said, </w:t>
+      </w:r>
+      <w:r>
+        <w:rPr>
+          <w:i/>
+        </w:rPr>
+        <w:t>Mr Lind thinks you are here, and he is usually wrong, so I have come to prove it,</w:t>
+      </w:r>
+      <w:r>
+        <w:t>" said Inês, in careful English. "I did not trust the police until I met this one."</w:t>
       </w:r>
     </w:p>
     <w:p>
@@ -9707,7 +10556,7 @@
     </w:p>
     <w:p>
       <w:r>
-        <w:t>"It was three dead people," said Mara. "Aubry. Giraud. Marchetti. You didn't do this for a house, Mr Hale. Who was on the jetty?"</w:t>
+        <w:t>"Who was on the jetty?" said Mara.</w:t>
       </w:r>
     </w:p>
     <w:p>
@@ -9717,21 +10566,36 @@
     </w:p>
     <w:p>
       <w:r>
-        <w:t xml:space="preserve">"The tape has already said a first name," said Mara. "You said it. On the twelfth of March. </w:t>
+        <w:t>It was Tobias who answered, from the punt, with the oars across his knees, and he surprised himself, because he had not known until he opened his mouth that he was going to say anything at all.</w:t>
+      </w:r>
+    </w:p>
+    <w:p>
+      <w:r>
+        <w:t xml:space="preserve">"On the twelfth of March," he said, "you were in that study, with Elise's papers on the desk, and a man rang you and told you she wasn't to bring the pages. And when he'd hung up you said, </w:t>
       </w:r>
       <w:r>
         <w:rPr>
           <w:i/>
         </w:rPr>
-        <w:t>Edouard, she's a friend.</w:t>
-      </w:r>
-      <w:r>
-        <w:t xml:space="preserve"> You can give me the rest, or the juge can find it. The juge does not want a deal."</w:t>
-      </w:r>
-    </w:p>
-    <w:p>
-      <w:r>
-        <w:t>He gave her the rest on the second telling. Maître Edouard Delacroix-Roux, avocat, Aix. The man who had said he would be on the jetty. And then, because a cashier who has begun does not know where to stop, Armand Vial. The Fondation Vial. Marseille. The two million for the cardinal's photograph. The second box. Vial did not attend jetties, Hale said. Vial sent a lawyer, and the lawyer sent calissons.</w:t>
+        <w:t>Edouard, she's a friend. I've known her twenty years. Edouard?</w:t>
+      </w:r>
+      <w:r>
+        <w:t>" Hale's face did something terrible and small. "It's on a tape, Victor. Inês made it. Nobody answered you that night. You stood in an empty room and asked for her, and nobody answered." Tobias held his eyes. "I'm answering. That's all this is. Somebody's finally asking you back."</w:t>
+      </w:r>
+    </w:p>
+    <w:p>
+      <w:r>
+        <w:t>Hale stood quite still on the oak planks. Then he took his hands out of his pockets, as if they had become very heavy, and said the name again, the whole of it this time, to the water: Maître Edouard Delacroix-Roux, avocat, Aix. The man who had said he would be on the jetty. And then, because a cashier who has begun does not know where to stop, Armand Vial. The Fondation Vial. Marseille. The two million for the cardinal's photograph. The second box. Vial did not attend jetties, Hale said. Vial sent a lawyer, and the lawyer sent calissons.</w:t>
+      </w:r>
+    </w:p>
+    <w:p>
+      <w:r>
+        <w:t>Mara wrote it all down, and then looked across at the punt, at the man who had stayed on a jetty in September and given advice.</w:t>
+      </w:r>
+    </w:p>
+    <w:p>
+      <w:r>
+        <w:t>"I'll want that in a statement, Mr Lind," she said. "Typed. On paper. Kept somewhere dry."</w:t>
       </w:r>
     </w:p>
     <w:p>
@@ -10094,7 +10958,7 @@
     </w:p>
     <w:p>
       <w:r>
-        <w:t>"I did not know his name. I knew he knew Monsieur Hale. I knew that if I went to the police, I would be going to his police." Inês sat back. "So I stayed in the hut. For seven months. Baptistin brought me bread and eels and newspapers and did not ask anything. I worked nights at the bakery in Saint-Martin, washing the trays, for cash. Gigi found me in June. She was a stray. She does not like strangers. She makes exceptions for tins." The dog thumped her tail once under the table, hearing her name. "I watched the house. I saw the new tenant come, an Englishman with a typewriter. I saw my sister come, in September, with her bag, and get out of a taxi, and stand at the gate, and look at the jetty for a long time. I nearly ran up the lane. I nearly did, every day." Her voice cracked for the first time, very slightly, and steadied. "But I thought, if I go to her, they will know where I am, and they will know she knows. So I watched. I watched her go into the lake after his pages. I watched her peg them on a line. I watched her sit on the jetty with him at night with the binoculars, looking at birds." She glanced at Tobias, and then away. "I watched her hold his hand. Under the stars. On the night the lights went out."</w:t>
+        <w:t>"I did not know his name. I knew he knew Monsieur Hale. I knew that if I went to the police, I would be going to his police." Inês sat back. "So I stayed in the hut. For seven months. Baptistin brought me bread and eels and newspapers and did not ask anything. I worked nights at the bakery in Saint-Martin, washing the trays, for cash. Gigi found me in June. She was a stray. She does not like strangers. She makes exceptions for tins." The dog thumped her tail once under the table, hearing her name. "I watched the house. I saw the new tenant come, an Englishman with a typewriter. I saw my sister come, in September, with her bag, and get out of a taxi, and stand at the gate, and look at the jetty for some time. I nearly ran up the lane. I nearly did, every day." Her voice cracked for the first time, very slightly, and steadied. "But I thought, if I go to her, they will know where I am, and they will know she knows. So I watched. I watched her go into the lake after his pages. I watched her peg them on a line. I watched her sit on the jetty with him at night with the binoculars, looking at birds." She glanced at Tobias, and then away. "I watched her hold his hand. Under the stars. On the night the lights went out."</w:t>
       </w:r>
     </w:p>
     <w:p>
@@ -10104,7 +10968,16 @@
     </w:p>
     <w:p>
       <w:r>
-        <w:t>"I watched for a long time," said Inês. "And then one day the Inspector came to the lane, in her own car, on a Sunday, and stood by the gate, alone, and looked at the jetty for twenty minutes the way my sister looked at it. Not like a policewoman. Like somebody who was sorry." She looked at Mara. "That was in October. I found your number from the bakery's telephone book. It took me another three weeks to ring it. I am a careful woman. Careful is how I am still alive."</w:t>
+        <w:t xml:space="preserve">"I watched for a while," said Inês. "And then one day the Inspector came to the lane, in her own car, on a Sunday, and stood by the gate, alone, and looked at the jetty for twenty minutes the way my sister looked at it. Not like a policewoman. Like somebody who was sorry." She looked at Mara. "That was in October. I found your number in the bakery's telephone book, and I wrote it on the wall of the hut, with a nail, and I did not ring it. I looked at it every night. I am a careful woman. Careful is how I am still alive." She looked down the table at Tobias. "And then this morning, at dawn, you sat on my step and said, </w:t>
+      </w:r>
+      <w:r>
+        <w:rPr>
+          <w:i/>
+        </w:rPr>
+        <w:t>Mr Lind thinks you are here</w:t>
+      </w:r>
+      <w:r>
+        <w:t>. I did not know whether to be angry with him or to kiss him. I have decided to be angry. It is more Portuguese."</w:t>
       </w:r>
     </w:p>
     <w:p>
@@ -10149,7 +11022,7 @@
     </w:p>
     <w:p>
       <w:r>
-        <w:t xml:space="preserve">Then he went back up to the house and sat at the Olivetti and began, for the third time, the chapter about the night of the fourteenth of March. He did not invent anything. He did not need to. He wrote it the way Inês had said it, in order, with the umbrella and the hand on the shoulder and the handkerchief and the smile, and when he got to the part where she let go of Elise on the ladder and ran, he stopped, and sat for a long time, and then wrote only: </w:t>
+        <w:t xml:space="preserve">Then he went back up to the house and sat at the Olivetti and began, for the third time, the chapter about the night of the fourteenth of March. He did not invent anything. He did not need to. He wrote it the way Inês had said it, in order, with the umbrella and the hand on the shoulder and the handkerchief and the smile, and when he got to the part where she let go of Elise on the ladder and ran, he stopped, and sat for a good while, and then wrote only: </w:t>
       </w:r>
       <w:r>
         <w:rPr>
@@ -10553,7 +11426,7 @@
     </w:p>
     <w:p>
       <w:r>
-        <w:t>Inês did not smile. She did not say anything. She simply looked, for as long as he was there to be looked at, the way a heron looks at the water.</w:t>
+        <w:t>Inês did not smile. She said nothing. She simply looked, for as long as he was there to be looked at, the way a heron looks at the water.</w:t>
       </w:r>
     </w:p>
     <w:p>
@@ -11101,7 +11974,7 @@
         <w:t>Liaison.</w:t>
       </w:r>
       <w:r>
-        <w:t>" She paused. "He put everything else in a cardboard box. The photographs, the trophy, the cigars, the commendation. And then he stood looking at the pen for a long time. And then he picked it up, and held it out to me."</w:t>
+        <w:t>" She paused. "He put everything else in a cardboard box. The photographs, the trophy, the cigars, the commendation. And then he stood looking at the pen for some time. And then he picked it up, and held it out to me."</w:t>
       </w:r>
     </w:p>
     <w:p>
@@ -11216,7 +12089,7 @@
     </w:p>
     <w:p>
       <w:r>
-        <w:t>Tobias thought of the swimming goggles on the floor of the small grey car, among the parking tickets and the empty water bottles, on the way to Avignon. He had not asked about them. He was glad, now, that he had not.</w:t>
+        <w:t>Tobias thought of the swimming goggles on the floor of the small grey car, among the parking tickets, on the way to Avignon. He had not asked about them. He was glad, now, that he had not.</w:t>
       </w:r>
     </w:p>
     <w:p>
@@ -11658,7 +12531,7 @@
     </w:p>
     <w:p>
       <w:r>
-        <w:t>They did not say anything for a long time. Catarina's arm was through his. She had put it there at the door of the village hall without asking, and he had not mentioned it, and it had stayed.</w:t>
+        <w:t>They did not say anything for some time. Catarina's arm was through his. She had put it there at the door of the village hall without asking, and he had not mentioned it, and it had stayed.</w:t>
       </w:r>
     </w:p>
     <w:p>
@@ -11857,7 +12730,7 @@
     </w:p>
     <w:p>
       <w:r>
-        <w:t>It was not like the cheek, in November. It was not like anything. It went on for some time. Somewhere in the middle of it his nerve went back into its cupboard and shut the door and left him to it, and he discovered that he did not need it, and that a man who has been very bad at a great many things for forty-six years can be, without any practice at all, reasonably good at one.</w:t>
+        <w:t>It was not like the cheek, at this same gate, in the autumn. It was not like anything. It went on for a good while. Somewhere in the middle of it his nerve went back into its cupboard and shut the door and left him to it, and he discovered that he did not need it, and that a man who has been very bad at a great many things for forty-six years can be, without any practice at all, reasonably good at one.</w:t>
       </w:r>
     </w:p>
     <w:p>
@@ -11951,7 +12824,7 @@
     </w:p>
     <w:p>
       <w:r>
-        <w:t>Tobias stood at the gate for a long time with the corrected letter in his hand, under the three women waiting for their ship, until he could not feel his feet. Then he went in, and found the bacalhau, which she had already bought, he discovered, a week ago, and hidden at the back of the cold larder wrapped in a tea towel, and put it in a bowl of cold water, and set an alarm on the Olivetti's bell, by an arrangement of string and a clothes peg that would have impressed Hugo, for three o'clock in the morning.</w:t>
+        <w:t>Tobias stood at the gate for a while with the corrected letter in his hand, under the three women waiting for their ship, until he could not feel his feet. Then he went in, and found the bacalhau, which she had already bought, he discovered, a week ago, and hidden at the back of the cold larder wrapped in a tea towel, and put it in a bowl of cold water, and set an alarm on the Olivetti's bell, by an arrangement of string and a clothes peg that would have impressed Hugo, for three o'clock in the morning.</w:t>
       </w:r>
     </w:p>
     <w:p>
@@ -12033,7 +12906,7 @@
     </w:p>
     <w:p>
       <w:r>
-        <w:t>The judge, a large, grey, patient man who had sat in that room for twenty-two years and believed himself beyond surprise, looked at Hugo for a long moment over his glasses.</w:t>
+        <w:t>The judge, a large, grey, patient man who had sat in that room for twenty-two years and believed himself beyond surprise, looked at Hugo for a moment over his glasses.</w:t>
       </w:r>
     </w:p>
     <w:p>
@@ -12323,6 +13196,20 @@
       </w:r>
     </w:p>
     <w:p>
+      <w:r>
+        <w:t xml:space="preserve">He had done that once before, Tobias realised, on the first morning, when the court, as French courts do before they hear a single fact, had heard who the accused was. The investigator who had prepared the report on his personality, a tired woman with a ring binder, had read it out in a flat voice. Born Edouard Roux, in 1973, in the concierge's lodge of a building on the Cours Mirabeau. Mother concierge there for thirty-one years; now ninety-one, in a home on the road to Éguilles, visited every Sunday without fail, with calissons. Schooling paid for by a tenant of the building, a young avocat named Armand Vial. The name Delacroix taken at the oath, from a bâtonnier on the first floor. </w:t>
+      </w:r>
+      <w:r>
+        <w:rPr>
+          <w:i/>
+        </w:rPr>
+        <w:t>He never knew my mother's name,</w:t>
+      </w:r>
+      <w:r>
+        <w:t xml:space="preserve"> the accused had told her, of the bâtonnier, and it was the only sentence in the report she had put in quotation marks. When she read it out, Delacroix-Roux had looked down at his hands, exactly as he did now, and Tobias had thought, against his will, of a woman polishing brass for men who walked past her, and of a housekeeper nobody wonders about, and of how the same small wound can make one person very careful and another person a murderer, and how you cannot tell which from the outside.</w:t>
+      </w:r>
+    </w:p>
+    <w:p>
       <w:pPr>
         <w:spacing w:before="160" w:after="160"/>
         <w:ind w:firstLine="0"/>
@@ -12629,7 +13516,7 @@
     </w:p>
     <w:p>
       <w:r>
-        <w:t>She was quiet for a long time. Then she looked up at him with her serious dark eyes, and he saw that she was trying not to laugh.</w:t>
+        <w:t>She was quiet for a while. Then she looked up at him with her serious dark eyes, and he saw that she was trying not to laugh.</w:t>
       </w:r>
     </w:p>
     <w:p>
@@ -12752,7 +13639,7 @@
     </w:p>
     <w:p>
       <w:r>
-        <w:t xml:space="preserve">Catarina, beside him, very pink in the light of the dashboard, did not say anything. She put her hand on his knee, quite firmly, as she had put it there in a café in Lyon when a chambermaid said </w:t>
+        <w:t xml:space="preserve">Catarina, beside him, very pink in the light of the dashboard, said nothing. She put her hand on his knee, quite firmly, as she had put it there in a café in Lyon when a chambermaid said </w:t>
       </w:r>
       <w:r>
         <w:rPr>
@@ -13361,7 +14248,7 @@
     </w:p>
     <w:p>
       <w:r>
-        <w:t>When it came off, she dipped one finger in, and tasted it, and sat for a long time looking at the water.</w:t>
+        <w:t>When it came off, she dipped one finger in, and tasted it, and sat for some time looking at the water.</w:t>
       </w:r>
     </w:p>
     <w:p>
@@ -13408,7 +14295,7 @@
         <w:t>Zamenis scalaris.</w:t>
       </w:r>
       <w:r>
-        <w:t xml:space="preserve"> Completely harmless. Lives in old walls and eats mice. They're very common in Provence." He looked up at Tobias and Catarina, who were standing in the doorway in a tight formation, Catarina with the broom, Tobias with the Olivetti's dust cover held out in front of him like a shield, exactly as they had stood in October. "It's been here the whole time. Behind the false back. Nobody looked behind the false back, because you'd already found what was behind the false back. So it was the safest place in the house." He switched off the torch. "That's what a snake would think. If snakes thought. Which they don't, mostly."</w:t>
+        <w:t xml:space="preserve"> Completely harmless. Lives in old walls and eats mice. They're very common in Provence." He looked up at Tobias and Catarina, who were standing in the doorway in a tight formation, Catarina with the broom, Tobias with the Olivetti's dust cover held out in front of him like a shield, exactly as they had stood in October. "It's been here the whole time. Behind the false back. Nobody looked behind the false back, because you'd already found what was behind the false back. So it was the safest place in the house." He switched off the torch. "That's what a snake would think. If snakes thought. Which they don't, mostly." He considered the snake. "And it's exactly where I told the Gastons it was. So technically I wasn't lying. I was early."</w:t>
       </w:r>
     </w:p>
     <w:p>

</xml_diff>

<commit_message>
ILWM round 5 final pass: reread + line edit chapters 21-epilogue; timeline fixes (statement Wednesday, box opened same Thursday, epilogue July), tic reduction; rebuilt docx with TOC page numbers (292 pp)
</commit_message>
<xml_diff>
--- a/In Love with Murder, Actually/In_Love_with_Murder_Actually.docx
+++ b/In Love with Murder, Actually/In_Love_with_Murder_Actually.docx
@@ -86,7 +86,7 @@
         <w:ind w:firstLine="0"/>
       </w:pPr>
       <w:r>
-        <w:t>This is a work of fiction. The characters, the Verrane Foundation and its award, Lake Verrane, Hale Books, the Fondation Vial, the Marchetti Codex and every crime in these pages are invented. Any resemblance to actual persons, living or dead, or to actual companies, prizes or events, is coincidental. Real towns, streets, landmarks and institutions appear only as settings, and nothing in this book describes the conduct of any real person who works in them.</w:t>
+        <w:t>This is a work of fiction. The characters, the Verrane Foundation and its award, the lake house, Hale Books, the Fondation Vial, the Marchetti Codex and every crime in these pages are invented. Any resemblance to actual persons, living or dead, or to actual companies, prizes or events, is coincidental. Real towns, streets, landmarks and institutions appear only as settings, and nothing in this book describes the conduct of any real person who works in them.</w:t>
       </w:r>
     </w:p>
     <w:p>
@@ -146,7 +146,7 @@
     </w:p>
     <w:p>
       <w:r>
-        <w:t>The Verrane Foundation Award is invented, and so is Lake Verrane, which is only a pond. Prizes that charge an entry fee and then ask "commended" writers to pay for inclusion in an anthology are, unhappily, not invented. If a competition you have never heard of praises your work and then asks for money, look it up before you pay.</w:t>
+        <w:t>The Verrane Foundation Award is invented, and so is the lake, which is only a pond. Prizes that charge an entry fee and then ask "commended" writers to pay for inclusion in an anthology are, unhappily, not invented. If a competition you have never heard of praises your work and then asks for money, look it up before you pay.</w:t>
       </w:r>
     </w:p>
     <w:p>
@@ -1608,7 +1608,7 @@
     </w:p>
     <w:p>
       <w:r>
-        <w:t>He went up because it was his house. Camilla was there. Gerald, from the golf club, was there. The duvet was his. He asked if it was, because the other questions were too large for the landing. Nobody answered usefully. He went down. He put the wine back in the fridge, out of habit, took it out again, out of dignity, and drank it at the sink. He wrote a note. Gone to France. Keep the duvet. He considered adjectives, and refused them. A person cannot improve that sort of note. He put the Olivetti in its case, and the only copy of the new book in a satchel, and a postcard from a dead friend in his breast pocket, and left the lamps.</w:t>
+        <w:t>He went up because it was his house. Camilla was there. Gerald, from the golf club, was there. The duvet was his. He asked if it was, because the other questions were too large for the landing. Nobody answered usefully. He went down. He put the wine back in the fridge, out of habit, took it out again, out of dignity, and drank it at the sink. He wrote a note. Gone to France. Keep the duvet. He considered adjectives, and refused them. A person cannot improve that sort of note. He put the Olivetti in its case, and the only copy of the new book in a satchel, and a postcard from a dead friend in his breast pocket, and left the lamps on.</w:t>
       </w:r>
     </w:p>
     <w:p>
@@ -1642,7 +1642,7 @@
     </w:p>
     <w:p>
       <w:r>
-        <w:t>It was a pond. The advertisement had said lake, because a lake can be let by the week and a pond cannot. Madame Fournier called it the étang and did not discuss it. Tobias called it the lake for eleven days, because he was English and recently ruined and needed a body of water large enough to have taken a friend. It was not. You could see the far reeds from the jetty. You could wade it, if you were angry, or pushed, or simply unwilling to let paper go. A heron used it. A pelican would later occupy it, and look too big, which was the pond's opinion of grandeur.</w:t>
+        <w:t>It was a pond. The advertisement had said lake, because a lake can be let by the week and a pond cannot. Madame Fournier called it the étang and did not discuss it. Tobias called it the lake, because he was English and recently ruined and needed a body of water large enough to have taken a friend. It was not. You could see the far reeds from the jetty. You could wade it, if you were angry, or pushed, or simply unwilling to let paper go. A heron used it. A pelican would later occupy it, and look too big, which was the pond's opinion of grandeur.</w:t>
       </w:r>
     </w:p>
     <w:p>
@@ -1661,7 +1661,7 @@
     </w:p>
     <w:p>
       <w:r>
-        <w:t>Tobias Lind had carried the manuscript out to the end of the jetty because the house was too quiet to read in. He wanted wind and cold and the sound of something bigger than his own failure. The pond did not provide the sound. It provided a surface. He sat down with the satchel on his knees, a Thermos of tea at his elbow, and a gust came across the water and opened the bag like a hand.</w:t>
+        <w:t>He had carried the manuscript out to the end of the jetty because the house was too quiet to read in. He wanted wind and cold and the sound of something bigger than his own failure. The pond did not provide the sound. It provided a surface. He sat down with the satchel on his knees, a Thermos of tea at his elbow, and a gust came across the water and opened the bag like a hand.</w:t>
       </w:r>
     </w:p>
     <w:p>
@@ -1676,7 +1676,7 @@
     </w:p>
     <w:p>
       <w:r>
-        <w:t>He did not shout. He was English, and Leeds-born, and the family instinct in a disaster was to say nothing and put the kettle on. He stood very still and watched two years of his life drift away. It was, he reflected, a fairly standard Tuesday.</w:t>
+        <w:t>He did not shout. He was English, and Leeds-born, and the family instinct in a disaster was to say nothing and put the kettle on. He stood there and watched two years of his life drift away. It was, he reflected, a fairly standard Tuesday.</w:t>
       </w:r>
     </w:p>
     <w:p>
@@ -1730,7 +1730,7 @@
         <w:ind w:firstLine="0"/>
       </w:pPr>
       <w:r>
-        <w:t>She had come to the lake house in September, sent by an agency in the city. Tobias had rented the place for the autumn from a publisher named Victor Hale, who had been very generous about the price, and who had implied, in several warm emails, that the house was his. Too generous, in hindsight. The house came with a housekeeper, and the housekeeper was Portuguese, spoke perhaps thirty words of English, and had never looked at him for longer than politeness required.</w:t>
+        <w:t>She had come to the lake house at the beginning of September, eleven days before him, sent by an agency in the city. Victor Hale's emails, which had been warm, and had implied that the house was his, had said a great deal about the light and nothing about her. She was Portuguese, spoke perhaps thirty words of English, and had never looked at him for longer than politeness required.</w:t>
       </w:r>
     </w:p>
     <w:p>
@@ -1771,7 +1771,7 @@
         <w:t>pó</w:t>
       </w:r>
       <w:r>
-        <w:t>, dust, and dusted the doorframe very hard. He thought nothing of it. He thought nothing of anything that fortnight. He was a man who had recently been ruined, and the ruined are very bad at noticing.</w:t>
+        <w:t>, dust, and dusted the doorframe very hard. He thought nothing of it. He thought nothing of anything that month. He was a man who had recently been ruined, and the ruined are very bad at noticing.</w:t>
       </w:r>
     </w:p>
     <w:p>
@@ -1801,7 +1801,7 @@
     </w:p>
     <w:p>
       <w:r>
-        <w:t>He sat across from her for an hour and said nothing, because he had nothing in a language she could use. At the end of it she put a mug of tea in front of him, so weak that the tea bag had clearly been introduced to the water only briefly, in a cup with a chip in it, and walked out. He realised it was the kindest thing anyone had done for him in a year.</w:t>
+        <w:t>He sat across from her for an hour and said nothing, because he had nothing in a language she could use. At the end of it she put a cup of tea in front of him, so weak that the bag had clearly been introduced to the water only briefly. The cup had a chip in the rim. Then she walked out. He realised it was the kindest thing anyone had done for him in a year.</w:t>
       </w:r>
     </w:p>
     <w:p>
@@ -1845,7 +1845,7 @@
         <w:ind w:firstLine="0"/>
       </w:pPr>
       <w:r>
-        <w:t>By noon only a third of the pages could be read, and Tobias was struck by what he was reading.</w:t>
+        <w:t>By noon only a third of the pages could be read, and Tobias, reading them, remembered why he had written them.</w:t>
       </w:r>
     </w:p>
     <w:p>
@@ -1885,7 +1885,7 @@
     </w:p>
     <w:p>
       <w:r>
-        <w:t>Now the pages that named the villain were floating in a pond, or drying on a towel, illegibly.</w:t>
+        <w:t>Now the pages that named the villain were in a pond, or on a towel, illegible.</w:t>
       </w:r>
     </w:p>
     <w:p>
@@ -1920,7 +1920,7 @@
     </w:p>
     <w:p>
       <w:r>
-        <w:t>Later she came back with the linen she had pretended to be fetching, and stood in the kitchen doorway while he read. For the first time she did not look away.</w:t>
+        <w:t>Later, when he had brought the pages down to the kitchen table, she came back with the linen she had pretended to be fetching, and stood in the doorway while he read. For the first time she did not look away.</w:t>
       </w:r>
     </w:p>
     <w:p>
@@ -1940,7 +1940,7 @@
     </w:p>
     <w:p>
       <w:r>
-        <w:t>Then she went back to work, and he sat very still for a long time. The name stayed where she had left it. Inês. He wrote it on the back of an envelope, so that he would not lose it the way he lost everything else, and put the envelope under the Olivetti, and did not look at it again that day.</w:t>
+        <w:t>Then she went back to work, and he sat where he was until the light moved off the table. The name stayed where she had left it. Inês. He wrote it on the back of an envelope, so that he would not lose it the way he lost everything else, and put the envelope under the Olivetti, and did not look at it again that day.</w:t>
       </w:r>
     </w:p>
     <w:p>
@@ -2049,12 +2049,7 @@
     </w:p>
     <w:p>
       <w:r>
-        <w:t>Lake Verrane was in the south of France, which Tobias had known for twelve days and had somehow still failed to prepare for.</w:t>
-      </w:r>
-    </w:p>
-    <w:p>
-      <w:r>
-        <w:t>When she had gone, he walked to the garage in the village and hired a small car, because there was a bookshop in the next town and he needed, urgently, to be able to say more to his housekeeper than thank you in the voice of her aunt. The man at the garage had handed over the keys with the expression of a vet releasing a pet to an owner he did not trust. "À droite," the man had said, three times, pointing at the road. Tobias had nodded three times and driven out of the yard on the left.</w:t>
+        <w:t>When she had gone, he walked to the garage in the village and hired a small car, because there was a bookshop in the next town and he needed, urgently, to be able to say more to his housekeeper than thank you in the voice of her aunt. The man at the garage handed over the keys with the expression of a vet releasing a pet to an owner he did not trust. "À droite," he said, three times, pointing at the road. Tobias nodded three times and drove out of the yard on the left.</w:t>
       </w:r>
     </w:p>
     <w:p>
@@ -2094,7 +2089,7 @@
     </w:p>
     <w:p>
       <w:r>
-        <w:t>Madame Fournier looked at him for a long moment.</w:t>
+        <w:t>Madame Fournier looked at him.</w:t>
       </w:r>
     </w:p>
     <w:p>
@@ -2139,7 +2134,7 @@
     </w:p>
     <w:p>
       <w:r>
-        <w:t>"Non, merci," said Tobias, with great dignity. "Je suis plein."</w:t>
+        <w:t>"Non, merci," said Tobias, with what he hoped was dignity. "Je suis plein."</w:t>
       </w:r>
     </w:p>
     <w:p>
@@ -2174,7 +2169,7 @@
     </w:p>
     <w:p>
       <w:r>
-        <w:t>"Victor Hale pays me eleven hundred euros a month for this house," she said. "He tells me he rents it to a very quiet English writer."</w:t>
+        <w:t>"Victor Hale pays me eleven hundred euros a month for this house," she said. "He tells me he lends it to friends. This autumn, a very quiet English writer."</w:t>
       </w:r>
     </w:p>
     <w:p>
@@ -2298,7 +2293,7 @@
     </w:p>
     <w:p>
       <w:r>
-        <w:t>"The ink ran," Tobias said, with the dignity of a man defending his work against an appliance. "It's the water damage. It can't cope."</w:t>
+        <w:t>"The ink ran," said Tobias, defending his work against an appliance. "It's the water damage. It can't cope."</w:t>
       </w:r>
     </w:p>
     <w:p>
@@ -2328,7 +2323,7 @@
     </w:p>
     <w:p>
       <w:r>
-        <w:t>He gave the laptop back to Madame Fournier, who put it under the lace cloth with the scanner, so that they could keep each other company in disgrace. For the first time in his life, he typed the next chapter on the Olivetti on purpose.</w:t>
+        <w:t>He gave the laptop back to Madame Fournier, who put it under the lace cloth with the scanner, so that they could keep each other company in disgrace. Then he went upstairs and typed the next chapter on the Olivetti, with the relief of a man returning to a bad habit that has been proved right.</w:t>
       </w:r>
     </w:p>
     <w:p>
@@ -2436,7 +2431,7 @@
         <w:t>La Provence</w:t>
       </w:r>
       <w:r>
-        <w:t>, from the week after, folded so many times that the folds had begun to wear through. "The inquest says she left the house at about twenty to eleven. A neighbour heard a splash at about eleven. I want to know how long it takes to walk from the study to the water in the dark. I want to know what you'd see. What you'd hear."</w:t>
+        <w:t>, from the week after, folded so many times that the folds had begun to wear through. "The police report says she left the house at about twenty to eleven. A neighbour heard a splash at about eleven. I want to know how long it takes to walk from the study to the water in the dark. I want to know what you'd see. What you'd hear."</w:t>
       </w:r>
     </w:p>
     <w:p>
@@ -2464,7 +2459,7 @@
         <w:ind w:firstLine="0"/>
       </w:pPr>
       <w:r>
-        <w:t>They began in the study at twenty to eleven, with the lamp on and the Olivetti uncovered, because Elise had been working, the inquest said, until late; there had been a page in her typewriter, unfinished. Tobias had always wondered what had been on it. Nobody had thought to say.</w:t>
+        <w:t>They began in the study at twenty to eleven, with the lamp on and the Olivetti uncovered, because Elise had been working, the report said, until late; there had been a notebook open on the desk, mid-sentence. Tobias had always wondered what the sentence was. Nobody had thought to say.</w:t>
       </w:r>
     </w:p>
     <w:p>
@@ -2538,7 +2533,7 @@
     </w:p>
     <w:p>
       <w:r>
-        <w:t>"She was very slow. In the dark. In March." He looked down at the water, which was black and very still and made small private sounds against the piles. "Four minutes from the study. She left at twenty to eleven. The splash was at eleven. That leaves fifteen minutes on the jetty."</w:t>
+        <w:t>"She was very slow. In the dark. In March." He looked down at the water, which was black and flat and made small private sounds against the piles. "Four minutes from the study. She left at twenty to eleven. The splash was at eleven. That leaves fifteen minutes on the jetty."</w:t>
       </w:r>
     </w:p>
     <w:p>
@@ -2572,7 +2567,7 @@
         <w:t>do be careful of the jetty, it's rotten, I'd hate to lose another guest</w:t>
       </w:r>
       <w:r>
-        <w:t>. Catarina had found the same postscript on a card propped against the kettle when she arrived. Hale, it seemed, said it to everybody. He knelt down on the planks and put his hand flat on the wood, and then on the next plank, and the next, as Catarina had put her hand on the window seat on the day of the curtain, as if the wood might have something to say. The planks were cold and slightly damp and absolutely sound. He knocked on one. It gave back a dull, solid, unimpressed sound, like a well-fed man being asked for money.</w:t>
+        <w:t>. Catarina had found the same postscript on a card propped against the kettle when she arrived. Hale, it seemed, said it to everybody. He knelt and put his hand flat on the planks, one after another, as if the wood might have something to say. The planks were cold and slightly damp and absolutely sound. He knocked on one. It gave back a dull, solid, unimpressed sound, like a well-fed man being asked for money.</w:t>
       </w:r>
     </w:p>
     <w:p>
@@ -2626,7 +2621,7 @@
     </w:p>
     <w:p>
       <w:r>
-        <w:t>He looked at her. In the torchlight her face was very pale and very still, and she was looking not at him but at the house, at the one lit window, high up, like an eye.</w:t>
+        <w:t>He looked at her. In the torchlight her face was pale, and she was looking not at him but at the house, at the one lit window, high up, like an eye.</w:t>
       </w:r>
     </w:p>
     <w:p>
@@ -2722,7 +2717,7 @@
     </w:p>
     <w:p>
       <w:r>
-        <w:t>He thought about it, honestly, because she deserved an honest answer and he was not sure he had one.</w:t>
+        <w:t>He took his time, because she deserved an honest answer and he was not sure he had one.</w:t>
       </w:r>
     </w:p>
     <w:p>
@@ -2760,12 +2755,12 @@
         <w:ind w:firstLine="0"/>
       </w:pPr>
       <w:r>
-        <w:t>They walked back up the jetty and the three stone steps and the dark lawn, not touching, at the pace of a woman who did not like the dark. In the kitchen, in the yellow light, Catarina put the kettle on, and stood with her back to him while it boiled, and her shoulders were very straight.</w:t>
-      </w:r>
-    </w:p>
-    <w:p>
-      <w:r>
-        <w:t>When she turned round, she had two cups, and she put one in front of him, in the cup with the chip, and kept the other in both hands.</w:t>
+        <w:t>They walked back up the jetty and the three stone steps and the dark lawn, not touching, at the pace of a woman who did not like the dark. In the kitchen, in the yellow light, Catarina put the kettle on, and stood with her back to him while it boiled, her shoulders straight.</w:t>
+      </w:r>
+    </w:p>
+    <w:p>
+      <w:r>
+        <w:t>When she turned round, she had two cups. She put the chipped one in front of him and kept the other in both hands.</w:t>
       </w:r>
     </w:p>
     <w:p>
@@ -2814,7 +2809,7 @@
         <w:ind w:firstLine="0"/>
       </w:pPr>
       <w:r>
-        <w:t>The lake lay at the bottom of a valley in the French countryside, and it did not appear to be aware that anyone was writing a murder mystery on its shore.</w:t>
+        <w:t>The lake lay at the bottom of a valley in the Luberon, and it did not appear to be aware that anyone was writing a murder mystery on its shore.</w:t>
       </w:r>
     </w:p>
     <w:p>
@@ -2939,12 +2934,12 @@
     </w:p>
     <w:p>
       <w:r>
-        <w:t>He would think about those evenings later, when he was sitting in a courtroom in Aix-en-Provence being asked to describe the lake. He would say that it was very quiet. That it was very beautiful. That he had not, at first, noticed anything sinister about it at all.</w:t>
-      </w:r>
-    </w:p>
-    <w:p>
-      <w:r>
-        <w:t>He had been watching the birds. It had seemed more important at the time.</w:t>
+        <w:t>He would think about those evenings later, in a courtroom in Aix-en-Provence, listening to lawyers describe the lake. It was very quiet, they said. It was very beautiful. Nobody had noticed anything sinister about it at all.</w:t>
+      </w:r>
+    </w:p>
+    <w:p>
+      <w:r>
+        <w:t>Nor had he. He had been watching the birds. It had seemed more important at the time.</w:t>
       </w:r>
     </w:p>
     <w:p>
@@ -3004,7 +2999,7 @@
     </w:p>
     <w:p>
       <w:r>
-        <w:t>"Who knows? It is a snake." She shrugged with the whole waistcoat. "It is not lost. It is only not where you are looking."</w:t>
+        <w:t>"Who knows? It is a snake." She lifted the secateurs an inch, which in that valley counted as a shrug. "It is not lost. It is only not where you are looking."</w:t>
       </w:r>
     </w:p>
     <w:p>
@@ -3014,12 +3009,12 @@
     </w:p>
     <w:p>
       <w:r>
-        <w:t>But everyone, ever after, felt it. In the evenings, when the light went, Tobias would sit at the Olivetti with his feet drawn carefully up onto the chair. In the kitchen, Catarina would open a cupboard and wait a long moment before she looked in. Something was in the house with them: patient, brown, a metre or more, and perfectly content.</w:t>
-      </w:r>
-    </w:p>
-    <w:p>
-      <w:r>
-        <w:t>"It does not matter," said Catarina, one night, with great dignity, stepping over a loose slipper in the hall as if it were a bomb. "We are not afraid."</w:t>
+        <w:t>But everyone, ever after, felt it. In the evenings, when the light went, Tobias would sit at the Olivetti with his feet drawn carefully up onto the chair. In the kitchen, Catarina would open a cupboard and count to three before she looked in. Something was in the house with them: patient, brown, a metre or more, and perfectly content.</w:t>
+      </w:r>
+    </w:p>
+    <w:p>
+      <w:r>
+        <w:t>"It does not matter," said Catarina, one night, stepping over a loose slipper in the hall as if it were a bomb. "We are not afraid."</w:t>
       </w:r>
     </w:p>
     <w:p>
@@ -3044,7 +3039,7 @@
     </w:p>
     <w:p>
       <w:r>
-        <w:t>What Tobias did find, when they lifted the window seat and found no snake, was that the board beneath it had already been lifted. The dust was disturbed in a clean rectangle, the size of a hand. Catarina saw him see it. She put the cushion back with great care, as if the cushion were the point, and said nothing. He said nothing. The house was getting very good at that.</w:t>
+        <w:t>What Tobias did find, when they lifted the window seat and found no snake, was that the board beneath it had already been lifted. The dust was disturbed in a clean rectangle, the size of a paperback. Catarina saw him see it. She put the cushion back with great care, as if the cushion were the point, and said nothing. He said nothing. The house was getting very good at that.</w:t>
       </w:r>
     </w:p>
     <w:p>
@@ -3083,7 +3078,7 @@
     </w:p>
     <w:p>
       <w:r>
-        <w:t>"It is in the contract." She shrugged her whole waistcoat. "Lucien, who had the bakery before the van, went in 2011. He was a widower for six weeks. He went to count the birds, and he did not come back."</w:t>
+        <w:t>"It is in the contract," she said, as if she had read it twice. "Lucien, who had the bakery before the van, went in 2011. He was a widower for six weeks. He went to count the birds, and he did not come back."</w:t>
       </w:r>
     </w:p>
     <w:p>
@@ -3193,7 +3188,7 @@
     </w:p>
     <w:p>
       <w:r>
-        <w:t>"Not alone," said Catarina. She looked at the pan, not at him. "I would come. I know flamingos. You would count the same one forty times."</w:t>
+        <w:t>"Not alone," said Catarina. She looked at the pan, not at him. "I would come. You would count the same one forty times."</w:t>
       </w:r>
     </w:p>
     <w:p>
@@ -3262,7 +3257,7 @@
     </w:p>
     <w:p>
       <w:r>
-        <w:t>It was a Thursday of marvellous, suffocating politeness. Tobias sat between a retired orthodontist and a woman who wished to discuss the royal family, and ate a vol-au-vent the size and texture of an ear.</w:t>
+        <w:t>It was an evening of marvellous, suffocating politeness. Tobias sat between a retired orthodontist and a woman who wished to discuss the royal family, and ate a vol-au-vent the size and texture of an ear.</w:t>
       </w:r>
     </w:p>
     <w:p>
@@ -3392,7 +3387,7 @@
     </w:p>
     <w:p>
       <w:r>
-        <w:t>There was a long, ringing pause. Then the orthodontist began to laugh. The woman who liked the royal family laughed. Tobias, to his shame, was laughing already, helplessly, into a vol-au-vent. And Priscilla, who had stood in her coat through the whole of it with the stillness of a Roman senator, drew a long breath and said, with great dignity:</w:t>
+        <w:t>There was a long, ringing pause. Then the orthodontist began to laugh. The woman who liked the royal family laughed. Tobias, to his shame, was laughing already, helplessly, into a vol-au-vent. And Priscilla, who had stood in her coat through the whole of it with the stillness of a Roman senator, drew a long breath and said:</w:t>
       </w:r>
     </w:p>
     <w:p>
@@ -3422,7 +3417,7 @@
     </w:p>
     <w:p>
       <w:r>
-        <w:t>On the walk home through the dark lane Tobias passed the garden wall of the lake house and thought about it all. Three people were dead and a murderer was still at large, he thought, and the village's great scandal of the week was a man in a bonnet. It struck him as the most English thing he had ever heard.</w:t>
+        <w:t>Walking home down the dark lane, Tobias thought about it. Three people were dead, a murderer was at large, and the village's great scandal of the week was a man in a bonnet. It struck him as the most English thing he had ever heard.</w:t>
       </w:r>
     </w:p>
     <w:p>
@@ -3452,7 +3447,7 @@
     </w:p>
     <w:p>
       <w:r>
-        <w:t>Catarina considered this for a long time. "The English," she said at last, "are the only people in Europe who can be caught with the babysitter and say, it was for the pantomime, and everybody believes."</w:t>
+        <w:t>Catarina considered this. "The English," she said at last, "are the only people in Europe who can be caught with the babysitter and say, it was for the pantomime, and everybody believes."</w:t>
       </w:r>
     </w:p>
     <w:p>
@@ -3531,12 +3526,12 @@
     </w:p>
     <w:p>
       <w:r>
-        <w:t>"I'd hope so. It's your face he's using."</w:t>
-      </w:r>
-    </w:p>
-    <w:p>
-      <w:r>
-        <w:t>She let that sit for exactly as long as was cruel, then added: "Your Portuguese friend has a vocabulary like a sailor."</w:t>
+        <w:t>"I'd hope so. It's your vocabulary she's using."</w:t>
+      </w:r>
+    </w:p>
+    <w:p>
+      <w:r>
+        <w:t>She let that sit for exactly as long as was cruel, then added: "She swears like a sailor, your housekeeper. A very polite sailor."</w:t>
       </w:r>
     </w:p>
     <w:p>
@@ -3561,7 +3556,7 @@
     </w:p>
     <w:p>
       <w:r>
-        <w:t>He found out that evening. Catarina, stirring the pot, asked him in her shining new English how he was, and he answered, with great dignity, "Eu sou quente."</w:t>
+        <w:t>He found out that evening. Catarina, stirring the pot, asked him in her shining new English how he was, and he answered, carefully, "Eu sou quente."</w:t>
       </w:r>
     </w:p>
     <w:p>
@@ -3686,7 +3681,7 @@
     </w:p>
     <w:p>
       <w:r>
-        <w:t>Neither of them said anything. Neither of them needed to. A star fell, long and white, from one end of the sky to the other, and they both drew a breath, and both said, at the same instant, in their own languages, the same thing:</w:t>
+        <w:t>Neither of them said anything. A star fell, long and white, from one end of the sky to the other, and they both drew a breath, and both said, at the same instant, in their own languages, the same thing:</w:t>
       </w:r>
     </w:p>
     <w:p>
@@ -3736,12 +3731,12 @@
     </w:p>
     <w:p>
       <w:r>
-        <w:t>Three stars waiting. A boat that does not come. And I, on the stone, practising being no one. He learned the meaning years later. By then he had already known it.</w:t>
-      </w:r>
-    </w:p>
-    <w:p>
-      <w:r>
-        <w:t>From the far end of the jetty came a long, offended clearing of the throat. The pelican, who had been standing there in the dark the whole time, shifted its feet, turned its enormous head away with great dignity, and gazed pointedly at the lake.</w:t>
+        <w:t>Three stars waiting. A boat that does not come. And I, on the stone, practising being no one. He learned the words weeks later, in the dark, in a cheap hotel in Lyon. By then he had already known what they meant.</w:t>
+      </w:r>
+    </w:p>
+    <w:p>
+      <w:r>
+        <w:t>From the far end of the jetty came a long, offended clearing of the throat. The pelican, who had been standing there in the dark the whole time, shifted its feet, turned its enormous head away, and gazed pointedly at the lake.</w:t>
       </w:r>
     </w:p>
     <w:p>
@@ -3800,7 +3795,7 @@
     </w:p>
     <w:p>
       <w:r>
-        <w:t>The Camargue lay an hour to the south, where the Rhône spread out into the sea and the land gave up all pretence of hills. It was an unseasonably warm day for October, twenty-seven degrees by the car's thermometer, which Catarina did not trust. The sky was a hard blue lid. White horses stood knee-deep in the marsh with an air of complete indifference, rice paddies glittered like sheets of green glass, and in the salt pans the water turned a faint, impossible pink.</w:t>
+        <w:t>The Camargue lay an hour to the south, where the Rhône spread out into the sea and the land gave up all pretence of hills. It was an unseasonably warm day for October, twenty-seven degrees by the car's thermometer, which Catarina did not trust. The sky was hard and blue and very high. White horses stood knee-deep in the marsh with an air of complete indifference, rice paddies glittered like sheets of green glass, and in the salt pans the water turned a faint, impossible pink.</w:t>
       </w:r>
     </w:p>
     <w:p>
@@ -3984,7 +3979,7 @@
     </w:p>
     <w:p>
       <w:r>
-        <w:t>There were stalls in every street. There were stalls in every square, and down every alley, and up the steps of the church, and spilling into the doorways of shops that had given up and joined in. There was cheese, goat's cheese mostly, in small white rounds and logs and pyramids, some rolled in ash, some in herbs, some wrapped in chestnut leaves and tied with raffia like presents from a very small, very serious aunt. There were olives in tubs, thirty kinds, black and green and violet and wrinkled, in oil and in brine and with garlic and with fennel and with orange peel. There were sausages hanging in garlands. There were the last tomatoes of the year, enormous and lumpen and cracked, and the first mushrooms of the autumn, in baskets, with the earth still on them. There was honey, from lavender and chestnut and thyme and rosemary and something called garrigue, which was apparently a kind of hillside. There was a man selling nothing but garlic, and another selling nothing but knives, and a woman selling nothing but candied fruit, glowing in their trays like stained glass, for which, Madame Fournier said, Apt was famous, and which, she said, nobody in Apt ever ate.</w:t>
+        <w:t>There were stalls in every street. There were stalls in every square, and down every alley, and up the steps of the church, and spilling into the doorways of shops that had given up and joined in. There was cheese, goat's cheese mostly, in small white rounds and logs and pyramids, some rolled in ash, some in herbs, some wrapped in chestnut leaves and tied with raffia like presents from a very small, very serious aunt. There were olives in tubs, thirty kinds, black and green and violet, with garlic, with fennel, with orange peel. There were sausages hanging in garlands. There were the last tomatoes of the year, enormous and lumpen and cracked, and the first mushrooms of the autumn, in baskets, with the earth still on them. There was honey, from lavender and chestnut and thyme and rosemary and something called garrigue, which was apparently a kind of hillside. There was a man selling nothing but garlic, and another selling nothing but knives, and a woman selling nothing but candied fruit, glowing in their trays like stained glass, for which, Madame Fournier said, Apt was famous, and which, she said, nobody in Apt ever ate.</w:t>
       </w:r>
     </w:p>
     <w:p>
@@ -4125,7 +4120,7 @@
     </w:p>
     <w:p>
       <w:r>
-        <w:t>She stood for a long moment looking at nothing. Then she said, in a voice so low that he had to lean in to hear it over the accordion:</w:t>
+        <w:t>She stood looking at nothing. Then she said, in a voice so low that he had to lean in to hear it over the accordion:</w:t>
       </w:r>
     </w:p>
     <w:p>
@@ -4192,7 +4187,7 @@
         <w:ind w:firstLine="0"/>
       </w:pPr>
       <w:r>
-        <w:t>They drove home with the windows open and the market in string bags on the back seat, and Madame Fournier drove the Renault 4 like a tractor through a field that had insulted her, and said nothing until they were back in the valley, at the top of the lane, with the lake below them, flat and grey under a sky that was making up its mind.</w:t>
+        <w:t>They came back with the windows open and the market in string bags on the back seat, and Madame Fournier drove the Renault 4 home in second gear, all the way, on principle, and said nothing until they were back in the valley, at the top of the lane, with the lake below them, flat and grey under a sky that was making up its mind.</w:t>
       </w:r>
     </w:p>
     <w:p>
@@ -4217,12 +4212,17 @@
     </w:p>
     <w:p>
       <w:r>
-        <w:t>The third eel, the small one, in its single sheet of newspaper, she put in the cold larder, on a shelf by itself. In the morning, it was still there. She looked at it for some time, and then she put it back.</w:t>
-      </w:r>
-    </w:p>
-    <w:p>
-      <w:r>
-        <w:t>It was still there on the Monday, when the telephone rang and a voice like cashmere being lowered onto a duke said that it would be grateful if what came out of the water were not read.</w:t>
+        <w:t>The third eel, the small one, in its single sheet of newspaper, she put in the cold larder, on a shelf by itself. In the morning, it was still there. She looked at it, and then she put it back.</w:t>
+      </w:r>
+    </w:p>
+    <w:p>
+      <w:r>
+        <w:t>That week, in the afternoons, she walked along the bank towards the marsh three times, with a basket, as if for blackberries, and came back each time with nothing in the basket and reeds in her hair and her mouth set. Tobias watched her go from the study window. He did not follow. He was beginning to understand who she was looking for.</w:t>
+      </w:r>
+    </w:p>
+    <w:p>
+      <w:r>
+        <w:t>It was still there on the Monday, when the telephone rang.</w:t>
       </w:r>
     </w:p>
     <w:p>
@@ -4291,7 +4291,7 @@
     </w:p>
     <w:p>
       <w:r>
-        <w:t>It was a print of some bathers, three of them in the foreground. Tobias looked at them for a very long time, at their pale, strange, geometric limbs.</w:t>
+        <w:t>It was a print of some bathers, three of them in the foreground. Tobias studied them, their pale, strange, geometric limbs.</w:t>
       </w:r>
     </w:p>
     <w:p>
@@ -4366,7 +4366,7 @@
     </w:p>
     <w:p>
       <w:r>
-        <w:t>She nodded slowly, leaning against his shoulder, watching the light go. She did not say anything else. She did not need to. It was the kind of silence that two people only arrive at after weeks of trying to find words in two languages, and then finding that the silence was a language too.</w:t>
+        <w:t>She nodded slowly, leaning against his shoulder, watching the light go, and said nothing else. It was the kind of silence that two people only arrive at after weeks of trying to find words in two languages, and then finding that the silence was a language too.</w:t>
       </w:r>
     </w:p>
     <w:p>
@@ -4585,7 +4585,7 @@
     </w:p>
     <w:p>
       <w:r>
-        <w:t>She could not hear the conversation. She did not need to. A waiter, bringing a second bottle of white, said it for her, because he was French and could not help himself.</w:t>
+        <w:t>She could not hear the conversation. A waiter, bringing a second bottle of white, supplied the only part of it she needed, because he was French and could not help himself.</w:t>
       </w:r>
     </w:p>
     <w:p>
@@ -4610,7 +4610,7 @@
     </w:p>
     <w:p>
       <w:r>
-        <w:t>Mara watched him lift a claw and smile at it, and thought of eleven thousand four hundred writers sitting at kitchen tables from Dundee to Durban, each of whom had put sixty pounds in an envelope along with a hopeful short story about a lighthouse. She thought of a man on a jetty with an Olivetti. She thought of Elise Marchetti, who had once, according to a letter in the file, refused to cross a puddle because it looked ambitious. She thought of the commandant who had closed the file in April with his very good pen, and who played golf, she happened to know, on Thursday mornings at a club outside Marseille where the membership list was not published.</w:t>
+        <w:t>Mara watched him lift a claw and smile at it, and thought of eleven thousand four hundred writers sitting at kitchen tables from Dundee to Durban, each of whom had put sixty pounds in an envelope along with a hopeful short story about a dead wife's garden. She thought of a man on a jetty with an Olivetti. She thought of Elise Marchetti, who had once, according to a letter in the file, refused to cross a puddle because it looked ambitious. She thought of the commandant who had closed the file in April with his very good pen, and who played golf, she happened to know, on Thursday mornings at a club outside Marseille where the membership list was not published.</w:t>
       </w:r>
     </w:p>
     <w:p>
@@ -4625,7 +4625,7 @@
     </w:p>
     <w:p>
       <w:r>
-        <w:t>On the lake, that evening, the pelican stood at the end of the jetty and did not fish. Catarina stood at the kitchen window and did not sing. Tobias sat with the pages in a stack, drying at the edges, and did not type. The house had been a place to begin again. It had remembered, overnight, what it was for.</w:t>
+        <w:t>That evening Catarina stood at the kitchen window and did not sing. Tobias sat with the pages in a stack, drying at the edges, and did not type. In the reeds, even the heron did not fish. The house had been a place to begin again. It had remembered, overnight, what it was for.</w:t>
       </w:r>
     </w:p>
     <w:p>
@@ -5130,7 +5130,7 @@
     </w:p>
     <w:p>
       <w:r>
-        <w:t>Catarina looked at the letter in her hands for a long moment. Then she gave it back to him, and stood up, and went to the door, and stopped there with one hand on the frame.</w:t>
+        <w:t>Catarina looked at the letter in her hands. Then she gave it back to him, and stood up, and went to the door, and stopped there with one hand on the frame.</w:t>
       </w:r>
     </w:p>
     <w:p>
@@ -5201,7 +5201,7 @@
     </w:p>
     <w:p>
       <w:r>
-        <w:t>Catarina did not say anything. She stood beside him for another moment, very still. Then she went back to the stove, and moved the soup to the front again, and stirred it for a long time, much longer than it needed. When she spoke, it was to the pot.</w:t>
+        <w:t>Catarina did not say anything. She stood beside him a moment longer. Then she went back to the stove, and moved the soup to the front again, and stirred it much longer than it needed. When she spoke, it was to the pot.</w:t>
       </w:r>
     </w:p>
     <w:p>
@@ -5705,7 +5705,30 @@
     </w:p>
     <w:p>
       <w:r>
-        <w:t>He did not answer. He did not have to. He printed the thread, all forty-one pages of it, on Madame Fournier's printer-scanner, which complained bitterly but did not turn anything into cats, and put it in a folder with the Highly Commended letter and the receipt for sixty pounds. On the front of the folder, in his best capitals, which were now very nearly as good as hers, he wrote: NOT ONLY PAPER.</w:t>
+        <w:t>He did not answer. He printed the thread, all forty-one pages of it, on Madame Fournier's printer-scanner, which complained bitterly but did not turn anything into cats, and put it in a folder with the Highly Commended letter and the receipt for sixty pounds. On the front of the folder, in his best capitals, which were now very nearly as good as hers, he wrote: NOT ONLY PAPER.</w:t>
+      </w:r>
+    </w:p>
+    <w:p>
+      <w:r>
+        <w:t xml:space="preserve">Then, before he closed the laptop, he did the thing Catarina had not thought of, because she had never had to make a story stand up in front of a stranger. He wrote to the woman in Cape Town, and the headmaster in Fife, and the nurse in Leicester, and to forty others, and asked each of them one question: if a court in France ever wanted to know what had happened to their sixty pounds, would they say so, in writing, with their names? </w:t>
+      </w:r>
+      <w:r>
+        <w:rPr>
+          <w:i/>
+        </w:rPr>
+        <w:t>A prize that cheats eleven thousand people,</w:t>
+      </w:r>
+      <w:r>
+        <w:t xml:space="preserve"> he wrote, </w:t>
+      </w:r>
+      <w:r>
+        <w:rPr>
+          <w:i/>
+        </w:rPr>
+        <w:t>is a rumour. A prize that cheated Mrs Naidoo of Cape Town, who put a ribbon in the book, is a crime.</w:t>
+      </w:r>
+      <w:r>
+        <w:t xml:space="preserve"> By the morning nineteen of them had said yes. The nurse in Leicester had said yes twice.</w:t>
       </w:r>
     </w:p>
     <w:p>
@@ -5802,7 +5825,7 @@
     </w:p>
     <w:p>
       <w:r>
-        <w:t>Tobias wrote it down. He thanked the voice warmly. He said he would transfer the money that afternoon. He put the phone down and looked at Catarina, who had straightened up and was looking at the window with the expression of a heron that has seen the fish.</w:t>
+        <w:t>Tobias wrote it down. He thanked the voice warmly. He said he would transfer the money that afternoon. He put the phone down and looked at Catarina, who had straightened up and was looking at the window with the expression of a cat that has heard a tin being opened.</w:t>
       </w:r>
     </w:p>
     <w:p>
@@ -5911,7 +5934,7 @@
     </w:p>
     <w:p>
       <w:r>
-        <w:t>Neither of them changed their minds. They sat opposite each other in a carriage that smelled of warm plastic and oranges, with the folder on the table between them and a paper bag of calissons left over from the Sunday, and watched Provence go past in long dry strokes: pines, limestone, a village on a hill like a pile of bread.</w:t>
+        <w:t>Neither of them changed their minds. They sat opposite each other in a carriage that smelled of warm plastic and oranges, with the folder on the table between them and a paper bag of calissons, the last of the second bag from Aix, which Catarina had been rationing like a siege, and watched Provence go past in long dry strokes: pines, limestone, a village on a hill like a pile of bread.</w:t>
       </w:r>
     </w:p>
     <w:p>
@@ -6076,7 +6099,7 @@
     </w:p>
     <w:p>
       <w:r>
-        <w:t>"Good morning! I'm so sorry to bother you. My name is Lind. I rang last week, about the lighthouse."</w:t>
+        <w:t>"Good morning! I'm so sorry to bother you. My name is Lind. I rang yesterday, about the lighthouse."</w:t>
       </w:r>
     </w:p>
     <w:p>
@@ -6153,12 +6176,7 @@
     </w:p>
     <w:p>
       <w:r>
-        <w:t>"The gull," he said, when he could. "The gull who is the keeper. And the lighthouse, his mother. Mon Dieu. I read it. I read it to my wife. She cried. She cried laughing, monsieur." He wiped his eyes. "I read the first page of every one. Yours, monsieur, is the worst thing I have ever read in my life, and I have been in a television series about a fisherman for eleven years."</w:t>
-      </w:r>
-    </w:p>
-    <w:p>
-      <w:r>
-        <w:t xml:space="preserve">"And then I put it in the sack," said Raymond, the laugh going out of his face, "with the others. And I write the letter. </w:t>
+        <w:t xml:space="preserve">"The gull," he said, when he could. "The gull who is the keeper. And the lighthouse, his mother. Mon Dieu. I read it. I read it to my wife. She cried. She cried laughing, monsieur." He wiped his eyes. "I read the first page of every one. Yours, monsieur, is the worst thing I have ever read in my life, and I have been in a television series about a fisherman for eleven years." The laugh went out of his face. "And then I put it in the sack, "with the others. And I write the letter. </w:t>
       </w:r>
       <w:r>
         <w:rPr>
@@ -6232,12 +6250,7 @@
     </w:p>
     <w:p>
       <w:r>
-        <w:t>"Someone did," said Catarina.</w:t>
-      </w:r>
-    </w:p>
-    <w:p>
-      <w:r>
-        <w:t xml:space="preserve">"The Englishman rang," she said, "and you put your hand on the telephone and said, </w:t>
+        <w:t xml:space="preserve">"Someone did," said Catarina. "The Englishman rang, and you put your hand on the telephone and said, </w:t>
       </w:r>
       <w:r>
         <w:rPr>
@@ -6355,7 +6368,7 @@
     </w:p>
     <w:p>
       <w:r>
-        <w:t>"Is a lobster." She stood with her hands in her coat pockets, looking at the starched cloths through the glass. "My father catches lobsters. In Afurada. Eighteen years. He sells them to a man on the quay for the price of a lunch. The man sells them to a man in Lisbon. The man in Lisbon sells them to a man here." She turned away from the window. "Like the flamingos. Everybody is pink because of what they eat."</w:t>
+        <w:t>"Is a lobster." She stood with her hands in her coat pockets, looking at the starched cloths through the glass. "My father catches lobsters. In Afurada. Forty years. He sells them to a man on the quay for the price of a lunch. The man sells them to a man in Lisbon. The man in Lisbon sells them to a man here." She turned away from the window. "Like the flamingos. Everybody is pink because of what they eat."</w:t>
       </w:r>
     </w:p>
     <w:p>
@@ -6677,7 +6690,7 @@
         <w:t>ah</w:t>
       </w:r>
       <w:r>
-        <w:t>. And the next week she came over the wall with honey, and the key."</w:t>
+        <w:t>. And the next week she came over the wall with a jar of honey, and stayed for coffee, and asked me about Henri, which nobody had done for a long time." She did not say anything more about the honey, and Tobias, who was getting better at not asking, did not ask.</w:t>
       </w:r>
     </w:p>
     <w:p>
@@ -6694,6 +6707,16 @@
       <w:pPr>
         <w:ind w:firstLine="0"/>
       </w:pPr>
+      <w:r>
+        <w:t>It was Tobias who decided what to ask them.</w:t>
+      </w:r>
+    </w:p>
+    <w:p>
+      <w:r>
+        <w:t>"Not how much," he said, when Catarina had found the first number. "They'll all say three thousand, and we'll feel clever, and it won't help. Ask who they paid. Which company, which bank, which country. And whether anybody ever sent them a receipt with Madame Fournier's name on it." He had been thinking about it since the lease. "A man who sublets illegally doesn't put the landlord on the paperwork. And if the money went somewhere that isn't France, a commandant in Avignon can't sit on it. It was never his to sit on."</w:t>
+      </w:r>
+    </w:p>
+    <w:p>
       <w:r>
         <w:t>They telephoned them all, on the grandson's laptop, which kept asking to update itself at moments of crisis like a waiter who will not stop asking whether everything is all right.</w:t>
       </w:r>
@@ -7068,7 +7091,7 @@
     </w:p>
     <w:p>
       <w:r>
-        <w:t>"One glass. Of water with gas." Dona Graça held up one finger, very firmly. "I know Kader in the bar. One glass, at ten. He paid with coins. He counted them twice." "Then he goes up. And at half past ten, a visitor comes for him."</w:t>
+        <w:t>"One glass. Of water with gas." Dona Graça held up one finger, very firmly. "I know Kader in the bar. One glass, at ten. He paid with coins. He counted them twice. Then he goes up. And at half past ten, a visitor comes for him."</w:t>
       </w:r>
     </w:p>
     <w:p>
@@ -7108,7 +7131,7 @@
     </w:p>
     <w:p>
       <w:r>
-        <w:t>Dona Graça looked at her. "Why the tie?"</w:t>
+        <w:t>Dona Graça looked at him. "Why the tie?"</w:t>
       </w:r>
     </w:p>
     <w:p>
@@ -7352,7 +7375,7 @@
     </w:p>
     <w:p>
       <w:r>
-        <w:t>In the dark, after a long time, Catarina said:</w:t>
+        <w:t>In the dark, after a long time, Catarina spoke.</w:t>
       </w:r>
     </w:p>
     <w:p>
@@ -7377,7 +7400,7 @@
     </w:p>
     <w:p>
       <w:r>
-        <w:t>"No. Is not sad. Is only a long time ago." He heard her smile in the dark, a little crooked. "My grandmother has a poem. You heard it, on the jetty. Three stars waiting. A boat that does not come. And I, on the stone, practising being no one." The rain filled the pause. "I practised very hard. For five years I am very good at being no one. Then one day I think, I am twenty-three, and I do not want to be good at this. So I go to the university in Porto, and I learn to teach children to read, so that nobody can ever tell them a letter is coming when it is not." "That is what I was before. A woman who decided not to wait on a stone."</w:t>
+        <w:t>"No. Is not sad. Is only a long time ago." He heard her smile in the dark, a little crooked. "My grandmother has a poem. You heard it, on the jetty. Three stars waiting. A boat that does not come. And I, on the stone, practising being no one." The rain filled the pause. "I practised very hard. For five years I am very good at being no one. Then one day I think, I am twenty-three, and I do not want to be good at this. So I go to the university in Porto, and I learn to teach children to read, so that nobody can ever tell them a letter is coming when it is not. That is what I was before. A woman who decided not to wait on a stone."</w:t>
       </w:r>
     </w:p>
     <w:p>
@@ -7712,7 +7735,12 @@
     </w:p>
     <w:p>
       <w:r>
-        <w:t>Mara photographed it, with Monsieur Pons in the picture, and his newspaper, and Fangio, at Monsieur Pons's insistence, because Fangio had been present. Then she put on gloves, took the hose off in his presence, bagged it, and had him sign the bag, which he did with the solemnity of a man at a wedding.</w:t>
+        <w:t>Mara did not touch it yet. She walked away between the towers of Renaults and rang Aix, because a hose taken off a car by an officer on her day off, without an order, is a hose that a defence lawyer throws out of the window. Juge Sarrazin, who already had an inquiry open on the rent, extended Mara's commission to the Giraud car by telephone, and had her clerk send the order to the gendarmerie at Cavaillon, and told Mara to wait for the two gendarmes from Cavaillon to arrive and witness it. They came in forty minutes, in a blue van, and stood in the gravel looking at Fangio.</w:t>
+      </w:r>
+    </w:p>
+    <w:p>
+      <w:r>
+        <w:t>Then Mara photographed it, with Monsieur Pons in the picture, and his newspaper, and Fangio, at Monsieur Pons's insistence, because Fangio had been present. Then she put on gloves, took the hose off in front of all three of them, sealed it, and had Monsieur Pons and both gendarmes sign the seal, which Monsieur Pons did with the solemnity of a man at a wedding.</w:t>
       </w:r>
     </w:p>
     <w:p>
@@ -7722,7 +7750,7 @@
     </w:p>
     <w:p>
       <w:r>
-        <w:t>"Your commandant," said Monsieur Pons, taking the pen, "is he the one with the very good pen?"</w:t>
+        <w:t>"Your commandant," said Monsieur Pons, handing back the pen, "is he the one with the very good pen?"</w:t>
       </w:r>
     </w:p>
     <w:p>
@@ -7732,7 +7760,7 @@
     </w:p>
     <w:p>
       <w:r>
-        <w:t>"He came," said Monsieur Pons, signing with a flourish. "In June. The week after. He looked at the car. He did not lie down. He asked me, is there anything here, Pons? I said, I have not looked. He said, then do not look. Crush it when the insurance pays." He handed the bag back. "I did not like him. Fangio did not like him. Fangio likes everybody."</w:t>
+        <w:t>"He came," said Monsieur Pons. "In June. The week after. He looked at the car. He did not lie down. He asked me, is there anything here, Pons? I said, I have not looked. He said, then do not look. Crush it when the insurance pays." "I did not like him. Fangio did not like him. Fangio likes everybody."</w:t>
       </w:r>
     </w:p>
     <w:p>
@@ -7775,7 +7803,16 @@
     </w:p>
     <w:p>
       <w:r>
-        <w:t>"Tomorrow is Sunday," said Mara. "On Monday morning at eight o'clock I'm going to drive to Aix and put a brake hose and a notary's diary on the desk of a juge who swims in the sea in November. And she's going to ask me where I got them, and I'm going to tell her. And then at ten o'clock Commandant Moutet is going to find out, because he finds everything out, and he's going to call me into his office." She glanced in the mirror, at Tobias. "Your book, Mr Lind. The one on the jetty. How did the detective come out of it?"</w:t>
+        <w:t xml:space="preserve">"Tomorrow is Sunday," said Mara. "On Monday morning at eight o'clock I'm going to drive to Aix and put a brake hose and a notary's diary on the desk of a juge who swims in the sea in November, and she's going to open a file that has the word </w:t>
+      </w:r>
+      <w:r>
+        <w:rPr>
+          <w:i/>
+        </w:rPr>
+        <w:t>meurtre</w:t>
+      </w:r>
+      <w:r>
+        <w:t xml:space="preserve"> on it, with my name underneath. And then at ten o'clock Commandant Moutet is going to find out, because he finds everything out, and he's going to call me into his office." She glanced in the mirror, at Tobias. "Your book, Mr Lind. The one on the jetty. How did the detective come out of it?"</w:t>
       </w:r>
     </w:p>
     <w:p>
@@ -7823,7 +7860,7 @@
     </w:p>
     <w:p>
       <w:r>
-        <w:t>"He said, you have made a very serious mistake for your career. And he looked at me for some time." Mara drank the marc. "And then he said, it would be a pity, Mara, if your career were the only thing you lost. And he smiled."</w:t>
+        <w:t>"He said, you have made a very serious mistake for your career. And he looked at me. For about a week, it felt like." Mara drank the marc. "And then he said, it would be a pity, Mara, if your career were the only thing you lost. And he smiled."</w:t>
       </w:r>
     </w:p>
     <w:p>
@@ -8008,7 +8045,7 @@
     </w:p>
     <w:p>
       <w:r>
-        <w:t>He reached across the table and covered her hand with his. Neither of them moved for a long time.</w:t>
+        <w:t>He reached across the table and covered her hand with his. Neither of them moved.</w:t>
       </w:r>
     </w:p>
     <w:p>
@@ -8176,7 +8213,7 @@
     </w:p>
     <w:p>
       <w:r>
-        <w:t>They did not play the tape again that night. They copied Inês's note onto a clean page, in Catarina's block capitals, and in the morning they carried the page and the tape over the wall and put them in Madame Fournier's biscuit tin, with her spare keys, which was the only place in the valley that had never once lost anything.</w:t>
+        <w:t>They did not play the tape again that night. They copied Inês's note onto a clean page, in Catarina's block capitals, and in the morning, while he was too ill to stop her, Catarina carried the page and the tape over the wall and put them in Madame Fournier's biscuit tin, with her spare keys, which was the only place in the valley that had never once lost anything.</w:t>
       </w:r>
     </w:p>
     <w:p>
@@ -8241,60 +8278,68 @@
         <w:t>Is service included?</w:t>
       </w:r>
       <w:r>
-        <w:t xml:space="preserve"> he laughed so hard that he coughed for a minute, and she put down the book and held a cup of water to his mouth and said, very severely, that she would stop reading if he could not behave. He could not behave. She did not stop reading. She sat with him until he fell asleep, and then she tiptoed out. The lamp went down. The house creaked. And on the desk, in the dark, something cleared its throat.</w:t>
-      </w:r>
-    </w:p>
-    <w:p>
-      <w:r>
-        <w:t>Tobias opened one eye. The thermometer on the bedside table, which Catarina had left there with a note that said NOT FOR THE PELICAN, said thirty-nine point four, and the room was swimming gently, like a room in a boat.</w:t>
-      </w:r>
-    </w:p>
-    <w:p>
-      <w:r>
-        <w:t>The Olivetti, on the desk, had a face. It had not had one that afternoon. It was made of the carriage and the bell and the two round spools, and it looked like a retired colonel who had been kept waiting in a draughty corridor.</w:t>
-      </w:r>
-    </w:p>
-    <w:p>
-      <w:r>
-        <w:t xml:space="preserve">"I have typed </w:t>
+        <w:t xml:space="preserve"> he laughed so hard that he coughed for a minute, and she put down the book and held a cup of water to his mouth and said, very severely, that she would stop reading if he could not behave. He could not behave. She did not stop reading. She sat with him until he fell asleep, and then she tiptoed out. The lamp went down. The house creaked. The thermometer on the bedside table, which Catarina had left there with a note that said NOT FOR THE PELICAN, said thirty-nine point four, and the room began to behave like a room in a boat.</w:t>
+      </w:r>
+    </w:p>
+    <w:p>
+      <w:r>
+        <w:t xml:space="preserve">He knew it was the fever. Knowing did not help. In the dark the Olivetti's carriage and bell and two round spools had arranged themselves into the face of a retired colonel kept waiting in a draughty corridor, and when the rain ticked against the window Tobias heard, in his own voice, which is the only voice a fever has, a count he had not known he was keeping. </w:t>
       </w:r>
       <w:r>
         <w:rPr>
           <w:i/>
         </w:rPr>
-        <w:t>she put the tray outside the door</w:t>
-      </w:r>
-      <w:r>
-        <w:t xml:space="preserve"> forty-one times," it said. "I have typed </w:t>
+        <w:t>She put the tray outside the door:</w:t>
+      </w:r>
+      <w:r>
+        <w:t xml:space="preserve"> forty-one times, typed. </w:t>
       </w:r>
       <w:r>
         <w:rPr>
           <w:i/>
         </w:rPr>
-        <w:t>she did not look away</w:t>
-      </w:r>
-      <w:r>
-        <w:t xml:space="preserve"> nine times. I have not once been asked to type what you intend to do about it."</w:t>
-      </w:r>
-    </w:p>
-    <w:p>
-      <w:r>
-        <w:t>On the bedside table the chipped cup rocked on its saucer, and said, in a small, high, fast voice, "She went into the lake for your paper. She held your hand on the jetty. And you said nothing for a week."</w:t>
-      </w:r>
-    </w:p>
-    <w:p>
-      <w:r>
-        <w:t>"My Portuguese is terrible," said Tobias, to a cup, at thirty-nine point four.</w:t>
-      </w:r>
-    </w:p>
-    <w:p>
-      <w:r>
-        <w:t>"She does not want your Portuguese," said the cup. "She wants to be met. Halfway. On purpose."</w:t>
-      </w:r>
-    </w:p>
-    <w:p>
-      <w:r>
-        <w:t>Then the room tipped the other way, and the colonel was a typewriter again, and the cup was a cup, and Tobias lay in the blankets, shivering and warm, and thought, in the half-light, of how many small, tireless kindnesses there had been in the house since September: the trays, the notes, the fourth stair she did not step on in the night because she had learned that it creaked. None of them had asked to be noticed. That, he thought, was rather the point of them, and rather the problem.</w:t>
+        <w:t>She did not look away:</w:t>
+      </w:r>
+      <w:r>
+        <w:t xml:space="preserve"> nine. And not once, anywhere in the book, what he intended to do about it.</w:t>
+      </w:r>
+    </w:p>
+    <w:p>
+      <w:r>
+        <w:t xml:space="preserve">The chipped cup on the bedside table rocked on its saucer as the room tipped, and the same voice, smaller and faster, went on without him. </w:t>
+      </w:r>
+      <w:r>
+        <w:rPr>
+          <w:i/>
+        </w:rPr>
+        <w:t>She went into the lake for your paper. She held your hand on the jetty. And you said nothing for a week.</w:t>
+      </w:r>
+    </w:p>
+    <w:p>
+      <w:r>
+        <w:t>"My Portuguese is terrible," he told the cup, aloud, and heard himself, and knew how ill he was.</w:t>
+      </w:r>
+    </w:p>
+    <w:p>
+      <w:r>
+        <w:rPr>
+          <w:i/>
+        </w:rPr>
+        <w:t>She doesn't want your Portuguese,</w:t>
+      </w:r>
+      <w:r>
+        <w:t xml:space="preserve"> said the part of him that was not ill. </w:t>
+      </w:r>
+      <w:r>
+        <w:rPr>
+          <w:i/>
+        </w:rPr>
+        <w:t>She wants to be met. Halfway. On purpose.</w:t>
+      </w:r>
+    </w:p>
+    <w:p>
+      <w:r>
+        <w:t>Then the room tipped back, and the colonel was a typewriter, and the cup was a cup, and Tobias lay in the blankets, shivering and warm, and thought, in the half-light, of how many small, tireless kindnesses there had been in the house since September: the trays, the notes, the fourth stair she did not step on in the night because she had learned that it creaked. None of them had asked to be noticed. That, he thought, was rather the point of them, and rather the problem.</w:t>
       </w:r>
     </w:p>
     <w:p>
@@ -8309,12 +8354,12 @@
     </w:p>
     <w:p>
       <w:r>
-        <w:t>Catarina came in with the tray. On it, steaming, was a mug of tea made properly for the first time: the pot warmed, the leaves left to stand, the milk in last. It was in the cup with the chip.</w:t>
-      </w:r>
-    </w:p>
-    <w:p>
-      <w:r>
-        <w:t>He took it, and held it in both hands, and looked at it for a long moment.</w:t>
+        <w:t>Catarina came in with the tray. On it, steaming, was a cup of tea made properly for the first time: the pot warmed, the leaves left to stand, the milk in last. It was in the cup with the chip.</w:t>
+      </w:r>
+    </w:p>
+    <w:p>
+      <w:r>
+        <w:t>He took it in both hands and looked at it.</w:t>
       </w:r>
     </w:p>
     <w:p>
@@ -8324,12 +8369,12 @@
     </w:p>
     <w:p>
       <w:r>
-        <w:t>"Yes," said Tobias. "I think it has opinions."</w:t>
-      </w:r>
-    </w:p>
-    <w:p>
-      <w:r>
-        <w:t>She laughed, and sat on the edge of the bed, and for a while neither of them said anything at all. Outside, the clock in the hall struck eight. On the desk the Olivetti stayed discreetly silent. He did not tell her about the dream. A dream that has been explained is only a temperature, and this one had been thirty-nine point four. But he kept the sentence. Halfway, on purpose. He wrote it on the envelope under the typewriter, under the name.</w:t>
+        <w:t>"Yes," said Tobias. "It kept me up half the night."</w:t>
+      </w:r>
+    </w:p>
+    <w:p>
+      <w:r>
+        <w:t>She laughed, and sat on the edge of the bed, and for a while neither of them said anything at all. Outside, the clock in the hall struck eight. He did not tell her about the fever's arithmetic. A dream that has been explained is only a temperature, and this one had been thirty-nine point four. But he kept the sentence. Halfway, on purpose. He wrote it on the envelope under the typewriter, under the name.</w:t>
       </w:r>
     </w:p>
     <w:p>
@@ -8559,7 +8604,7 @@
     </w:p>
     <w:p>
       <w:r>
-        <w:t>He was leaning against their car in the hospital car park when they came out, as if he had been there for some time and did not mind, beside a long black saloon with a driver who did not look up. Close to, he was about fifty, immaculate, in a charcoal suit and a tie the colour of old claret, and he carried a furled black umbrella under a sky that had not held a cloud all day.</w:t>
+        <w:t>Somebody was leaning against their car in the hospital car park when they came out, as if he had been there for some time and did not mind, beside a long black saloon with a driver who did not look up. It was the Frenchman from the supper. Close to, he was about fifty, immaculate, in a charcoal suit and a tie the colour of old claret, and he carried a furled black umbrella under a sky that had not held a cloud all day.</w:t>
       </w:r>
     </w:p>
     <w:p>
@@ -8619,7 +8664,7 @@
     </w:p>
     <w:p>
       <w:r>
-        <w:t>Edouard. The name in the margin of Inês's notebook, beside the twelfth of March. And the tie had been across a plate of vol-au-vents in October, and he had admired it. He wrote that down before he started the car, and then, because Catarina was watching him write it, he wrote underneath: I should have known at the supper. She took the pen and added, in capitals: NOBODY KNOWS AT THE SUPPER. THAT IS WHY IT IS A SUPPER.</w:t>
+        <w:t>Edouard. The name in the margin of Inês's notebook, beside the twelfth of March. And the tie had been across a plate of vol-au-vents in October, and an orthodontist had admired it. He wrote that down before he started the car, and then, because Catarina was watching him write it, he wrote underneath: I should have known at the supper. She took the pen and added, in capitals: NOBODY KNOWS AT THE SUPPER. THAT IS WHY IT IS A SUPPER.</w:t>
       </w:r>
     </w:p>
     <w:p>
@@ -8652,7 +8697,7 @@
     </w:p>
     <w:p>
       <w:r>
-        <w:t>"The key has been in the biscuit tin since March," she said. "You took your time. It is under your tape, now, and the letter about the rent, and a photograph of Lucien standing on one leg, which I am not going to explain. Your friend Elise gave it to me. She came over the wall on a Thursday with a jar of honey I did not need and asked me to keep one thing in this valley that Monsieur Hale did not know about. She said she was a very careful guest." Madame Fournier snipped a rose that did not need it. "She did not come back. I put the honey in the cellar. I have not been able to open it."</w:t>
+        <w:t>"The key has been in the biscuit tin since March," she said. "You took your time. It is under your tape, now, and the letter about the rent, and a photograph of Lucien standing on one leg, which I am not going to explain. Your friend Elise gave it to me. She came over the wall on a Thursday with a jar of honey I did not need and asked me to keep one thing in this valley that Monsieur Hale did not know about. She said she was a very careful guest." Madame Fournier snipped a rose that did not need it. "She did not come back. I put the honey in the cellar. I have not been able to open it." She looked at Tobias over the secateurs. "She said, give the key only to somebody who comes to you because of the honey. Not because of the key. Anybody can want a key. Nobody said honey, monsieur, until today."</w:t>
       </w:r>
     </w:p>
     <w:p>
@@ -8820,7 +8865,7 @@
     </w:p>
     <w:p>
       <w:r>
-        <w:t>"Hale is a cashier," said Mara. She was not, strictly, on the case. She was on the juge's case, which was a different thing, and which existed because Madame Fournier had sat in a procureur's waiting room in her good coat, and Mara had followed her into a magistrate's office in Aix with a rent ledger, a loose bolt in a jam jar and a scrapyard photograph, and had not walked out until it did. She put the Marseille photograph on the table, the one from the lobster restaurant: Hale, and the man with the closed-door face, and the hands buttering a roll. "This one decides. Armand Vial. The foundation is his. The cooler voice on the tape is not Hale's. Inês wrote his first name in the margin in March, before any of us had met him."</w:t>
+        <w:t>"Hale is a cashier," said Mara. She was not, strictly, on the case. She was on the juge's case, which was a different thing, and which existed because Madame Fournier had sat in a procureur's waiting room in her good coat, and Mara had followed her into a magistrate's office in Aix with a rent ledger, a sawn bolt from Lyon and a brake hose from a scrapyard, and had not walked out until it did. She put the Marseille photograph on the table, the one from the lobster restaurant: Hale, and the man with the closed-door face, and the hands buttering a roll. "This one decides. Armand Vial. The foundation is his. The cooler voice on the tape is not Hale's. Inês wrote his first name in the margin in March, before any of us had met him."</w:t>
       </w:r>
     </w:p>
     <w:p>
@@ -8879,7 +8924,7 @@
     </w:p>
     <w:p>
       <w:r>
-        <w:t>It had been Madame Fournier's washing machine for nineteen years, a heavy white French machine that had survived eleven winters, a flood, seven tenants and Tobias. It did not survive the thunderbolt. It gave a groan like a dying ox, shuddered through one last spin with the door still locked, sent a thin grey thread of smoke out of its soap drawer, and died, quite visibly, with a small clink, its drum full of Catarina's tea towels.</w:t>
+        <w:t>It had been Madame Fournier's washing machine for nineteen years, a heavy white French machine that had survived nineteen winters, a flood, seven tenants and Tobias. It did not survive the thunderbolt. It gave a groan like a dying ox, shuddered through one last spin with the door still locked, sent a thin grey thread of smoke out of its soap drawer, and died, quite visibly, with a small clink, its drum full of Catarina's tea towels.</w:t>
       </w:r>
     </w:p>
     <w:p>
@@ -9109,7 +9154,7 @@
     </w:p>
     <w:p>
       <w:r>
-        <w:t>Madame Fournier came down the garden ten minutes later, in her gardening gloves, because she had seen them from her kitchen window and wished to know what two people in dressing gowns were doing in Henri's terrace at seven in the morning. She stopped at the edge of the grove. She stood there for some time. Then she took off one glove, finger by finger, and reached up and touched a branch, the way you would touch the sleeve of somebody you had not seen for a while and were not sure you were allowed to speak to.</w:t>
+        <w:t>Madame Fournier came down the garden ten minutes later, in her gardening gloves, because she had seen them from her kitchen window and wished to know what two people in dressing gowns were doing in Henri's terrace at seven in the morning. She stopped at the edge of the grove. She stood there for some time. Then she pulled off one glove and reached up and touched a branch, the way you would touch the sleeve of somebody you had not seen for a while and were not sure you were allowed to speak to.</w:t>
       </w:r>
     </w:p>
     <w:p>
@@ -9196,7 +9241,7 @@
         <w:t>since those poor men must be famished</w:t>
       </w:r>
       <w:r>
-        <w:t>. She walked up the garden path in a yellow coat with the plate in both hands, looked up the ladder, and said, in her clear schoolgirl voice:</w:t>
+        <w:t>. She walked up the garden path in a yellow coat with the plate in both hands, looked up the ladder, and said, in her clear, bright, nineteen-year-old voice:</w:t>
       </w:r>
     </w:p>
     <w:p>
@@ -9514,7 +9559,7 @@
     </w:p>
     <w:p>
       <w:r>
-        <w:t>"You telephone your wife. You say, I will think. You say, I promise. And then you tell the housekeeper to go home." She said it quite slowly, as if she were reading it from a page held at arm's length. "It is very good. It is very tidy. In English it is very kind, I am sure."</w:t>
+        <w:t>"You telephone your wife. You say, I will think about it. And then you tell the housekeeper to go home." She said it quite slowly, as if she were reading it from a page held at arm's length. "It is very good. It is very tidy. In English it is very kind, I am sure."</w:t>
       </w:r>
     </w:p>
     <w:p>
@@ -9539,7 +9584,7 @@
     </w:p>
     <w:p>
       <w:r>
-        <w:t>Catarina looked at him for a long moment.</w:t>
+        <w:t>Catarina looked at him.</w:t>
       </w:r>
     </w:p>
     <w:p>
@@ -9715,12 +9760,7 @@
     </w:p>
     <w:p>
       <w:r>
-        <w:t>On the second afternoon, Madame Fournier came over the wall.</w:t>
-      </w:r>
-    </w:p>
-    <w:p>
-      <w:r>
-        <w:t>She came round to the front and rang the bell, which nobody had ever rung, walked past him into the hall, took off her gardening gloves finger by finger, and sat down on the bottom stair.</w:t>
+        <w:t>On the second afternoon, Madame Fournier came to call. She did not come over the wall. She came round to the front and rang the bell, which nobody had ever rung, walked past him into the hall, took off her gardening gloves finger by finger, and sat down on the bottom stair.</w:t>
       </w:r>
     </w:p>
     <w:p>
@@ -9756,6 +9796,11 @@
     <w:p>
       <w:r>
         <w:t>"She told me also. Over the wall. She said everything three times, in three languages, which is how I know it was the truth. A woman does not lie in three languages. It is too much work. And you said, so I was useful."</w:t>
+      </w:r>
+    </w:p>
+    <w:p>
+      <w:r>
+        <w:t>Tobias stared at her.</w:t>
       </w:r>
     </w:p>
     <w:p>
@@ -9936,7 +9981,7 @@
     </w:p>
     <w:p>
       <w:r>
-        <w:t>That night the radio from Lisbon came back on, and she sang along to it, off-key, and the house, which had been holding its breath for two days, let it out through every window, over the pond, where the pelican put its head under its wing and slept.</w:t>
+        <w:t>That night the radio from Lisbon came back on, and she sang along to it, off-key, and the house, which had been holding its breath for two days, let it out through every window, over the dark pond. In the morning there was a note under his plate again. It said EAT, and under that, smaller, in pencil, PLEASE.</w:t>
       </w:r>
     </w:p>
     <w:p>
@@ -10025,7 +10070,7 @@
     </w:p>
     <w:p>
       <w:r>
-        <w:t>The gate was locked. They climbed it, which is how a locked gate announces itself to the unlucky, and the first Gaston came down on the far side onto the brass gong that Madame Fournier kept on the porch as a decoration, and which Hugo had carried down the drive that afternoon and propped against the inside of the gate, he said afterwards, "for acoustic reasons." The sound went round the valley like the end of the world. Over the wall, in Madame Fournier's kitchen, three heads came up from the biscuit tin at once.</w:t>
+        <w:t>The gate was locked. They climbed it, which is how a locked gate announces itself to the unlucky, and the first Gaston, swinging his leg over, kicked the brass gong that Henri Fournier had hung on the gatepost in 1987 instead of a bell, because he said bells were for people who expected visitors. The sound went round the valley like the end of the world. Over the wall, in Madame Fournier's kitchen, three heads came up from the biscuit tin at once.</w:t>
       </w:r>
     </w:p>
     <w:p>
@@ -10360,12 +10405,12 @@
     </w:p>
     <w:p>
       <w:r>
-        <w:t>"In the afternoons," he said. "When anybody could see you go. From the road, from the lane, from a car parked at the top of it. She'd have seen you too. And she'd have stayed in, because she's careful, because you're being watched, and if she came out they'd have two of you." He turned round. "Baptistin's hut is on the channel. The torch I saw was on the channel. She isn't hiding from you. She's hiding from whoever's watching you. So we don't walk down the bank in daylight like people looking for somebody. We go by water, at dawn, before anybody's at the top of the lane, and we take everything with us, the tape and the notebook, because Hale has just told us he's coming back, and I'm not leaving them in a house he's walked into twice."</w:t>
-      </w:r>
-    </w:p>
-    <w:p>
-      <w:r>
-        <w:t>She had come up behind him, and she looked at him for some time across the dark study.</w:t>
+        <w:t>"In the afternoons," he said. "When anybody could see you go. From the road, from the lane, from a car parked at the top of it. She'd have seen you too. And she'd have stayed in, because she's careful, because you're being watched, and if she came out they'd have two of you." He turned round. "Baptistin's hut is on the channel. The torch I saw was on the channel. She isn't hiding from you. She's hiding from whoever's watching you. So we don't walk down the bank in daylight like people looking for somebody. We go by water, at dawn, before anybody's at the top of the lane, and we take everything with us, the tape and the notebook, because Hale has just told us he's coming back, and I'm not leaving them in a house that every crook in the Bouches-du-Rhône seems to have the address of."</w:t>
+      </w:r>
+    </w:p>
+    <w:p>
+      <w:r>
+        <w:t>She had come up behind him, and she looked at him across the dark study.</w:t>
       </w:r>
     </w:p>
     <w:p>
@@ -10420,7 +10465,7 @@
     </w:p>
     <w:p>
       <w:r>
-        <w:t xml:space="preserve">Catarina laughed, very quietly, with the water running off her face, and did not wipe it. It was the first time she had laughed since the margin. He kept rowing. He thought that if he rowed down this channel for the rest of his life, badly, soaking them both, with a heron going on ahead, and Catarina in the stern saying </w:t>
+        <w:t xml:space="preserve">Catarina laughed, very quietly, with the water running off her face, and did not wipe it. He kept rowing. He thought that if he rowed down this channel for the rest of his life, badly, soaking them both, with a heron going on ahead, and Catarina in the stern saying </w:t>
       </w:r>
       <w:r>
         <w:rPr>
@@ -10473,7 +10518,7 @@
     </w:p>
     <w:p>
       <w:r>
-        <w:t>"I watched you go into the lake for his pages," said Inês, also in Portuguese, and then, because the Inspector was there and manners are manners, in English. "I watched you for seven weeks. If I had come, they would have known where I was. They were watching the house. They were watching you." She looked at Tobias, briefly, as at a piece of evidence she had already filed. "And also you would have stopped looking at him, and I wanted to see how it ended."</w:t>
+        <w:t>"I watched you go into the lake for his pages," said Inês, also in Portuguese, and then, because the Inspector was there and manners are manners, in English. "I watched you since September. If I had come, they would have known where I was. They were watching the house. They were watching you." She looked at Tobias, briefly, as at a piece of evidence she had already filed. "And also you would have stopped looking at him, and I wanted to see how it ended."</w:t>
       </w:r>
     </w:p>
     <w:p>
@@ -10644,7 +10689,7 @@
         <w:ind w:firstLine="0"/>
       </w:pPr>
       <w:r>
-        <w:t>Mara took Inês's statement at Madame Fournier's kitchen table, on the Monday morning, with a recording machine the size of a matchbox, a notebook, two pens in case one died, and the juge's clerk on the end of a telephone line, listening, in Aix.</w:t>
+        <w:t>Mara took Inês's statement at Madame Fournier's kitchen table on the Wednesday morning. She could have taken it on the Monday, and the juge, who had Hale's names but nobody yet who had seen the jetty, had wanted her to; but on the Monday Inês had been seven months in a hut and had slept, Madame Fournier reported, for fourteen hours in Henri's chair with her boots on, and Mara had told Aix that a witness who falls asleep in the middle of her own evidence is a gift to the defence. So it was Wednesday, at Madame Fournier's table, with a recording machine the size of a matchbox, a notebook, two pens in case one died, and the juge's clerk on the end of a telephone line, listening, in Aix.</w:t>
       </w:r>
     </w:p>
     <w:p>
@@ -10968,7 +11013,7 @@
     </w:p>
     <w:p>
       <w:r>
-        <w:t xml:space="preserve">"I watched for a while," said Inês. "And then one day the Inspector came to the lane, in her own car, on a Sunday, and stood by the gate, alone, and looked at the jetty for twenty minutes the way my sister looked at it. Not like a policewoman. Like somebody who was sorry." She looked at Mara. "That was in October. I found your number in the bakery's telephone book, and I wrote it on the wall of the hut, with a nail, and I did not ring it. I looked at it every night. I am a careful woman. Careful is how I am still alive." She looked down the table at Tobias. "And then this morning, at dawn, you sat on my step and said, </w:t>
+        <w:t xml:space="preserve">"I watched for a while," said Inês. "And then one day the Inspector came to the lane, in her own car, on a Sunday, and stood by the gate, alone, and looked at the jetty for twenty minutes the way my sister looked at it. Not like a policewoman. Like somebody who was sorry." She looked at Mara. "That was in October. I found your number in the bakery's telephone book, and I wrote it on the wall of the hut, with a nail, and I did not ring it. I looked at it every night. I am a careful woman. Careful is how I am still alive." She looked down the table at Tobias. "And then on Monday, at dawn, you sat on my step and said, </w:t>
       </w:r>
       <w:r>
         <w:rPr>
@@ -11058,7 +11103,16 @@
         <w:ind w:firstLine="0"/>
       </w:pPr>
       <w:r>
-        <w:t>On the last evening before the warrant, Maître Edouard Delacroix-Roux polished the brass plate himself.</w:t>
+        <w:t xml:space="preserve">Sixty kilometres away, on that same Wednesday evening, while Tobias sat at the Olivetti with the word </w:t>
+      </w:r>
+      <w:r>
+        <w:rPr>
+          <w:i/>
+        </w:rPr>
+        <w:t>counted</w:t>
+      </w:r>
+      <w:r>
+        <w:t xml:space="preserve"> still on the page, Maître Edouard Delacroix-Roux polished the brass plate himself. It was the last evening before the warrant. He did not know that. He would have polished it anyway.</w:t>
       </w:r>
     </w:p>
     <w:p>
@@ -11134,7 +11188,7 @@
     </w:p>
     <w:p>
       <w:r>
-        <w:t xml:space="preserve">Hale had been taken that morning from the end of the jetty, and Hale would talk, because Hale was a man who had always talked: to waiters, to authors, to the speaker of his own telephone. Let him. Hale's word was a cashier's word. Hale had stood at a window and seen nothing, and had checked, beforehand, that nothing could be seen. The tape had a first name on it, and there were, Edouard knew exactly, forty-one avocats called Edouard at the bar of Aix. The bolt was a bolt. The hose was a hose. Moutet would say what Moutet had always said, because once you have said </w:t>
+        <w:t xml:space="preserve">Hale had been taken on Monday from the end of the jetty, and Hale would talk, because Hale was a man who had always talked: to waiters, to authors, to the speaker of his own telephone. Let him. Hale's word was a cashier's word. Hale had stood at a window and seen nothing, and had checked, beforehand, that nothing could be seen. The tape had a first name on it, and there were, Edouard knew exactly, forty-one avocats called Edouard at the bar of Aix. The bolt was a bolt. The hose was a hose. Moutet would say what Moutet had always said, because once you have said </w:t>
       </w:r>
       <w:r>
         <w:rPr>
@@ -11158,7 +11212,7 @@
     </w:p>
     <w:p>
       <w:r>
-        <w:t>She had not been afraid either. That had surprised him. She had stood on the end of the jetty in her grey wool coat with her hands in her pockets, exactly as Hale was standing now at the window, and she had listened to him explain, very reasonably, what she would sign and what she would forget, and at the end she had laughed. Not unkindly. She had laughed the way the English laugh at a waiter's French.</w:t>
+        <w:t>She had not been afraid either. That had surprised him. She had stood on the end of the jetty in her grey wool coat with her hands in her pockets, exactly as Hale was standing, at that moment, at the study window, and she had listened to him explain, very reasonably, what she would sign and what she would forget, and at the end she had laughed. Not unkindly. She had laughed the way the English laugh at a waiter's French.</w:t>
       </w:r>
     </w:p>
     <w:p>
@@ -11263,7 +11317,7 @@
         <w:ind w:firstLine="0"/>
       </w:pPr>
       <w:r>
-        <w:t>Juge Hélène Sarrazin listened to Inês's statement at her desk in Aix, from the beginning, before lunch, sitting down, exactly as Mara had advised. Her clerk said afterwards that she listened to it twice, and that during the second hearing she took off her glasses and laid them on the desk and put both hands flat on either side of them, and did not move until the tape ran out. Then she put her glasses back on, picked up her pen, and signed four documents in a row without reading them again, because she had already read them, three times, the night before, at her kitchen table, while her husband made an omelette and was not spoken to.</w:t>
+        <w:t>That morning, before the brass plate and the yellow cloth, Juge Hélène Sarrazin had listened to Inês's statement at her desk in Aix, from the beginning, before lunch, sitting down, exactly as Mara had advised. Her clerk said afterwards that she listened to it twice, and that during the second hearing she took off her glasses and laid them on the desk and put both hands flat on either side of them, and did not move until the tape ran out. Then she put her glasses back on, picked up her pen, and signed four documents in a row without reading them again, because she had already read them, three times, the night before, at her kitchen table, while her husband made an omelette and was not spoken to.</w:t>
       </w:r>
     </w:p>
     <w:p>
@@ -11566,7 +11620,7 @@
         <w:ind w:firstLine="0"/>
       </w:pPr>
       <w:r>
-        <w:t>The second box was opened on a Thursday, in a vault in the rue Paradis, in the presence of the director of the bank, two lawyers for the Fondation Vial who did not stop objecting until the juge's clerk read them the order aloud in its entirety for the third time, Inspector Mara Quill of the judicial police, and Anselm Brunner of the Vatican Apostolic Library, who had been in Marseille for eleven days, staying in a small hotel near the station, waiting, with his umbrella and his patience, for exactly this.</w:t>
+        <w:t>The second box was opened that same Thursday afternoon, in a vault in the rue Paradis, in the presence of the director of the bank, two lawyers for the Fondation Vial who did not stop objecting until the juge's clerk read them the order aloud in its entirety for the third time, Lieutenant Mara Quill of the gendarmerie, and Anselm Brunner of the Vatican Apostolic Library, who had been in Marseille for thirteen days, staying in a small hotel near the station, waiting, with his umbrella and his patience, for exactly this.</w:t>
       </w:r>
     </w:p>
     <w:p>
@@ -11686,7 +11740,7 @@
     </w:p>
     <w:p>
       <w:r>
-        <w:t>Brunner looked at her for a long moment. Then he smiled, a small, weary, dignified smile, the smile of a man who has spent his whole life being mocked by the French and has decided, on balance, that it was worth it.</w:t>
+        <w:t>Brunner looked at her. Then he smiled, a small, weary, dignified smile, the smile of a man who has spent his whole life being mocked by the French and has decided, on balance, that it was worth it.</w:t>
       </w:r>
     </w:p>
     <w:p>
@@ -11716,7 +11770,7 @@
     </w:p>
     <w:p>
       <w:r>
-        <w:t>Then he went out into the rain, and down the gravel, with the case under his arm and the umbrella up, and through the gate, and the pelican on the lounger took its head out from under its wing and watched him go all the way down the lane until he was out of sight.</w:t>
+        <w:t>Brunner walked out into the rain, and down the gravel with the case under his arm, and through the gate, and Tobias stood in the doorway and watched the umbrella go down the lane, held at the angle of a bayonet, until the rain took it.</w:t>
       </w:r>
     </w:p>
     <w:p>
@@ -11974,7 +12028,7 @@
         <w:t>Liaison.</w:t>
       </w:r>
       <w:r>
-        <w:t>" She paused. "He put everything else in a cardboard box. The photographs, the trophy, the cigars, the commendation. And then he stood looking at the pen for some time. And then he picked it up, and held it out to me."</w:t>
+        <w:t>" She paused. "He put everything else in a cardboard box. The photographs, the trophy, the cigars, the commendation. And then he stood looking at the pen. And then he picked it up, and held it out to me."</w:t>
       </w:r>
     </w:p>
     <w:p>
@@ -12054,7 +12108,7 @@
         <w:ind w:firstLine="0"/>
       </w:pPr>
       <w:r>
-        <w:t>The juge offered Mara a promotion. That was not, strictly, within a juge's gift; but Juge Sarrazin had a way of mentioning things to the right people over lunch, and by the end of the following week a letter had arrived from the regional directorate offering Lieutenant Mara Quill the rank of capitaine, a transfer to the judicial police in Marseille, an office with a window onto the old port, and a pay rise that was not large but was, she said, at least a number.</w:t>
+        <w:t>The juge offered Mara a promotion. That was not, strictly, within a juge's gift; but Juge Sarrazin had a way of mentioning things to the right people over lunch, and by the end of the following week a letter had arrived from the regional directorate offering Lieutenant Mara Quill the rank of capitaine, a transfer to the gendarmerie's research section in Marseille, an office with a window onto the old port, and a pay rise that was not large but was, she said, at least a number.</w:t>
       </w:r>
     </w:p>
     <w:p>
@@ -12119,7 +12173,7 @@
     </w:p>
     <w:p>
       <w:r>
-        <w:t>"He's a pelican," said Mara. "He doesn't approve of anything." She looked at the bird for a long moment, with something in her face that Tobias had not seen there before, something that in a less disciplined woman might have been tenderness. "But he stays. I'll give him that. Everyone else left this jetty in March. He stayed."</w:t>
+        <w:t>"He's a pelican," said Mara. "He doesn't approve of anything." She looked at the bird for a while, with something in her face that Tobias had not seen there before, something that in a less disciplined woman might have been tenderness. "But he stays. I'll give him that. Everyone else left this jetty in March. He stayed."</w:t>
       </w:r>
     </w:p>
     <w:p>
@@ -12148,7 +12202,7 @@
     </w:p>
     <w:p>
       <w:r>
-        <w:t>It had begun, Priscilla Pemberton-Hayes explained, in 2009, when there had been eleven English couples within ten kilometres and nothing on the television. It now involved twenty-three English people, four Dutch, one Belgian schoolmaster who had come back for it every year since his October in the lake house, a German dentist who played the piano, and, in the back row of the chorus, by special arrangement with the mairie, the deputy mayor, who did not speak a word of English and had been a pirate, a policeman, a Chinese laundryman and an ugly sister in successive years, without ever once being told what any of it was about.</w:t>
+        <w:t>It had begun, Priscilla Pemberton-Hayes explained, in 2009, when there had been eleven English couples within ten kilometres and nothing on the television. It now involved twenty-three English people, four Dutch, one Belgian schoolmaster who had come down from Liège for it ever since his October in the lake house, a German dentist who played the piano, and, in the back row of the chorus, by special arrangement with the mairie, the deputy mayor, who did not speak a word of English and had been a pirate, a policeman, a Chinese laundryman and an ugly sister in successive years, without ever once being told what any of it was about.</w:t>
       </w:r>
     </w:p>
     <w:p>
@@ -12326,7 +12380,7 @@
     </w:p>
     <w:p>
       <w:r>
-        <w:t>Catarina considered this for a long time.</w:t>
+        <w:t>Catarina considered this.</w:t>
       </w:r>
     </w:p>
     <w:p>
@@ -12445,7 +12499,7 @@
     </w:p>
     <w:p>
       <w:r>
-        <w:t>"OH YES YOU HAVE! WE SAW! IN OCTOBER! WITH THE BABYSITTER!"</w:t>
+        <w:t>"OH YES YOU HAVE! IN OCTOBER! WITH THE BABYSITTER!"</w:t>
       </w:r>
     </w:p>
     <w:p>
@@ -12455,7 +12509,7 @@
     </w:p>
     <w:p>
       <w:r>
-        <w:t>Then the back half of the horse sat down very suddenly on the stage, and the front half fell over it, and Priscilla Pemberton-Hayes, Dame, in a dress made of her own curtains, looked down at the wreckage of her husband with an expression of the most perfect, serene and complete satisfaction, and said, to the third row, with great dignity:</w:t>
+        <w:t>Then the back half of the horse sat down very suddenly on the stage, and the front half fell over it, and Priscilla Pemberton-Hayes, Dame, in a dress made of her own curtains, looked down at the wreckage of her husband with an expression of the most perfect, serene and complete satisfaction, and said, to the third row:</w:t>
       </w:r>
     </w:p>
     <w:p>
@@ -12834,7 +12888,7 @@
     </w:p>
     <w:p>
       <w:r>
-        <w:t>At two minutes past three, the fourth stair creaked, on purpose, and she was there, in the doorway, in her dressing gown, with her arms folded, watching him, and she did not say anything, and she did not need to.</w:t>
+        <w:t>At two minutes past three, the fourth stair creaked, on purpose, and she was there, in the doorway, in her dressing gown, with her arms folded, watching him, and said nothing at all, which in that house had long since become a language.</w:t>
       </w:r>
     </w:p>
     <w:p>
@@ -12892,7 +12946,7 @@
     </w:p>
     <w:p>
       <w:r>
-        <w:t xml:space="preserve">"On them," said Hugo, and pointed. "I looked them up after the first burglary. At the notary's. It was in </w:t>
+        <w:t xml:space="preserve">"On them," said Hugo, and pointed. "After the notary's, it was in </w:t>
       </w:r>
       <w:r>
         <w:rPr>
@@ -12901,7 +12955,7 @@
         <w:t>La Provence</w:t>
       </w:r>
       <w:r>
-        <w:t>. Two men called Gaston, both from Toulon, both with eleven previous convictions, mostly for falling over." He folded his hands. "I knew they'd come. Men who've been sent for something always come back for it. It's in all the books. So I prepared."</w:t>
+        <w:t>. Two men called Gaston, both from Toulon, both with eleven previous convictions, mostly for falling over." He folded his hands. "I didn't do anything clever. I just told them the law and told them about a snake. People who are already frightened believe whatever you say next. That's in all the books too."</w:t>
       </w:r>
     </w:p>
     <w:p>
@@ -12921,12 +12975,12 @@
     </w:p>
     <w:p>
       <w:r>
-        <w:t>The Gastons got eighteen months each, suspended, and an order not to come within five kilometres of the lake, which the second Gaston, the one who falls, said in a small voice he had no intention of doing ever again, as there were children there. As they were led out, the first Gaston was heard to say to the second, with a kind of broken wonder, "Gaston. I think we should go to New York."</w:t>
-      </w:r>
-    </w:p>
-    <w:p>
-      <w:r>
-        <w:t>"There are children in New York," said the second Gaston, and the door closed on them.</w:t>
+        <w:t>The Gastons got eighteen months each, suspended, and an order not to come within five kilometres of the lake, which the second Gaston, the one who falls, said in a small voice he had no intention of doing ever again, as there were children there. As they were led out, the first Gaston was heard to say to the second, with a kind of broken wonder, "Gaston. I think we should retire."</w:t>
+      </w:r>
+    </w:p>
+    <w:p>
+      <w:r>
+        <w:t>"From what?" said the second Gaston, and the door closed on them.</w:t>
       </w:r>
     </w:p>
     <w:p>
@@ -12954,7 +13008,7 @@
     </w:p>
     <w:p>
       <w:r>
-        <w:t>There were two men in the dock. Maître Edouard Delacroix-Roux, avocat, fifty-three, in a charcoal suit and a white shirt and a plain dark-blue tie, because his own lawyers, it was said, had begged him not to wear the other one; and Victor Hale, publisher, sixty-one, in a beautiful coat that had begun, over five months in the maison d'arrêt at Luynes, to hang on him like a coat on a peg.</w:t>
+        <w:t>There were two men in the dock. Maître Edouard Delacroix-Roux, avocat, fifty-three, in a charcoal suit and a white shirt and a plain dark-blue tie, because his own lawyers, it was said, had begged him not to wear the other one; and Victor Hale, publisher, sixty-one, in a beautiful coat that had begun, over four months in the maison d'arrêt at Luynes, to hang on him like a coat on a peg.</w:t>
       </w:r>
     </w:p>
     <w:p>
@@ -12973,7 +13027,7 @@
     </w:p>
     <w:p>
       <w:r>
-        <w:t>The case had already been made, by ordinary means, before the doors of the court opened: the tape, the margin in Inês's notebook, the forged assignment from Barbier's files, the bolt from Lyon, the brake hose from Cavaillon, the telephone records, the rent ledger, the sacks of Highly Commended letters, and Hale's own second statement. The trial would test those things in public. It would not replace them.</w:t>
+        <w:t>The case had already been made, by ordinary means, before the doors of the court opened: the tape, the margin in Inês's notebook, the forged assignment from Barbier's files, the bolt from Lyon, the brake hose from Cavaillon, the telephone records, the rent ledger, the sacks of Highly Commended letters, nineteen signed statements from writers who had paid, one of them from Cape Town with a photograph of a red ribbon, and Hale's own second statement. The trial would test those things in public. It would not replace them.</w:t>
       </w:r>
     </w:p>
     <w:p>
@@ -13035,7 +13089,7 @@
     </w:p>
     <w:p>
       <w:r>
-        <w:t>The judge asked whether the cooler voice on the telephone could be identified as the accused's. Mara said the laboratory's comparison was consistent with recordings of Maître Delacroix-Roux's voice from two earlier hearings, but that voice comparison was not a fingerprint, and the court should treat it as one strand among several and not as a rope. Tobias, in the public gallery, wrote that down. It was the most honest sentence he had heard from anyone in a uniform in his life, and he wanted it for the book.</w:t>
+        <w:t>The judge asked whether the cooler voice on the telephone could be identified as the accused's. Mara said the laboratory's comparison was consistent with recordings of Maître Delacroix-Roux's voice from two earlier hearings, but that voice comparison was not a fingerprint, and the court should treat it as one strand among several and not as a rope. Tobias, in the public gallery, wrote that down. It was the most honest sentence he had heard from anyone in the service in his life, and he wanted it for the book.</w:t>
       </w:r>
     </w:p>
     <w:p>
@@ -13073,7 +13127,7 @@
     </w:p>
     <w:p>
       <w:r>
-        <w:t>Monsieur Lemaire, in his cardigan, without the cat, repeated what he had told Dona Graça and the young officer and Tobias and Catarina, in the same words, in the same order, like a train timetable, and when the defence asked whether, at seventy-one, doing the crossword, he could really be sure it was an umbrella and not a walking stick, he looked at the lawyer for a long time and said, "Maître, I worked at Lyon airport for thirty-one years. I know the difference between an umbrella and a walking stick. Do you?" and sat down, and was not asked anything else.</w:t>
+        <w:t>Monsieur Lemaire, in his cardigan, without the cat, repeated what he had told Dona Graça and the commandant with the very good pen and Tobias and Catarina, in the same words, in the same order, like a train timetable, and when the defence asked whether, at seventy-one, doing the crossword, he could really be sure it was an umbrella and not a walking stick, he looked at the lawyer for a long time and said, "Maître, I worked at Lyon airport for thirty-one years. I know the difference between an umbrella and a walking stick. Do you?" and sat down, and was not asked anything else.</w:t>
       </w:r>
     </w:p>
     <w:p>
@@ -13182,7 +13236,7 @@
     </w:p>
     <w:p>
       <w:r>
-        <w:t>Then she turned her head and looked at Delacroix-Roux, across the room, for a long moment, the way she had looked at him across the Cours Mirabeau through the falling leaves.</w:t>
+        <w:t>Then she turned her head and looked at Delacroix-Roux, across the room, the way she had looked at him across the Cours Mirabeau through the falling leaves.</w:t>
       </w:r>
     </w:p>
     <w:p>
@@ -13441,7 +13495,7 @@
     </w:p>
     <w:p>
       <w:r>
-        <w:t>"Resistance is useless," Inês murmured, in English, for his benefit alone. "I tried for thirty-four years. The only winning move is to be hungry."</w:t>
+        <w:t>"Resistance is useless," Inês murmured, in English, for his benefit alone. "I tried for thirty-two years. The only winning move is to be hungry."</w:t>
       </w:r>
     </w:p>
     <w:p>
@@ -13501,7 +13555,7 @@
     </w:p>
     <w:p>
       <w:r>
-        <w:t>When Fernanda had finished with him, he wiped his hands, took Catarina a little apart, and held out a thin bound manuscript.</w:t>
+        <w:t>When Fernanda had finished with them, Tobias wiped his hands, took Catarina a little apart, and held out a thin bound manuscript.</w:t>
       </w:r>
     </w:p>
     <w:p>
@@ -13581,7 +13635,7 @@
     </w:p>
     <w:p>
       <w:r>
-        <w:t>She kissed him then, in the cold sun, in front of the whole courthouse. A single stray page of an old draft, blown loose from nowhere, spun up over their heads, caught the light, and drifted away down the street over the heads of the market. Sixty kilometres away, on the end of a jetty, a pelican cleared its throat, or did not; nobody was there to hear it, which was how he preferred it.</w:t>
+        <w:t>She kissed him then, in the cold sun, in front of the whole courthouse. A single stray page of an old draft, blown loose from nowhere, spun up over their heads, caught the light, and drifted away down the street over the heads of the market.</w:t>
       </w:r>
     </w:p>
     <w:p>
@@ -13927,7 +13981,7 @@
     </w:p>
     <w:p>
       <w:r>
-        <w:t>Margaret looked at her son for a long moment, with the expression of a woman who has found out, forty-six years late, exactly where she went wrong.</w:t>
+        <w:t>Margaret looked at her son for some time, with the expression of a woman who has found out, forty-six years late, exactly where she went wrong.</w:t>
       </w:r>
     </w:p>
     <w:p>
@@ -14205,7 +14259,7 @@
     </w:p>
     <w:p>
       <w:r>
-        <w:t>"I know. I read it at night, in the study, in September," said Catarina, "with a dictionary, on the floor. I will make it better."</w:t>
+        <w:t>"I know. I read it in December, by the stove, with a dictionary," said Catarina. "I will make it better."</w:t>
       </w:r>
     </w:p>
     <w:p>
@@ -14233,7 +14287,7 @@
     </w:p>
     <w:p>
       <w:r>
-        <w:t>"It is the same jetty," she said, when it was done, standing at the end of it in her quilted waistcoat with her secateurs, which she had brought, she said, in case of emergencies. "The same wood. The same nails, mostly. Only, turned over." She tapped the newest board with her foot. "Like a page."</w:t>
+        <w:t>"It is the same jetty," she said, when it was done, standing at the end of it in her quilted waistcoat with her secateurs. "The same wood. The same nails, mostly. Only, turned over." She tapped the newest board with her foot. "Like a page."</w:t>
       </w:r>
     </w:p>
     <w:p>
@@ -14248,7 +14302,7 @@
     </w:p>
     <w:p>
       <w:r>
-        <w:t>When it came off, she dipped one finger in, and tasted it, and sat for some time looking at the water.</w:t>
+        <w:t>When it came off, she dipped one finger in, and tasted it, and sat looking at the water until the light changed.</w:t>
       </w:r>
     </w:p>
     <w:p>
@@ -14276,7 +14330,7 @@
         <w:ind w:firstLine="0"/>
       </w:pPr>
       <w:r>
-        <w:t>Hugo found the snake in June.</w:t>
+        <w:t>Hugo found the snake in July.</w:t>
       </w:r>
     </w:p>
     <w:p>
@@ -14333,7 +14387,7 @@
     </w:p>
     <w:p>
       <w:r>
-        <w:t>They went down without a torch, because they knew the path now, and the moon was up, and they had walked it a hundred times since March, and it was only a garden, and only a lawn, and only three stone steps, the second of which Tobias still nearly fell on every time, and which Catarina said she was going to have Henri's carpenter look at, and never did, because it was his step now, and a man should have one thing in a house he can rely on to go wrong.</w:t>
+        <w:t>They went down without a torch, because they knew the path now, and the moon was up, and they had walked it a hundred times since the autumn, and it was only a garden, and only a lawn, and only three stone steps, the second of which Tobias still nearly fell on every time, and which Catarina said she was going to have Henri's carpenter look at, and never did, because it was his step now, and a man should have one thing in a house he can rely on to go wrong.</w:t>
       </w:r>
     </w:p>
     <w:p>
@@ -14414,7 +14468,7 @@
     </w:p>
     <w:p>
       <w:r>
-        <w:t>He felt in his jacket pocket. He had been carrying it since the courthouse steps, for nine weeks, in the inside pocket, against his heart, where a postcard from a dead friend had once been, and where the cold had got in, and it had worn the lining thin. It was not a ring. A ring was Portugal, and Fernanda, and a priest who was a cousin, and that was September. This was the jetty, and this was now, and this was only the two of them.</w:t>
+        <w:t>He felt in his jacket pocket. He had been carrying it since the spring, since the week after the courthouse steps, in the inside pocket, against his heart, where a postcard from a dead friend had once been, and where the cold had got in, and it had worn the lining thin. It was not a ring. A ring was Portugal, and Fernanda, and a priest who was a cousin, and that was September. This was the jetty, and this was now, and this was only the two of them.</w:t>
       </w:r>
     </w:p>
     <w:p>

</xml_diff>

<commit_message>
Merge 'In Love with Murder, Actually' folder from book-2-lectures-after-qed (round 5: full line edit and final reread)
</commit_message>
<xml_diff>
--- a/In Love with Murder, Actually/In_Love_with_Murder_Actually.docx
+++ b/In Love with Murder, Actually/In_Love_with_Murder_Actually.docx
@@ -86,7 +86,7 @@
         <w:ind w:firstLine="0"/>
       </w:pPr>
       <w:r>
-        <w:t>This is a work of fiction. The characters, the Verrane Foundation and its award, Lake Verrane, Hale Books, the Fondation Vial, the Marchetti Codex and every crime in these pages are invented. Any resemblance to actual persons, living or dead, or to actual companies, prizes or events, is coincidental. Real towns, streets, landmarks and institutions appear only as settings, and nothing in this book describes the conduct of any real person who works in them.</w:t>
+        <w:t>This is a work of fiction. The characters, the Verrane Foundation and its award, the lake house, Hale Books, the Fondation Vial, the Marchetti Codex and every crime in these pages are invented. Any resemblance to actual persons, living or dead, or to actual companies, prizes or events, is coincidental. Real towns, streets, landmarks and institutions appear only as settings, and nothing in this book describes the conduct of any real person who works in them.</w:t>
       </w:r>
     </w:p>
     <w:p>
@@ -146,7 +146,7 @@
     </w:p>
     <w:p>
       <w:r>
-        <w:t>The Verrane Foundation Award is invented, and so is Lake Verrane, which is only a pond. Prizes that charge an entry fee and then ask "commended" writers to pay for inclusion in an anthology are, unhappily, not invented. If a competition you have never heard of praises your work and then asks for money, look it up before you pay.</w:t>
+        <w:t>The Verrane Foundation Award is invented, and so is the lake, which is only a pond. Prizes that charge an entry fee and then ask "commended" writers to pay for inclusion in an anthology are, unhappily, not invented. If a competition you have never heard of praises your work and then asks for money, look it up before you pay.</w:t>
       </w:r>
     </w:p>
     <w:p>
@@ -1608,7 +1608,7 @@
     </w:p>
     <w:p>
       <w:r>
-        <w:t>He went up because it was his house. Camilla was there. Gerald, from the golf club, was there. The duvet was his. He asked if it was, because the other questions were too large for the landing. Nobody answered usefully. He went down. He put the wine back in the fridge, out of habit, took it out again, out of dignity, and drank it at the sink. He wrote a note. Gone to France. Keep the duvet. He considered adjectives, and refused them. A person cannot improve that sort of note. He put the Olivetti in its case, and the only copy of the new book in a satchel, and a postcard from a dead friend in his breast pocket, and left the lamps.</w:t>
+        <w:t>He went up because it was his house. Camilla was there. Gerald, from the golf club, was there. The duvet was his. He asked if it was, because the other questions were too large for the landing. Nobody answered usefully. He went down. He put the wine back in the fridge, out of habit, took it out again, out of dignity, and drank it at the sink. He wrote a note. Gone to France. Keep the duvet. He considered adjectives, and refused them. A person cannot improve that sort of note. He put the Olivetti in its case, and the only copy of the new book in a satchel, and a postcard from a dead friend in his breast pocket, and left the lamps on.</w:t>
       </w:r>
     </w:p>
     <w:p>
@@ -1642,7 +1642,7 @@
     </w:p>
     <w:p>
       <w:r>
-        <w:t>It was a pond. The advertisement had said lake, because a lake can be let by the week and a pond cannot. Madame Fournier called it the étang and did not discuss it. Tobias called it the lake for eleven days, because he was English and recently ruined and needed a body of water large enough to have taken a friend. It was not. You could see the far reeds from the jetty. You could wade it, if you were angry, or pushed, or simply unwilling to let paper go. A heron used it. A pelican would later occupy it, and look too big, which was the pond's opinion of grandeur.</w:t>
+        <w:t>It was a pond. The advertisement had said lake, because a lake can be let by the week and a pond cannot. Madame Fournier called it the étang and did not discuss it. Tobias called it the lake, because he was English and recently ruined and needed a body of water large enough to have taken a friend. It was not. You could see the far reeds from the jetty. You could wade it, if you were angry, or pushed, or simply unwilling to let paper go. A heron used it. A pelican would later occupy it, and look too big, which was the pond's opinion of grandeur.</w:t>
       </w:r>
     </w:p>
     <w:p>
@@ -1661,7 +1661,7 @@
     </w:p>
     <w:p>
       <w:r>
-        <w:t>Tobias Lind had carried the manuscript out to the end of the jetty because the house was too quiet to read in. He wanted wind and cold and the sound of something bigger than his own failure. The pond did not provide the sound. It provided a surface. He sat down with the satchel on his knees, a Thermos of tea at his elbow, and a gust came across the water and opened the bag like a hand.</w:t>
+        <w:t>He had carried the manuscript out to the end of the jetty because the house was too quiet to read in. He wanted wind and cold and the sound of something bigger than his own failure. The pond did not provide the sound. It provided a surface. He sat down with the satchel on his knees, a Thermos of tea at his elbow, and a gust came across the water and opened the bag like a hand.</w:t>
       </w:r>
     </w:p>
     <w:p>
@@ -1676,7 +1676,7 @@
     </w:p>
     <w:p>
       <w:r>
-        <w:t>He did not shout. He was English, and Leeds-born, and the family instinct in a disaster was to say nothing and put the kettle on. He stood very still and watched two years of his life drift away. It was, he reflected, a fairly standard Tuesday.</w:t>
+        <w:t>He did not shout. He was English, and Leeds-born, and the family instinct in a disaster was to say nothing and put the kettle on. He stood there and watched two years of his life drift away. It was, he reflected, a fairly standard Tuesday.</w:t>
       </w:r>
     </w:p>
     <w:p>
@@ -1730,7 +1730,7 @@
         <w:ind w:firstLine="0"/>
       </w:pPr>
       <w:r>
-        <w:t>She had come to the lake house in September, sent by an agency in the city. Tobias had rented the place for the autumn from a publisher named Victor Hale, who had been very generous about the price, and who had implied, in several warm emails, that the house was his. Too generous, in hindsight. The house came with a housekeeper, and the housekeeper was Portuguese, spoke perhaps thirty words of English, and had never looked at him for longer than politeness required.</w:t>
+        <w:t>She had come to the lake house at the beginning of September, eleven days before him, sent by an agency in the city. Victor Hale's emails, which had been warm, and had implied that the house was his, had said a great deal about the light and nothing about her. She was Portuguese, spoke perhaps thirty words of English, and had never looked at him for longer than politeness required.</w:t>
       </w:r>
     </w:p>
     <w:p>
@@ -1771,7 +1771,7 @@
         <w:t>pó</w:t>
       </w:r>
       <w:r>
-        <w:t>, dust, and dusted the doorframe very hard. He thought nothing of it. He thought nothing of anything that fortnight. He was a man who had recently been ruined, and the ruined are very bad at noticing.</w:t>
+        <w:t>, dust, and dusted the doorframe very hard. He thought nothing of it. He thought nothing of anything that month. He was a man who had recently been ruined, and the ruined are very bad at noticing.</w:t>
       </w:r>
     </w:p>
     <w:p>
@@ -1801,7 +1801,7 @@
     </w:p>
     <w:p>
       <w:r>
-        <w:t>He sat across from her for an hour and said nothing, because he had nothing in a language she could use. At the end of it she put a mug of tea in front of him, so weak that the tea bag had clearly been introduced to the water only briefly, in a cup with a chip in it, and walked out. He realised it was the kindest thing anyone had done for him in a year.</w:t>
+        <w:t>He sat across from her for an hour and said nothing, because he had nothing in a language she could use. At the end of it she put a cup of tea in front of him, so weak that the bag had clearly been introduced to the water only briefly. The cup had a chip in the rim. Then she walked out. He realised it was the kindest thing anyone had done for him in a year.</w:t>
       </w:r>
     </w:p>
     <w:p>
@@ -1845,7 +1845,7 @@
         <w:ind w:firstLine="0"/>
       </w:pPr>
       <w:r>
-        <w:t>By noon only a third of the pages could be read, and Tobias was struck by what he was reading.</w:t>
+        <w:t>By noon only a third of the pages could be read, and Tobias, reading them, remembered why he had written them.</w:t>
       </w:r>
     </w:p>
     <w:p>
@@ -1885,7 +1885,7 @@
     </w:p>
     <w:p>
       <w:r>
-        <w:t>Now the pages that named the villain were floating in a pond, or drying on a towel, illegibly.</w:t>
+        <w:t>Now the pages that named the villain were in a pond, or on a towel, illegible.</w:t>
       </w:r>
     </w:p>
     <w:p>
@@ -1920,7 +1920,7 @@
     </w:p>
     <w:p>
       <w:r>
-        <w:t>Later she came back with the linen she had pretended to be fetching, and stood in the kitchen doorway while he read. For the first time she did not look away.</w:t>
+        <w:t>Later, when he had brought the pages down to the kitchen table, she came back with the linen she had pretended to be fetching, and stood in the doorway while he read. For the first time she did not look away.</w:t>
       </w:r>
     </w:p>
     <w:p>
@@ -1940,7 +1940,7 @@
     </w:p>
     <w:p>
       <w:r>
-        <w:t>Then she went back to work, and he sat very still for a long time. The name stayed where she had left it. Inês. He wrote it on the back of an envelope, so that he would not lose it the way he lost everything else, and put the envelope under the Olivetti, and did not look at it again that day.</w:t>
+        <w:t>Then she went back to work, and he sat where he was until the light moved off the table. The name stayed where she had left it. Inês. He wrote it on the back of an envelope, so that he would not lose it the way he lost everything else, and put the envelope under the Olivetti, and did not look at it again that day.</w:t>
       </w:r>
     </w:p>
     <w:p>
@@ -2049,12 +2049,7 @@
     </w:p>
     <w:p>
       <w:r>
-        <w:t>Lake Verrane was in the south of France, which Tobias had known for twelve days and had somehow still failed to prepare for.</w:t>
-      </w:r>
-    </w:p>
-    <w:p>
-      <w:r>
-        <w:t>When she had gone, he walked to the garage in the village and hired a small car, because there was a bookshop in the next town and he needed, urgently, to be able to say more to his housekeeper than thank you in the voice of her aunt. The man at the garage had handed over the keys with the expression of a vet releasing a pet to an owner he did not trust. "À droite," the man had said, three times, pointing at the road. Tobias had nodded three times and driven out of the yard on the left.</w:t>
+        <w:t>When she had gone, he walked to the garage in the village and hired a small car, because there was a bookshop in the next town and he needed, urgently, to be able to say more to his housekeeper than thank you in the voice of her aunt. The man at the garage handed over the keys with the expression of a vet releasing a pet to an owner he did not trust. "À droite," he said, three times, pointing at the road. Tobias nodded three times and drove out of the yard on the left.</w:t>
       </w:r>
     </w:p>
     <w:p>
@@ -2094,7 +2089,7 @@
     </w:p>
     <w:p>
       <w:r>
-        <w:t>Madame Fournier looked at him for a long moment.</w:t>
+        <w:t>Madame Fournier looked at him.</w:t>
       </w:r>
     </w:p>
     <w:p>
@@ -2139,7 +2134,7 @@
     </w:p>
     <w:p>
       <w:r>
-        <w:t>"Non, merci," said Tobias, with great dignity. "Je suis plein."</w:t>
+        <w:t>"Non, merci," said Tobias, with what he hoped was dignity. "Je suis plein."</w:t>
       </w:r>
     </w:p>
     <w:p>
@@ -2174,7 +2169,7 @@
     </w:p>
     <w:p>
       <w:r>
-        <w:t>"Victor Hale pays me eleven hundred euros a month for this house," she said. "He tells me he rents it to a very quiet English writer."</w:t>
+        <w:t>"Victor Hale pays me eleven hundred euros a month for this house," she said. "He tells me he lends it to friends. This autumn, a very quiet English writer."</w:t>
       </w:r>
     </w:p>
     <w:p>
@@ -2298,7 +2293,7 @@
     </w:p>
     <w:p>
       <w:r>
-        <w:t>"The ink ran," Tobias said, with the dignity of a man defending his work against an appliance. "It's the water damage. It can't cope."</w:t>
+        <w:t>"The ink ran," said Tobias, defending his work against an appliance. "It's the water damage. It can't cope."</w:t>
       </w:r>
     </w:p>
     <w:p>
@@ -2328,7 +2323,7 @@
     </w:p>
     <w:p>
       <w:r>
-        <w:t>He gave the laptop back to Madame Fournier, who put it under the lace cloth with the scanner, so that they could keep each other company in disgrace. For the first time in his life, he typed the next chapter on the Olivetti on purpose.</w:t>
+        <w:t>He gave the laptop back to Madame Fournier, who put it under the lace cloth with the scanner, so that they could keep each other company in disgrace. Then he went upstairs and typed the next chapter on the Olivetti, with the relief of a man returning to a bad habit that has been proved right.</w:t>
       </w:r>
     </w:p>
     <w:p>
@@ -2436,7 +2431,7 @@
         <w:t>La Provence</w:t>
       </w:r>
       <w:r>
-        <w:t>, from the week after, folded so many times that the folds had begun to wear through. "The inquest says she left the house at about twenty to eleven. A neighbour heard a splash at about eleven. I want to know how long it takes to walk from the study to the water in the dark. I want to know what you'd see. What you'd hear."</w:t>
+        <w:t>, from the week after, folded so many times that the folds had begun to wear through. "The police report says she left the house at about twenty to eleven. A neighbour heard a splash at about eleven. I want to know how long it takes to walk from the study to the water in the dark. I want to know what you'd see. What you'd hear."</w:t>
       </w:r>
     </w:p>
     <w:p>
@@ -2464,7 +2459,7 @@
         <w:ind w:firstLine="0"/>
       </w:pPr>
       <w:r>
-        <w:t>They began in the study at twenty to eleven, with the lamp on and the Olivetti uncovered, because Elise had been working, the inquest said, until late; there had been a page in her typewriter, unfinished. Tobias had always wondered what had been on it. Nobody had thought to say.</w:t>
+        <w:t>They began in the study at twenty to eleven, with the lamp on and the Olivetti uncovered, because Elise had been working, the report said, until late; there had been a notebook open on the desk, mid-sentence. Tobias had always wondered what the sentence was. Nobody had thought to say.</w:t>
       </w:r>
     </w:p>
     <w:p>
@@ -2538,7 +2533,7 @@
     </w:p>
     <w:p>
       <w:r>
-        <w:t>"She was very slow. In the dark. In March." He looked down at the water, which was black and very still and made small private sounds against the piles. "Four minutes from the study. She left at twenty to eleven. The splash was at eleven. That leaves fifteen minutes on the jetty."</w:t>
+        <w:t>"She was very slow. In the dark. In March." He looked down at the water, which was black and flat and made small private sounds against the piles. "Four minutes from the study. She left at twenty to eleven. The splash was at eleven. That leaves fifteen minutes on the jetty."</w:t>
       </w:r>
     </w:p>
     <w:p>
@@ -2572,7 +2567,7 @@
         <w:t>do be careful of the jetty, it's rotten, I'd hate to lose another guest</w:t>
       </w:r>
       <w:r>
-        <w:t>. Catarina had found the same postscript on a card propped against the kettle when she arrived. Hale, it seemed, said it to everybody. He knelt down on the planks and put his hand flat on the wood, and then on the next plank, and the next, as Catarina had put her hand on the window seat on the day of the curtain, as if the wood might have something to say. The planks were cold and slightly damp and absolutely sound. He knocked on one. It gave back a dull, solid, unimpressed sound, like a well-fed man being asked for money.</w:t>
+        <w:t>. Catarina had found the same postscript on a card propped against the kettle when she arrived. Hale, it seemed, said it to everybody. He knelt and put his hand flat on the planks, one after another, as if the wood might have something to say. The planks were cold and slightly damp and absolutely sound. He knocked on one. It gave back a dull, solid, unimpressed sound, like a well-fed man being asked for money.</w:t>
       </w:r>
     </w:p>
     <w:p>
@@ -2626,7 +2621,7 @@
     </w:p>
     <w:p>
       <w:r>
-        <w:t>He looked at her. In the torchlight her face was very pale and very still, and she was looking not at him but at the house, at the one lit window, high up, like an eye.</w:t>
+        <w:t>He looked at her. In the torchlight her face was pale, and she was looking not at him but at the house, at the one lit window, high up, like an eye.</w:t>
       </w:r>
     </w:p>
     <w:p>
@@ -2722,7 +2717,7 @@
     </w:p>
     <w:p>
       <w:r>
-        <w:t>He thought about it, honestly, because she deserved an honest answer and he was not sure he had one.</w:t>
+        <w:t>He took his time, because she deserved an honest answer and he was not sure he had one.</w:t>
       </w:r>
     </w:p>
     <w:p>
@@ -2760,12 +2755,12 @@
         <w:ind w:firstLine="0"/>
       </w:pPr>
       <w:r>
-        <w:t>They walked back up the jetty and the three stone steps and the dark lawn, not touching, at the pace of a woman who did not like the dark. In the kitchen, in the yellow light, Catarina put the kettle on, and stood with her back to him while it boiled, and her shoulders were very straight.</w:t>
-      </w:r>
-    </w:p>
-    <w:p>
-      <w:r>
-        <w:t>When she turned round, she had two cups, and she put one in front of him, in the cup with the chip, and kept the other in both hands.</w:t>
+        <w:t>They walked back up the jetty and the three stone steps and the dark lawn, not touching, at the pace of a woman who did not like the dark. In the kitchen, in the yellow light, Catarina put the kettle on, and stood with her back to him while it boiled, her shoulders straight.</w:t>
+      </w:r>
+    </w:p>
+    <w:p>
+      <w:r>
+        <w:t>When she turned round, she had two cups. She put the chipped one in front of him and kept the other in both hands.</w:t>
       </w:r>
     </w:p>
     <w:p>
@@ -2814,7 +2809,7 @@
         <w:ind w:firstLine="0"/>
       </w:pPr>
       <w:r>
-        <w:t>The lake lay at the bottom of a valley in the French countryside, and it did not appear to be aware that anyone was writing a murder mystery on its shore.</w:t>
+        <w:t>The lake lay at the bottom of a valley in the Luberon, and it did not appear to be aware that anyone was writing a murder mystery on its shore.</w:t>
       </w:r>
     </w:p>
     <w:p>
@@ -2939,12 +2934,12 @@
     </w:p>
     <w:p>
       <w:r>
-        <w:t>He would think about those evenings later, when he was sitting in a courtroom in Aix-en-Provence being asked to describe the lake. He would say that it was very quiet. That it was very beautiful. That he had not, at first, noticed anything sinister about it at all.</w:t>
-      </w:r>
-    </w:p>
-    <w:p>
-      <w:r>
-        <w:t>He had been watching the birds. It had seemed more important at the time.</w:t>
+        <w:t>He would think about those evenings later, in a courtroom in Aix-en-Provence, listening to lawyers describe the lake. It was very quiet, they said. It was very beautiful. Nobody had noticed anything sinister about it at all.</w:t>
+      </w:r>
+    </w:p>
+    <w:p>
+      <w:r>
+        <w:t>Nor had he. He had been watching the birds. It had seemed more important at the time.</w:t>
       </w:r>
     </w:p>
     <w:p>
@@ -3004,7 +2999,7 @@
     </w:p>
     <w:p>
       <w:r>
-        <w:t>"Who knows? It is a snake." She shrugged with the whole waistcoat. "It is not lost. It is only not where you are looking."</w:t>
+        <w:t>"Who knows? It is a snake." She lifted the secateurs an inch, which in that valley counted as a shrug. "It is not lost. It is only not where you are looking."</w:t>
       </w:r>
     </w:p>
     <w:p>
@@ -3014,12 +3009,12 @@
     </w:p>
     <w:p>
       <w:r>
-        <w:t>But everyone, ever after, felt it. In the evenings, when the light went, Tobias would sit at the Olivetti with his feet drawn carefully up onto the chair. In the kitchen, Catarina would open a cupboard and wait a long moment before she looked in. Something was in the house with them: patient, brown, a metre or more, and perfectly content.</w:t>
-      </w:r>
-    </w:p>
-    <w:p>
-      <w:r>
-        <w:t>"It does not matter," said Catarina, one night, with great dignity, stepping over a loose slipper in the hall as if it were a bomb. "We are not afraid."</w:t>
+        <w:t>But everyone, ever after, felt it. In the evenings, when the light went, Tobias would sit at the Olivetti with his feet drawn carefully up onto the chair. In the kitchen, Catarina would open a cupboard and count to three before she looked in. Something was in the house with them: patient, brown, a metre or more, and perfectly content.</w:t>
+      </w:r>
+    </w:p>
+    <w:p>
+      <w:r>
+        <w:t>"It does not matter," said Catarina, one night, stepping over a loose slipper in the hall as if it were a bomb. "We are not afraid."</w:t>
       </w:r>
     </w:p>
     <w:p>
@@ -3044,7 +3039,7 @@
     </w:p>
     <w:p>
       <w:r>
-        <w:t>What Tobias did find, when they lifted the window seat and found no snake, was that the board beneath it had already been lifted. The dust was disturbed in a clean rectangle, the size of a hand. Catarina saw him see it. She put the cushion back with great care, as if the cushion were the point, and said nothing. He said nothing. The house was getting very good at that.</w:t>
+        <w:t>What Tobias did find, when they lifted the window seat and found no snake, was that the board beneath it had already been lifted. The dust was disturbed in a clean rectangle, the size of a paperback. Catarina saw him see it. She put the cushion back with great care, as if the cushion were the point, and said nothing. He said nothing. The house was getting very good at that.</w:t>
       </w:r>
     </w:p>
     <w:p>
@@ -3083,7 +3078,7 @@
     </w:p>
     <w:p>
       <w:r>
-        <w:t>"It is in the contract." She shrugged her whole waistcoat. "Lucien, who had the bakery before the van, went in 2011. He was a widower for six weeks. He went to count the birds, and he did not come back."</w:t>
+        <w:t>"It is in the contract," she said, as if she had read it twice. "Lucien, who had the bakery before the van, went in 2011. He was a widower for six weeks. He went to count the birds, and he did not come back."</w:t>
       </w:r>
     </w:p>
     <w:p>
@@ -3193,7 +3188,7 @@
     </w:p>
     <w:p>
       <w:r>
-        <w:t>"Not alone," said Catarina. She looked at the pan, not at him. "I would come. I know flamingos. You would count the same one forty times."</w:t>
+        <w:t>"Not alone," said Catarina. She looked at the pan, not at him. "I would come. You would count the same one forty times."</w:t>
       </w:r>
     </w:p>
     <w:p>
@@ -3262,7 +3257,7 @@
     </w:p>
     <w:p>
       <w:r>
-        <w:t>It was a Thursday of marvellous, suffocating politeness. Tobias sat between a retired orthodontist and a woman who wished to discuss the royal family, and ate a vol-au-vent the size and texture of an ear.</w:t>
+        <w:t>It was an evening of marvellous, suffocating politeness. Tobias sat between a retired orthodontist and a woman who wished to discuss the royal family, and ate a vol-au-vent the size and texture of an ear.</w:t>
       </w:r>
     </w:p>
     <w:p>
@@ -3392,7 +3387,7 @@
     </w:p>
     <w:p>
       <w:r>
-        <w:t>There was a long, ringing pause. Then the orthodontist began to laugh. The woman who liked the royal family laughed. Tobias, to his shame, was laughing already, helplessly, into a vol-au-vent. And Priscilla, who had stood in her coat through the whole of it with the stillness of a Roman senator, drew a long breath and said, with great dignity:</w:t>
+        <w:t>There was a long, ringing pause. Then the orthodontist began to laugh. The woman who liked the royal family laughed. Tobias, to his shame, was laughing already, helplessly, into a vol-au-vent. And Priscilla, who had stood in her coat through the whole of it with the stillness of a Roman senator, drew a long breath and said:</w:t>
       </w:r>
     </w:p>
     <w:p>
@@ -3422,7 +3417,7 @@
     </w:p>
     <w:p>
       <w:r>
-        <w:t>On the walk home through the dark lane Tobias passed the garden wall of the lake house and thought about it all. Three people were dead and a murderer was still at large, he thought, and the village's great scandal of the week was a man in a bonnet. It struck him as the most English thing he had ever heard.</w:t>
+        <w:t>Walking home down the dark lane, Tobias thought about it. Three people were dead, a murderer was at large, and the village's great scandal of the week was a man in a bonnet. It struck him as the most English thing he had ever heard.</w:t>
       </w:r>
     </w:p>
     <w:p>
@@ -3452,7 +3447,7 @@
     </w:p>
     <w:p>
       <w:r>
-        <w:t>Catarina considered this for a long time. "The English," she said at last, "are the only people in Europe who can be caught with the babysitter and say, it was for the pantomime, and everybody believes."</w:t>
+        <w:t>Catarina considered this. "The English," she said at last, "are the only people in Europe who can be caught with the babysitter and say, it was for the pantomime, and everybody believes."</w:t>
       </w:r>
     </w:p>
     <w:p>
@@ -3531,12 +3526,12 @@
     </w:p>
     <w:p>
       <w:r>
-        <w:t>"I'd hope so. It's your face he's using."</w:t>
-      </w:r>
-    </w:p>
-    <w:p>
-      <w:r>
-        <w:t>She let that sit for exactly as long as was cruel, then added: "Your Portuguese friend has a vocabulary like a sailor."</w:t>
+        <w:t>"I'd hope so. It's your vocabulary she's using."</w:t>
+      </w:r>
+    </w:p>
+    <w:p>
+      <w:r>
+        <w:t>She let that sit for exactly as long as was cruel, then added: "She swears like a sailor, your housekeeper. A very polite sailor."</w:t>
       </w:r>
     </w:p>
     <w:p>
@@ -3561,7 +3556,7 @@
     </w:p>
     <w:p>
       <w:r>
-        <w:t>He found out that evening. Catarina, stirring the pot, asked him in her shining new English how he was, and he answered, with great dignity, "Eu sou quente."</w:t>
+        <w:t>He found out that evening. Catarina, stirring the pot, asked him in her shining new English how he was, and he answered, carefully, "Eu sou quente."</w:t>
       </w:r>
     </w:p>
     <w:p>
@@ -3686,7 +3681,7 @@
     </w:p>
     <w:p>
       <w:r>
-        <w:t>Neither of them said anything. Neither of them needed to. A star fell, long and white, from one end of the sky to the other, and they both drew a breath, and both said, at the same instant, in their own languages, the same thing:</w:t>
+        <w:t>Neither of them said anything. A star fell, long and white, from one end of the sky to the other, and they both drew a breath, and both said, at the same instant, in their own languages, the same thing:</w:t>
       </w:r>
     </w:p>
     <w:p>
@@ -3736,12 +3731,12 @@
     </w:p>
     <w:p>
       <w:r>
-        <w:t>Three stars waiting. A boat that does not come. And I, on the stone, practising being no one. He learned the meaning years later. By then he had already known it.</w:t>
-      </w:r>
-    </w:p>
-    <w:p>
-      <w:r>
-        <w:t>From the far end of the jetty came a long, offended clearing of the throat. The pelican, who had been standing there in the dark the whole time, shifted its feet, turned its enormous head away with great dignity, and gazed pointedly at the lake.</w:t>
+        <w:t>Three stars waiting. A boat that does not come. And I, on the stone, practising being no one. He learned the words weeks later, in the dark, in a cheap hotel in Lyon. By then he had already known what they meant.</w:t>
+      </w:r>
+    </w:p>
+    <w:p>
+      <w:r>
+        <w:t>From the far end of the jetty came a long, offended clearing of the throat. The pelican, who had been standing there in the dark the whole time, shifted its feet, turned its enormous head away, and gazed pointedly at the lake.</w:t>
       </w:r>
     </w:p>
     <w:p>
@@ -3800,7 +3795,7 @@
     </w:p>
     <w:p>
       <w:r>
-        <w:t>The Camargue lay an hour to the south, where the Rhône spread out into the sea and the land gave up all pretence of hills. It was an unseasonably warm day for October, twenty-seven degrees by the car's thermometer, which Catarina did not trust. The sky was a hard blue lid. White horses stood knee-deep in the marsh with an air of complete indifference, rice paddies glittered like sheets of green glass, and in the salt pans the water turned a faint, impossible pink.</w:t>
+        <w:t>The Camargue lay an hour to the south, where the Rhône spread out into the sea and the land gave up all pretence of hills. It was an unseasonably warm day for October, twenty-seven degrees by the car's thermometer, which Catarina did not trust. The sky was hard and blue and very high. White horses stood knee-deep in the marsh with an air of complete indifference, rice paddies glittered like sheets of green glass, and in the salt pans the water turned a faint, impossible pink.</w:t>
       </w:r>
     </w:p>
     <w:p>
@@ -3984,7 +3979,7 @@
     </w:p>
     <w:p>
       <w:r>
-        <w:t>There were stalls in every street. There were stalls in every square, and down every alley, and up the steps of the church, and spilling into the doorways of shops that had given up and joined in. There was cheese, goat's cheese mostly, in small white rounds and logs and pyramids, some rolled in ash, some in herbs, some wrapped in chestnut leaves and tied with raffia like presents from a very small, very serious aunt. There were olives in tubs, thirty kinds, black and green and violet and wrinkled, in oil and in brine and with garlic and with fennel and with orange peel. There were sausages hanging in garlands. There were the last tomatoes of the year, enormous and lumpen and cracked, and the first mushrooms of the autumn, in baskets, with the earth still on them. There was honey, from lavender and chestnut and thyme and rosemary and something called garrigue, which was apparently a kind of hillside. There was a man selling nothing but garlic, and another selling nothing but knives, and a woman selling nothing but candied fruit, glowing in their trays like stained glass, for which, Madame Fournier said, Apt was famous, and which, she said, nobody in Apt ever ate.</w:t>
+        <w:t>There were stalls in every street. There were stalls in every square, and down every alley, and up the steps of the church, and spilling into the doorways of shops that had given up and joined in. There was cheese, goat's cheese mostly, in small white rounds and logs and pyramids, some rolled in ash, some in herbs, some wrapped in chestnut leaves and tied with raffia like presents from a very small, very serious aunt. There were olives in tubs, thirty kinds, black and green and violet, with garlic, with fennel, with orange peel. There were sausages hanging in garlands. There were the last tomatoes of the year, enormous and lumpen and cracked, and the first mushrooms of the autumn, in baskets, with the earth still on them. There was honey, from lavender and chestnut and thyme and rosemary and something called garrigue, which was apparently a kind of hillside. There was a man selling nothing but garlic, and another selling nothing but knives, and a woman selling nothing but candied fruit, glowing in their trays like stained glass, for which, Madame Fournier said, Apt was famous, and which, she said, nobody in Apt ever ate.</w:t>
       </w:r>
     </w:p>
     <w:p>
@@ -4125,7 +4120,7 @@
     </w:p>
     <w:p>
       <w:r>
-        <w:t>She stood for a long moment looking at nothing. Then she said, in a voice so low that he had to lean in to hear it over the accordion:</w:t>
+        <w:t>She stood looking at nothing. Then she said, in a voice so low that he had to lean in to hear it over the accordion:</w:t>
       </w:r>
     </w:p>
     <w:p>
@@ -4192,7 +4187,7 @@
         <w:ind w:firstLine="0"/>
       </w:pPr>
       <w:r>
-        <w:t>They drove home with the windows open and the market in string bags on the back seat, and Madame Fournier drove the Renault 4 like a tractor through a field that had insulted her, and said nothing until they were back in the valley, at the top of the lane, with the lake below them, flat and grey under a sky that was making up its mind.</w:t>
+        <w:t>They came back with the windows open and the market in string bags on the back seat, and Madame Fournier drove the Renault 4 home in second gear, all the way, on principle, and said nothing until they were back in the valley, at the top of the lane, with the lake below them, flat and grey under a sky that was making up its mind.</w:t>
       </w:r>
     </w:p>
     <w:p>
@@ -4217,12 +4212,17 @@
     </w:p>
     <w:p>
       <w:r>
-        <w:t>The third eel, the small one, in its single sheet of newspaper, she put in the cold larder, on a shelf by itself. In the morning, it was still there. She looked at it for some time, and then she put it back.</w:t>
-      </w:r>
-    </w:p>
-    <w:p>
-      <w:r>
-        <w:t>It was still there on the Monday, when the telephone rang and a voice like cashmere being lowered onto a duke said that it would be grateful if what came out of the water were not read.</w:t>
+        <w:t>The third eel, the small one, in its single sheet of newspaper, she put in the cold larder, on a shelf by itself. In the morning, it was still there. She looked at it, and then she put it back.</w:t>
+      </w:r>
+    </w:p>
+    <w:p>
+      <w:r>
+        <w:t>That week, in the afternoons, she walked along the bank towards the marsh three times, with a basket, as if for blackberries, and came back each time with nothing in the basket and reeds in her hair and her mouth set. Tobias watched her go from the study window. He did not follow. He was beginning to understand who she was looking for.</w:t>
+      </w:r>
+    </w:p>
+    <w:p>
+      <w:r>
+        <w:t>It was still there on the Monday, when the telephone rang.</w:t>
       </w:r>
     </w:p>
     <w:p>
@@ -4291,7 +4291,7 @@
     </w:p>
     <w:p>
       <w:r>
-        <w:t>It was a print of some bathers, three of them in the foreground. Tobias looked at them for a very long time, at their pale, strange, geometric limbs.</w:t>
+        <w:t>It was a print of some bathers, three of them in the foreground. Tobias studied them, their pale, strange, geometric limbs.</w:t>
       </w:r>
     </w:p>
     <w:p>
@@ -4366,7 +4366,7 @@
     </w:p>
     <w:p>
       <w:r>
-        <w:t>She nodded slowly, leaning against his shoulder, watching the light go. She did not say anything else. She did not need to. It was the kind of silence that two people only arrive at after weeks of trying to find words in two languages, and then finding that the silence was a language too.</w:t>
+        <w:t>She nodded slowly, leaning against his shoulder, watching the light go, and said nothing else. It was the kind of silence that two people only arrive at after weeks of trying to find words in two languages, and then finding that the silence was a language too.</w:t>
       </w:r>
     </w:p>
     <w:p>
@@ -4585,7 +4585,7 @@
     </w:p>
     <w:p>
       <w:r>
-        <w:t>She could not hear the conversation. She did not need to. A waiter, bringing a second bottle of white, said it for her, because he was French and could not help himself.</w:t>
+        <w:t>She could not hear the conversation. A waiter, bringing a second bottle of white, supplied the only part of it she needed, because he was French and could not help himself.</w:t>
       </w:r>
     </w:p>
     <w:p>
@@ -4610,7 +4610,7 @@
     </w:p>
     <w:p>
       <w:r>
-        <w:t>Mara watched him lift a claw and smile at it, and thought of eleven thousand four hundred writers sitting at kitchen tables from Dundee to Durban, each of whom had put sixty pounds in an envelope along with a hopeful short story about a lighthouse. She thought of a man on a jetty with an Olivetti. She thought of Elise Marchetti, who had once, according to a letter in the file, refused to cross a puddle because it looked ambitious. She thought of the commandant who had closed the file in April with his very good pen, and who played golf, she happened to know, on Thursday mornings at a club outside Marseille where the membership list was not published.</w:t>
+        <w:t>Mara watched him lift a claw and smile at it, and thought of eleven thousand four hundred writers sitting at kitchen tables from Dundee to Durban, each of whom had put sixty pounds in an envelope along with a hopeful short story about a dead wife's garden. She thought of a man on a jetty with an Olivetti. She thought of Elise Marchetti, who had once, according to a letter in the file, refused to cross a puddle because it looked ambitious. She thought of the commandant who had closed the file in April with his very good pen, and who played golf, she happened to know, on Thursday mornings at a club outside Marseille where the membership list was not published.</w:t>
       </w:r>
     </w:p>
     <w:p>
@@ -4625,7 +4625,7 @@
     </w:p>
     <w:p>
       <w:r>
-        <w:t>On the lake, that evening, the pelican stood at the end of the jetty and did not fish. Catarina stood at the kitchen window and did not sing. Tobias sat with the pages in a stack, drying at the edges, and did not type. The house had been a place to begin again. It had remembered, overnight, what it was for.</w:t>
+        <w:t>That evening Catarina stood at the kitchen window and did not sing. Tobias sat with the pages in a stack, drying at the edges, and did not type. In the reeds, even the heron did not fish. The house had been a place to begin again. It had remembered, overnight, what it was for.</w:t>
       </w:r>
     </w:p>
     <w:p>
@@ -5130,7 +5130,7 @@
     </w:p>
     <w:p>
       <w:r>
-        <w:t>Catarina looked at the letter in her hands for a long moment. Then she gave it back to him, and stood up, and went to the door, and stopped there with one hand on the frame.</w:t>
+        <w:t>Catarina looked at the letter in her hands. Then she gave it back to him, and stood up, and went to the door, and stopped there with one hand on the frame.</w:t>
       </w:r>
     </w:p>
     <w:p>
@@ -5201,7 +5201,7 @@
     </w:p>
     <w:p>
       <w:r>
-        <w:t>Catarina did not say anything. She stood beside him for another moment, very still. Then she went back to the stove, and moved the soup to the front again, and stirred it for a long time, much longer than it needed. When she spoke, it was to the pot.</w:t>
+        <w:t>Catarina did not say anything. She stood beside him a moment longer. Then she went back to the stove, and moved the soup to the front again, and stirred it much longer than it needed. When she spoke, it was to the pot.</w:t>
       </w:r>
     </w:p>
     <w:p>
@@ -5705,7 +5705,30 @@
     </w:p>
     <w:p>
       <w:r>
-        <w:t>He did not answer. He did not have to. He printed the thread, all forty-one pages of it, on Madame Fournier's printer-scanner, which complained bitterly but did not turn anything into cats, and put it in a folder with the Highly Commended letter and the receipt for sixty pounds. On the front of the folder, in his best capitals, which were now very nearly as good as hers, he wrote: NOT ONLY PAPER.</w:t>
+        <w:t>He did not answer. He printed the thread, all forty-one pages of it, on Madame Fournier's printer-scanner, which complained bitterly but did not turn anything into cats, and put it in a folder with the Highly Commended letter and the receipt for sixty pounds. On the front of the folder, in his best capitals, which were now very nearly as good as hers, he wrote: NOT ONLY PAPER.</w:t>
+      </w:r>
+    </w:p>
+    <w:p>
+      <w:r>
+        <w:t xml:space="preserve">Then, before he closed the laptop, he did the thing Catarina had not thought of, because she had never had to make a story stand up in front of a stranger. He wrote to the woman in Cape Town, and the headmaster in Fife, and the nurse in Leicester, and to forty others, and asked each of them one question: if a court in France ever wanted to know what had happened to their sixty pounds, would they say so, in writing, with their names? </w:t>
+      </w:r>
+      <w:r>
+        <w:rPr>
+          <w:i/>
+        </w:rPr>
+        <w:t>A prize that cheats eleven thousand people,</w:t>
+      </w:r>
+      <w:r>
+        <w:t xml:space="preserve"> he wrote, </w:t>
+      </w:r>
+      <w:r>
+        <w:rPr>
+          <w:i/>
+        </w:rPr>
+        <w:t>is a rumour. A prize that cheated Mrs Naidoo of Cape Town, who put a ribbon in the book, is a crime.</w:t>
+      </w:r>
+      <w:r>
+        <w:t xml:space="preserve"> By the morning nineteen of them had said yes. The nurse in Leicester had said yes twice.</w:t>
       </w:r>
     </w:p>
     <w:p>
@@ -5802,7 +5825,7 @@
     </w:p>
     <w:p>
       <w:r>
-        <w:t>Tobias wrote it down. He thanked the voice warmly. He said he would transfer the money that afternoon. He put the phone down and looked at Catarina, who had straightened up and was looking at the window with the expression of a heron that has seen the fish.</w:t>
+        <w:t>Tobias wrote it down. He thanked the voice warmly. He said he would transfer the money that afternoon. He put the phone down and looked at Catarina, who had straightened up and was looking at the window with the expression of a cat that has heard a tin being opened.</w:t>
       </w:r>
     </w:p>
     <w:p>
@@ -5911,7 +5934,7 @@
     </w:p>
     <w:p>
       <w:r>
-        <w:t>Neither of them changed their minds. They sat opposite each other in a carriage that smelled of warm plastic and oranges, with the folder on the table between them and a paper bag of calissons left over from the Sunday, and watched Provence go past in long dry strokes: pines, limestone, a village on a hill like a pile of bread.</w:t>
+        <w:t>Neither of them changed their minds. They sat opposite each other in a carriage that smelled of warm plastic and oranges, with the folder on the table between them and a paper bag of calissons, the last of the second bag from Aix, which Catarina had been rationing like a siege, and watched Provence go past in long dry strokes: pines, limestone, a village on a hill like a pile of bread.</w:t>
       </w:r>
     </w:p>
     <w:p>
@@ -6076,7 +6099,7 @@
     </w:p>
     <w:p>
       <w:r>
-        <w:t>"Good morning! I'm so sorry to bother you. My name is Lind. I rang last week, about the lighthouse."</w:t>
+        <w:t>"Good morning! I'm so sorry to bother you. My name is Lind. I rang yesterday, about the lighthouse."</w:t>
       </w:r>
     </w:p>
     <w:p>
@@ -6153,12 +6176,7 @@
     </w:p>
     <w:p>
       <w:r>
-        <w:t>"The gull," he said, when he could. "The gull who is the keeper. And the lighthouse, his mother. Mon Dieu. I read it. I read it to my wife. She cried. She cried laughing, monsieur." He wiped his eyes. "I read the first page of every one. Yours, monsieur, is the worst thing I have ever read in my life, and I have been in a television series about a fisherman for eleven years."</w:t>
-      </w:r>
-    </w:p>
-    <w:p>
-      <w:r>
-        <w:t xml:space="preserve">"And then I put it in the sack," said Raymond, the laugh going out of his face, "with the others. And I write the letter. </w:t>
+        <w:t xml:space="preserve">"The gull," he said, when he could. "The gull who is the keeper. And the lighthouse, his mother. Mon Dieu. I read it. I read it to my wife. She cried. She cried laughing, monsieur." He wiped his eyes. "I read the first page of every one. Yours, monsieur, is the worst thing I have ever read in my life, and I have been in a television series about a fisherman for eleven years." The laugh went out of his face. "And then I put it in the sack, "with the others. And I write the letter. </w:t>
       </w:r>
       <w:r>
         <w:rPr>
@@ -6232,12 +6250,7 @@
     </w:p>
     <w:p>
       <w:r>
-        <w:t>"Someone did," said Catarina.</w:t>
-      </w:r>
-    </w:p>
-    <w:p>
-      <w:r>
-        <w:t xml:space="preserve">"The Englishman rang," she said, "and you put your hand on the telephone and said, </w:t>
+        <w:t xml:space="preserve">"Someone did," said Catarina. "The Englishman rang, and you put your hand on the telephone and said, </w:t>
       </w:r>
       <w:r>
         <w:rPr>
@@ -6355,7 +6368,7 @@
     </w:p>
     <w:p>
       <w:r>
-        <w:t>"Is a lobster." She stood with her hands in her coat pockets, looking at the starched cloths through the glass. "My father catches lobsters. In Afurada. Eighteen years. He sells them to a man on the quay for the price of a lunch. The man sells them to a man in Lisbon. The man in Lisbon sells them to a man here." She turned away from the window. "Like the flamingos. Everybody is pink because of what they eat."</w:t>
+        <w:t>"Is a lobster." She stood with her hands in her coat pockets, looking at the starched cloths through the glass. "My father catches lobsters. In Afurada. Forty years. He sells them to a man on the quay for the price of a lunch. The man sells them to a man in Lisbon. The man in Lisbon sells them to a man here." She turned away from the window. "Like the flamingos. Everybody is pink because of what they eat."</w:t>
       </w:r>
     </w:p>
     <w:p>
@@ -6677,7 +6690,7 @@
         <w:t>ah</w:t>
       </w:r>
       <w:r>
-        <w:t>. And the next week she came over the wall with honey, and the key."</w:t>
+        <w:t>. And the next week she came over the wall with a jar of honey, and stayed for coffee, and asked me about Henri, which nobody had done for a long time." She did not say anything more about the honey, and Tobias, who was getting better at not asking, did not ask.</w:t>
       </w:r>
     </w:p>
     <w:p>
@@ -6694,6 +6707,16 @@
       <w:pPr>
         <w:ind w:firstLine="0"/>
       </w:pPr>
+      <w:r>
+        <w:t>It was Tobias who decided what to ask them.</w:t>
+      </w:r>
+    </w:p>
+    <w:p>
+      <w:r>
+        <w:t>"Not how much," he said, when Catarina had found the first number. "They'll all say three thousand, and we'll feel clever, and it won't help. Ask who they paid. Which company, which bank, which country. And whether anybody ever sent them a receipt with Madame Fournier's name on it." He had been thinking about it since the lease. "A man who sublets illegally doesn't put the landlord on the paperwork. And if the money went somewhere that isn't France, a commandant in Avignon can't sit on it. It was never his to sit on."</w:t>
+      </w:r>
+    </w:p>
+    <w:p>
       <w:r>
         <w:t>They telephoned them all, on the grandson's laptop, which kept asking to update itself at moments of crisis like a waiter who will not stop asking whether everything is all right.</w:t>
       </w:r>
@@ -7068,7 +7091,7 @@
     </w:p>
     <w:p>
       <w:r>
-        <w:t>"One glass. Of water with gas." Dona Graça held up one finger, very firmly. "I know Kader in the bar. One glass, at ten. He paid with coins. He counted them twice." "Then he goes up. And at half past ten, a visitor comes for him."</w:t>
+        <w:t>"One glass. Of water with gas." Dona Graça held up one finger, very firmly. "I know Kader in the bar. One glass, at ten. He paid with coins. He counted them twice. Then he goes up. And at half past ten, a visitor comes for him."</w:t>
       </w:r>
     </w:p>
     <w:p>
@@ -7108,7 +7131,7 @@
     </w:p>
     <w:p>
       <w:r>
-        <w:t>Dona Graça looked at her. "Why the tie?"</w:t>
+        <w:t>Dona Graça looked at him. "Why the tie?"</w:t>
       </w:r>
     </w:p>
     <w:p>
@@ -7352,7 +7375,7 @@
     </w:p>
     <w:p>
       <w:r>
-        <w:t>In the dark, after a long time, Catarina said:</w:t>
+        <w:t>In the dark, after a long time, Catarina spoke.</w:t>
       </w:r>
     </w:p>
     <w:p>
@@ -7377,7 +7400,7 @@
     </w:p>
     <w:p>
       <w:r>
-        <w:t>"No. Is not sad. Is only a long time ago." He heard her smile in the dark, a little crooked. "My grandmother has a poem. You heard it, on the jetty. Three stars waiting. A boat that does not come. And I, on the stone, practising being no one." The rain filled the pause. "I practised very hard. For five years I am very good at being no one. Then one day I think, I am twenty-three, and I do not want to be good at this. So I go to the university in Porto, and I learn to teach children to read, so that nobody can ever tell them a letter is coming when it is not." "That is what I was before. A woman who decided not to wait on a stone."</w:t>
+        <w:t>"No. Is not sad. Is only a long time ago." He heard her smile in the dark, a little crooked. "My grandmother has a poem. You heard it, on the jetty. Three stars waiting. A boat that does not come. And I, on the stone, practising being no one." The rain filled the pause. "I practised very hard. For five years I am very good at being no one. Then one day I think, I am twenty-three, and I do not want to be good at this. So I go to the university in Porto, and I learn to teach children to read, so that nobody can ever tell them a letter is coming when it is not. That is what I was before. A woman who decided not to wait on a stone."</w:t>
       </w:r>
     </w:p>
     <w:p>
@@ -7712,7 +7735,12 @@
     </w:p>
     <w:p>
       <w:r>
-        <w:t>Mara photographed it, with Monsieur Pons in the picture, and his newspaper, and Fangio, at Monsieur Pons's insistence, because Fangio had been present. Then she put on gloves, took the hose off in his presence, bagged it, and had him sign the bag, which he did with the solemnity of a man at a wedding.</w:t>
+        <w:t>Mara did not touch it yet. She walked away between the towers of Renaults and rang Aix, because a hose taken off a car by an officer on her day off, without an order, is a hose that a defence lawyer throws out of the window. Juge Sarrazin, who already had an inquiry open on the rent, extended Mara's commission to the Giraud car by telephone, and had her clerk send the order to the gendarmerie at Cavaillon, and told Mara to wait for the two gendarmes from Cavaillon to arrive and witness it. They came in forty minutes, in a blue van, and stood in the gravel looking at Fangio.</w:t>
+      </w:r>
+    </w:p>
+    <w:p>
+      <w:r>
+        <w:t>Then Mara photographed it, with Monsieur Pons in the picture, and his newspaper, and Fangio, at Monsieur Pons's insistence, because Fangio had been present. Then she put on gloves, took the hose off in front of all three of them, sealed it, and had Monsieur Pons and both gendarmes sign the seal, which Monsieur Pons did with the solemnity of a man at a wedding.</w:t>
       </w:r>
     </w:p>
     <w:p>
@@ -7722,7 +7750,7 @@
     </w:p>
     <w:p>
       <w:r>
-        <w:t>"Your commandant," said Monsieur Pons, taking the pen, "is he the one with the very good pen?"</w:t>
+        <w:t>"Your commandant," said Monsieur Pons, handing back the pen, "is he the one with the very good pen?"</w:t>
       </w:r>
     </w:p>
     <w:p>
@@ -7732,7 +7760,7 @@
     </w:p>
     <w:p>
       <w:r>
-        <w:t>"He came," said Monsieur Pons, signing with a flourish. "In June. The week after. He looked at the car. He did not lie down. He asked me, is there anything here, Pons? I said, I have not looked. He said, then do not look. Crush it when the insurance pays." He handed the bag back. "I did not like him. Fangio did not like him. Fangio likes everybody."</w:t>
+        <w:t>"He came," said Monsieur Pons. "In June. The week after. He looked at the car. He did not lie down. He asked me, is there anything here, Pons? I said, I have not looked. He said, then do not look. Crush it when the insurance pays." "I did not like him. Fangio did not like him. Fangio likes everybody."</w:t>
       </w:r>
     </w:p>
     <w:p>
@@ -7775,7 +7803,16 @@
     </w:p>
     <w:p>
       <w:r>
-        <w:t>"Tomorrow is Sunday," said Mara. "On Monday morning at eight o'clock I'm going to drive to Aix and put a brake hose and a notary's diary on the desk of a juge who swims in the sea in November. And she's going to ask me where I got them, and I'm going to tell her. And then at ten o'clock Commandant Moutet is going to find out, because he finds everything out, and he's going to call me into his office." She glanced in the mirror, at Tobias. "Your book, Mr Lind. The one on the jetty. How did the detective come out of it?"</w:t>
+        <w:t xml:space="preserve">"Tomorrow is Sunday," said Mara. "On Monday morning at eight o'clock I'm going to drive to Aix and put a brake hose and a notary's diary on the desk of a juge who swims in the sea in November, and she's going to open a file that has the word </w:t>
+      </w:r>
+      <w:r>
+        <w:rPr>
+          <w:i/>
+        </w:rPr>
+        <w:t>meurtre</w:t>
+      </w:r>
+      <w:r>
+        <w:t xml:space="preserve"> on it, with my name underneath. And then at ten o'clock Commandant Moutet is going to find out, because he finds everything out, and he's going to call me into his office." She glanced in the mirror, at Tobias. "Your book, Mr Lind. The one on the jetty. How did the detective come out of it?"</w:t>
       </w:r>
     </w:p>
     <w:p>
@@ -7823,7 +7860,7 @@
     </w:p>
     <w:p>
       <w:r>
-        <w:t>"He said, you have made a very serious mistake for your career. And he looked at me for some time." Mara drank the marc. "And then he said, it would be a pity, Mara, if your career were the only thing you lost. And he smiled."</w:t>
+        <w:t>"He said, you have made a very serious mistake for your career. And he looked at me. For about a week, it felt like." Mara drank the marc. "And then he said, it would be a pity, Mara, if your career were the only thing you lost. And he smiled."</w:t>
       </w:r>
     </w:p>
     <w:p>
@@ -8008,7 +8045,7 @@
     </w:p>
     <w:p>
       <w:r>
-        <w:t>He reached across the table and covered her hand with his. Neither of them moved for a long time.</w:t>
+        <w:t>He reached across the table and covered her hand with his. Neither of them moved.</w:t>
       </w:r>
     </w:p>
     <w:p>
@@ -8176,7 +8213,7 @@
     </w:p>
     <w:p>
       <w:r>
-        <w:t>They did not play the tape again that night. They copied Inês's note onto a clean page, in Catarina's block capitals, and in the morning they carried the page and the tape over the wall and put them in Madame Fournier's biscuit tin, with her spare keys, which was the only place in the valley that had never once lost anything.</w:t>
+        <w:t>They did not play the tape again that night. They copied Inês's note onto a clean page, in Catarina's block capitals, and in the morning, while he was too ill to stop her, Catarina carried the page and the tape over the wall and put them in Madame Fournier's biscuit tin, with her spare keys, which was the only place in the valley that had never once lost anything.</w:t>
       </w:r>
     </w:p>
     <w:p>
@@ -8241,60 +8278,68 @@
         <w:t>Is service included?</w:t>
       </w:r>
       <w:r>
-        <w:t xml:space="preserve"> he laughed so hard that he coughed for a minute, and she put down the book and held a cup of water to his mouth and said, very severely, that she would stop reading if he could not behave. He could not behave. She did not stop reading. She sat with him until he fell asleep, and then she tiptoed out. The lamp went down. The house creaked. And on the desk, in the dark, something cleared its throat.</w:t>
-      </w:r>
-    </w:p>
-    <w:p>
-      <w:r>
-        <w:t>Tobias opened one eye. The thermometer on the bedside table, which Catarina had left there with a note that said NOT FOR THE PELICAN, said thirty-nine point four, and the room was swimming gently, like a room in a boat.</w:t>
-      </w:r>
-    </w:p>
-    <w:p>
-      <w:r>
-        <w:t>The Olivetti, on the desk, had a face. It had not had one that afternoon. It was made of the carriage and the bell and the two round spools, and it looked like a retired colonel who had been kept waiting in a draughty corridor.</w:t>
-      </w:r>
-    </w:p>
-    <w:p>
-      <w:r>
-        <w:t xml:space="preserve">"I have typed </w:t>
+        <w:t xml:space="preserve"> he laughed so hard that he coughed for a minute, and she put down the book and held a cup of water to his mouth and said, very severely, that she would stop reading if he could not behave. He could not behave. She did not stop reading. She sat with him until he fell asleep, and then she tiptoed out. The lamp went down. The house creaked. The thermometer on the bedside table, which Catarina had left there with a note that said NOT FOR THE PELICAN, said thirty-nine point four, and the room began to behave like a room in a boat.</w:t>
+      </w:r>
+    </w:p>
+    <w:p>
+      <w:r>
+        <w:t xml:space="preserve">He knew it was the fever. Knowing did not help. In the dark the Olivetti's carriage and bell and two round spools had arranged themselves into the face of a retired colonel kept waiting in a draughty corridor, and when the rain ticked against the window Tobias heard, in his own voice, which is the only voice a fever has, a count he had not known he was keeping. </w:t>
       </w:r>
       <w:r>
         <w:rPr>
           <w:i/>
         </w:rPr>
-        <w:t>she put the tray outside the door</w:t>
-      </w:r>
-      <w:r>
-        <w:t xml:space="preserve"> forty-one times," it said. "I have typed </w:t>
+        <w:t>She put the tray outside the door:</w:t>
+      </w:r>
+      <w:r>
+        <w:t xml:space="preserve"> forty-one times, typed. </w:t>
       </w:r>
       <w:r>
         <w:rPr>
           <w:i/>
         </w:rPr>
-        <w:t>she did not look away</w:t>
-      </w:r>
-      <w:r>
-        <w:t xml:space="preserve"> nine times. I have not once been asked to type what you intend to do about it."</w:t>
-      </w:r>
-    </w:p>
-    <w:p>
-      <w:r>
-        <w:t>On the bedside table the chipped cup rocked on its saucer, and said, in a small, high, fast voice, "She went into the lake for your paper. She held your hand on the jetty. And you said nothing for a week."</w:t>
-      </w:r>
-    </w:p>
-    <w:p>
-      <w:r>
-        <w:t>"My Portuguese is terrible," said Tobias, to a cup, at thirty-nine point four.</w:t>
-      </w:r>
-    </w:p>
-    <w:p>
-      <w:r>
-        <w:t>"She does not want your Portuguese," said the cup. "She wants to be met. Halfway. On purpose."</w:t>
-      </w:r>
-    </w:p>
-    <w:p>
-      <w:r>
-        <w:t>Then the room tipped the other way, and the colonel was a typewriter again, and the cup was a cup, and Tobias lay in the blankets, shivering and warm, and thought, in the half-light, of how many small, tireless kindnesses there had been in the house since September: the trays, the notes, the fourth stair she did not step on in the night because she had learned that it creaked. None of them had asked to be noticed. That, he thought, was rather the point of them, and rather the problem.</w:t>
+        <w:t>She did not look away:</w:t>
+      </w:r>
+      <w:r>
+        <w:t xml:space="preserve"> nine. And not once, anywhere in the book, what he intended to do about it.</w:t>
+      </w:r>
+    </w:p>
+    <w:p>
+      <w:r>
+        <w:t xml:space="preserve">The chipped cup on the bedside table rocked on its saucer as the room tipped, and the same voice, smaller and faster, went on without him. </w:t>
+      </w:r>
+      <w:r>
+        <w:rPr>
+          <w:i/>
+        </w:rPr>
+        <w:t>She went into the lake for your paper. She held your hand on the jetty. And you said nothing for a week.</w:t>
+      </w:r>
+    </w:p>
+    <w:p>
+      <w:r>
+        <w:t>"My Portuguese is terrible," he told the cup, aloud, and heard himself, and knew how ill he was.</w:t>
+      </w:r>
+    </w:p>
+    <w:p>
+      <w:r>
+        <w:rPr>
+          <w:i/>
+        </w:rPr>
+        <w:t>She doesn't want your Portuguese,</w:t>
+      </w:r>
+      <w:r>
+        <w:t xml:space="preserve"> said the part of him that was not ill. </w:t>
+      </w:r>
+      <w:r>
+        <w:rPr>
+          <w:i/>
+        </w:rPr>
+        <w:t>She wants to be met. Halfway. On purpose.</w:t>
+      </w:r>
+    </w:p>
+    <w:p>
+      <w:r>
+        <w:t>Then the room tipped back, and the colonel was a typewriter, and the cup was a cup, and Tobias lay in the blankets, shivering and warm, and thought, in the half-light, of how many small, tireless kindnesses there had been in the house since September: the trays, the notes, the fourth stair she did not step on in the night because she had learned that it creaked. None of them had asked to be noticed. That, he thought, was rather the point of them, and rather the problem.</w:t>
       </w:r>
     </w:p>
     <w:p>
@@ -8309,12 +8354,12 @@
     </w:p>
     <w:p>
       <w:r>
-        <w:t>Catarina came in with the tray. On it, steaming, was a mug of tea made properly for the first time: the pot warmed, the leaves left to stand, the milk in last. It was in the cup with the chip.</w:t>
-      </w:r>
-    </w:p>
-    <w:p>
-      <w:r>
-        <w:t>He took it, and held it in both hands, and looked at it for a long moment.</w:t>
+        <w:t>Catarina came in with the tray. On it, steaming, was a cup of tea made properly for the first time: the pot warmed, the leaves left to stand, the milk in last. It was in the cup with the chip.</w:t>
+      </w:r>
+    </w:p>
+    <w:p>
+      <w:r>
+        <w:t>He took it in both hands and looked at it.</w:t>
       </w:r>
     </w:p>
     <w:p>
@@ -8324,12 +8369,12 @@
     </w:p>
     <w:p>
       <w:r>
-        <w:t>"Yes," said Tobias. "I think it has opinions."</w:t>
-      </w:r>
-    </w:p>
-    <w:p>
-      <w:r>
-        <w:t>She laughed, and sat on the edge of the bed, and for a while neither of them said anything at all. Outside, the clock in the hall struck eight. On the desk the Olivetti stayed discreetly silent. He did not tell her about the dream. A dream that has been explained is only a temperature, and this one had been thirty-nine point four. But he kept the sentence. Halfway, on purpose. He wrote it on the envelope under the typewriter, under the name.</w:t>
+        <w:t>"Yes," said Tobias. "It kept me up half the night."</w:t>
+      </w:r>
+    </w:p>
+    <w:p>
+      <w:r>
+        <w:t>She laughed, and sat on the edge of the bed, and for a while neither of them said anything at all. Outside, the clock in the hall struck eight. He did not tell her about the fever's arithmetic. A dream that has been explained is only a temperature, and this one had been thirty-nine point four. But he kept the sentence. Halfway, on purpose. He wrote it on the envelope under the typewriter, under the name.</w:t>
       </w:r>
     </w:p>
     <w:p>
@@ -8559,7 +8604,7 @@
     </w:p>
     <w:p>
       <w:r>
-        <w:t>He was leaning against their car in the hospital car park when they came out, as if he had been there for some time and did not mind, beside a long black saloon with a driver who did not look up. Close to, he was about fifty, immaculate, in a charcoal suit and a tie the colour of old claret, and he carried a furled black umbrella under a sky that had not held a cloud all day.</w:t>
+        <w:t>Somebody was leaning against their car in the hospital car park when they came out, as if he had been there for some time and did not mind, beside a long black saloon with a driver who did not look up. It was the Frenchman from the supper. Close to, he was about fifty, immaculate, in a charcoal suit and a tie the colour of old claret, and he carried a furled black umbrella under a sky that had not held a cloud all day.</w:t>
       </w:r>
     </w:p>
     <w:p>
@@ -8619,7 +8664,7 @@
     </w:p>
     <w:p>
       <w:r>
-        <w:t>Edouard. The name in the margin of Inês's notebook, beside the twelfth of March. And the tie had been across a plate of vol-au-vents in October, and he had admired it. He wrote that down before he started the car, and then, because Catarina was watching him write it, he wrote underneath: I should have known at the supper. She took the pen and added, in capitals: NOBODY KNOWS AT THE SUPPER. THAT IS WHY IT IS A SUPPER.</w:t>
+        <w:t>Edouard. The name in the margin of Inês's notebook, beside the twelfth of March. And the tie had been across a plate of vol-au-vents in October, and an orthodontist had admired it. He wrote that down before he started the car, and then, because Catarina was watching him write it, he wrote underneath: I should have known at the supper. She took the pen and added, in capitals: NOBODY KNOWS AT THE SUPPER. THAT IS WHY IT IS A SUPPER.</w:t>
       </w:r>
     </w:p>
     <w:p>
@@ -8652,7 +8697,7 @@
     </w:p>
     <w:p>
       <w:r>
-        <w:t>"The key has been in the biscuit tin since March," she said. "You took your time. It is under your tape, now, and the letter about the rent, and a photograph of Lucien standing on one leg, which I am not going to explain. Your friend Elise gave it to me. She came over the wall on a Thursday with a jar of honey I did not need and asked me to keep one thing in this valley that Monsieur Hale did not know about. She said she was a very careful guest." Madame Fournier snipped a rose that did not need it. "She did not come back. I put the honey in the cellar. I have not been able to open it."</w:t>
+        <w:t>"The key has been in the biscuit tin since March," she said. "You took your time. It is under your tape, now, and the letter about the rent, and a photograph of Lucien standing on one leg, which I am not going to explain. Your friend Elise gave it to me. She came over the wall on a Thursday with a jar of honey I did not need and asked me to keep one thing in this valley that Monsieur Hale did not know about. She said she was a very careful guest." Madame Fournier snipped a rose that did not need it. "She did not come back. I put the honey in the cellar. I have not been able to open it." She looked at Tobias over the secateurs. "She said, give the key only to somebody who comes to you because of the honey. Not because of the key. Anybody can want a key. Nobody said honey, monsieur, until today."</w:t>
       </w:r>
     </w:p>
     <w:p>
@@ -8820,7 +8865,7 @@
     </w:p>
     <w:p>
       <w:r>
-        <w:t>"Hale is a cashier," said Mara. She was not, strictly, on the case. She was on the juge's case, which was a different thing, and which existed because Madame Fournier had sat in a procureur's waiting room in her good coat, and Mara had followed her into a magistrate's office in Aix with a rent ledger, a loose bolt in a jam jar and a scrapyard photograph, and had not walked out until it did. She put the Marseille photograph on the table, the one from the lobster restaurant: Hale, and the man with the closed-door face, and the hands buttering a roll. "This one decides. Armand Vial. The foundation is his. The cooler voice on the tape is not Hale's. Inês wrote his first name in the margin in March, before any of us had met him."</w:t>
+        <w:t>"Hale is a cashier," said Mara. She was not, strictly, on the case. She was on the juge's case, which was a different thing, and which existed because Madame Fournier had sat in a procureur's waiting room in her good coat, and Mara had followed her into a magistrate's office in Aix with a rent ledger, a sawn bolt from Lyon and a brake hose from a scrapyard, and had not walked out until it did. She put the Marseille photograph on the table, the one from the lobster restaurant: Hale, and the man with the closed-door face, and the hands buttering a roll. "This one decides. Armand Vial. The foundation is his. The cooler voice on the tape is not Hale's. Inês wrote his first name in the margin in March, before any of us had met him."</w:t>
       </w:r>
     </w:p>
     <w:p>
@@ -8879,7 +8924,7 @@
     </w:p>
     <w:p>
       <w:r>
-        <w:t>It had been Madame Fournier's washing machine for nineteen years, a heavy white French machine that had survived eleven winters, a flood, seven tenants and Tobias. It did not survive the thunderbolt. It gave a groan like a dying ox, shuddered through one last spin with the door still locked, sent a thin grey thread of smoke out of its soap drawer, and died, quite visibly, with a small clink, its drum full of Catarina's tea towels.</w:t>
+        <w:t>It had been Madame Fournier's washing machine for nineteen years, a heavy white French machine that had survived nineteen winters, a flood, seven tenants and Tobias. It did not survive the thunderbolt. It gave a groan like a dying ox, shuddered through one last spin with the door still locked, sent a thin grey thread of smoke out of its soap drawer, and died, quite visibly, with a small clink, its drum full of Catarina's tea towels.</w:t>
       </w:r>
     </w:p>
     <w:p>
@@ -9109,7 +9154,7 @@
     </w:p>
     <w:p>
       <w:r>
-        <w:t>Madame Fournier came down the garden ten minutes later, in her gardening gloves, because she had seen them from her kitchen window and wished to know what two people in dressing gowns were doing in Henri's terrace at seven in the morning. She stopped at the edge of the grove. She stood there for some time. Then she took off one glove, finger by finger, and reached up and touched a branch, the way you would touch the sleeve of somebody you had not seen for a while and were not sure you were allowed to speak to.</w:t>
+        <w:t>Madame Fournier came down the garden ten minutes later, in her gardening gloves, because she had seen them from her kitchen window and wished to know what two people in dressing gowns were doing in Henri's terrace at seven in the morning. She stopped at the edge of the grove. She stood there for some time. Then she pulled off one glove and reached up and touched a branch, the way you would touch the sleeve of somebody you had not seen for a while and were not sure you were allowed to speak to.</w:t>
       </w:r>
     </w:p>
     <w:p>
@@ -9196,7 +9241,7 @@
         <w:t>since those poor men must be famished</w:t>
       </w:r>
       <w:r>
-        <w:t>. She walked up the garden path in a yellow coat with the plate in both hands, looked up the ladder, and said, in her clear schoolgirl voice:</w:t>
+        <w:t>. She walked up the garden path in a yellow coat with the plate in both hands, looked up the ladder, and said, in her clear, bright, nineteen-year-old voice:</w:t>
       </w:r>
     </w:p>
     <w:p>
@@ -9514,7 +9559,7 @@
     </w:p>
     <w:p>
       <w:r>
-        <w:t>"You telephone your wife. You say, I will think. You say, I promise. And then you tell the housekeeper to go home." She said it quite slowly, as if she were reading it from a page held at arm's length. "It is very good. It is very tidy. In English it is very kind, I am sure."</w:t>
+        <w:t>"You telephone your wife. You say, I will think about it. And then you tell the housekeeper to go home." She said it quite slowly, as if she were reading it from a page held at arm's length. "It is very good. It is very tidy. In English it is very kind, I am sure."</w:t>
       </w:r>
     </w:p>
     <w:p>
@@ -9539,7 +9584,7 @@
     </w:p>
     <w:p>
       <w:r>
-        <w:t>Catarina looked at him for a long moment.</w:t>
+        <w:t>Catarina looked at him.</w:t>
       </w:r>
     </w:p>
     <w:p>
@@ -9715,12 +9760,7 @@
     </w:p>
     <w:p>
       <w:r>
-        <w:t>On the second afternoon, Madame Fournier came over the wall.</w:t>
-      </w:r>
-    </w:p>
-    <w:p>
-      <w:r>
-        <w:t>She came round to the front and rang the bell, which nobody had ever rung, walked past him into the hall, took off her gardening gloves finger by finger, and sat down on the bottom stair.</w:t>
+        <w:t>On the second afternoon, Madame Fournier came to call. She did not come over the wall. She came round to the front and rang the bell, which nobody had ever rung, walked past him into the hall, took off her gardening gloves finger by finger, and sat down on the bottom stair.</w:t>
       </w:r>
     </w:p>
     <w:p>
@@ -9756,6 +9796,11 @@
     <w:p>
       <w:r>
         <w:t>"She told me also. Over the wall. She said everything three times, in three languages, which is how I know it was the truth. A woman does not lie in three languages. It is too much work. And you said, so I was useful."</w:t>
+      </w:r>
+    </w:p>
+    <w:p>
+      <w:r>
+        <w:t>Tobias stared at her.</w:t>
       </w:r>
     </w:p>
     <w:p>
@@ -9936,7 +9981,7 @@
     </w:p>
     <w:p>
       <w:r>
-        <w:t>That night the radio from Lisbon came back on, and she sang along to it, off-key, and the house, which had been holding its breath for two days, let it out through every window, over the pond, where the pelican put its head under its wing and slept.</w:t>
+        <w:t>That night the radio from Lisbon came back on, and she sang along to it, off-key, and the house, which had been holding its breath for two days, let it out through every window, over the dark pond. In the morning there was a note under his plate again. It said EAT, and under that, smaller, in pencil, PLEASE.</w:t>
       </w:r>
     </w:p>
     <w:p>
@@ -10025,7 +10070,7 @@
     </w:p>
     <w:p>
       <w:r>
-        <w:t>The gate was locked. They climbed it, which is how a locked gate announces itself to the unlucky, and the first Gaston came down on the far side onto the brass gong that Madame Fournier kept on the porch as a decoration, and which Hugo had carried down the drive that afternoon and propped against the inside of the gate, he said afterwards, "for acoustic reasons." The sound went round the valley like the end of the world. Over the wall, in Madame Fournier's kitchen, three heads came up from the biscuit tin at once.</w:t>
+        <w:t>The gate was locked. They climbed it, which is how a locked gate announces itself to the unlucky, and the first Gaston, swinging his leg over, kicked the brass gong that Henri Fournier had hung on the gatepost in 1987 instead of a bell, because he said bells were for people who expected visitors. The sound went round the valley like the end of the world. Over the wall, in Madame Fournier's kitchen, three heads came up from the biscuit tin at once.</w:t>
       </w:r>
     </w:p>
     <w:p>
@@ -10360,12 +10405,12 @@
     </w:p>
     <w:p>
       <w:r>
-        <w:t>"In the afternoons," he said. "When anybody could see you go. From the road, from the lane, from a car parked at the top of it. She'd have seen you too. And she'd have stayed in, because she's careful, because you're being watched, and if she came out they'd have two of you." He turned round. "Baptistin's hut is on the channel. The torch I saw was on the channel. She isn't hiding from you. She's hiding from whoever's watching you. So we don't walk down the bank in daylight like people looking for somebody. We go by water, at dawn, before anybody's at the top of the lane, and we take everything with us, the tape and the notebook, because Hale has just told us he's coming back, and I'm not leaving them in a house he's walked into twice."</w:t>
-      </w:r>
-    </w:p>
-    <w:p>
-      <w:r>
-        <w:t>She had come up behind him, and she looked at him for some time across the dark study.</w:t>
+        <w:t>"In the afternoons," he said. "When anybody could see you go. From the road, from the lane, from a car parked at the top of it. She'd have seen you too. And she'd have stayed in, because she's careful, because you're being watched, and if she came out they'd have two of you." He turned round. "Baptistin's hut is on the channel. The torch I saw was on the channel. She isn't hiding from you. She's hiding from whoever's watching you. So we don't walk down the bank in daylight like people looking for somebody. We go by water, at dawn, before anybody's at the top of the lane, and we take everything with us, the tape and the notebook, because Hale has just told us he's coming back, and I'm not leaving them in a house that every crook in the Bouches-du-Rhône seems to have the address of."</w:t>
+      </w:r>
+    </w:p>
+    <w:p>
+      <w:r>
+        <w:t>She had come up behind him, and she looked at him across the dark study.</w:t>
       </w:r>
     </w:p>
     <w:p>
@@ -10420,7 +10465,7 @@
     </w:p>
     <w:p>
       <w:r>
-        <w:t xml:space="preserve">Catarina laughed, very quietly, with the water running off her face, and did not wipe it. It was the first time she had laughed since the margin. He kept rowing. He thought that if he rowed down this channel for the rest of his life, badly, soaking them both, with a heron going on ahead, and Catarina in the stern saying </w:t>
+        <w:t xml:space="preserve">Catarina laughed, very quietly, with the water running off her face, and did not wipe it. He kept rowing. He thought that if he rowed down this channel for the rest of his life, badly, soaking them both, with a heron going on ahead, and Catarina in the stern saying </w:t>
       </w:r>
       <w:r>
         <w:rPr>
@@ -10473,7 +10518,7 @@
     </w:p>
     <w:p>
       <w:r>
-        <w:t>"I watched you go into the lake for his pages," said Inês, also in Portuguese, and then, because the Inspector was there and manners are manners, in English. "I watched you for seven weeks. If I had come, they would have known where I was. They were watching the house. They were watching you." She looked at Tobias, briefly, as at a piece of evidence she had already filed. "And also you would have stopped looking at him, and I wanted to see how it ended."</w:t>
+        <w:t>"I watched you go into the lake for his pages," said Inês, also in Portuguese, and then, because the Inspector was there and manners are manners, in English. "I watched you since September. If I had come, they would have known where I was. They were watching the house. They were watching you." She looked at Tobias, briefly, as at a piece of evidence she had already filed. "And also you would have stopped looking at him, and I wanted to see how it ended."</w:t>
       </w:r>
     </w:p>
     <w:p>
@@ -10644,7 +10689,7 @@
         <w:ind w:firstLine="0"/>
       </w:pPr>
       <w:r>
-        <w:t>Mara took Inês's statement at Madame Fournier's kitchen table, on the Monday morning, with a recording machine the size of a matchbox, a notebook, two pens in case one died, and the juge's clerk on the end of a telephone line, listening, in Aix.</w:t>
+        <w:t>Mara took Inês's statement at Madame Fournier's kitchen table on the Wednesday morning. She could have taken it on the Monday, and the juge, who had Hale's names but nobody yet who had seen the jetty, had wanted her to; but on the Monday Inês had been seven months in a hut and had slept, Madame Fournier reported, for fourteen hours in Henri's chair with her boots on, and Mara had told Aix that a witness who falls asleep in the middle of her own evidence is a gift to the defence. So it was Wednesday, at Madame Fournier's table, with a recording machine the size of a matchbox, a notebook, two pens in case one died, and the juge's clerk on the end of a telephone line, listening, in Aix.</w:t>
       </w:r>
     </w:p>
     <w:p>
@@ -10968,7 +11013,7 @@
     </w:p>
     <w:p>
       <w:r>
-        <w:t xml:space="preserve">"I watched for a while," said Inês. "And then one day the Inspector came to the lane, in her own car, on a Sunday, and stood by the gate, alone, and looked at the jetty for twenty minutes the way my sister looked at it. Not like a policewoman. Like somebody who was sorry." She looked at Mara. "That was in October. I found your number in the bakery's telephone book, and I wrote it on the wall of the hut, with a nail, and I did not ring it. I looked at it every night. I am a careful woman. Careful is how I am still alive." She looked down the table at Tobias. "And then this morning, at dawn, you sat on my step and said, </w:t>
+        <w:t xml:space="preserve">"I watched for a while," said Inês. "And then one day the Inspector came to the lane, in her own car, on a Sunday, and stood by the gate, alone, and looked at the jetty for twenty minutes the way my sister looked at it. Not like a policewoman. Like somebody who was sorry." She looked at Mara. "That was in October. I found your number in the bakery's telephone book, and I wrote it on the wall of the hut, with a nail, and I did not ring it. I looked at it every night. I am a careful woman. Careful is how I am still alive." She looked down the table at Tobias. "And then on Monday, at dawn, you sat on my step and said, </w:t>
       </w:r>
       <w:r>
         <w:rPr>
@@ -11058,7 +11103,16 @@
         <w:ind w:firstLine="0"/>
       </w:pPr>
       <w:r>
-        <w:t>On the last evening before the warrant, Maître Edouard Delacroix-Roux polished the brass plate himself.</w:t>
+        <w:t xml:space="preserve">Sixty kilometres away, on that same Wednesday evening, while Tobias sat at the Olivetti with the word </w:t>
+      </w:r>
+      <w:r>
+        <w:rPr>
+          <w:i/>
+        </w:rPr>
+        <w:t>counted</w:t>
+      </w:r>
+      <w:r>
+        <w:t xml:space="preserve"> still on the page, Maître Edouard Delacroix-Roux polished the brass plate himself. It was the last evening before the warrant. He did not know that. He would have polished it anyway.</w:t>
       </w:r>
     </w:p>
     <w:p>
@@ -11134,7 +11188,7 @@
     </w:p>
     <w:p>
       <w:r>
-        <w:t xml:space="preserve">Hale had been taken that morning from the end of the jetty, and Hale would talk, because Hale was a man who had always talked: to waiters, to authors, to the speaker of his own telephone. Let him. Hale's word was a cashier's word. Hale had stood at a window and seen nothing, and had checked, beforehand, that nothing could be seen. The tape had a first name on it, and there were, Edouard knew exactly, forty-one avocats called Edouard at the bar of Aix. The bolt was a bolt. The hose was a hose. Moutet would say what Moutet had always said, because once you have said </w:t>
+        <w:t xml:space="preserve">Hale had been taken on Monday from the end of the jetty, and Hale would talk, because Hale was a man who had always talked: to waiters, to authors, to the speaker of his own telephone. Let him. Hale's word was a cashier's word. Hale had stood at a window and seen nothing, and had checked, beforehand, that nothing could be seen. The tape had a first name on it, and there were, Edouard knew exactly, forty-one avocats called Edouard at the bar of Aix. The bolt was a bolt. The hose was a hose. Moutet would say what Moutet had always said, because once you have said </w:t>
       </w:r>
       <w:r>
         <w:rPr>
@@ -11158,7 +11212,7 @@
     </w:p>
     <w:p>
       <w:r>
-        <w:t>She had not been afraid either. That had surprised him. She had stood on the end of the jetty in her grey wool coat with her hands in her pockets, exactly as Hale was standing now at the window, and she had listened to him explain, very reasonably, what she would sign and what she would forget, and at the end she had laughed. Not unkindly. She had laughed the way the English laugh at a waiter's French.</w:t>
+        <w:t>She had not been afraid either. That had surprised him. She had stood on the end of the jetty in her grey wool coat with her hands in her pockets, exactly as Hale was standing, at that moment, at the study window, and she had listened to him explain, very reasonably, what she would sign and what she would forget, and at the end she had laughed. Not unkindly. She had laughed the way the English laugh at a waiter's French.</w:t>
       </w:r>
     </w:p>
     <w:p>
@@ -11263,7 +11317,7 @@
         <w:ind w:firstLine="0"/>
       </w:pPr>
       <w:r>
-        <w:t>Juge Hélène Sarrazin listened to Inês's statement at her desk in Aix, from the beginning, before lunch, sitting down, exactly as Mara had advised. Her clerk said afterwards that she listened to it twice, and that during the second hearing she took off her glasses and laid them on the desk and put both hands flat on either side of them, and did not move until the tape ran out. Then she put her glasses back on, picked up her pen, and signed four documents in a row without reading them again, because she had already read them, three times, the night before, at her kitchen table, while her husband made an omelette and was not spoken to.</w:t>
+        <w:t>That morning, before the brass plate and the yellow cloth, Juge Hélène Sarrazin had listened to Inês's statement at her desk in Aix, from the beginning, before lunch, sitting down, exactly as Mara had advised. Her clerk said afterwards that she listened to it twice, and that during the second hearing she took off her glasses and laid them on the desk and put both hands flat on either side of them, and did not move until the tape ran out. Then she put her glasses back on, picked up her pen, and signed four documents in a row without reading them again, because she had already read them, three times, the night before, at her kitchen table, while her husband made an omelette and was not spoken to.</w:t>
       </w:r>
     </w:p>
     <w:p>
@@ -11566,7 +11620,7 @@
         <w:ind w:firstLine="0"/>
       </w:pPr>
       <w:r>
-        <w:t>The second box was opened on a Thursday, in a vault in the rue Paradis, in the presence of the director of the bank, two lawyers for the Fondation Vial who did not stop objecting until the juge's clerk read them the order aloud in its entirety for the third time, Inspector Mara Quill of the judicial police, and Anselm Brunner of the Vatican Apostolic Library, who had been in Marseille for eleven days, staying in a small hotel near the station, waiting, with his umbrella and his patience, for exactly this.</w:t>
+        <w:t>The second box was opened that same Thursday afternoon, in a vault in the rue Paradis, in the presence of the director of the bank, two lawyers for the Fondation Vial who did not stop objecting until the juge's clerk read them the order aloud in its entirety for the third time, Lieutenant Mara Quill of the gendarmerie, and Anselm Brunner of the Vatican Apostolic Library, who had been in Marseille for thirteen days, staying in a small hotel near the station, waiting, with his umbrella and his patience, for exactly this.</w:t>
       </w:r>
     </w:p>
     <w:p>
@@ -11686,7 +11740,7 @@
     </w:p>
     <w:p>
       <w:r>
-        <w:t>Brunner looked at her for a long moment. Then he smiled, a small, weary, dignified smile, the smile of a man who has spent his whole life being mocked by the French and has decided, on balance, that it was worth it.</w:t>
+        <w:t>Brunner looked at her. Then he smiled, a small, weary, dignified smile, the smile of a man who has spent his whole life being mocked by the French and has decided, on balance, that it was worth it.</w:t>
       </w:r>
     </w:p>
     <w:p>
@@ -11716,7 +11770,7 @@
     </w:p>
     <w:p>
       <w:r>
-        <w:t>Then he went out into the rain, and down the gravel, with the case under his arm and the umbrella up, and through the gate, and the pelican on the lounger took its head out from under its wing and watched him go all the way down the lane until he was out of sight.</w:t>
+        <w:t>Brunner walked out into the rain, and down the gravel with the case under his arm, and through the gate, and Tobias stood in the doorway and watched the umbrella go down the lane, held at the angle of a bayonet, until the rain took it.</w:t>
       </w:r>
     </w:p>
     <w:p>
@@ -11974,7 +12028,7 @@
         <w:t>Liaison.</w:t>
       </w:r>
       <w:r>
-        <w:t>" She paused. "He put everything else in a cardboard box. The photographs, the trophy, the cigars, the commendation. And then he stood looking at the pen for some time. And then he picked it up, and held it out to me."</w:t>
+        <w:t>" She paused. "He put everything else in a cardboard box. The photographs, the trophy, the cigars, the commendation. And then he stood looking at the pen. And then he picked it up, and held it out to me."</w:t>
       </w:r>
     </w:p>
     <w:p>
@@ -12054,7 +12108,7 @@
         <w:ind w:firstLine="0"/>
       </w:pPr>
       <w:r>
-        <w:t>The juge offered Mara a promotion. That was not, strictly, within a juge's gift; but Juge Sarrazin had a way of mentioning things to the right people over lunch, and by the end of the following week a letter had arrived from the regional directorate offering Lieutenant Mara Quill the rank of capitaine, a transfer to the judicial police in Marseille, an office with a window onto the old port, and a pay rise that was not large but was, she said, at least a number.</w:t>
+        <w:t>The juge offered Mara a promotion. That was not, strictly, within a juge's gift; but Juge Sarrazin had a way of mentioning things to the right people over lunch, and by the end of the following week a letter had arrived from the regional directorate offering Lieutenant Mara Quill the rank of capitaine, a transfer to the gendarmerie's research section in Marseille, an office with a window onto the old port, and a pay rise that was not large but was, she said, at least a number.</w:t>
       </w:r>
     </w:p>
     <w:p>
@@ -12119,7 +12173,7 @@
     </w:p>
     <w:p>
       <w:r>
-        <w:t>"He's a pelican," said Mara. "He doesn't approve of anything." She looked at the bird for a long moment, with something in her face that Tobias had not seen there before, something that in a less disciplined woman might have been tenderness. "But he stays. I'll give him that. Everyone else left this jetty in March. He stayed."</w:t>
+        <w:t>"He's a pelican," said Mara. "He doesn't approve of anything." She looked at the bird for a while, with something in her face that Tobias had not seen there before, something that in a less disciplined woman might have been tenderness. "But he stays. I'll give him that. Everyone else left this jetty in March. He stayed."</w:t>
       </w:r>
     </w:p>
     <w:p>
@@ -12148,7 +12202,7 @@
     </w:p>
     <w:p>
       <w:r>
-        <w:t>It had begun, Priscilla Pemberton-Hayes explained, in 2009, when there had been eleven English couples within ten kilometres and nothing on the television. It now involved twenty-three English people, four Dutch, one Belgian schoolmaster who had come back for it every year since his October in the lake house, a German dentist who played the piano, and, in the back row of the chorus, by special arrangement with the mairie, the deputy mayor, who did not speak a word of English and had been a pirate, a policeman, a Chinese laundryman and an ugly sister in successive years, without ever once being told what any of it was about.</w:t>
+        <w:t>It had begun, Priscilla Pemberton-Hayes explained, in 2009, when there had been eleven English couples within ten kilometres and nothing on the television. It now involved twenty-three English people, four Dutch, one Belgian schoolmaster who had come down from Liège for it ever since his October in the lake house, a German dentist who played the piano, and, in the back row of the chorus, by special arrangement with the mairie, the deputy mayor, who did not speak a word of English and had been a pirate, a policeman, a Chinese laundryman and an ugly sister in successive years, without ever once being told what any of it was about.</w:t>
       </w:r>
     </w:p>
     <w:p>
@@ -12326,7 +12380,7 @@
     </w:p>
     <w:p>
       <w:r>
-        <w:t>Catarina considered this for a long time.</w:t>
+        <w:t>Catarina considered this.</w:t>
       </w:r>
     </w:p>
     <w:p>
@@ -12445,7 +12499,7 @@
     </w:p>
     <w:p>
       <w:r>
-        <w:t>"OH YES YOU HAVE! WE SAW! IN OCTOBER! WITH THE BABYSITTER!"</w:t>
+        <w:t>"OH YES YOU HAVE! IN OCTOBER! WITH THE BABYSITTER!"</w:t>
       </w:r>
     </w:p>
     <w:p>
@@ -12455,7 +12509,7 @@
     </w:p>
     <w:p>
       <w:r>
-        <w:t>Then the back half of the horse sat down very suddenly on the stage, and the front half fell over it, and Priscilla Pemberton-Hayes, Dame, in a dress made of her own curtains, looked down at the wreckage of her husband with an expression of the most perfect, serene and complete satisfaction, and said, to the third row, with great dignity:</w:t>
+        <w:t>Then the back half of the horse sat down very suddenly on the stage, and the front half fell over it, and Priscilla Pemberton-Hayes, Dame, in a dress made of her own curtains, looked down at the wreckage of her husband with an expression of the most perfect, serene and complete satisfaction, and said, to the third row:</w:t>
       </w:r>
     </w:p>
     <w:p>
@@ -12834,7 +12888,7 @@
     </w:p>
     <w:p>
       <w:r>
-        <w:t>At two minutes past three, the fourth stair creaked, on purpose, and she was there, in the doorway, in her dressing gown, with her arms folded, watching him, and she did not say anything, and she did not need to.</w:t>
+        <w:t>At two minutes past three, the fourth stair creaked, on purpose, and she was there, in the doorway, in her dressing gown, with her arms folded, watching him, and said nothing at all, which in that house had long since become a language.</w:t>
       </w:r>
     </w:p>
     <w:p>
@@ -12892,7 +12946,7 @@
     </w:p>
     <w:p>
       <w:r>
-        <w:t xml:space="preserve">"On them," said Hugo, and pointed. "I looked them up after the first burglary. At the notary's. It was in </w:t>
+        <w:t xml:space="preserve">"On them," said Hugo, and pointed. "After the notary's, it was in </w:t>
       </w:r>
       <w:r>
         <w:rPr>
@@ -12901,7 +12955,7 @@
         <w:t>La Provence</w:t>
       </w:r>
       <w:r>
-        <w:t>. Two men called Gaston, both from Toulon, both with eleven previous convictions, mostly for falling over." He folded his hands. "I knew they'd come. Men who've been sent for something always come back for it. It's in all the books. So I prepared."</w:t>
+        <w:t>. Two men called Gaston, both from Toulon, both with eleven previous convictions, mostly for falling over." He folded his hands. "I didn't do anything clever. I just told them the law and told them about a snake. People who are already frightened believe whatever you say next. That's in all the books too."</w:t>
       </w:r>
     </w:p>
     <w:p>
@@ -12921,12 +12975,12 @@
     </w:p>
     <w:p>
       <w:r>
-        <w:t>The Gastons got eighteen months each, suspended, and an order not to come within five kilometres of the lake, which the second Gaston, the one who falls, said in a small voice he had no intention of doing ever again, as there were children there. As they were led out, the first Gaston was heard to say to the second, with a kind of broken wonder, "Gaston. I think we should go to New York."</w:t>
-      </w:r>
-    </w:p>
-    <w:p>
-      <w:r>
-        <w:t>"There are children in New York," said the second Gaston, and the door closed on them.</w:t>
+        <w:t>The Gastons got eighteen months each, suspended, and an order not to come within five kilometres of the lake, which the second Gaston, the one who falls, said in a small voice he had no intention of doing ever again, as there were children there. As they were led out, the first Gaston was heard to say to the second, with a kind of broken wonder, "Gaston. I think we should retire."</w:t>
+      </w:r>
+    </w:p>
+    <w:p>
+      <w:r>
+        <w:t>"From what?" said the second Gaston, and the door closed on them.</w:t>
       </w:r>
     </w:p>
     <w:p>
@@ -12954,7 +13008,7 @@
     </w:p>
     <w:p>
       <w:r>
-        <w:t>There were two men in the dock. Maître Edouard Delacroix-Roux, avocat, fifty-three, in a charcoal suit and a white shirt and a plain dark-blue tie, because his own lawyers, it was said, had begged him not to wear the other one; and Victor Hale, publisher, sixty-one, in a beautiful coat that had begun, over five months in the maison d'arrêt at Luynes, to hang on him like a coat on a peg.</w:t>
+        <w:t>There were two men in the dock. Maître Edouard Delacroix-Roux, avocat, fifty-three, in a charcoal suit and a white shirt and a plain dark-blue tie, because his own lawyers, it was said, had begged him not to wear the other one; and Victor Hale, publisher, sixty-one, in a beautiful coat that had begun, over four months in the maison d'arrêt at Luynes, to hang on him like a coat on a peg.</w:t>
       </w:r>
     </w:p>
     <w:p>
@@ -12973,7 +13027,7 @@
     </w:p>
     <w:p>
       <w:r>
-        <w:t>The case had already been made, by ordinary means, before the doors of the court opened: the tape, the margin in Inês's notebook, the forged assignment from Barbier's files, the bolt from Lyon, the brake hose from Cavaillon, the telephone records, the rent ledger, the sacks of Highly Commended letters, and Hale's own second statement. The trial would test those things in public. It would not replace them.</w:t>
+        <w:t>The case had already been made, by ordinary means, before the doors of the court opened: the tape, the margin in Inês's notebook, the forged assignment from Barbier's files, the bolt from Lyon, the brake hose from Cavaillon, the telephone records, the rent ledger, the sacks of Highly Commended letters, nineteen signed statements from writers who had paid, one of them from Cape Town with a photograph of a red ribbon, and Hale's own second statement. The trial would test those things in public. It would not replace them.</w:t>
       </w:r>
     </w:p>
     <w:p>
@@ -13035,7 +13089,7 @@
     </w:p>
     <w:p>
       <w:r>
-        <w:t>The judge asked whether the cooler voice on the telephone could be identified as the accused's. Mara said the laboratory's comparison was consistent with recordings of Maître Delacroix-Roux's voice from two earlier hearings, but that voice comparison was not a fingerprint, and the court should treat it as one strand among several and not as a rope. Tobias, in the public gallery, wrote that down. It was the most honest sentence he had heard from anyone in a uniform in his life, and he wanted it for the book.</w:t>
+        <w:t>The judge asked whether the cooler voice on the telephone could be identified as the accused's. Mara said the laboratory's comparison was consistent with recordings of Maître Delacroix-Roux's voice from two earlier hearings, but that voice comparison was not a fingerprint, and the court should treat it as one strand among several and not as a rope. Tobias, in the public gallery, wrote that down. It was the most honest sentence he had heard from anyone in the service in his life, and he wanted it for the book.</w:t>
       </w:r>
     </w:p>
     <w:p>
@@ -13073,7 +13127,7 @@
     </w:p>
     <w:p>
       <w:r>
-        <w:t>Monsieur Lemaire, in his cardigan, without the cat, repeated what he had told Dona Graça and the young officer and Tobias and Catarina, in the same words, in the same order, like a train timetable, and when the defence asked whether, at seventy-one, doing the crossword, he could really be sure it was an umbrella and not a walking stick, he looked at the lawyer for a long time and said, "Maître, I worked at Lyon airport for thirty-one years. I know the difference between an umbrella and a walking stick. Do you?" and sat down, and was not asked anything else.</w:t>
+        <w:t>Monsieur Lemaire, in his cardigan, without the cat, repeated what he had told Dona Graça and the commandant with the very good pen and Tobias and Catarina, in the same words, in the same order, like a train timetable, and when the defence asked whether, at seventy-one, doing the crossword, he could really be sure it was an umbrella and not a walking stick, he looked at the lawyer for a long time and said, "Maître, I worked at Lyon airport for thirty-one years. I know the difference between an umbrella and a walking stick. Do you?" and sat down, and was not asked anything else.</w:t>
       </w:r>
     </w:p>
     <w:p>
@@ -13182,7 +13236,7 @@
     </w:p>
     <w:p>
       <w:r>
-        <w:t>Then she turned her head and looked at Delacroix-Roux, across the room, for a long moment, the way she had looked at him across the Cours Mirabeau through the falling leaves.</w:t>
+        <w:t>Then she turned her head and looked at Delacroix-Roux, across the room, the way she had looked at him across the Cours Mirabeau through the falling leaves.</w:t>
       </w:r>
     </w:p>
     <w:p>
@@ -13441,7 +13495,7 @@
     </w:p>
     <w:p>
       <w:r>
-        <w:t>"Resistance is useless," Inês murmured, in English, for his benefit alone. "I tried for thirty-four years. The only winning move is to be hungry."</w:t>
+        <w:t>"Resistance is useless," Inês murmured, in English, for his benefit alone. "I tried for thirty-two years. The only winning move is to be hungry."</w:t>
       </w:r>
     </w:p>
     <w:p>
@@ -13501,7 +13555,7 @@
     </w:p>
     <w:p>
       <w:r>
-        <w:t>When Fernanda had finished with him, he wiped his hands, took Catarina a little apart, and held out a thin bound manuscript.</w:t>
+        <w:t>When Fernanda had finished with them, Tobias wiped his hands, took Catarina a little apart, and held out a thin bound manuscript.</w:t>
       </w:r>
     </w:p>
     <w:p>
@@ -13581,7 +13635,7 @@
     </w:p>
     <w:p>
       <w:r>
-        <w:t>She kissed him then, in the cold sun, in front of the whole courthouse. A single stray page of an old draft, blown loose from nowhere, spun up over their heads, caught the light, and drifted away down the street over the heads of the market. Sixty kilometres away, on the end of a jetty, a pelican cleared its throat, or did not; nobody was there to hear it, which was how he preferred it.</w:t>
+        <w:t>She kissed him then, in the cold sun, in front of the whole courthouse. A single stray page of an old draft, blown loose from nowhere, spun up over their heads, caught the light, and drifted away down the street over the heads of the market.</w:t>
       </w:r>
     </w:p>
     <w:p>
@@ -13927,7 +13981,7 @@
     </w:p>
     <w:p>
       <w:r>
-        <w:t>Margaret looked at her son for a long moment, with the expression of a woman who has found out, forty-six years late, exactly where she went wrong.</w:t>
+        <w:t>Margaret looked at her son for some time, with the expression of a woman who has found out, forty-six years late, exactly where she went wrong.</w:t>
       </w:r>
     </w:p>
     <w:p>
@@ -14205,7 +14259,7 @@
     </w:p>
     <w:p>
       <w:r>
-        <w:t>"I know. I read it at night, in the study, in September," said Catarina, "with a dictionary, on the floor. I will make it better."</w:t>
+        <w:t>"I know. I read it in December, by the stove, with a dictionary," said Catarina. "I will make it better."</w:t>
       </w:r>
     </w:p>
     <w:p>
@@ -14233,7 +14287,7 @@
     </w:p>
     <w:p>
       <w:r>
-        <w:t>"It is the same jetty," she said, when it was done, standing at the end of it in her quilted waistcoat with her secateurs, which she had brought, she said, in case of emergencies. "The same wood. The same nails, mostly. Only, turned over." She tapped the newest board with her foot. "Like a page."</w:t>
+        <w:t>"It is the same jetty," she said, when it was done, standing at the end of it in her quilted waistcoat with her secateurs. "The same wood. The same nails, mostly. Only, turned over." She tapped the newest board with her foot. "Like a page."</w:t>
       </w:r>
     </w:p>
     <w:p>
@@ -14248,7 +14302,7 @@
     </w:p>
     <w:p>
       <w:r>
-        <w:t>When it came off, she dipped one finger in, and tasted it, and sat for some time looking at the water.</w:t>
+        <w:t>When it came off, she dipped one finger in, and tasted it, and sat looking at the water until the light changed.</w:t>
       </w:r>
     </w:p>
     <w:p>
@@ -14276,7 +14330,7 @@
         <w:ind w:firstLine="0"/>
       </w:pPr>
       <w:r>
-        <w:t>Hugo found the snake in June.</w:t>
+        <w:t>Hugo found the snake in July.</w:t>
       </w:r>
     </w:p>
     <w:p>
@@ -14333,7 +14387,7 @@
     </w:p>
     <w:p>
       <w:r>
-        <w:t>They went down without a torch, because they knew the path now, and the moon was up, and they had walked it a hundred times since March, and it was only a garden, and only a lawn, and only three stone steps, the second of which Tobias still nearly fell on every time, and which Catarina said she was going to have Henri's carpenter look at, and never did, because it was his step now, and a man should have one thing in a house he can rely on to go wrong.</w:t>
+        <w:t>They went down without a torch, because they knew the path now, and the moon was up, and they had walked it a hundred times since the autumn, and it was only a garden, and only a lawn, and only three stone steps, the second of which Tobias still nearly fell on every time, and which Catarina said she was going to have Henri's carpenter look at, and never did, because it was his step now, and a man should have one thing in a house he can rely on to go wrong.</w:t>
       </w:r>
     </w:p>
     <w:p>
@@ -14414,7 +14468,7 @@
     </w:p>
     <w:p>
       <w:r>
-        <w:t>He felt in his jacket pocket. He had been carrying it since the courthouse steps, for nine weeks, in the inside pocket, against his heart, where a postcard from a dead friend had once been, and where the cold had got in, and it had worn the lining thin. It was not a ring. A ring was Portugal, and Fernanda, and a priest who was a cousin, and that was September. This was the jetty, and this was now, and this was only the two of them.</w:t>
+        <w:t>He felt in his jacket pocket. He had been carrying it since the spring, since the week after the courthouse steps, in the inside pocket, against his heart, where a postcard from a dead friend had once been, and where the cold had got in, and it had worn the lining thin. It was not a ring. A ring was Portugal, and Fernanda, and a priest who was a cousin, and that was September. This was the jetty, and this was now, and this was only the two of them.</w:t>
       </w:r>
     </w:p>
     <w:p>

</xml_diff>

<commit_message>
ILWM: fresh reread ch21-epilogue after round-5 late fixes; continuity (Camilla 'not married', hose seal, tape stop, biscuit-tin tape, Hugo's message, parents' arrival, Mara's Dec timeline, Barbier dates), prose slips, 'for some time' 17->4, 'for a while' 19->11; rebuilt docx (291 pp, TOC page numbers)
</commit_message>
<xml_diff>
--- a/In Love with Murder, Actually/In_Love_with_Murder_Actually.docx
+++ b/In Love with Murder, Actually/In_Love_with_Murder_Actually.docx
@@ -1268,7 +1268,7 @@
         <w:fldChar w:fldCharType="separate"/>
       </w:r>
       <w:r>
-        <w:t xml:space="preserve">194</w:t>
+        <w:t xml:space="preserve">193</w:t>
       </w:r>
       <w:r>
         <w:fldChar w:fldCharType="end"/>
@@ -1300,7 +1300,7 @@
         <w:fldChar w:fldCharType="separate"/>
       </w:r>
       <w:r>
-        <w:t xml:space="preserve">202</w:t>
+        <w:t xml:space="preserve">201</w:t>
       </w:r>
       <w:r>
         <w:fldChar w:fldCharType="end"/>
@@ -1332,7 +1332,7 @@
         <w:fldChar w:fldCharType="separate"/>
       </w:r>
       <w:r>
-        <w:t xml:space="preserve">214</w:t>
+        <w:t xml:space="preserve">213</w:t>
       </w:r>
       <w:r>
         <w:fldChar w:fldCharType="end"/>
@@ -1364,7 +1364,7 @@
         <w:fldChar w:fldCharType="separate"/>
       </w:r>
       <w:r>
-        <w:t xml:space="preserve">220</w:t>
+        <w:t xml:space="preserve">219</w:t>
       </w:r>
       <w:r>
         <w:fldChar w:fldCharType="end"/>
@@ -1396,7 +1396,7 @@
         <w:fldChar w:fldCharType="separate"/>
       </w:r>
       <w:r>
-        <w:t xml:space="preserve">231</w:t>
+        <w:t xml:space="preserve">230</w:t>
       </w:r>
       <w:r>
         <w:fldChar w:fldCharType="end"/>
@@ -1428,7 +1428,7 @@
         <w:fldChar w:fldCharType="separate"/>
       </w:r>
       <w:r>
-        <w:t xml:space="preserve">241</w:t>
+        <w:t xml:space="preserve">240</w:t>
       </w:r>
       <w:r>
         <w:fldChar w:fldCharType="end"/>
@@ -1460,7 +1460,7 @@
         <w:fldChar w:fldCharType="separate"/>
       </w:r>
       <w:r>
-        <w:t xml:space="preserve">253</w:t>
+        <w:t xml:space="preserve">252</w:t>
       </w:r>
       <w:r>
         <w:fldChar w:fldCharType="end"/>
@@ -1492,7 +1492,7 @@
         <w:fldChar w:fldCharType="separate"/>
       </w:r>
       <w:r>
-        <w:t xml:space="preserve">267</w:t>
+        <w:t xml:space="preserve">266</w:t>
       </w:r>
       <w:r>
         <w:fldChar w:fldCharType="end"/>
@@ -1524,7 +1524,7 @@
         <w:fldChar w:fldCharType="separate"/>
       </w:r>
       <w:r>
-        <w:t xml:space="preserve">273</w:t>
+        <w:t xml:space="preserve">272</w:t>
       </w:r>
       <w:r>
         <w:fldChar w:fldCharType="end"/>
@@ -1556,7 +1556,7 @@
         <w:fldChar w:fldCharType="separate"/>
       </w:r>
       <w:r>
-        <w:t xml:space="preserve">279</w:t>
+        <w:t xml:space="preserve">278</w:t>
       </w:r>
       <w:r>
         <w:fldChar w:fldCharType="end"/>
@@ -1880,7 +1880,7 @@
     </w:p>
     <w:p>
       <w:r>
-        <w:t>He had pinned the three names to the study wall with red string, as detectives do in films. It was a dramatic arrangement. He stepped back to admire it, and the string, the pins, the three photographs and, as it turned out, the left-hand curtain all came down on him at once, and he stood for some time in a shroud of toile de Jouy, wondering where it had all gone wrong.</w:t>
+        <w:t>He had pinned the three names to the study wall with red string, as detectives do in films. It was a dramatic arrangement. He stepped back to admire it, and the string, the pins, the three photographs and, as it turned out, the left-hand curtain all came down on him at once, and he stood in a shroud of toile de Jouy, wondering where it had all gone wrong.</w:t>
       </w:r>
     </w:p>
     <w:p>
@@ -2785,7 +2785,7 @@
     </w:p>
     <w:p>
       <w:r>
-        <w:t>Later, after she had gone up, he sat for some time in the study with the lamp on, at the window, looking down at the end of the jetty, which he could not see, which was only a darker line on dark water. At midnight he saw a torch come on, briefly, on the far shore, where the pond narrowed into the reeds and became the marsh, and go off again. He watched for a while. It did not come back. He told himself it was an eel-fisher, or a poacher, or a man looking for his dog.</w:t>
+        <w:t>Later, after she had gone up, he sat on in the study with the lamp on, at the window, looking down at the end of the jetty, which he could not see, which was only a darker line on dark water. At midnight he saw a torch come on, briefly, on the far shore, where the pond narrowed into the reeds and became the marsh, and go off again. He watched for a while. It did not come back. He told himself it was an eel-fisher, or a poacher, or a man looking for his dog.</w:t>
       </w:r>
     </w:p>
     <w:p>
@@ -3910,7 +3910,7 @@
     </w:p>
     <w:p>
       <w:r>
-        <w:t>At that moment, fate intervened, as fate in the south of France often does, in the form of a bird. A flamingo that had been wading in the shallows beyond the terrace for some time with a look of mild interest decided that the Hargreaveses' table was an excellent place to be, strolled up the steps with the confidence of a bailiff, and lowered its enormous bent beak into Mr Hargreaves's soup.</w:t>
+        <w:t>At that moment, fate intervened, as fate in the south of France often does, in the form of a bird. A flamingo that had been wading in the shallows beyond the terrace all through lunch with a look of mild interest decided that the Hargreaveses' table was an excellent place to be, strolled up the steps with the confidence of a bailiff, and lowered its enormous bent beak into Mr Hargreaves's soup.</w:t>
       </w:r>
     </w:p>
     <w:p>
@@ -4939,7 +4939,7 @@
     </w:p>
     <w:p>
       <w:r>
-        <w:t>The three of them looked at it for some time.</w:t>
+        <w:t>The three of them looked at it.</w:t>
       </w:r>
     </w:p>
     <w:p>
@@ -6408,7 +6408,7 @@
     </w:p>
     <w:p>
       <w:r>
-        <w:t>Catarina considered him for some time. Then she took the dead arm in both hands, and rubbed it, briskly, from the shoulder to the wrist, the way you would rub the arm of a child who has come in from the snow, until the blood came back into it in a thousand furious needles and he yelped. She did not let go when it had come back. She held his hand, quite firmly, in her lap, on top of the folder, for the rest of the way to the car.</w:t>
+        <w:t>Catarina considered him. Then she took the dead arm in both hands, and rubbed it, briskly, from the shoulder to the wrist, the way you would rub the arm of a child who has come in from the snow, until the blood came back into it in a thousand furious needles and he yelped. She did not let go when it had come back. She held his hand, quite firmly, in her lap, on top of the folder, for the rest of the way to the car.</w:t>
       </w:r>
     </w:p>
     <w:p>
@@ -6653,7 +6653,7 @@
     </w:p>
     <w:p>
       <w:r>
-        <w:t>He sat and looked at it for some time. Catarina put her hand flat on the table next to the book, not touching it, not touching him, the way she had laid her hand on the window seat on the day she had said her sister's name.</w:t>
+        <w:t>He sat and looked at it. Catarina put her hand flat on the table next to the book, not touching it, not touching him, the way she had laid her hand on the window seat on the day she had said her sister's name.</w:t>
       </w:r>
     </w:p>
     <w:p>
@@ -7525,7 +7525,7 @@
     </w:p>
     <w:p>
       <w:r>
-        <w:t>When Mara had finished, Madame Giraud did not say anything for a while.</w:t>
+        <w:t>When Mara had finished, Madame Giraud was silent.</w:t>
       </w:r>
     </w:p>
     <w:p>
@@ -7690,7 +7690,7 @@
     </w:p>
     <w:p>
       <w:r>
-        <w:t>She did it without any fuss, in her slate-grey jumper and her good trousers, on her day off, and slid under the front of the car on her back, with a torch, the way she had presumably done a hundred times before on a hundred wrecked cars, and was silent under there for some time.</w:t>
+        <w:t>She did it without any fuss, in her slate-grey jumper and her good trousers, on her day off, and slid under the front of the car on her back, with a torch, the way she had presumably done a hundred times before on a hundred wrecked cars, and was silent under there for a full minute.</w:t>
       </w:r>
     </w:p>
     <w:p>
@@ -7760,7 +7760,7 @@
     </w:p>
     <w:p>
       <w:r>
-        <w:t>"He came," said Monsieur Pons. "In June. The week after. He looked at the car. He did not lie down. He asked me, is there anything here, Pons? I said, I have not looked. He said, then do not look. Crush it when the insurance pays." "I did not like him. Fangio did not like him. Fangio likes everybody."</w:t>
+        <w:t>"He came," said Monsieur Pons. "In June. The week after. He looked at the car. He did not lie down. He asked me, is there anything here, Pons? I said, I have not looked. He said, then do not look. Crush it when the insurance pays. I did not like him. Fangio did not like him. Fangio likes everybody."</w:t>
       </w:r>
     </w:p>
     <w:p>
@@ -7778,7 +7778,7 @@
         <w:ind w:firstLine="0"/>
       </w:pPr>
       <w:r>
-        <w:t>They drove back through the dusk with the bag in the boot and nobody saying anything for the first half-hour.</w:t>
+        <w:t>They drove back through the dusk with the sealed hose in the boot and nobody saying anything for the first half-hour.</w:t>
       </w:r>
     </w:p>
     <w:p>
@@ -8040,7 +8040,7 @@
     </w:p>
     <w:p>
       <w:r>
-        <w:t>"Sim." She laid her hand flat on the photograph. "And the old man at the market, with the eels. He says a heron. Three times I walk down the marsh, alone, in the afternoon, when you are writing. Three times I find only reeds, and water, and birds that are only birds." She took a breath. "I do not... confio. Trust. I do not trust this house."</w:t>
+        <w:t>"Sim." She laid her hand flat on the photograph. "And the old man at the market, with the eels. He says a heron. Three times I walk down the marsh, alone, in the afternoon, with a basket, so you will think it is blackberries. Three times I find only reeds, and water, and birds that are only birds." She took a breath. "I do not... confio. Trust. I do not trust this house."</w:t>
       </w:r>
     </w:p>
     <w:p>
@@ -8123,7 +8123,7 @@
     </w:p>
     <w:p>
       <w:r>
-        <w:t>They had it open at midnight. The false back was a second skin of wood, very well made, by a woman who was very good at woodwork and very bad at trusting landlords. Inside, wrapped in oilskin, lay a notebook in Inês's handwriting and a small tape recorder. Inês had written, on the inside of the wood, DO NOT MOVE THIS. TRUST ME. They did not move it. They took what she had hidden, and they put the board back.</w:t>
+        <w:t>They had it open at midnight. The false back was a second skin of wood, very well made, by a woman who was very good at woodwork and very bad at trusting landlords. Inside, wrapped in oilskin, lay a notebook in Inês's handwriting and a small tape recorder. Inês had written, on the inside of the wood, DO NOT MOVE THIS. TRUST ME. They left the false back where it was. They took what she had hidden, and put the board back.</w:t>
       </w:r>
     </w:p>
     <w:p>
@@ -8173,7 +8173,7 @@
     </w:p>
     <w:p>
       <w:r>
-        <w:t>The click. And then Hale again, alone, not smooth now, not kind, in a voice Tobias had never heard him use, the voice of a boy from Croydon who has been caught: "Edouard, she's a friend. I've known her twenty years. Edouard?" Nobody answered him. The tape ran on over a long silence, and then Elise's footsteps came back up the stairs, and Hale said, "Ah, there you are," in his cashmere voice again, and Inês, in the kitchen, must have reached the end of her courage, because the recording stopped.</w:t>
+        <w:t>The click. And then Hale again, alone, not smooth now, not kind, in a voice Tobias had never heard him use, the voice of a boy from Croydon who has been caught: "Edouard, she's a friend. I've known her twenty years. Edouard?" Nobody answered him. The tape ran on over a long silence, and then Elise's footsteps came back up the stairs, and Hale said, "Ah, there you are," in his cashmere voice again, and Inês, coming in with the coffee, must have reached under the seat and reached the end of her courage at the same moment, because the recording stopped.</w:t>
       </w:r>
     </w:p>
     <w:p>
@@ -8374,7 +8374,7 @@
     </w:p>
     <w:p>
       <w:r>
-        <w:t>She laughed, and sat on the edge of the bed, and for a while neither of them said anything at all. Outside, the clock in the hall struck eight. He did not tell her about the fever's arithmetic. A dream that has been explained is only a temperature, and this one had been thirty-nine point four. But he kept the sentence. Halfway, on purpose. He wrote it on the envelope under the typewriter, under the name.</w:t>
+        <w:t>She laughed, and sat on the edge of the bed, and neither of them said anything at all. Outside, the clock in the hall struck eight. He did not tell her about the fever's arithmetic. A dream that has been explained is only a temperature, and this one had been thirty-nine point four. But he kept the sentence. Halfway, on purpose. He wrote it on the envelope under the typewriter, under the name.</w:t>
       </w:r>
     </w:p>
     <w:p>
@@ -8488,12 +8488,12 @@
     </w:p>
     <w:p>
       <w:r>
-        <w:t>"You are not married."</w:t>
-      </w:r>
-    </w:p>
-    <w:p>
-      <w:r>
-        <w:t>"No," said Tobias. "I was thinking it in advance."</w:t>
+        <w:t>"You are married. To the woman with the duvet."</w:t>
+      </w:r>
+    </w:p>
+    <w:p>
+      <w:r>
+        <w:t>"Not for much longer," said Tobias. "I was thinking it in advance."</w:t>
       </w:r>
     </w:p>
     <w:p>
@@ -8604,7 +8604,7 @@
     </w:p>
     <w:p>
       <w:r>
-        <w:t>Somebody was leaning against their car in the hospital car park when they came out, as if he had been there for some time and did not mind, beside a long black saloon with a driver who did not look up. It was the Frenchman from the supper. Close to, he was about fifty, immaculate, in a charcoal suit and a tie the colour of old claret, and he carried a furled black umbrella under a sky that had not held a cloud all day.</w:t>
+        <w:t>Somebody was leaning against their car in the hospital car park when they came out, as if he had been there a while and did not mind, beside a long black saloon with a driver who did not look up. It was the Frenchman from the supper. Close to, he was about fifty, immaculate, in a charcoal suit and a tie the colour of old claret, and he carried a furled black umbrella under a sky that had not held a cloud all day.</w:t>
       </w:r>
     </w:p>
     <w:p>
@@ -8721,7 +8721,7 @@
     </w:p>
     <w:p>
       <w:r>
-        <w:t>There was no ceremony. They carried the contracts out in the bag that had held the figs. In the car Catarina read the top page and did not say I told you. She said, "The woman in your chapter four should not slip."</w:t>
+        <w:t>They carried the contracts out in the bag that had held the figs. In the car Catarina read the top page and did not say I told you. She said, "The woman in your chapter four should not slip."</w:t>
       </w:r>
     </w:p>
     <w:p>
@@ -8736,7 +8736,7 @@
     </w:p>
     <w:p>
       <w:r>
-        <w:t xml:space="preserve">Anselm Brunner arrived at the lake house two evenings later, at eight o'clock, on foot, in the rain, sent, he said, by a juge in Aix who had read the word </w:t>
+        <w:t xml:space="preserve">Anselm Brunner arrived at the lake house two evenings later, at eight o'clock, on foot, in the rain, with an umbrella held at the precise angle of a bayonet. He had been sent, he said, by a juge in Aix who had read the word </w:t>
       </w:r>
       <w:r>
         <w:rPr>
@@ -8745,7 +8745,7 @@
         <w:t>codex</w:t>
       </w:r>
       <w:r>
-        <w:t xml:space="preserve"> in the inventory of a safe deposit box and had telephoned Rome before lunch, with an umbrella held at the precise angle of a bayonet.</w:t>
+        <w:t xml:space="preserve"> in the inventory of a safe deposit box and had telephoned Rome before lunch.</w:t>
       </w:r>
     </w:p>
     <w:p>
@@ -8790,7 +8790,7 @@
     </w:p>
     <w:p>
       <w:r>
-        <w:t>They sat him in the kitchen. He declined tea, accepted water, declined the glass and drank from the tap cup with his back very straight. He then took from his coat an envelope, an old Latin letter, a photograph and a notebook, and laid them in a row on the table, in order of size.</w:t>
+        <w:t>They sat him in the kitchen. He declined tea, accepted water, declined a glass, and drank it from the chipped cup with his back very straight. He then took from his coat an envelope, an old Latin letter, a photograph and a notebook, and laid them in a row on the table, in order of size.</w:t>
       </w:r>
     </w:p>
     <w:p>
@@ -8840,7 +8840,7 @@
     </w:p>
     <w:p>
       <w:r>
-        <w:t>Inspector Mara Quill eyed him across the kitchen table the way a cat eyes a different breed of cat.</w:t>
+        <w:t>Inspector Mara Quill, who had driven over with a copy of the bank inventory and stayed, eyed him across the kitchen table the way a cat eyes a different breed of cat.</w:t>
       </w:r>
     </w:p>
     <w:p>
@@ -8865,7 +8865,7 @@
     </w:p>
     <w:p>
       <w:r>
-        <w:t>"Hale is a cashier," said Mara. She was not, strictly, on the case. She was on the juge's case, which was a different thing, and which existed because Madame Fournier had sat in a procureur's waiting room in her good coat, and Mara had followed her into a magistrate's office in Aix with a rent ledger, a sawn bolt from Lyon and a brake hose from a scrapyard, and had not walked out until it did. She put the Marseille photograph on the table, the one from the lobster restaurant: Hale, and the man with the closed-door face, and the hands buttering a roll. "This one decides. Armand Vial. The foundation is his. The cooler voice on the tape is not Hale's. Inês wrote his first name in the margin in March, before any of us had met him."</w:t>
+        <w:t>"Hale is a cashier," said Mara. She was not, strictly, on the case. She was on the juge's case, which was a different thing, and which existed because Madame Fournier had sat in a procureur's waiting room in her good coat, and Mara had followed her into a magistrate's office in Aix with a rent ledger, a sawn bolt from Lyon and a brake hose from a scrapyard, and had not walked out until it was opened. She put the Marseille photograph on the table, the one from the lobster restaurant: Hale, and the man with the closed-door face, and the hands buttering a roll. "This one decides. Armand Vial. The foundation is his. The cooler voice on the tape is not Hale's. Inês wrote his first name in the margin in March, before any of us knew whose name it was."</w:t>
       </w:r>
     </w:p>
     <w:p>
@@ -8890,7 +8890,7 @@
     </w:p>
     <w:p>
       <w:r>
-        <w:t>He went to Marseille the next morning, by the slow train, with the umbrella. He did not come back for some time.</w:t>
+        <w:t>He went to Marseille the next morning, by the slow train, with the umbrella. He did not come back for nearly a fortnight.</w:t>
       </w:r>
     </w:p>
     <w:p>
@@ -8924,7 +8924,7 @@
     </w:p>
     <w:p>
       <w:r>
-        <w:t>It had been Madame Fournier's washing machine for nineteen years, a heavy white French machine that had survived nineteen winters, a flood, seven tenants and Tobias. It did not survive the thunderbolt. It gave a groan like a dying ox, shuddered through one last spin with the door still locked, sent a thin grey thread of smoke out of its soap drawer, and died, quite visibly, with a small clink, its drum full of Catarina's tea towels.</w:t>
+        <w:t>It had been Madame Fournier's washing machine for nineteen years, a heavy white French machine that had survived a flood, seven tenants and Tobias. It did not survive the thunderbolt. It gave a groan like a dying ox, shuddered through one last spin with the door still locked, sent a thin grey thread of smoke out of its soap drawer, and died, quite visibly, with a small clink, its drum full of Catarina's tea towels.</w:t>
       </w:r>
     </w:p>
     <w:p>
@@ -9154,7 +9154,7 @@
     </w:p>
     <w:p>
       <w:r>
-        <w:t>Madame Fournier came down the garden ten minutes later, in her gardening gloves, because she had seen them from her kitchen window and wished to know what two people in dressing gowns were doing in Henri's terrace at seven in the morning. She stopped at the edge of the grove. She stood there for some time. Then she pulled off one glove and reached up and touched a branch, the way you would touch the sleeve of somebody you had not seen for a while and were not sure you were allowed to speak to.</w:t>
+        <w:t>Madame Fournier came down the garden ten minutes later, in her gardening gloves, because she had seen them from her kitchen window and wished to know what two people in dressing gowns were doing in Henri's terrace at seven in the morning. She stopped at the edge of the grove. She stood there without moving. Then she pulled off one glove and reached up and touched a branch, the way you would touch the sleeve of somebody you had not seen for a while and were not sure you were allowed to speak to.</w:t>
       </w:r>
     </w:p>
     <w:p>
@@ -9192,7 +9192,7 @@
     </w:p>
     <w:p>
       <w:r>
-        <w:t>"Dzień dobry," said Marek, to the house. He looked up at the roof for a long time, as a doctor looks at a patient who has not followed his advice. "Dach jest chory."</w:t>
+        <w:t>"Dzień dobry," said Marek, to the house. He looked up at the roof the way a doctor looks at a patient who has not followed his advice. "Dach jest chory."</w:t>
       </w:r>
     </w:p>
     <w:p>
@@ -9458,7 +9458,7 @@
     </w:p>
     <w:p>
       <w:r>
-        <w:t>He put the receiver down. He stood in the hall for a while.</w:t>
+        <w:t>He put the receiver down. He stood in the hall with his hand still on it.</w:t>
       </w:r>
     </w:p>
     <w:p>
@@ -10217,7 +10217,7 @@
     </w:p>
     <w:p>
       <w:r>
-        <w:t>Mara arrived at a quarter to midnight in a dressing gown, wellington boots and a raincoat, with her service card in one hand and a torch in the other, followed by two gendarmes from Saint-Martin who had been playing cards and had brought the cards. She looked at the pond for a while. She looked at the pelican. She looked at Hugo.</w:t>
+        <w:t>Mara arrived at a quarter to midnight in a dressing gown, wellington boots and a raincoat, with her service card in one hand and a torch in the other, followed by two gendarmes from Saint-Martin who had been playing cards and had brought the cards. She looked at the pond. She looked at the pelican. She looked at Hugo.</w:t>
       </w:r>
     </w:p>
     <w:p>
@@ -10232,7 +10232,7 @@
     </w:p>
     <w:p>
       <w:r>
-        <w:t>She interviewed the Gastons in the kitchen, at the table, wrapped in two of Henri Fournier's army blankets, dripping onto the tiles. They were not difficult to interview. They were, in fact, almost pathetically eager to be interviewed, in the way of men who have spent a long evening being defeated by a child and would like very much to talk to an adult about anything at all.</w:t>
+        <w:t>She interviewed the Gastons in the kitchen, at the table, wrapped in two of Henri Fournier's army blankets, which Madame Fournier had fetched over the wall, dripping onto the tiles. They were not difficult to interview. They were, in fact, almost pathetically eager to be interviewed, in the way of men who have spent a long evening being defeated by a child and would like very much to talk to an adult about anything at all.</w:t>
       </w:r>
     </w:p>
     <w:p>
@@ -10268,7 +10268,7 @@
     </w:p>
     <w:p>
       <w:r>
-        <w:t>"Did you eat them?" said Hugo, from the doorway, in his pyjamas, with interest.</w:t>
+        <w:t>"Did you eat the calissons?" said Hugo, from the doorway, in his pyjamas, with interest.</w:t>
       </w:r>
     </w:p>
     <w:p>
@@ -10307,16 +10307,16 @@
         <w:t>Poisonous Plants of the Mediterranean</w:t>
       </w:r>
       <w:r>
-        <w:t xml:space="preserve">, and delivered him to Priscilla and Nigel, who had come back from their rehearsal to an empty house and a note on the kitchen table in Hugo's handwriting that said, in full, </w:t>
+        <w:t xml:space="preserve">, and delivered him to Priscilla and Nigel, who had come back from their rehearsal to a message on the answering machine, in Hugo's own voice, that said, in full, </w:t>
       </w:r>
       <w:r>
         <w:rPr>
           <w:i/>
         </w:rPr>
-        <w:t>At Tobias's. Burglars. Fine. H.</w:t>
-      </w:r>
-      <w:r>
-        <w:t>, and who were standing in the drive in their coats, Priscilla still in half her Dame's make-up and Nigel still in the back legs of a horse.</w:t>
+        <w:t>It's Hugo. Burglars. Fine. Don't come,</w:t>
+      </w:r>
+      <w:r>
+        <w:t xml:space="preserve"> and who were standing in the drive in their coats, Priscilla still in half her Dame's make-up and Nigel still in the back legs of a horse.</w:t>
       </w:r>
     </w:p>
     <w:p>
@@ -10405,7 +10405,7 @@
     </w:p>
     <w:p>
       <w:r>
-        <w:t>"In the afternoons," he said. "When anybody could see you go. From the road, from the lane, from a car parked at the top of it. She'd have seen you too. And she'd have stayed in, because she's careful, because you're being watched, and if she came out they'd have two of you." He turned round. "Baptistin's hut is on the channel. The torch I saw was on the channel. She isn't hiding from you. She's hiding from whoever's watching you. So we don't walk down the bank in daylight like people looking for somebody. We go by water, at dawn, before anybody's at the top of the lane, and we take everything with us, the tape and the notebook, because Hale has just told us he's coming back, and I'm not leaving them in a house that every crook in the Bouches-du-Rhône seems to have the address of."</w:t>
+        <w:t>"In the afternoons," he said. "When anybody could see you go. From the road, from the lane, from a car parked at the top of it. She'd have seen you too. And she'd have stayed in, because she's careful, because you're being watched, and if she came out they'd have two of you." He turned round. "Baptistin's hut is on the channel. The torch I saw was on the channel. She isn't hiding from you. She's hiding from whoever's watching you. So we don't walk down the bank in daylight like people looking for somebody. We go by water, at dawn, before anybody's at the top of the lane, and we take the tape and the notebook out of Odile's tin and keep them on us, because somebody has already moved that tin an inch, and Hale has just told us he's coming back."</w:t>
       </w:r>
     </w:p>
     <w:p>
@@ -10625,7 +10625,7 @@
         <w:t>Edouard, she's a friend. I've known her twenty years. Edouard?</w:t>
       </w:r>
       <w:r>
-        <w:t>" Hale's face did something terrible and small. "It's on a tape, Victor. Inês made it. Nobody answered you that night. You stood in an empty room and asked for her, and nobody answered." Tobias held his eyes. "I'm answering. That's all this is. Somebody's finally asking you back."</w:t>
+        <w:t>" Hale's face did something terrible and small. "It's on a tape, Victor. Inês made it. Nobody answered you that night. You stood in an empty room and asked for him, and nobody answered." Tobias held his eyes. "I'm answering. That's all this is."</w:t>
       </w:r>
     </w:p>
     <w:p>
@@ -10645,7 +10645,7 @@
     </w:p>
     <w:p>
       <w:r>
-        <w:t>One of the gendarmes put a hand on his arm, quite gently, the way Hale had once put a hand under Elise's elbow on the second step, and Hale looked down at the hand as if he recognised it.</w:t>
+        <w:t>One of the gendarmes put a hand on Hale's arm, quite gently, the way Hale had once put a hand under Elise's elbow on the second step, and Hale looked down at the hand as if he recognised it.</w:t>
       </w:r>
     </w:p>
     <w:p>
@@ -10655,7 +10655,7 @@
     </w:p>
     <w:p>
       <w:r>
-        <w:t>"Não é só papel," she said to him.</w:t>
+        <w:t>"Não é só papel," she said to Tobias.</w:t>
       </w:r>
     </w:p>
     <w:p>
@@ -10935,7 +10935,7 @@
         <w:ind w:firstLine="0"/>
       </w:pPr>
       <w:r>
-        <w:t>Nobody said anything for a long time. Madame Fournier had stopped knitting. Catarina stood at the stove with her back to the room and her hands flat on the rail, as she had stood at the sink on the day Hale came. Gigi, under the table, put her chin on Inês's foot.</w:t>
+        <w:t>Nobody said anything. Madame Fournier had stopped knitting. Catarina stood at the stove with her back to the room and her hands flat on the rail, as she had stood at the sink on the day Hale came. Gigi, under the table, put her chin on Inês's foot.</w:t>
       </w:r>
     </w:p>
     <w:p>
@@ -11003,7 +11003,7 @@
     </w:p>
     <w:p>
       <w:r>
-        <w:t>"I did not know his name. I knew he knew Monsieur Hale. I knew that if I went to the police, I would be going to his police." Inês sat back. "So I stayed in the hut. For seven months. Baptistin brought me bread and eels and newspapers and did not ask anything. I worked nights at the bakery in Saint-Martin, washing the trays, for cash. Gigi found me in June. She was a stray. She does not like strangers. She makes exceptions for tins." The dog thumped her tail once under the table, hearing her name. "I watched the house. I saw the new tenant come, an Englishman with a typewriter. I saw my sister come, in September, with her bag, and get out of a taxi, and stand at the gate, and look at the jetty for some time. I nearly ran up the lane. I nearly did, every day." Her voice cracked for the first time, very slightly, and steadied. "But I thought, if I go to her, they will know where I am, and they will know she knows. So I watched. I watched her go into the lake after his pages. I watched her peg them on a line. I watched her sit on the jetty with him at night with the binoculars, looking at birds." She glanced at Tobias, and then away. "I watched her hold his hand. Under the stars. On the night the lights went out."</w:t>
+        <w:t>"I did not know his name. I knew he knew Monsieur Hale. I knew that if I went to the police, I would be going to his police." Inês sat back. "So I stayed in the hut. For seven months. Baptistin brought me bread and eels and newspapers and did not ask anything. I worked nights at the bakery in Saint-Martin, washing the trays, for cash. Gigi found me in June. She was a stray. She does not like strangers. She makes exceptions for tins." The dog thumped her tail once under the table, hearing her name. "I watched the house. I saw the new tenant come, an Englishman with a typewriter. I saw my sister come, in September, with her bag, and get out of a taxi, and stand at the gate, and look at the jetty. I nearly ran up the lane. I nearly did, every day." Her voice cracked for the first time, very slightly, and steadied. "But I thought, if I go to her, they will know where I am, and they will know she knows. So I watched. I watched her go into the lake after his pages. I watched her peg them on a line. I watched her sit on the jetty with him at night with the binoculars, looking at birds." She glanced at Tobias, and then away. "I watched her hold his hand. Under the stars. On the night the lights went out."</w:t>
       </w:r>
     </w:p>
     <w:p>
@@ -11062,7 +11062,7 @@
     </w:p>
     <w:p>
       <w:r>
-        <w:t>He walked down to the jetty. He stood at the end of it, by the ladder, where a man had knelt with his arms in the water to the elbow for a very long time, and where Inês had held her friend on the ladder until a light came on up the lane. The water was a metre and a half deep. The planks were oak, and sound. He looked down into it for a while.</w:t>
+        <w:t>He walked down to the jetty. He stood at the end of it, by the ladder, where a man had knelt with his arms in the water to the elbow for a very long time, and where Inês had held her friend on the ladder until a light came on up the lane. The water was a metre and a half deep. The planks were oak, and sound. He looked down into it.</w:t>
       </w:r>
     </w:p>
     <w:p>
@@ -11485,7 +11485,7 @@
     </w:p>
     <w:p>
       <w:r>
-        <w:t>Then Mara put a hand on his elbow, courteously, firmly, like a man helping an old lady across a road, and he got into the car.</w:t>
+        <w:t>Then Mara put a hand on his elbow, courteously, firmly, the way you help an old lady across a road, and he got into the car.</w:t>
       </w:r>
     </w:p>
     <w:p>
@@ -11765,7 +11765,7 @@
     </w:p>
     <w:p>
       <w:r>
-        <w:t>"Mr Lind. Miss Vidal." He bowed from the waist, the bow nobody had given Tobias since he was a child at a pantomime. "The Holy See will write to you. It will be a very short letter. Two lines, perhaps. It will say thank you, and it will say that we have prayed for you." He paused. "It will not be enough. I wish to say that myself, now, so that when the letter comes, you will know that somebody in Rome knew it was not enough."</w:t>
+        <w:t>"Mr Lind. Miss Vidal." He bowed from the waist, as he had on the porch on the first evening. "The Holy See will write to you. It will be a very short letter. Two lines, perhaps. It will say thank you, and it will say that we have prayed for you." He paused. "It will not be enough. I wish to say that myself, now, so that when the letter comes, you will know that somebody in Rome knew it was not enough."</w:t>
       </w:r>
     </w:p>
     <w:p>
@@ -11829,7 +11829,7 @@
     </w:p>
     <w:p>
       <w:r>
-        <w:t xml:space="preserve">"And April," Mara went on. "The eleventh, the night Aubry fell in Lyon. At eleven fifty-two, a call from Delacroix's mobile to Moutet's. Ninety seconds. Delacroix's mobile was in Lyon at the time; the operator can tell you which mast. Moutet's was at home, in bed, beside his wife, who does pottery." She set the cup down. "And on the fourteenth of April, three days later, Moutet drove to Lyon, which is not his jurisdiction and four hours away, in a service car, and filled in a mileage claim for it, which he signed with his very good pen, and on which he described the purpose of the journey as </w:t>
+        <w:t xml:space="preserve">"And April," Mara went on. "The eleventh, the night Aubry fell in Lyon. At eleven fifty-two, a call from Delacroix's mobile to Moutet's. Ninety seconds. Delacroix's mobile was in Lyon at the time; the operator can tell you which mast. Moutet's was at home, in bed, beside his wife, who does pottery." She set the cup down. "And on the fourteenth of April, three days later, Moutet drove to Lyon, which is not his jurisdiction and three hours away, in a service car, and filled in a mileage claim for it, which he signed with his very good pen, and on which he described the purpose of the journey as </w:t>
       </w:r>
       <w:r>
         <w:rPr>
@@ -12080,7 +12080,7 @@
     </w:p>
     <w:p>
       <w:r>
-        <w:t>Nobody said anything for a while.</w:t>
+        <w:t>Nobody said anything.</w:t>
       </w:r>
     </w:p>
     <w:p>
@@ -12118,7 +12118,7 @@
     </w:p>
     <w:p>
       <w:r>
-        <w:t>"I like it here," she said, to Tobias, on the jetty, on a cold bright afternoon at the end of November, when she had driven over on her day off with no reason except, she said, that she wanted to see the pelican. "I like the valley. I like the lake, or the pond, or whatever Madame Fournier says it is this week. I like the baker who thinks a man who buys nothing is confessing. I like that I know which roundabout the English always go round the wrong way." She looked out at the water. "And there's a new commandant coming in January. From Lyon. A woman. The juge says she's very good and very difficult and asks for everything in writing. I'd like to work for somebody like that before I'm too old to be surprised."</w:t>
+        <w:t>"I like it here," she said, to Tobias, on the jetty, on a cold bright afternoon in the first week of December, when she had driven over on her day off with no reason except, she said, that she wanted to see the pelican. "I like the valley. I like the lake, or the pond, or whatever Madame Fournier says it is this week. I like the baker who thinks a man who buys nothing is confessing. I like that I know which roundabout the English always go round the wrong way." She looked out at the water. "And there's a new commandant coming in January. From Lyon. A woman. The juge says she's very good and very difficult and asks for everything in writing. I'd like to work for somebody like that before I'm too old to be surprised."</w:t>
       </w:r>
     </w:p>
     <w:p>
@@ -12148,7 +12148,7 @@
     </w:p>
     <w:p>
       <w:r>
-        <w:t>"There's a race on Sunday," said Mara. "At the Catalans. The juge swims there too. On Sundays, in November. That's how I know her, actually. Not from work. From standing on a beach in a coat watching a sixty-year-old magistrate walk into the Mediterranean in a black costume and a white cap as if she were walking into a courtroom." She smiled, properly, for the first time that afternoon. "She asked me last week if I'd like to swim with her. After Lily's race. In the sea. In November."</w:t>
+        <w:t>"There's a race on Sunday," said Mara. "At the Catalans. The juge swims there too. On Sundays, all winter. That's how I know her, actually. Not from work. From standing on a beach in a coat watching a sixty-year-old magistrate walk into the Mediterranean in a black costume and a white cap as if she were walking into a courtroom." She smiled, properly, for the first time that afternoon. "She asked me last week if I'd like to swim with her. After Lily's race. In the sea. In December."</w:t>
       </w:r>
     </w:p>
     <w:p>
@@ -12178,7 +12178,7 @@
     </w:p>
     <w:p>
       <w:r>
-        <w:t>She went back up the three stone steps and the lawn to her small grey car, and drove away down the lane, carefully, at the speed limit, without scraping anything, and on the passenger seat beside her, Tobias was almost sure, as the car turned at the gate, he saw a white swimming cap and a small pair of blue goggles, side by side, like two people who have finally agreed to go somewhere together.</w:t>
+        <w:t>She went back up the three stone steps and the lawn to her small grey car, and drove away down the lane, carefully, at the speed limit, without scraping anything, and as the car turned at the gate Tobias was almost sure he saw, on the passenger seat beside her, a white swimming cap and a small pair of blue goggles, side by side, like two people who have finally agreed to go somewhere together.</w:t>
       </w:r>
     </w:p>
     <w:p>
@@ -12585,7 +12585,7 @@
     </w:p>
     <w:p>
       <w:r>
-        <w:t>They did not say anything for some time. Catarina's arm was through his. She had put it there at the door of the village hall without asking, and he had not mentioned it, and it had stayed.</w:t>
+        <w:t>They walked in silence. Catarina's arm was through his. She had put it there at the door of the village hall without asking, and he had not mentioned it, and it had stayed.</w:t>
       </w:r>
     </w:p>
     <w:p>
@@ -12605,7 +12605,7 @@
     </w:p>
     <w:p>
       <w:r>
-        <w:t>He had spent three days on it. He had spent three days at the typewriter with both dictionaries open and the children's phrasebook and a grammar he had bought in Aix, typing, and crossing out, and typing again, while the Olivetti, he felt, watched him with an expression of the deepest Italian scepticism. It was nine lines long. It was the longest thing he had ever written in a language other than his own. It was, he was quite certain, full of mistakes.</w:t>
+        <w:t>He had spent three days on it, at the typewriter, with both dictionaries open and the children's phrasebook and a grammar he had bought in Aix, typing, and crossing out, and typing again, while the Olivetti, he felt, watched him with an expression of the deepest Italian scepticism. It was nine lines long. It was the longest thing he had ever written in a language other than his own. It was, he was quite certain, full of mistakes.</w:t>
       </w:r>
     </w:p>
     <w:p>
@@ -12878,7 +12878,7 @@
     </w:p>
     <w:p>
       <w:r>
-        <w:t>Tobias stood at the gate for a while with the corrected letter in his hand, under the three women waiting for their ship, until he could not feel his feet. Then he went in, and found the bacalhau, which she had already bought, he discovered, a week ago, and hidden at the back of the cold larder wrapped in a tea towel, and put it in a bowl of cold water, and set an alarm on the Olivetti's bell, by an arrangement of string and a clothes peg that would have impressed Hugo, for three o'clock in the morning.</w:t>
+        <w:t>Tobias stood at the gate with the corrected letter in his hand, under the three women waiting for their ship, until he could not feel his feet. Then he went in, and found the bacalhau, which she had already bought, he discovered, a week ago, and hidden at the back of the cold larder wrapped in a tea towel, and put it in a bowl of cold water, and set an alarm on the Olivetti's bell, by an arrangement of string and a clothes peg that would have impressed Hugo, for three o'clock in the morning.</w:t>
       </w:r>
     </w:p>
     <w:p>
@@ -12975,7 +12975,7 @@
     </w:p>
     <w:p>
       <w:r>
-        <w:t>The Gastons got eighteen months each, suspended, and an order not to come within five kilometres of the lake, which the second Gaston, the one who falls, said in a small voice he had no intention of doing ever again, as there were children there. As they were led out, the first Gaston was heard to say to the second, with a kind of broken wonder, "Gaston. I think we should retire."</w:t>
+        <w:t>The Gastons got eighteen months each, suspended, and an order not to come within five kilometres of the lake, which, the second Gaston said in a small voice, he had no intention of breaking, as there were children there. As they were led out, the first Gaston was heard to say to the second, with a kind of broken wonder, "Gaston. I think we should retire."</w:t>
       </w:r>
     </w:p>
     <w:p>
@@ -13127,7 +13127,7 @@
     </w:p>
     <w:p>
       <w:r>
-        <w:t>Monsieur Lemaire, in his cardigan, without the cat, repeated what he had told Dona Graça and the commandant with the very good pen and Tobias and Catarina, in the same words, in the same order, like a train timetable, and when the defence asked whether, at seventy-one, doing the crossword, he could really be sure it was an umbrella and not a walking stick, he looked at the lawyer for a long time and said, "Maître, I worked at Lyon airport for thirty-one years. I know the difference between an umbrella and a walking stick. Do you?" and sat down, and was not asked anything else.</w:t>
+        <w:t>Monsieur Lemaire, in his cardigan, without the cat, repeated what he had told Dona Graça and the commandant with the very good pen and Tobias and Catarina, in the same words, in the same order, like a train timetable, and when the defence asked whether, at seventy-one, doing the crossword, he could really be sure it was an umbrella and not a walking stick, he looked at the lawyer over his glasses and said, "Maître, I worked at Lyon airport for thirty-one years. I know the difference between an umbrella and a walking stick. Do you?" and sat down, and was not asked anything else.</w:t>
       </w:r>
     </w:p>
     <w:p>
@@ -13156,7 +13156,7 @@
     </w:p>
     <w:p>
       <w:r>
-        <w:t>Maître Barbier, now seventy and retired by law, with his arm healed and his temper not, told the court that the assignment of the Marchetti rights had been brought to his office in Aix for registration two days after Valentina Marchetti's death, by Maître Delacroix-Roux personally, and that he had registered it because the signatures were in order and the witness was a member of the bar, and that three weeks later Elise Marchetti had come to his office with her mother's medical file and asked him how a woman who had not recognised her own daughter for two years had managed to sign her name so beautifully, three days before she died. "I had no answer," said Maître Barbier. "I have been a notary for forty-four years. I had no answer. So I put the originals in my safe, and I told her to come back with a lawyer, and I was afraid." He looked at the dock. "And then she drowned. And Giraud drove off a bridge. And two men came for my safe with an owl."</w:t>
+        <w:t>Maître Barbier, now seventy and retired by law, with his arm healed and his temper not, told the court that the assignment of the Marchetti rights had been brought to his office in Aix for registration two days after Valentina Marchetti's death, by Maître Delacroix-Roux personally, and that he had registered it because the signatures were in order and the witness was a member of the bar, and that two years later, in February, Elise Marchetti had come to his office with her mother's medical file and asked him how a woman who had not recognised her own daughter for two years had managed to sign her name so beautifully, three days before she died. "I had no answer," said Maître Barbier. "I have been a notary for forty-four years. I had no answer. So I put the originals in my safe, and I told her to come back with a lawyer, and I was afraid." He looked at the dock. "And then she drowned. And Giraud drove off a bridge. And two men came for my safe with an owl."</w:t>
       </w:r>
     </w:p>
     <w:p>
@@ -13251,7 +13251,7 @@
     </w:p>
     <w:p>
       <w:r>
-        <w:t xml:space="preserve">He had done that once before, Tobias realised, on the first morning, when the court, as French courts do before they hear a single fact, had heard who the accused was. The investigator who had prepared the report on his personality, a tired woman with a ring binder, had read it out in a flat voice. Born Edouard Roux, in 1973, in the concierge's lodge of a building on the Cours Mirabeau. Mother concierge there for thirty-one years; now ninety-one, in a home on the road to Éguilles, visited every Sunday without fail, with calissons. Schooling paid for by a tenant of the building, a young avocat named Armand Vial. The name Delacroix taken at the oath, from a bâtonnier on the first floor. </w:t>
+        <w:t xml:space="preserve">He had done that once before, Tobias realised, on the first morning, when the court, as French courts do before they hear a single fact, had heard who the accused was. The investigator who had prepared the report on his personality, a tired woman with a ring binder, had read it out in a flat voice. Born Edouard Roux, in 1974, in the concierge's lodge of a building on the Cours Mirabeau. Mother concierge there for thirty-one years; now ninety-one, in a home on the road to Éguilles, visited every Sunday without fail, with calissons. Schooling paid for by a tenant of the building, a young avocat named Armand Vial. The name Delacroix taken at the oath, from a bâtonnier on the first floor. </w:t>
       </w:r>
       <w:r>
         <w:rPr>
@@ -13288,7 +13288,7 @@
     </w:p>
     <w:p>
       <w:r>
-        <w:t>He told the court that he had been a small publisher with large debts when Armand Vial had first come to him, eleven years ago, with the idea of a prize. He told them about the sixty pounds, and the sacks, and the anthology, and the house by the lake he had rented for eleven hundred and let for three thousand, because, he said, once you have begun to take money from people who trust you, it becomes very difficult to see why you should stop at writers. He told them about Valentina Marchetti's estate, and the backlist, and the book of hours in her bedroom that she thought was her missal, and the assignment that Delacroix had drafted and taken to her bedside in Lyon, with a pen.</w:t>
+        <w:t>He told the court that he had been a small publisher with large debts when Armand Vial had first come to him, ten years ago, with the idea of a prize. He told them about the sixty pounds, and the sacks, and the anthology, and the house by the lake he had rented for eleven hundred and let for three thousand, because, he said, once you have begun to take money from people who trust you, it becomes very difficult to see why you should stop at writers. He told them about Valentina Marchetti's estate, and the backlist, and the book of hours in her bedroom that she thought was her missal, and the assignment that Delacroix had drafted and taken to her bedside in Lyon, with a pen.</w:t>
       </w:r>
     </w:p>
     <w:p>
@@ -13570,7 +13570,7 @@
     </w:p>
     <w:p>
       <w:r>
-        <w:t>She was quiet for a while. Then she looked up at him with her serious dark eyes, and he saw that she was trying not to laugh.</w:t>
+        <w:t>She was quiet. Then she looked up at him with her serious dark eyes, and he saw that she was trying not to laugh.</w:t>
       </w:r>
     </w:p>
     <w:p>
@@ -13726,7 +13726,7 @@
         <w:ind w:firstLine="0"/>
       </w:pPr>
       <w:r>
-        <w:t>Tobias's parents arrived the morning after the verdict, unannounced, in a hired Fiat from Marseille airport, with one suitcase, a Tupperware of flapjacks, and the expression of two people who had been on an aeroplane for the first time since 1998 and had not enjoyed it.</w:t>
+        <w:t>Tobias's parents arrived three days after the verdict, unannounced, in a hired Fiat from Marseille airport, with one suitcase, a Tupperware of flapjacks, and the expression of two people who had been on an aeroplane for the first time since 1998 and had not enjoyed it.</w:t>
       </w:r>
     </w:p>
     <w:p>
@@ -13927,7 +13927,7 @@
     </w:p>
     <w:p>
       <w:r>
-        <w:t>"Margaret. I know what you think. You think, a woman from another country, with no money, who cleans his house. You think I will take your son and break his heart, or that he will take me and break mine." She paused. "You are right to be afraid. I am also afraid. In my family, a woman who marries an Englishman is a woman who has lost her mind. My grandmother says so. She has said so four times this week, on the telephone, at seven in the morning." She almost smiled. "But I have read all of his books. Slowly. With a dictionary. The first one is not good. The second is better. The third has a detective who looks like a man who sells double glazing. And in the new one, the one that went into the lake, there is a page about a woman who walks into the water after a manuscript, and I thought: this man, he does not know how to say thank you. But he knows how to write it down. And I thought, I would like to be written down."</w:t>
+        <w:t>"Margaret. I know what you think. You think, a woman from another country, with no money, who cleans his house. You think I will take your son and break his heart, or that he will take me and break mine." She paused. "You are right to be afraid. I am also afraid. In my family, a woman who marries an Englishman is a woman who has lost her mind. My grandmother says so. She has said so four times this week, on the telephone, at seven in the morning." She almost smiled. "But I have read all of his books. Slowly. With a dictionary. The first one is not good. The second is better. The third has a detective who looks like a man who sells double glazing. And in the new one, the one he gave me on the steps, there is a page about a woman who walks into the water after a manuscript, and I thought: this man, he does not know how to say thank you. But he knows how to write it down. And I thought, I would like to be written down."</w:t>
       </w:r>
     </w:p>
     <w:p>
@@ -13967,7 +13967,7 @@
     </w:p>
     <w:p>
       <w:r>
-        <w:t xml:space="preserve">"Four minutes. With the cosy. The milk is after." Catarina folded her hands again. "I learned in October. From a book in English, for children, with a picture of a bear. Tobias makes it very badly. He puts the bag in the cup and says </w:t>
+        <w:t xml:space="preserve">"Four minutes. With the cosy. The milk is after." Catarina folded her hands again. "I learned in November. From a book in English, for children, with a picture of a bear. Tobias makes it very badly. He puts the bag in the cup and says </w:t>
       </w:r>
       <w:r>
         <w:rPr>
@@ -13981,7 +13981,7 @@
     </w:p>
     <w:p>
       <w:r>
-        <w:t>Margaret looked at her son for some time, with the expression of a woman who has found out, forty-six years late, exactly where she went wrong.</w:t>
+        <w:t>Margaret looked at her son with the expression of a woman who has found out, forty-six years late, exactly where she went wrong.</w:t>
       </w:r>
     </w:p>
     <w:p>
@@ -14092,7 +14092,7 @@
     </w:p>
     <w:p>
       <w:r>
-        <w:t>They went out from an office in Aix rented by the court-appointed administrator of the frozen assets of the Verrane Foundation, the Fondation Vial pour les Lettres, Hale Books (Marseille) and Hale Retreats of the Channel Islands, a dry, careful, bespectacled man named Monsieur Ferrand who had spent the spring reading eleven sacks of Highly Commended letters and, he admitted to the juge, had not slept well since. There were eleven thousand four hundred of them, one to every writer who had ever paid sixty pounds to be told they had not won, and they had been translated into nine languages, and they said, in each of them, more or less the same thing.</w:t>
+        <w:t>They went out from an office in Aix rented by the court-appointed administrator of the frozen assets of the Verrane Foundation, the Fondation Vial pour les Lettres, Hale Books (Marseille) and Hale Retreats of the Channel Islands, a dry, careful, bespectacled man named Monsieur Ferrand who had spent the spring reading the sacks of Highly Commended letters and, he admitted to the juge, had not slept well since. There were eleven thousand four hundred of them, one to every writer who had ever paid sixty pounds to be told they had not won, and they had been translated into nine languages, and they said, in each of them, more or less the same thing.</w:t>
       </w:r>
     </w:p>
     <w:p>
@@ -14170,7 +14170,7 @@
     </w:p>
     <w:p>
       <w:r>
-        <w:t>Not from Hale Books, which no longer existed, but from a small, fierce, underfunded publisher in Edinburgh run by a woman who had worked with Elise for nine years and had wept, she told Tobias on the telephone, for the whole of the first chapter and the whole of the last, and laughed for most of the middle, and had found forty-one missing commas, which she had put back. The advance was four thousand pounds. It was a tenth of what Victor Hale had offered. Tobias had accepted it in less than a minute, and had then sat on the bottom stair with the telephone in his lap, in exactly the place where he had sat with Hale's contract in October, and laughed until Catarina came out of the kitchen to see whether he was dying.</w:t>
+        <w:t>Not from Hale Books, which no longer existed, but from a small, fierce, underfunded publisher in Edinburgh run by a woman who had worked with Elise for nine years and had wept, she told Tobias on the telephone, for the whole of the first chapter and the whole of the last, and laughed for most of the middle, and had found thirty-eight missing commas, which she had put back. The advance was four thousand pounds. It was a tenth of what Victor Hale had offered. Tobias had accepted it in less than a minute, and had then sat on the bottom stair with the telephone in his lap, in exactly the place where he had sat with Hale's contract in October, and laughed until Catarina came out of the kitchen to see whether he was dying.</w:t>
       </w:r>
     </w:p>
     <w:p>

</xml_diff>

<commit_message>
Merge 'In Love with Murder, Actually' folder from book-2-lectures-after-qed 774c148 (fresh reread ch21-epilogue, docx rebuilt)
</commit_message>
<xml_diff>
--- a/In Love with Murder, Actually/In_Love_with_Murder_Actually.docx
+++ b/In Love with Murder, Actually/In_Love_with_Murder_Actually.docx
@@ -1268,7 +1268,7 @@
         <w:fldChar w:fldCharType="separate"/>
       </w:r>
       <w:r>
-        <w:t xml:space="preserve">194</w:t>
+        <w:t xml:space="preserve">193</w:t>
       </w:r>
       <w:r>
         <w:fldChar w:fldCharType="end"/>
@@ -1300,7 +1300,7 @@
         <w:fldChar w:fldCharType="separate"/>
       </w:r>
       <w:r>
-        <w:t xml:space="preserve">202</w:t>
+        <w:t xml:space="preserve">201</w:t>
       </w:r>
       <w:r>
         <w:fldChar w:fldCharType="end"/>
@@ -1332,7 +1332,7 @@
         <w:fldChar w:fldCharType="separate"/>
       </w:r>
       <w:r>
-        <w:t xml:space="preserve">214</w:t>
+        <w:t xml:space="preserve">213</w:t>
       </w:r>
       <w:r>
         <w:fldChar w:fldCharType="end"/>
@@ -1364,7 +1364,7 @@
         <w:fldChar w:fldCharType="separate"/>
       </w:r>
       <w:r>
-        <w:t xml:space="preserve">220</w:t>
+        <w:t xml:space="preserve">219</w:t>
       </w:r>
       <w:r>
         <w:fldChar w:fldCharType="end"/>
@@ -1396,7 +1396,7 @@
         <w:fldChar w:fldCharType="separate"/>
       </w:r>
       <w:r>
-        <w:t xml:space="preserve">231</w:t>
+        <w:t xml:space="preserve">230</w:t>
       </w:r>
       <w:r>
         <w:fldChar w:fldCharType="end"/>
@@ -1428,7 +1428,7 @@
         <w:fldChar w:fldCharType="separate"/>
       </w:r>
       <w:r>
-        <w:t xml:space="preserve">241</w:t>
+        <w:t xml:space="preserve">240</w:t>
       </w:r>
       <w:r>
         <w:fldChar w:fldCharType="end"/>
@@ -1460,7 +1460,7 @@
         <w:fldChar w:fldCharType="separate"/>
       </w:r>
       <w:r>
-        <w:t xml:space="preserve">253</w:t>
+        <w:t xml:space="preserve">252</w:t>
       </w:r>
       <w:r>
         <w:fldChar w:fldCharType="end"/>
@@ -1492,7 +1492,7 @@
         <w:fldChar w:fldCharType="separate"/>
       </w:r>
       <w:r>
-        <w:t xml:space="preserve">267</w:t>
+        <w:t xml:space="preserve">266</w:t>
       </w:r>
       <w:r>
         <w:fldChar w:fldCharType="end"/>
@@ -1524,7 +1524,7 @@
         <w:fldChar w:fldCharType="separate"/>
       </w:r>
       <w:r>
-        <w:t xml:space="preserve">273</w:t>
+        <w:t xml:space="preserve">272</w:t>
       </w:r>
       <w:r>
         <w:fldChar w:fldCharType="end"/>
@@ -1556,7 +1556,7 @@
         <w:fldChar w:fldCharType="separate"/>
       </w:r>
       <w:r>
-        <w:t xml:space="preserve">279</w:t>
+        <w:t xml:space="preserve">278</w:t>
       </w:r>
       <w:r>
         <w:fldChar w:fldCharType="end"/>
@@ -1880,7 +1880,7 @@
     </w:p>
     <w:p>
       <w:r>
-        <w:t>He had pinned the three names to the study wall with red string, as detectives do in films. It was a dramatic arrangement. He stepped back to admire it, and the string, the pins, the three photographs and, as it turned out, the left-hand curtain all came down on him at once, and he stood for some time in a shroud of toile de Jouy, wondering where it had all gone wrong.</w:t>
+        <w:t>He had pinned the three names to the study wall with red string, as detectives do in films. It was a dramatic arrangement. He stepped back to admire it, and the string, the pins, the three photographs and, as it turned out, the left-hand curtain all came down on him at once, and he stood in a shroud of toile de Jouy, wondering where it had all gone wrong.</w:t>
       </w:r>
     </w:p>
     <w:p>
@@ -2785,7 +2785,7 @@
     </w:p>
     <w:p>
       <w:r>
-        <w:t>Later, after she had gone up, he sat for some time in the study with the lamp on, at the window, looking down at the end of the jetty, which he could not see, which was only a darker line on dark water. At midnight he saw a torch come on, briefly, on the far shore, where the pond narrowed into the reeds and became the marsh, and go off again. He watched for a while. It did not come back. He told himself it was an eel-fisher, or a poacher, or a man looking for his dog.</w:t>
+        <w:t>Later, after she had gone up, he sat on in the study with the lamp on, at the window, looking down at the end of the jetty, which he could not see, which was only a darker line on dark water. At midnight he saw a torch come on, briefly, on the far shore, where the pond narrowed into the reeds and became the marsh, and go off again. He watched for a while. It did not come back. He told himself it was an eel-fisher, or a poacher, or a man looking for his dog.</w:t>
       </w:r>
     </w:p>
     <w:p>
@@ -3910,7 +3910,7 @@
     </w:p>
     <w:p>
       <w:r>
-        <w:t>At that moment, fate intervened, as fate in the south of France often does, in the form of a bird. A flamingo that had been wading in the shallows beyond the terrace for some time with a look of mild interest decided that the Hargreaveses' table was an excellent place to be, strolled up the steps with the confidence of a bailiff, and lowered its enormous bent beak into Mr Hargreaves's soup.</w:t>
+        <w:t>At that moment, fate intervened, as fate in the south of France often does, in the form of a bird. A flamingo that had been wading in the shallows beyond the terrace all through lunch with a look of mild interest decided that the Hargreaveses' table was an excellent place to be, strolled up the steps with the confidence of a bailiff, and lowered its enormous bent beak into Mr Hargreaves's soup.</w:t>
       </w:r>
     </w:p>
     <w:p>
@@ -4939,7 +4939,7 @@
     </w:p>
     <w:p>
       <w:r>
-        <w:t>The three of them looked at it for some time.</w:t>
+        <w:t>The three of them looked at it.</w:t>
       </w:r>
     </w:p>
     <w:p>
@@ -6408,7 +6408,7 @@
     </w:p>
     <w:p>
       <w:r>
-        <w:t>Catarina considered him for some time. Then she took the dead arm in both hands, and rubbed it, briskly, from the shoulder to the wrist, the way you would rub the arm of a child who has come in from the snow, until the blood came back into it in a thousand furious needles and he yelped. She did not let go when it had come back. She held his hand, quite firmly, in her lap, on top of the folder, for the rest of the way to the car.</w:t>
+        <w:t>Catarina considered him. Then she took the dead arm in both hands, and rubbed it, briskly, from the shoulder to the wrist, the way you would rub the arm of a child who has come in from the snow, until the blood came back into it in a thousand furious needles and he yelped. She did not let go when it had come back. She held his hand, quite firmly, in her lap, on top of the folder, for the rest of the way to the car.</w:t>
       </w:r>
     </w:p>
     <w:p>
@@ -6653,7 +6653,7 @@
     </w:p>
     <w:p>
       <w:r>
-        <w:t>He sat and looked at it for some time. Catarina put her hand flat on the table next to the book, not touching it, not touching him, the way she had laid her hand on the window seat on the day she had said her sister's name.</w:t>
+        <w:t>He sat and looked at it. Catarina put her hand flat on the table next to the book, not touching it, not touching him, the way she had laid her hand on the window seat on the day she had said her sister's name.</w:t>
       </w:r>
     </w:p>
     <w:p>
@@ -7525,7 +7525,7 @@
     </w:p>
     <w:p>
       <w:r>
-        <w:t>When Mara had finished, Madame Giraud did not say anything for a while.</w:t>
+        <w:t>When Mara had finished, Madame Giraud was silent.</w:t>
       </w:r>
     </w:p>
     <w:p>
@@ -7690,7 +7690,7 @@
     </w:p>
     <w:p>
       <w:r>
-        <w:t>She did it without any fuss, in her slate-grey jumper and her good trousers, on her day off, and slid under the front of the car on her back, with a torch, the way she had presumably done a hundred times before on a hundred wrecked cars, and was silent under there for some time.</w:t>
+        <w:t>She did it without any fuss, in her slate-grey jumper and her good trousers, on her day off, and slid under the front of the car on her back, with a torch, the way she had presumably done a hundred times before on a hundred wrecked cars, and was silent under there for a full minute.</w:t>
       </w:r>
     </w:p>
     <w:p>
@@ -7760,7 +7760,7 @@
     </w:p>
     <w:p>
       <w:r>
-        <w:t>"He came," said Monsieur Pons. "In June. The week after. He looked at the car. He did not lie down. He asked me, is there anything here, Pons? I said, I have not looked. He said, then do not look. Crush it when the insurance pays." "I did not like him. Fangio did not like him. Fangio likes everybody."</w:t>
+        <w:t>"He came," said Monsieur Pons. "In June. The week after. He looked at the car. He did not lie down. He asked me, is there anything here, Pons? I said, I have not looked. He said, then do not look. Crush it when the insurance pays. I did not like him. Fangio did not like him. Fangio likes everybody."</w:t>
       </w:r>
     </w:p>
     <w:p>
@@ -7778,7 +7778,7 @@
         <w:ind w:firstLine="0"/>
       </w:pPr>
       <w:r>
-        <w:t>They drove back through the dusk with the bag in the boot and nobody saying anything for the first half-hour.</w:t>
+        <w:t>They drove back through the dusk with the sealed hose in the boot and nobody saying anything for the first half-hour.</w:t>
       </w:r>
     </w:p>
     <w:p>
@@ -8040,7 +8040,7 @@
     </w:p>
     <w:p>
       <w:r>
-        <w:t>"Sim." She laid her hand flat on the photograph. "And the old man at the market, with the eels. He says a heron. Three times I walk down the marsh, alone, in the afternoon, when you are writing. Three times I find only reeds, and water, and birds that are only birds." She took a breath. "I do not... confio. Trust. I do not trust this house."</w:t>
+        <w:t>"Sim." She laid her hand flat on the photograph. "And the old man at the market, with the eels. He says a heron. Three times I walk down the marsh, alone, in the afternoon, with a basket, so you will think it is blackberries. Three times I find only reeds, and water, and birds that are only birds." She took a breath. "I do not... confio. Trust. I do not trust this house."</w:t>
       </w:r>
     </w:p>
     <w:p>
@@ -8123,7 +8123,7 @@
     </w:p>
     <w:p>
       <w:r>
-        <w:t>They had it open at midnight. The false back was a second skin of wood, very well made, by a woman who was very good at woodwork and very bad at trusting landlords. Inside, wrapped in oilskin, lay a notebook in Inês's handwriting and a small tape recorder. Inês had written, on the inside of the wood, DO NOT MOVE THIS. TRUST ME. They did not move it. They took what she had hidden, and they put the board back.</w:t>
+        <w:t>They had it open at midnight. The false back was a second skin of wood, very well made, by a woman who was very good at woodwork and very bad at trusting landlords. Inside, wrapped in oilskin, lay a notebook in Inês's handwriting and a small tape recorder. Inês had written, on the inside of the wood, DO NOT MOVE THIS. TRUST ME. They left the false back where it was. They took what she had hidden, and put the board back.</w:t>
       </w:r>
     </w:p>
     <w:p>
@@ -8173,7 +8173,7 @@
     </w:p>
     <w:p>
       <w:r>
-        <w:t>The click. And then Hale again, alone, not smooth now, not kind, in a voice Tobias had never heard him use, the voice of a boy from Croydon who has been caught: "Edouard, she's a friend. I've known her twenty years. Edouard?" Nobody answered him. The tape ran on over a long silence, and then Elise's footsteps came back up the stairs, and Hale said, "Ah, there you are," in his cashmere voice again, and Inês, in the kitchen, must have reached the end of her courage, because the recording stopped.</w:t>
+        <w:t>The click. And then Hale again, alone, not smooth now, not kind, in a voice Tobias had never heard him use, the voice of a boy from Croydon who has been caught: "Edouard, she's a friend. I've known her twenty years. Edouard?" Nobody answered him. The tape ran on over a long silence, and then Elise's footsteps came back up the stairs, and Hale said, "Ah, there you are," in his cashmere voice again, and Inês, coming in with the coffee, must have reached under the seat and reached the end of her courage at the same moment, because the recording stopped.</w:t>
       </w:r>
     </w:p>
     <w:p>
@@ -8374,7 +8374,7 @@
     </w:p>
     <w:p>
       <w:r>
-        <w:t>She laughed, and sat on the edge of the bed, and for a while neither of them said anything at all. Outside, the clock in the hall struck eight. He did not tell her about the fever's arithmetic. A dream that has been explained is only a temperature, and this one had been thirty-nine point four. But he kept the sentence. Halfway, on purpose. He wrote it on the envelope under the typewriter, under the name.</w:t>
+        <w:t>She laughed, and sat on the edge of the bed, and neither of them said anything at all. Outside, the clock in the hall struck eight. He did not tell her about the fever's arithmetic. A dream that has been explained is only a temperature, and this one had been thirty-nine point four. But he kept the sentence. Halfway, on purpose. He wrote it on the envelope under the typewriter, under the name.</w:t>
       </w:r>
     </w:p>
     <w:p>
@@ -8488,12 +8488,12 @@
     </w:p>
     <w:p>
       <w:r>
-        <w:t>"You are not married."</w:t>
-      </w:r>
-    </w:p>
-    <w:p>
-      <w:r>
-        <w:t>"No," said Tobias. "I was thinking it in advance."</w:t>
+        <w:t>"You are married. To the woman with the duvet."</w:t>
+      </w:r>
+    </w:p>
+    <w:p>
+      <w:r>
+        <w:t>"Not for much longer," said Tobias. "I was thinking it in advance."</w:t>
       </w:r>
     </w:p>
     <w:p>
@@ -8604,7 +8604,7 @@
     </w:p>
     <w:p>
       <w:r>
-        <w:t>Somebody was leaning against their car in the hospital car park when they came out, as if he had been there for some time and did not mind, beside a long black saloon with a driver who did not look up. It was the Frenchman from the supper. Close to, he was about fifty, immaculate, in a charcoal suit and a tie the colour of old claret, and he carried a furled black umbrella under a sky that had not held a cloud all day.</w:t>
+        <w:t>Somebody was leaning against their car in the hospital car park when they came out, as if he had been there a while and did not mind, beside a long black saloon with a driver who did not look up. It was the Frenchman from the supper. Close to, he was about fifty, immaculate, in a charcoal suit and a tie the colour of old claret, and he carried a furled black umbrella under a sky that had not held a cloud all day.</w:t>
       </w:r>
     </w:p>
     <w:p>
@@ -8721,7 +8721,7 @@
     </w:p>
     <w:p>
       <w:r>
-        <w:t>There was no ceremony. They carried the contracts out in the bag that had held the figs. In the car Catarina read the top page and did not say I told you. She said, "The woman in your chapter four should not slip."</w:t>
+        <w:t>They carried the contracts out in the bag that had held the figs. In the car Catarina read the top page and did not say I told you. She said, "The woman in your chapter four should not slip."</w:t>
       </w:r>
     </w:p>
     <w:p>
@@ -8736,7 +8736,7 @@
     </w:p>
     <w:p>
       <w:r>
-        <w:t xml:space="preserve">Anselm Brunner arrived at the lake house two evenings later, at eight o'clock, on foot, in the rain, sent, he said, by a juge in Aix who had read the word </w:t>
+        <w:t xml:space="preserve">Anselm Brunner arrived at the lake house two evenings later, at eight o'clock, on foot, in the rain, with an umbrella held at the precise angle of a bayonet. He had been sent, he said, by a juge in Aix who had read the word </w:t>
       </w:r>
       <w:r>
         <w:rPr>
@@ -8745,7 +8745,7 @@
         <w:t>codex</w:t>
       </w:r>
       <w:r>
-        <w:t xml:space="preserve"> in the inventory of a safe deposit box and had telephoned Rome before lunch, with an umbrella held at the precise angle of a bayonet.</w:t>
+        <w:t xml:space="preserve"> in the inventory of a safe deposit box and had telephoned Rome before lunch.</w:t>
       </w:r>
     </w:p>
     <w:p>
@@ -8790,7 +8790,7 @@
     </w:p>
     <w:p>
       <w:r>
-        <w:t>They sat him in the kitchen. He declined tea, accepted water, declined the glass and drank from the tap cup with his back very straight. He then took from his coat an envelope, an old Latin letter, a photograph and a notebook, and laid them in a row on the table, in order of size.</w:t>
+        <w:t>They sat him in the kitchen. He declined tea, accepted water, declined a glass, and drank it from the chipped cup with his back very straight. He then took from his coat an envelope, an old Latin letter, a photograph and a notebook, and laid them in a row on the table, in order of size.</w:t>
       </w:r>
     </w:p>
     <w:p>
@@ -8840,7 +8840,7 @@
     </w:p>
     <w:p>
       <w:r>
-        <w:t>Inspector Mara Quill eyed him across the kitchen table the way a cat eyes a different breed of cat.</w:t>
+        <w:t>Inspector Mara Quill, who had driven over with a copy of the bank inventory and stayed, eyed him across the kitchen table the way a cat eyes a different breed of cat.</w:t>
       </w:r>
     </w:p>
     <w:p>
@@ -8865,7 +8865,7 @@
     </w:p>
     <w:p>
       <w:r>
-        <w:t>"Hale is a cashier," said Mara. She was not, strictly, on the case. She was on the juge's case, which was a different thing, and which existed because Madame Fournier had sat in a procureur's waiting room in her good coat, and Mara had followed her into a magistrate's office in Aix with a rent ledger, a sawn bolt from Lyon and a brake hose from a scrapyard, and had not walked out until it did. She put the Marseille photograph on the table, the one from the lobster restaurant: Hale, and the man with the closed-door face, and the hands buttering a roll. "This one decides. Armand Vial. The foundation is his. The cooler voice on the tape is not Hale's. Inês wrote his first name in the margin in March, before any of us had met him."</w:t>
+        <w:t>"Hale is a cashier," said Mara. She was not, strictly, on the case. She was on the juge's case, which was a different thing, and which existed because Madame Fournier had sat in a procureur's waiting room in her good coat, and Mara had followed her into a magistrate's office in Aix with a rent ledger, a sawn bolt from Lyon and a brake hose from a scrapyard, and had not walked out until it was opened. She put the Marseille photograph on the table, the one from the lobster restaurant: Hale, and the man with the closed-door face, and the hands buttering a roll. "This one decides. Armand Vial. The foundation is his. The cooler voice on the tape is not Hale's. Inês wrote his first name in the margin in March, before any of us knew whose name it was."</w:t>
       </w:r>
     </w:p>
     <w:p>
@@ -8890,7 +8890,7 @@
     </w:p>
     <w:p>
       <w:r>
-        <w:t>He went to Marseille the next morning, by the slow train, with the umbrella. He did not come back for some time.</w:t>
+        <w:t>He went to Marseille the next morning, by the slow train, with the umbrella. He did not come back for nearly a fortnight.</w:t>
       </w:r>
     </w:p>
     <w:p>
@@ -8924,7 +8924,7 @@
     </w:p>
     <w:p>
       <w:r>
-        <w:t>It had been Madame Fournier's washing machine for nineteen years, a heavy white French machine that had survived nineteen winters, a flood, seven tenants and Tobias. It did not survive the thunderbolt. It gave a groan like a dying ox, shuddered through one last spin with the door still locked, sent a thin grey thread of smoke out of its soap drawer, and died, quite visibly, with a small clink, its drum full of Catarina's tea towels.</w:t>
+        <w:t>It had been Madame Fournier's washing machine for nineteen years, a heavy white French machine that had survived a flood, seven tenants and Tobias. It did not survive the thunderbolt. It gave a groan like a dying ox, shuddered through one last spin with the door still locked, sent a thin grey thread of smoke out of its soap drawer, and died, quite visibly, with a small clink, its drum full of Catarina's tea towels.</w:t>
       </w:r>
     </w:p>
     <w:p>
@@ -9154,7 +9154,7 @@
     </w:p>
     <w:p>
       <w:r>
-        <w:t>Madame Fournier came down the garden ten minutes later, in her gardening gloves, because she had seen them from her kitchen window and wished to know what two people in dressing gowns were doing in Henri's terrace at seven in the morning. She stopped at the edge of the grove. She stood there for some time. Then she pulled off one glove and reached up and touched a branch, the way you would touch the sleeve of somebody you had not seen for a while and were not sure you were allowed to speak to.</w:t>
+        <w:t>Madame Fournier came down the garden ten minutes later, in her gardening gloves, because she had seen them from her kitchen window and wished to know what two people in dressing gowns were doing in Henri's terrace at seven in the morning. She stopped at the edge of the grove. She stood there without moving. Then she pulled off one glove and reached up and touched a branch, the way you would touch the sleeve of somebody you had not seen for a while and were not sure you were allowed to speak to.</w:t>
       </w:r>
     </w:p>
     <w:p>
@@ -9192,7 +9192,7 @@
     </w:p>
     <w:p>
       <w:r>
-        <w:t>"Dzień dobry," said Marek, to the house. He looked up at the roof for a long time, as a doctor looks at a patient who has not followed his advice. "Dach jest chory."</w:t>
+        <w:t>"Dzień dobry," said Marek, to the house. He looked up at the roof the way a doctor looks at a patient who has not followed his advice. "Dach jest chory."</w:t>
       </w:r>
     </w:p>
     <w:p>
@@ -9458,7 +9458,7 @@
     </w:p>
     <w:p>
       <w:r>
-        <w:t>He put the receiver down. He stood in the hall for a while.</w:t>
+        <w:t>He put the receiver down. He stood in the hall with his hand still on it.</w:t>
       </w:r>
     </w:p>
     <w:p>
@@ -10217,7 +10217,7 @@
     </w:p>
     <w:p>
       <w:r>
-        <w:t>Mara arrived at a quarter to midnight in a dressing gown, wellington boots and a raincoat, with her service card in one hand and a torch in the other, followed by two gendarmes from Saint-Martin who had been playing cards and had brought the cards. She looked at the pond for a while. She looked at the pelican. She looked at Hugo.</w:t>
+        <w:t>Mara arrived at a quarter to midnight in a dressing gown, wellington boots and a raincoat, with her service card in one hand and a torch in the other, followed by two gendarmes from Saint-Martin who had been playing cards and had brought the cards. She looked at the pond. She looked at the pelican. She looked at Hugo.</w:t>
       </w:r>
     </w:p>
     <w:p>
@@ -10232,7 +10232,7 @@
     </w:p>
     <w:p>
       <w:r>
-        <w:t>She interviewed the Gastons in the kitchen, at the table, wrapped in two of Henri Fournier's army blankets, dripping onto the tiles. They were not difficult to interview. They were, in fact, almost pathetically eager to be interviewed, in the way of men who have spent a long evening being defeated by a child and would like very much to talk to an adult about anything at all.</w:t>
+        <w:t>She interviewed the Gastons in the kitchen, at the table, wrapped in two of Henri Fournier's army blankets, which Madame Fournier had fetched over the wall, dripping onto the tiles. They were not difficult to interview. They were, in fact, almost pathetically eager to be interviewed, in the way of men who have spent a long evening being defeated by a child and would like very much to talk to an adult about anything at all.</w:t>
       </w:r>
     </w:p>
     <w:p>
@@ -10268,7 +10268,7 @@
     </w:p>
     <w:p>
       <w:r>
-        <w:t>"Did you eat them?" said Hugo, from the doorway, in his pyjamas, with interest.</w:t>
+        <w:t>"Did you eat the calissons?" said Hugo, from the doorway, in his pyjamas, with interest.</w:t>
       </w:r>
     </w:p>
     <w:p>
@@ -10307,16 +10307,16 @@
         <w:t>Poisonous Plants of the Mediterranean</w:t>
       </w:r>
       <w:r>
-        <w:t xml:space="preserve">, and delivered him to Priscilla and Nigel, who had come back from their rehearsal to an empty house and a note on the kitchen table in Hugo's handwriting that said, in full, </w:t>
+        <w:t xml:space="preserve">, and delivered him to Priscilla and Nigel, who had come back from their rehearsal to a message on the answering machine, in Hugo's own voice, that said, in full, </w:t>
       </w:r>
       <w:r>
         <w:rPr>
           <w:i/>
         </w:rPr>
-        <w:t>At Tobias's. Burglars. Fine. H.</w:t>
-      </w:r>
-      <w:r>
-        <w:t>, and who were standing in the drive in their coats, Priscilla still in half her Dame's make-up and Nigel still in the back legs of a horse.</w:t>
+        <w:t>It's Hugo. Burglars. Fine. Don't come,</w:t>
+      </w:r>
+      <w:r>
+        <w:t xml:space="preserve"> and who were standing in the drive in their coats, Priscilla still in half her Dame's make-up and Nigel still in the back legs of a horse.</w:t>
       </w:r>
     </w:p>
     <w:p>
@@ -10405,7 +10405,7 @@
     </w:p>
     <w:p>
       <w:r>
-        <w:t>"In the afternoons," he said. "When anybody could see you go. From the road, from the lane, from a car parked at the top of it. She'd have seen you too. And she'd have stayed in, because she's careful, because you're being watched, and if she came out they'd have two of you." He turned round. "Baptistin's hut is on the channel. The torch I saw was on the channel. She isn't hiding from you. She's hiding from whoever's watching you. So we don't walk down the bank in daylight like people looking for somebody. We go by water, at dawn, before anybody's at the top of the lane, and we take everything with us, the tape and the notebook, because Hale has just told us he's coming back, and I'm not leaving them in a house that every crook in the Bouches-du-Rhône seems to have the address of."</w:t>
+        <w:t>"In the afternoons," he said. "When anybody could see you go. From the road, from the lane, from a car parked at the top of it. She'd have seen you too. And she'd have stayed in, because she's careful, because you're being watched, and if she came out they'd have two of you." He turned round. "Baptistin's hut is on the channel. The torch I saw was on the channel. She isn't hiding from you. She's hiding from whoever's watching you. So we don't walk down the bank in daylight like people looking for somebody. We go by water, at dawn, before anybody's at the top of the lane, and we take the tape and the notebook out of Odile's tin and keep them on us, because somebody has already moved that tin an inch, and Hale has just told us he's coming back."</w:t>
       </w:r>
     </w:p>
     <w:p>
@@ -10625,7 +10625,7 @@
         <w:t>Edouard, she's a friend. I've known her twenty years. Edouard?</w:t>
       </w:r>
       <w:r>
-        <w:t>" Hale's face did something terrible and small. "It's on a tape, Victor. Inês made it. Nobody answered you that night. You stood in an empty room and asked for her, and nobody answered." Tobias held his eyes. "I'm answering. That's all this is. Somebody's finally asking you back."</w:t>
+        <w:t>" Hale's face did something terrible and small. "It's on a tape, Victor. Inês made it. Nobody answered you that night. You stood in an empty room and asked for him, and nobody answered." Tobias held his eyes. "I'm answering. That's all this is."</w:t>
       </w:r>
     </w:p>
     <w:p>
@@ -10645,7 +10645,7 @@
     </w:p>
     <w:p>
       <w:r>
-        <w:t>One of the gendarmes put a hand on his arm, quite gently, the way Hale had once put a hand under Elise's elbow on the second step, and Hale looked down at the hand as if he recognised it.</w:t>
+        <w:t>One of the gendarmes put a hand on Hale's arm, quite gently, the way Hale had once put a hand under Elise's elbow on the second step, and Hale looked down at the hand as if he recognised it.</w:t>
       </w:r>
     </w:p>
     <w:p>
@@ -10655,7 +10655,7 @@
     </w:p>
     <w:p>
       <w:r>
-        <w:t>"Não é só papel," she said to him.</w:t>
+        <w:t>"Não é só papel," she said to Tobias.</w:t>
       </w:r>
     </w:p>
     <w:p>
@@ -10935,7 +10935,7 @@
         <w:ind w:firstLine="0"/>
       </w:pPr>
       <w:r>
-        <w:t>Nobody said anything for a long time. Madame Fournier had stopped knitting. Catarina stood at the stove with her back to the room and her hands flat on the rail, as she had stood at the sink on the day Hale came. Gigi, under the table, put her chin on Inês's foot.</w:t>
+        <w:t>Nobody said anything. Madame Fournier had stopped knitting. Catarina stood at the stove with her back to the room and her hands flat on the rail, as she had stood at the sink on the day Hale came. Gigi, under the table, put her chin on Inês's foot.</w:t>
       </w:r>
     </w:p>
     <w:p>
@@ -11003,7 +11003,7 @@
     </w:p>
     <w:p>
       <w:r>
-        <w:t>"I did not know his name. I knew he knew Monsieur Hale. I knew that if I went to the police, I would be going to his police." Inês sat back. "So I stayed in the hut. For seven months. Baptistin brought me bread and eels and newspapers and did not ask anything. I worked nights at the bakery in Saint-Martin, washing the trays, for cash. Gigi found me in June. She was a stray. She does not like strangers. She makes exceptions for tins." The dog thumped her tail once under the table, hearing her name. "I watched the house. I saw the new tenant come, an Englishman with a typewriter. I saw my sister come, in September, with her bag, and get out of a taxi, and stand at the gate, and look at the jetty for some time. I nearly ran up the lane. I nearly did, every day." Her voice cracked for the first time, very slightly, and steadied. "But I thought, if I go to her, they will know where I am, and they will know she knows. So I watched. I watched her go into the lake after his pages. I watched her peg them on a line. I watched her sit on the jetty with him at night with the binoculars, looking at birds." She glanced at Tobias, and then away. "I watched her hold his hand. Under the stars. On the night the lights went out."</w:t>
+        <w:t>"I did not know his name. I knew he knew Monsieur Hale. I knew that if I went to the police, I would be going to his police." Inês sat back. "So I stayed in the hut. For seven months. Baptistin brought me bread and eels and newspapers and did not ask anything. I worked nights at the bakery in Saint-Martin, washing the trays, for cash. Gigi found me in June. She was a stray. She does not like strangers. She makes exceptions for tins." The dog thumped her tail once under the table, hearing her name. "I watched the house. I saw the new tenant come, an Englishman with a typewriter. I saw my sister come, in September, with her bag, and get out of a taxi, and stand at the gate, and look at the jetty. I nearly ran up the lane. I nearly did, every day." Her voice cracked for the first time, very slightly, and steadied. "But I thought, if I go to her, they will know where I am, and they will know she knows. So I watched. I watched her go into the lake after his pages. I watched her peg them on a line. I watched her sit on the jetty with him at night with the binoculars, looking at birds." She glanced at Tobias, and then away. "I watched her hold his hand. Under the stars. On the night the lights went out."</w:t>
       </w:r>
     </w:p>
     <w:p>
@@ -11062,7 +11062,7 @@
     </w:p>
     <w:p>
       <w:r>
-        <w:t>He walked down to the jetty. He stood at the end of it, by the ladder, where a man had knelt with his arms in the water to the elbow for a very long time, and where Inês had held her friend on the ladder until a light came on up the lane. The water was a metre and a half deep. The planks were oak, and sound. He looked down into it for a while.</w:t>
+        <w:t>He walked down to the jetty. He stood at the end of it, by the ladder, where a man had knelt with his arms in the water to the elbow for a very long time, and where Inês had held her friend on the ladder until a light came on up the lane. The water was a metre and a half deep. The planks were oak, and sound. He looked down into it.</w:t>
       </w:r>
     </w:p>
     <w:p>
@@ -11485,7 +11485,7 @@
     </w:p>
     <w:p>
       <w:r>
-        <w:t>Then Mara put a hand on his elbow, courteously, firmly, like a man helping an old lady across a road, and he got into the car.</w:t>
+        <w:t>Then Mara put a hand on his elbow, courteously, firmly, the way you help an old lady across a road, and he got into the car.</w:t>
       </w:r>
     </w:p>
     <w:p>
@@ -11765,7 +11765,7 @@
     </w:p>
     <w:p>
       <w:r>
-        <w:t>"Mr Lind. Miss Vidal." He bowed from the waist, the bow nobody had given Tobias since he was a child at a pantomime. "The Holy See will write to you. It will be a very short letter. Two lines, perhaps. It will say thank you, and it will say that we have prayed for you." He paused. "It will not be enough. I wish to say that myself, now, so that when the letter comes, you will know that somebody in Rome knew it was not enough."</w:t>
+        <w:t>"Mr Lind. Miss Vidal." He bowed from the waist, as he had on the porch on the first evening. "The Holy See will write to you. It will be a very short letter. Two lines, perhaps. It will say thank you, and it will say that we have prayed for you." He paused. "It will not be enough. I wish to say that myself, now, so that when the letter comes, you will know that somebody in Rome knew it was not enough."</w:t>
       </w:r>
     </w:p>
     <w:p>
@@ -11829,7 +11829,7 @@
     </w:p>
     <w:p>
       <w:r>
-        <w:t xml:space="preserve">"And April," Mara went on. "The eleventh, the night Aubry fell in Lyon. At eleven fifty-two, a call from Delacroix's mobile to Moutet's. Ninety seconds. Delacroix's mobile was in Lyon at the time; the operator can tell you which mast. Moutet's was at home, in bed, beside his wife, who does pottery." She set the cup down. "And on the fourteenth of April, three days later, Moutet drove to Lyon, which is not his jurisdiction and four hours away, in a service car, and filled in a mileage claim for it, which he signed with his very good pen, and on which he described the purpose of the journey as </w:t>
+        <w:t xml:space="preserve">"And April," Mara went on. "The eleventh, the night Aubry fell in Lyon. At eleven fifty-two, a call from Delacroix's mobile to Moutet's. Ninety seconds. Delacroix's mobile was in Lyon at the time; the operator can tell you which mast. Moutet's was at home, in bed, beside his wife, who does pottery." She set the cup down. "And on the fourteenth of April, three days later, Moutet drove to Lyon, which is not his jurisdiction and three hours away, in a service car, and filled in a mileage claim for it, which he signed with his very good pen, and on which he described the purpose of the journey as </w:t>
       </w:r>
       <w:r>
         <w:rPr>
@@ -12080,7 +12080,7 @@
     </w:p>
     <w:p>
       <w:r>
-        <w:t>Nobody said anything for a while.</w:t>
+        <w:t>Nobody said anything.</w:t>
       </w:r>
     </w:p>
     <w:p>
@@ -12118,7 +12118,7 @@
     </w:p>
     <w:p>
       <w:r>
-        <w:t>"I like it here," she said, to Tobias, on the jetty, on a cold bright afternoon at the end of November, when she had driven over on her day off with no reason except, she said, that she wanted to see the pelican. "I like the valley. I like the lake, or the pond, or whatever Madame Fournier says it is this week. I like the baker who thinks a man who buys nothing is confessing. I like that I know which roundabout the English always go round the wrong way." She looked out at the water. "And there's a new commandant coming in January. From Lyon. A woman. The juge says she's very good and very difficult and asks for everything in writing. I'd like to work for somebody like that before I'm too old to be surprised."</w:t>
+        <w:t>"I like it here," she said, to Tobias, on the jetty, on a cold bright afternoon in the first week of December, when she had driven over on her day off with no reason except, she said, that she wanted to see the pelican. "I like the valley. I like the lake, or the pond, or whatever Madame Fournier says it is this week. I like the baker who thinks a man who buys nothing is confessing. I like that I know which roundabout the English always go round the wrong way." She looked out at the water. "And there's a new commandant coming in January. From Lyon. A woman. The juge says she's very good and very difficult and asks for everything in writing. I'd like to work for somebody like that before I'm too old to be surprised."</w:t>
       </w:r>
     </w:p>
     <w:p>
@@ -12148,7 +12148,7 @@
     </w:p>
     <w:p>
       <w:r>
-        <w:t>"There's a race on Sunday," said Mara. "At the Catalans. The juge swims there too. On Sundays, in November. That's how I know her, actually. Not from work. From standing on a beach in a coat watching a sixty-year-old magistrate walk into the Mediterranean in a black costume and a white cap as if she were walking into a courtroom." She smiled, properly, for the first time that afternoon. "She asked me last week if I'd like to swim with her. After Lily's race. In the sea. In November."</w:t>
+        <w:t>"There's a race on Sunday," said Mara. "At the Catalans. The juge swims there too. On Sundays, all winter. That's how I know her, actually. Not from work. From standing on a beach in a coat watching a sixty-year-old magistrate walk into the Mediterranean in a black costume and a white cap as if she were walking into a courtroom." She smiled, properly, for the first time that afternoon. "She asked me last week if I'd like to swim with her. After Lily's race. In the sea. In December."</w:t>
       </w:r>
     </w:p>
     <w:p>
@@ -12178,7 +12178,7 @@
     </w:p>
     <w:p>
       <w:r>
-        <w:t>She went back up the three stone steps and the lawn to her small grey car, and drove away down the lane, carefully, at the speed limit, without scraping anything, and on the passenger seat beside her, Tobias was almost sure, as the car turned at the gate, he saw a white swimming cap and a small pair of blue goggles, side by side, like two people who have finally agreed to go somewhere together.</w:t>
+        <w:t>She went back up the three stone steps and the lawn to her small grey car, and drove away down the lane, carefully, at the speed limit, without scraping anything, and as the car turned at the gate Tobias was almost sure he saw, on the passenger seat beside her, a white swimming cap and a small pair of blue goggles, side by side, like two people who have finally agreed to go somewhere together.</w:t>
       </w:r>
     </w:p>
     <w:p>
@@ -12585,7 +12585,7 @@
     </w:p>
     <w:p>
       <w:r>
-        <w:t>They did not say anything for some time. Catarina's arm was through his. She had put it there at the door of the village hall without asking, and he had not mentioned it, and it had stayed.</w:t>
+        <w:t>They walked in silence. Catarina's arm was through his. She had put it there at the door of the village hall without asking, and he had not mentioned it, and it had stayed.</w:t>
       </w:r>
     </w:p>
     <w:p>
@@ -12605,7 +12605,7 @@
     </w:p>
     <w:p>
       <w:r>
-        <w:t>He had spent three days on it. He had spent three days at the typewriter with both dictionaries open and the children's phrasebook and a grammar he had bought in Aix, typing, and crossing out, and typing again, while the Olivetti, he felt, watched him with an expression of the deepest Italian scepticism. It was nine lines long. It was the longest thing he had ever written in a language other than his own. It was, he was quite certain, full of mistakes.</w:t>
+        <w:t>He had spent three days on it, at the typewriter, with both dictionaries open and the children's phrasebook and a grammar he had bought in Aix, typing, and crossing out, and typing again, while the Olivetti, he felt, watched him with an expression of the deepest Italian scepticism. It was nine lines long. It was the longest thing he had ever written in a language other than his own. It was, he was quite certain, full of mistakes.</w:t>
       </w:r>
     </w:p>
     <w:p>
@@ -12878,7 +12878,7 @@
     </w:p>
     <w:p>
       <w:r>
-        <w:t>Tobias stood at the gate for a while with the corrected letter in his hand, under the three women waiting for their ship, until he could not feel his feet. Then he went in, and found the bacalhau, which she had already bought, he discovered, a week ago, and hidden at the back of the cold larder wrapped in a tea towel, and put it in a bowl of cold water, and set an alarm on the Olivetti's bell, by an arrangement of string and a clothes peg that would have impressed Hugo, for three o'clock in the morning.</w:t>
+        <w:t>Tobias stood at the gate with the corrected letter in his hand, under the three women waiting for their ship, until he could not feel his feet. Then he went in, and found the bacalhau, which she had already bought, he discovered, a week ago, and hidden at the back of the cold larder wrapped in a tea towel, and put it in a bowl of cold water, and set an alarm on the Olivetti's bell, by an arrangement of string and a clothes peg that would have impressed Hugo, for three o'clock in the morning.</w:t>
       </w:r>
     </w:p>
     <w:p>
@@ -12975,7 +12975,7 @@
     </w:p>
     <w:p>
       <w:r>
-        <w:t>The Gastons got eighteen months each, suspended, and an order not to come within five kilometres of the lake, which the second Gaston, the one who falls, said in a small voice he had no intention of doing ever again, as there were children there. As they were led out, the first Gaston was heard to say to the second, with a kind of broken wonder, "Gaston. I think we should retire."</w:t>
+        <w:t>The Gastons got eighteen months each, suspended, and an order not to come within five kilometres of the lake, which, the second Gaston said in a small voice, he had no intention of breaking, as there were children there. As they were led out, the first Gaston was heard to say to the second, with a kind of broken wonder, "Gaston. I think we should retire."</w:t>
       </w:r>
     </w:p>
     <w:p>
@@ -13127,7 +13127,7 @@
     </w:p>
     <w:p>
       <w:r>
-        <w:t>Monsieur Lemaire, in his cardigan, without the cat, repeated what he had told Dona Graça and the commandant with the very good pen and Tobias and Catarina, in the same words, in the same order, like a train timetable, and when the defence asked whether, at seventy-one, doing the crossword, he could really be sure it was an umbrella and not a walking stick, he looked at the lawyer for a long time and said, "Maître, I worked at Lyon airport for thirty-one years. I know the difference between an umbrella and a walking stick. Do you?" and sat down, and was not asked anything else.</w:t>
+        <w:t>Monsieur Lemaire, in his cardigan, without the cat, repeated what he had told Dona Graça and the commandant with the very good pen and Tobias and Catarina, in the same words, in the same order, like a train timetable, and when the defence asked whether, at seventy-one, doing the crossword, he could really be sure it was an umbrella and not a walking stick, he looked at the lawyer over his glasses and said, "Maître, I worked at Lyon airport for thirty-one years. I know the difference between an umbrella and a walking stick. Do you?" and sat down, and was not asked anything else.</w:t>
       </w:r>
     </w:p>
     <w:p>
@@ -13156,7 +13156,7 @@
     </w:p>
     <w:p>
       <w:r>
-        <w:t>Maître Barbier, now seventy and retired by law, with his arm healed and his temper not, told the court that the assignment of the Marchetti rights had been brought to his office in Aix for registration two days after Valentina Marchetti's death, by Maître Delacroix-Roux personally, and that he had registered it because the signatures were in order and the witness was a member of the bar, and that three weeks later Elise Marchetti had come to his office with her mother's medical file and asked him how a woman who had not recognised her own daughter for two years had managed to sign her name so beautifully, three days before she died. "I had no answer," said Maître Barbier. "I have been a notary for forty-four years. I had no answer. So I put the originals in my safe, and I told her to come back with a lawyer, and I was afraid." He looked at the dock. "And then she drowned. And Giraud drove off a bridge. And two men came for my safe with an owl."</w:t>
+        <w:t>Maître Barbier, now seventy and retired by law, with his arm healed and his temper not, told the court that the assignment of the Marchetti rights had been brought to his office in Aix for registration two days after Valentina Marchetti's death, by Maître Delacroix-Roux personally, and that he had registered it because the signatures were in order and the witness was a member of the bar, and that two years later, in February, Elise Marchetti had come to his office with her mother's medical file and asked him how a woman who had not recognised her own daughter for two years had managed to sign her name so beautifully, three days before she died. "I had no answer," said Maître Barbier. "I have been a notary for forty-four years. I had no answer. So I put the originals in my safe, and I told her to come back with a lawyer, and I was afraid." He looked at the dock. "And then she drowned. And Giraud drove off a bridge. And two men came for my safe with an owl."</w:t>
       </w:r>
     </w:p>
     <w:p>
@@ -13251,7 +13251,7 @@
     </w:p>
     <w:p>
       <w:r>
-        <w:t xml:space="preserve">He had done that once before, Tobias realised, on the first morning, when the court, as French courts do before they hear a single fact, had heard who the accused was. The investigator who had prepared the report on his personality, a tired woman with a ring binder, had read it out in a flat voice. Born Edouard Roux, in 1973, in the concierge's lodge of a building on the Cours Mirabeau. Mother concierge there for thirty-one years; now ninety-one, in a home on the road to Éguilles, visited every Sunday without fail, with calissons. Schooling paid for by a tenant of the building, a young avocat named Armand Vial. The name Delacroix taken at the oath, from a bâtonnier on the first floor. </w:t>
+        <w:t xml:space="preserve">He had done that once before, Tobias realised, on the first morning, when the court, as French courts do before they hear a single fact, had heard who the accused was. The investigator who had prepared the report on his personality, a tired woman with a ring binder, had read it out in a flat voice. Born Edouard Roux, in 1974, in the concierge's lodge of a building on the Cours Mirabeau. Mother concierge there for thirty-one years; now ninety-one, in a home on the road to Éguilles, visited every Sunday without fail, with calissons. Schooling paid for by a tenant of the building, a young avocat named Armand Vial. The name Delacroix taken at the oath, from a bâtonnier on the first floor. </w:t>
       </w:r>
       <w:r>
         <w:rPr>
@@ -13288,7 +13288,7 @@
     </w:p>
     <w:p>
       <w:r>
-        <w:t>He told the court that he had been a small publisher with large debts when Armand Vial had first come to him, eleven years ago, with the idea of a prize. He told them about the sixty pounds, and the sacks, and the anthology, and the house by the lake he had rented for eleven hundred and let for three thousand, because, he said, once you have begun to take money from people who trust you, it becomes very difficult to see why you should stop at writers. He told them about Valentina Marchetti's estate, and the backlist, and the book of hours in her bedroom that she thought was her missal, and the assignment that Delacroix had drafted and taken to her bedside in Lyon, with a pen.</w:t>
+        <w:t>He told the court that he had been a small publisher with large debts when Armand Vial had first come to him, ten years ago, with the idea of a prize. He told them about the sixty pounds, and the sacks, and the anthology, and the house by the lake he had rented for eleven hundred and let for three thousand, because, he said, once you have begun to take money from people who trust you, it becomes very difficult to see why you should stop at writers. He told them about Valentina Marchetti's estate, and the backlist, and the book of hours in her bedroom that she thought was her missal, and the assignment that Delacroix had drafted and taken to her bedside in Lyon, with a pen.</w:t>
       </w:r>
     </w:p>
     <w:p>
@@ -13570,7 +13570,7 @@
     </w:p>
     <w:p>
       <w:r>
-        <w:t>She was quiet for a while. Then she looked up at him with her serious dark eyes, and he saw that she was trying not to laugh.</w:t>
+        <w:t>She was quiet. Then she looked up at him with her serious dark eyes, and he saw that she was trying not to laugh.</w:t>
       </w:r>
     </w:p>
     <w:p>
@@ -13726,7 +13726,7 @@
         <w:ind w:firstLine="0"/>
       </w:pPr>
       <w:r>
-        <w:t>Tobias's parents arrived the morning after the verdict, unannounced, in a hired Fiat from Marseille airport, with one suitcase, a Tupperware of flapjacks, and the expression of two people who had been on an aeroplane for the first time since 1998 and had not enjoyed it.</w:t>
+        <w:t>Tobias's parents arrived three days after the verdict, unannounced, in a hired Fiat from Marseille airport, with one suitcase, a Tupperware of flapjacks, and the expression of two people who had been on an aeroplane for the first time since 1998 and had not enjoyed it.</w:t>
       </w:r>
     </w:p>
     <w:p>
@@ -13927,7 +13927,7 @@
     </w:p>
     <w:p>
       <w:r>
-        <w:t>"Margaret. I know what you think. You think, a woman from another country, with no money, who cleans his house. You think I will take your son and break his heart, or that he will take me and break mine." She paused. "You are right to be afraid. I am also afraid. In my family, a woman who marries an Englishman is a woman who has lost her mind. My grandmother says so. She has said so four times this week, on the telephone, at seven in the morning." She almost smiled. "But I have read all of his books. Slowly. With a dictionary. The first one is not good. The second is better. The third has a detective who looks like a man who sells double glazing. And in the new one, the one that went into the lake, there is a page about a woman who walks into the water after a manuscript, and I thought: this man, he does not know how to say thank you. But he knows how to write it down. And I thought, I would like to be written down."</w:t>
+        <w:t>"Margaret. I know what you think. You think, a woman from another country, with no money, who cleans his house. You think I will take your son and break his heart, or that he will take me and break mine." She paused. "You are right to be afraid. I am also afraid. In my family, a woman who marries an Englishman is a woman who has lost her mind. My grandmother says so. She has said so four times this week, on the telephone, at seven in the morning." She almost smiled. "But I have read all of his books. Slowly. With a dictionary. The first one is not good. The second is better. The third has a detective who looks like a man who sells double glazing. And in the new one, the one he gave me on the steps, there is a page about a woman who walks into the water after a manuscript, and I thought: this man, he does not know how to say thank you. But he knows how to write it down. And I thought, I would like to be written down."</w:t>
       </w:r>
     </w:p>
     <w:p>
@@ -13967,7 +13967,7 @@
     </w:p>
     <w:p>
       <w:r>
-        <w:t xml:space="preserve">"Four minutes. With the cosy. The milk is after." Catarina folded her hands again. "I learned in October. From a book in English, for children, with a picture of a bear. Tobias makes it very badly. He puts the bag in the cup and says </w:t>
+        <w:t xml:space="preserve">"Four minutes. With the cosy. The milk is after." Catarina folded her hands again. "I learned in November. From a book in English, for children, with a picture of a bear. Tobias makes it very badly. He puts the bag in the cup and says </w:t>
       </w:r>
       <w:r>
         <w:rPr>
@@ -13981,7 +13981,7 @@
     </w:p>
     <w:p>
       <w:r>
-        <w:t>Margaret looked at her son for some time, with the expression of a woman who has found out, forty-six years late, exactly where she went wrong.</w:t>
+        <w:t>Margaret looked at her son with the expression of a woman who has found out, forty-six years late, exactly where she went wrong.</w:t>
       </w:r>
     </w:p>
     <w:p>
@@ -14092,7 +14092,7 @@
     </w:p>
     <w:p>
       <w:r>
-        <w:t>They went out from an office in Aix rented by the court-appointed administrator of the frozen assets of the Verrane Foundation, the Fondation Vial pour les Lettres, Hale Books (Marseille) and Hale Retreats of the Channel Islands, a dry, careful, bespectacled man named Monsieur Ferrand who had spent the spring reading eleven sacks of Highly Commended letters and, he admitted to the juge, had not slept well since. There were eleven thousand four hundred of them, one to every writer who had ever paid sixty pounds to be told they had not won, and they had been translated into nine languages, and they said, in each of them, more or less the same thing.</w:t>
+        <w:t>They went out from an office in Aix rented by the court-appointed administrator of the frozen assets of the Verrane Foundation, the Fondation Vial pour les Lettres, Hale Books (Marseille) and Hale Retreats of the Channel Islands, a dry, careful, bespectacled man named Monsieur Ferrand who had spent the spring reading the sacks of Highly Commended letters and, he admitted to the juge, had not slept well since. There were eleven thousand four hundred of them, one to every writer who had ever paid sixty pounds to be told they had not won, and they had been translated into nine languages, and they said, in each of them, more or less the same thing.</w:t>
       </w:r>
     </w:p>
     <w:p>
@@ -14170,7 +14170,7 @@
     </w:p>
     <w:p>
       <w:r>
-        <w:t>Not from Hale Books, which no longer existed, but from a small, fierce, underfunded publisher in Edinburgh run by a woman who had worked with Elise for nine years and had wept, she told Tobias on the telephone, for the whole of the first chapter and the whole of the last, and laughed for most of the middle, and had found forty-one missing commas, which she had put back. The advance was four thousand pounds. It was a tenth of what Victor Hale had offered. Tobias had accepted it in less than a minute, and had then sat on the bottom stair with the telephone in his lap, in exactly the place where he had sat with Hale's contract in October, and laughed until Catarina came out of the kitchen to see whether he was dying.</w:t>
+        <w:t>Not from Hale Books, which no longer existed, but from a small, fierce, underfunded publisher in Edinburgh run by a woman who had worked with Elise for nine years and had wept, she told Tobias on the telephone, for the whole of the first chapter and the whole of the last, and laughed for most of the middle, and had found thirty-eight missing commas, which she had put back. The advance was four thousand pounds. It was a tenth of what Victor Hale had offered. Tobias had accepted it in less than a minute, and had then sat on the bottom stair with the telephone in his lap, in exactly the place where he had sat with Hale's contract in October, and laughed until Catarina came out of the kitchen to see whether he was dying.</w:t>
       </w:r>
     </w:p>
     <w:p>

</xml_diff>

<commit_message>
Also-by: In Love with Murder, Actually to canonical list
</commit_message>
<xml_diff>
--- a/In Love with Murder, Actually/In_Love_with_Murder_Actually.docx
+++ b/In Love with Murder, Actually/In_Love_with_Murder_Actually.docx
@@ -14579,7 +14579,7 @@
         <w:rPr>
           <w:b/>
         </w:rPr>
-        <w:t>Physics, Actually</w:t>
+        <w:t xml:space="preserve">Physics, Actually</w:t>
       </w:r>
     </w:p>
     <w:p>
@@ -14587,7 +14587,7 @@
         <w:ind w:firstLine="0" w:left="288"/>
       </w:pPr>
       <w:r>
-        <w:t>Physics, Actually, Volume 1: Motion, Forces, Time, and Relativity</w:t>
+        <w:t xml:space="preserve">Physics, Actually, Volume 1: Motion, Forces, Time, and Relativity</w:t>
       </w:r>
     </w:p>
     <w:p>
@@ -14595,7 +14595,7 @@
         <w:ind w:firstLine="0" w:left="288"/>
       </w:pPr>
       <w:r>
-        <w:t>Physics, Actually, Volume 2: Gravity, Cosmology, and the Limits of Spacetime</w:t>
+        <w:t xml:space="preserve">Physics, Actually, Volume 2: Gravity, Cosmology, and the Limits of Spacetime</w:t>
       </w:r>
     </w:p>
     <w:p>
@@ -14603,7 +14603,7 @@
         <w:ind w:firstLine="0" w:left="288"/>
       </w:pPr>
       <w:r>
-        <w:t>Physics, Actually, Volume 3: The Standard Model, Chaos, and the Edge of Knowledge</w:t>
+        <w:t xml:space="preserve">Physics, Actually, Volume 3: The Standard Model, Chaos, and the Edge of Knowledge</w:t>
       </w:r>
     </w:p>
     <w:p>
@@ -14611,15 +14611,18 @@
         <w:ind w:firstLine="0" w:left="288"/>
       </w:pPr>
       <w:r>
-        <w:t>Life, Actually: From the First Cell to the Edited Genome and the Search for Life Elsewhere</w:t>
-      </w:r>
-    </w:p>
-    <w:p>
+        <w:t xml:space="preserve">Life, Actually: From the First Cell to the Edited Genome and the Search for Life Elsewhere</w:t>
+      </w:r>
+    </w:p>
+    <w:p>
+      <w:pPr>
+        <w:ind w:firstLine="0"/>
+      </w:pPr>
       <w:r>
         <w:rPr>
           <w:b/>
         </w:rPr>
-        <w:t>Math, Actually</w:t>
+        <w:t xml:space="preserve">More Actually Books</w:t>
       </w:r>
     </w:p>
     <w:p>
@@ -14627,7 +14630,7 @@
         <w:ind w:firstLine="0" w:left="288"/>
       </w:pPr>
       <w:r>
-        <w:t>Math, Actually, Volume 1: From Arithmetic to Calculus</w:t>
+        <w:t xml:space="preserve">Gravitation, Actually: A Short Book on Gravity</w:t>
       </w:r>
     </w:p>
     <w:p>
@@ -14635,31 +14638,18 @@
         <w:ind w:firstLine="0" w:left="288"/>
       </w:pPr>
       <w:r>
-        <w:t>Math, Actually, Volume 2: From Multivariable Calculus to Set Theory &amp; Logic</w:t>
-      </w:r>
-    </w:p>
-    <w:p>
-      <w:pPr>
-        <w:ind w:firstLine="0" w:left="288"/>
-      </w:pPr>
-      <w:r>
-        <w:t>Math, Actually, Volume 3: From Differential Equations to Abstract Algebra</w:t>
-      </w:r>
-    </w:p>
-    <w:p>
-      <w:pPr>
-        <w:ind w:firstLine="0" w:left="288"/>
-      </w:pPr>
-      <w:r>
-        <w:t>Math, Actually, Volume 4: From Category Theory to the Frontier</w:t>
-      </w:r>
-    </w:p>
-    <w:p>
+        <w:t xml:space="preserve">The Universe, Actually: What Humanity Currently Understands About Reality</w:t>
+      </w:r>
+    </w:p>
+    <w:p>
+      <w:pPr>
+        <w:ind w:firstLine="0"/>
+      </w:pPr>
       <w:r>
         <w:rPr>
           <w:b/>
         </w:rPr>
-        <w:t>Quantum, Actually</w:t>
+        <w:t xml:space="preserve">Math, Actually</w:t>
       </w:r>
     </w:p>
     <w:p>
@@ -14667,7 +14657,7 @@
         <w:ind w:firstLine="0" w:left="288"/>
       </w:pPr>
       <w:r>
-        <w:t>Quantum, Actually, Volume 1: Questions and Answers from the Double Slit to the Superconducting Wire</w:t>
+        <w:t xml:space="preserve">Math, Actually, Volume 1: From Arithmetic to Calculus</w:t>
       </w:r>
     </w:p>
     <w:p>
@@ -14675,15 +14665,34 @@
         <w:ind w:firstLine="0" w:left="288"/>
       </w:pPr>
       <w:r>
-        <w:t>Quantum, Actually, Volume 2: A QED Course</w:t>
-      </w:r>
-    </w:p>
-    <w:p>
+        <w:t xml:space="preserve">Math, Actually, Volume 2: From Multivariable Calculus to Set Theory &amp; Logic</w:t>
+      </w:r>
+    </w:p>
+    <w:p>
+      <w:pPr>
+        <w:ind w:firstLine="0" w:left="288"/>
+      </w:pPr>
+      <w:r>
+        <w:t xml:space="preserve">Math, Actually, Volume 3: From Differential Equations to Abstract Algebra</w:t>
+      </w:r>
+    </w:p>
+    <w:p>
+      <w:pPr>
+        <w:ind w:firstLine="0" w:left="288"/>
+      </w:pPr>
+      <w:r>
+        <w:t xml:space="preserve">Math, Actually, Volume 4: From Category Theory to the Frontier</w:t>
+      </w:r>
+    </w:p>
+    <w:p>
+      <w:pPr>
+        <w:ind w:firstLine="0"/>
+      </w:pPr>
       <w:r>
         <w:rPr>
           <w:b/>
         </w:rPr>
-        <w:t>Science Sparks</w:t>
+        <w:t xml:space="preserve">Quantum, Actually</w:t>
       </w:r>
     </w:p>
     <w:p>
@@ -14691,15 +14700,26 @@
         <w:ind w:firstLine="0" w:left="288"/>
       </w:pPr>
       <w:r>
-        <w:t>Science Sparks: Physics, Life, and Mathematics — The Same Few Rules, Told in Highlights</w:t>
-      </w:r>
-    </w:p>
-    <w:p>
+        <w:t xml:space="preserve">Quantum, Actually, Volume 1: Questions and Answers from the Double Slit to the Superconducting Wire</w:t>
+      </w:r>
+    </w:p>
+    <w:p>
+      <w:pPr>
+        <w:ind w:firstLine="0" w:left="288"/>
+      </w:pPr>
+      <w:r>
+        <w:t xml:space="preserve">Quantum, Actually, Volume 2: A QED Course</w:t>
+      </w:r>
+    </w:p>
+    <w:p>
+      <w:pPr>
+        <w:ind w:firstLine="0"/>
+      </w:pPr>
       <w:r>
         <w:rPr>
           <w:b/>
         </w:rPr>
-        <w:t>Look First</w:t>
+        <w:t xml:space="preserve">Science Sparks</w:t>
       </w:r>
     </w:p>
     <w:p>
@@ -14707,23 +14727,18 @@
         <w:ind w:firstLine="0" w:left="288"/>
       </w:pPr>
       <w:r>
-        <w:t>Look First, Volume 1: The Universe Has No Now</w:t>
-      </w:r>
-    </w:p>
-    <w:p>
-      <w:pPr>
-        <w:ind w:firstLine="0" w:left="288"/>
-      </w:pPr>
-      <w:r>
-        <w:t>Look First, Volume 2: A Trip Is Not a New Life</w:t>
-      </w:r>
-    </w:p>
-    <w:p>
+        <w:t xml:space="preserve">Science Sparks: Physics, Life, and Mathematics — The Same Few Rules, Told in Highlights</w:t>
+      </w:r>
+    </w:p>
+    <w:p>
+      <w:pPr>
+        <w:ind w:firstLine="0"/>
+      </w:pPr>
       <w:r>
         <w:rPr>
           <w:b/>
         </w:rPr>
-        <w:t>Electrical Engineering Series</w:t>
+        <w:t xml:space="preserve">Look First</w:t>
       </w:r>
     </w:p>
     <w:p>
@@ -14731,7 +14746,7 @@
         <w:ind w:firstLine="0" w:left="288"/>
       </w:pPr>
       <w:r>
-        <w:t>Foundations of Electronics (Book 1)</w:t>
+        <w:t xml:space="preserve">Look First, Volume 1: The Universe Has No Now</w:t>
       </w:r>
     </w:p>
     <w:p>
@@ -14739,55 +14754,18 @@
         <w:ind w:firstLine="0" w:left="288"/>
       </w:pPr>
       <w:r>
-        <w:t>Circuits, Components, and Control (Book 2)</w:t>
-      </w:r>
-    </w:p>
-    <w:p>
-      <w:pPr>
-        <w:ind w:firstLine="0" w:left="288"/>
-      </w:pPr>
-      <w:r>
-        <w:t>Semiconductor Physics and Devices (Book 3)</w:t>
-      </w:r>
-    </w:p>
-    <w:p>
-      <w:pPr>
-        <w:ind w:firstLine="0" w:left="288"/>
-      </w:pPr>
-      <w:r>
-        <w:t>RF, Microwave, and Transceivers (Book 4)</w:t>
-      </w:r>
-    </w:p>
-    <w:p>
-      <w:pPr>
-        <w:ind w:firstLine="0" w:left="288"/>
-      </w:pPr>
-      <w:r>
-        <w:t>Communications, Wireless, and SDR (Book 5)</w:t>
-      </w:r>
-    </w:p>
-    <w:p>
-      <w:pPr>
-        <w:ind w:firstLine="0" w:left="288"/>
-      </w:pPr>
-      <w:r>
-        <w:t>Power and Energy (Book 6)</w:t>
-      </w:r>
-    </w:p>
-    <w:p>
-      <w:pPr>
-        <w:ind w:firstLine="0" w:left="288"/>
-      </w:pPr>
-      <w:r>
-        <w:t>Packaging, Layout, EMC, and Test (Book 7)</w:t>
-      </w:r>
-    </w:p>
-    <w:p>
+        <w:t xml:space="preserve">Look First, Volume 2: A Trip Is Not a New Life</w:t>
+      </w:r>
+    </w:p>
+    <w:p>
+      <w:pPr>
+        <w:ind w:firstLine="0"/>
+      </w:pPr>
       <w:r>
         <w:rPr>
           <w:b/>
         </w:rPr>
-        <w:t>History</w:t>
+        <w:t xml:space="preserve">Electrical Engineering Series</w:t>
       </w:r>
     </w:p>
     <w:p>
@@ -14795,15 +14773,66 @@
         <w:ind w:firstLine="0" w:left="288"/>
       </w:pPr>
       <w:r>
-        <w:t>The Dolphins' View of History</w:t>
-      </w:r>
-    </w:p>
-    <w:p>
+        <w:t xml:space="preserve">Foundations of Electronics (Book 1)</w:t>
+      </w:r>
+    </w:p>
+    <w:p>
+      <w:pPr>
+        <w:ind w:firstLine="0" w:left="288"/>
+      </w:pPr>
+      <w:r>
+        <w:t xml:space="preserve">Circuits, Components, and Control (Book 2)</w:t>
+      </w:r>
+    </w:p>
+    <w:p>
+      <w:pPr>
+        <w:ind w:firstLine="0" w:left="288"/>
+      </w:pPr>
+      <w:r>
+        <w:t xml:space="preserve">Semiconductor Physics and Devices (Book 3)</w:t>
+      </w:r>
+    </w:p>
+    <w:p>
+      <w:pPr>
+        <w:ind w:firstLine="0" w:left="288"/>
+      </w:pPr>
+      <w:r>
+        <w:t xml:space="preserve">RF, Microwave, and Transceivers (Book 4)</w:t>
+      </w:r>
+    </w:p>
+    <w:p>
+      <w:pPr>
+        <w:ind w:firstLine="0" w:left="288"/>
+      </w:pPr>
+      <w:r>
+        <w:t xml:space="preserve">Communications, Wireless, and SDR (Book 5)</w:t>
+      </w:r>
+    </w:p>
+    <w:p>
+      <w:pPr>
+        <w:ind w:firstLine="0" w:left="288"/>
+      </w:pPr>
+      <w:r>
+        <w:t xml:space="preserve">Power and Energy (Book 6)</w:t>
+      </w:r>
+    </w:p>
+    <w:p>
+      <w:pPr>
+        <w:ind w:firstLine="0" w:left="288"/>
+      </w:pPr>
+      <w:r>
+        <w:t xml:space="preserve">Packaging, Layout, EMC, and Test (Book 7)</w:t>
+      </w:r>
+    </w:p>
+    <w:p>
+      <w:pPr>
+        <w:ind w:firstLine="0"/>
+      </w:pPr>
       <w:r>
         <w:rPr>
           <w:b/>
         </w:rPr>
-        <w:t>Fiction</w:t>
+        <w:t xml:space="preserve">History</w:t>
       </w:r>
     </w:p>
     <w:p>
@@ -14811,47 +14840,18 @@
         <w:ind w:firstLine="0" w:left="288"/>
       </w:pPr>
       <w:r>
-        <w:t>The Murder That Hadn't Happened Yet (The Relativistic Investigation Bureau, Book 1)</w:t>
-      </w:r>
-    </w:p>
-    <w:p>
-      <w:pPr>
-        <w:ind w:firstLine="0" w:left="288"/>
-      </w:pPr>
-      <w:r>
-        <w:t>The Warning That Was Sent Too Late (The Relativistic Investigation Bureau, Book 2)</w:t>
-      </w:r>
-    </w:p>
-    <w:p>
-      <w:pPr>
-        <w:ind w:firstLine="0" w:left="288"/>
-      </w:pPr>
-      <w:r>
-        <w:t>Schrödinger's Paperwork (Lolly Wren's Curious Science Adventures, Book 1)</w:t>
-      </w:r>
-    </w:p>
-    <w:p>
-      <w:pPr>
-        <w:ind w:firstLine="0" w:left="288"/>
-      </w:pPr>
-      <w:r>
-        <w:t>The Permitted Options (Lolly Wren's Curious Science Adventures, Book 2)</w:t>
-      </w:r>
-    </w:p>
-    <w:p>
-      <w:pPr>
-        <w:ind w:firstLine="0" w:left="288"/>
-      </w:pPr>
-      <w:r>
-        <w:t>Protocol Flamingo (The Invasion Storybooks, Book 1), as George Herbert Fontaine</w:t>
-      </w:r>
-    </w:p>
-    <w:p>
+        <w:t xml:space="preserve">The Dolphins' View of History</w:t>
+      </w:r>
+    </w:p>
+    <w:p>
+      <w:pPr>
+        <w:ind w:firstLine="0"/>
+      </w:pPr>
       <w:r>
         <w:rPr>
           <w:b/>
         </w:rPr>
-        <w:t>How-To</w:t>
+        <w:t xml:space="preserve">Fiction</w:t>
       </w:r>
     </w:p>
     <w:p>
@@ -14859,7 +14859,7 @@
         <w:ind w:firstLine="0" w:left="288"/>
       </w:pPr>
       <w:r>
-        <w:t>Your First Book That Sells</w:t>
+        <w:t xml:space="preserve">The Murder That Hadn't Happened Yet (The Relativistic Investigation Bureau, Book 1), Lothar J. Musiol writing as Spezala Genara Relavi (S.G.R.)</w:t>
       </w:r>
     </w:p>
     <w:p>
@@ -14867,7 +14867,50 @@
         <w:ind w:firstLine="0" w:left="288"/>
       </w:pPr>
       <w:r>
-        <w:t>Your First YouTube Channel That Rocks</w:t>
+        <w:t xml:space="preserve">The Warning That Was Sent Too Late (The Relativistic Investigation Bureau, Book 2), Lothar J. Musiol writing as Spezala Genara Relavi (S.G.R.)</w:t>
+      </w:r>
+    </w:p>
+    <w:p>
+      <w:pPr>
+        <w:ind w:firstLine="0" w:left="288"/>
+      </w:pPr>
+      <w:r>
+        <w:t xml:space="preserve">Schrödinger's Paperwork (Lolly Wren's Curious Science Adventures, Book 1), Lothar J. Musiol writing as Quentin Edmund Darling (Q.E.D.)</w:t>
+      </w:r>
+    </w:p>
+    <w:p>
+      <w:pPr>
+        <w:ind w:firstLine="0" w:left="288"/>
+      </w:pPr>
+      <w:r>
+        <w:t xml:space="preserve">The Permitted Options (Lolly Wren's Curious Science Adventures, Book 2), Lothar J. Musiol writing as Quentin Edmund Darling (Q.E.D.)</w:t>
+      </w:r>
+    </w:p>
+    <w:p>
+      <w:pPr>
+        <w:ind w:firstLine="0" w:left="288"/>
+      </w:pPr>
+      <w:r>
+        <w:t xml:space="preserve">Protocol Flamingo (The Invasion Storybooks, Book 1), Lothar J. Musiol writing as George Herbert Fontaine</w:t>
+      </w:r>
+    </w:p>
+    <w:p>
+      <w:pPr>
+        <w:ind w:firstLine="0"/>
+      </w:pPr>
+      <w:r>
+        <w:rPr>
+          <w:b/>
+        </w:rPr>
+        <w:t xml:space="preserve">In German</w:t>
+      </w:r>
+    </w:p>
+    <w:p>
+      <w:pPr>
+        <w:ind w:firstLine="0" w:left="288"/>
+      </w:pPr>
+      <w:r>
+        <w:t xml:space="preserve">Auswandern – Ab in die USA, Kanada, Australien oder Neuseeland?</w:t>
       </w:r>
     </w:p>
     <w:sectPr>

</xml_diff>

<commit_message>
Also-by: In Love with Murder, Actually to canonical list [merged onto main from book-2-lectures-after-qed c75f42b, paths only]
</commit_message>
<xml_diff>
--- a/In Love with Murder, Actually/In_Love_with_Murder_Actually.docx
+++ b/In Love with Murder, Actually/In_Love_with_Murder_Actually.docx
@@ -14579,7 +14579,7 @@
         <w:rPr>
           <w:b/>
         </w:rPr>
-        <w:t>Physics, Actually</w:t>
+        <w:t xml:space="preserve">Physics, Actually</w:t>
       </w:r>
     </w:p>
     <w:p>
@@ -14587,7 +14587,7 @@
         <w:ind w:firstLine="0" w:left="288"/>
       </w:pPr>
       <w:r>
-        <w:t>Physics, Actually, Volume 1: Motion, Forces, Time, and Relativity</w:t>
+        <w:t xml:space="preserve">Physics, Actually, Volume 1: Motion, Forces, Time, and Relativity</w:t>
       </w:r>
     </w:p>
     <w:p>
@@ -14595,7 +14595,7 @@
         <w:ind w:firstLine="0" w:left="288"/>
       </w:pPr>
       <w:r>
-        <w:t>Physics, Actually, Volume 2: Gravity, Cosmology, and the Limits of Spacetime</w:t>
+        <w:t xml:space="preserve">Physics, Actually, Volume 2: Gravity, Cosmology, and the Limits of Spacetime</w:t>
       </w:r>
     </w:p>
     <w:p>
@@ -14603,7 +14603,7 @@
         <w:ind w:firstLine="0" w:left="288"/>
       </w:pPr>
       <w:r>
-        <w:t>Physics, Actually, Volume 3: The Standard Model, Chaos, and the Edge of Knowledge</w:t>
+        <w:t xml:space="preserve">Physics, Actually, Volume 3: The Standard Model, Chaos, and the Edge of Knowledge</w:t>
       </w:r>
     </w:p>
     <w:p>
@@ -14611,15 +14611,18 @@
         <w:ind w:firstLine="0" w:left="288"/>
       </w:pPr>
       <w:r>
-        <w:t>Life, Actually: From the First Cell to the Edited Genome and the Search for Life Elsewhere</w:t>
-      </w:r>
-    </w:p>
-    <w:p>
+        <w:t xml:space="preserve">Life, Actually: From the First Cell to the Edited Genome and the Search for Life Elsewhere</w:t>
+      </w:r>
+    </w:p>
+    <w:p>
+      <w:pPr>
+        <w:ind w:firstLine="0"/>
+      </w:pPr>
       <w:r>
         <w:rPr>
           <w:b/>
         </w:rPr>
-        <w:t>Math, Actually</w:t>
+        <w:t xml:space="preserve">More Actually Books</w:t>
       </w:r>
     </w:p>
     <w:p>
@@ -14627,7 +14630,7 @@
         <w:ind w:firstLine="0" w:left="288"/>
       </w:pPr>
       <w:r>
-        <w:t>Math, Actually, Volume 1: From Arithmetic to Calculus</w:t>
+        <w:t xml:space="preserve">Gravitation, Actually: A Short Book on Gravity</w:t>
       </w:r>
     </w:p>
     <w:p>
@@ -14635,31 +14638,18 @@
         <w:ind w:firstLine="0" w:left="288"/>
       </w:pPr>
       <w:r>
-        <w:t>Math, Actually, Volume 2: From Multivariable Calculus to Set Theory &amp; Logic</w:t>
-      </w:r>
-    </w:p>
-    <w:p>
-      <w:pPr>
-        <w:ind w:firstLine="0" w:left="288"/>
-      </w:pPr>
-      <w:r>
-        <w:t>Math, Actually, Volume 3: From Differential Equations to Abstract Algebra</w:t>
-      </w:r>
-    </w:p>
-    <w:p>
-      <w:pPr>
-        <w:ind w:firstLine="0" w:left="288"/>
-      </w:pPr>
-      <w:r>
-        <w:t>Math, Actually, Volume 4: From Category Theory to the Frontier</w:t>
-      </w:r>
-    </w:p>
-    <w:p>
+        <w:t xml:space="preserve">The Universe, Actually: What Humanity Currently Understands About Reality</w:t>
+      </w:r>
+    </w:p>
+    <w:p>
+      <w:pPr>
+        <w:ind w:firstLine="0"/>
+      </w:pPr>
       <w:r>
         <w:rPr>
           <w:b/>
         </w:rPr>
-        <w:t>Quantum, Actually</w:t>
+        <w:t xml:space="preserve">Math, Actually</w:t>
       </w:r>
     </w:p>
     <w:p>
@@ -14667,7 +14657,7 @@
         <w:ind w:firstLine="0" w:left="288"/>
       </w:pPr>
       <w:r>
-        <w:t>Quantum, Actually, Volume 1: Questions and Answers from the Double Slit to the Superconducting Wire</w:t>
+        <w:t xml:space="preserve">Math, Actually, Volume 1: From Arithmetic to Calculus</w:t>
       </w:r>
     </w:p>
     <w:p>
@@ -14675,15 +14665,34 @@
         <w:ind w:firstLine="0" w:left="288"/>
       </w:pPr>
       <w:r>
-        <w:t>Quantum, Actually, Volume 2: A QED Course</w:t>
-      </w:r>
-    </w:p>
-    <w:p>
+        <w:t xml:space="preserve">Math, Actually, Volume 2: From Multivariable Calculus to Set Theory &amp; Logic</w:t>
+      </w:r>
+    </w:p>
+    <w:p>
+      <w:pPr>
+        <w:ind w:firstLine="0" w:left="288"/>
+      </w:pPr>
+      <w:r>
+        <w:t xml:space="preserve">Math, Actually, Volume 3: From Differential Equations to Abstract Algebra</w:t>
+      </w:r>
+    </w:p>
+    <w:p>
+      <w:pPr>
+        <w:ind w:firstLine="0" w:left="288"/>
+      </w:pPr>
+      <w:r>
+        <w:t xml:space="preserve">Math, Actually, Volume 4: From Category Theory to the Frontier</w:t>
+      </w:r>
+    </w:p>
+    <w:p>
+      <w:pPr>
+        <w:ind w:firstLine="0"/>
+      </w:pPr>
       <w:r>
         <w:rPr>
           <w:b/>
         </w:rPr>
-        <w:t>Science Sparks</w:t>
+        <w:t xml:space="preserve">Quantum, Actually</w:t>
       </w:r>
     </w:p>
     <w:p>
@@ -14691,15 +14700,26 @@
         <w:ind w:firstLine="0" w:left="288"/>
       </w:pPr>
       <w:r>
-        <w:t>Science Sparks: Physics, Life, and Mathematics — The Same Few Rules, Told in Highlights</w:t>
-      </w:r>
-    </w:p>
-    <w:p>
+        <w:t xml:space="preserve">Quantum, Actually, Volume 1: Questions and Answers from the Double Slit to the Superconducting Wire</w:t>
+      </w:r>
+    </w:p>
+    <w:p>
+      <w:pPr>
+        <w:ind w:firstLine="0" w:left="288"/>
+      </w:pPr>
+      <w:r>
+        <w:t xml:space="preserve">Quantum, Actually, Volume 2: A QED Course</w:t>
+      </w:r>
+    </w:p>
+    <w:p>
+      <w:pPr>
+        <w:ind w:firstLine="0"/>
+      </w:pPr>
       <w:r>
         <w:rPr>
           <w:b/>
         </w:rPr>
-        <w:t>Look First</w:t>
+        <w:t xml:space="preserve">Science Sparks</w:t>
       </w:r>
     </w:p>
     <w:p>
@@ -14707,23 +14727,18 @@
         <w:ind w:firstLine="0" w:left="288"/>
       </w:pPr>
       <w:r>
-        <w:t>Look First, Volume 1: The Universe Has No Now</w:t>
-      </w:r>
-    </w:p>
-    <w:p>
-      <w:pPr>
-        <w:ind w:firstLine="0" w:left="288"/>
-      </w:pPr>
-      <w:r>
-        <w:t>Look First, Volume 2: A Trip Is Not a New Life</w:t>
-      </w:r>
-    </w:p>
-    <w:p>
+        <w:t xml:space="preserve">Science Sparks: Physics, Life, and Mathematics — The Same Few Rules, Told in Highlights</w:t>
+      </w:r>
+    </w:p>
+    <w:p>
+      <w:pPr>
+        <w:ind w:firstLine="0"/>
+      </w:pPr>
       <w:r>
         <w:rPr>
           <w:b/>
         </w:rPr>
-        <w:t>Electrical Engineering Series</w:t>
+        <w:t xml:space="preserve">Look First</w:t>
       </w:r>
     </w:p>
     <w:p>
@@ -14731,7 +14746,7 @@
         <w:ind w:firstLine="0" w:left="288"/>
       </w:pPr>
       <w:r>
-        <w:t>Foundations of Electronics (Book 1)</w:t>
+        <w:t xml:space="preserve">Look First, Volume 1: The Universe Has No Now</w:t>
       </w:r>
     </w:p>
     <w:p>
@@ -14739,55 +14754,18 @@
         <w:ind w:firstLine="0" w:left="288"/>
       </w:pPr>
       <w:r>
-        <w:t>Circuits, Components, and Control (Book 2)</w:t>
-      </w:r>
-    </w:p>
-    <w:p>
-      <w:pPr>
-        <w:ind w:firstLine="0" w:left="288"/>
-      </w:pPr>
-      <w:r>
-        <w:t>Semiconductor Physics and Devices (Book 3)</w:t>
-      </w:r>
-    </w:p>
-    <w:p>
-      <w:pPr>
-        <w:ind w:firstLine="0" w:left="288"/>
-      </w:pPr>
-      <w:r>
-        <w:t>RF, Microwave, and Transceivers (Book 4)</w:t>
-      </w:r>
-    </w:p>
-    <w:p>
-      <w:pPr>
-        <w:ind w:firstLine="0" w:left="288"/>
-      </w:pPr>
-      <w:r>
-        <w:t>Communications, Wireless, and SDR (Book 5)</w:t>
-      </w:r>
-    </w:p>
-    <w:p>
-      <w:pPr>
-        <w:ind w:firstLine="0" w:left="288"/>
-      </w:pPr>
-      <w:r>
-        <w:t>Power and Energy (Book 6)</w:t>
-      </w:r>
-    </w:p>
-    <w:p>
-      <w:pPr>
-        <w:ind w:firstLine="0" w:left="288"/>
-      </w:pPr>
-      <w:r>
-        <w:t>Packaging, Layout, EMC, and Test (Book 7)</w:t>
-      </w:r>
-    </w:p>
-    <w:p>
+        <w:t xml:space="preserve">Look First, Volume 2: A Trip Is Not a New Life</w:t>
+      </w:r>
+    </w:p>
+    <w:p>
+      <w:pPr>
+        <w:ind w:firstLine="0"/>
+      </w:pPr>
       <w:r>
         <w:rPr>
           <w:b/>
         </w:rPr>
-        <w:t>History</w:t>
+        <w:t xml:space="preserve">Electrical Engineering Series</w:t>
       </w:r>
     </w:p>
     <w:p>
@@ -14795,15 +14773,66 @@
         <w:ind w:firstLine="0" w:left="288"/>
       </w:pPr>
       <w:r>
-        <w:t>The Dolphins' View of History</w:t>
-      </w:r>
-    </w:p>
-    <w:p>
+        <w:t xml:space="preserve">Foundations of Electronics (Book 1)</w:t>
+      </w:r>
+    </w:p>
+    <w:p>
+      <w:pPr>
+        <w:ind w:firstLine="0" w:left="288"/>
+      </w:pPr>
+      <w:r>
+        <w:t xml:space="preserve">Circuits, Components, and Control (Book 2)</w:t>
+      </w:r>
+    </w:p>
+    <w:p>
+      <w:pPr>
+        <w:ind w:firstLine="0" w:left="288"/>
+      </w:pPr>
+      <w:r>
+        <w:t xml:space="preserve">Semiconductor Physics and Devices (Book 3)</w:t>
+      </w:r>
+    </w:p>
+    <w:p>
+      <w:pPr>
+        <w:ind w:firstLine="0" w:left="288"/>
+      </w:pPr>
+      <w:r>
+        <w:t xml:space="preserve">RF, Microwave, and Transceivers (Book 4)</w:t>
+      </w:r>
+    </w:p>
+    <w:p>
+      <w:pPr>
+        <w:ind w:firstLine="0" w:left="288"/>
+      </w:pPr>
+      <w:r>
+        <w:t xml:space="preserve">Communications, Wireless, and SDR (Book 5)</w:t>
+      </w:r>
+    </w:p>
+    <w:p>
+      <w:pPr>
+        <w:ind w:firstLine="0" w:left="288"/>
+      </w:pPr>
+      <w:r>
+        <w:t xml:space="preserve">Power and Energy (Book 6)</w:t>
+      </w:r>
+    </w:p>
+    <w:p>
+      <w:pPr>
+        <w:ind w:firstLine="0" w:left="288"/>
+      </w:pPr>
+      <w:r>
+        <w:t xml:space="preserve">Packaging, Layout, EMC, and Test (Book 7)</w:t>
+      </w:r>
+    </w:p>
+    <w:p>
+      <w:pPr>
+        <w:ind w:firstLine="0"/>
+      </w:pPr>
       <w:r>
         <w:rPr>
           <w:b/>
         </w:rPr>
-        <w:t>Fiction</w:t>
+        <w:t xml:space="preserve">History</w:t>
       </w:r>
     </w:p>
     <w:p>
@@ -14811,47 +14840,18 @@
         <w:ind w:firstLine="0" w:left="288"/>
       </w:pPr>
       <w:r>
-        <w:t>The Murder That Hadn't Happened Yet (The Relativistic Investigation Bureau, Book 1)</w:t>
-      </w:r>
-    </w:p>
-    <w:p>
-      <w:pPr>
-        <w:ind w:firstLine="0" w:left="288"/>
-      </w:pPr>
-      <w:r>
-        <w:t>The Warning That Was Sent Too Late (The Relativistic Investigation Bureau, Book 2)</w:t>
-      </w:r>
-    </w:p>
-    <w:p>
-      <w:pPr>
-        <w:ind w:firstLine="0" w:left="288"/>
-      </w:pPr>
-      <w:r>
-        <w:t>Schrödinger's Paperwork (Lolly Wren's Curious Science Adventures, Book 1)</w:t>
-      </w:r>
-    </w:p>
-    <w:p>
-      <w:pPr>
-        <w:ind w:firstLine="0" w:left="288"/>
-      </w:pPr>
-      <w:r>
-        <w:t>The Permitted Options (Lolly Wren's Curious Science Adventures, Book 2)</w:t>
-      </w:r>
-    </w:p>
-    <w:p>
-      <w:pPr>
-        <w:ind w:firstLine="0" w:left="288"/>
-      </w:pPr>
-      <w:r>
-        <w:t>Protocol Flamingo (The Invasion Storybooks, Book 1), as George Herbert Fontaine</w:t>
-      </w:r>
-    </w:p>
-    <w:p>
+        <w:t xml:space="preserve">The Dolphins' View of History</w:t>
+      </w:r>
+    </w:p>
+    <w:p>
+      <w:pPr>
+        <w:ind w:firstLine="0"/>
+      </w:pPr>
       <w:r>
         <w:rPr>
           <w:b/>
         </w:rPr>
-        <w:t>How-To</w:t>
+        <w:t xml:space="preserve">Fiction</w:t>
       </w:r>
     </w:p>
     <w:p>
@@ -14859,7 +14859,7 @@
         <w:ind w:firstLine="0" w:left="288"/>
       </w:pPr>
       <w:r>
-        <w:t>Your First Book That Sells</w:t>
+        <w:t xml:space="preserve">The Murder That Hadn't Happened Yet (The Relativistic Investigation Bureau, Book 1), Lothar J. Musiol writing as Spezala Genara Relavi (S.G.R.)</w:t>
       </w:r>
     </w:p>
     <w:p>
@@ -14867,7 +14867,50 @@
         <w:ind w:firstLine="0" w:left="288"/>
       </w:pPr>
       <w:r>
-        <w:t>Your First YouTube Channel That Rocks</w:t>
+        <w:t xml:space="preserve">The Warning That Was Sent Too Late (The Relativistic Investigation Bureau, Book 2), Lothar J. Musiol writing as Spezala Genara Relavi (S.G.R.)</w:t>
+      </w:r>
+    </w:p>
+    <w:p>
+      <w:pPr>
+        <w:ind w:firstLine="0" w:left="288"/>
+      </w:pPr>
+      <w:r>
+        <w:t xml:space="preserve">Schrödinger's Paperwork (Lolly Wren's Curious Science Adventures, Book 1), Lothar J. Musiol writing as Quentin Edmund Darling (Q.E.D.)</w:t>
+      </w:r>
+    </w:p>
+    <w:p>
+      <w:pPr>
+        <w:ind w:firstLine="0" w:left="288"/>
+      </w:pPr>
+      <w:r>
+        <w:t xml:space="preserve">The Permitted Options (Lolly Wren's Curious Science Adventures, Book 2), Lothar J. Musiol writing as Quentin Edmund Darling (Q.E.D.)</w:t>
+      </w:r>
+    </w:p>
+    <w:p>
+      <w:pPr>
+        <w:ind w:firstLine="0" w:left="288"/>
+      </w:pPr>
+      <w:r>
+        <w:t xml:space="preserve">Protocol Flamingo (The Invasion Storybooks, Book 1), Lothar J. Musiol writing as George Herbert Fontaine</w:t>
+      </w:r>
+    </w:p>
+    <w:p>
+      <w:pPr>
+        <w:ind w:firstLine="0"/>
+      </w:pPr>
+      <w:r>
+        <w:rPr>
+          <w:b/>
+        </w:rPr>
+        <w:t xml:space="preserve">In German</w:t>
+      </w:r>
+    </w:p>
+    <w:p>
+      <w:pPr>
+        <w:ind w:firstLine="0" w:left="288"/>
+      </w:pPr>
+      <w:r>
+        <w:t xml:space="preserve">Auswandern – Ab in die USA, Kanada, Australien oder Neuseeland?</w:t>
       </w:r>
     </w:p>
     <w:sectPr>

</xml_diff>

<commit_message>
About the Author (A): In Love with Murder, Actually
</commit_message>
<xml_diff>
--- a/In Love with Murder, Actually/In_Love_with_Murder_Actually.docx
+++ b/In Love with Murder, Actually/In_Love_with_Murder_Actually.docx
@@ -14560,6 +14560,45 @@
     <w:p>
       <w:r>
         <w:br w:type="page"/>
+      </w:r>
+    </w:p>
+    <w:p>
+      <w:pPr>
+        <w:pStyle w:val="Heading2"/>
+        <w:pageBreakBefore/>
+      </w:pPr>
+      <w:r>
+        <w:t xml:space="preserve">About the Author</w:t>
+      </w:r>
+    </w:p>
+    <w:p>
+      <w:r>
+        <w:t xml:space="preserve">Lothar J. Musiol is German by birth and American by choice, and he writes in British because he regards it as the most awkward American dialect. For exactly that reason he is a staunch aficionado of British films such as </w:t>
+      </w:r>
+      <w:r>
+        <w:rPr>
+          <w:i/>
+          <w:iCs/>
+        </w:rPr>
+        <w:t xml:space="preserve">Four Weddings and a Funeral</w:t>
+      </w:r>
+      <w:r>
+        <w:t xml:space="preserve">. The preposterous accent, however, was inspired by </w:t>
+      </w:r>
+      <w:r>
+        <w:rPr>
+          <w:i/>
+          <w:iCs/>
+        </w:rPr>
+        <w:t xml:space="preserve">Love Actually</w:t>
+      </w:r>
+      <w:r>
+        <w:t xml:space="preserve">, in which a daft sod named Colin Frissell flies to America and has a conversation in a bar before arriving at the true purpose of his travels. The author found that eye-opening and still hopes to get there one day, if he keeps up his admittedly naff British long enough.</w:t>
+      </w:r>
+    </w:p>
+    <w:p>
+      <w:r>
+        <w:t xml:space="preserve">A graduate of Munich University of Applied Sciences, he spent more than forty years in the semiconductor industry, first at Germany's largest company in the field, then at a string of American start-ups. Dual citizenship, put to its most sensible use, lets him split his time between San Clemente, California, and Passau, Bavaria, where Austria begins at the garden fence. The household includes one married daughter, one grumpy Teacup Pomeranian named Gucci, and eleven chickens, listed in order of seniority rather than volume.</w:t>
       </w:r>
     </w:p>
     <w:p>

</xml_diff>

<commit_message>
About the Author (A): In Love with Murder, Actually [merged onto main from book-2-lectures-after-qed 5931679, paths only]
</commit_message>
<xml_diff>
--- a/In Love with Murder, Actually/In_Love_with_Murder_Actually.docx
+++ b/In Love with Murder, Actually/In_Love_with_Murder_Actually.docx
@@ -14560,6 +14560,45 @@
     <w:p>
       <w:r>
         <w:br w:type="page"/>
+      </w:r>
+    </w:p>
+    <w:p>
+      <w:pPr>
+        <w:pStyle w:val="Heading2"/>
+        <w:pageBreakBefore/>
+      </w:pPr>
+      <w:r>
+        <w:t xml:space="preserve">About the Author</w:t>
+      </w:r>
+    </w:p>
+    <w:p>
+      <w:r>
+        <w:t xml:space="preserve">Lothar J. Musiol is German by birth and American by choice, and he writes in British because he regards it as the most awkward American dialect. For exactly that reason he is a staunch aficionado of British films such as </w:t>
+      </w:r>
+      <w:r>
+        <w:rPr>
+          <w:i/>
+          <w:iCs/>
+        </w:rPr>
+        <w:t xml:space="preserve">Four Weddings and a Funeral</w:t>
+      </w:r>
+      <w:r>
+        <w:t xml:space="preserve">. The preposterous accent, however, was inspired by </w:t>
+      </w:r>
+      <w:r>
+        <w:rPr>
+          <w:i/>
+          <w:iCs/>
+        </w:rPr>
+        <w:t xml:space="preserve">Love Actually</w:t>
+      </w:r>
+      <w:r>
+        <w:t xml:space="preserve">, in which a daft sod named Colin Frissell flies to America and has a conversation in a bar before arriving at the true purpose of his travels. The author found that eye-opening and still hopes to get there one day, if he keeps up his admittedly naff British long enough.</w:t>
+      </w:r>
+    </w:p>
+    <w:p>
+      <w:r>
+        <w:t xml:space="preserve">A graduate of Munich University of Applied Sciences, he spent more than forty years in the semiconductor industry, first at Germany's largest company in the field, then at a string of American start-ups. Dual citizenship, put to its most sensible use, lets him split his time between San Clemente, California, and Passau, Bavaria, where Austria begins at the garden fence. The household includes one married daughter, one grumpy Teacup Pomeranian named Gucci, and eleven chickens, listed in order of seniority rather than volume.</w:t>
       </w:r>
     </w:p>
     <w:p>

</xml_diff>

<commit_message>
TOC complete and linked + review invitation: In Love with Murder, Actually
</commit_message>
<xml_diff>
--- a/In Love with Murder, Actually/In_Love_with_Murder_Actually.docx
+++ b/In Love with Murder, Actually/In_Love_with_Murder_Actually.docx
@@ -1563,6 +1563,70 @@
       </w:r>
     </w:p>
     <w:p>
+      <w:pPr>
+        <w:tabs>
+          <w:tab w:pos="5544" w:val="right" w:leader="dot"/>
+        </w:tabs>
+        <w:ind w:firstLine="0" w:left="288"/>
+      </w:pPr>
+      <w:hyperlink w:anchor="_TocAll0001" w:history="1">
+        <w:r>
+          <w:rPr/>
+          <w:t xml:space="preserve">About the Author</w:t>
+        </w:r>
+      </w:hyperlink>
+      <w:r>
+        <w:tab/>
+      </w:r>
+      <w:r>
+        <w:fldChar w:fldCharType="begin" w:dirty="true"/>
+      </w:r>
+      <w:r>
+        <w:instrText xml:space="preserve"> PAGEREF _TocAll0001 \h </w:instrText>
+      </w:r>
+      <w:r>
+        <w:fldChar w:fldCharType="separate"/>
+      </w:r>
+      <w:r>
+        <w:t>293</w:t>
+      </w:r>
+      <w:r>
+        <w:fldChar w:fldCharType="end"/>
+      </w:r>
+    </w:p>
+    <w:p>
+      <w:pPr>
+        <w:tabs>
+          <w:tab w:pos="5544" w:val="right" w:leader="dot"/>
+        </w:tabs>
+        <w:ind w:firstLine="0" w:left="288"/>
+      </w:pPr>
+      <w:hyperlink w:anchor="_TocAll0002" w:history="1">
+        <w:r>
+          <w:rPr/>
+          <w:t xml:space="preserve">Also by Lothar J. Musiol</w:t>
+        </w:r>
+      </w:hyperlink>
+      <w:r>
+        <w:tab/>
+      </w:r>
+      <w:r>
+        <w:fldChar w:fldCharType="begin" w:dirty="true"/>
+      </w:r>
+      <w:r>
+        <w:instrText xml:space="preserve"> PAGEREF _TocAll0002 \h </w:instrText>
+      </w:r>
+      <w:r>
+        <w:fldChar w:fldCharType="separate"/>
+      </w:r>
+      <w:r>
+        <w:t>294</w:t>
+      </w:r>
+      <w:r>
+        <w:fldChar w:fldCharType="end"/>
+      </w:r>
+    </w:p>
+    <w:p>
       <w:r>
         <w:br w:type="page"/>
       </w:r>
@@ -14563,10 +14627,22 @@
       </w:r>
     </w:p>
     <w:p>
+      <w:pPr/>
+      <w:r>
+        <w:rPr>
+          <w:i/>
+          <w:iCs/>
+        </w:rPr>
+        <w:t xml:space="preserve">If you enjoyed the story, a few words on Amazon would mean a great deal. It's how other readers find their way here, and I read every one.</w:t>
+      </w:r>
+    </w:p>
+    <w:p>
       <w:pPr>
         <w:pStyle w:val="Heading2"/>
         <w:pageBreakBefore/>
       </w:pPr>
+      <w:bookmarkStart w:id="142" w:name="_TocAll0001"/>
+      <w:bookmarkEnd w:id="142"/>
       <w:r>
         <w:t xml:space="preserve">About the Author</w:t>
       </w:r>
@@ -14606,6 +14682,8 @@
         <w:pStyle w:val="Heading2"/>
         <w:pageBreakBefore/>
       </w:pPr>
+      <w:bookmarkStart w:id="143" w:name="_TocAll0002"/>
+      <w:bookmarkEnd w:id="143"/>
       <w:r>
         <w:t>Also by Lothar J. Musiol</w:t>
       </w:r>

</xml_diff>

<commit_message>
TOC complete and linked + review invitation: In Love with Murder, Actually [merged onto main from book-2-lectures-after-qed f54e645, paths only]
</commit_message>
<xml_diff>
--- a/In Love with Murder, Actually/In_Love_with_Murder_Actually.docx
+++ b/In Love with Murder, Actually/In_Love_with_Murder_Actually.docx
@@ -1563,6 +1563,70 @@
       </w:r>
     </w:p>
     <w:p>
+      <w:pPr>
+        <w:tabs>
+          <w:tab w:pos="5544" w:val="right" w:leader="dot"/>
+        </w:tabs>
+        <w:ind w:firstLine="0" w:left="288"/>
+      </w:pPr>
+      <w:hyperlink w:anchor="_TocAll0001" w:history="1">
+        <w:r>
+          <w:rPr/>
+          <w:t xml:space="preserve">About the Author</w:t>
+        </w:r>
+      </w:hyperlink>
+      <w:r>
+        <w:tab/>
+      </w:r>
+      <w:r>
+        <w:fldChar w:fldCharType="begin" w:dirty="true"/>
+      </w:r>
+      <w:r>
+        <w:instrText xml:space="preserve"> PAGEREF _TocAll0001 \h </w:instrText>
+      </w:r>
+      <w:r>
+        <w:fldChar w:fldCharType="separate"/>
+      </w:r>
+      <w:r>
+        <w:t>293</w:t>
+      </w:r>
+      <w:r>
+        <w:fldChar w:fldCharType="end"/>
+      </w:r>
+    </w:p>
+    <w:p>
+      <w:pPr>
+        <w:tabs>
+          <w:tab w:pos="5544" w:val="right" w:leader="dot"/>
+        </w:tabs>
+        <w:ind w:firstLine="0" w:left="288"/>
+      </w:pPr>
+      <w:hyperlink w:anchor="_TocAll0002" w:history="1">
+        <w:r>
+          <w:rPr/>
+          <w:t xml:space="preserve">Also by Lothar J. Musiol</w:t>
+        </w:r>
+      </w:hyperlink>
+      <w:r>
+        <w:tab/>
+      </w:r>
+      <w:r>
+        <w:fldChar w:fldCharType="begin" w:dirty="true"/>
+      </w:r>
+      <w:r>
+        <w:instrText xml:space="preserve"> PAGEREF _TocAll0002 \h </w:instrText>
+      </w:r>
+      <w:r>
+        <w:fldChar w:fldCharType="separate"/>
+      </w:r>
+      <w:r>
+        <w:t>294</w:t>
+      </w:r>
+      <w:r>
+        <w:fldChar w:fldCharType="end"/>
+      </w:r>
+    </w:p>
+    <w:p>
       <w:r>
         <w:br w:type="page"/>
       </w:r>
@@ -14563,10 +14627,22 @@
       </w:r>
     </w:p>
     <w:p>
+      <w:pPr/>
+      <w:r>
+        <w:rPr>
+          <w:i/>
+          <w:iCs/>
+        </w:rPr>
+        <w:t xml:space="preserve">If you enjoyed the story, a few words on Amazon would mean a great deal. It's how other readers find their way here, and I read every one.</w:t>
+      </w:r>
+    </w:p>
+    <w:p>
       <w:pPr>
         <w:pStyle w:val="Heading2"/>
         <w:pageBreakBefore/>
       </w:pPr>
+      <w:bookmarkStart w:id="142" w:name="_TocAll0001"/>
+      <w:bookmarkEnd w:id="142"/>
       <w:r>
         <w:t xml:space="preserve">About the Author</w:t>
       </w:r>
@@ -14606,6 +14682,8 @@
         <w:pStyle w:val="Heading2"/>
         <w:pageBreakBefore/>
       </w:pPr>
+      <w:bookmarkStart w:id="143" w:name="_TocAll0002"/>
+      <w:bookmarkEnd w:id="143"/>
       <w:r>
         <w:t>Also by Lothar J. Musiol</w:t>
       </w:r>

</xml_diff>

<commit_message>
ILWM docx: add Skippy and the lilac-summons gag (inserted into the Word master with matching styles; TOC page numbers shifted for Ch29-Epilogue)
Co-Authored-By: Claude Sonnet 5.5 <noreply@anthropic.com>
</commit_message>
<xml_diff>
--- a/In Love with Murder, Actually/In_Love_with_Murder_Actually.docx
+++ b/In Love with Murder, Actually/In_Love_with_Murder_Actually.docx
@@ -1268,7 +1268,7 @@
         <w:fldChar w:fldCharType="separate"/>
       </w:r>
       <w:r>
-        <w:t xml:space="preserve">193</w:t>
+        <w:t xml:space="preserve">194</w:t>
       </w:r>
       <w:r>
         <w:fldChar w:fldCharType="end"/>
@@ -1300,7 +1300,7 @@
         <w:fldChar w:fldCharType="separate"/>
       </w:r>
       <w:r>
-        <w:t xml:space="preserve">201</w:t>
+        <w:t xml:space="preserve">202</w:t>
       </w:r>
       <w:r>
         <w:fldChar w:fldCharType="end"/>
@@ -1332,7 +1332,7 @@
         <w:fldChar w:fldCharType="separate"/>
       </w:r>
       <w:r>
-        <w:t xml:space="preserve">213</w:t>
+        <w:t xml:space="preserve">214</w:t>
       </w:r>
       <w:r>
         <w:fldChar w:fldCharType="end"/>
@@ -1364,7 +1364,7 @@
         <w:fldChar w:fldCharType="separate"/>
       </w:r>
       <w:r>
-        <w:t xml:space="preserve">219</w:t>
+        <w:t xml:space="preserve">220</w:t>
       </w:r>
       <w:r>
         <w:fldChar w:fldCharType="end"/>
@@ -1396,7 +1396,7 @@
         <w:fldChar w:fldCharType="separate"/>
       </w:r>
       <w:r>
-        <w:t xml:space="preserve">230</w:t>
+        <w:t xml:space="preserve">231</w:t>
       </w:r>
       <w:r>
         <w:fldChar w:fldCharType="end"/>
@@ -1428,7 +1428,7 @@
         <w:fldChar w:fldCharType="separate"/>
       </w:r>
       <w:r>
-        <w:t xml:space="preserve">240</w:t>
+        <w:t xml:space="preserve">241</w:t>
       </w:r>
       <w:r>
         <w:fldChar w:fldCharType="end"/>
@@ -1460,7 +1460,7 @@
         <w:fldChar w:fldCharType="separate"/>
       </w:r>
       <w:r>
-        <w:t xml:space="preserve">252</w:t>
+        <w:t xml:space="preserve">253</w:t>
       </w:r>
       <w:r>
         <w:fldChar w:fldCharType="end"/>
@@ -1492,7 +1492,7 @@
         <w:fldChar w:fldCharType="separate"/>
       </w:r>
       <w:r>
-        <w:t xml:space="preserve">266</w:t>
+        <w:t xml:space="preserve">269</w:t>
       </w:r>
       <w:r>
         <w:fldChar w:fldCharType="end"/>
@@ -1524,7 +1524,7 @@
         <w:fldChar w:fldCharType="separate"/>
       </w:r>
       <w:r>
-        <w:t xml:space="preserve">272</w:t>
+        <w:t xml:space="preserve">275</w:t>
       </w:r>
       <w:r>
         <w:fldChar w:fldCharType="end"/>
@@ -1556,7 +1556,7 @@
         <w:fldChar w:fldCharType="separate"/>
       </w:r>
       <w:r>
-        <w:t xml:space="preserve">278</w:t>
+        <w:t xml:space="preserve">281</w:t>
       </w:r>
       <w:r>
         <w:fldChar w:fldCharType="end"/>
@@ -2993,6 +2993,26 @@
     </w:p>
     <w:p>
       <w:r>
+        <w:t xml:space="preserve">He was not the only one who had left the bird park. On the Thursday Tobias went over the garden wall to return a colander, and found, under an apple tree in Madame Fournier's orchard, a large grey animal standing upright with its forearms folded, regarding him with the patient disdain of a nightclub doorman.</w:t>
+      </w:r>
+    </w:p>
+    <w:p>
+      <w:r>
+        <w:t xml:space="preserve">"That is Skippy," said Madame Fournier. "The park had also an outback. A very small outback. He left the same night as the pelican, and he came here, and I did not ask why. He guards the apples."</w:t>
+      </w:r>
+    </w:p>
+    <w:p>
+      <w:r>
+        <w:t xml:space="preserve">"Does he box?"</w:t>
+      </w:r>
+    </w:p>
+    <w:p>
+      <w:r>
+        <w:t xml:space="preserve">"Only men in expensive coats," said Madame Fournier. "It is a quality I respect."</w:t>
+      </w:r>
+    </w:p>
+    <w:p>
+      <w:r>
         <w:t>The pelican stayed. It fished at dawn, stood about at noon looking gravely at nothing, and bobbed its enormous beak whenever Tobias went by, as if it knew exactly what he was writing and had notes.</w:t>
       </w:r>
     </w:p>
@@ -10352,6 +10372,31 @@
     </w:p>
     <w:p>
       <w:r>
+        <w:t xml:space="preserve">"And on the way in," said the second Gaston, with the flat voice of a man who had stopped expecting to be believed, "before the gong, in the lane, by the orchard wall, I was hit. By something. At the height of my chest. A very large man in a fur coat, with a pouch. He took my legs out from under me and then he stood over me, with his arms folded, until I got up and went away."</w:t>
+      </w:r>
+    </w:p>
+    <w:p>
+      <w:r>
+        <w:t xml:space="preserve">Mara looked at Madame Fournier, who had come in with the blankets.</w:t>
+      </w:r>
+    </w:p>
+    <w:p>
+      <w:r>
+        <w:t xml:space="preserve">"That will be Skippy," said Madame Fournier. "He has always had very strong views about people in dark coats."</w:t>
+      </w:r>
+    </w:p>
+    <w:p>
+      <w:r>
+        <w:t xml:space="preserve">"You have a kangaroo," said Mara.</w:t>
+      </w:r>
+    </w:p>
+    <w:p>
+      <w:r>
+        <w:t xml:space="preserve">"I have an orchard," said Madame Fournier. "What lives in it is its own affair."</w:t>
+      </w:r>
+    </w:p>
+    <w:p>
+      <w:r>
         <w:t>The Gastons were taken away at half past midnight in the back of the gendarmes' car, still in the army blankets, which Madame Fournier said they could keep, as they had been bought for a war and had finally seen action. As the car went down the lane with its blue light turning, she stood at the gate with her secateurs and watched it go with an expression of deep satisfaction.</w:t>
       </w:r>
     </w:p>
@@ -13061,6 +13106,80 @@
       <w:pPr>
         <w:ind w:firstLine="0"/>
       </w:pPr>
+      <w:r>
+        <w:t xml:space="preserve">The summons had come in January, on pale lilac paper, in an envelope with no stamp and no sender. It required Monsieur Tobias Lind to present himself at the tribunal in Aix, Room 14, on the first Monday of March, at nine o'clock. It did not say why.</w:t>
+      </w:r>
+    </w:p>
+    <w:p>
+      <w:r>
+        <w:t xml:space="preserve">He rang the number at the bottom. A woman answered, said "It is being clarified," and put the phone down. A man answered, said the same, and did the same. A recorded voice, pleasant, said that his call was important to them, and that the matter was being clarified, and that he should please hold, and he held for forty minutes while a violin played, and at the end the voice thanked him for waiting and hung up.</w:t>
+      </w:r>
+    </w:p>
+    <w:p>
+      <w:r>
+        <w:t xml:space="preserve">"What have I done?" he asked Catarina.</w:t>
+      </w:r>
+    </w:p>
+    <w:p>
+      <w:r>
+        <w:t xml:space="preserve">"Perhaps something," said Catarina, who had been brought up Catholic and believed in being charged first. "You will find out."</w:t>
+      </w:r>
+    </w:p>
+    <w:p>
+      <w:r>
+        <w:t xml:space="preserve">He found out nothing. In Room 14, on the first Monday of March, he sat for three hours on a bench among a number of silent, well-dressed strangers, each of whom appeared to be waiting for a verdict on something. At noon a clerk read a name from a list and nobody got up. At one he read it again. At two he read it a third time, and Tobias, who could not in his whole life sit quietly while a name was read, put up his hand.</w:t>
+      </w:r>
+    </w:p>
+    <w:p>
+      <w:r>
+        <w:t xml:space="preserve">"Lind," said the clerk. "Tobias."</w:t>
+      </w:r>
+    </w:p>
+    <w:p>
+      <w:r>
+        <w:t xml:space="preserve">"Yes?"</w:t>
+      </w:r>
+    </w:p>
+    <w:p>
+      <w:r>
+        <w:t xml:space="preserve">"It is not you."</w:t>
+      </w:r>
+    </w:p>
+    <w:p>
+      <w:r>
+        <w:t xml:space="preserve">"It's my name."</w:t>
+      </w:r>
+    </w:p>
+    <w:p>
+      <w:r>
+        <w:t xml:space="preserve">"It is a different Tobias Lind." The clerk consulted a document that turned out, on closer inspection, to be a restaurant menu. "Tobias Lindt. With a </w:t>
+      </w:r>
+      <w:r>
+        <w:rPr>
+          <w:i/>
+        </w:rPr>
+        <w:t xml:space="preserve">t</w:t>
+      </w:r>
+      <w:r>
+        <w:t xml:space="preserve">. A chocolatier from Zurich. He is accused of being too good at chocolate."</w:t>
+      </w:r>
+    </w:p>
+    <w:p>
+      <w:r>
+        <w:t xml:space="preserve">"That isn't a crime."</w:t>
+      </w:r>
+    </w:p>
+    <w:p>
+      <w:r>
+        <w:t xml:space="preserve">"In the Canton of Vaud it is. It is a very old law." The clerk looked distressed. "You were never accused of anything, monsieur. It was a clerical error. The paper was put in the wrong envelope, and the envelope in the wrong post, and the post sent in the wrong year. It has been clarified."</w:t>
+      </w:r>
+    </w:p>
+    <w:p>
+      <w:r>
+        <w:t xml:space="preserve">Tobias came out into the light at half past two, having missed, as he learned that evening from Inês, who had sat through all of it with a notebook and gave him a full account with commentary, only the first morning of the larger trial, which had consisted mostly of the reading of lists. At the foot of the steps a small, tearful man in a chocolatier's apron pressed a large, beautifully wrapped box into his arms, said "Thank you, I will never forget you," and ran off among the plane trees. It contained thirty-six hand-made truffles. They were the best Tobias had ever tasted. He never found out why.</w:t>
+      </w:r>
+    </w:p>
+    <w:p>
       <w:r>
         <w:t>The larger trial began in March, one year almost to the day after Elise Marchetti died, at the Cour d'assises in the Palais de Justice at Aix-en-Provence: a handsome, pale, pillared building facing a square of plane trees, still bare that early in the year, where on market mornings stalls sold lavender, old postcards, saucisson and cheese of a tragic ripeness.</w:t>
       </w:r>

</xml_diff>

<commit_message>
ILWM: Skippy the kangaroo and the lilac-summons gag in novel md and Word master (merged onto main from book-2-lectures-after-qed 9763e28, paths only)
Co-Authored-By: Claude Sonnet 5.5 <noreply@anthropic.com>
</commit_message>
<xml_diff>
--- a/In Love with Murder, Actually/In_Love_with_Murder_Actually.docx
+++ b/In Love with Murder, Actually/In_Love_with_Murder_Actually.docx
@@ -1268,7 +1268,7 @@
         <w:fldChar w:fldCharType="separate"/>
       </w:r>
       <w:r>
-        <w:t xml:space="preserve">193</w:t>
+        <w:t xml:space="preserve">194</w:t>
       </w:r>
       <w:r>
         <w:fldChar w:fldCharType="end"/>
@@ -1300,7 +1300,7 @@
         <w:fldChar w:fldCharType="separate"/>
       </w:r>
       <w:r>
-        <w:t xml:space="preserve">201</w:t>
+        <w:t xml:space="preserve">202</w:t>
       </w:r>
       <w:r>
         <w:fldChar w:fldCharType="end"/>
@@ -1332,7 +1332,7 @@
         <w:fldChar w:fldCharType="separate"/>
       </w:r>
       <w:r>
-        <w:t xml:space="preserve">213</w:t>
+        <w:t xml:space="preserve">214</w:t>
       </w:r>
       <w:r>
         <w:fldChar w:fldCharType="end"/>
@@ -1364,7 +1364,7 @@
         <w:fldChar w:fldCharType="separate"/>
       </w:r>
       <w:r>
-        <w:t xml:space="preserve">219</w:t>
+        <w:t xml:space="preserve">220</w:t>
       </w:r>
       <w:r>
         <w:fldChar w:fldCharType="end"/>
@@ -1396,7 +1396,7 @@
         <w:fldChar w:fldCharType="separate"/>
       </w:r>
       <w:r>
-        <w:t xml:space="preserve">230</w:t>
+        <w:t xml:space="preserve">231</w:t>
       </w:r>
       <w:r>
         <w:fldChar w:fldCharType="end"/>
@@ -1428,7 +1428,7 @@
         <w:fldChar w:fldCharType="separate"/>
       </w:r>
       <w:r>
-        <w:t xml:space="preserve">240</w:t>
+        <w:t xml:space="preserve">241</w:t>
       </w:r>
       <w:r>
         <w:fldChar w:fldCharType="end"/>
@@ -1460,7 +1460,7 @@
         <w:fldChar w:fldCharType="separate"/>
       </w:r>
       <w:r>
-        <w:t xml:space="preserve">252</w:t>
+        <w:t xml:space="preserve">253</w:t>
       </w:r>
       <w:r>
         <w:fldChar w:fldCharType="end"/>
@@ -1492,7 +1492,7 @@
         <w:fldChar w:fldCharType="separate"/>
       </w:r>
       <w:r>
-        <w:t xml:space="preserve">266</w:t>
+        <w:t xml:space="preserve">269</w:t>
       </w:r>
       <w:r>
         <w:fldChar w:fldCharType="end"/>
@@ -1524,7 +1524,7 @@
         <w:fldChar w:fldCharType="separate"/>
       </w:r>
       <w:r>
-        <w:t xml:space="preserve">272</w:t>
+        <w:t xml:space="preserve">275</w:t>
       </w:r>
       <w:r>
         <w:fldChar w:fldCharType="end"/>
@@ -1556,7 +1556,7 @@
         <w:fldChar w:fldCharType="separate"/>
       </w:r>
       <w:r>
-        <w:t xml:space="preserve">278</w:t>
+        <w:t xml:space="preserve">281</w:t>
       </w:r>
       <w:r>
         <w:fldChar w:fldCharType="end"/>
@@ -2993,6 +2993,26 @@
     </w:p>
     <w:p>
       <w:r>
+        <w:t xml:space="preserve">He was not the only one who had left the bird park. On the Thursday Tobias went over the garden wall to return a colander, and found, under an apple tree in Madame Fournier's orchard, a large grey animal standing upright with its forearms folded, regarding him with the patient disdain of a nightclub doorman.</w:t>
+      </w:r>
+    </w:p>
+    <w:p>
+      <w:r>
+        <w:t xml:space="preserve">"That is Skippy," said Madame Fournier. "The park had also an outback. A very small outback. He left the same night as the pelican, and he came here, and I did not ask why. He guards the apples."</w:t>
+      </w:r>
+    </w:p>
+    <w:p>
+      <w:r>
+        <w:t xml:space="preserve">"Does he box?"</w:t>
+      </w:r>
+    </w:p>
+    <w:p>
+      <w:r>
+        <w:t xml:space="preserve">"Only men in expensive coats," said Madame Fournier. "It is a quality I respect."</w:t>
+      </w:r>
+    </w:p>
+    <w:p>
+      <w:r>
         <w:t>The pelican stayed. It fished at dawn, stood about at noon looking gravely at nothing, and bobbed its enormous beak whenever Tobias went by, as if it knew exactly what he was writing and had notes.</w:t>
       </w:r>
     </w:p>
@@ -10352,6 +10372,31 @@
     </w:p>
     <w:p>
       <w:r>
+        <w:t xml:space="preserve">"And on the way in," said the second Gaston, with the flat voice of a man who had stopped expecting to be believed, "before the gong, in the lane, by the orchard wall, I was hit. By something. At the height of my chest. A very large man in a fur coat, with a pouch. He took my legs out from under me and then he stood over me, with his arms folded, until I got up and went away."</w:t>
+      </w:r>
+    </w:p>
+    <w:p>
+      <w:r>
+        <w:t xml:space="preserve">Mara looked at Madame Fournier, who had come in with the blankets.</w:t>
+      </w:r>
+    </w:p>
+    <w:p>
+      <w:r>
+        <w:t xml:space="preserve">"That will be Skippy," said Madame Fournier. "He has always had very strong views about people in dark coats."</w:t>
+      </w:r>
+    </w:p>
+    <w:p>
+      <w:r>
+        <w:t xml:space="preserve">"You have a kangaroo," said Mara.</w:t>
+      </w:r>
+    </w:p>
+    <w:p>
+      <w:r>
+        <w:t xml:space="preserve">"I have an orchard," said Madame Fournier. "What lives in it is its own affair."</w:t>
+      </w:r>
+    </w:p>
+    <w:p>
+      <w:r>
         <w:t>The Gastons were taken away at half past midnight in the back of the gendarmes' car, still in the army blankets, which Madame Fournier said they could keep, as they had been bought for a war and had finally seen action. As the car went down the lane with its blue light turning, she stood at the gate with her secateurs and watched it go with an expression of deep satisfaction.</w:t>
       </w:r>
     </w:p>
@@ -13061,6 +13106,80 @@
       <w:pPr>
         <w:ind w:firstLine="0"/>
       </w:pPr>
+      <w:r>
+        <w:t xml:space="preserve">The summons had come in January, on pale lilac paper, in an envelope with no stamp and no sender. It required Monsieur Tobias Lind to present himself at the tribunal in Aix, Room 14, on the first Monday of March, at nine o'clock. It did not say why.</w:t>
+      </w:r>
+    </w:p>
+    <w:p>
+      <w:r>
+        <w:t xml:space="preserve">He rang the number at the bottom. A woman answered, said "It is being clarified," and put the phone down. A man answered, said the same, and did the same. A recorded voice, pleasant, said that his call was important to them, and that the matter was being clarified, and that he should please hold, and he held for forty minutes while a violin played, and at the end the voice thanked him for waiting and hung up.</w:t>
+      </w:r>
+    </w:p>
+    <w:p>
+      <w:r>
+        <w:t xml:space="preserve">"What have I done?" he asked Catarina.</w:t>
+      </w:r>
+    </w:p>
+    <w:p>
+      <w:r>
+        <w:t xml:space="preserve">"Perhaps something," said Catarina, who had been brought up Catholic and believed in being charged first. "You will find out."</w:t>
+      </w:r>
+    </w:p>
+    <w:p>
+      <w:r>
+        <w:t xml:space="preserve">He found out nothing. In Room 14, on the first Monday of March, he sat for three hours on a bench among a number of silent, well-dressed strangers, each of whom appeared to be waiting for a verdict on something. At noon a clerk read a name from a list and nobody got up. At one he read it again. At two he read it a third time, and Tobias, who could not in his whole life sit quietly while a name was read, put up his hand.</w:t>
+      </w:r>
+    </w:p>
+    <w:p>
+      <w:r>
+        <w:t xml:space="preserve">"Lind," said the clerk. "Tobias."</w:t>
+      </w:r>
+    </w:p>
+    <w:p>
+      <w:r>
+        <w:t xml:space="preserve">"Yes?"</w:t>
+      </w:r>
+    </w:p>
+    <w:p>
+      <w:r>
+        <w:t xml:space="preserve">"It is not you."</w:t>
+      </w:r>
+    </w:p>
+    <w:p>
+      <w:r>
+        <w:t xml:space="preserve">"It's my name."</w:t>
+      </w:r>
+    </w:p>
+    <w:p>
+      <w:r>
+        <w:t xml:space="preserve">"It is a different Tobias Lind." The clerk consulted a document that turned out, on closer inspection, to be a restaurant menu. "Tobias Lindt. With a </w:t>
+      </w:r>
+      <w:r>
+        <w:rPr>
+          <w:i/>
+        </w:rPr>
+        <w:t xml:space="preserve">t</w:t>
+      </w:r>
+      <w:r>
+        <w:t xml:space="preserve">. A chocolatier from Zurich. He is accused of being too good at chocolate."</w:t>
+      </w:r>
+    </w:p>
+    <w:p>
+      <w:r>
+        <w:t xml:space="preserve">"That isn't a crime."</w:t>
+      </w:r>
+    </w:p>
+    <w:p>
+      <w:r>
+        <w:t xml:space="preserve">"In the Canton of Vaud it is. It is a very old law." The clerk looked distressed. "You were never accused of anything, monsieur. It was a clerical error. The paper was put in the wrong envelope, and the envelope in the wrong post, and the post sent in the wrong year. It has been clarified."</w:t>
+      </w:r>
+    </w:p>
+    <w:p>
+      <w:r>
+        <w:t xml:space="preserve">Tobias came out into the light at half past two, having missed, as he learned that evening from Inês, who had sat through all of it with a notebook and gave him a full account with commentary, only the first morning of the larger trial, which had consisted mostly of the reading of lists. At the foot of the steps a small, tearful man in a chocolatier's apron pressed a large, beautifully wrapped box into his arms, said "Thank you, I will never forget you," and ran off among the plane trees. It contained thirty-six hand-made truffles. They were the best Tobias had ever tasted. He never found out why.</w:t>
+      </w:r>
+    </w:p>
+    <w:p>
       <w:r>
         <w:t>The larger trial began in March, one year almost to the day after Elise Marchetti died, at the Cour d'assises in the Palais de Justice at Aix-en-Provence: a handsome, pale, pillared building facing a square of plane trees, still bare that early in the year, where on market mornings stalls sold lavender, old postcards, saucisson and cheese of a tragic ripeness.</w:t>
       </w:r>

</xml_diff>

<commit_message>
ILWM: strip contents page numbers (links kept); tighten Part Two (Drip roofers, road to Aix, small trims) and trial (lilac summons condensed); tone down Gastons farce (no kangaroo, Hugo stays upstairs, adults' fear); Madame Giraud on the courthouse steps; Gerald/Camilla cameo cut; fix stray quote; resync .md
</commit_message>
<xml_diff>
--- a/In Love with Murder, Actually/In_Love_with_Murder_Actually.docx
+++ b/In Love with Murder, Actually/In_Love_with_Murder_Actually.docx
@@ -189,9 +189,6 @@
     </w:p>
     <w:p>
       <w:pPr>
-        <w:tabs>
-          <w:tab w:pos="5544" w:val="right" w:leader="dot"/>
-        </w:tabs>
         <w:spacing w:before="160" w:after="80"/>
         <w:ind w:firstLine="0"/>
       </w:pPr>
@@ -203,48 +200,9 @@
           <w:t xml:space="preserve">Part One: The Lake</w:t>
         </w:r>
       </w:hyperlink>
-      <w:r>
-        <w:rPr>
-          <w:b/>
-        </w:rPr>
-        <w:tab/>
-      </w:r>
-      <w:r>
-        <w:rPr>
-          <w:b/>
-        </w:rPr>
-        <w:fldChar w:fldCharType="begin"/>
-      </w:r>
-      <w:r>
-        <w:rPr>
-          <w:b/>
-        </w:rPr>
-        <w:instrText xml:space="preserve"> PAGEREF part_part_one \h </w:instrText>
-      </w:r>
-      <w:r>
-        <w:rPr>
-          <w:b/>
-        </w:rPr>
-        <w:fldChar w:fldCharType="separate"/>
-      </w:r>
-      <w:r>
-        <w:rPr>
-          <w:b/>
-        </w:rPr>
-        <w:t xml:space="preserve">7</w:t>
-      </w:r>
-      <w:r>
-        <w:rPr>
-          <w:b/>
-        </w:rPr>
-        <w:fldChar w:fldCharType="end"/>
-      </w:r>
-    </w:p>
-    <w:p>
-      <w:pPr>
-        <w:tabs>
-          <w:tab w:pos="5544" w:val="right" w:leader="dot"/>
-        </w:tabs>
+    </w:p>
+    <w:p>
+      <w:pPr>
         <w:ind w:firstLine="0" w:left="288"/>
       </w:pPr>
       <w:hyperlink w:anchor="ch_1" w:history="1">
@@ -253,30 +211,9 @@
           <w:t xml:space="preserve">Chapter 1: Leeds</w:t>
         </w:r>
       </w:hyperlink>
-      <w:r>
-        <w:tab/>
-      </w:r>
-      <w:r>
-        <w:fldChar w:fldCharType="begin"/>
-      </w:r>
-      <w:r>
-        <w:instrText xml:space="preserve"> PAGEREF ch_1 \h </w:instrText>
-      </w:r>
-      <w:r>
-        <w:fldChar w:fldCharType="separate"/>
-      </w:r>
-      <w:r>
-        <w:t xml:space="preserve">8</w:t>
-      </w:r>
-      <w:r>
-        <w:fldChar w:fldCharType="end"/>
-      </w:r>
-    </w:p>
-    <w:p>
-      <w:pPr>
-        <w:tabs>
-          <w:tab w:pos="5544" w:val="right" w:leader="dot"/>
-        </w:tabs>
+    </w:p>
+    <w:p>
+      <w:pPr>
         <w:ind w:firstLine="0" w:left="288"/>
       </w:pPr>
       <w:hyperlink w:anchor="ch_2" w:history="1">
@@ -285,30 +222,9 @@
           <w:t xml:space="preserve">Chapter 2: The Pond</w:t>
         </w:r>
       </w:hyperlink>
-      <w:r>
-        <w:tab/>
-      </w:r>
-      <w:r>
-        <w:fldChar w:fldCharType="begin"/>
-      </w:r>
-      <w:r>
-        <w:instrText xml:space="preserve"> PAGEREF ch_2 \h </w:instrText>
-      </w:r>
-      <w:r>
-        <w:fldChar w:fldCharType="separate"/>
-      </w:r>
-      <w:r>
-        <w:t xml:space="preserve">10</w:t>
-      </w:r>
-      <w:r>
-        <w:fldChar w:fldCharType="end"/>
-      </w:r>
-    </w:p>
-    <w:p>
-      <w:pPr>
-        <w:tabs>
-          <w:tab w:pos="5544" w:val="right" w:leader="dot"/>
-        </w:tabs>
+    </w:p>
+    <w:p>
+      <w:pPr>
         <w:ind w:firstLine="0" w:left="288"/>
       </w:pPr>
       <w:hyperlink w:anchor="ch_3" w:history="1">
@@ -317,30 +233,9 @@
           <w:t xml:space="preserve">Chapter 3: The Housekeeper</w:t>
         </w:r>
       </w:hyperlink>
-      <w:r>
-        <w:tab/>
-      </w:r>
-      <w:r>
-        <w:fldChar w:fldCharType="begin"/>
-      </w:r>
-      <w:r>
-        <w:instrText xml:space="preserve"> PAGEREF ch_3 \h </w:instrText>
-      </w:r>
-      <w:r>
-        <w:fldChar w:fldCharType="separate"/>
-      </w:r>
-      <w:r>
-        <w:t xml:space="preserve">13</w:t>
-      </w:r>
-      <w:r>
-        <w:fldChar w:fldCharType="end"/>
-      </w:r>
-    </w:p>
-    <w:p>
-      <w:pPr>
-        <w:tabs>
-          <w:tab w:pos="5544" w:val="right" w:leader="dot"/>
-        </w:tabs>
+    </w:p>
+    <w:p>
+      <w:pPr>
         <w:ind w:firstLine="0" w:left="288"/>
       </w:pPr>
       <w:hyperlink w:anchor="ch_4" w:history="1">
@@ -349,30 +244,9 @@
           <w:t xml:space="preserve">Chapter 4: What the Water Left</w:t>
         </w:r>
       </w:hyperlink>
-      <w:r>
-        <w:tab/>
-      </w:r>
-      <w:r>
-        <w:fldChar w:fldCharType="begin"/>
-      </w:r>
-      <w:r>
-        <w:instrText xml:space="preserve"> PAGEREF ch_4 \h </w:instrText>
-      </w:r>
-      <w:r>
-        <w:fldChar w:fldCharType="separate"/>
-      </w:r>
-      <w:r>
-        <w:t xml:space="preserve">16</w:t>
-      </w:r>
-      <w:r>
-        <w:fldChar w:fldCharType="end"/>
-      </w:r>
-    </w:p>
-    <w:p>
-      <w:pPr>
-        <w:tabs>
-          <w:tab w:pos="5544" w:val="right" w:leader="dot"/>
-        </w:tabs>
+    </w:p>
+    <w:p>
+      <w:pPr>
         <w:ind w:firstLine="0" w:left="288"/>
       </w:pPr>
       <w:hyperlink w:anchor="ch_5" w:history="1">
@@ -381,30 +255,9 @@
           <w:t xml:space="preserve">Chapter 5: The Gatepost</w:t>
         </w:r>
       </w:hyperlink>
-      <w:r>
-        <w:tab/>
-      </w:r>
-      <w:r>
-        <w:fldChar w:fldCharType="begin"/>
-      </w:r>
-      <w:r>
-        <w:instrText xml:space="preserve"> PAGEREF ch_5 \h </w:instrText>
-      </w:r>
-      <w:r>
-        <w:fldChar w:fldCharType="separate"/>
-      </w:r>
-      <w:r>
-        <w:t xml:space="preserve">20</w:t>
-      </w:r>
-      <w:r>
-        <w:fldChar w:fldCharType="end"/>
-      </w:r>
-    </w:p>
-    <w:p>
-      <w:pPr>
-        <w:tabs>
-          <w:tab w:pos="5544" w:val="right" w:leader="dot"/>
-        </w:tabs>
+    </w:p>
+    <w:p>
+      <w:pPr>
         <w:ind w:firstLine="0" w:left="288"/>
       </w:pPr>
       <w:hyperlink w:anchor="ch_6" w:history="1">
@@ -413,30 +266,9 @@
           <w:t xml:space="preserve">Chapter 6: The Machine</w:t>
         </w:r>
       </w:hyperlink>
-      <w:r>
-        <w:tab/>
-      </w:r>
-      <w:r>
-        <w:fldChar w:fldCharType="begin"/>
-      </w:r>
-      <w:r>
-        <w:instrText xml:space="preserve"> PAGEREF ch_6 \h </w:instrText>
-      </w:r>
-      <w:r>
-        <w:fldChar w:fldCharType="separate"/>
-      </w:r>
-      <w:r>
-        <w:t xml:space="preserve">25</w:t>
-      </w:r>
-      <w:r>
-        <w:fldChar w:fldCharType="end"/>
-      </w:r>
-    </w:p>
-    <w:p>
-      <w:pPr>
-        <w:tabs>
-          <w:tab w:pos="5544" w:val="right" w:leader="dot"/>
-        </w:tabs>
+    </w:p>
+    <w:p>
+      <w:pPr>
         <w:ind w:firstLine="0" w:left="288"/>
       </w:pPr>
       <w:hyperlink w:anchor="ch_7" w:history="1">
@@ -445,30 +277,9 @@
           <w:t xml:space="preserve">Chapter 7: The Night She Died</w:t>
         </w:r>
       </w:hyperlink>
-      <w:r>
-        <w:tab/>
-      </w:r>
-      <w:r>
-        <w:fldChar w:fldCharType="begin"/>
-      </w:r>
-      <w:r>
-        <w:instrText xml:space="preserve"> PAGEREF ch_7 \h </w:instrText>
-      </w:r>
-      <w:r>
-        <w:fldChar w:fldCharType="separate"/>
-      </w:r>
-      <w:r>
-        <w:t xml:space="preserve">29</w:t>
-      </w:r>
-      <w:r>
-        <w:fldChar w:fldCharType="end"/>
-      </w:r>
-    </w:p>
-    <w:p>
-      <w:pPr>
-        <w:tabs>
-          <w:tab w:pos="5544" w:val="right" w:leader="dot"/>
-        </w:tabs>
+    </w:p>
+    <w:p>
+      <w:pPr>
         <w:ind w:firstLine="0" w:left="288"/>
       </w:pPr>
       <w:hyperlink w:anchor="ch_8" w:history="1">
@@ -477,30 +288,9 @@
           <w:t xml:space="preserve">Chapter 8: Birds</w:t>
         </w:r>
       </w:hyperlink>
-      <w:r>
-        <w:tab/>
-      </w:r>
-      <w:r>
-        <w:fldChar w:fldCharType="begin"/>
-      </w:r>
-      <w:r>
-        <w:instrText xml:space="preserve"> PAGEREF ch_8 \h </w:instrText>
-      </w:r>
-      <w:r>
-        <w:fldChar w:fldCharType="separate"/>
-      </w:r>
-      <w:r>
-        <w:t xml:space="preserve">37</w:t>
-      </w:r>
-      <w:r>
-        <w:fldChar w:fldCharType="end"/>
-      </w:r>
-    </w:p>
-    <w:p>
-      <w:pPr>
-        <w:tabs>
-          <w:tab w:pos="5544" w:val="right" w:leader="dot"/>
-        </w:tabs>
+    </w:p>
+    <w:p>
+      <w:pPr>
         <w:ind w:firstLine="0" w:left="288"/>
       </w:pPr>
       <w:hyperlink w:anchor="ch_9" w:history="1">
@@ -509,30 +299,9 @@
           <w:t xml:space="preserve">Chapter 9: The Leaflet</w:t>
         </w:r>
       </w:hyperlink>
-      <w:r>
-        <w:tab/>
-      </w:r>
-      <w:r>
-        <w:fldChar w:fldCharType="begin"/>
-      </w:r>
-      <w:r>
-        <w:instrText xml:space="preserve"> PAGEREF ch_9 \h </w:instrText>
-      </w:r>
-      <w:r>
-        <w:fldChar w:fldCharType="separate"/>
-      </w:r>
-      <w:r>
-        <w:t xml:space="preserve">42</w:t>
-      </w:r>
-      <w:r>
-        <w:fldChar w:fldCharType="end"/>
-      </w:r>
-    </w:p>
-    <w:p>
-      <w:pPr>
-        <w:tabs>
-          <w:tab w:pos="5544" w:val="right" w:leader="dot"/>
-        </w:tabs>
+    </w:p>
+    <w:p>
+      <w:pPr>
         <w:ind w:firstLine="0" w:left="288"/>
       </w:pPr>
       <w:hyperlink w:anchor="ch_10" w:history="1">
@@ -541,30 +310,9 @@
           <w:t xml:space="preserve">Chapter 10: The House Next Door</w:t>
         </w:r>
       </w:hyperlink>
-      <w:r>
-        <w:tab/>
-      </w:r>
-      <w:r>
-        <w:fldChar w:fldCharType="begin"/>
-      </w:r>
-      <w:r>
-        <w:instrText xml:space="preserve"> PAGEREF ch_10 \h </w:instrText>
-      </w:r>
-      <w:r>
-        <w:fldChar w:fldCharType="separate"/>
-      </w:r>
-      <w:r>
-        <w:t xml:space="preserve">46</w:t>
-      </w:r>
-      <w:r>
-        <w:fldChar w:fldCharType="end"/>
-      </w:r>
-    </w:p>
-    <w:p>
-      <w:pPr>
-        <w:tabs>
-          <w:tab w:pos="5544" w:val="right" w:leader="dot"/>
-        </w:tabs>
+    </w:p>
+    <w:p>
+      <w:pPr>
         <w:ind w:firstLine="0" w:left="288"/>
       </w:pPr>
       <w:hyperlink w:anchor="ch_11" w:history="1">
@@ -573,30 +321,9 @@
           <w:t xml:space="preserve">Chapter 11: Três Marias</w:t>
         </w:r>
       </w:hyperlink>
-      <w:r>
-        <w:tab/>
-      </w:r>
-      <w:r>
-        <w:fldChar w:fldCharType="begin"/>
-      </w:r>
-      <w:r>
-        <w:instrText xml:space="preserve"> PAGEREF ch_11 \h </w:instrText>
-      </w:r>
-      <w:r>
-        <w:fldChar w:fldCharType="separate"/>
-      </w:r>
-      <w:r>
-        <w:t xml:space="preserve">51</w:t>
-      </w:r>
-      <w:r>
-        <w:fldChar w:fldCharType="end"/>
-      </w:r>
-    </w:p>
-    <w:p>
-      <w:pPr>
-        <w:tabs>
-          <w:tab w:pos="5544" w:val="right" w:leader="dot"/>
-        </w:tabs>
+    </w:p>
+    <w:p>
+      <w:pPr>
         <w:ind w:firstLine="0" w:left="288"/>
       </w:pPr>
       <w:hyperlink w:anchor="ch_12" w:history="1">
@@ -605,30 +332,9 @@
           <w:t xml:space="preserve">Chapter 12: Flamingos</w:t>
         </w:r>
       </w:hyperlink>
-      <w:r>
-        <w:tab/>
-      </w:r>
-      <w:r>
-        <w:fldChar w:fldCharType="begin"/>
-      </w:r>
-      <w:r>
-        <w:instrText xml:space="preserve"> PAGEREF ch_12 \h </w:instrText>
-      </w:r>
-      <w:r>
-        <w:fldChar w:fldCharType="separate"/>
-      </w:r>
-      <w:r>
-        <w:t xml:space="preserve">56</w:t>
-      </w:r>
-      <w:r>
-        <w:fldChar w:fldCharType="end"/>
-      </w:r>
-    </w:p>
-    <w:p>
-      <w:pPr>
-        <w:tabs>
-          <w:tab w:pos="5544" w:val="right" w:leader="dot"/>
-        </w:tabs>
+    </w:p>
+    <w:p>
+      <w:pPr>
         <w:ind w:firstLine="0" w:left="288"/>
       </w:pPr>
       <w:hyperlink w:anchor="ch_13" w:history="1">
@@ -637,30 +343,9 @@
           <w:t xml:space="preserve">Chapter 13: Market Day</w:t>
         </w:r>
       </w:hyperlink>
-      <w:r>
-        <w:tab/>
-      </w:r>
-      <w:r>
-        <w:fldChar w:fldCharType="begin"/>
-      </w:r>
-      <w:r>
-        <w:instrText xml:space="preserve"> PAGEREF ch_13 \h </w:instrText>
-      </w:r>
-      <w:r>
-        <w:fldChar w:fldCharType="separate"/>
-      </w:r>
-      <w:r>
-        <w:t xml:space="preserve">60</w:t>
-      </w:r>
-      <w:r>
-        <w:fldChar w:fldCharType="end"/>
-      </w:r>
-    </w:p>
-    <w:p>
-      <w:pPr>
-        <w:tabs>
-          <w:tab w:pos="5544" w:val="right" w:leader="dot"/>
-        </w:tabs>
+    </w:p>
+    <w:p>
+      <w:pPr>
         <w:ind w:firstLine="0" w:left="288"/>
       </w:pPr>
       <w:hyperlink w:anchor="ch_14" w:history="1">
@@ -669,30 +354,9 @@
           <w:t xml:space="preserve">Chapter 14: The Mountain</w:t>
         </w:r>
       </w:hyperlink>
-      <w:r>
-        <w:tab/>
-      </w:r>
-      <w:r>
-        <w:fldChar w:fldCharType="begin"/>
-      </w:r>
-      <w:r>
-        <w:instrText xml:space="preserve"> PAGEREF ch_14 \h </w:instrText>
-      </w:r>
-      <w:r>
-        <w:fldChar w:fldCharType="separate"/>
-      </w:r>
-      <w:r>
-        <w:t xml:space="preserve">67</w:t>
-      </w:r>
-      <w:r>
-        <w:fldChar w:fldCharType="end"/>
-      </w:r>
-    </w:p>
-    <w:p>
-      <w:pPr>
-        <w:tabs>
-          <w:tab w:pos="5544" w:val="right" w:leader="dot"/>
-        </w:tabs>
+    </w:p>
+    <w:p>
+      <w:pPr>
         <w:ind w:firstLine="0" w:left="288"/>
       </w:pPr>
       <w:hyperlink w:anchor="ch_15" w:history="1">
@@ -701,30 +365,9 @@
           <w:t xml:space="preserve">Chapter 15: The Visitor</w:t>
         </w:r>
       </w:hyperlink>
-      <w:r>
-        <w:tab/>
-      </w:r>
-      <w:r>
-        <w:fldChar w:fldCharType="begin"/>
-      </w:r>
-      <w:r>
-        <w:instrText xml:space="preserve"> PAGEREF ch_15 \h </w:instrText>
-      </w:r>
-      <w:r>
-        <w:fldChar w:fldCharType="separate"/>
-      </w:r>
-      <w:r>
-        <w:t xml:space="preserve">71</w:t>
-      </w:r>
-      <w:r>
-        <w:fldChar w:fldCharType="end"/>
-      </w:r>
-    </w:p>
-    <w:p>
-      <w:pPr>
-        <w:tabs>
-          <w:tab w:pos="5544" w:val="right" w:leader="dot"/>
-        </w:tabs>
+    </w:p>
+    <w:p>
+      <w:pPr>
         <w:spacing w:before="160" w:after="80"/>
         <w:ind w:firstLine="0"/>
       </w:pPr>
@@ -736,48 +379,9 @@
           <w:t xml:space="preserve">Part Two: The Paper Trail</w:t>
         </w:r>
       </w:hyperlink>
-      <w:r>
-        <w:rPr>
-          <w:b/>
-        </w:rPr>
-        <w:tab/>
-      </w:r>
-      <w:r>
-        <w:rPr>
-          <w:b/>
-        </w:rPr>
-        <w:fldChar w:fldCharType="begin"/>
-      </w:r>
-      <w:r>
-        <w:rPr>
-          <w:b/>
-        </w:rPr>
-        <w:instrText xml:space="preserve"> PAGEREF part_part_two \h </w:instrText>
-      </w:r>
-      <w:r>
-        <w:rPr>
-          <w:b/>
-        </w:rPr>
-        <w:fldChar w:fldCharType="separate"/>
-      </w:r>
-      <w:r>
-        <w:rPr>
-          <w:b/>
-        </w:rPr>
-        <w:t xml:space="preserve">77</w:t>
-      </w:r>
-      <w:r>
-        <w:rPr>
-          <w:b/>
-        </w:rPr>
-        <w:fldChar w:fldCharType="end"/>
-      </w:r>
-    </w:p>
-    <w:p>
-      <w:pPr>
-        <w:tabs>
-          <w:tab w:pos="5544" w:val="right" w:leader="dot"/>
-        </w:tabs>
+    </w:p>
+    <w:p>
+      <w:pPr>
         <w:ind w:firstLine="0" w:left="288"/>
       </w:pPr>
       <w:hyperlink w:anchor="ch_16" w:history="1">
@@ -786,30 +390,9 @@
           <w:t xml:space="preserve">Chapter 16: The Contract</w:t>
         </w:r>
       </w:hyperlink>
-      <w:r>
-        <w:tab/>
-      </w:r>
-      <w:r>
-        <w:fldChar w:fldCharType="begin"/>
-      </w:r>
-      <w:r>
-        <w:instrText xml:space="preserve"> PAGEREF ch_16 \h </w:instrText>
-      </w:r>
-      <w:r>
-        <w:fldChar w:fldCharType="separate"/>
-      </w:r>
-      <w:r>
-        <w:t xml:space="preserve">78</w:t>
-      </w:r>
-      <w:r>
-        <w:fldChar w:fldCharType="end"/>
-      </w:r>
-    </w:p>
-    <w:p>
-      <w:pPr>
-        <w:tabs>
-          <w:tab w:pos="5544" w:val="right" w:leader="dot"/>
-        </w:tabs>
+    </w:p>
+    <w:p>
+      <w:pPr>
         <w:ind w:firstLine="0" w:left="288"/>
       </w:pPr>
       <w:hyperlink w:anchor="ch_17" w:history="1">
@@ -818,30 +401,9 @@
           <w:t xml:space="preserve">Chapter 17: Highly Commended</w:t>
         </w:r>
       </w:hyperlink>
-      <w:r>
-        <w:tab/>
-      </w:r>
-      <w:r>
-        <w:fldChar w:fldCharType="begin"/>
-      </w:r>
-      <w:r>
-        <w:instrText xml:space="preserve"> PAGEREF ch_17 \h </w:instrText>
-      </w:r>
-      <w:r>
-        <w:fldChar w:fldCharType="separate"/>
-      </w:r>
-      <w:r>
-        <w:t xml:space="preserve">89</w:t>
-      </w:r>
-      <w:r>
-        <w:fldChar w:fldCharType="end"/>
-      </w:r>
-    </w:p>
-    <w:p>
-      <w:pPr>
-        <w:tabs>
-          <w:tab w:pos="5544" w:val="right" w:leader="dot"/>
-        </w:tabs>
+    </w:p>
+    <w:p>
+      <w:pPr>
         <w:ind w:firstLine="0" w:left="288"/>
       </w:pPr>
       <w:hyperlink w:anchor="ch_18" w:history="1">
@@ -850,30 +412,9 @@
           <w:t xml:space="preserve">Chapter 18: The Voice</w:t>
         </w:r>
       </w:hyperlink>
-      <w:r>
-        <w:tab/>
-      </w:r>
-      <w:r>
-        <w:fldChar w:fldCharType="begin"/>
-      </w:r>
-      <w:r>
-        <w:instrText xml:space="preserve"> PAGEREF ch_18 \h </w:instrText>
-      </w:r>
-      <w:r>
-        <w:fldChar w:fldCharType="separate"/>
-      </w:r>
-      <w:r>
-        <w:t xml:space="preserve">100</w:t>
-      </w:r>
-      <w:r>
-        <w:fldChar w:fldCharType="end"/>
-      </w:r>
-    </w:p>
-    <w:p>
-      <w:pPr>
-        <w:tabs>
-          <w:tab w:pos="5544" w:val="right" w:leader="dot"/>
-        </w:tabs>
+    </w:p>
+    <w:p>
+      <w:pPr>
         <w:ind w:firstLine="0" w:left="288"/>
       </w:pPr>
       <w:hyperlink w:anchor="ch_19" w:history="1">
@@ -882,30 +423,9 @@
           <w:t xml:space="preserve">Chapter 19: The Rent</w:t>
         </w:r>
       </w:hyperlink>
-      <w:r>
-        <w:tab/>
-      </w:r>
-      <w:r>
-        <w:fldChar w:fldCharType="begin"/>
-      </w:r>
-      <w:r>
-        <w:instrText xml:space="preserve"> PAGEREF ch_19 \h </w:instrText>
-      </w:r>
-      <w:r>
-        <w:fldChar w:fldCharType="separate"/>
-      </w:r>
-      <w:r>
-        <w:t xml:space="preserve">111</w:t>
-      </w:r>
-      <w:r>
-        <w:fldChar w:fldCharType="end"/>
-      </w:r>
-    </w:p>
-    <w:p>
-      <w:pPr>
-        <w:tabs>
-          <w:tab w:pos="5544" w:val="right" w:leader="dot"/>
-        </w:tabs>
+    </w:p>
+    <w:p>
+      <w:pPr>
         <w:ind w:firstLine="0" w:left="288"/>
       </w:pPr>
       <w:hyperlink w:anchor="ch_20" w:history="1">
@@ -914,30 +434,9 @@
           <w:t xml:space="preserve">Chapter 20: The Balcony</w:t>
         </w:r>
       </w:hyperlink>
-      <w:r>
-        <w:tab/>
-      </w:r>
-      <w:r>
-        <w:fldChar w:fldCharType="begin"/>
-      </w:r>
-      <w:r>
-        <w:instrText xml:space="preserve"> PAGEREF ch_20 \h </w:instrText>
-      </w:r>
-      <w:r>
-        <w:fldChar w:fldCharType="separate"/>
-      </w:r>
-      <w:r>
-        <w:t xml:space="preserve">122</w:t>
-      </w:r>
-      <w:r>
-        <w:fldChar w:fldCharType="end"/>
-      </w:r>
-    </w:p>
-    <w:p>
-      <w:pPr>
-        <w:tabs>
-          <w:tab w:pos="5544" w:val="right" w:leader="dot"/>
-        </w:tabs>
+    </w:p>
+    <w:p>
+      <w:pPr>
         <w:ind w:firstLine="0" w:left="288"/>
       </w:pPr>
       <w:hyperlink w:anchor="ch_21" w:history="1">
@@ -946,30 +445,9 @@
           <w:t xml:space="preserve">Chapter 21: The Bridge</w:t>
         </w:r>
       </w:hyperlink>
-      <w:r>
-        <w:tab/>
-      </w:r>
-      <w:r>
-        <w:fldChar w:fldCharType="begin"/>
-      </w:r>
-      <w:r>
-        <w:instrText xml:space="preserve"> PAGEREF ch_21 \h </w:instrText>
-      </w:r>
-      <w:r>
-        <w:fldChar w:fldCharType="separate"/>
-      </w:r>
-      <w:r>
-        <w:t xml:space="preserve">133</w:t>
-      </w:r>
-      <w:r>
-        <w:fldChar w:fldCharType="end"/>
-      </w:r>
-    </w:p>
-    <w:p>
-      <w:pPr>
-        <w:tabs>
-          <w:tab w:pos="5544" w:val="right" w:leader="dot"/>
-        </w:tabs>
+    </w:p>
+    <w:p>
+      <w:pPr>
         <w:ind w:firstLine="0" w:left="288"/>
       </w:pPr>
       <w:hyperlink w:anchor="ch_22" w:history="1">
@@ -978,30 +456,9 @@
           <w:t xml:space="preserve">Chapter 22: The Photograph</w:t>
         </w:r>
       </w:hyperlink>
-      <w:r>
-        <w:tab/>
-      </w:r>
-      <w:r>
-        <w:fldChar w:fldCharType="begin"/>
-      </w:r>
-      <w:r>
-        <w:instrText xml:space="preserve"> PAGEREF ch_22 \h </w:instrText>
-      </w:r>
-      <w:r>
-        <w:fldChar w:fldCharType="separate"/>
-      </w:r>
-      <w:r>
-        <w:t xml:space="preserve">144</w:t>
-      </w:r>
-      <w:r>
-        <w:fldChar w:fldCharType="end"/>
-      </w:r>
-    </w:p>
-    <w:p>
-      <w:pPr>
-        <w:tabs>
-          <w:tab w:pos="5544" w:val="right" w:leader="dot"/>
-        </w:tabs>
+    </w:p>
+    <w:p>
+      <w:pPr>
         <w:ind w:firstLine="0" w:left="288"/>
       </w:pPr>
       <w:hyperlink w:anchor="ch_23" w:history="1">
@@ -1010,30 +467,9 @@
           <w:t xml:space="preserve">Chapter 23: The Cup</w:t>
         </w:r>
       </w:hyperlink>
-      <w:r>
-        <w:tab/>
-      </w:r>
-      <w:r>
-        <w:fldChar w:fldCharType="begin"/>
-      </w:r>
-      <w:r>
-        <w:instrText xml:space="preserve"> PAGEREF ch_23 \h </w:instrText>
-      </w:r>
-      <w:r>
-        <w:fldChar w:fldCharType="separate"/>
-      </w:r>
-      <w:r>
-        <w:t xml:space="preserve">149</w:t>
-      </w:r>
-      <w:r>
-        <w:fldChar w:fldCharType="end"/>
-      </w:r>
-    </w:p>
-    <w:p>
-      <w:pPr>
-        <w:tabs>
-          <w:tab w:pos="5544" w:val="right" w:leader="dot"/>
-        </w:tabs>
+    </w:p>
+    <w:p>
+      <w:pPr>
         <w:ind w:firstLine="0" w:left="288"/>
       </w:pPr>
       <w:hyperlink w:anchor="ch_24" w:history="1">
@@ -1042,30 +478,9 @@
           <w:t xml:space="preserve">Chapter 24: The Road to Aix</w:t>
         </w:r>
       </w:hyperlink>
-      <w:r>
-        <w:tab/>
-      </w:r>
-      <w:r>
-        <w:fldChar w:fldCharType="begin"/>
-      </w:r>
-      <w:r>
-        <w:instrText xml:space="preserve"> PAGEREF ch_24 \h </w:instrText>
-      </w:r>
-      <w:r>
-        <w:fldChar w:fldCharType="separate"/>
-      </w:r>
-      <w:r>
-        <w:t xml:space="preserve">152</w:t>
-      </w:r>
-      <w:r>
-        <w:fldChar w:fldCharType="end"/>
-      </w:r>
-    </w:p>
-    <w:p>
-      <w:pPr>
-        <w:tabs>
-          <w:tab w:pos="5544" w:val="right" w:leader="dot"/>
-        </w:tabs>
+    </w:p>
+    <w:p>
+      <w:pPr>
         <w:ind w:firstLine="0" w:left="288"/>
       </w:pPr>
       <w:hyperlink w:anchor="ch_25" w:history="1">
@@ -1074,30 +489,9 @@
           <w:t xml:space="preserve">Chapter 25: The Key</w:t>
         </w:r>
       </w:hyperlink>
-      <w:r>
-        <w:tab/>
-      </w:r>
-      <w:r>
-        <w:fldChar w:fldCharType="begin"/>
-      </w:r>
-      <w:r>
-        <w:instrText xml:space="preserve"> PAGEREF ch_25 \h </w:instrText>
-      </w:r>
-      <w:r>
-        <w:fldChar w:fldCharType="separate"/>
-      </w:r>
-      <w:r>
-        <w:t xml:space="preserve">159</w:t>
-      </w:r>
-      <w:r>
-        <w:fldChar w:fldCharType="end"/>
-      </w:r>
-    </w:p>
-    <w:p>
-      <w:pPr>
-        <w:tabs>
-          <w:tab w:pos="5544" w:val="right" w:leader="dot"/>
-        </w:tabs>
+    </w:p>
+    <w:p>
+      <w:pPr>
         <w:ind w:firstLine="0" w:left="288"/>
       </w:pPr>
       <w:hyperlink w:anchor="ch_26" w:history="1">
@@ -1106,30 +500,9 @@
           <w:t xml:space="preserve">Chapter 26: Drip</w:t>
         </w:r>
       </w:hyperlink>
-      <w:r>
-        <w:tab/>
-      </w:r>
-      <w:r>
-        <w:fldChar w:fldCharType="begin"/>
-      </w:r>
-      <w:r>
-        <w:instrText xml:space="preserve"> PAGEREF ch_26 \h </w:instrText>
-      </w:r>
-      <w:r>
-        <w:fldChar w:fldCharType="separate"/>
-      </w:r>
-      <w:r>
-        <w:t xml:space="preserve">165</w:t>
-      </w:r>
-      <w:r>
-        <w:fldChar w:fldCharType="end"/>
-      </w:r>
-    </w:p>
-    <w:p>
-      <w:pPr>
-        <w:tabs>
-          <w:tab w:pos="5544" w:val="right" w:leader="dot"/>
-        </w:tabs>
+    </w:p>
+    <w:p>
+      <w:pPr>
         <w:ind w:firstLine="0" w:left="288"/>
       </w:pPr>
       <w:hyperlink w:anchor="ch_27" w:history="1">
@@ -1138,30 +511,9 @@
           <w:t xml:space="preserve">Chapter 27: Not Only Paper</w:t>
         </w:r>
       </w:hyperlink>
-      <w:r>
-        <w:tab/>
-      </w:r>
-      <w:r>
-        <w:fldChar w:fldCharType="begin"/>
-      </w:r>
-      <w:r>
-        <w:instrText xml:space="preserve"> PAGEREF ch_27 \h </w:instrText>
-      </w:r>
-      <w:r>
-        <w:fldChar w:fldCharType="separate"/>
-      </w:r>
-      <w:r>
-        <w:t xml:space="preserve">174</w:t>
-      </w:r>
-      <w:r>
-        <w:fldChar w:fldCharType="end"/>
-      </w:r>
-    </w:p>
-    <w:p>
-      <w:pPr>
-        <w:tabs>
-          <w:tab w:pos="5544" w:val="right" w:leader="dot"/>
-        </w:tabs>
+    </w:p>
+    <w:p>
+      <w:pPr>
         <w:spacing w:before="160" w:after="80"/>
         <w:ind w:firstLine="0"/>
       </w:pPr>
@@ -1173,48 +525,9 @@
           <w:t xml:space="preserve">Part Three: The Water</w:t>
         </w:r>
       </w:hyperlink>
-      <w:r>
-        <w:rPr>
-          <w:b/>
-        </w:rPr>
-        <w:tab/>
-      </w:r>
-      <w:r>
-        <w:rPr>
-          <w:b/>
-        </w:rPr>
-        <w:fldChar w:fldCharType="begin"/>
-      </w:r>
-      <w:r>
-        <w:rPr>
-          <w:b/>
-        </w:rPr>
-        <w:instrText xml:space="preserve"> PAGEREF part_part_three \h </w:instrText>
-      </w:r>
-      <w:r>
-        <w:rPr>
-          <w:b/>
-        </w:rPr>
-        <w:fldChar w:fldCharType="separate"/>
-      </w:r>
-      <w:r>
-        <w:rPr>
-          <w:b/>
-        </w:rPr>
-        <w:t xml:space="preserve">185</w:t>
-      </w:r>
-      <w:r>
-        <w:rPr>
-          <w:b/>
-        </w:rPr>
-        <w:fldChar w:fldCharType="end"/>
-      </w:r>
-    </w:p>
-    <w:p>
-      <w:pPr>
-        <w:tabs>
-          <w:tab w:pos="5544" w:val="right" w:leader="dot"/>
-        </w:tabs>
+    </w:p>
+    <w:p>
+      <w:pPr>
         <w:ind w:firstLine="0" w:left="288"/>
       </w:pPr>
       <w:hyperlink w:anchor="ch_28" w:history="1">
@@ -1223,30 +536,9 @@
           <w:t xml:space="preserve">Chapter 28: The Two Gastons</w:t>
         </w:r>
       </w:hyperlink>
-      <w:r>
-        <w:tab/>
-      </w:r>
-      <w:r>
-        <w:fldChar w:fldCharType="begin"/>
-      </w:r>
-      <w:r>
-        <w:instrText xml:space="preserve"> PAGEREF ch_28 \h </w:instrText>
-      </w:r>
-      <w:r>
-        <w:fldChar w:fldCharType="separate"/>
-      </w:r>
-      <w:r>
-        <w:t xml:space="preserve">186</w:t>
-      </w:r>
-      <w:r>
-        <w:fldChar w:fldCharType="end"/>
-      </w:r>
-    </w:p>
-    <w:p>
-      <w:pPr>
-        <w:tabs>
-          <w:tab w:pos="5544" w:val="right" w:leader="dot"/>
-        </w:tabs>
+    </w:p>
+    <w:p>
+      <w:pPr>
         <w:ind w:firstLine="0" w:left="288"/>
       </w:pPr>
       <w:hyperlink w:anchor="ch_29" w:history="1">
@@ -1255,30 +547,9 @@
           <w:t xml:space="preserve">Chapter 29: The Far Shore</w:t>
         </w:r>
       </w:hyperlink>
-      <w:r>
-        <w:tab/>
-      </w:r>
-      <w:r>
-        <w:fldChar w:fldCharType="begin"/>
-      </w:r>
-      <w:r>
-        <w:instrText xml:space="preserve"> PAGEREF ch_29 \h </w:instrText>
-      </w:r>
-      <w:r>
-        <w:fldChar w:fldCharType="separate"/>
-      </w:r>
-      <w:r>
-        <w:t xml:space="preserve">194</w:t>
-      </w:r>
-      <w:r>
-        <w:fldChar w:fldCharType="end"/>
-      </w:r>
-    </w:p>
-    <w:p>
-      <w:pPr>
-        <w:tabs>
-          <w:tab w:pos="5544" w:val="right" w:leader="dot"/>
-        </w:tabs>
+    </w:p>
+    <w:p>
+      <w:pPr>
         <w:ind w:firstLine="0" w:left="288"/>
       </w:pPr>
       <w:hyperlink w:anchor="ch_30" w:history="1">
@@ -1287,30 +558,9 @@
           <w:t xml:space="preserve">Chapter 30: What Inês Saw</w:t>
         </w:r>
       </w:hyperlink>
-      <w:r>
-        <w:tab/>
-      </w:r>
-      <w:r>
-        <w:fldChar w:fldCharType="begin"/>
-      </w:r>
-      <w:r>
-        <w:instrText xml:space="preserve"> PAGEREF ch_30 \h </w:instrText>
-      </w:r>
-      <w:r>
-        <w:fldChar w:fldCharType="separate"/>
-      </w:r>
-      <w:r>
-        <w:t xml:space="preserve">202</w:t>
-      </w:r>
-      <w:r>
-        <w:fldChar w:fldCharType="end"/>
-      </w:r>
-    </w:p>
-    <w:p>
-      <w:pPr>
-        <w:tabs>
-          <w:tab w:pos="5544" w:val="right" w:leader="dot"/>
-        </w:tabs>
+    </w:p>
+    <w:p>
+      <w:pPr>
         <w:ind w:firstLine="0" w:left="288"/>
       </w:pPr>
       <w:hyperlink w:anchor="ch_31" w:history="1">
@@ -1319,30 +569,9 @@
           <w:t xml:space="preserve">Chapter 31: Edouard</w:t>
         </w:r>
       </w:hyperlink>
-      <w:r>
-        <w:tab/>
-      </w:r>
-      <w:r>
-        <w:fldChar w:fldCharType="begin"/>
-      </w:r>
-      <w:r>
-        <w:instrText xml:space="preserve"> PAGEREF ch_31 \h </w:instrText>
-      </w:r>
-      <w:r>
-        <w:fldChar w:fldCharType="separate"/>
-      </w:r>
-      <w:r>
-        <w:t xml:space="preserve">214</w:t>
-      </w:r>
-      <w:r>
-        <w:fldChar w:fldCharType="end"/>
-      </w:r>
-    </w:p>
-    <w:p>
-      <w:pPr>
-        <w:tabs>
-          <w:tab w:pos="5544" w:val="right" w:leader="dot"/>
-        </w:tabs>
+    </w:p>
+    <w:p>
+      <w:pPr>
         <w:ind w:firstLine="0" w:left="288"/>
       </w:pPr>
       <w:hyperlink w:anchor="ch_32" w:history="1">
@@ -1351,30 +580,9 @@
           <w:t xml:space="preserve">Chapter 32: The Second Box</w:t>
         </w:r>
       </w:hyperlink>
-      <w:r>
-        <w:tab/>
-      </w:r>
-      <w:r>
-        <w:fldChar w:fldCharType="begin"/>
-      </w:r>
-      <w:r>
-        <w:instrText xml:space="preserve"> PAGEREF ch_32 \h </w:instrText>
-      </w:r>
-      <w:r>
-        <w:fldChar w:fldCharType="separate"/>
-      </w:r>
-      <w:r>
-        <w:t xml:space="preserve">220</w:t>
-      </w:r>
-      <w:r>
-        <w:fldChar w:fldCharType="end"/>
-      </w:r>
-    </w:p>
-    <w:p>
-      <w:pPr>
-        <w:tabs>
-          <w:tab w:pos="5544" w:val="right" w:leader="dot"/>
-        </w:tabs>
+    </w:p>
+    <w:p>
+      <w:pPr>
         <w:ind w:firstLine="0" w:left="288"/>
       </w:pPr>
       <w:hyperlink w:anchor="ch_33" w:history="1">
@@ -1383,30 +591,9 @@
           <w:t xml:space="preserve">Chapter 33: The Commandant</w:t>
         </w:r>
       </w:hyperlink>
-      <w:r>
-        <w:tab/>
-      </w:r>
-      <w:r>
-        <w:fldChar w:fldCharType="begin"/>
-      </w:r>
-      <w:r>
-        <w:instrText xml:space="preserve"> PAGEREF ch_33 \h </w:instrText>
-      </w:r>
-      <w:r>
-        <w:fldChar w:fldCharType="separate"/>
-      </w:r>
-      <w:r>
-        <w:t xml:space="preserve">231</w:t>
-      </w:r>
-      <w:r>
-        <w:fldChar w:fldCharType="end"/>
-      </w:r>
-    </w:p>
-    <w:p>
-      <w:pPr>
-        <w:tabs>
-          <w:tab w:pos="5544" w:val="right" w:leader="dot"/>
-        </w:tabs>
+    </w:p>
+    <w:p>
+      <w:pPr>
         <w:ind w:firstLine="0" w:left="288"/>
       </w:pPr>
       <w:hyperlink w:anchor="ch_34" w:history="1">
@@ -1415,30 +602,9 @@
           <w:t xml:space="preserve">Chapter 34: Dick Whittington</w:t>
         </w:r>
       </w:hyperlink>
-      <w:r>
-        <w:tab/>
-      </w:r>
-      <w:r>
-        <w:fldChar w:fldCharType="begin"/>
-      </w:r>
-      <w:r>
-        <w:instrText xml:space="preserve"> PAGEREF ch_34 \h </w:instrText>
-      </w:r>
-      <w:r>
-        <w:fldChar w:fldCharType="separate"/>
-      </w:r>
-      <w:r>
-        <w:t xml:space="preserve">241</w:t>
-      </w:r>
-      <w:r>
-        <w:fldChar w:fldCharType="end"/>
-      </w:r>
-    </w:p>
-    <w:p>
-      <w:pPr>
-        <w:tabs>
-          <w:tab w:pos="5544" w:val="right" w:leader="dot"/>
-        </w:tabs>
+    </w:p>
+    <w:p>
+      <w:pPr>
         <w:ind w:firstLine="0" w:left="288"/>
       </w:pPr>
       <w:hyperlink w:anchor="ch_35" w:history="1">
@@ -1447,30 +613,9 @@
           <w:t xml:space="preserve">Chapter 35: The Trial</w:t>
         </w:r>
       </w:hyperlink>
-      <w:r>
-        <w:tab/>
-      </w:r>
-      <w:r>
-        <w:fldChar w:fldCharType="begin"/>
-      </w:r>
-      <w:r>
-        <w:instrText xml:space="preserve"> PAGEREF ch_35 \h </w:instrText>
-      </w:r>
-      <w:r>
-        <w:fldChar w:fldCharType="separate"/>
-      </w:r>
-      <w:r>
-        <w:t xml:space="preserve">253</w:t>
-      </w:r>
-      <w:r>
-        <w:fldChar w:fldCharType="end"/>
-      </w:r>
-    </w:p>
-    <w:p>
-      <w:pPr>
-        <w:tabs>
-          <w:tab w:pos="5544" w:val="right" w:leader="dot"/>
-        </w:tabs>
+    </w:p>
+    <w:p>
+      <w:pPr>
         <w:ind w:firstLine="0" w:left="288"/>
       </w:pPr>
       <w:hyperlink w:anchor="ch_36" w:history="1">
@@ -1479,30 +624,9 @@
           <w:t xml:space="preserve">Chapter 36: The Courthouse Steps</w:t>
         </w:r>
       </w:hyperlink>
-      <w:r>
-        <w:tab/>
-      </w:r>
-      <w:r>
-        <w:fldChar w:fldCharType="begin"/>
-      </w:r>
-      <w:r>
-        <w:instrText xml:space="preserve"> PAGEREF ch_36 \h </w:instrText>
-      </w:r>
-      <w:r>
-        <w:fldChar w:fldCharType="separate"/>
-      </w:r>
-      <w:r>
-        <w:t xml:space="preserve">269</w:t>
-      </w:r>
-      <w:r>
-        <w:fldChar w:fldCharType="end"/>
-      </w:r>
-    </w:p>
-    <w:p>
-      <w:pPr>
-        <w:tabs>
-          <w:tab w:pos="5544" w:val="right" w:leader="dot"/>
-        </w:tabs>
+    </w:p>
+    <w:p>
+      <w:pPr>
         <w:ind w:firstLine="0" w:left="288"/>
       </w:pPr>
       <w:hyperlink w:anchor="ch_37" w:history="1">
@@ -1511,30 +635,9 @@
           <w:t xml:space="preserve">Chapter 37: Margaret and Geoffrey</w:t>
         </w:r>
       </w:hyperlink>
-      <w:r>
-        <w:tab/>
-      </w:r>
-      <w:r>
-        <w:fldChar w:fldCharType="begin"/>
-      </w:r>
-      <w:r>
-        <w:instrText xml:space="preserve"> PAGEREF ch_37 \h </w:instrText>
-      </w:r>
-      <w:r>
-        <w:fldChar w:fldCharType="separate"/>
-      </w:r>
-      <w:r>
-        <w:t xml:space="preserve">275</w:t>
-      </w:r>
-      <w:r>
-        <w:fldChar w:fldCharType="end"/>
-      </w:r>
-    </w:p>
-    <w:p>
-      <w:pPr>
-        <w:tabs>
-          <w:tab w:pos="5544" w:val="right" w:leader="dot"/>
-        </w:tabs>
+    </w:p>
+    <w:p>
+      <w:pPr>
         <w:ind w:firstLine="0" w:left="288"/>
       </w:pPr>
       <w:hyperlink w:anchor="epilogue" w:history="1">
@@ -1543,30 +646,9 @@
           <w:t xml:space="preserve">Epilogue: The Jetty</w:t>
         </w:r>
       </w:hyperlink>
-      <w:r>
-        <w:tab/>
-      </w:r>
-      <w:r>
-        <w:fldChar w:fldCharType="begin"/>
-      </w:r>
-      <w:r>
-        <w:instrText xml:space="preserve"> PAGEREF epilogue \h </w:instrText>
-      </w:r>
-      <w:r>
-        <w:fldChar w:fldCharType="separate"/>
-      </w:r>
-      <w:r>
-        <w:t xml:space="preserve">281</w:t>
-      </w:r>
-      <w:r>
-        <w:fldChar w:fldCharType="end"/>
-      </w:r>
-    </w:p>
-    <w:p>
-      <w:pPr>
-        <w:tabs>
-          <w:tab w:pos="5544" w:val="right" w:leader="dot"/>
-        </w:tabs>
+    </w:p>
+    <w:p>
+      <w:pPr>
         <w:ind w:firstLine="0" w:left="288"/>
       </w:pPr>
       <w:hyperlink w:anchor="_TocAll0001" w:history="1">
@@ -1575,30 +657,9 @@
           <w:t xml:space="preserve">About the Author</w:t>
         </w:r>
       </w:hyperlink>
-      <w:r>
-        <w:tab/>
-      </w:r>
-      <w:r>
-        <w:fldChar w:fldCharType="begin" w:dirty="true"/>
-      </w:r>
-      <w:r>
-        <w:instrText xml:space="preserve"> PAGEREF _TocAll0001 \h </w:instrText>
-      </w:r>
-      <w:r>
-        <w:fldChar w:fldCharType="separate"/>
-      </w:r>
-      <w:r>
-        <w:t>293</w:t>
-      </w:r>
-      <w:r>
-        <w:fldChar w:fldCharType="end"/>
-      </w:r>
-    </w:p>
-    <w:p>
-      <w:pPr>
-        <w:tabs>
-          <w:tab w:pos="5544" w:val="right" w:leader="dot"/>
-        </w:tabs>
+    </w:p>
+    <w:p>
+      <w:pPr>
         <w:ind w:firstLine="0" w:left="288"/>
       </w:pPr>
       <w:hyperlink w:anchor="_TocAll0002" w:history="1">
@@ -1607,24 +668,6 @@
           <w:t xml:space="preserve">Also by Lothar J. Musiol</w:t>
         </w:r>
       </w:hyperlink>
-      <w:r>
-        <w:tab/>
-      </w:r>
-      <w:r>
-        <w:fldChar w:fldCharType="begin" w:dirty="true"/>
-      </w:r>
-      <w:r>
-        <w:instrText xml:space="preserve"> PAGEREF _TocAll0002 \h </w:instrText>
-      </w:r>
-      <w:r>
-        <w:fldChar w:fldCharType="separate"/>
-      </w:r>
-      <w:r>
-        <w:t>294</w:t>
-      </w:r>
-      <w:r>
-        <w:fldChar w:fldCharType="end"/>
-      </w:r>
     </w:p>
     <w:p>
       <w:r>
@@ -5315,17 +4358,7 @@
     </w:p>
     <w:p>
       <w:r>
-        <w:t>"Good," she said. "Then we will not buy it with this. We will put this," she picked up Hale's contract between finger and thumb, as if it were something the pelican had brought in, "in the biscuit tin, with Odile. And the other one, from your wife, you will answer later, when you are not hungry. A man should never sell a house when he is hungry. My grandmother says this. She sold a house once before lunch and it was a disaster."</w:t>
-      </w:r>
-    </w:p>
-    <w:p>
-      <w:r>
-        <w:t>"What happened?"</w:t>
-      </w:r>
-    </w:p>
-    <w:p>
-      <w:r>
-        <w:t>"She bought it back after lunch," said Catarina, "for more money." She put a bowl in front of him. "Eat."</w:t>
+        <w:t xml:space="preserve">"Good," she said. "Then we will not buy it with this. We will put this," she picked up Hale's contract between finger and thumb, as if it were something the pelican had brought in, "in the biscuit tin, with Odile. And the other one, from your wife, you will answer later, when you are not hungry. A man should never sell a house when he is hungry." She put a bowl in front of him. "Eat."</w:t>
       </w:r>
     </w:p>
     <w:p>
@@ -5556,7 +4589,7 @@
         <w:ind w:firstLine="0"/>
       </w:pPr>
       <w:r>
-        <w:t>They sent it on Tuesday morning, in a brown envelope, from the post office in the village, where the postmistress weighed it as if it might contain explosives and then, when she saw the address on the envelope, gave Tobias a look of such profound disappointment that he nearly asked for it back. Tobias paid the sixty pounds by card, from his own account, with his own name, which was Mara's idea, by telephone, from the ladies', because, she said, if this was going to be evidence it ought to be clean evidence, and nothing is cleaner than a writer paying to be lied to.</w:t>
+        <w:t xml:space="preserve">They sent it on Tuesday morning, in a brown envelope, from the post office in the village, where the postmistress weighed it as if it might contain explosives and then, when she saw the address, gave Tobias a look of such profound disappointment that he nearly asked for it back. He paid the sixty pounds by card, from his own account, in his own name. That was Mara's idea, delivered by telephone from the ladies': if this was going to be evidence, it ought to be clean evidence, and nothing is cleaner than a writer paying to be lied to.</w:t>
       </w:r>
     </w:p>
     <w:p>
@@ -5566,7 +4599,7 @@
     </w:p>
     <w:p>
       <w:r>
-        <w:t>Tobias waited by rewriting chapter seven three times. Catarina waited by cleaning the oven, which had not been cleaned since Henri Fournier's lifetime, and which turned out, at the back, to contain a small cast-iron saucepan that Madame Fournier said she had been accusing her sister of stealing since 1998. They walked to the village every morning to meet the post van. The postman came to expect them. On the fourth day he began, without being asked, to shake his head from the end of the lane, so that they would not have to walk all the way.</w:t>
+        <w:t xml:space="preserve">Tobias waited by rewriting chapter seven three times. Catarina waited by cleaning the oven, which had not been cleaned since Henri Fournier's lifetime. They walked to the village every morning to meet the post van. On the fourth day the postman began, without being asked, to shake his head from the end of the lane, so that they would not have to walk all the way.</w:t>
       </w:r>
     </w:p>
     <w:p>
@@ -6260,7 +5293,7 @@
     </w:p>
     <w:p>
       <w:r>
-        <w:t xml:space="preserve">"The gull," he said, when he could. "The gull who is the keeper. And the lighthouse, his mother. Mon Dieu. I read it. I read it to my wife. She cried. She cried laughing, monsieur." He wiped his eyes. "I read the first page of every one. Yours, monsieur, is the worst thing I have ever read in my life, and I have been in a television series about a fisherman for eleven years." The laugh went out of his face. "And then I put it in the sack, "with the others. And I write the letter. </w:t>
+        <w:t xml:space="preserve">"The gull," he said, when he could. "The gull who is the keeper. And the lighthouse, his mother. Mon Dieu. I read it. I read it to my wife. She cried. She cried laughing, monsieur." He wiped his eyes. "I read the first page of every one. Yours, monsieur, is the worst thing I have ever read in my life, and I have been in a television series about a fisherman for eleven years." The laugh went out of his face. "And then I put it in the sack, with the others. And I write the letter. </w:t>
       </w:r>
       <w:r>
         <w:rPr>
@@ -6821,12 +5854,7 @@
     </w:p>
     <w:p>
       <w:r>
-        <w:t>The Belgian schoolmaster had paid three thousand two hundred, because October was "peak season for writers", the listing had said. He said what he thought of that in a long, beautiful, furious paragraph of French that made Madame Fournier nod slowly throughout, as at a sermon with which she was in complete agreement.</w:t>
-      </w:r>
-    </w:p>
-    <w:p>
-      <w:r>
-        <w:t>The family from Surrey had paid two thousand eight hundred, because they had haggled. The mother was very proud of this until Tobias told her what Madame Fournier was paid, at which point there was a pause on the line and then the sound of a woman in Surrey calling her husband into the room in the voice of somebody who has found a mouse.</w:t>
+        <w:t xml:space="preserve">The Belgian schoolmaster had paid three thousand two hundred, because October was "peak season for writers", the listing had said, and he said what he thought of that in a long, beautiful, furious paragraph of French that made Madame Fournier nod throughout, as at a sermon. The family from Surrey had paid two thousand eight hundred, because they had haggled, and the mother was very proud of this until Tobias told her what Madame Fournier was paid.</w:t>
       </w:r>
     </w:p>
     <w:p>
@@ -7016,7 +6044,7 @@
     </w:p>
     <w:p>
       <w:r>
-        <w:t>"She paid three thousand," said Tobias, at last, to the dark. "Elise. For the house. She came here to find out what Hale had done, and she paid him three thousand euros a month to do it, so he wouldn't suspect. She signed his visitors' book. She made a joke about a heron." He stopped by the gate. "I didn't know any of that. I wrote two years of a book about the night she died and I didn't know any of that."</w:t>
+        <w:t xml:space="preserve">"I wrote two years of a book about the night she died," said Tobias at last, to the dark, stopping by the gate, "and I didn't know any of that."</w:t>
       </w:r>
     </w:p>
     <w:p>
@@ -7425,7 +6453,7 @@
     </w:p>
     <w:p>
       <w:r>
-        <w:t>They had not planned to stay. They had planned to take the last train home. But Monsieur Bacri wrote slowly, and carefully, and twice started a page again because a word had come out crooked, and neither of them had the heart to hurry a carpenter, and by the time the envelope was sealed the last train had gone, and every hotel in Lyon was full of cardiologists, and it was nine o'clock at night, and raining, for the first time in ten days, as if the city had been saving it.</w:t>
+        <w:t xml:space="preserve">They had not planned to stay. But Monsieur Bacri wrote slowly, and twice started a page again because a word had come out crooked, and neither of them had the heart to hurry a carpenter. By the time the envelope was sealed the last train had gone, every hotel in Lyon was full of cardiologists, and it was raining, for the first time in ten days, as if the city had been saving it.</w:t>
       </w:r>
     </w:p>
     <w:p>
@@ -7819,7 +6847,7 @@
     </w:p>
     <w:p>
       <w:r>
-        <w:t>Mara did not touch it yet. She walked away between the towers of Renaults and rang Aix, because a hose taken off a car by an officer on her day off, without an order, is a hose that a defence lawyer throws out of the window. Juge Sarrazin, who already had an inquiry open on the rent, extended Mara's commission to the Giraud car by telephone, and had her clerk send the order to the gendarmerie at Cavaillon, and told Mara to wait for the two gendarmes from Cavaillon to arrive and witness it. They came in forty minutes, in a blue van, and stood in the gravel looking at Fangio.</w:t>
+        <w:t xml:space="preserve">Mara did not touch it yet. A hose taken off a car by an officer on her day off, without an order, is a hose that a defence lawyer throws out of the window. She rang Aix instead. Juge Sarrazin, who already had an inquiry open on the rent, extended Mara's commission to the Giraud car by telephone and sent two gendarmes from Cavaillon to witness the removal. They came in forty minutes, in a blue van, and stood in the gravel looking at Fangio.</w:t>
       </w:r>
     </w:p>
     <w:p>
@@ -7973,25 +7001,8 @@
       </w:r>
     </w:p>
     <w:p>
-      <w:pPr>
-        <w:ind w:firstLine="0"/>
-      </w:pPr>
-      <w:r>
-        <w:t xml:space="preserve">Catarina said nothing during any of this. Once, when Mara said </w:t>
-      </w:r>
-      <w:r>
-        <w:rPr>
-          <w:i/>
-        </w:rPr>
-        <w:t>it would be a pity if your career were the only thing you lost</w:t>
-      </w:r>
-      <w:r>
-        <w:t>, she closed her eyes.</w:t>
-      </w:r>
-    </w:p>
-    <w:p>
-      <w:r>
-        <w:t>Later, walking back along the wall in the dark, she stopped by the gate, as she had stopped there on the night of the kiss on the cheek, and stood with her hand on the cold iron.</w:t>
+      <w:r>
+        <w:t xml:space="preserve">Catarina had said nothing all evening. Later, walking back along the wall in the dark, she stopped by the gate, as she had stopped there on the night of the kiss on the cheek, and stood with her hand on the cold iron.</w:t>
       </w:r>
     </w:p>
     <w:p>
@@ -8522,12 +7533,7 @@
     </w:p>
     <w:p>
       <w:r>
-        <w:t>The second delay was a goat farm, because there was a sign. The third was a ruined abbey on a hill, because Tobias remarked that it looked Romanesque, and Catarina said "Românico," and they both spent twenty minutes standing in an empty nave where the roof had fallen in and the sky had come to live, whispering because it seemed to demand it. The fourth was an olive mill, where an old man in a blue apron poured them a thimble of oil so green and peppery that Catarina coughed, wiped her eyes, and bought six litres.</w:t>
-      </w:r>
-    </w:p>
-    <w:p>
-      <w:r>
-        <w:t>"It is for the restaurant," she said defensively. "Fernanda will say it is too expensive. Then she will use all of it."</w:t>
+        <w:t xml:space="preserve">The second delay was a goat farm, because there was a sign. The third was a ruined abbey on a hill, where they stood whispering in an empty nave whose roof had fallen in and let the sky come to live. The fourth was an olive mill, where an old man in a blue apron poured them a thimble of oil so green and peppery that Catarina coughed, wiped her eyes, and bought six litres for Fernanda's restaurant.</w:t>
       </w:r>
     </w:p>
     <w:p>
@@ -8914,16 +7920,6 @@
     </w:p>
     <w:p>
       <w:r>
-        <w:t>Brunner looked out of the window at the lawn, where in the rain, on a sun lounger left by the last tenants, a vast white bird sat motionless on one leg. A long silence stretched out. The former officer of the Swiss Guard, who had stood in the presence of cardinals without moving an eyelid, took out a clean white handkerchief and blew his nose.</w:t>
-      </w:r>
-    </w:p>
-    <w:p>
-      <w:r>
-        <w:t>"I am sorry," he said. "It has been a long journey."</w:t>
-      </w:r>
-    </w:p>
-    <w:p>
-      <w:r>
         <w:t>Inspector Mara Quill, who had driven over with a copy of the bank inventory and stayed, eyed him across the kitchen table the way a cat eyes a different breed of cat.</w:t>
       </w:r>
     </w:p>
@@ -9266,154 +8262,32 @@
         <w:ind w:firstLine="0"/>
       </w:pPr>
       <w:r>
-        <w:t>The roofers arrived on the Monday, in a white van with a Cavaillon number plate and a sticker on the back window that said, in English, WE FIX THINGS. WE DO NOT TALK ABOUT IT.</w:t>
-      </w:r>
-    </w:p>
-    <w:p>
-      <w:r>
-        <w:t>There were three of them, Poles who had come to Provence for one summer twelve years earlier and stayed because, the foreman said, the roofs here were very bad and the bread was very good. Marek, the foreman, was fifty, broad as a door and nearly as talkative, with forearms like cured hams and a moustache that expressed opinions on his behalf. Tomasz was thirty-five, bald and cheerful, and sang all day, in a deep and mournful voice, something that sounded like a hymn and turned out to be an advertisement for washing powder. And Pawel, the youngest, was twenty-three, very tall, shy and fair, with the face of a startled choirboy and the manners of a person raised by his grandmother.</w:t>
-      </w:r>
-    </w:p>
-    <w:p>
-      <w:r>
-        <w:t>"Dzień dobry," said Marek, to the house. He looked up at the roof the way a doctor looks at a patient who has not followed his advice. "Dach jest chory."</w:t>
-      </w:r>
-    </w:p>
-    <w:p>
-      <w:r>
-        <w:t>"What did he say?"</w:t>
-      </w:r>
-    </w:p>
-    <w:p>
-      <w:r>
-        <w:t>"He says," said Tomasz, who had some English, "that the roof is sick."</w:t>
-      </w:r>
-    </w:p>
-    <w:p>
-      <w:r>
-        <w:t>"Can you cure it?"</w:t>
-      </w:r>
-    </w:p>
-    <w:p>
-      <w:r>
-        <w:t>Marek appeared to consider the question very deeply. "Yes," he said, in English, and nothing else, and went up the ladder.</w:t>
-      </w:r>
-    </w:p>
-    <w:p>
-      <w:r>
-        <w:t>They worked for two days in the clean cold light after the storm, tearing off broken tiles and passing new ones hand to hand along the ladder in a chain of such precision that Catarina stood and watched them for an hour from the garden with her arms folded, quietly approving. They ate lunch on the lawn: enormous sandwiches of dark bread, sausage and pickled cucumber, unwrapped from silver foil with great ceremony, and a thermos of black tea so strong it could have held up the roof on its own.</w:t>
-      </w:r>
-    </w:p>
-    <w:p>
-      <w:r>
-        <w:t>"They work like Portuguese," said Catarina, in tones of the highest praise. "No talking. Many sandwiches."</w:t>
-      </w:r>
-    </w:p>
-    <w:p>
-      <w:r>
-        <w:t>It was on the second afternoon that Pawel fell in love.</w:t>
-      </w:r>
-    </w:p>
-    <w:p>
-      <w:r>
-        <w:t xml:space="preserve">It happened with great suddenness. Chloe, the Pemberton-Hayeses' babysitter, had been sent down the lane by Priscilla with a plate of shortbread, </w:t>
-      </w:r>
-      <w:r>
-        <w:rPr>
-          <w:i/>
-        </w:rPr>
-        <w:t>since those poor men must be famished</w:t>
-      </w:r>
-      <w:r>
-        <w:t>. She walked up the garden path in a yellow coat with the plate in both hands, looked up the ladder, and said, in her clear, bright, nineteen-year-old voice:</w:t>
-      </w:r>
-    </w:p>
-    <w:p>
-      <w:r>
-        <w:t>"Hello! Would anyone like a biscuit?"</w:t>
-      </w:r>
-    </w:p>
-    <w:p>
-      <w:r>
-        <w:t>Pawel, at the top, turned his head. A tile slipped from his fingers, whistled past Tomasz's ear, and broke into eleven pieces on the gravel.</w:t>
-      </w:r>
-    </w:p>
-    <w:p>
-      <w:r>
-        <w:t>"</w:t>
-      </w:r>
-      <w:r>
-        <w:rPr>
-          <w:i/>
-        </w:rPr>
-        <w:t>Pawel!</w:t>
-      </w:r>
-      <w:r>
-        <w:t>" said Marek, from the ridge.</w:t>
-      </w:r>
-    </w:p>
-    <w:p>
-      <w:r>
-        <w:t>"Przepraszam," said Pawel faintly. Sorry. He was staring at Chloe. He had gone entirely red, from the collar of his work shirt to the tips of his ears. "I... hello. Yes. Biscuit."</w:t>
-      </w:r>
-    </w:p>
-    <w:p>
-      <w:r>
-        <w:t>"I'm Chloe."</w:t>
-      </w:r>
-    </w:p>
-    <w:p>
-      <w:r>
-        <w:t>"Pawel."</w:t>
-      </w:r>
-    </w:p>
-    <w:p>
-      <w:r>
-        <w:t>"Pavel?"</w:t>
-      </w:r>
-    </w:p>
-    <w:p>
-      <w:r>
-        <w:t>"</w:t>
-      </w:r>
-      <w:r>
-        <w:rPr>
-          <w:i/>
-        </w:rPr>
-        <w:t>Pa-vel.</w:t>
-      </w:r>
-      <w:r>
-        <w:t>"</w:t>
-      </w:r>
-    </w:p>
-    <w:p>
-      <w:r>
-        <w:t>"Pa-vel," said Chloe, and smiled so brightly that Tomasz put his hand on his heart and began to sing again, and it was, once again, the washing powder.</w:t>
-      </w:r>
-    </w:p>
-    <w:p>
-      <w:r>
-        <w:t>What followed was the most stately courtship Tobias had ever witnessed, conducted in three languages, none of which anyone fully spoke. Chloe had school French and a little Spanish. Pawel had Polish, some German from his mother's side, and English he had learned from American films. They met on the lawn at four, with the shortbread. He told her, in carefully built sentences, that Poland had many trees. She told him, in the same tone, that she liked horses. He said, "Very nice." She said, "Very nice." There was a long silence, filled with the sweetest tension, and then she said, in desperation, "Do you like tea?" and he answered, with the whole of his heart, "I like tea very much."</w:t>
-      </w:r>
-    </w:p>
-    <w:p>
-      <w:r>
-        <w:t>"They are in love," said Catarina, watching from the kitchen window with her chin in her hand.</w:t>
-      </w:r>
-    </w:p>
-    <w:p>
-      <w:r>
-        <w:t>"They've said eleven words."</w:t>
-      </w:r>
-    </w:p>
-    <w:p>
-      <w:r>
-        <w:t>"Is plenty." She did not look round. "We said fewer."</w:t>
-      </w:r>
-    </w:p>
-    <w:p>
-      <w:r>
-        <w:t>By the Tuesday evening the roof was done, red and new and tight as a drum, and the nine pots were emptied and stacked in the cupboard, and Catarina, standing in the kitchen at dusk with the empty copper pot in her arms, was surprised to find that she minded.</w:t>
+        <w:t xml:space="preserve">The roofers arrived on the Monday: three Poles in a white van with a Cavaillon number plate and a sticker on the back window that said, in English, WE FIX THINGS. WE DO NOT TALK ABOUT IT. They did not talk about it. Marek, the foreman, looked up at the roof the way a doctor looks at a patient who has not followed his advice, said "Dach jest chory," which meant that the roof was sick, and went up the ladder. For two days, in the clean cold light after the storm, they passed tiles hand to hand in a chain of such precision that Catarina watched them for an hour from the garden with her arms folded, and then paid them the highest compliment she had. "They work like Portuguese. No talking. Many sandwiches."</w:t>
+      </w:r>
+    </w:p>
+    <w:p>
+      <w:r>
+        <w:t xml:space="preserve">On the second afternoon Chloe, the Pemberton-Hayeses' babysitter, came up the garden path in a yellow coat with a plate of shortbread and called up the ladder to ask whether anyone would like a biscuit, and Pawel, the youngest, who was twenty-three and had the face of a startled choirboy, dropped a tile from the top of the ladder and went red from his collar to the tips of his ears. The courtship that followed was conducted in three languages, none of which anybody fully spoke, and consisted mainly of the information that Poland had many trees and that Chloe liked horses. On the last evening, as the van was loaded, Pawel took three steps down the path with extraordinary courage and gave her a note in careful block capitals: SATURDAY? I HAVE A VAN. IT IS CLEAN. I DO NOT HAVE MANY WORDS. THESE ARE THE BEST ONES.</w:t>
+      </w:r>
+    </w:p>
+    <w:p>
+      <w:r>
+        <w:t xml:space="preserve">"They are in love," said Catarina, watching from the kitchen window with her chin in her hand.</w:t>
+      </w:r>
+    </w:p>
+    <w:p>
+      <w:r>
+        <w:t xml:space="preserve">"They've said eleven words."</w:t>
+      </w:r>
+    </w:p>
+    <w:p>
+      <w:r>
+        <w:t xml:space="preserve">"Is plenty." She did not look round. "We said fewer."</w:t>
+      </w:r>
+    </w:p>
+    <w:p>
+      <w:r>
+        <w:t xml:space="preserve">When they had gone, leaving the roof red and new and tight as a drum, the nine pots were emptied and stacked in the cupboard, and Catarina, standing in the kitchen at dusk with the empty copper pot in her arms, was surprised to find that she minded.</w:t>
       </w:r>
     </w:p>
     <w:p>
@@ -9429,36 +8303,6 @@
     <w:p>
       <w:r>
         <w:t>"It was a terrible roof," said Catarina. "But it had a very good voice."</w:t>
-      </w:r>
-    </w:p>
-    <w:p>
-      <w:r>
-        <w:t>Marek loaded the van at six. He shook Tobias's hand once, firmly, and said in English, "Roof will not leak. You will not thank me. This is correct." Tomasz kissed Catarina's hand, which she permitted. Pawel, standing a little apart, held something in his hands, rolled and rolled again, and finally, at the last moment, with extraordinary courage, took three steps down the path and gave it to Chloe, who had come to say goodbye in a different yellow coat.</w:t>
-      </w:r>
-    </w:p>
-    <w:p>
-      <w:r>
-        <w:t>It was a note, in careful block capitals, with a telephone number.</w:t>
-      </w:r>
-    </w:p>
-    <w:p>
-      <w:r>
-        <w:t>SATURDAY? I HAVE A VAN. IT IS CLEAN. I DO NOT HAVE MANY WORDS. THESE ARE THE BEST ONES. KOCHAM CIĘ (MAYBE).</w:t>
-      </w:r>
-    </w:p>
-    <w:p>
-      <w:r>
-        <w:t>"What does the last one mean?" said Chloe.</w:t>
-      </w:r>
-    </w:p>
-    <w:p>
-      <w:r>
-        <w:t>Tomasz leaned out of the van window with a wide, delighted smile.</w:t>
-      </w:r>
-    </w:p>
-    <w:p>
-      <w:r>
-        <w:t>"It means," he said, "that he likes tea very much."</w:t>
       </w:r>
     </w:p>
     <w:p>
@@ -10129,7 +8973,7 @@
     </w:p>
     <w:p>
       <w:r>
-        <w:t>Two men got out. They wore dark coats, balaclavas and the stiff, hunted air of the professionally unlucky.</w:t>
+        <w:t xml:space="preserve">Two men got out. They wore dark coats and balaclavas, and one of them carried a crowbar.</w:t>
       </w:r>
     </w:p>
     <w:p>
@@ -10139,22 +8983,12 @@
     </w:p>
     <w:p>
       <w:r>
-        <w:t>"Oui?"</w:t>
-      </w:r>
-    </w:p>
-    <w:p>
-      <w:r>
-        <w:t>"Not you. The other one."</w:t>
-      </w:r>
-    </w:p>
-    <w:p>
-      <w:r>
-        <w:t>"There is no other one, Gaston! It is only the two of us!"</w:t>
-      </w:r>
-    </w:p>
-    <w:p>
-      <w:r>
-        <w:t>The gate was locked. They climbed it, which is how a locked gate announces itself to the unlucky, and the first Gaston, swinging his leg over, kicked the brass gong that Henri Fournier had hung on the gatepost in 1987 instead of a bell, because he said bells were for people who expected visitors. The sound went round the valley like the end of the world. Over the wall, in Madame Fournier's kitchen, three heads came up from the biscuit tin at once.</w:t>
+        <w:t xml:space="preserve">"Oui?" whispered the other, who was also called Gaston.</w:t>
+      </w:r>
+    </w:p>
+    <w:p>
+      <w:r>
+        <w:t xml:space="preserve">The gate was locked. They climbed it, and the first Gaston, swinging his leg over, kicked the brass gong that Henri Fournier had hung on the gatepost in 1987 instead of a bell, because he said bells were for people who expected visitors. The sound went round the valley like the end of the world. Over the wall, in Madame Fournier's kitchen, three heads came up from the biscuit tin at once, and Catarina, who had understood before either of the others what a gong at night meant with a child alone in the house, was already running.</w:t>
       </w:r>
     </w:p>
     <w:p>
@@ -10238,17 +9072,17 @@
     </w:p>
     <w:p>
       <w:r>
-        <w:t>It was at this moment that the pelican, who had been asleep on the porch and had been woken by the gong and had come in through the open kitchen door to see who was responsible, put its enormous head round the hall door behind the two Gastons in the dark and, finding nobody with bread, opened its beak to its fullest extent and let out the long, low, wheezing hiss of a large bird that has been disturbed for nothing.</w:t>
-      </w:r>
-    </w:p>
-    <w:p>
-      <w:r>
-        <w:t>The Gastons left by the nearest exit, which was the hall window. It was not open. That was a matter for the insurance. They went across the lawn at a speed that did them great credit, and the first one, looking back over his shoulder for the snake, ran straight off the end of the garden into the shallows of the pond, and the second, who had been holding onto the first one's coat, followed him in, and they stood up to their waists among the reeds in the black water, gasping, while a heron rose out of the dark beside them with a cry of complete disgust.</w:t>
-      </w:r>
-    </w:p>
-    <w:p>
-      <w:r>
-        <w:t>Hugo came down to the jetty with his torch, in his pyjamas and a coat, and sat on the end of it with his legs crossed and his notebook open, and took their statement.</w:t>
+        <w:t xml:space="preserve">It was at this moment that the pelican, woken on the porch by the gong, came in through the open kitchen door to see who was responsible, put its enormous head round the hall door behind the two Gastons in the dark, and let out the long, low, wheezing hiss of a large bird that has been disturbed for nothing.</w:t>
+      </w:r>
+    </w:p>
+    <w:p>
+      <w:r>
+        <w:t xml:space="preserve">The Gastons left by the nearest exit, which was the hall window, and which was not open. They went across the lawn in the dark, and the first, looking back over his shoulder for the snake, ran straight off the end of the garden into the shallows of the pond, and the second, who had been holding onto his coat, followed him in.</w:t>
+      </w:r>
+    </w:p>
+    <w:p>
+      <w:r>
+        <w:t xml:space="preserve">Hugo did not come down. He had more sense than that, and now that nobody could see him his hands had begun to shake. He stood at the open study window with his torch on the two men in the pond and his notebook on the sill, and took their statement from there.</w:t>
       </w:r>
     </w:p>
     <w:p>
@@ -10286,12 +9120,12 @@
     </w:p>
     <w:p>
       <w:r>
-        <w:t>They told him. They told a nine-year-old with a torch everything, standing in a pond in the cold, because the pelican was walking up and down the jetty behind him, and because, the first Gaston said later, in court, there are moments in a man's life when he needs very badly to explain himself to somebody, and the somebody is not always the one he would have chosen.</w:t>
-      </w:r>
-    </w:p>
-    <w:p>
-      <w:r>
-        <w:t>By the time Tobias and Catarina had got back over the wall, which took longer than it should have, because Madame Fournier had insisted on coming too, with her secateurs, in case of emergencies, it was more or less over. They found a white van abandoned in the lane, a broken hall window, two men up to their waists in the pond, a pelican patrolling the jetty above them with the air of a bird who had not been asked and did not intend to give a statement, and Hugo, at the end of the planks, with a notebook, reading their own words back to them to make sure he had got it right.</w:t>
+        <w:t>They told him. They told a nine-year-old with a torch everything, standing in a pond in the cold, because the pelican was walking up and down the jetty above them, and because, the first Gaston said later, in court, there are moments in a man's life when he needs very badly to explain himself to somebody, and the somebody is not always the one he would have chosen.</w:t>
+      </w:r>
+    </w:p>
+    <w:p>
+      <w:r>
+        <w:t xml:space="preserve">Tobias got there first, over the wall and up the garden faster than he had moved in twenty years, with Catarina at his shoulder and Madame Fournier, with her secateurs, some way behind. They found a white van abandoned in the lane, a broken hall window, two men up to their waists in the pond, a pelican patrolling the jetty above them, and Hugo at the study window, reading the men's own words back to them to make sure he had got it right. Catarina went straight up the stairs and put her arms round him, and he let her, which he had never let anybody do in front of witnesses.</w:t>
       </w:r>
     </w:p>
     <w:p>
@@ -10301,7 +9135,12 @@
     </w:p>
     <w:p>
       <w:r>
-        <w:t>Mara arrived at a quarter to midnight in a dressing gown, wellington boots and a raincoat, with her service card in one hand and a torch in the other, followed by two gendarmes from Saint-Martin who had been playing cards and had brought the cards. She looked at the pond. She looked at the pelican. She looked at Hugo.</w:t>
+        <w:t xml:space="preserve">Tobias stood in the hall with broken glass round his feet and thought about the man who had sent them: a man who had already killed three people and had never once needed to raise his voice. And he thought about a boy of nine, alone in this house, because two grown-ups had gone over a wall to look at a biscuit tin. It did not feel like a story to tell at dinner. It never did, afterwards, however many times other people told it for him.</w:t>
+      </w:r>
+    </w:p>
+    <w:p>
+      <w:r>
+        <w:t>Mara arrived at a quarter to midnight in a dressing gown, wellington boots and a raincoat, with her service card in one hand and a torch in the other, followed by two gendarmes from Saint-Martin. She looked at the pond. She looked at the pelican. She looked at Hugo.</w:t>
       </w:r>
     </w:p>
     <w:p>
@@ -10372,31 +9211,6 @@
     </w:p>
     <w:p>
       <w:r>
-        <w:t xml:space="preserve">"And on the way in," said the second Gaston, with the flat voice of a man who had stopped expecting to be believed, "before the gong, in the lane, by the orchard wall, I was hit. By something. At the height of my chest. A very large man in a fur coat, with a pouch. He took my legs out from under me and then he stood over me, with his arms folded, until I got up and went away."</w:t>
-      </w:r>
-    </w:p>
-    <w:p>
-      <w:r>
-        <w:t xml:space="preserve">Mara looked at Madame Fournier, who had come in with the blankets.</w:t>
-      </w:r>
-    </w:p>
-    <w:p>
-      <w:r>
-        <w:t xml:space="preserve">"That will be Skippy," said Madame Fournier. "He has always had very strong views about people in dark coats."</w:t>
-      </w:r>
-    </w:p>
-    <w:p>
-      <w:r>
-        <w:t xml:space="preserve">"You have a kangaroo," said Mara.</w:t>
-      </w:r>
-    </w:p>
-    <w:p>
-      <w:r>
-        <w:t xml:space="preserve">"I have an orchard," said Madame Fournier. "What lives in it is its own affair."</w:t>
-      </w:r>
-    </w:p>
-    <w:p>
-      <w:r>
         <w:t>The Gastons were taken away at half past midnight in the back of the gendarmes' car, still in the army blankets, which Madame Fournier said they could keep, as they had been bought for a war and had finally seen action. As the car went down the lane with its blue light turning, she stood at the gate with her secateurs and watched it go with an expression of deep satisfaction.</w:t>
       </w:r>
     </w:p>
@@ -10425,17 +9239,12 @@
         <w:t>It's Hugo. Burglars. Fine. Don't come,</w:t>
       </w:r>
       <w:r>
-        <w:t xml:space="preserve"> and who were standing in the drive in their coats, Priscilla still in half her Dame's make-up and Nigel still in the back legs of a horse.</w:t>
-      </w:r>
-    </w:p>
-    <w:p>
-      <w:r>
-        <w:t>"He was magnificent," Mara told them, in the drive, in her dressing gown. "I want you to know that. He was magnificent, and he did everything wrong, and if he ever does anything like it again I'll arrest him myself."</w:t>
-      </w:r>
-    </w:p>
-    <w:p>
-      <w:r>
-        <w:t>"Yes," said Priscilla, looking at her son. "That's rather how we feel about his father."</w:t>
+        <w:t xml:space="preserve"> and who were standing in the drive in their coats, Priscilla still in half her Dame's make-up.</w:t>
+      </w:r>
+    </w:p>
+    <w:p>
+      <w:r>
+        <w:t xml:space="preserve">"He was magnificent," Mara told them, in the drive, in her dressing gown. "I want you to know that. He was magnificent, and he did everything wrong, and if he ever does anything like it again I'll arrest him myself." Then, because they had a right to know, she told them quietly who had paid for the van, and what that man had already done, and Priscilla knelt down on the gravel in her coat and held her son, and did not let go for some time.</w:t>
       </w:r>
     </w:p>
     <w:p>
@@ -13021,7 +11830,7 @@
     </w:p>
     <w:p>
       <w:r>
-        <w:t>They were charged with breaking and entering, attempted theft, criminal damage to a hall window, and, at the particular insistence of the prosecutor, who had a nine-year-old of her own, wilful ignorance of the ways of a child. Their lawyer was a tired young woman from the duty roster who had been given the file on the Friday and had read it, she told the court with some feeling, three times, in the hope that it would make more sense the third time, which it had not.</w:t>
+        <w:t xml:space="preserve">They were charged with breaking and entering, attempted theft and criminal damage to a hall window. Their lawyer was a tired young woman from the duty roster who had been given the file on the Friday and had read it, she told the court with some feeling, three times, in the hope that it would make more sense the third time, which it had not.</w:t>
       </w:r>
     </w:p>
     <w:p>
@@ -13031,21 +11840,12 @@
     </w:p>
     <w:p>
       <w:r>
-        <w:t xml:space="preserve">He corrected the spelling of </w:t>
-      </w:r>
-      <w:r>
-        <w:rPr>
-          <w:i/>
-        </w:rPr>
-        <w:t>Malpolon monspessulanus</w:t>
-      </w:r>
-      <w:r>
-        <w:t xml:space="preserve"> in the police report. He explained, with diagrams he had prepared in advance on squared paper, the difference between a Montpellier snake, which is back-fanged and bad-tempered, and a ladder snake, which is neither, and why a man who believes the first is under a cushion will leave a house by a window that is not open. He read out, from his notebook, the statement both defendants had given him from the pond, and both Gastons, from the dock, nodded, because it was accurate, and because he had read it back to them at the time. He identified the first Gaston as "the one who shouts" and the second Gaston as "the one who falls." When the duty lawyer asked him, gently, whether he had not been frightened, alone in a dark house at night with two grown men breaking in, Hugo considered the question with real seriousness.</w:t>
-      </w:r>
-    </w:p>
-    <w:p>
-      <w:r>
-        <w:t>"No," he said. "I'd read the file."</w:t>
+        <w:t xml:space="preserve">He explained, with diagrams prepared in advance on squared paper, the difference between a Montpellier snake, which is back-fanged and bad-tempered, and a ladder snake, which is neither, and why a man who believes the first is under a cushion will leave a house by a window that is not open. He read out, from his notebook, the statement both defendants had given him from the pond, and both Gastons, from the dock, nodded, because it was accurate. When the duty lawyer asked him, gently, whether he had not been frightened, alone in a dark house at night with two grown men breaking in, Hugo considered the question with real seriousness.</w:t>
+      </w:r>
+    </w:p>
+    <w:p>
+      <w:r>
+        <w:t xml:space="preserve">"Yes," he said. "Afterwards. But I'd read the file."</w:t>
       </w:r>
     </w:p>
     <w:p>
@@ -13107,76 +11907,7 @@
         <w:ind w:firstLine="0"/>
       </w:pPr>
       <w:r>
-        <w:t xml:space="preserve">The summons had come in January, on pale lilac paper, in an envelope with no stamp and no sender. It required Monsieur Tobias Lind to present himself at the tribunal in Aix, Room 14, on the first Monday of March, at nine o'clock. It did not say why.</w:t>
-      </w:r>
-    </w:p>
-    <w:p>
-      <w:r>
-        <w:t xml:space="preserve">He rang the number at the bottom. A woman answered, said "It is being clarified," and put the phone down. A man answered, said the same, and did the same. A recorded voice, pleasant, said that his call was important to them, and that the matter was being clarified, and that he should please hold, and he held for forty minutes while a violin played, and at the end the voice thanked him for waiting and hung up.</w:t>
-      </w:r>
-    </w:p>
-    <w:p>
-      <w:r>
-        <w:t xml:space="preserve">"What have I done?" he asked Catarina.</w:t>
-      </w:r>
-    </w:p>
-    <w:p>
-      <w:r>
-        <w:t xml:space="preserve">"Perhaps something," said Catarina, who had been brought up Catholic and believed in being charged first. "You will find out."</w:t>
-      </w:r>
-    </w:p>
-    <w:p>
-      <w:r>
-        <w:t xml:space="preserve">He found out nothing. In Room 14, on the first Monday of March, he sat for three hours on a bench among a number of silent, well-dressed strangers, each of whom appeared to be waiting for a verdict on something. At noon a clerk read a name from a list and nobody got up. At one he read it again. At two he read it a third time, and Tobias, who could not in his whole life sit quietly while a name was read, put up his hand.</w:t>
-      </w:r>
-    </w:p>
-    <w:p>
-      <w:r>
-        <w:t xml:space="preserve">"Lind," said the clerk. "Tobias."</w:t>
-      </w:r>
-    </w:p>
-    <w:p>
-      <w:r>
-        <w:t xml:space="preserve">"Yes?"</w:t>
-      </w:r>
-    </w:p>
-    <w:p>
-      <w:r>
-        <w:t xml:space="preserve">"It is not you."</w:t>
-      </w:r>
-    </w:p>
-    <w:p>
-      <w:r>
-        <w:t xml:space="preserve">"It's my name."</w:t>
-      </w:r>
-    </w:p>
-    <w:p>
-      <w:r>
-        <w:t xml:space="preserve">"It is a different Tobias Lind." The clerk consulted a document that turned out, on closer inspection, to be a restaurant menu. "Tobias Lindt. With a </w:t>
-      </w:r>
-      <w:r>
-        <w:rPr>
-          <w:i/>
-        </w:rPr>
-        <w:t xml:space="preserve">t</w:t>
-      </w:r>
-      <w:r>
-        <w:t xml:space="preserve">. A chocolatier from Zurich. He is accused of being too good at chocolate."</w:t>
-      </w:r>
-    </w:p>
-    <w:p>
-      <w:r>
-        <w:t xml:space="preserve">"That isn't a crime."</w:t>
-      </w:r>
-    </w:p>
-    <w:p>
-      <w:r>
-        <w:t xml:space="preserve">"In the Canton of Vaud it is. It is a very old law." The clerk looked distressed. "You were never accused of anything, monsieur. It was a clerical error. The paper was put in the wrong envelope, and the envelope in the wrong post, and the post sent in the wrong year. It has been clarified."</w:t>
-      </w:r>
-    </w:p>
-    <w:p>
-      <w:r>
-        <w:t xml:space="preserve">Tobias came out into the light at half past two, having missed, as he learned that evening from Inês, who had sat through all of it with a notebook and gave him a full account with commentary, only the first morning of the larger trial, which had consisted mostly of the reading of lists. At the foot of the steps a small, tearful man in a chocolatier's apron pressed a large, beautifully wrapped box into his arms, said "Thank you, I will never forget you," and ran off among the plane trees. It contained thirty-six hand-made truffles. They were the best Tobias had ever tasted. He never found out why.</w:t>
+        <w:t xml:space="preserve">The summons had come in January, on pale lilac paper, with no stamp and no sender, requiring Monsieur Tobias Lind to present himself in Room 14 of the tribunal in Aix on the first Monday of March. Every number he rang told him that the matter was being clarified. In Room 14 he sat for five hours among silent, well-dressed strangers, until a clerk, consulting what turned out on closer inspection to be a restaurant menu, informed him that the summons was meant for a Tobias Lindt, with a t, a chocolatier from Zurich, and had been put in the wrong envelope, in the wrong post, in the wrong year. It had been clarified. Tobias came out into the light having missed only the first morning of the larger trial, which had consisted mostly of the reading of lists, with the feeling that he had been told something about French justice and did not yet know what.</w:t>
       </w:r>
     </w:p>
     <w:p>
@@ -13628,7 +12359,15 @@
         <w:ind w:firstLine="0"/>
       </w:pPr>
       <w:r>
-        <w:t>Afterwards, on the courthouse steps, in the cold spring sun, Tobias met the third Vidal sister.</w:t>
+        <w:t xml:space="preserve">Afterwards, Madame Giraud came down the courthouse steps first, on her own, in the enormous cardigan. She stopped beside them long enough to take Catarina's hand in both of hers. She did not say anything, and nobody else did either. Then she went on across the square, under the bare plane trees, a small grey woman going home to a flat with a chair in it that nobody sat in, and Tobias watched her until she turned the corner. Three names had been read out in that court every morning for three weeks. For the length of the square, none of the rest of it seemed very funny.</w:t>
+      </w:r>
+    </w:p>
+    <w:p>
+      <w:pPr>
+        <w:ind w:firstLine="0"/>
+      </w:pPr>
+      <w:r>
+        <w:t xml:space="preserve">A few minutes later, on the same steps, in the cold spring sun, Tobias met the third Vidal sister.</w:t>
       </w:r>
     </w:p>
     <w:p>
@@ -13703,42 +12442,7 @@
     </w:p>
     <w:p>
       <w:r>
-        <w:t>Through the crowd, in a brown tweed jacket that was rather better than anything Tobias owned, came a tall, sheepish man with a golf umbrella and a woman in a very large hat. Gerald, and Camilla.</w:t>
-      </w:r>
-    </w:p>
-    <w:p>
-      <w:r>
-        <w:t>"Tobias. Ah. What a coincidence. We're on a short break. Together. Again." Gerald coughed. "My wife took me back for a month. Then she didn't. She said thirty years was a sufficient sample."</w:t>
-      </w:r>
-    </w:p>
-    <w:p>
-      <w:r>
-        <w:t>"Hello, Gerald."</w:t>
-      </w:r>
-    </w:p>
-    <w:p>
-      <w:r>
-        <w:t>"About the duvet. And the springs. They were rather loud."</w:t>
-      </w:r>
-    </w:p>
-    <w:p>
-      <w:r>
-        <w:t>"I know," said Tobias. "I could hear them from the hall. I thought it was the pipes."</w:t>
-      </w:r>
-    </w:p>
-    <w:p>
-      <w:r>
-        <w:t>"It was not the pipes," said Camilla, from under the hat.</w:t>
-      </w:r>
-    </w:p>
-    <w:p>
-      <w:r>
-        <w:t>Fernanda, who had seen a thin man and a pale woman standing near a cool-box, sat them down. "TOO. THIN. I FEED YOU." Gerald was fed chicken, rice and three custard tarts before he could draw breath. Camilla was fed the rest. They left with a Tupperware and the impression that they were somehow engaged to Portugal. They did not mention the duvet again. Camilla, as far as anyone knows, still has it.</w:t>
-      </w:r>
-    </w:p>
-    <w:p>
-      <w:r>
-        <w:t>When Fernanda had finished with them, Tobias wiped his hands, took Catarina a little apart, and held out a thin bound manuscript.</w:t>
+        <w:t>When Fernanda had finished with him, Tobias wiped his hands, took Catarina a little apart, and held out a thin bound manuscript.</w:t>
       </w:r>
     </w:p>
     <w:p>

</xml_diff>

<commit_message>
ILWM: front and back covers drawn by script (lake house, pelican, lavender; tagline 'Paris can wait. Aix can't.'), credits, front embedded inline in docx at 1000x1600 (old docx in bak/2026-10-11 pre-cover)
</commit_message>
<xml_diff>
--- a/In Love with Murder, Actually/In_Love_with_Murder_Actually.docx
+++ b/In Love with Murder, Actually/In_Love_with_Murder_Actually.docx
@@ -2,6 +2,54 @@
 <file path=word/document.xml><?xml version="1.0" encoding="utf-8"?>
 <w:document xmlns:wpc="http://schemas.microsoft.com/office/word/2010/wordprocessingCanvas" xmlns:mo="http://schemas.microsoft.com/office/mac/office/2008/main" xmlns:mc="http://schemas.openxmlformats.org/markup-compatibility/2006" xmlns:mv="urn:schemas-microsoft-com:mac:vml" xmlns:o="urn:schemas-microsoft-com:office:office" xmlns:r="http://schemas.openxmlformats.org/officeDocument/2006/relationships" xmlns:m="http://schemas.openxmlformats.org/officeDocument/2006/math" xmlns:v="urn:schemas-microsoft-com:vml" xmlns:wp14="http://schemas.microsoft.com/office/word/2010/wordprocessingDrawing" xmlns:wp="http://schemas.openxmlformats.org/drawingml/2006/wordprocessingDrawing" xmlns:w10="urn:schemas-microsoft-com:office:word" xmlns:w="http://schemas.openxmlformats.org/wordprocessingml/2006/main" xmlns:w14="http://schemas.microsoft.com/office/word/2010/wordml" xmlns:wpg="http://schemas.microsoft.com/office/word/2010/wordprocessingGroup" xmlns:wpi="http://schemas.microsoft.com/office/word/2010/wordprocessingInk" xmlns:wne="http://schemas.microsoft.com/office/word/2006/wordml" xmlns:wps="http://schemas.microsoft.com/office/word/2010/wordprocessingShape" mc:Ignorable="w14 wp14">
   <w:body>
+    <w:p>
+      <w:pPr>
+        <w:spacing w:before="0" w:after="0"/>
+        <w:ind w:firstLine="0"/>
+        <w:jc w:val="center"/>
+      </w:pPr>
+      <w:r>
+        <w:drawing>
+          <wp:inline distT="0" distB="0" distL="0" distR="0">
+            <wp:extent cx="3520440" cy="5632704"/>
+            <wp:docPr id="9001" name="Front cover" descr="Front cover of In Love with Murder, Actually"/>
+            <wp:cNvGraphicFramePr>
+              <a:graphicFrameLocks xmlns:a="http://schemas.openxmlformats.org/drawingml/2006/main" noChangeAspect="1"/>
+            </wp:cNvGraphicFramePr>
+            <a:graphic xmlns:a="http://schemas.openxmlformats.org/drawingml/2006/main">
+              <a:graphicData uri="http://schemas.openxmlformats.org/drawingml/2006/picture">
+                <pic:pic xmlns:pic="http://schemas.openxmlformats.org/drawingml/2006/picture">
+                  <pic:nvPicPr>
+                    <pic:cNvPr id="0" name="cover.jpg"/>
+                    <pic:cNvPicPr/>
+                  </pic:nvPicPr>
+                  <pic:blipFill>
+                    <a:blip r:embed="rIdCover"/>
+                    <a:stretch>
+                      <a:fillRect/>
+                    </a:stretch>
+                  </pic:blipFill>
+                  <pic:spPr>
+                    <a:xfrm>
+                      <a:off x="0" y="0"/>
+                      <a:ext cx="3520440" cy="5632704"/>
+                    </a:xfrm>
+                    <a:prstGeom prst="rect">
+                      <a:avLst/>
+                    </a:prstGeom>
+                  </pic:spPr>
+                </pic:pic>
+              </a:graphicData>
+            </a:graphic>
+          </wp:inline>
+        </w:drawing>
+      </w:r>
+    </w:p>
+    <w:p>
+      <w:r>
+        <w:br w:type="page"/>
+      </w:r>
+    </w:p>
     <w:p>
       <w:pPr>
         <w:pStyle w:val="Title"/>

</xml_diff>